<commit_message>
Finally you can cap correctly framerate. Version 08 HUNS U1!
</commit_message>
<xml_diff>
--- a/changelog.docx
+++ b/changelog.docx
@@ -27,7 +27,7 @@
           <w:sz w:val="48"/>
           <w:szCs w:val="48"/>
         </w:rPr>
-        <w:t xml:space="preserve"> Voxel Game v 4</w:t>
+        <w:t xml:space="preserve"> Voxel Game v </w:t>
       </w:r>
       <w:r>
         <w:rPr>
@@ -35,7 +35,7 @@
           <w:sz w:val="48"/>
           <w:szCs w:val="48"/>
         </w:rPr>
-        <w:t>9</w:t>
+        <w:t>08 (HUNS)</w:t>
       </w:r>
     </w:p>
     <w:p>
@@ -61,7 +61,7 @@
           <w:sz w:val="48"/>
           <w:szCs w:val="48"/>
         </w:rPr>
-        <w:t>Night Zed</w:t>
+        <w:t>NEWGEN</w:t>
       </w:r>
       <w:r>
         <w:rPr>
@@ -95,19 +95,26 @@
           <w:sz w:val="48"/>
           <w:szCs w:val="48"/>
         </w:rPr>
-        <w:t>Game name suggestion: “Demolition Synergy”</w:t>
-      </w:r>
-    </w:p>
-    <w:p>
-      <w:pPr>
-        <w:jc w:val="center"/>
+        <w:t>Game name</w:t>
+      </w:r>
+      <w:r>
         <w:rPr>
           <w:b/>
           <w:sz w:val="48"/>
           <w:szCs w:val="48"/>
         </w:rPr>
-      </w:pPr>
-      <w:bookmarkStart w:id="0" w:name="_GoBack"/>
+        <w:t>: “Demolition Synergy”</w:t>
+      </w:r>
+    </w:p>
+    <w:p>
+      <w:pPr>
+        <w:jc w:val="center"/>
+        <w:rPr>
+          <w:b/>
+          <w:sz w:val="48"/>
+          <w:szCs w:val="48"/>
+        </w:rPr>
+      </w:pPr>
       <w:r>
         <w:rPr>
           <w:b/>
@@ -157,7 +164,6 @@
           </wp:inline>
         </w:drawing>
       </w:r>
-      <w:bookmarkEnd w:id="0"/>
     </w:p>
     <w:p>
       <w:pPr>
@@ -206,102 +212,14 @@
           <w:sz w:val="32"/>
           <w:szCs w:val="32"/>
         </w:rPr>
-        <w:t>Water renderer got implemented, user can see reflectio</w:t>
-      </w:r>
-      <w:r>
-        <w:rPr>
-          <w:sz w:val="32"/>
-          <w:szCs w:val="32"/>
-        </w:rPr>
-        <w:t>ns of surroundings in the water;</w:t>
-      </w:r>
-    </w:p>
-    <w:p>
-      <w:pPr>
-        <w:pStyle w:val="ListParagraph"/>
-        <w:numPr>
-          <w:ilvl w:val="0"/>
-          <w:numId w:val="17"/>
-        </w:numPr>
-        <w:rPr>
-          <w:b/>
-          <w:color w:val="00B050"/>
-          <w:sz w:val="32"/>
-          <w:szCs w:val="32"/>
-        </w:rPr>
-      </w:pPr>
-      <w:r>
-        <w:rPr>
-          <w:sz w:val="32"/>
-          <w:szCs w:val="32"/>
-        </w:rPr>
-        <w:t>New logo and icon are implemented.</w:t>
-      </w:r>
-    </w:p>
-    <w:p>
-      <w:pPr>
-        <w:rPr>
-          <w:b/>
-          <w:color w:val="FFC000"/>
-          <w:sz w:val="48"/>
-          <w:szCs w:val="48"/>
-        </w:rPr>
-      </w:pPr>
-      <w:r>
-        <w:rPr>
-          <w:b/>
-          <w:color w:val="FFC000"/>
-          <w:sz w:val="48"/>
-          <w:szCs w:val="48"/>
-        </w:rPr>
-        <w:t>CHANGES:</w:t>
-      </w:r>
-    </w:p>
-    <w:p>
-      <w:pPr>
-        <w:pStyle w:val="ListParagraph"/>
-        <w:numPr>
-          <w:ilvl w:val="0"/>
-          <w:numId w:val="16"/>
-        </w:numPr>
-        <w:rPr>
-          <w:sz w:val="32"/>
-          <w:szCs w:val="32"/>
-        </w:rPr>
-      </w:pPr>
-      <w:r>
-        <w:rPr>
-          <w:sz w:val="32"/>
-          <w:szCs w:val="32"/>
-        </w:rPr>
-        <w:t>Text is affected by resolution keeping the same size</w:t>
-      </w:r>
-      <w:r>
-        <w:rPr>
-          <w:sz w:val="32"/>
-          <w:szCs w:val="32"/>
-        </w:rPr>
-        <w:t>;</w:t>
-      </w:r>
-    </w:p>
-    <w:p>
-      <w:pPr>
-        <w:pStyle w:val="ListParagraph"/>
-        <w:numPr>
-          <w:ilvl w:val="0"/>
-          <w:numId w:val="16"/>
-        </w:numPr>
-        <w:rPr>
-          <w:sz w:val="32"/>
-          <w:szCs w:val="32"/>
-        </w:rPr>
-      </w:pPr>
-      <w:r>
-        <w:rPr>
-          <w:sz w:val="32"/>
-          <w:szCs w:val="32"/>
-        </w:rPr>
-        <w:t xml:space="preserve">Mouse input (related to camera) is also affected by resolution giving it “control” over “speed”. </w:t>
+        <w:t>More options in the Options menu (Water effects, Mouse sensitivity)</w:t>
+      </w:r>
+      <w:r>
+        <w:rPr>
+          <w:sz w:val="32"/>
+          <w:szCs w:val="32"/>
+        </w:rPr>
+        <w:t>.</w:t>
       </w:r>
     </w:p>
     <w:p>
@@ -332,45 +250,16 @@
         </w:numPr>
         <w:rPr>
           <w:b/>
-          <w:color w:val="FF0000"/>
-          <w:sz w:val="32"/>
-          <w:szCs w:val="32"/>
-        </w:rPr>
-      </w:pPr>
-      <w:r>
-        <w:rPr>
-          <w:sz w:val="32"/>
-          <w:szCs w:val="32"/>
-        </w:rPr>
-        <w:t>Fixed</w:t>
-      </w:r>
-      <w:r>
-        <w:rPr>
-          <w:sz w:val="32"/>
-          <w:szCs w:val="32"/>
-        </w:rPr>
-        <w:t xml:space="preserve"> glitch</w:t>
-      </w:r>
-      <w:r>
-        <w:rPr>
-          <w:sz w:val="32"/>
-          <w:szCs w:val="32"/>
-        </w:rPr>
-        <w:t xml:space="preserve"> when sides of water block are rendered underwater when viewed from above</w:t>
-      </w:r>
-      <w:r>
-        <w:rPr>
-          <w:sz w:val="32"/>
-          <w:szCs w:val="32"/>
-        </w:rPr>
-        <w:t xml:space="preserve"> (using OpenGL cull faces)</w:t>
-      </w:r>
-      <w:r>
-        <w:rPr>
-          <w:sz w:val="32"/>
-          <w:szCs w:val="32"/>
-        </w:rPr>
-        <w:t>;</w:t>
+          <w:sz w:val="48"/>
+          <w:szCs w:val="48"/>
+        </w:rPr>
+      </w:pPr>
+      <w:r>
+        <w:rPr>
+          <w:sz w:val="32"/>
+          <w:szCs w:val="32"/>
+        </w:rPr>
+        <w:t>Glitch when walking through the corners mitigated but not completely fixed!</w:t>
       </w:r>
     </w:p>
     <w:p>
@@ -382,25 +271,76 @@
         </w:numPr>
         <w:rPr>
           <w:b/>
-          <w:color w:val="FF0000"/>
-          <w:sz w:val="32"/>
-          <w:szCs w:val="32"/>
-        </w:rPr>
-      </w:pPr>
-      <w:r>
-        <w:rPr>
-          <w:sz w:val="32"/>
-          <w:szCs w:val="32"/>
-        </w:rPr>
-        <w:t>Fixed moving through the corners</w:t>
-      </w:r>
-      <w:r>
-        <w:rPr>
-          <w:sz w:val="32"/>
-          <w:szCs w:val="32"/>
-        </w:rPr>
-        <w:t xml:space="preserve"> with camera (it has model now);</w:t>
-      </w:r>
+          <w:sz w:val="48"/>
+          <w:szCs w:val="48"/>
+        </w:rPr>
+      </w:pPr>
+      <w:r>
+        <w:rPr>
+          <w:sz w:val="32"/>
+          <w:szCs w:val="32"/>
+        </w:rPr>
+        <w:t>Fixed setting framerate cap.</w:t>
+      </w:r>
+    </w:p>
+    <w:p>
+      <w:pPr>
+        <w:pStyle w:val="ListParagraph"/>
+        <w:rPr>
+          <w:sz w:val="32"/>
+          <w:szCs w:val="32"/>
+        </w:rPr>
+      </w:pPr>
+    </w:p>
+    <w:p>
+      <w:pPr>
+        <w:pStyle w:val="ListParagraph"/>
+        <w:rPr>
+          <w:b/>
+          <w:sz w:val="48"/>
+          <w:szCs w:val="48"/>
+        </w:rPr>
+      </w:pPr>
+    </w:p>
+    <w:p>
+      <w:pPr>
+        <w:pStyle w:val="ListParagraph"/>
+        <w:rPr>
+          <w:b/>
+          <w:sz w:val="48"/>
+          <w:szCs w:val="48"/>
+        </w:rPr>
+      </w:pPr>
+    </w:p>
+    <w:p>
+      <w:pPr>
+        <w:pStyle w:val="ListParagraph"/>
+        <w:rPr>
+          <w:b/>
+          <w:sz w:val="48"/>
+          <w:szCs w:val="48"/>
+        </w:rPr>
+      </w:pPr>
+    </w:p>
+    <w:p>
+      <w:pPr>
+        <w:pStyle w:val="ListParagraph"/>
+        <w:rPr>
+          <w:b/>
+          <w:sz w:val="48"/>
+          <w:szCs w:val="48"/>
+        </w:rPr>
+      </w:pPr>
+    </w:p>
+    <w:p>
+      <w:pPr>
+        <w:pStyle w:val="ListParagraph"/>
+        <w:rPr>
+          <w:b/>
+          <w:sz w:val="48"/>
+          <w:szCs w:val="48"/>
+        </w:rPr>
+      </w:pPr>
     </w:p>
     <w:p>
       <w:pPr>
@@ -411,53 +351,6 @@
         </w:numPr>
         <w:rPr>
           <w:b/>
-          <w:color w:val="FF0000"/>
-          <w:sz w:val="32"/>
-          <w:szCs w:val="32"/>
-        </w:rPr>
-      </w:pPr>
-      <w:r>
-        <w:rPr>
-          <w:sz w:val="32"/>
-          <w:szCs w:val="32"/>
-        </w:rPr>
-        <w:lastRenderedPageBreak/>
-        <w:t xml:space="preserve">Options menu and Editor menu </w:t>
-      </w:r>
-      <w:r>
-        <w:rPr>
-          <w:sz w:val="32"/>
-          <w:szCs w:val="32"/>
-        </w:rPr>
-        <w:t>now open Main menu upon closing;</w:t>
-      </w:r>
-    </w:p>
-    <w:p>
-      <w:pPr>
-        <w:pStyle w:val="ListParagraph"/>
-        <w:numPr>
-          <w:ilvl w:val="0"/>
-          <w:numId w:val="15"/>
-        </w:numPr>
-        <w:rPr>
-          <w:b/>
-          <w:color w:val="FF0000"/>
-          <w:sz w:val="32"/>
-          <w:szCs w:val="32"/>
-        </w:rPr>
-      </w:pPr>
-      <w:r>
-        <w:rPr>
-          <w:sz w:val="32"/>
-          <w:szCs w:val="32"/>
-        </w:rPr>
-        <w:t>Camera look from mouse movement and look by turning from keyboard are now in sync.</w:t>
-      </w:r>
-    </w:p>
-    <w:p>
-      <w:pPr>
-        <w:rPr>
-          <w:b/>
           <w:sz w:val="48"/>
           <w:szCs w:val="48"/>
         </w:rPr>
@@ -798,14 +691,7 @@
           <w:sz w:val="32"/>
           <w:szCs w:val="32"/>
         </w:rPr>
-        <w:t>to open command entering dialog press “ ` ” which is “grave accent key”</w:t>
-      </w:r>
-      <w:r>
-        <w:rPr>
-          <w:sz w:val="32"/>
-          <w:szCs w:val="32"/>
-        </w:rPr>
-        <w:t>;</w:t>
+        <w:t>Game uses LWJGL 3.2.3 since v 02 (BELARUS).</w:t>
       </w:r>
     </w:p>
     <w:p>
@@ -820,96 +706,90 @@
           <w:szCs w:val="32"/>
         </w:rPr>
       </w:pPr>
-      <w:proofErr w:type="gramStart"/>
-      <w:r>
-        <w:rPr>
-          <w:sz w:val="32"/>
-          <w:szCs w:val="32"/>
-        </w:rPr>
-        <w:t>all</w:t>
-      </w:r>
-      <w:proofErr w:type="gramEnd"/>
-      <w:r>
-        <w:rPr>
-          <w:sz w:val="32"/>
-          <w:szCs w:val="32"/>
-        </w:rPr>
-        <w:t xml:space="preserve"> commands can be written in any case (they will be read as they were written in lower case). Also synonyms are accepted.</w:t>
+      <w:r>
+        <w:rPr>
+          <w:sz w:val="32"/>
+          <w:szCs w:val="32"/>
+        </w:rPr>
+        <w:t>Game implementation is multithread</w:t>
+      </w:r>
+      <w:r>
+        <w:rPr>
+          <w:sz w:val="32"/>
+          <w:szCs w:val="32"/>
+        </w:rPr>
+        <w:t>ed</w:t>
+      </w:r>
+      <w:r>
+        <w:rPr>
+          <w:sz w:val="32"/>
+          <w:szCs w:val="32"/>
+        </w:rPr>
+        <w:t xml:space="preserve"> (max 2 of 3 threads can be active</w:t>
+      </w:r>
+      <w:bookmarkStart w:id="0" w:name="_GoBack"/>
+      <w:bookmarkEnd w:id="0"/>
+      <w:r>
+        <w:rPr>
+          <w:sz w:val="32"/>
+          <w:szCs w:val="32"/>
+        </w:rPr>
+        <w:t>)</w:t>
+      </w:r>
+      <w:r>
+        <w:rPr>
+          <w:sz w:val="32"/>
+          <w:szCs w:val="32"/>
+        </w:rPr>
+        <w:t>.</w:t>
       </w:r>
     </w:p>
     <w:p>
       <w:pPr>
         <w:pStyle w:val="ListParagraph"/>
-        <w:ind w:left="0"/>
-        <w:rPr>
-          <w:b/>
-          <w:sz w:val="32"/>
-          <w:szCs w:val="32"/>
-        </w:rPr>
-      </w:pPr>
-      <w:r>
-        <w:rPr>
-          <w:b/>
-          <w:sz w:val="32"/>
-          <w:szCs w:val="32"/>
-        </w:rPr>
-        <w:t>Important note:</w:t>
-      </w:r>
-    </w:p>
-    <w:p>
-      <w:pPr>
-        <w:pStyle w:val="ListParagraph"/>
-        <w:ind w:left="0"/>
-        <w:rPr>
-          <w:sz w:val="32"/>
-          <w:szCs w:val="32"/>
-        </w:rPr>
-      </w:pPr>
-      <w:r>
-        <w:rPr>
-          <w:sz w:val="32"/>
-          <w:szCs w:val="32"/>
-        </w:rPr>
-        <w:tab/>
-        <w:t xml:space="preserve">Reason </w:t>
-      </w:r>
-      <w:r>
-        <w:rPr>
-          <w:b/>
-          <w:sz w:val="32"/>
-          <w:szCs w:val="32"/>
-        </w:rPr>
-        <w:t>why LWJGL 3.1.1 is used rather</w:t>
-      </w:r>
-      <w:r>
-        <w:rPr>
-          <w:sz w:val="32"/>
-          <w:szCs w:val="32"/>
-        </w:rPr>
-        <w:t xml:space="preserve"> than the latest LWJGL 3.1.3 is because of the mouse input feeling </w:t>
-      </w:r>
-      <w:proofErr w:type="spellStart"/>
-      <w:r>
-        <w:rPr>
-          <w:sz w:val="32"/>
-          <w:szCs w:val="32"/>
-        </w:rPr>
-        <w:t>awkward</w:t>
-      </w:r>
-      <w:r>
-        <w:rPr>
-          <w:sz w:val="32"/>
-          <w:szCs w:val="32"/>
-        </w:rPr>
-        <w:t>s</w:t>
-      </w:r>
-      <w:proofErr w:type="spellEnd"/>
-      <w:r>
-        <w:rPr>
-          <w:sz w:val="32"/>
-          <w:szCs w:val="32"/>
-        </w:rPr>
-        <w:t xml:space="preserve"> (too much fluid).</w:t>
+        <w:numPr>
+          <w:ilvl w:val="0"/>
+          <w:numId w:val="10"/>
+        </w:numPr>
+        <w:rPr>
+          <w:sz w:val="32"/>
+          <w:szCs w:val="32"/>
+        </w:rPr>
+      </w:pPr>
+      <w:r>
+        <w:rPr>
+          <w:sz w:val="32"/>
+          <w:szCs w:val="32"/>
+        </w:rPr>
+        <w:t>Running the game requires</w:t>
+      </w:r>
+      <w:r>
+        <w:rPr>
+          <w:sz w:val="32"/>
+          <w:szCs w:val="32"/>
+        </w:rPr>
+        <w:t xml:space="preserve"> Open</w:t>
+      </w:r>
+      <w:r>
+        <w:rPr>
+          <w:sz w:val="32"/>
+          <w:szCs w:val="32"/>
+        </w:rPr>
+        <w:t xml:space="preserve">GL 3.3 </w:t>
+      </w:r>
+      <w:r>
+        <w:rPr>
+          <w:sz w:val="32"/>
+          <w:szCs w:val="32"/>
+        </w:rPr>
+        <w:t xml:space="preserve"> </w:t>
+      </w:r>
+      <w:r>
+        <w:rPr>
+          <w:sz w:val="32"/>
+          <w:szCs w:val="32"/>
+        </w:rPr>
+        <w:t>or later.</w:t>
       </w:r>
     </w:p>
     <w:sectPr>
@@ -3542,7 +3422,7 @@
 </file>
 
 <file path=customXml/itemProps1.xml><?xml version="1.0" encoding="utf-8"?>
-<ds:datastoreItem xmlns:ds="http://schemas.openxmlformats.org/officeDocument/2006/customXml" ds:itemID="{8B1AC304-9FAC-485C-88C4-632981F9A488}">
+<ds:datastoreItem xmlns:ds="http://schemas.openxmlformats.org/officeDocument/2006/customXml" ds:itemID="{DA0985BD-147E-483E-B24E-12E366D20B50}">
   <ds:schemaRefs>
     <ds:schemaRef ds:uri="http://schemas.openxmlformats.org/officeDocument/2006/bibliography"/>
   </ds:schemaRefs>

</xml_diff>

<commit_message>
Random level generator. Version 08 HUNS U2!
</commit_message>
<xml_diff>
--- a/changelog.docx
+++ b/changelog.docx
@@ -224,6 +224,28 @@
     </w:p>
     <w:p>
       <w:pPr>
+        <w:pStyle w:val="ListParagraph"/>
+        <w:numPr>
+          <w:ilvl w:val="0"/>
+          <w:numId w:val="17"/>
+        </w:numPr>
+        <w:rPr>
+          <w:b/>
+          <w:color w:val="00B050"/>
+          <w:sz w:val="32"/>
+          <w:szCs w:val="32"/>
+        </w:rPr>
+      </w:pPr>
+      <w:r>
+        <w:rPr>
+          <w:sz w:val="32"/>
+          <w:szCs w:val="32"/>
+        </w:rPr>
+        <w:t>Random level generator in Editors menu.</w:t>
+      </w:r>
+    </w:p>
+    <w:p>
+      <w:pPr>
         <w:rPr>
           <w:b/>
           <w:color w:val="FF0000"/>
@@ -334,33 +356,21 @@
     </w:p>
     <w:p>
       <w:pPr>
-        <w:pStyle w:val="ListParagraph"/>
         <w:rPr>
           <w:b/>
           <w:sz w:val="48"/>
           <w:szCs w:val="48"/>
         </w:rPr>
       </w:pPr>
-    </w:p>
-    <w:p>
-      <w:pPr>
-        <w:pStyle w:val="ListParagraph"/>
-        <w:numPr>
-          <w:ilvl w:val="0"/>
-          <w:numId w:val="15"/>
-        </w:numPr>
+      <w:bookmarkStart w:id="0" w:name="_GoBack"/>
+      <w:bookmarkEnd w:id="0"/>
+      <w:r>
         <w:rPr>
           <w:b/>
           <w:sz w:val="48"/>
           <w:szCs w:val="48"/>
         </w:rPr>
-      </w:pPr>
-      <w:r>
-        <w:rPr>
-          <w:b/>
-          <w:sz w:val="48"/>
-          <w:szCs w:val="48"/>
-        </w:rPr>
+        <w:lastRenderedPageBreak/>
         <w:t>Available commands:</w:t>
       </w:r>
     </w:p>
@@ -725,16 +735,7 @@
           <w:sz w:val="32"/>
           <w:szCs w:val="32"/>
         </w:rPr>
-        <w:t xml:space="preserve"> (max 2 of 3 threads can be active</w:t>
-      </w:r>
-      <w:bookmarkStart w:id="0" w:name="_GoBack"/>
-      <w:bookmarkEnd w:id="0"/>
-      <w:r>
-        <w:rPr>
-          <w:sz w:val="32"/>
-          <w:szCs w:val="32"/>
-        </w:rPr>
-        <w:t>)</w:t>
+        <w:t xml:space="preserve"> (max 2 of 3 threads can be active)</w:t>
       </w:r>
       <w:r>
         <w:rPr>
@@ -1260,8 +1261,8 @@
   <w:abstractNum w:abstractNumId="4">
     <w:nsid w:val="2E77476A"/>
     <w:multiLevelType w:val="hybridMultilevel"/>
-    <w:tmpl w:val="637882AC"/>
-    <w:lvl w:ilvl="0" w:tplc="753E5B04">
+    <w:tmpl w:val="694C00BE"/>
+    <w:lvl w:ilvl="0" w:tplc="B47EEF4C">
       <w:start w:val="1"/>
       <w:numFmt w:val="bullet"/>
       <w:lvlText w:val=""/>
@@ -1272,6 +1273,7 @@
       <w:rPr>
         <w:rFonts w:ascii="Symbol" w:hAnsi="Symbol" w:hint="default"/>
         <w:color w:val="auto"/>
+        <w:sz w:val="32"/>
       </w:rPr>
     </w:lvl>
     <w:lvl w:ilvl="1" w:tplc="04090003" w:tentative="1">
@@ -3422,7 +3424,7 @@
 </file>
 
 <file path=customXml/itemProps1.xml><?xml version="1.0" encoding="utf-8"?>
-<ds:datastoreItem xmlns:ds="http://schemas.openxmlformats.org/officeDocument/2006/customXml" ds:itemID="{DA0985BD-147E-483E-B24E-12E366D20B50}">
+<ds:datastoreItem xmlns:ds="http://schemas.openxmlformats.org/officeDocument/2006/customXml" ds:itemID="{CD7C7145-A2FC-4BDC-80AE-F9D18A2760D4}">
   <ds:schemaRefs>
     <ds:schemaRef ds:uri="http://schemas.openxmlformats.org/officeDocument/2006/bibliography"/>
   </ds:schemaRefs>

</xml_diff>

<commit_message>
Added progress bar as a text. Version 08 HUNS U3!
</commit_message>
<xml_diff>
--- a/changelog.docx
+++ b/changelog.docx
@@ -308,21 +308,34 @@
     <w:p>
       <w:pPr>
         <w:pStyle w:val="ListParagraph"/>
-        <w:rPr>
-          <w:sz w:val="32"/>
-          <w:szCs w:val="32"/>
-        </w:rPr>
-      </w:pPr>
-    </w:p>
-    <w:p>
-      <w:pPr>
-        <w:pStyle w:val="ListParagraph"/>
+        <w:numPr>
+          <w:ilvl w:val="0"/>
+          <w:numId w:val="15"/>
+        </w:numPr>
         <w:rPr>
           <w:b/>
           <w:sz w:val="48"/>
           <w:szCs w:val="48"/>
         </w:rPr>
       </w:pPr>
+      <w:r>
+        <w:rPr>
+          <w:sz w:val="32"/>
+          <w:szCs w:val="32"/>
+        </w:rPr>
+        <w:t>Fixed underwater feel is gone when level is loaded repeatedly.</w:t>
+      </w:r>
+      <w:bookmarkStart w:id="0" w:name="_GoBack"/>
+      <w:bookmarkEnd w:id="0"/>
+    </w:p>
+    <w:p>
+      <w:pPr>
+        <w:pStyle w:val="ListParagraph"/>
+        <w:rPr>
+          <w:sz w:val="32"/>
+          <w:szCs w:val="32"/>
+        </w:rPr>
+      </w:pPr>
     </w:p>
     <w:p>
       <w:pPr>
@@ -356,21 +369,28 @@
     </w:p>
     <w:p>
       <w:pPr>
+        <w:pStyle w:val="ListParagraph"/>
         <w:rPr>
           <w:b/>
           <w:sz w:val="48"/>
           <w:szCs w:val="48"/>
         </w:rPr>
       </w:pPr>
-      <w:bookmarkStart w:id="0" w:name="_GoBack"/>
-      <w:bookmarkEnd w:id="0"/>
-      <w:r>
+    </w:p>
+    <w:p>
+      <w:pPr>
         <w:rPr>
           <w:b/>
           <w:sz w:val="48"/>
           <w:szCs w:val="48"/>
         </w:rPr>
-        <w:lastRenderedPageBreak/>
+      </w:pPr>
+      <w:r>
+        <w:rPr>
+          <w:b/>
+          <w:sz w:val="48"/>
+          <w:szCs w:val="48"/>
+        </w:rPr>
         <w:t>Available commands:</w:t>
       </w:r>
     </w:p>
@@ -3424,7 +3444,7 @@
 </file>
 
 <file path=customXml/itemProps1.xml><?xml version="1.0" encoding="utf-8"?>
-<ds:datastoreItem xmlns:ds="http://schemas.openxmlformats.org/officeDocument/2006/customXml" ds:itemID="{CD7C7145-A2FC-4BDC-80AE-F9D18A2760D4}">
+<ds:datastoreItem xmlns:ds="http://schemas.openxmlformats.org/officeDocument/2006/customXml" ds:itemID="{01037B1E-B33A-47E3-8B5B-FC05D7A0DBB6}">
   <ds:schemaRefs>
     <ds:schemaRef ds:uri="http://schemas.openxmlformats.org/officeDocument/2006/bibliography"/>
   </ds:schemaRefs>

</xml_diff>

<commit_message>
Fixed crashes on resolution and vsync changes. Version 08 HUNS U7!
</commit_message>
<xml_diff>
--- a/changelog.docx
+++ b/changelog.docx
@@ -325,72 +325,62 @@
         </w:rPr>
         <w:t>Fixed underwater feel is gone when level is loaded repeatedly.</w:t>
       </w:r>
+    </w:p>
+    <w:p>
+      <w:pPr>
+        <w:pStyle w:val="ListParagraph"/>
+        <w:rPr>
+          <w:sz w:val="32"/>
+          <w:szCs w:val="32"/>
+        </w:rPr>
+      </w:pPr>
+    </w:p>
+    <w:p>
+      <w:pPr>
+        <w:pStyle w:val="ListParagraph"/>
+        <w:rPr>
+          <w:b/>
+          <w:sz w:val="48"/>
+          <w:szCs w:val="48"/>
+        </w:rPr>
+      </w:pPr>
+    </w:p>
+    <w:p>
+      <w:pPr>
+        <w:pStyle w:val="ListParagraph"/>
+        <w:rPr>
+          <w:b/>
+          <w:sz w:val="48"/>
+          <w:szCs w:val="48"/>
+        </w:rPr>
+      </w:pPr>
+    </w:p>
+    <w:p>
+      <w:pPr>
+        <w:rPr>
+          <w:b/>
+          <w:sz w:val="48"/>
+          <w:szCs w:val="48"/>
+        </w:rPr>
+      </w:pPr>
       <w:bookmarkStart w:id="0" w:name="_GoBack"/>
       <w:bookmarkEnd w:id="0"/>
     </w:p>
     <w:p>
       <w:pPr>
-        <w:pStyle w:val="ListParagraph"/>
-        <w:rPr>
-          <w:sz w:val="32"/>
-          <w:szCs w:val="32"/>
-        </w:rPr>
-      </w:pPr>
-    </w:p>
-    <w:p>
-      <w:pPr>
-        <w:pStyle w:val="ListParagraph"/>
         <w:rPr>
           <w:b/>
           <w:sz w:val="48"/>
           <w:szCs w:val="48"/>
         </w:rPr>
       </w:pPr>
-    </w:p>
-    <w:p>
-      <w:pPr>
-        <w:pStyle w:val="ListParagraph"/>
+      <w:r>
         <w:rPr>
           <w:b/>
           <w:sz w:val="48"/>
           <w:szCs w:val="48"/>
         </w:rPr>
-      </w:pPr>
-    </w:p>
-    <w:p>
-      <w:pPr>
-        <w:pStyle w:val="ListParagraph"/>
-        <w:rPr>
-          <w:b/>
-          <w:sz w:val="48"/>
-          <w:szCs w:val="48"/>
-        </w:rPr>
-      </w:pPr>
-    </w:p>
-    <w:p>
-      <w:pPr>
-        <w:pStyle w:val="ListParagraph"/>
-        <w:rPr>
-          <w:b/>
-          <w:sz w:val="48"/>
-          <w:szCs w:val="48"/>
-        </w:rPr>
-      </w:pPr>
-    </w:p>
-    <w:p>
-      <w:pPr>
-        <w:rPr>
-          <w:b/>
-          <w:sz w:val="48"/>
-          <w:szCs w:val="48"/>
-        </w:rPr>
-      </w:pPr>
-      <w:r>
-        <w:rPr>
-          <w:b/>
-          <w:sz w:val="48"/>
-          <w:szCs w:val="48"/>
-        </w:rPr>
+        <w:lastRenderedPageBreak/>
         <w:t>Available commands:</w:t>
       </w:r>
     </w:p>
@@ -687,6 +677,112 @@
           <w:szCs w:val="32"/>
         </w:rPr>
         <w:t xml:space="preserve"> If it’s on (you’ve set it to true) your fps is capped to your monitor refresh rate.</w:t>
+      </w:r>
+    </w:p>
+    <w:p>
+      <w:pPr>
+        <w:pStyle w:val="ListParagraph"/>
+        <w:numPr>
+          <w:ilvl w:val="0"/>
+          <w:numId w:val="9"/>
+        </w:numPr>
+        <w:rPr>
+          <w:sz w:val="32"/>
+          <w:szCs w:val="32"/>
+        </w:rPr>
+      </w:pPr>
+      <w:proofErr w:type="spellStart"/>
+      <w:r>
+        <w:rPr>
+          <w:sz w:val="32"/>
+          <w:szCs w:val="32"/>
+        </w:rPr>
+        <w:t>water_efects</w:t>
+      </w:r>
+      <w:proofErr w:type="spellEnd"/>
+      <w:r>
+        <w:rPr>
+          <w:sz w:val="32"/>
+          <w:szCs w:val="32"/>
+        </w:rPr>
+        <w:t xml:space="preserve"> &lt;bool&gt;: enables (true) or disables (false) water effects (such as reflection).</w:t>
+      </w:r>
+    </w:p>
+    <w:p>
+      <w:pPr>
+        <w:pStyle w:val="ListParagraph"/>
+        <w:numPr>
+          <w:ilvl w:val="0"/>
+          <w:numId w:val="9"/>
+        </w:numPr>
+        <w:rPr>
+          <w:sz w:val="32"/>
+          <w:szCs w:val="32"/>
+        </w:rPr>
+      </w:pPr>
+      <w:proofErr w:type="spellStart"/>
+      <w:r>
+        <w:rPr>
+          <w:sz w:val="32"/>
+          <w:szCs w:val="32"/>
+        </w:rPr>
+        <w:t>mouse_sensitivity</w:t>
+      </w:r>
+      <w:proofErr w:type="spellEnd"/>
+      <w:r>
+        <w:rPr>
+          <w:sz w:val="32"/>
+          <w:szCs w:val="32"/>
+        </w:rPr>
+        <w:t>&lt;</w:t>
+      </w:r>
+      <w:proofErr w:type="spellStart"/>
+      <w:r>
+        <w:rPr>
+          <w:sz w:val="32"/>
+          <w:szCs w:val="32"/>
+        </w:rPr>
+        <w:t>num</w:t>
+      </w:r>
+      <w:proofErr w:type="spellEnd"/>
+      <w:r>
+        <w:rPr>
+          <w:sz w:val="32"/>
+          <w:szCs w:val="32"/>
+        </w:rPr>
+        <w:t xml:space="preserve">&gt;, </w:t>
+      </w:r>
+      <w:proofErr w:type="spellStart"/>
+      <w:r>
+        <w:rPr>
+          <w:sz w:val="32"/>
+          <w:szCs w:val="32"/>
+        </w:rPr>
+        <w:t>msens</w:t>
+      </w:r>
+      <w:proofErr w:type="spellEnd"/>
+      <w:r>
+        <w:rPr>
+          <w:sz w:val="32"/>
+          <w:szCs w:val="32"/>
+        </w:rPr>
+        <w:t xml:space="preserve"> &lt;</w:t>
+      </w:r>
+      <w:proofErr w:type="spellStart"/>
+      <w:r>
+        <w:rPr>
+          <w:sz w:val="32"/>
+          <w:szCs w:val="32"/>
+        </w:rPr>
+        <w:t>num</w:t>
+      </w:r>
+      <w:proofErr w:type="spellEnd"/>
+      <w:r>
+        <w:rPr>
+          <w:sz w:val="32"/>
+          <w:szCs w:val="32"/>
+        </w:rPr>
+        <w:t>&gt;: sets mouse sensitivity to this value.</w:t>
       </w:r>
     </w:p>
     <w:p>
@@ -3444,7 +3540,7 @@
 </file>
 
 <file path=customXml/itemProps1.xml><?xml version="1.0" encoding="utf-8"?>
-<ds:datastoreItem xmlns:ds="http://schemas.openxmlformats.org/officeDocument/2006/customXml" ds:itemID="{01037B1E-B33A-47E3-8B5B-FC05D7A0DBB6}">
+<ds:datastoreItem xmlns:ds="http://schemas.openxmlformats.org/officeDocument/2006/customXml" ds:itemID="{06786EEE-522C-4AB7-BA6B-651E9AD53CC3}">
   <ds:schemaRefs>
     <ds:schemaRef ds:uri="http://schemas.openxmlformats.org/officeDocument/2006/bibliography"/>
   </ds:schemaRefs>

</xml_diff>

<commit_message>
Finished changelog. Version 09 IKAROS U15!
</commit_message>
<xml_diff>
--- a/changelog.docx
+++ b/changelog.docx
@@ -4,126 +4,138 @@
   <w:body>
     <w:p>
       <w:pPr>
+        <w:pStyle w:val="NoSpacing"/>
         <w:jc w:val="center"/>
         <w:rPr>
+          <w:rFonts w:ascii="Verdana" w:hAnsi="Verdana"/>
           <w:b/>
           <w:sz w:val="48"/>
-          <w:szCs w:val="48"/>
         </w:rPr>
       </w:pPr>
       <w:proofErr w:type="spellStart"/>
       <w:r>
         <w:rPr>
+          <w:rFonts w:ascii="Verdana" w:hAnsi="Verdana"/>
           <w:b/>
           <w:sz w:val="48"/>
-          <w:szCs w:val="48"/>
         </w:rPr>
         <w:t>Ermac</w:t>
       </w:r>
       <w:proofErr w:type="spellEnd"/>
       <w:r>
         <w:rPr>
+          <w:rFonts w:ascii="Verdana" w:hAnsi="Verdana"/>
           <w:b/>
           <w:sz w:val="48"/>
-          <w:szCs w:val="48"/>
         </w:rPr>
         <w:t xml:space="preserve"> Voxel Game v </w:t>
       </w:r>
       <w:r>
         <w:rPr>
+          <w:rFonts w:ascii="Verdana" w:hAnsi="Verdana"/>
           <w:b/>
           <w:sz w:val="48"/>
-          <w:szCs w:val="48"/>
-        </w:rPr>
-        <w:t>08 (HUNS)</w:t>
+        </w:rPr>
+        <w:t>09</w:t>
+      </w:r>
+      <w:r>
+        <w:rPr>
+          <w:rFonts w:ascii="Verdana" w:hAnsi="Verdana"/>
+          <w:b/>
+          <w:sz w:val="48"/>
+        </w:rPr>
+        <w:t xml:space="preserve"> (</w:t>
+      </w:r>
+      <w:r>
+        <w:rPr>
+          <w:rFonts w:ascii="Verdana" w:hAnsi="Verdana"/>
+          <w:b/>
+          <w:sz w:val="48"/>
+        </w:rPr>
+        <w:t>IKAROS</w:t>
+      </w:r>
+      <w:r>
+        <w:rPr>
+          <w:rFonts w:ascii="Verdana" w:hAnsi="Verdana"/>
+          <w:b/>
+          <w:sz w:val="48"/>
+        </w:rPr>
+        <w:t>)</w:t>
       </w:r>
     </w:p>
     <w:p>
       <w:pPr>
+        <w:pStyle w:val="NoSpacing"/>
         <w:jc w:val="center"/>
         <w:rPr>
+          <w:rFonts w:ascii="Verdana" w:hAnsi="Verdana"/>
           <w:b/>
           <w:sz w:val="48"/>
-          <w:szCs w:val="48"/>
-        </w:rPr>
-      </w:pPr>
-      <w:r>
-        <w:rPr>
+        </w:rPr>
+      </w:pPr>
+      <w:r>
+        <w:rPr>
+          <w:rFonts w:ascii="Verdana" w:hAnsi="Verdana"/>
           <w:b/>
           <w:sz w:val="48"/>
-          <w:szCs w:val="48"/>
         </w:rPr>
         <w:t>“</w:t>
       </w:r>
       <w:r>
         <w:rPr>
+          <w:rFonts w:ascii="Verdana" w:hAnsi="Verdana"/>
           <w:b/>
           <w:sz w:val="48"/>
-          <w:szCs w:val="48"/>
         </w:rPr>
         <w:t>NEWGEN</w:t>
       </w:r>
       <w:r>
         <w:rPr>
+          <w:rFonts w:ascii="Verdana" w:hAnsi="Verdana"/>
           <w:b/>
           <w:sz w:val="48"/>
-          <w:szCs w:val="48"/>
         </w:rPr>
         <w:t>”</w:t>
       </w:r>
-      <w:r>
-        <w:rPr>
+    </w:p>
+    <w:p>
+      <w:pPr>
+        <w:pStyle w:val="NoSpacing"/>
+        <w:jc w:val="center"/>
+        <w:rPr>
+          <w:rFonts w:ascii="Verdana" w:hAnsi="Verdana"/>
           <w:b/>
           <w:sz w:val="48"/>
-          <w:szCs w:val="48"/>
-        </w:rPr>
-        <w:t xml:space="preserve"> </w:t>
+        </w:rPr>
+      </w:pPr>
+      <w:r>
+        <w:rPr>
+          <w:rFonts w:ascii="Verdana" w:hAnsi="Verdana"/>
+          <w:b/>
+          <w:sz w:val="48"/>
+        </w:rPr>
+        <w:t>Game name</w:t>
+      </w:r>
+      <w:r>
+        <w:rPr>
+          <w:rFonts w:ascii="Verdana" w:hAnsi="Verdana"/>
+          <w:b/>
+          <w:sz w:val="48"/>
+        </w:rPr>
+        <w:t>: “Demolition Synergy”</w:t>
       </w:r>
     </w:p>
     <w:p>
       <w:pPr>
+        <w:pStyle w:val="NoSpacing"/>
         <w:jc w:val="center"/>
-        <w:rPr>
-          <w:b/>
-          <w:sz w:val="48"/>
-          <w:szCs w:val="48"/>
-        </w:rPr>
-      </w:pPr>
-      <w:r>
-        <w:rPr>
-          <w:b/>
-          <w:sz w:val="48"/>
-          <w:szCs w:val="48"/>
-        </w:rPr>
-        <w:t>Game name</w:t>
-      </w:r>
-      <w:r>
-        <w:rPr>
-          <w:b/>
-          <w:sz w:val="48"/>
-          <w:szCs w:val="48"/>
-        </w:rPr>
-        <w:t>: “Demolition Synergy”</w:t>
-      </w:r>
-    </w:p>
-    <w:p>
-      <w:pPr>
-        <w:jc w:val="center"/>
-        <w:rPr>
-          <w:b/>
-          <w:sz w:val="48"/>
-          <w:szCs w:val="48"/>
-        </w:rPr>
-      </w:pPr>
-      <w:r>
-        <w:rPr>
-          <w:b/>
+      </w:pPr>
+      <w:r>
+        <w:rPr>
           <w:noProof/>
-          <w:sz w:val="48"/>
-          <w:szCs w:val="48"/>
         </w:rPr>
         <w:drawing>
-          <wp:inline distT="0" distB="0" distL="0" distR="0">
+          <wp:inline distT="0" distB="0" distL="0" distR="0" wp14:anchorId="75B431CE" wp14:editId="1CE7B089">
             <wp:extent cx="2295144" cy="1197864"/>
             <wp:effectExtent l="0" t="0" r="0" b="2540"/>
             <wp:docPr id="1" name="Picture 1"/>
@@ -167,41 +179,42 @@
     </w:p>
     <w:p>
       <w:pPr>
-        <w:rPr>
+        <w:pStyle w:val="NoSpacing"/>
+        <w:rPr>
+          <w:rFonts w:ascii="Verdana" w:hAnsi="Verdana"/>
           <w:b/>
-          <w:color w:val="00B050"/>
+          <w:color w:val="FFC000"/>
           <w:sz w:val="48"/>
-          <w:szCs w:val="48"/>
-        </w:rPr>
-      </w:pPr>
-      <w:r>
-        <w:rPr>
+        </w:rPr>
+      </w:pPr>
+      <w:r>
+        <w:rPr>
+          <w:rFonts w:ascii="Verdana" w:hAnsi="Verdana"/>
           <w:b/>
-          <w:color w:val="00B050"/>
+          <w:color w:val="FFC000"/>
           <w:sz w:val="48"/>
-          <w:szCs w:val="48"/>
-        </w:rPr>
-        <w:t>FEATURES</w:t>
-      </w:r>
-      <w:r>
-        <w:rPr>
+        </w:rPr>
+        <w:t>CHANGES</w:t>
+      </w:r>
+      <w:r>
+        <w:rPr>
+          <w:rFonts w:ascii="Verdana" w:hAnsi="Verdana"/>
           <w:b/>
-          <w:color w:val="00B050"/>
+          <w:color w:val="FFC000"/>
           <w:sz w:val="48"/>
-          <w:szCs w:val="48"/>
         </w:rPr>
         <w:t>:</w:t>
       </w:r>
     </w:p>
     <w:p>
       <w:pPr>
-        <w:pStyle w:val="ListParagraph"/>
+        <w:pStyle w:val="NoSpacing"/>
         <w:numPr>
           <w:ilvl w:val="0"/>
-          <w:numId w:val="17"/>
+          <w:numId w:val="19"/>
         </w:numPr>
         <w:rPr>
-          <w:b/>
+          <w:rFonts w:ascii="Verdana" w:hAnsi="Verdana"/>
           <w:color w:val="00B050"/>
           <w:sz w:val="32"/>
           <w:szCs w:val="32"/>
@@ -209,28 +222,64 @@
       </w:pPr>
       <w:r>
         <w:rPr>
-          <w:sz w:val="32"/>
-          <w:szCs w:val="32"/>
-        </w:rPr>
-        <w:t>More options in the Options menu (Water effects, Mouse sensitivity)</w:t>
-      </w:r>
-      <w:r>
-        <w:rPr>
-          <w:sz w:val="32"/>
-          <w:szCs w:val="32"/>
-        </w:rPr>
-        <w:t>.</w:t>
+          <w:rFonts w:ascii="Verdana" w:hAnsi="Verdana"/>
+          <w:sz w:val="32"/>
+          <w:szCs w:val="32"/>
+        </w:rPr>
+        <w:t>Improved framerate</w:t>
+      </w:r>
+      <w:r>
+        <w:rPr>
+          <w:rFonts w:ascii="Verdana" w:hAnsi="Verdana"/>
+          <w:sz w:val="32"/>
+          <w:szCs w:val="32"/>
+        </w:rPr>
+        <w:t xml:space="preserve"> as i</w:t>
+      </w:r>
+      <w:r>
+        <w:rPr>
+          <w:rFonts w:ascii="Verdana" w:hAnsi="Verdana"/>
+          <w:sz w:val="32"/>
+          <w:szCs w:val="32"/>
+        </w:rPr>
+        <w:t>nstance rendering is being used.</w:t>
+      </w:r>
+      <w:r>
+        <w:rPr>
+          <w:rFonts w:ascii="Verdana" w:hAnsi="Verdana"/>
+          <w:color w:val="00B050"/>
+          <w:sz w:val="32"/>
+          <w:szCs w:val="32"/>
+        </w:rPr>
+        <w:t xml:space="preserve"> </w:t>
+      </w:r>
+      <w:r>
+        <w:rPr>
+          <w:rFonts w:ascii="Verdana" w:hAnsi="Verdana"/>
+          <w:sz w:val="32"/>
+          <w:szCs w:val="32"/>
+        </w:rPr>
+        <w:t>Changes to free block placement. Looks better now.</w:t>
+      </w:r>
+      <w:r>
+        <w:rPr>
+          <w:rFonts w:ascii="Verdana" w:hAnsi="Verdana"/>
+          <w:color w:val="00B050"/>
+          <w:sz w:val="32"/>
+          <w:szCs w:val="32"/>
+        </w:rPr>
+        <w:t xml:space="preserve"> </w:t>
       </w:r>
     </w:p>
     <w:p>
       <w:pPr>
-        <w:pStyle w:val="ListParagraph"/>
+        <w:pStyle w:val="NoSpacing"/>
         <w:numPr>
           <w:ilvl w:val="0"/>
-          <w:numId w:val="17"/>
+          <w:numId w:val="19"/>
         </w:numPr>
         <w:rPr>
-          <w:b/>
+          <w:rFonts w:ascii="Verdana" w:hAnsi="Verdana"/>
           <w:color w:val="00B050"/>
           <w:sz w:val="32"/>
           <w:szCs w:val="32"/>
@@ -238,676 +287,980 @@
       </w:pPr>
       <w:r>
         <w:rPr>
-          <w:sz w:val="32"/>
-          <w:szCs w:val="32"/>
-        </w:rPr>
-        <w:t>Random level generator in Editors menu.</w:t>
+          <w:rFonts w:ascii="Verdana" w:hAnsi="Verdana"/>
+          <w:sz w:val="32"/>
+          <w:szCs w:val="32"/>
+        </w:rPr>
+        <w:t>Progress information is now more independent and it’s updated periodically.</w:t>
       </w:r>
     </w:p>
     <w:p>
       <w:pPr>
-        <w:rPr>
+        <w:pStyle w:val="NoSpacing"/>
+        <w:ind w:left="360"/>
+        <w:rPr>
+          <w:rFonts w:ascii="Verdana" w:hAnsi="Verdana"/>
+          <w:color w:val="00B050"/>
+          <w:sz w:val="32"/>
+          <w:szCs w:val="32"/>
+        </w:rPr>
+      </w:pPr>
+    </w:p>
+    <w:p>
+      <w:pPr>
+        <w:pStyle w:val="NoSpacing"/>
+        <w:rPr>
+          <w:rFonts w:ascii="Verdana" w:hAnsi="Verdana"/>
           <w:b/>
           <w:color w:val="FF0000"/>
           <w:sz w:val="48"/>
-          <w:szCs w:val="48"/>
-        </w:rPr>
-      </w:pPr>
-      <w:r>
-        <w:rPr>
+        </w:rPr>
+      </w:pPr>
+      <w:r>
+        <w:rPr>
+          <w:rFonts w:ascii="Verdana" w:hAnsi="Verdana"/>
           <w:b/>
           <w:color w:val="FF0000"/>
           <w:sz w:val="48"/>
-          <w:szCs w:val="48"/>
         </w:rPr>
         <w:t>FIXES:</w:t>
       </w:r>
     </w:p>
     <w:p>
       <w:pPr>
-        <w:pStyle w:val="ListParagraph"/>
+        <w:pStyle w:val="NoSpacing"/>
         <w:numPr>
           <w:ilvl w:val="0"/>
-          <w:numId w:val="15"/>
+          <w:numId w:val="18"/>
         </w:numPr>
         <w:rPr>
+          <w:rFonts w:ascii="Verdana" w:hAnsi="Verdana"/>
+          <w:sz w:val="32"/>
+          <w:szCs w:val="32"/>
+        </w:rPr>
+      </w:pPr>
+      <w:r>
+        <w:rPr>
+          <w:rFonts w:ascii="Verdana" w:hAnsi="Verdana"/>
+          <w:sz w:val="32"/>
+          <w:szCs w:val="32"/>
+        </w:rPr>
+        <w:t>Random Level Generator doesn’t spawn anymore blocks which intersect each other.</w:t>
+      </w:r>
+    </w:p>
+    <w:p>
+      <w:pPr>
+        <w:pStyle w:val="NoSpacing"/>
+        <w:numPr>
+          <w:ilvl w:val="0"/>
+          <w:numId w:val="18"/>
+        </w:numPr>
+        <w:rPr>
+          <w:rFonts w:ascii="Verdana" w:hAnsi="Verdana"/>
+          <w:sz w:val="32"/>
+          <w:szCs w:val="32"/>
+        </w:rPr>
+      </w:pPr>
+      <w:r>
+        <w:rPr>
+          <w:rFonts w:ascii="Verdana" w:hAnsi="Verdana"/>
+          <w:sz w:val="32"/>
+          <w:szCs w:val="32"/>
+        </w:rPr>
+        <w:t>Fixed wrong message about collision.</w:t>
+      </w:r>
+    </w:p>
+    <w:p>
+      <w:pPr>
+        <w:pStyle w:val="NoSpacing"/>
+        <w:rPr>
+          <w:rFonts w:ascii="Verdana" w:hAnsi="Verdana"/>
+        </w:rPr>
+      </w:pPr>
+    </w:p>
+    <w:p>
+      <w:pPr>
+        <w:pStyle w:val="NoSpacing"/>
+        <w:rPr>
+          <w:rFonts w:ascii="Verdana" w:hAnsi="Verdana"/>
+        </w:rPr>
+      </w:pPr>
+    </w:p>
+    <w:p>
+      <w:pPr>
+        <w:pStyle w:val="NoSpacing"/>
+        <w:rPr>
+          <w:rFonts w:ascii="Verdana" w:hAnsi="Verdana"/>
+        </w:rPr>
+      </w:pPr>
+    </w:p>
+    <w:p>
+      <w:pPr>
+        <w:pStyle w:val="NoSpacing"/>
+        <w:rPr>
+          <w:rFonts w:ascii="Verdana" w:hAnsi="Verdana"/>
+        </w:rPr>
+      </w:pPr>
+    </w:p>
+    <w:p>
+      <w:pPr>
+        <w:pStyle w:val="NoSpacing"/>
+        <w:rPr>
+          <w:rFonts w:ascii="Verdana" w:hAnsi="Verdana"/>
+        </w:rPr>
+      </w:pPr>
+    </w:p>
+    <w:p>
+      <w:pPr>
+        <w:pStyle w:val="NoSpacing"/>
+        <w:rPr>
+          <w:rFonts w:ascii="Verdana" w:hAnsi="Verdana"/>
+        </w:rPr>
+      </w:pPr>
+    </w:p>
+    <w:p>
+      <w:pPr>
+        <w:pStyle w:val="NoSpacing"/>
+        <w:rPr>
+          <w:rFonts w:ascii="Verdana" w:hAnsi="Verdana"/>
+        </w:rPr>
+      </w:pPr>
+    </w:p>
+    <w:p>
+      <w:pPr>
+        <w:pStyle w:val="NoSpacing"/>
+        <w:rPr>
+          <w:rFonts w:ascii="Verdana" w:hAnsi="Verdana"/>
+        </w:rPr>
+      </w:pPr>
+    </w:p>
+    <w:p>
+      <w:pPr>
+        <w:pStyle w:val="NoSpacing"/>
+        <w:rPr>
+          <w:rFonts w:ascii="Verdana" w:hAnsi="Verdana"/>
+        </w:rPr>
+      </w:pPr>
+    </w:p>
+    <w:p>
+      <w:pPr>
+        <w:pStyle w:val="NoSpacing"/>
+        <w:rPr>
+          <w:rFonts w:ascii="Verdana" w:hAnsi="Verdana"/>
+        </w:rPr>
+      </w:pPr>
+    </w:p>
+    <w:p>
+      <w:pPr>
+        <w:pStyle w:val="NoSpacing"/>
+        <w:rPr>
+          <w:rFonts w:ascii="Verdana" w:hAnsi="Verdana"/>
+        </w:rPr>
+      </w:pPr>
+    </w:p>
+    <w:p>
+      <w:pPr>
+        <w:pStyle w:val="NoSpacing"/>
+        <w:rPr>
+          <w:rFonts w:ascii="Verdana" w:hAnsi="Verdana"/>
+        </w:rPr>
+      </w:pPr>
+    </w:p>
+    <w:p>
+      <w:pPr>
+        <w:pStyle w:val="NoSpacing"/>
+        <w:rPr>
+          <w:rFonts w:ascii="Verdana" w:hAnsi="Verdana"/>
+        </w:rPr>
+      </w:pPr>
+    </w:p>
+    <w:p>
+      <w:pPr>
+        <w:pStyle w:val="NoSpacing"/>
+        <w:rPr>
+          <w:rFonts w:ascii="Verdana" w:hAnsi="Verdana"/>
+        </w:rPr>
+      </w:pPr>
+    </w:p>
+    <w:p>
+      <w:pPr>
+        <w:pStyle w:val="NoSpacing"/>
+        <w:rPr>
+          <w:rFonts w:ascii="Verdana" w:hAnsi="Verdana"/>
+        </w:rPr>
+      </w:pPr>
+    </w:p>
+    <w:p>
+      <w:pPr>
+        <w:pStyle w:val="NoSpacing"/>
+        <w:rPr>
+          <w:rFonts w:ascii="Verdana" w:hAnsi="Verdana"/>
           <w:b/>
           <w:sz w:val="48"/>
-          <w:szCs w:val="48"/>
-        </w:rPr>
-      </w:pPr>
-      <w:r>
-        <w:rPr>
-          <w:sz w:val="32"/>
-          <w:szCs w:val="32"/>
-        </w:rPr>
-        <w:t>Glitch when walking through the corners mitigated but not completely fixed!</w:t>
+        </w:rPr>
+      </w:pPr>
+      <w:r>
+        <w:rPr>
+          <w:rFonts w:ascii="Verdana" w:hAnsi="Verdana"/>
+          <w:b/>
+          <w:sz w:val="48"/>
+        </w:rPr>
+        <w:lastRenderedPageBreak/>
+        <w:t>Available commands:</w:t>
       </w:r>
     </w:p>
     <w:p>
       <w:pPr>
-        <w:pStyle w:val="ListParagraph"/>
+        <w:pStyle w:val="NoSpacing"/>
+        <w:rPr>
+          <w:rFonts w:ascii="Verdana" w:hAnsi="Verdana"/>
+          <w:sz w:val="40"/>
+        </w:rPr>
+      </w:pPr>
+      <w:r>
+        <w:rPr>
+          <w:rFonts w:ascii="Verdana" w:hAnsi="Verdana"/>
+          <w:sz w:val="40"/>
+        </w:rPr>
+        <w:t xml:space="preserve">In order to type command </w:t>
+      </w:r>
+      <w:proofErr w:type="gramStart"/>
+      <w:r>
+        <w:rPr>
+          <w:rFonts w:ascii="Verdana" w:hAnsi="Verdana"/>
+          <w:sz w:val="40"/>
+        </w:rPr>
+        <w:t>which is equivalent to options setup press key “~”</w:t>
+      </w:r>
+      <w:r>
+        <w:rPr>
+          <w:rFonts w:ascii="Verdana" w:hAnsi="Verdana"/>
+          <w:sz w:val="40"/>
+        </w:rPr>
+        <w:t>.</w:t>
+      </w:r>
+      <w:proofErr w:type="gramEnd"/>
+    </w:p>
+    <w:p>
+      <w:pPr>
+        <w:pStyle w:val="NoSpacing"/>
         <w:numPr>
           <w:ilvl w:val="0"/>
-          <w:numId w:val="15"/>
+          <w:numId w:val="19"/>
         </w:numPr>
         <w:rPr>
+          <w:rFonts w:ascii="Verdana" w:hAnsi="Verdana"/>
+          <w:sz w:val="32"/>
+          <w:szCs w:val="32"/>
+        </w:rPr>
+      </w:pPr>
+      <w:proofErr w:type="spellStart"/>
+      <w:r>
+        <w:rPr>
+          <w:rFonts w:ascii="Verdana" w:hAnsi="Verdana"/>
+          <w:sz w:val="32"/>
+          <w:szCs w:val="32"/>
+        </w:rPr>
+        <w:t>fps_max</w:t>
+      </w:r>
+      <w:proofErr w:type="spellEnd"/>
+      <w:r>
+        <w:rPr>
+          <w:rFonts w:ascii="Verdana" w:hAnsi="Verdana"/>
+          <w:sz w:val="32"/>
+          <w:szCs w:val="32"/>
+        </w:rPr>
+        <w:t>&lt;</w:t>
+      </w:r>
+      <w:proofErr w:type="spellStart"/>
+      <w:r>
+        <w:rPr>
+          <w:rFonts w:ascii="Verdana" w:hAnsi="Verdana"/>
+          <w:sz w:val="32"/>
+          <w:szCs w:val="32"/>
+        </w:rPr>
+        <w:t>num</w:t>
+      </w:r>
+      <w:proofErr w:type="spellEnd"/>
+      <w:r>
+        <w:rPr>
+          <w:rFonts w:ascii="Verdana" w:hAnsi="Verdana"/>
+          <w:sz w:val="32"/>
+          <w:szCs w:val="32"/>
+        </w:rPr>
+        <w:t xml:space="preserve">&gt;, </w:t>
+      </w:r>
+      <w:proofErr w:type="spellStart"/>
+      <w:r>
+        <w:rPr>
+          <w:rFonts w:ascii="Verdana" w:hAnsi="Verdana"/>
+          <w:sz w:val="32"/>
+          <w:szCs w:val="32"/>
+        </w:rPr>
+        <w:t>fpsMax</w:t>
+      </w:r>
+      <w:proofErr w:type="spellEnd"/>
+      <w:r>
+        <w:rPr>
+          <w:rFonts w:ascii="Verdana" w:hAnsi="Verdana"/>
+          <w:sz w:val="32"/>
+          <w:szCs w:val="32"/>
+        </w:rPr>
+        <w:t>&lt;</w:t>
+      </w:r>
+      <w:proofErr w:type="spellStart"/>
+      <w:r>
+        <w:rPr>
+          <w:rFonts w:ascii="Verdana" w:hAnsi="Verdana"/>
+          <w:sz w:val="32"/>
+          <w:szCs w:val="32"/>
+        </w:rPr>
+        <w:t>num</w:t>
+      </w:r>
+      <w:proofErr w:type="spellEnd"/>
+      <w:r>
+        <w:rPr>
+          <w:rFonts w:ascii="Verdana" w:hAnsi="Verdana"/>
+          <w:sz w:val="32"/>
+          <w:szCs w:val="32"/>
+        </w:rPr>
+        <w:t xml:space="preserve">&gt;: allowing </w:t>
+      </w:r>
+      <w:proofErr w:type="gramStart"/>
+      <w:r>
+        <w:rPr>
+          <w:rFonts w:ascii="Verdana" w:hAnsi="Verdana"/>
+          <w:sz w:val="32"/>
+          <w:szCs w:val="32"/>
+        </w:rPr>
+        <w:t>to change</w:t>
+      </w:r>
+      <w:proofErr w:type="gramEnd"/>
+      <w:r>
+        <w:rPr>
+          <w:rFonts w:ascii="Verdana" w:hAnsi="Verdana"/>
+          <w:sz w:val="32"/>
+          <w:szCs w:val="32"/>
+        </w:rPr>
+        <w:t xml:space="preserve"> max fps</w:t>
+      </w:r>
+      <w:r>
+        <w:rPr>
+          <w:rFonts w:ascii="Verdana" w:hAnsi="Verdana"/>
+          <w:sz w:val="32"/>
+          <w:szCs w:val="32"/>
+        </w:rPr>
+        <w:t xml:space="preserve"> (it must be positive number)</w:t>
+      </w:r>
+      <w:r>
+        <w:rPr>
+          <w:rFonts w:ascii="Verdana" w:hAnsi="Verdana"/>
+          <w:sz w:val="32"/>
+          <w:szCs w:val="32"/>
+        </w:rPr>
+        <w:t>.</w:t>
+      </w:r>
+    </w:p>
+    <w:p>
+      <w:pPr>
+        <w:pStyle w:val="NoSpacing"/>
+        <w:numPr>
+          <w:ilvl w:val="0"/>
+          <w:numId w:val="19"/>
+        </w:numPr>
+        <w:rPr>
+          <w:rFonts w:ascii="Verdana" w:hAnsi="Verdana"/>
+          <w:sz w:val="32"/>
+          <w:szCs w:val="32"/>
+        </w:rPr>
+      </w:pPr>
+      <w:proofErr w:type="gramStart"/>
+      <w:r>
+        <w:rPr>
+          <w:rFonts w:ascii="Verdana" w:hAnsi="Verdana"/>
+          <w:sz w:val="32"/>
+          <w:szCs w:val="32"/>
+        </w:rPr>
+        <w:t>resolution&lt;</w:t>
+      </w:r>
+      <w:proofErr w:type="gramEnd"/>
+      <w:r>
+        <w:rPr>
+          <w:rFonts w:ascii="Verdana" w:hAnsi="Verdana"/>
+          <w:sz w:val="32"/>
+          <w:szCs w:val="32"/>
+        </w:rPr>
+        <w:t>width&gt;&lt;height&gt;, res&lt;width&gt;&lt;height&gt;: allowing to change resolution (min resolution is 640x480 whilst</w:t>
+      </w:r>
+      <w:r>
+        <w:rPr>
+          <w:rFonts w:ascii="Verdana" w:hAnsi="Verdana"/>
+          <w:sz w:val="32"/>
+          <w:szCs w:val="32"/>
+        </w:rPr>
+        <w:t xml:space="preserve"> max is your native resolution).</w:t>
+      </w:r>
+    </w:p>
+    <w:p>
+      <w:pPr>
+        <w:pStyle w:val="NoSpacing"/>
+        <w:numPr>
+          <w:ilvl w:val="0"/>
+          <w:numId w:val="19"/>
+        </w:numPr>
+        <w:rPr>
+          <w:rFonts w:ascii="Verdana" w:hAnsi="Verdana"/>
+          <w:sz w:val="32"/>
+          <w:szCs w:val="32"/>
+        </w:rPr>
+      </w:pPr>
+      <w:proofErr w:type="spellStart"/>
+      <w:proofErr w:type="gramStart"/>
+      <w:r>
+        <w:rPr>
+          <w:rFonts w:ascii="Verdana" w:hAnsi="Verdana"/>
+          <w:sz w:val="32"/>
+          <w:szCs w:val="32"/>
+        </w:rPr>
+        <w:t>fullscreen</w:t>
+      </w:r>
+      <w:proofErr w:type="spellEnd"/>
+      <w:proofErr w:type="gramEnd"/>
+      <w:r>
+        <w:rPr>
+          <w:rFonts w:ascii="Verdana" w:hAnsi="Verdana"/>
+          <w:sz w:val="32"/>
+          <w:szCs w:val="32"/>
+        </w:rPr>
+        <w:t>:</w:t>
+      </w:r>
+      <w:r>
+        <w:rPr>
+          <w:rFonts w:ascii="Verdana" w:hAnsi="Verdana"/>
+          <w:sz w:val="32"/>
+          <w:szCs w:val="32"/>
+        </w:rPr>
+        <w:t xml:space="preserve"> makes your game run </w:t>
+      </w:r>
+      <w:proofErr w:type="spellStart"/>
+      <w:r>
+        <w:rPr>
+          <w:rFonts w:ascii="Verdana" w:hAnsi="Verdana"/>
+          <w:sz w:val="32"/>
+          <w:szCs w:val="32"/>
+        </w:rPr>
+        <w:t>fullscreen</w:t>
+      </w:r>
+      <w:proofErr w:type="spellEnd"/>
+      <w:r>
+        <w:rPr>
+          <w:rFonts w:ascii="Verdana" w:hAnsi="Verdana"/>
+          <w:sz w:val="32"/>
+          <w:szCs w:val="32"/>
+        </w:rPr>
+        <w:t>.</w:t>
+      </w:r>
+    </w:p>
+    <w:p>
+      <w:pPr>
+        <w:pStyle w:val="NoSpacing"/>
+        <w:numPr>
+          <w:ilvl w:val="0"/>
+          <w:numId w:val="19"/>
+        </w:numPr>
+        <w:rPr>
+          <w:rFonts w:ascii="Verdana" w:hAnsi="Verdana"/>
+          <w:sz w:val="32"/>
+          <w:szCs w:val="32"/>
+        </w:rPr>
+      </w:pPr>
+      <w:proofErr w:type="gramStart"/>
+      <w:r>
+        <w:rPr>
+          <w:rFonts w:ascii="Verdana" w:hAnsi="Verdana"/>
+          <w:sz w:val="32"/>
+          <w:szCs w:val="32"/>
+        </w:rPr>
+        <w:t>windowed</w:t>
+      </w:r>
+      <w:proofErr w:type="gramEnd"/>
+      <w:r>
+        <w:rPr>
+          <w:rFonts w:ascii="Verdana" w:hAnsi="Verdana"/>
+          <w:sz w:val="32"/>
+          <w:szCs w:val="32"/>
+        </w:rPr>
+        <w:t xml:space="preserve">: makes your game run </w:t>
+      </w:r>
+      <w:r>
+        <w:rPr>
+          <w:rFonts w:ascii="Verdana" w:hAnsi="Verdana"/>
+          <w:sz w:val="32"/>
+          <w:szCs w:val="32"/>
+        </w:rPr>
+        <w:t>windowed mode.</w:t>
+      </w:r>
+    </w:p>
+    <w:p>
+      <w:pPr>
+        <w:pStyle w:val="NoSpacing"/>
+        <w:numPr>
+          <w:ilvl w:val="0"/>
+          <w:numId w:val="19"/>
+        </w:numPr>
+        <w:rPr>
+          <w:rFonts w:ascii="Verdana" w:hAnsi="Verdana"/>
+          <w:sz w:val="32"/>
+          <w:szCs w:val="32"/>
+        </w:rPr>
+      </w:pPr>
+      <w:proofErr w:type="spellStart"/>
+      <w:r>
+        <w:rPr>
+          <w:rFonts w:ascii="Verdana" w:hAnsi="Verdana"/>
+          <w:sz w:val="32"/>
+          <w:szCs w:val="32"/>
+        </w:rPr>
+        <w:t>v_sync</w:t>
+      </w:r>
+      <w:proofErr w:type="spellEnd"/>
+      <w:r>
+        <w:rPr>
+          <w:rFonts w:ascii="Verdana" w:hAnsi="Verdana"/>
+          <w:sz w:val="32"/>
+          <w:szCs w:val="32"/>
+        </w:rPr>
+        <w:t xml:space="preserve"> &lt;bool&gt;</w:t>
+      </w:r>
+      <w:r>
+        <w:rPr>
+          <w:rFonts w:ascii="Verdana" w:hAnsi="Verdana"/>
+          <w:sz w:val="32"/>
+          <w:szCs w:val="32"/>
+        </w:rPr>
+        <w:t xml:space="preserve">, </w:t>
+      </w:r>
+      <w:proofErr w:type="spellStart"/>
+      <w:r>
+        <w:rPr>
+          <w:rFonts w:ascii="Verdana" w:hAnsi="Verdana"/>
+          <w:sz w:val="32"/>
+          <w:szCs w:val="32"/>
+        </w:rPr>
+        <w:t>vsync</w:t>
+      </w:r>
+      <w:proofErr w:type="spellEnd"/>
+      <w:r>
+        <w:rPr>
+          <w:rFonts w:ascii="Verdana" w:hAnsi="Verdana"/>
+          <w:sz w:val="32"/>
+          <w:szCs w:val="32"/>
+        </w:rPr>
+        <w:t>&lt;bool&gt;</w:t>
+      </w:r>
+      <w:r>
+        <w:rPr>
+          <w:rFonts w:ascii="Verdana" w:hAnsi="Verdana"/>
+          <w:sz w:val="32"/>
+          <w:szCs w:val="32"/>
+        </w:rPr>
+        <w:t>: whether</w:t>
+      </w:r>
+      <w:r>
+        <w:rPr>
+          <w:rFonts w:ascii="Verdana" w:hAnsi="Verdana"/>
+          <w:sz w:val="32"/>
+          <w:szCs w:val="32"/>
+        </w:rPr>
+        <w:t xml:space="preserve"> or not you</w:t>
+      </w:r>
+      <w:r>
+        <w:rPr>
+          <w:rFonts w:ascii="Verdana" w:hAnsi="Verdana"/>
+          <w:sz w:val="32"/>
+          <w:szCs w:val="32"/>
+        </w:rPr>
+        <w:t xml:space="preserve"> </w:t>
+      </w:r>
+      <w:proofErr w:type="spellStart"/>
+      <w:r>
+        <w:rPr>
+          <w:rFonts w:ascii="Verdana" w:hAnsi="Verdana"/>
+          <w:sz w:val="32"/>
+          <w:szCs w:val="32"/>
+        </w:rPr>
+        <w:t>wanna</w:t>
+      </w:r>
+      <w:proofErr w:type="spellEnd"/>
+      <w:r>
+        <w:rPr>
+          <w:rFonts w:ascii="Verdana" w:hAnsi="Verdana"/>
+          <w:sz w:val="32"/>
+          <w:szCs w:val="32"/>
+        </w:rPr>
+        <w:t xml:space="preserve"> </w:t>
+      </w:r>
+      <w:proofErr w:type="spellStart"/>
+      <w:r>
+        <w:rPr>
+          <w:rFonts w:ascii="Verdana" w:hAnsi="Verdana"/>
+          <w:sz w:val="32"/>
+          <w:szCs w:val="32"/>
+        </w:rPr>
+        <w:t>vsync</w:t>
+      </w:r>
+      <w:proofErr w:type="spellEnd"/>
+      <w:r>
+        <w:rPr>
+          <w:rFonts w:ascii="Verdana" w:hAnsi="Verdana"/>
+          <w:sz w:val="32"/>
+          <w:szCs w:val="32"/>
+        </w:rPr>
+        <w:t xml:space="preserve"> on or off</w:t>
+      </w:r>
+      <w:r>
+        <w:rPr>
+          <w:rFonts w:ascii="Verdana" w:hAnsi="Verdana"/>
+          <w:sz w:val="32"/>
+          <w:szCs w:val="32"/>
+        </w:rPr>
+        <w:t>.</w:t>
+      </w:r>
+      <w:r>
+        <w:rPr>
+          <w:rFonts w:ascii="Verdana" w:hAnsi="Verdana"/>
+          <w:sz w:val="32"/>
+          <w:szCs w:val="32"/>
+        </w:rPr>
+        <w:t xml:space="preserve"> If it’s on (you’ve set it to true) your fps is capped to your monitor refresh rate.</w:t>
+      </w:r>
+    </w:p>
+    <w:p>
+      <w:pPr>
+        <w:pStyle w:val="NoSpacing"/>
+        <w:numPr>
+          <w:ilvl w:val="0"/>
+          <w:numId w:val="19"/>
+        </w:numPr>
+        <w:rPr>
+          <w:rFonts w:ascii="Verdana" w:hAnsi="Verdana"/>
+          <w:sz w:val="32"/>
+          <w:szCs w:val="32"/>
+        </w:rPr>
+      </w:pPr>
+      <w:proofErr w:type="spellStart"/>
+      <w:r>
+        <w:rPr>
+          <w:rFonts w:ascii="Verdana" w:hAnsi="Verdana"/>
+          <w:sz w:val="32"/>
+          <w:szCs w:val="32"/>
+        </w:rPr>
+        <w:t>water_efects</w:t>
+      </w:r>
+      <w:proofErr w:type="spellEnd"/>
+      <w:r>
+        <w:rPr>
+          <w:rFonts w:ascii="Verdana" w:hAnsi="Verdana"/>
+          <w:sz w:val="32"/>
+          <w:szCs w:val="32"/>
+        </w:rPr>
+        <w:t xml:space="preserve"> &lt;bool&gt;: enables (true) or disables (false) water effects (such as reflection).</w:t>
+      </w:r>
+    </w:p>
+    <w:p>
+      <w:pPr>
+        <w:pStyle w:val="NoSpacing"/>
+        <w:numPr>
+          <w:ilvl w:val="0"/>
+          <w:numId w:val="19"/>
+        </w:numPr>
+        <w:rPr>
+          <w:rFonts w:ascii="Verdana" w:hAnsi="Verdana"/>
+          <w:sz w:val="32"/>
+          <w:szCs w:val="32"/>
+        </w:rPr>
+      </w:pPr>
+      <w:proofErr w:type="spellStart"/>
+      <w:r>
+        <w:rPr>
+          <w:rFonts w:ascii="Verdana" w:hAnsi="Verdana"/>
+          <w:sz w:val="32"/>
+          <w:szCs w:val="32"/>
+        </w:rPr>
+        <w:t>mouse_sensitivity</w:t>
+      </w:r>
+      <w:proofErr w:type="spellEnd"/>
+      <w:r>
+        <w:rPr>
+          <w:rFonts w:ascii="Verdana" w:hAnsi="Verdana"/>
+          <w:sz w:val="32"/>
+          <w:szCs w:val="32"/>
+        </w:rPr>
+        <w:t>&lt;</w:t>
+      </w:r>
+      <w:proofErr w:type="spellStart"/>
+      <w:r>
+        <w:rPr>
+          <w:rFonts w:ascii="Verdana" w:hAnsi="Verdana"/>
+          <w:sz w:val="32"/>
+          <w:szCs w:val="32"/>
+        </w:rPr>
+        <w:t>num</w:t>
+      </w:r>
+      <w:proofErr w:type="spellEnd"/>
+      <w:r>
+        <w:rPr>
+          <w:rFonts w:ascii="Verdana" w:hAnsi="Verdana"/>
+          <w:sz w:val="32"/>
+          <w:szCs w:val="32"/>
+        </w:rPr>
+        <w:t xml:space="preserve">&gt;, </w:t>
+      </w:r>
+      <w:proofErr w:type="spellStart"/>
+      <w:r>
+        <w:rPr>
+          <w:rFonts w:ascii="Verdana" w:hAnsi="Verdana"/>
+          <w:sz w:val="32"/>
+          <w:szCs w:val="32"/>
+        </w:rPr>
+        <w:t>msens</w:t>
+      </w:r>
+      <w:proofErr w:type="spellEnd"/>
+      <w:r>
+        <w:rPr>
+          <w:rFonts w:ascii="Verdana" w:hAnsi="Verdana"/>
+          <w:sz w:val="32"/>
+          <w:szCs w:val="32"/>
+        </w:rPr>
+        <w:t xml:space="preserve"> &lt;</w:t>
+      </w:r>
+      <w:proofErr w:type="spellStart"/>
+      <w:r>
+        <w:rPr>
+          <w:rFonts w:ascii="Verdana" w:hAnsi="Verdana"/>
+          <w:sz w:val="32"/>
+          <w:szCs w:val="32"/>
+        </w:rPr>
+        <w:t>num</w:t>
+      </w:r>
+      <w:proofErr w:type="spellEnd"/>
+      <w:r>
+        <w:rPr>
+          <w:rFonts w:ascii="Verdana" w:hAnsi="Verdana"/>
+          <w:sz w:val="32"/>
+          <w:szCs w:val="32"/>
+        </w:rPr>
+        <w:t>&gt;: sets mouse sensitivity to this value.</w:t>
+      </w:r>
+    </w:p>
+    <w:p>
+      <w:pPr>
+        <w:pStyle w:val="NoSpacing"/>
+        <w:ind w:left="360"/>
+        <w:rPr>
+          <w:rFonts w:ascii="Verdana" w:hAnsi="Verdana"/>
+          <w:sz w:val="32"/>
+          <w:szCs w:val="32"/>
+        </w:rPr>
+      </w:pPr>
+    </w:p>
+    <w:p>
+      <w:pPr>
+        <w:pStyle w:val="NoSpacing"/>
+        <w:rPr>
+          <w:rFonts w:ascii="Verdana" w:hAnsi="Verdana"/>
           <w:b/>
           <w:sz w:val="48"/>
-          <w:szCs w:val="48"/>
-        </w:rPr>
-      </w:pPr>
-      <w:r>
-        <w:rPr>
-          <w:sz w:val="32"/>
-          <w:szCs w:val="32"/>
-        </w:rPr>
-        <w:t>Fixed setting framerate cap.</w:t>
+          <w:szCs w:val="32"/>
+        </w:rPr>
+      </w:pPr>
+      <w:r>
+        <w:rPr>
+          <w:rFonts w:ascii="Verdana" w:hAnsi="Verdana"/>
+          <w:b/>
+          <w:sz w:val="48"/>
+          <w:szCs w:val="32"/>
+        </w:rPr>
+        <w:t>Notes:</w:t>
       </w:r>
     </w:p>
     <w:p>
       <w:pPr>
-        <w:pStyle w:val="ListParagraph"/>
+        <w:pStyle w:val="NoSpacing"/>
         <w:numPr>
           <w:ilvl w:val="0"/>
-          <w:numId w:val="15"/>
+          <w:numId w:val="19"/>
         </w:numPr>
         <w:rPr>
-          <w:b/>
-          <w:sz w:val="48"/>
-          <w:szCs w:val="48"/>
-        </w:rPr>
-      </w:pPr>
-      <w:r>
-        <w:rPr>
-          <w:sz w:val="32"/>
-          <w:szCs w:val="32"/>
-        </w:rPr>
-        <w:t>Fixed underwater feel is gone when level is loaded repeatedly.</w:t>
+          <w:rFonts w:ascii="Verdana" w:hAnsi="Verdana"/>
+          <w:sz w:val="32"/>
+          <w:szCs w:val="32"/>
+        </w:rPr>
+      </w:pPr>
+      <w:r>
+        <w:rPr>
+          <w:rFonts w:ascii="Verdana" w:hAnsi="Verdana"/>
+          <w:sz w:val="32"/>
+          <w:szCs w:val="32"/>
+        </w:rPr>
+        <w:t>Game uses LWJGL 3.2.3 since v 02 (BELARUS).</w:t>
       </w:r>
     </w:p>
     <w:p>
       <w:pPr>
-        <w:pStyle w:val="ListParagraph"/>
-        <w:rPr>
-          <w:sz w:val="32"/>
-          <w:szCs w:val="32"/>
-        </w:rPr>
-      </w:pPr>
+        <w:pStyle w:val="NoSpacing"/>
+        <w:numPr>
+          <w:ilvl w:val="0"/>
+          <w:numId w:val="19"/>
+        </w:numPr>
+        <w:rPr>
+          <w:rFonts w:ascii="Verdana" w:hAnsi="Verdana"/>
+          <w:sz w:val="32"/>
+          <w:szCs w:val="32"/>
+        </w:rPr>
+      </w:pPr>
+      <w:r>
+        <w:rPr>
+          <w:rFonts w:ascii="Verdana" w:hAnsi="Verdana"/>
+          <w:sz w:val="32"/>
+          <w:szCs w:val="32"/>
+        </w:rPr>
+        <w:t>Game implementation is multithread</w:t>
+      </w:r>
+      <w:r>
+        <w:rPr>
+          <w:rFonts w:ascii="Verdana" w:hAnsi="Verdana"/>
+          <w:sz w:val="32"/>
+          <w:szCs w:val="32"/>
+        </w:rPr>
+        <w:t>ed</w:t>
+      </w:r>
+      <w:r>
+        <w:rPr>
+          <w:rFonts w:ascii="Verdana" w:hAnsi="Verdana"/>
+          <w:sz w:val="32"/>
+          <w:szCs w:val="32"/>
+        </w:rPr>
+        <w:t xml:space="preserve"> (max </w:t>
+      </w:r>
+      <w:r>
+        <w:rPr>
+          <w:rFonts w:ascii="Verdana" w:hAnsi="Verdana"/>
+          <w:sz w:val="32"/>
+          <w:szCs w:val="32"/>
+        </w:rPr>
+        <w:t xml:space="preserve">3 </w:t>
+      </w:r>
+      <w:r>
+        <w:rPr>
+          <w:rFonts w:ascii="Verdana" w:hAnsi="Verdana"/>
+          <w:sz w:val="32"/>
+          <w:szCs w:val="32"/>
+        </w:rPr>
+        <w:t>threads can be active)</w:t>
+      </w:r>
+      <w:r>
+        <w:rPr>
+          <w:rFonts w:ascii="Verdana" w:hAnsi="Verdana"/>
+          <w:sz w:val="32"/>
+          <w:szCs w:val="32"/>
+        </w:rPr>
+        <w:t>.</w:t>
+      </w:r>
     </w:p>
     <w:p>
       <w:pPr>
-        <w:pStyle w:val="ListParagraph"/>
-        <w:rPr>
-          <w:b/>
-          <w:sz w:val="48"/>
-          <w:szCs w:val="48"/>
-        </w:rPr>
-      </w:pPr>
+        <w:pStyle w:val="NoSpacing"/>
+        <w:numPr>
+          <w:ilvl w:val="0"/>
+          <w:numId w:val="19"/>
+        </w:numPr>
+        <w:rPr>
+          <w:rFonts w:ascii="Verdana" w:hAnsi="Verdana"/>
+          <w:sz w:val="32"/>
+          <w:szCs w:val="32"/>
+        </w:rPr>
+      </w:pPr>
+      <w:r>
+        <w:rPr>
+          <w:rFonts w:ascii="Verdana" w:hAnsi="Verdana"/>
+          <w:sz w:val="32"/>
+          <w:szCs w:val="32"/>
+        </w:rPr>
+        <w:t>Running the game requires</w:t>
+      </w:r>
+      <w:r>
+        <w:rPr>
+          <w:rFonts w:ascii="Verdana" w:hAnsi="Verdana"/>
+          <w:sz w:val="32"/>
+          <w:szCs w:val="32"/>
+        </w:rPr>
+        <w:t xml:space="preserve"> Open</w:t>
+      </w:r>
+      <w:r>
+        <w:rPr>
+          <w:rFonts w:ascii="Verdana" w:hAnsi="Verdana"/>
+          <w:sz w:val="32"/>
+          <w:szCs w:val="32"/>
+        </w:rPr>
+        <w:t>GL 3.3</w:t>
+      </w:r>
+      <w:r>
+        <w:rPr>
+          <w:rFonts w:ascii="Verdana" w:hAnsi="Verdana"/>
+          <w:sz w:val="32"/>
+          <w:szCs w:val="32"/>
+        </w:rPr>
+        <w:t xml:space="preserve"> (o</w:t>
+      </w:r>
+      <w:r>
+        <w:rPr>
+          <w:rFonts w:ascii="Verdana" w:hAnsi="Verdana"/>
+          <w:sz w:val="32"/>
+          <w:szCs w:val="32"/>
+        </w:rPr>
+        <w:t>n graphic cards since March 2010</w:t>
+      </w:r>
+      <w:r>
+        <w:rPr>
+          <w:rFonts w:ascii="Verdana" w:hAnsi="Verdana"/>
+          <w:sz w:val="32"/>
+          <w:szCs w:val="32"/>
+        </w:rPr>
+        <w:t>)</w:t>
+      </w:r>
+      <w:r>
+        <w:rPr>
+          <w:rFonts w:ascii="Verdana" w:hAnsi="Verdana"/>
+          <w:sz w:val="32"/>
+          <w:szCs w:val="32"/>
+        </w:rPr>
+        <w:t xml:space="preserve"> or later.</w:t>
+      </w:r>
     </w:p>
     <w:p>
       <w:pPr>
-        <w:pStyle w:val="ListParagraph"/>
-        <w:rPr>
-          <w:b/>
-          <w:sz w:val="48"/>
-          <w:szCs w:val="48"/>
-        </w:rPr>
-      </w:pPr>
-    </w:p>
-    <w:p>
-      <w:pPr>
-        <w:rPr>
-          <w:b/>
-          <w:sz w:val="48"/>
-          <w:szCs w:val="48"/>
-        </w:rPr>
-      </w:pPr>
+        <w:pStyle w:val="NoSpacing"/>
+        <w:numPr>
+          <w:ilvl w:val="0"/>
+          <w:numId w:val="19"/>
+        </w:numPr>
+        <w:rPr>
+          <w:rFonts w:ascii="Verdana" w:hAnsi="Verdana"/>
+          <w:sz w:val="32"/>
+          <w:szCs w:val="32"/>
+        </w:rPr>
+      </w:pPr>
+      <w:r>
+        <w:rPr>
+          <w:rFonts w:ascii="Verdana" w:hAnsi="Verdana"/>
+          <w:sz w:val="32"/>
+          <w:szCs w:val="32"/>
+        </w:rPr>
+        <w:t>Game is implemented using Java version 1.8. (requires 1.8 or higher).</w:t>
+      </w:r>
       <w:bookmarkStart w:id="0" w:name="_GoBack"/>
       <w:bookmarkEnd w:id="0"/>
-    </w:p>
-    <w:p>
-      <w:pPr>
-        <w:rPr>
-          <w:b/>
-          <w:sz w:val="48"/>
-          <w:szCs w:val="48"/>
-        </w:rPr>
-      </w:pPr>
-      <w:r>
-        <w:rPr>
-          <w:b/>
-          <w:sz w:val="48"/>
-          <w:szCs w:val="48"/>
-        </w:rPr>
-        <w:lastRenderedPageBreak/>
-        <w:t>Available commands:</w:t>
-      </w:r>
-    </w:p>
-    <w:p>
-      <w:pPr>
-        <w:pStyle w:val="ListParagraph"/>
-        <w:numPr>
-          <w:ilvl w:val="0"/>
-          <w:numId w:val="9"/>
-        </w:numPr>
-        <w:rPr>
-          <w:sz w:val="32"/>
-          <w:szCs w:val="32"/>
-        </w:rPr>
-      </w:pPr>
-      <w:proofErr w:type="spellStart"/>
-      <w:r>
-        <w:rPr>
-          <w:sz w:val="32"/>
-          <w:szCs w:val="32"/>
-        </w:rPr>
-        <w:t>fps_max</w:t>
-      </w:r>
-      <w:proofErr w:type="spellEnd"/>
-      <w:r>
-        <w:rPr>
-          <w:sz w:val="32"/>
-          <w:szCs w:val="32"/>
-        </w:rPr>
-        <w:t>&lt;</w:t>
-      </w:r>
-      <w:proofErr w:type="spellStart"/>
-      <w:r>
-        <w:rPr>
-          <w:sz w:val="32"/>
-          <w:szCs w:val="32"/>
-        </w:rPr>
-        <w:t>num</w:t>
-      </w:r>
-      <w:proofErr w:type="spellEnd"/>
-      <w:r>
-        <w:rPr>
-          <w:sz w:val="32"/>
-          <w:szCs w:val="32"/>
-        </w:rPr>
-        <w:t xml:space="preserve">&gt;, </w:t>
-      </w:r>
-      <w:proofErr w:type="spellStart"/>
-      <w:r>
-        <w:rPr>
-          <w:sz w:val="32"/>
-          <w:szCs w:val="32"/>
-        </w:rPr>
-        <w:t>fpsMax</w:t>
-      </w:r>
-      <w:proofErr w:type="spellEnd"/>
-      <w:r>
-        <w:rPr>
-          <w:sz w:val="32"/>
-          <w:szCs w:val="32"/>
-        </w:rPr>
-        <w:t>&lt;</w:t>
-      </w:r>
-      <w:proofErr w:type="spellStart"/>
-      <w:r>
-        <w:rPr>
-          <w:sz w:val="32"/>
-          <w:szCs w:val="32"/>
-        </w:rPr>
-        <w:t>num</w:t>
-      </w:r>
-      <w:proofErr w:type="spellEnd"/>
-      <w:r>
-        <w:rPr>
-          <w:sz w:val="32"/>
-          <w:szCs w:val="32"/>
-        </w:rPr>
-        <w:t>&gt;: allowing to change max fps</w:t>
-      </w:r>
-      <w:r>
-        <w:rPr>
-          <w:sz w:val="32"/>
-          <w:szCs w:val="32"/>
-        </w:rPr>
-        <w:t xml:space="preserve"> (it must be positive number)</w:t>
-      </w:r>
-      <w:r>
-        <w:rPr>
-          <w:sz w:val="32"/>
-          <w:szCs w:val="32"/>
-        </w:rPr>
-        <w:t>;</w:t>
-      </w:r>
-    </w:p>
-    <w:p>
-      <w:pPr>
-        <w:pStyle w:val="ListParagraph"/>
-        <w:numPr>
-          <w:ilvl w:val="0"/>
-          <w:numId w:val="9"/>
-        </w:numPr>
-        <w:rPr>
-          <w:sz w:val="32"/>
-          <w:szCs w:val="32"/>
-        </w:rPr>
-      </w:pPr>
-      <w:r>
-        <w:rPr>
-          <w:sz w:val="32"/>
-          <w:szCs w:val="32"/>
-        </w:rPr>
-        <w:t>resolution&lt;width&gt;&lt;height&gt;, res&lt;width&gt;&lt;height&gt;: allowing to change resolution (min resolution is 640x480 whilst max is your native resolution);</w:t>
-      </w:r>
-    </w:p>
-    <w:p>
-      <w:pPr>
-        <w:pStyle w:val="ListParagraph"/>
-        <w:numPr>
-          <w:ilvl w:val="0"/>
-          <w:numId w:val="9"/>
-        </w:numPr>
-        <w:rPr>
-          <w:sz w:val="32"/>
-          <w:szCs w:val="32"/>
-        </w:rPr>
-      </w:pPr>
-      <w:proofErr w:type="spellStart"/>
-      <w:r>
-        <w:rPr>
-          <w:sz w:val="32"/>
-          <w:szCs w:val="32"/>
-        </w:rPr>
-        <w:t>fullscreen</w:t>
-      </w:r>
-      <w:proofErr w:type="spellEnd"/>
-      <w:r>
-        <w:rPr>
-          <w:sz w:val="32"/>
-          <w:szCs w:val="32"/>
-        </w:rPr>
-        <w:t xml:space="preserve">: makes your game run </w:t>
-      </w:r>
-      <w:proofErr w:type="spellStart"/>
-      <w:r>
-        <w:rPr>
-          <w:sz w:val="32"/>
-          <w:szCs w:val="32"/>
-        </w:rPr>
-        <w:t>fullscreen</w:t>
-      </w:r>
-      <w:proofErr w:type="spellEnd"/>
-      <w:r>
-        <w:rPr>
-          <w:sz w:val="32"/>
-          <w:szCs w:val="32"/>
-        </w:rPr>
-        <w:t>;</w:t>
-      </w:r>
-    </w:p>
-    <w:p>
-      <w:pPr>
-        <w:pStyle w:val="ListParagraph"/>
-        <w:numPr>
-          <w:ilvl w:val="0"/>
-          <w:numId w:val="9"/>
-        </w:numPr>
-        <w:rPr>
-          <w:sz w:val="32"/>
-          <w:szCs w:val="32"/>
-        </w:rPr>
-      </w:pPr>
-      <w:r>
-        <w:rPr>
-          <w:sz w:val="32"/>
-          <w:szCs w:val="32"/>
-        </w:rPr>
-        <w:t>windowed: makes your game run windowed mode;</w:t>
-      </w:r>
-    </w:p>
-    <w:p>
-      <w:pPr>
-        <w:pStyle w:val="ListParagraph"/>
-        <w:numPr>
-          <w:ilvl w:val="0"/>
-          <w:numId w:val="9"/>
-        </w:numPr>
-        <w:rPr>
-          <w:sz w:val="32"/>
-          <w:szCs w:val="32"/>
-        </w:rPr>
-      </w:pPr>
-      <w:proofErr w:type="spellStart"/>
-      <w:r>
-        <w:rPr>
-          <w:sz w:val="32"/>
-          <w:szCs w:val="32"/>
-        </w:rPr>
-        <w:t>v_sync</w:t>
-      </w:r>
-      <w:proofErr w:type="spellEnd"/>
-      <w:r>
-        <w:rPr>
-          <w:sz w:val="32"/>
-          <w:szCs w:val="32"/>
-        </w:rPr>
-        <w:t xml:space="preserve"> &lt;bool&gt;</w:t>
-      </w:r>
-      <w:r>
-        <w:rPr>
-          <w:sz w:val="32"/>
-          <w:szCs w:val="32"/>
-        </w:rPr>
-        <w:t xml:space="preserve">, </w:t>
-      </w:r>
-      <w:proofErr w:type="spellStart"/>
-      <w:r>
-        <w:rPr>
-          <w:sz w:val="32"/>
-          <w:szCs w:val="32"/>
-        </w:rPr>
-        <w:t>vsync</w:t>
-      </w:r>
-      <w:proofErr w:type="spellEnd"/>
-      <w:r>
-        <w:rPr>
-          <w:sz w:val="32"/>
-          <w:szCs w:val="32"/>
-        </w:rPr>
-        <w:t>&lt;bool&gt;</w:t>
-      </w:r>
-      <w:r>
-        <w:rPr>
-          <w:sz w:val="32"/>
-          <w:szCs w:val="32"/>
-        </w:rPr>
-        <w:t>: whether</w:t>
-      </w:r>
-      <w:r>
-        <w:rPr>
-          <w:sz w:val="32"/>
-          <w:szCs w:val="32"/>
-        </w:rPr>
-        <w:t xml:space="preserve"> or not you</w:t>
-      </w:r>
-      <w:r>
-        <w:rPr>
-          <w:sz w:val="32"/>
-          <w:szCs w:val="32"/>
-        </w:rPr>
-        <w:t xml:space="preserve"> </w:t>
-      </w:r>
-      <w:proofErr w:type="spellStart"/>
-      <w:r>
-        <w:rPr>
-          <w:sz w:val="32"/>
-          <w:szCs w:val="32"/>
-        </w:rPr>
-        <w:t>wanna</w:t>
-      </w:r>
-      <w:proofErr w:type="spellEnd"/>
-      <w:r>
-        <w:rPr>
-          <w:sz w:val="32"/>
-          <w:szCs w:val="32"/>
-        </w:rPr>
-        <w:t xml:space="preserve"> </w:t>
-      </w:r>
-      <w:proofErr w:type="spellStart"/>
-      <w:r>
-        <w:rPr>
-          <w:sz w:val="32"/>
-          <w:szCs w:val="32"/>
-        </w:rPr>
-        <w:t>vsync</w:t>
-      </w:r>
-      <w:proofErr w:type="spellEnd"/>
-      <w:r>
-        <w:rPr>
-          <w:sz w:val="32"/>
-          <w:szCs w:val="32"/>
-        </w:rPr>
-        <w:t xml:space="preserve"> on or off</w:t>
-      </w:r>
-      <w:r>
-        <w:rPr>
-          <w:sz w:val="32"/>
-          <w:szCs w:val="32"/>
-        </w:rPr>
-        <w:t>.</w:t>
-      </w:r>
-      <w:r>
-        <w:rPr>
-          <w:sz w:val="32"/>
-          <w:szCs w:val="32"/>
-        </w:rPr>
-        <w:t xml:space="preserve"> If it’s on (you’ve set it to true) your fps is capped to your monitor refresh rate.</w:t>
-      </w:r>
-    </w:p>
-    <w:p>
-      <w:pPr>
-        <w:pStyle w:val="ListParagraph"/>
-        <w:numPr>
-          <w:ilvl w:val="0"/>
-          <w:numId w:val="9"/>
-        </w:numPr>
-        <w:rPr>
-          <w:sz w:val="32"/>
-          <w:szCs w:val="32"/>
-        </w:rPr>
-      </w:pPr>
-      <w:proofErr w:type="spellStart"/>
-      <w:r>
-        <w:rPr>
-          <w:sz w:val="32"/>
-          <w:szCs w:val="32"/>
-        </w:rPr>
-        <w:t>water_efects</w:t>
-      </w:r>
-      <w:proofErr w:type="spellEnd"/>
-      <w:r>
-        <w:rPr>
-          <w:sz w:val="32"/>
-          <w:szCs w:val="32"/>
-        </w:rPr>
-        <w:t xml:space="preserve"> &lt;bool&gt;: enables (true) or disables (false) water effects (such as reflection).</w:t>
-      </w:r>
-    </w:p>
-    <w:p>
-      <w:pPr>
-        <w:pStyle w:val="ListParagraph"/>
-        <w:numPr>
-          <w:ilvl w:val="0"/>
-          <w:numId w:val="9"/>
-        </w:numPr>
-        <w:rPr>
-          <w:sz w:val="32"/>
-          <w:szCs w:val="32"/>
-        </w:rPr>
-      </w:pPr>
-      <w:proofErr w:type="spellStart"/>
-      <w:r>
-        <w:rPr>
-          <w:sz w:val="32"/>
-          <w:szCs w:val="32"/>
-        </w:rPr>
-        <w:t>mouse_sensitivity</w:t>
-      </w:r>
-      <w:proofErr w:type="spellEnd"/>
-      <w:r>
-        <w:rPr>
-          <w:sz w:val="32"/>
-          <w:szCs w:val="32"/>
-        </w:rPr>
-        <w:t>&lt;</w:t>
-      </w:r>
-      <w:proofErr w:type="spellStart"/>
-      <w:r>
-        <w:rPr>
-          <w:sz w:val="32"/>
-          <w:szCs w:val="32"/>
-        </w:rPr>
-        <w:t>num</w:t>
-      </w:r>
-      <w:proofErr w:type="spellEnd"/>
-      <w:r>
-        <w:rPr>
-          <w:sz w:val="32"/>
-          <w:szCs w:val="32"/>
-        </w:rPr>
-        <w:t xml:space="preserve">&gt;, </w:t>
-      </w:r>
-      <w:proofErr w:type="spellStart"/>
-      <w:r>
-        <w:rPr>
-          <w:sz w:val="32"/>
-          <w:szCs w:val="32"/>
-        </w:rPr>
-        <w:t>msens</w:t>
-      </w:r>
-      <w:proofErr w:type="spellEnd"/>
-      <w:r>
-        <w:rPr>
-          <w:sz w:val="32"/>
-          <w:szCs w:val="32"/>
-        </w:rPr>
-        <w:t xml:space="preserve"> &lt;</w:t>
-      </w:r>
-      <w:proofErr w:type="spellStart"/>
-      <w:r>
-        <w:rPr>
-          <w:sz w:val="32"/>
-          <w:szCs w:val="32"/>
-        </w:rPr>
-        <w:t>num</w:t>
-      </w:r>
-      <w:proofErr w:type="spellEnd"/>
-      <w:r>
-        <w:rPr>
-          <w:sz w:val="32"/>
-          <w:szCs w:val="32"/>
-        </w:rPr>
-        <w:t>&gt;: sets mouse sensitivity to this value.</w:t>
-      </w:r>
-    </w:p>
-    <w:p>
-      <w:pPr>
-        <w:rPr>
-          <w:sz w:val="32"/>
-          <w:szCs w:val="32"/>
-        </w:rPr>
-      </w:pPr>
-      <w:r>
-        <w:rPr>
-          <w:sz w:val="32"/>
-          <w:szCs w:val="32"/>
-        </w:rPr>
-        <w:t>Notes:</w:t>
-      </w:r>
-    </w:p>
-    <w:p>
-      <w:pPr>
-        <w:pStyle w:val="ListParagraph"/>
-        <w:numPr>
-          <w:ilvl w:val="0"/>
-          <w:numId w:val="10"/>
-        </w:numPr>
-        <w:rPr>
-          <w:sz w:val="32"/>
-          <w:szCs w:val="32"/>
-        </w:rPr>
-      </w:pPr>
-      <w:r>
-        <w:rPr>
-          <w:sz w:val="32"/>
-          <w:szCs w:val="32"/>
-        </w:rPr>
-        <w:t>Game uses LWJGL 3.2.3 since v 02 (BELARUS).</w:t>
-      </w:r>
-    </w:p>
-    <w:p>
-      <w:pPr>
-        <w:pStyle w:val="ListParagraph"/>
-        <w:numPr>
-          <w:ilvl w:val="0"/>
-          <w:numId w:val="10"/>
-        </w:numPr>
-        <w:rPr>
-          <w:sz w:val="32"/>
-          <w:szCs w:val="32"/>
-        </w:rPr>
-      </w:pPr>
-      <w:r>
-        <w:rPr>
-          <w:sz w:val="32"/>
-          <w:szCs w:val="32"/>
-        </w:rPr>
-        <w:t>Game implementation is multithread</w:t>
-      </w:r>
-      <w:r>
-        <w:rPr>
-          <w:sz w:val="32"/>
-          <w:szCs w:val="32"/>
-        </w:rPr>
-        <w:t>ed</w:t>
-      </w:r>
-      <w:r>
-        <w:rPr>
-          <w:sz w:val="32"/>
-          <w:szCs w:val="32"/>
-        </w:rPr>
-        <w:t xml:space="preserve"> (max 2 of 3 threads can be active)</w:t>
-      </w:r>
-      <w:r>
-        <w:rPr>
-          <w:sz w:val="32"/>
-          <w:szCs w:val="32"/>
-        </w:rPr>
-        <w:t>.</w:t>
-      </w:r>
-    </w:p>
-    <w:p>
-      <w:pPr>
-        <w:pStyle w:val="ListParagraph"/>
-        <w:numPr>
-          <w:ilvl w:val="0"/>
-          <w:numId w:val="10"/>
-        </w:numPr>
-        <w:rPr>
-          <w:sz w:val="32"/>
-          <w:szCs w:val="32"/>
-        </w:rPr>
-      </w:pPr>
-      <w:r>
-        <w:rPr>
-          <w:sz w:val="32"/>
-          <w:szCs w:val="32"/>
-        </w:rPr>
-        <w:t>Running the game requires</w:t>
-      </w:r>
-      <w:r>
-        <w:rPr>
-          <w:sz w:val="32"/>
-          <w:szCs w:val="32"/>
-        </w:rPr>
-        <w:t xml:space="preserve"> Open</w:t>
-      </w:r>
-      <w:r>
-        <w:rPr>
-          <w:sz w:val="32"/>
-          <w:szCs w:val="32"/>
-        </w:rPr>
-        <w:t xml:space="preserve">GL 3.3 </w:t>
-      </w:r>
-      <w:r>
-        <w:rPr>
-          <w:sz w:val="32"/>
-          <w:szCs w:val="32"/>
-        </w:rPr>
-        <w:t xml:space="preserve"> </w:t>
-      </w:r>
-      <w:r>
-        <w:rPr>
-          <w:sz w:val="32"/>
-          <w:szCs w:val="32"/>
-        </w:rPr>
-        <w:t>or later.</w:t>
-      </w:r>
     </w:p>
     <w:sectPr>
       <w:pgSz w:w="12240" w:h="15840"/>
@@ -1148,6 +1501,119 @@
     </w:lvl>
   </w:abstractNum>
   <w:abstractNum w:abstractNumId="2">
+    <w:nsid w:val="104F63B2"/>
+    <w:multiLevelType w:val="hybridMultilevel"/>
+    <w:tmpl w:val="B9768288"/>
+    <w:lvl w:ilvl="0" w:tplc="04090001">
+      <w:start w:val="1"/>
+      <w:numFmt w:val="bullet"/>
+      <w:lvlText w:val=""/>
+      <w:lvlJc w:val="left"/>
+      <w:pPr>
+        <w:ind w:left="360" w:hanging="360"/>
+      </w:pPr>
+      <w:rPr>
+        <w:rFonts w:ascii="Symbol" w:hAnsi="Symbol" w:hint="default"/>
+      </w:rPr>
+    </w:lvl>
+    <w:lvl w:ilvl="1" w:tplc="04090003" w:tentative="1">
+      <w:start w:val="1"/>
+      <w:numFmt w:val="bullet"/>
+      <w:lvlText w:val="o"/>
+      <w:lvlJc w:val="left"/>
+      <w:pPr>
+        <w:ind w:left="1080" w:hanging="360"/>
+      </w:pPr>
+      <w:rPr>
+        <w:rFonts w:ascii="Courier New" w:hAnsi="Courier New" w:cs="Courier New" w:hint="default"/>
+      </w:rPr>
+    </w:lvl>
+    <w:lvl w:ilvl="2" w:tplc="04090005" w:tentative="1">
+      <w:start w:val="1"/>
+      <w:numFmt w:val="bullet"/>
+      <w:lvlText w:val=""/>
+      <w:lvlJc w:val="left"/>
+      <w:pPr>
+        <w:ind w:left="1800" w:hanging="360"/>
+      </w:pPr>
+      <w:rPr>
+        <w:rFonts w:ascii="Wingdings" w:hAnsi="Wingdings" w:hint="default"/>
+      </w:rPr>
+    </w:lvl>
+    <w:lvl w:ilvl="3" w:tplc="04090001" w:tentative="1">
+      <w:start w:val="1"/>
+      <w:numFmt w:val="bullet"/>
+      <w:lvlText w:val=""/>
+      <w:lvlJc w:val="left"/>
+      <w:pPr>
+        <w:ind w:left="2520" w:hanging="360"/>
+      </w:pPr>
+      <w:rPr>
+        <w:rFonts w:ascii="Symbol" w:hAnsi="Symbol" w:hint="default"/>
+      </w:rPr>
+    </w:lvl>
+    <w:lvl w:ilvl="4" w:tplc="04090003" w:tentative="1">
+      <w:start w:val="1"/>
+      <w:numFmt w:val="bullet"/>
+      <w:lvlText w:val="o"/>
+      <w:lvlJc w:val="left"/>
+      <w:pPr>
+        <w:ind w:left="3240" w:hanging="360"/>
+      </w:pPr>
+      <w:rPr>
+        <w:rFonts w:ascii="Courier New" w:hAnsi="Courier New" w:cs="Courier New" w:hint="default"/>
+      </w:rPr>
+    </w:lvl>
+    <w:lvl w:ilvl="5" w:tplc="04090005" w:tentative="1">
+      <w:start w:val="1"/>
+      <w:numFmt w:val="bullet"/>
+      <w:lvlText w:val=""/>
+      <w:lvlJc w:val="left"/>
+      <w:pPr>
+        <w:ind w:left="3960" w:hanging="360"/>
+      </w:pPr>
+      <w:rPr>
+        <w:rFonts w:ascii="Wingdings" w:hAnsi="Wingdings" w:hint="default"/>
+      </w:rPr>
+    </w:lvl>
+    <w:lvl w:ilvl="6" w:tplc="04090001" w:tentative="1">
+      <w:start w:val="1"/>
+      <w:numFmt w:val="bullet"/>
+      <w:lvlText w:val=""/>
+      <w:lvlJc w:val="left"/>
+      <w:pPr>
+        <w:ind w:left="4680" w:hanging="360"/>
+      </w:pPr>
+      <w:rPr>
+        <w:rFonts w:ascii="Symbol" w:hAnsi="Symbol" w:hint="default"/>
+      </w:rPr>
+    </w:lvl>
+    <w:lvl w:ilvl="7" w:tplc="04090003" w:tentative="1">
+      <w:start w:val="1"/>
+      <w:numFmt w:val="bullet"/>
+      <w:lvlText w:val="o"/>
+      <w:lvlJc w:val="left"/>
+      <w:pPr>
+        <w:ind w:left="5400" w:hanging="360"/>
+      </w:pPr>
+      <w:rPr>
+        <w:rFonts w:ascii="Courier New" w:hAnsi="Courier New" w:cs="Courier New" w:hint="default"/>
+      </w:rPr>
+    </w:lvl>
+    <w:lvl w:ilvl="8" w:tplc="04090005" w:tentative="1">
+      <w:start w:val="1"/>
+      <w:numFmt w:val="bullet"/>
+      <w:lvlText w:val=""/>
+      <w:lvlJc w:val="left"/>
+      <w:pPr>
+        <w:ind w:left="6120" w:hanging="360"/>
+      </w:pPr>
+      <w:rPr>
+        <w:rFonts w:ascii="Wingdings" w:hAnsi="Wingdings" w:hint="default"/>
+      </w:rPr>
+    </w:lvl>
+  </w:abstractNum>
+  <w:abstractNum w:abstractNumId="3">
     <w:nsid w:val="12230F50"/>
     <w:multiLevelType w:val="hybridMultilevel"/>
     <w:tmpl w:val="48B49748"/>
@@ -1261,7 +1727,7 @@
       </w:rPr>
     </w:lvl>
   </w:abstractNum>
-  <w:abstractNum w:abstractNumId="3">
+  <w:abstractNum w:abstractNumId="4">
     <w:nsid w:val="1BE12BBC"/>
     <w:multiLevelType w:val="hybridMultilevel"/>
     <w:tmpl w:val="F04E8ADA"/>
@@ -1374,7 +1840,7 @@
       </w:rPr>
     </w:lvl>
   </w:abstractNum>
-  <w:abstractNum w:abstractNumId="4">
+  <w:abstractNum w:abstractNumId="5">
     <w:nsid w:val="2E77476A"/>
     <w:multiLevelType w:val="hybridMultilevel"/>
     <w:tmpl w:val="694C00BE"/>
@@ -1489,7 +1955,7 @@
       </w:rPr>
     </w:lvl>
   </w:abstractNum>
-  <w:abstractNum w:abstractNumId="5">
+  <w:abstractNum w:abstractNumId="6">
     <w:nsid w:val="2F63198A"/>
     <w:multiLevelType w:val="hybridMultilevel"/>
     <w:tmpl w:val="8CBEE520"/>
@@ -1602,7 +2068,7 @@
       </w:rPr>
     </w:lvl>
   </w:abstractNum>
-  <w:abstractNum w:abstractNumId="6">
+  <w:abstractNum w:abstractNumId="7">
     <w:nsid w:val="31C4647D"/>
     <w:multiLevelType w:val="hybridMultilevel"/>
     <w:tmpl w:val="C250244E"/>
@@ -1715,7 +2181,121 @@
       </w:rPr>
     </w:lvl>
   </w:abstractNum>
-  <w:abstractNum w:abstractNumId="7">
+  <w:abstractNum w:abstractNumId="8">
+    <w:nsid w:val="47BB246C"/>
+    <w:multiLevelType w:val="hybridMultilevel"/>
+    <w:tmpl w:val="46048FB8"/>
+    <w:lvl w:ilvl="0" w:tplc="C818C576">
+      <w:start w:val="1"/>
+      <w:numFmt w:val="bullet"/>
+      <w:lvlText w:val=""/>
+      <w:lvlJc w:val="left"/>
+      <w:pPr>
+        <w:ind w:left="360" w:hanging="360"/>
+      </w:pPr>
+      <w:rPr>
+        <w:rFonts w:ascii="Symbol" w:hAnsi="Symbol" w:hint="default"/>
+        <w:color w:val="auto"/>
+      </w:rPr>
+    </w:lvl>
+    <w:lvl w:ilvl="1" w:tplc="04090003" w:tentative="1">
+      <w:start w:val="1"/>
+      <w:numFmt w:val="bullet"/>
+      <w:lvlText w:val="o"/>
+      <w:lvlJc w:val="left"/>
+      <w:pPr>
+        <w:ind w:left="1080" w:hanging="360"/>
+      </w:pPr>
+      <w:rPr>
+        <w:rFonts w:ascii="Courier New" w:hAnsi="Courier New" w:cs="Courier New" w:hint="default"/>
+      </w:rPr>
+    </w:lvl>
+    <w:lvl w:ilvl="2" w:tplc="04090005" w:tentative="1">
+      <w:start w:val="1"/>
+      <w:numFmt w:val="bullet"/>
+      <w:lvlText w:val=""/>
+      <w:lvlJc w:val="left"/>
+      <w:pPr>
+        <w:ind w:left="1800" w:hanging="360"/>
+      </w:pPr>
+      <w:rPr>
+        <w:rFonts w:ascii="Wingdings" w:hAnsi="Wingdings" w:hint="default"/>
+      </w:rPr>
+    </w:lvl>
+    <w:lvl w:ilvl="3" w:tplc="04090001" w:tentative="1">
+      <w:start w:val="1"/>
+      <w:numFmt w:val="bullet"/>
+      <w:lvlText w:val=""/>
+      <w:lvlJc w:val="left"/>
+      <w:pPr>
+        <w:ind w:left="2520" w:hanging="360"/>
+      </w:pPr>
+      <w:rPr>
+        <w:rFonts w:ascii="Symbol" w:hAnsi="Symbol" w:hint="default"/>
+      </w:rPr>
+    </w:lvl>
+    <w:lvl w:ilvl="4" w:tplc="04090003" w:tentative="1">
+      <w:start w:val="1"/>
+      <w:numFmt w:val="bullet"/>
+      <w:lvlText w:val="o"/>
+      <w:lvlJc w:val="left"/>
+      <w:pPr>
+        <w:ind w:left="3240" w:hanging="360"/>
+      </w:pPr>
+      <w:rPr>
+        <w:rFonts w:ascii="Courier New" w:hAnsi="Courier New" w:cs="Courier New" w:hint="default"/>
+      </w:rPr>
+    </w:lvl>
+    <w:lvl w:ilvl="5" w:tplc="04090005" w:tentative="1">
+      <w:start w:val="1"/>
+      <w:numFmt w:val="bullet"/>
+      <w:lvlText w:val=""/>
+      <w:lvlJc w:val="left"/>
+      <w:pPr>
+        <w:ind w:left="3960" w:hanging="360"/>
+      </w:pPr>
+      <w:rPr>
+        <w:rFonts w:ascii="Wingdings" w:hAnsi="Wingdings" w:hint="default"/>
+      </w:rPr>
+    </w:lvl>
+    <w:lvl w:ilvl="6" w:tplc="04090001" w:tentative="1">
+      <w:start w:val="1"/>
+      <w:numFmt w:val="bullet"/>
+      <w:lvlText w:val=""/>
+      <w:lvlJc w:val="left"/>
+      <w:pPr>
+        <w:ind w:left="4680" w:hanging="360"/>
+      </w:pPr>
+      <w:rPr>
+        <w:rFonts w:ascii="Symbol" w:hAnsi="Symbol" w:hint="default"/>
+      </w:rPr>
+    </w:lvl>
+    <w:lvl w:ilvl="7" w:tplc="04090003" w:tentative="1">
+      <w:start w:val="1"/>
+      <w:numFmt w:val="bullet"/>
+      <w:lvlText w:val="o"/>
+      <w:lvlJc w:val="left"/>
+      <w:pPr>
+        <w:ind w:left="5400" w:hanging="360"/>
+      </w:pPr>
+      <w:rPr>
+        <w:rFonts w:ascii="Courier New" w:hAnsi="Courier New" w:cs="Courier New" w:hint="default"/>
+      </w:rPr>
+    </w:lvl>
+    <w:lvl w:ilvl="8" w:tplc="04090005" w:tentative="1">
+      <w:start w:val="1"/>
+      <w:numFmt w:val="bullet"/>
+      <w:lvlText w:val=""/>
+      <w:lvlJc w:val="left"/>
+      <w:pPr>
+        <w:ind w:left="6120" w:hanging="360"/>
+      </w:pPr>
+      <w:rPr>
+        <w:rFonts w:ascii="Wingdings" w:hAnsi="Wingdings" w:hint="default"/>
+      </w:rPr>
+    </w:lvl>
+  </w:abstractNum>
+  <w:abstractNum w:abstractNumId="9">
     <w:nsid w:val="49BD1D98"/>
     <w:multiLevelType w:val="hybridMultilevel"/>
     <w:tmpl w:val="3332526C"/>
@@ -1828,7 +2408,7 @@
       </w:rPr>
     </w:lvl>
   </w:abstractNum>
-  <w:abstractNum w:abstractNumId="8">
+  <w:abstractNum w:abstractNumId="10">
     <w:nsid w:val="4CBE58AB"/>
     <w:multiLevelType w:val="hybridMultilevel"/>
     <w:tmpl w:val="F7484EBC"/>
@@ -1942,7 +2522,7 @@
       </w:rPr>
     </w:lvl>
   </w:abstractNum>
-  <w:abstractNum w:abstractNumId="9">
+  <w:abstractNum w:abstractNumId="11">
     <w:nsid w:val="4DFC1534"/>
     <w:multiLevelType w:val="hybridMultilevel"/>
     <w:tmpl w:val="2EF85536"/>
@@ -2055,7 +2635,7 @@
       </w:rPr>
     </w:lvl>
   </w:abstractNum>
-  <w:abstractNum w:abstractNumId="10">
+  <w:abstractNum w:abstractNumId="12">
     <w:nsid w:val="511F51B9"/>
     <w:multiLevelType w:val="hybridMultilevel"/>
     <w:tmpl w:val="F650FDA2"/>
@@ -2168,7 +2748,7 @@
       </w:rPr>
     </w:lvl>
   </w:abstractNum>
-  <w:abstractNum w:abstractNumId="11">
+  <w:abstractNum w:abstractNumId="13">
     <w:nsid w:val="57FA5BDC"/>
     <w:multiLevelType w:val="hybridMultilevel"/>
     <w:tmpl w:val="C1069388"/>
@@ -2281,7 +2861,7 @@
       </w:rPr>
     </w:lvl>
   </w:abstractNum>
-  <w:abstractNum w:abstractNumId="12">
+  <w:abstractNum w:abstractNumId="14">
     <w:nsid w:val="6A465EA9"/>
     <w:multiLevelType w:val="hybridMultilevel"/>
     <w:tmpl w:val="83527182"/>
@@ -2394,7 +2974,7 @@
       </w:rPr>
     </w:lvl>
   </w:abstractNum>
-  <w:abstractNum w:abstractNumId="13">
+  <w:abstractNum w:abstractNumId="15">
     <w:nsid w:val="6E0F0971"/>
     <w:multiLevelType w:val="hybridMultilevel"/>
     <w:tmpl w:val="EF481D2C"/>
@@ -2508,7 +3088,7 @@
       </w:rPr>
     </w:lvl>
   </w:abstractNum>
-  <w:abstractNum w:abstractNumId="14">
+  <w:abstractNum w:abstractNumId="16">
     <w:nsid w:val="74E724D3"/>
     <w:multiLevelType w:val="hybridMultilevel"/>
     <w:tmpl w:val="EDCC46EC"/>
@@ -2621,7 +3201,7 @@
       </w:rPr>
     </w:lvl>
   </w:abstractNum>
-  <w:abstractNum w:abstractNumId="15">
+  <w:abstractNum w:abstractNumId="17">
     <w:nsid w:val="7C7B411A"/>
     <w:multiLevelType w:val="hybridMultilevel"/>
     <w:tmpl w:val="DD327E98"/>
@@ -2735,54 +3315,60 @@
     </w:lvl>
   </w:abstractNum>
   <w:num w:numId="1">
-    <w:abstractNumId w:val="14"/>
+    <w:abstractNumId w:val="16"/>
   </w:num>
   <w:num w:numId="2">
+    <w:abstractNumId w:val="13"/>
+  </w:num>
+  <w:num w:numId="3">
     <w:abstractNumId w:val="11"/>
   </w:num>
-  <w:num w:numId="3">
-    <w:abstractNumId w:val="9"/>
-  </w:num>
   <w:num w:numId="4">
-    <w:abstractNumId w:val="5"/>
+    <w:abstractNumId w:val="6"/>
   </w:num>
   <w:num w:numId="5">
-    <w:abstractNumId w:val="3"/>
+    <w:abstractNumId w:val="4"/>
   </w:num>
   <w:num w:numId="6">
     <w:abstractNumId w:val="1"/>
   </w:num>
   <w:num w:numId="7">
+    <w:abstractNumId w:val="14"/>
+  </w:num>
+  <w:num w:numId="8">
+    <w:abstractNumId w:val="7"/>
+  </w:num>
+  <w:num w:numId="9">
     <w:abstractNumId w:val="12"/>
   </w:num>
-  <w:num w:numId="8">
-    <w:abstractNumId w:val="6"/>
-  </w:num>
-  <w:num w:numId="9">
-    <w:abstractNumId w:val="10"/>
-  </w:num>
   <w:num w:numId="10">
-    <w:abstractNumId w:val="7"/>
+    <w:abstractNumId w:val="9"/>
   </w:num>
   <w:num w:numId="11">
     <w:abstractNumId w:val="0"/>
   </w:num>
   <w:num w:numId="12">
+    <w:abstractNumId w:val="17"/>
+  </w:num>
+  <w:num w:numId="13">
+    <w:abstractNumId w:val="7"/>
+  </w:num>
+  <w:num w:numId="14">
     <w:abstractNumId w:val="15"/>
   </w:num>
-  <w:num w:numId="13">
-    <w:abstractNumId w:val="6"/>
-  </w:num>
-  <w:num w:numId="14">
-    <w:abstractNumId w:val="13"/>
-  </w:num>
   <w:num w:numId="15">
-    <w:abstractNumId w:val="4"/>
+    <w:abstractNumId w:val="5"/>
   </w:num>
   <w:num w:numId="16">
+    <w:abstractNumId w:val="3"/>
+  </w:num>
+  <w:num w:numId="17">
+    <w:abstractNumId w:val="10"/>
+  </w:num>
+  <w:num w:numId="18">
     <w:abstractNumId w:val="2"/>
   </w:num>
-  <w:num w:numId="17">
+  <w:num w:numId="19">
     <w:abstractNumId w:val="8"/>
   </w:num>
 </w:numbering>
@@ -3016,6 +3602,15 @@
       <w:szCs w:val="16"/>
     </w:rPr>
   </w:style>
+  <w:style w:type="paragraph" w:styleId="NoSpacing">
+    <w:name w:val="No Spacing"/>
+    <w:uiPriority w:val="1"/>
+    <w:qFormat/>
+    <w:rsid w:val="006456AE"/>
+    <w:pPr>
+      <w:spacing w:after="0" w:line="240" w:lineRule="auto"/>
+    </w:pPr>
+  </w:style>
 </w:styles>
 </file>
 
@@ -3246,6 +3841,15 @@
       <w:sz w:val="16"/>
       <w:szCs w:val="16"/>
     </w:rPr>
+  </w:style>
+  <w:style w:type="paragraph" w:styleId="NoSpacing">
+    <w:name w:val="No Spacing"/>
+    <w:uiPriority w:val="1"/>
+    <w:qFormat/>
+    <w:rsid w:val="006456AE"/>
+    <w:pPr>
+      <w:spacing w:after="0" w:line="240" w:lineRule="auto"/>
+    </w:pPr>
   </w:style>
 </w:styles>
 </file>
@@ -3540,7 +4144,7 @@
 </file>
 
 <file path=customXml/itemProps1.xml><?xml version="1.0" encoding="utf-8"?>
-<ds:datastoreItem xmlns:ds="http://schemas.openxmlformats.org/officeDocument/2006/customXml" ds:itemID="{06786EEE-522C-4AB7-BA6B-651E9AD53CC3}">
+<ds:datastoreItem xmlns:ds="http://schemas.openxmlformats.org/officeDocument/2006/customXml" ds:itemID="{F0D639A2-B4D5-49B7-80CC-5B18E87FEF38}">
   <ds:schemaRefs>
     <ds:schemaRef ds:uri="http://schemas.openxmlformats.org/officeDocument/2006/bibliography"/>
   </ds:schemaRefs>

</xml_diff>

<commit_message>
Tweaking for more FPS MK2. Version 09 IKAROS U22!
</commit_message>
<xml_diff>
--- a/changelog.docx
+++ b/changelog.docx
@@ -244,32 +244,6 @@
         </w:rPr>
         <w:t>nstance rendering is being used.</w:t>
       </w:r>
-      <w:r>
-        <w:rPr>
-          <w:rFonts w:ascii="Verdana" w:hAnsi="Verdana"/>
-          <w:color w:val="00B050"/>
-          <w:sz w:val="32"/>
-          <w:szCs w:val="32"/>
-        </w:rPr>
-        <w:t xml:space="preserve"> </w:t>
-      </w:r>
-      <w:r>
-        <w:rPr>
-          <w:rFonts w:ascii="Verdana" w:hAnsi="Verdana"/>
-          <w:sz w:val="32"/>
-          <w:szCs w:val="32"/>
-        </w:rPr>
-        <w:t>Changes to free block placement. Looks better now.</w:t>
-      </w:r>
-      <w:r>
-        <w:rPr>
-          <w:rFonts w:ascii="Verdana" w:hAnsi="Verdana"/>
-          <w:color w:val="00B050"/>
-          <w:sz w:val="32"/>
-          <w:szCs w:val="32"/>
-        </w:rPr>
-        <w:t xml:space="preserve"> </w:t>
-      </w:r>
     </w:p>
     <w:p>
       <w:pPr>
@@ -291,6 +265,70 @@
           <w:sz w:val="32"/>
           <w:szCs w:val="32"/>
         </w:rPr>
+        <w:t>Improved synchronization of threads. One thread removed.</w:t>
+      </w:r>
+      <w:r>
+        <w:rPr>
+          <w:rFonts w:ascii="Verdana" w:hAnsi="Verdana"/>
+          <w:color w:val="00B050"/>
+          <w:sz w:val="32"/>
+          <w:szCs w:val="32"/>
+        </w:rPr>
+        <w:t xml:space="preserve"> </w:t>
+      </w:r>
+    </w:p>
+    <w:p>
+      <w:pPr>
+        <w:pStyle w:val="NoSpacing"/>
+        <w:numPr>
+          <w:ilvl w:val="0"/>
+          <w:numId w:val="19"/>
+        </w:numPr>
+        <w:rPr>
+          <w:rFonts w:ascii="Verdana" w:hAnsi="Verdana"/>
+          <w:color w:val="00B050"/>
+          <w:sz w:val="32"/>
+          <w:szCs w:val="32"/>
+        </w:rPr>
+      </w:pPr>
+      <w:r>
+        <w:rPr>
+          <w:rFonts w:ascii="Verdana" w:hAnsi="Verdana"/>
+          <w:sz w:val="32"/>
+          <w:szCs w:val="32"/>
+        </w:rPr>
+        <w:t>Changes to free block placement. Looks better now.</w:t>
+      </w:r>
+      <w:r>
+        <w:rPr>
+          <w:rFonts w:ascii="Verdana" w:hAnsi="Verdana"/>
+          <w:color w:val="00B050"/>
+          <w:sz w:val="32"/>
+          <w:szCs w:val="32"/>
+        </w:rPr>
+        <w:t xml:space="preserve"> </w:t>
+      </w:r>
+    </w:p>
+    <w:p>
+      <w:pPr>
+        <w:pStyle w:val="NoSpacing"/>
+        <w:numPr>
+          <w:ilvl w:val="0"/>
+          <w:numId w:val="19"/>
+        </w:numPr>
+        <w:rPr>
+          <w:rFonts w:ascii="Verdana" w:hAnsi="Verdana"/>
+          <w:color w:val="00B050"/>
+          <w:sz w:val="32"/>
+          <w:szCs w:val="32"/>
+        </w:rPr>
+      </w:pPr>
+      <w:r>
+        <w:rPr>
+          <w:rFonts w:ascii="Verdana" w:hAnsi="Verdana"/>
+          <w:sz w:val="32"/>
+          <w:szCs w:val="32"/>
+        </w:rPr>
         <w:t>Progress information is now more independent and it’s updated periodically.</w:t>
       </w:r>
     </w:p>
@@ -463,38 +501,6 @@
         <w:pStyle w:val="NoSpacing"/>
         <w:rPr>
           <w:rFonts w:ascii="Verdana" w:hAnsi="Verdana"/>
-        </w:rPr>
-      </w:pPr>
-    </w:p>
-    <w:p>
-      <w:pPr>
-        <w:pStyle w:val="NoSpacing"/>
-        <w:rPr>
-          <w:rFonts w:ascii="Verdana" w:hAnsi="Verdana"/>
-        </w:rPr>
-      </w:pPr>
-    </w:p>
-    <w:p>
-      <w:pPr>
-        <w:pStyle w:val="NoSpacing"/>
-        <w:rPr>
-          <w:rFonts w:ascii="Verdana" w:hAnsi="Verdana"/>
-        </w:rPr>
-      </w:pPr>
-    </w:p>
-    <w:p>
-      <w:pPr>
-        <w:pStyle w:val="NoSpacing"/>
-        <w:rPr>
-          <w:rFonts w:ascii="Verdana" w:hAnsi="Verdana"/>
-        </w:rPr>
-      </w:pPr>
-    </w:p>
-    <w:p>
-      <w:pPr>
-        <w:pStyle w:val="NoSpacing"/>
-        <w:rPr>
-          <w:rFonts w:ascii="Verdana" w:hAnsi="Verdana"/>
           <w:b/>
           <w:sz w:val="48"/>
         </w:rPr>
@@ -506,7 +512,17 @@
           <w:sz w:val="48"/>
         </w:rPr>
         <w:lastRenderedPageBreak/>
-        <w:t>Available commands:</w:t>
+        <w:t>A</w:t>
+      </w:r>
+      <w:bookmarkStart w:id="0" w:name="_GoBack"/>
+      <w:bookmarkEnd w:id="0"/>
+      <w:r>
+        <w:rPr>
+          <w:rFonts w:ascii="Verdana" w:hAnsi="Verdana"/>
+          <w:b/>
+          <w:sz w:val="48"/>
+        </w:rPr>
+        <w:t>vailable commands:</w:t>
       </w:r>
     </w:p>
     <w:p>
@@ -1149,7 +1165,15 @@
           <w:sz w:val="32"/>
           <w:szCs w:val="32"/>
         </w:rPr>
-        <w:t xml:space="preserve">3 </w:t>
+        <w:t>2</w:t>
+      </w:r>
+      <w:r>
+        <w:rPr>
+          <w:rFonts w:ascii="Verdana" w:hAnsi="Verdana"/>
+          <w:sz w:val="32"/>
+          <w:szCs w:val="32"/>
+        </w:rPr>
+        <w:t xml:space="preserve"> </w:t>
       </w:r>
       <w:r>
         <w:rPr>
@@ -1259,8 +1283,6 @@
         </w:rPr>
         <w:t>Game is implemented using Java version 1.8. (requires 1.8 or higher).</w:t>
       </w:r>
-      <w:bookmarkStart w:id="0" w:name="_GoBack"/>
-      <w:bookmarkEnd w:id="0"/>
     </w:p>
     <w:sectPr>
       <w:pgSz w:w="12240" w:h="15840"/>
@@ -4144,7 +4166,7 @@
 </file>
 
 <file path=customXml/itemProps1.xml><?xml version="1.0" encoding="utf-8"?>
-<ds:datastoreItem xmlns:ds="http://schemas.openxmlformats.org/officeDocument/2006/customXml" ds:itemID="{F0D639A2-B4D5-49B7-80CC-5B18E87FEF38}">
+<ds:datastoreItem xmlns:ds="http://schemas.openxmlformats.org/officeDocument/2006/customXml" ds:itemID="{6BBFE52B-85C7-4B33-8F78-91F253823619}">
   <ds:schemaRefs>
     <ds:schemaRef ds:uri="http://schemas.openxmlformats.org/officeDocument/2006/bibliography"/>
   </ds:schemaRefs>

</xml_diff>

<commit_message>
Implement Concurrent dialog for Rand Lvl Gen. Version 09 IKAROS U24!
</commit_message>
<xml_diff>
--- a/changelog.docx
+++ b/changelog.docx
@@ -512,17 +512,7 @@
           <w:sz w:val="48"/>
         </w:rPr>
         <w:lastRenderedPageBreak/>
-        <w:t>A</w:t>
-      </w:r>
-      <w:bookmarkStart w:id="0" w:name="_GoBack"/>
-      <w:bookmarkEnd w:id="0"/>
-      <w:r>
-        <w:rPr>
-          <w:rFonts w:ascii="Verdana" w:hAnsi="Verdana"/>
-          <w:b/>
-          <w:sz w:val="48"/>
-        </w:rPr>
-        <w:t>vailable commands:</w:t>
+        <w:t>Available commands:</w:t>
       </w:r>
     </w:p>
     <w:p>
@@ -1157,7 +1147,15 @@
           <w:sz w:val="32"/>
           <w:szCs w:val="32"/>
         </w:rPr>
-        <w:t xml:space="preserve"> (max </w:t>
+        <w:t xml:space="preserve"> (</w:t>
+      </w:r>
+      <w:r>
+        <w:rPr>
+          <w:rFonts w:ascii="Verdana" w:hAnsi="Verdana"/>
+          <w:sz w:val="32"/>
+          <w:szCs w:val="32"/>
+        </w:rPr>
+        <w:t xml:space="preserve">at most time </w:t>
       </w:r>
       <w:r>
         <w:rPr>
@@ -1181,7 +1179,33 @@
           <w:sz w:val="32"/>
           <w:szCs w:val="32"/>
         </w:rPr>
-        <w:t>threads can be active)</w:t>
+        <w:t>threads will</w:t>
+      </w:r>
+      <w:r>
+        <w:rPr>
+          <w:rFonts w:ascii="Verdana" w:hAnsi="Verdana"/>
+          <w:sz w:val="32"/>
+          <w:szCs w:val="32"/>
+        </w:rPr>
+        <w:t xml:space="preserve"> be active</w:t>
+      </w:r>
+      <w:r>
+        <w:rPr>
+          <w:rFonts w:ascii="Verdana" w:hAnsi="Verdana"/>
+          <w:sz w:val="32"/>
+          <w:szCs w:val="32"/>
+        </w:rPr>
+        <w:t xml:space="preserve"> + 1 additional thread if random level generator is being used</w:t>
+      </w:r>
+      <w:bookmarkStart w:id="0" w:name="_GoBack"/>
+      <w:bookmarkEnd w:id="0"/>
+      <w:r>
+        <w:rPr>
+          <w:rFonts w:ascii="Verdana" w:hAnsi="Verdana"/>
+          <w:sz w:val="32"/>
+          <w:szCs w:val="32"/>
+        </w:rPr>
+        <w:t>)</w:t>
       </w:r>
       <w:r>
         <w:rPr>
@@ -4166,7 +4190,7 @@
 </file>
 
 <file path=customXml/itemProps1.xml><?xml version="1.0" encoding="utf-8"?>
-<ds:datastoreItem xmlns:ds="http://schemas.openxmlformats.org/officeDocument/2006/customXml" ds:itemID="{6BBFE52B-85C7-4B33-8F78-91F253823619}">
+<ds:datastoreItem xmlns:ds="http://schemas.openxmlformats.org/officeDocument/2006/customXml" ds:itemID="{2522A15A-EDC0-42F3-9257-4CA80549AC95}">
   <ds:schemaRefs>
     <ds:schemaRef ds:uri="http://schemas.openxmlformats.org/officeDocument/2006/bibliography"/>
   </ds:schemaRefs>

</xml_diff>

<commit_message>
Improving Random Level Generator II. Version 09 IKAROS U27!
</commit_message>
<xml_diff>
--- a/changelog.docx
+++ b/changelog.docx
@@ -335,6 +335,84 @@
     <w:p>
       <w:pPr>
         <w:pStyle w:val="NoSpacing"/>
+        <w:numPr>
+          <w:ilvl w:val="0"/>
+          <w:numId w:val="19"/>
+        </w:numPr>
+        <w:rPr>
+          <w:rFonts w:ascii="Verdana" w:hAnsi="Verdana"/>
+          <w:color w:val="00B050"/>
+          <w:sz w:val="32"/>
+          <w:szCs w:val="32"/>
+        </w:rPr>
+      </w:pPr>
+      <w:r>
+        <w:rPr>
+          <w:rFonts w:ascii="Verdana" w:hAnsi="Verdana"/>
+          <w:sz w:val="32"/>
+          <w:szCs w:val="32"/>
+        </w:rPr>
+        <w:t xml:space="preserve">Random </w:t>
+      </w:r>
+      <w:r>
+        <w:rPr>
+          <w:rFonts w:ascii="Verdana" w:hAnsi="Verdana"/>
+          <w:sz w:val="32"/>
+          <w:szCs w:val="32"/>
+        </w:rPr>
+        <w:t>L</w:t>
+      </w:r>
+      <w:r>
+        <w:rPr>
+          <w:rFonts w:ascii="Verdana" w:hAnsi="Verdana"/>
+          <w:sz w:val="32"/>
+          <w:szCs w:val="32"/>
+        </w:rPr>
+        <w:t xml:space="preserve">evel </w:t>
+      </w:r>
+      <w:r>
+        <w:rPr>
+          <w:rFonts w:ascii="Verdana" w:hAnsi="Verdana"/>
+          <w:sz w:val="32"/>
+          <w:szCs w:val="32"/>
+        </w:rPr>
+        <w:t xml:space="preserve">Generator </w:t>
+      </w:r>
+      <w:r>
+        <w:rPr>
+          <w:rFonts w:ascii="Verdana" w:hAnsi="Verdana"/>
+          <w:sz w:val="32"/>
+          <w:szCs w:val="32"/>
+        </w:rPr>
+        <w:t>takes exact number of blocks instead of maximum random number of blocks.</w:t>
+      </w:r>
+    </w:p>
+    <w:p>
+      <w:pPr>
+        <w:pStyle w:val="NoSpacing"/>
+        <w:numPr>
+          <w:ilvl w:val="0"/>
+          <w:numId w:val="19"/>
+        </w:numPr>
+        <w:rPr>
+          <w:rFonts w:ascii="Verdana" w:hAnsi="Verdana"/>
+          <w:color w:val="00B050"/>
+          <w:sz w:val="32"/>
+          <w:szCs w:val="32"/>
+        </w:rPr>
+      </w:pPr>
+      <w:r>
+        <w:rPr>
+          <w:rFonts w:ascii="Verdana" w:hAnsi="Verdana"/>
+          <w:sz w:val="32"/>
+          <w:szCs w:val="32"/>
+        </w:rPr>
+        <w:t>Random level generation can be terminated at any time by exiting application.</w:t>
+      </w:r>
+    </w:p>
+    <w:p>
+      <w:pPr>
+        <w:pStyle w:val="NoSpacing"/>
         <w:ind w:left="360"/>
         <w:rPr>
           <w:rFonts w:ascii="Verdana" w:hAnsi="Verdana"/>
@@ -461,50 +539,12 @@
         <w:pStyle w:val="NoSpacing"/>
         <w:rPr>
           <w:rFonts w:ascii="Verdana" w:hAnsi="Verdana"/>
-        </w:rPr>
-      </w:pPr>
-    </w:p>
-    <w:p>
-      <w:pPr>
-        <w:pStyle w:val="NoSpacing"/>
-        <w:rPr>
-          <w:rFonts w:ascii="Verdana" w:hAnsi="Verdana"/>
-        </w:rPr>
-      </w:pPr>
-    </w:p>
-    <w:p>
-      <w:pPr>
-        <w:pStyle w:val="NoSpacing"/>
-        <w:rPr>
-          <w:rFonts w:ascii="Verdana" w:hAnsi="Verdana"/>
-        </w:rPr>
-      </w:pPr>
-    </w:p>
-    <w:p>
-      <w:pPr>
-        <w:pStyle w:val="NoSpacing"/>
-        <w:rPr>
-          <w:rFonts w:ascii="Verdana" w:hAnsi="Verdana"/>
-        </w:rPr>
-      </w:pPr>
-    </w:p>
-    <w:p>
-      <w:pPr>
-        <w:pStyle w:val="NoSpacing"/>
-        <w:rPr>
-          <w:rFonts w:ascii="Verdana" w:hAnsi="Verdana"/>
-        </w:rPr>
-      </w:pPr>
-    </w:p>
-    <w:p>
-      <w:pPr>
-        <w:pStyle w:val="NoSpacing"/>
-        <w:rPr>
-          <w:rFonts w:ascii="Verdana" w:hAnsi="Verdana"/>
           <w:b/>
           <w:sz w:val="48"/>
         </w:rPr>
       </w:pPr>
+      <w:bookmarkStart w:id="0" w:name="_GoBack"/>
+      <w:bookmarkEnd w:id="0"/>
       <w:r>
         <w:rPr>
           <w:rFonts w:ascii="Verdana" w:hAnsi="Verdana"/>
@@ -1197,8 +1237,6 @@
         </w:rPr>
         <w:t xml:space="preserve"> + 1 additional thread if random level generator is being used</w:t>
       </w:r>
-      <w:bookmarkStart w:id="0" w:name="_GoBack"/>
-      <w:bookmarkEnd w:id="0"/>
       <w:r>
         <w:rPr>
           <w:rFonts w:ascii="Verdana" w:hAnsi="Verdana"/>
@@ -4190,7 +4228,7 @@
 </file>
 
 <file path=customXml/itemProps1.xml><?xml version="1.0" encoding="utf-8"?>
-<ds:datastoreItem xmlns:ds="http://schemas.openxmlformats.org/officeDocument/2006/customXml" ds:itemID="{2522A15A-EDC0-42F3-9257-4CA80549AC95}">
+<ds:datastoreItem xmlns:ds="http://schemas.openxmlformats.org/officeDocument/2006/customXml" ds:itemID="{F6208714-DCAD-40A2-8822-7D6313425536}">
   <ds:schemaRefs>
     <ds:schemaRef ds:uri="http://schemas.openxmlformats.org/officeDocument/2006/bibliography"/>
   </ds:schemaRefs>

</xml_diff>

<commit_message>
Speeding up Random Level Generator! Version 10 JAPANESE U01!
</commit_message>
<xml_diff>
--- a/changelog.docx
+++ b/changelog.docx
@@ -36,7 +36,7 @@
           <w:b/>
           <w:sz w:val="48"/>
         </w:rPr>
-        <w:t>09</w:t>
+        <w:t>10</w:t>
       </w:r>
       <w:r>
         <w:rPr>
@@ -52,7 +52,7 @@
           <w:b/>
           <w:sz w:val="48"/>
         </w:rPr>
-        <w:t>IKAROS</w:t>
+        <w:t>JAPANESE</w:t>
       </w:r>
       <w:r>
         <w:rPr>
@@ -413,6 +413,31 @@
     <w:p>
       <w:pPr>
         <w:pStyle w:val="NoSpacing"/>
+        <w:numPr>
+          <w:ilvl w:val="0"/>
+          <w:numId w:val="19"/>
+        </w:numPr>
+        <w:rPr>
+          <w:rFonts w:ascii="Verdana" w:hAnsi="Verdana"/>
+          <w:color w:val="00B050"/>
+          <w:sz w:val="32"/>
+          <w:szCs w:val="32"/>
+        </w:rPr>
+      </w:pPr>
+      <w:r>
+        <w:rPr>
+          <w:rFonts w:ascii="Verdana" w:hAnsi="Verdana"/>
+          <w:sz w:val="32"/>
+          <w:szCs w:val="32"/>
+        </w:rPr>
+        <w:t>Random Level Generator generates level faster.</w:t>
+      </w:r>
+      <w:bookmarkStart w:id="0" w:name="_GoBack"/>
+      <w:bookmarkEnd w:id="0"/>
+    </w:p>
+    <w:p>
+      <w:pPr>
+        <w:pStyle w:val="NoSpacing"/>
         <w:ind w:left="360"/>
         <w:rPr>
           <w:rFonts w:ascii="Verdana" w:hAnsi="Verdana"/>
@@ -507,44 +532,10 @@
         <w:pStyle w:val="NoSpacing"/>
         <w:rPr>
           <w:rFonts w:ascii="Verdana" w:hAnsi="Verdana"/>
-        </w:rPr>
-      </w:pPr>
-    </w:p>
-    <w:p>
-      <w:pPr>
-        <w:pStyle w:val="NoSpacing"/>
-        <w:rPr>
-          <w:rFonts w:ascii="Verdana" w:hAnsi="Verdana"/>
-        </w:rPr>
-      </w:pPr>
-    </w:p>
-    <w:p>
-      <w:pPr>
-        <w:pStyle w:val="NoSpacing"/>
-        <w:rPr>
-          <w:rFonts w:ascii="Verdana" w:hAnsi="Verdana"/>
-        </w:rPr>
-      </w:pPr>
-    </w:p>
-    <w:p>
-      <w:pPr>
-        <w:pStyle w:val="NoSpacing"/>
-        <w:rPr>
-          <w:rFonts w:ascii="Verdana" w:hAnsi="Verdana"/>
-        </w:rPr>
-      </w:pPr>
-    </w:p>
-    <w:p>
-      <w:pPr>
-        <w:pStyle w:val="NoSpacing"/>
-        <w:rPr>
-          <w:rFonts w:ascii="Verdana" w:hAnsi="Verdana"/>
           <w:b/>
           <w:sz w:val="48"/>
         </w:rPr>
       </w:pPr>
-      <w:bookmarkStart w:id="0" w:name="_GoBack"/>
-      <w:bookmarkEnd w:id="0"/>
       <w:r>
         <w:rPr>
           <w:rFonts w:ascii="Verdana" w:hAnsi="Verdana"/>
@@ -4228,7 +4219,7 @@
 </file>
 
 <file path=customXml/itemProps1.xml><?xml version="1.0" encoding="utf-8"?>
-<ds:datastoreItem xmlns:ds="http://schemas.openxmlformats.org/officeDocument/2006/customXml" ds:itemID="{F6208714-DCAD-40A2-8822-7D6313425536}">
+<ds:datastoreItem xmlns:ds="http://schemas.openxmlformats.org/officeDocument/2006/customXml" ds:itemID="{24C80AB0-7B7E-4D30-B193-391CB07909BD}">
   <ds:schemaRefs>
     <ds:schemaRef ds:uri="http://schemas.openxmlformats.org/officeDocument/2006/bibliography"/>
   </ds:schemaRefs>

</xml_diff>

<commit_message>
Tweaking camera code for more fps. For Version 1.0.2 - KOREANS U04!
</commit_message>
<xml_diff>
--- a/changelog.docx
+++ b/changelog.docx
@@ -36,7 +36,7 @@
           <w:b/>
           <w:sz w:val="48"/>
         </w:rPr>
-        <w:t>10</w:t>
+        <w:t>1</w:t>
       </w:r>
       <w:r>
         <w:rPr>
@@ -44,7 +44,7 @@
           <w:b/>
           <w:sz w:val="48"/>
         </w:rPr>
-        <w:t xml:space="preserve"> (</w:t>
+        <w:t>1</w:t>
       </w:r>
       <w:r>
         <w:rPr>
@@ -52,7 +52,15 @@
           <w:b/>
           <w:sz w:val="48"/>
         </w:rPr>
-        <w:t>JAPANESE</w:t>
+        <w:t xml:space="preserve"> (</w:t>
+      </w:r>
+      <w:r>
+        <w:rPr>
+          <w:rFonts w:ascii="Verdana" w:hAnsi="Verdana"/>
+          <w:b/>
+          <w:sz w:val="48"/>
+        </w:rPr>
+        <w:t>KOREANS</w:t>
       </w:r>
       <w:r>
         <w:rPr>
@@ -183,7 +191,7 @@
         <w:rPr>
           <w:rFonts w:ascii="Verdana" w:hAnsi="Verdana"/>
           <w:b/>
-          <w:color w:val="FFC000"/>
+          <w:color w:val="00B050"/>
           <w:sz w:val="48"/>
         </w:rPr>
       </w:pPr>
@@ -191,19 +199,10 @@
         <w:rPr>
           <w:rFonts w:ascii="Verdana" w:hAnsi="Verdana"/>
           <w:b/>
-          <w:color w:val="FFC000"/>
+          <w:color w:val="00B050"/>
           <w:sz w:val="48"/>
         </w:rPr>
-        <w:t>CHANGES</w:t>
-      </w:r>
-      <w:r>
-        <w:rPr>
-          <w:rFonts w:ascii="Verdana" w:hAnsi="Verdana"/>
-          <w:b/>
-          <w:color w:val="FFC000"/>
-          <w:sz w:val="48"/>
-        </w:rPr>
-        <w:t>:</w:t>
+        <w:t>FEATURES:</w:t>
       </w:r>
     </w:p>
     <w:p>
@@ -226,23 +225,48 @@
           <w:sz w:val="32"/>
           <w:szCs w:val="32"/>
         </w:rPr>
-        <w:t>Improved framerate</w:t>
-      </w:r>
-      <w:r>
-        <w:rPr>
-          <w:rFonts w:ascii="Verdana" w:hAnsi="Verdana"/>
-          <w:sz w:val="32"/>
-          <w:szCs w:val="32"/>
-        </w:rPr>
-        <w:t xml:space="preserve"> as i</w:t>
-      </w:r>
-      <w:r>
-        <w:rPr>
-          <w:rFonts w:ascii="Verdana" w:hAnsi="Verdana"/>
-          <w:sz w:val="32"/>
-          <w:szCs w:val="32"/>
-        </w:rPr>
-        <w:t>nstance rendering is being used.</w:t>
+        <w:t>First fog implementation.</w:t>
+      </w:r>
+    </w:p>
+    <w:p>
+      <w:pPr>
+        <w:pStyle w:val="NoSpacing"/>
+        <w:ind w:left="360"/>
+        <w:rPr>
+          <w:rFonts w:ascii="Verdana" w:hAnsi="Verdana"/>
+          <w:color w:val="00B050"/>
+          <w:sz w:val="32"/>
+          <w:szCs w:val="32"/>
+        </w:rPr>
+      </w:pPr>
+    </w:p>
+    <w:p>
+      <w:pPr>
+        <w:pStyle w:val="NoSpacing"/>
+        <w:rPr>
+          <w:rFonts w:ascii="Verdana" w:hAnsi="Verdana"/>
+          <w:b/>
+          <w:color w:val="FFC000"/>
+          <w:sz w:val="48"/>
+        </w:rPr>
+      </w:pPr>
+      <w:r>
+        <w:rPr>
+          <w:rFonts w:ascii="Verdana" w:hAnsi="Verdana"/>
+          <w:b/>
+          <w:color w:val="FFC000"/>
+          <w:sz w:val="48"/>
+        </w:rPr>
+        <w:t>CHANGES</w:t>
+      </w:r>
+      <w:r>
+        <w:rPr>
+          <w:rFonts w:ascii="Verdana" w:hAnsi="Verdana"/>
+          <w:b/>
+          <w:color w:val="FFC000"/>
+          <w:sz w:val="48"/>
+        </w:rPr>
+        <w:t>:</w:t>
       </w:r>
     </w:p>
     <w:p>
@@ -265,17 +289,313 @@
           <w:sz w:val="32"/>
           <w:szCs w:val="32"/>
         </w:rPr>
-        <w:t>Improved synchronization of threads. One thread removed.</w:t>
-      </w:r>
-      <w:r>
+        <w:t>Improved framerate</w:t>
+      </w:r>
+      <w:r>
+        <w:rPr>
+          <w:rFonts w:ascii="Verdana" w:hAnsi="Verdana"/>
+          <w:sz w:val="32"/>
+          <w:szCs w:val="32"/>
+        </w:rPr>
+        <w:t xml:space="preserve"> </w:t>
+      </w:r>
+      <w:r>
+        <w:rPr>
+          <w:rFonts w:ascii="Verdana" w:hAnsi="Verdana"/>
+          <w:sz w:val="32"/>
+          <w:szCs w:val="32"/>
+        </w:rPr>
+        <w:t>with more optimizations.</w:t>
+      </w:r>
+    </w:p>
+    <w:p>
+      <w:pPr>
+        <w:pStyle w:val="NoSpacing"/>
+        <w:ind w:left="360"/>
         <w:rPr>
           <w:rFonts w:ascii="Verdana" w:hAnsi="Verdana"/>
           <w:color w:val="00B050"/>
           <w:sz w:val="32"/>
           <w:szCs w:val="32"/>
         </w:rPr>
-        <w:t xml:space="preserve"> </w:t>
-      </w:r>
+      </w:pPr>
+    </w:p>
+    <w:p>
+      <w:pPr>
+        <w:pStyle w:val="NoSpacing"/>
+        <w:rPr>
+          <w:rFonts w:ascii="Verdana" w:hAnsi="Verdana"/>
+        </w:rPr>
+      </w:pPr>
+    </w:p>
+    <w:p>
+      <w:pPr>
+        <w:pStyle w:val="NoSpacing"/>
+        <w:rPr>
+          <w:rFonts w:ascii="Verdana" w:hAnsi="Verdana"/>
+        </w:rPr>
+      </w:pPr>
+    </w:p>
+    <w:p>
+      <w:pPr>
+        <w:pStyle w:val="NoSpacing"/>
+        <w:rPr>
+          <w:rFonts w:ascii="Verdana" w:hAnsi="Verdana"/>
+        </w:rPr>
+      </w:pPr>
+    </w:p>
+    <w:p>
+      <w:pPr>
+        <w:pStyle w:val="NoSpacing"/>
+        <w:rPr>
+          <w:rFonts w:ascii="Verdana" w:hAnsi="Verdana"/>
+        </w:rPr>
+      </w:pPr>
+    </w:p>
+    <w:p>
+      <w:pPr>
+        <w:pStyle w:val="NoSpacing"/>
+        <w:rPr>
+          <w:rFonts w:ascii="Verdana" w:hAnsi="Verdana"/>
+        </w:rPr>
+      </w:pPr>
+    </w:p>
+    <w:p>
+      <w:pPr>
+        <w:pStyle w:val="NoSpacing"/>
+        <w:rPr>
+          <w:rFonts w:ascii="Verdana" w:hAnsi="Verdana"/>
+        </w:rPr>
+      </w:pPr>
+    </w:p>
+    <w:p>
+      <w:pPr>
+        <w:pStyle w:val="NoSpacing"/>
+        <w:rPr>
+          <w:rFonts w:ascii="Verdana" w:hAnsi="Verdana"/>
+        </w:rPr>
+      </w:pPr>
+    </w:p>
+    <w:p>
+      <w:pPr>
+        <w:pStyle w:val="NoSpacing"/>
+        <w:rPr>
+          <w:rFonts w:ascii="Verdana" w:hAnsi="Verdana"/>
+        </w:rPr>
+      </w:pPr>
+    </w:p>
+    <w:p>
+      <w:pPr>
+        <w:pStyle w:val="NoSpacing"/>
+        <w:rPr>
+          <w:rFonts w:ascii="Verdana" w:hAnsi="Verdana"/>
+        </w:rPr>
+      </w:pPr>
+    </w:p>
+    <w:p>
+      <w:pPr>
+        <w:pStyle w:val="NoSpacing"/>
+        <w:rPr>
+          <w:rFonts w:ascii="Verdana" w:hAnsi="Verdana"/>
+        </w:rPr>
+      </w:pPr>
+    </w:p>
+    <w:p>
+      <w:pPr>
+        <w:pStyle w:val="NoSpacing"/>
+        <w:rPr>
+          <w:rFonts w:ascii="Verdana" w:hAnsi="Verdana"/>
+        </w:rPr>
+      </w:pPr>
+    </w:p>
+    <w:p>
+      <w:pPr>
+        <w:pStyle w:val="NoSpacing"/>
+        <w:rPr>
+          <w:rFonts w:ascii="Verdana" w:hAnsi="Verdana"/>
+        </w:rPr>
+      </w:pPr>
+    </w:p>
+    <w:p>
+      <w:pPr>
+        <w:pStyle w:val="NoSpacing"/>
+        <w:rPr>
+          <w:rFonts w:ascii="Verdana" w:hAnsi="Verdana"/>
+        </w:rPr>
+      </w:pPr>
+    </w:p>
+    <w:p>
+      <w:pPr>
+        <w:pStyle w:val="NoSpacing"/>
+        <w:rPr>
+          <w:rFonts w:ascii="Verdana" w:hAnsi="Verdana"/>
+        </w:rPr>
+      </w:pPr>
+    </w:p>
+    <w:p>
+      <w:pPr>
+        <w:pStyle w:val="NoSpacing"/>
+        <w:rPr>
+          <w:rFonts w:ascii="Verdana" w:hAnsi="Verdana"/>
+        </w:rPr>
+      </w:pPr>
+    </w:p>
+    <w:p>
+      <w:pPr>
+        <w:pStyle w:val="NoSpacing"/>
+        <w:rPr>
+          <w:rFonts w:ascii="Verdana" w:hAnsi="Verdana"/>
+        </w:rPr>
+      </w:pPr>
+    </w:p>
+    <w:p>
+      <w:pPr>
+        <w:pStyle w:val="NoSpacing"/>
+        <w:rPr>
+          <w:rFonts w:ascii="Verdana" w:hAnsi="Verdana"/>
+        </w:rPr>
+      </w:pPr>
+    </w:p>
+    <w:p>
+      <w:pPr>
+        <w:pStyle w:val="NoSpacing"/>
+        <w:rPr>
+          <w:rFonts w:ascii="Verdana" w:hAnsi="Verdana"/>
+        </w:rPr>
+      </w:pPr>
+    </w:p>
+    <w:p>
+      <w:pPr>
+        <w:pStyle w:val="NoSpacing"/>
+        <w:rPr>
+          <w:rFonts w:ascii="Verdana" w:hAnsi="Verdana"/>
+        </w:rPr>
+      </w:pPr>
+    </w:p>
+    <w:p>
+      <w:pPr>
+        <w:pStyle w:val="NoSpacing"/>
+        <w:rPr>
+          <w:rFonts w:ascii="Verdana" w:hAnsi="Verdana"/>
+        </w:rPr>
+      </w:pPr>
+    </w:p>
+    <w:p>
+      <w:pPr>
+        <w:pStyle w:val="NoSpacing"/>
+        <w:rPr>
+          <w:rFonts w:ascii="Verdana" w:hAnsi="Verdana"/>
+        </w:rPr>
+      </w:pPr>
+    </w:p>
+    <w:p>
+      <w:pPr>
+        <w:pStyle w:val="NoSpacing"/>
+        <w:rPr>
+          <w:rFonts w:ascii="Verdana" w:hAnsi="Verdana"/>
+        </w:rPr>
+      </w:pPr>
+    </w:p>
+    <w:p>
+      <w:pPr>
+        <w:pStyle w:val="NoSpacing"/>
+        <w:rPr>
+          <w:rFonts w:ascii="Verdana" w:hAnsi="Verdana"/>
+        </w:rPr>
+      </w:pPr>
+    </w:p>
+    <w:p>
+      <w:pPr>
+        <w:pStyle w:val="NoSpacing"/>
+        <w:rPr>
+          <w:rFonts w:ascii="Verdana" w:hAnsi="Verdana"/>
+        </w:rPr>
+      </w:pPr>
+    </w:p>
+    <w:p>
+      <w:pPr>
+        <w:pStyle w:val="NoSpacing"/>
+        <w:rPr>
+          <w:rFonts w:ascii="Verdana" w:hAnsi="Verdana"/>
+        </w:rPr>
+      </w:pPr>
+    </w:p>
+    <w:p>
+      <w:pPr>
+        <w:pStyle w:val="NoSpacing"/>
+        <w:rPr>
+          <w:rFonts w:ascii="Verdana" w:hAnsi="Verdana"/>
+        </w:rPr>
+      </w:pPr>
+    </w:p>
+    <w:p>
+      <w:pPr>
+        <w:pStyle w:val="NoSpacing"/>
+        <w:rPr>
+          <w:rFonts w:ascii="Verdana" w:hAnsi="Verdana"/>
+        </w:rPr>
+      </w:pPr>
+    </w:p>
+    <w:p>
+      <w:pPr>
+        <w:pStyle w:val="NoSpacing"/>
+        <w:rPr>
+          <w:rFonts w:ascii="Verdana" w:hAnsi="Verdana"/>
+        </w:rPr>
+      </w:pPr>
+    </w:p>
+    <w:p>
+      <w:pPr>
+        <w:pStyle w:val="NoSpacing"/>
+        <w:rPr>
+          <w:rFonts w:ascii="Verdana" w:hAnsi="Verdana"/>
+          <w:b/>
+          <w:sz w:val="48"/>
+        </w:rPr>
+      </w:pPr>
+      <w:bookmarkStart w:id="0" w:name="_GoBack"/>
+      <w:bookmarkEnd w:id="0"/>
+      <w:r>
+        <w:rPr>
+          <w:rFonts w:ascii="Verdana" w:hAnsi="Verdana"/>
+          <w:b/>
+          <w:sz w:val="48"/>
+        </w:rPr>
+        <w:lastRenderedPageBreak/>
+        <w:t>Available commands:</w:t>
+      </w:r>
+    </w:p>
+    <w:p>
+      <w:pPr>
+        <w:pStyle w:val="NoSpacing"/>
+        <w:rPr>
+          <w:rFonts w:ascii="Verdana" w:hAnsi="Verdana"/>
+          <w:sz w:val="40"/>
+        </w:rPr>
+      </w:pPr>
+      <w:r>
+        <w:rPr>
+          <w:rFonts w:ascii="Verdana" w:hAnsi="Verdana"/>
+          <w:sz w:val="40"/>
+        </w:rPr>
+        <w:t xml:space="preserve">In order to type command </w:t>
+      </w:r>
+      <w:proofErr w:type="gramStart"/>
+      <w:r>
+        <w:rPr>
+          <w:rFonts w:ascii="Verdana" w:hAnsi="Verdana"/>
+          <w:sz w:val="40"/>
+        </w:rPr>
+        <w:t>which is equivalent to options setup press key “~”</w:t>
+      </w:r>
+      <w:r>
+        <w:rPr>
+          <w:rFonts w:ascii="Verdana" w:hAnsi="Verdana"/>
+          <w:sz w:val="40"/>
+        </w:rPr>
+        <w:t>.</w:t>
+      </w:r>
+      <w:proofErr w:type="gramEnd"/>
     </w:p>
     <w:p>
       <w:pPr>
@@ -286,27 +606,115 @@
         </w:numPr>
         <w:rPr>
           <w:rFonts w:ascii="Verdana" w:hAnsi="Verdana"/>
-          <w:color w:val="00B050"/>
-          <w:sz w:val="32"/>
-          <w:szCs w:val="32"/>
-        </w:rPr>
-      </w:pPr>
-      <w:r>
-        <w:rPr>
-          <w:rFonts w:ascii="Verdana" w:hAnsi="Verdana"/>
-          <w:sz w:val="32"/>
-          <w:szCs w:val="32"/>
-        </w:rPr>
-        <w:t>Changes to free block placement. Looks better now.</w:t>
-      </w:r>
-      <w:r>
-        <w:rPr>
-          <w:rFonts w:ascii="Verdana" w:hAnsi="Verdana"/>
-          <w:color w:val="00B050"/>
-          <w:sz w:val="32"/>
-          <w:szCs w:val="32"/>
-        </w:rPr>
-        <w:t xml:space="preserve"> </w:t>
+          <w:sz w:val="32"/>
+          <w:szCs w:val="32"/>
+        </w:rPr>
+      </w:pPr>
+      <w:proofErr w:type="spellStart"/>
+      <w:r>
+        <w:rPr>
+          <w:rFonts w:ascii="Verdana" w:hAnsi="Verdana"/>
+          <w:sz w:val="32"/>
+          <w:szCs w:val="32"/>
+        </w:rPr>
+        <w:t>fps_max</w:t>
+      </w:r>
+      <w:proofErr w:type="spellEnd"/>
+      <w:r>
+        <w:rPr>
+          <w:rFonts w:ascii="Verdana" w:hAnsi="Verdana"/>
+          <w:sz w:val="32"/>
+          <w:szCs w:val="32"/>
+        </w:rPr>
+        <w:t>&lt;</w:t>
+      </w:r>
+      <w:proofErr w:type="spellStart"/>
+      <w:r>
+        <w:rPr>
+          <w:rFonts w:ascii="Verdana" w:hAnsi="Verdana"/>
+          <w:sz w:val="32"/>
+          <w:szCs w:val="32"/>
+        </w:rPr>
+        <w:t>num</w:t>
+      </w:r>
+      <w:proofErr w:type="spellEnd"/>
+      <w:r>
+        <w:rPr>
+          <w:rFonts w:ascii="Verdana" w:hAnsi="Verdana"/>
+          <w:sz w:val="32"/>
+          <w:szCs w:val="32"/>
+        </w:rPr>
+        <w:t xml:space="preserve">&gt;, </w:t>
+      </w:r>
+      <w:proofErr w:type="spellStart"/>
+      <w:r>
+        <w:rPr>
+          <w:rFonts w:ascii="Verdana" w:hAnsi="Verdana"/>
+          <w:sz w:val="32"/>
+          <w:szCs w:val="32"/>
+        </w:rPr>
+        <w:t>fpsMax</w:t>
+      </w:r>
+      <w:proofErr w:type="spellEnd"/>
+      <w:r>
+        <w:rPr>
+          <w:rFonts w:ascii="Verdana" w:hAnsi="Verdana"/>
+          <w:sz w:val="32"/>
+          <w:szCs w:val="32"/>
+        </w:rPr>
+        <w:t>&lt;</w:t>
+      </w:r>
+      <w:proofErr w:type="spellStart"/>
+      <w:r>
+        <w:rPr>
+          <w:rFonts w:ascii="Verdana" w:hAnsi="Verdana"/>
+          <w:sz w:val="32"/>
+          <w:szCs w:val="32"/>
+        </w:rPr>
+        <w:t>num</w:t>
+      </w:r>
+      <w:proofErr w:type="spellEnd"/>
+      <w:r>
+        <w:rPr>
+          <w:rFonts w:ascii="Verdana" w:hAnsi="Verdana"/>
+          <w:sz w:val="32"/>
+          <w:szCs w:val="32"/>
+        </w:rPr>
+        <w:t xml:space="preserve">&gt;: allowing </w:t>
+      </w:r>
+      <w:proofErr w:type="gramStart"/>
+      <w:r>
+        <w:rPr>
+          <w:rFonts w:ascii="Verdana" w:hAnsi="Verdana"/>
+          <w:sz w:val="32"/>
+          <w:szCs w:val="32"/>
+        </w:rPr>
+        <w:t>to change</w:t>
+      </w:r>
+      <w:proofErr w:type="gramEnd"/>
+      <w:r>
+        <w:rPr>
+          <w:rFonts w:ascii="Verdana" w:hAnsi="Verdana"/>
+          <w:sz w:val="32"/>
+          <w:szCs w:val="32"/>
+        </w:rPr>
+        <w:t xml:space="preserve"> max fps</w:t>
+      </w:r>
+      <w:r>
+        <w:rPr>
+          <w:rFonts w:ascii="Verdana" w:hAnsi="Verdana"/>
+          <w:sz w:val="32"/>
+          <w:szCs w:val="32"/>
+        </w:rPr>
+        <w:t xml:space="preserve"> (it must be positive number)</w:t>
+      </w:r>
+      <w:r>
+        <w:rPr>
+          <w:rFonts w:ascii="Verdana" w:hAnsi="Verdana"/>
+          <w:sz w:val="32"/>
+          <w:szCs w:val="32"/>
+        </w:rPr>
+        <w:t>.</w:t>
       </w:r>
     </w:p>
     <w:p>
@@ -318,18 +726,35 @@
         </w:numPr>
         <w:rPr>
           <w:rFonts w:ascii="Verdana" w:hAnsi="Verdana"/>
-          <w:color w:val="00B050"/>
-          <w:sz w:val="32"/>
-          <w:szCs w:val="32"/>
-        </w:rPr>
-      </w:pPr>
-      <w:r>
-        <w:rPr>
-          <w:rFonts w:ascii="Verdana" w:hAnsi="Verdana"/>
-          <w:sz w:val="32"/>
-          <w:szCs w:val="32"/>
-        </w:rPr>
-        <w:t>Progress information is now more independent and it’s updated periodically.</w:t>
+          <w:sz w:val="32"/>
+          <w:szCs w:val="32"/>
+        </w:rPr>
+      </w:pPr>
+      <w:proofErr w:type="gramStart"/>
+      <w:r>
+        <w:rPr>
+          <w:rFonts w:ascii="Verdana" w:hAnsi="Verdana"/>
+          <w:sz w:val="32"/>
+          <w:szCs w:val="32"/>
+        </w:rPr>
+        <w:t>resolution&lt;</w:t>
+      </w:r>
+      <w:proofErr w:type="gramEnd"/>
+      <w:r>
+        <w:rPr>
+          <w:rFonts w:ascii="Verdana" w:hAnsi="Verdana"/>
+          <w:sz w:val="32"/>
+          <w:szCs w:val="32"/>
+        </w:rPr>
+        <w:t>width&gt;&lt;height&gt;, res&lt;width&gt;&lt;height&gt;: allowing to change resolution (min resolution is 640x480 whilst</w:t>
+      </w:r>
+      <w:r>
+        <w:rPr>
+          <w:rFonts w:ascii="Verdana" w:hAnsi="Verdana"/>
+          <w:sz w:val="32"/>
+          <w:szCs w:val="32"/>
+        </w:rPr>
+        <w:t xml:space="preserve"> max is your native resolution).</w:t>
       </w:r>
     </w:p>
     <w:p>
@@ -341,50 +766,55 @@
         </w:numPr>
         <w:rPr>
           <w:rFonts w:ascii="Verdana" w:hAnsi="Verdana"/>
-          <w:color w:val="00B050"/>
-          <w:sz w:val="32"/>
-          <w:szCs w:val="32"/>
-        </w:rPr>
-      </w:pPr>
-      <w:r>
-        <w:rPr>
-          <w:rFonts w:ascii="Verdana" w:hAnsi="Verdana"/>
-          <w:sz w:val="32"/>
-          <w:szCs w:val="32"/>
-        </w:rPr>
-        <w:t xml:space="preserve">Random </w:t>
-      </w:r>
-      <w:r>
-        <w:rPr>
-          <w:rFonts w:ascii="Verdana" w:hAnsi="Verdana"/>
-          <w:sz w:val="32"/>
-          <w:szCs w:val="32"/>
-        </w:rPr>
-        <w:t>L</w:t>
-      </w:r>
-      <w:r>
-        <w:rPr>
-          <w:rFonts w:ascii="Verdana" w:hAnsi="Verdana"/>
-          <w:sz w:val="32"/>
-          <w:szCs w:val="32"/>
-        </w:rPr>
-        <w:t xml:space="preserve">evel </w:t>
-      </w:r>
-      <w:r>
-        <w:rPr>
-          <w:rFonts w:ascii="Verdana" w:hAnsi="Verdana"/>
-          <w:sz w:val="32"/>
-          <w:szCs w:val="32"/>
-        </w:rPr>
-        <w:t xml:space="preserve">Generator </w:t>
-      </w:r>
-      <w:r>
-        <w:rPr>
-          <w:rFonts w:ascii="Verdana" w:hAnsi="Verdana"/>
-          <w:sz w:val="32"/>
-          <w:szCs w:val="32"/>
-        </w:rPr>
-        <w:t>takes exact number of blocks instead of maximum random number of blocks.</w:t>
+          <w:sz w:val="32"/>
+          <w:szCs w:val="32"/>
+        </w:rPr>
+      </w:pPr>
+      <w:proofErr w:type="spellStart"/>
+      <w:proofErr w:type="gramStart"/>
+      <w:r>
+        <w:rPr>
+          <w:rFonts w:ascii="Verdana" w:hAnsi="Verdana"/>
+          <w:sz w:val="32"/>
+          <w:szCs w:val="32"/>
+        </w:rPr>
+        <w:t>fullscreen</w:t>
+      </w:r>
+      <w:proofErr w:type="spellEnd"/>
+      <w:proofErr w:type="gramEnd"/>
+      <w:r>
+        <w:rPr>
+          <w:rFonts w:ascii="Verdana" w:hAnsi="Verdana"/>
+          <w:sz w:val="32"/>
+          <w:szCs w:val="32"/>
+        </w:rPr>
+        <w:t>:</w:t>
+      </w:r>
+      <w:r>
+        <w:rPr>
+          <w:rFonts w:ascii="Verdana" w:hAnsi="Verdana"/>
+          <w:sz w:val="32"/>
+          <w:szCs w:val="32"/>
+        </w:rPr>
+        <w:t xml:space="preserve"> makes your game run </w:t>
+      </w:r>
+      <w:proofErr w:type="spellStart"/>
+      <w:r>
+        <w:rPr>
+          <w:rFonts w:ascii="Verdana" w:hAnsi="Verdana"/>
+          <w:sz w:val="32"/>
+          <w:szCs w:val="32"/>
+        </w:rPr>
+        <w:t>fullscreen</w:t>
+      </w:r>
+      <w:proofErr w:type="spellEnd"/>
+      <w:r>
+        <w:rPr>
+          <w:rFonts w:ascii="Verdana" w:hAnsi="Verdana"/>
+          <w:sz w:val="32"/>
+          <w:szCs w:val="32"/>
+        </w:rPr>
+        <w:t>.</w:t>
       </w:r>
     </w:p>
     <w:p>
@@ -396,18 +826,35 @@
         </w:numPr>
         <w:rPr>
           <w:rFonts w:ascii="Verdana" w:hAnsi="Verdana"/>
-          <w:color w:val="00B050"/>
-          <w:sz w:val="32"/>
-          <w:szCs w:val="32"/>
-        </w:rPr>
-      </w:pPr>
-      <w:r>
-        <w:rPr>
-          <w:rFonts w:ascii="Verdana" w:hAnsi="Verdana"/>
-          <w:sz w:val="32"/>
-          <w:szCs w:val="32"/>
-        </w:rPr>
-        <w:t>Random level generation can be terminated at any time by exiting application.</w:t>
+          <w:sz w:val="32"/>
+          <w:szCs w:val="32"/>
+        </w:rPr>
+      </w:pPr>
+      <w:proofErr w:type="gramStart"/>
+      <w:r>
+        <w:rPr>
+          <w:rFonts w:ascii="Verdana" w:hAnsi="Verdana"/>
+          <w:sz w:val="32"/>
+          <w:szCs w:val="32"/>
+        </w:rPr>
+        <w:t>windowed</w:t>
+      </w:r>
+      <w:proofErr w:type="gramEnd"/>
+      <w:r>
+        <w:rPr>
+          <w:rFonts w:ascii="Verdana" w:hAnsi="Verdana"/>
+          <w:sz w:val="32"/>
+          <w:szCs w:val="32"/>
+        </w:rPr>
+        <w:t xml:space="preserve">: makes your game run </w:t>
+      </w:r>
+      <w:r>
+        <w:rPr>
+          <w:rFonts w:ascii="Verdana" w:hAnsi="Verdana"/>
+          <w:sz w:val="32"/>
+          <w:szCs w:val="32"/>
+        </w:rPr>
+        <w:t>windowed mode.</w:t>
       </w:r>
     </w:p>
     <w:p>
@@ -419,164 +866,130 @@
         </w:numPr>
         <w:rPr>
           <w:rFonts w:ascii="Verdana" w:hAnsi="Verdana"/>
-          <w:color w:val="00B050"/>
-          <w:sz w:val="32"/>
-          <w:szCs w:val="32"/>
-        </w:rPr>
-      </w:pPr>
-      <w:r>
-        <w:rPr>
-          <w:rFonts w:ascii="Verdana" w:hAnsi="Verdana"/>
-          <w:sz w:val="32"/>
-          <w:szCs w:val="32"/>
-        </w:rPr>
-        <w:t>Random Level Generator generates level faster.</w:t>
-      </w:r>
-      <w:bookmarkStart w:id="0" w:name="_GoBack"/>
-      <w:bookmarkEnd w:id="0"/>
-    </w:p>
-    <w:p>
-      <w:pPr>
-        <w:pStyle w:val="NoSpacing"/>
-        <w:ind w:left="360"/>
-        <w:rPr>
-          <w:rFonts w:ascii="Verdana" w:hAnsi="Verdana"/>
-          <w:color w:val="00B050"/>
-          <w:sz w:val="32"/>
-          <w:szCs w:val="32"/>
-        </w:rPr>
-      </w:pPr>
-    </w:p>
-    <w:p>
-      <w:pPr>
-        <w:pStyle w:val="NoSpacing"/>
-        <w:rPr>
-          <w:rFonts w:ascii="Verdana" w:hAnsi="Verdana"/>
-          <w:b/>
-          <w:color w:val="FF0000"/>
-          <w:sz w:val="48"/>
-        </w:rPr>
-      </w:pPr>
-      <w:r>
-        <w:rPr>
-          <w:rFonts w:ascii="Verdana" w:hAnsi="Verdana"/>
-          <w:b/>
-          <w:color w:val="FF0000"/>
-          <w:sz w:val="48"/>
-        </w:rPr>
-        <w:t>FIXES:</w:t>
-      </w:r>
-    </w:p>
-    <w:p>
-      <w:pPr>
-        <w:pStyle w:val="NoSpacing"/>
-        <w:numPr>
-          <w:ilvl w:val="0"/>
-          <w:numId w:val="18"/>
-        </w:numPr>
-        <w:rPr>
-          <w:rFonts w:ascii="Verdana" w:hAnsi="Verdana"/>
-          <w:sz w:val="32"/>
-          <w:szCs w:val="32"/>
-        </w:rPr>
-      </w:pPr>
-      <w:r>
-        <w:rPr>
-          <w:rFonts w:ascii="Verdana" w:hAnsi="Verdana"/>
-          <w:sz w:val="32"/>
-          <w:szCs w:val="32"/>
-        </w:rPr>
-        <w:t>Random Level Generator doesn’t spawn anymore blocks which intersect each other.</w:t>
-      </w:r>
-    </w:p>
-    <w:p>
-      <w:pPr>
-        <w:pStyle w:val="NoSpacing"/>
-        <w:numPr>
-          <w:ilvl w:val="0"/>
-          <w:numId w:val="18"/>
-        </w:numPr>
-        <w:rPr>
-          <w:rFonts w:ascii="Verdana" w:hAnsi="Verdana"/>
-          <w:sz w:val="32"/>
-          <w:szCs w:val="32"/>
-        </w:rPr>
-      </w:pPr>
-      <w:r>
-        <w:rPr>
-          <w:rFonts w:ascii="Verdana" w:hAnsi="Verdana"/>
-          <w:sz w:val="32"/>
-          <w:szCs w:val="32"/>
-        </w:rPr>
-        <w:t>Fixed wrong message about collision.</w:t>
-      </w:r>
-    </w:p>
-    <w:p>
-      <w:pPr>
-        <w:pStyle w:val="NoSpacing"/>
-        <w:rPr>
-          <w:rFonts w:ascii="Verdana" w:hAnsi="Verdana"/>
-        </w:rPr>
-      </w:pPr>
-    </w:p>
-    <w:p>
-      <w:pPr>
-        <w:pStyle w:val="NoSpacing"/>
-        <w:rPr>
-          <w:rFonts w:ascii="Verdana" w:hAnsi="Verdana"/>
-        </w:rPr>
-      </w:pPr>
-    </w:p>
-    <w:p>
-      <w:pPr>
-        <w:pStyle w:val="NoSpacing"/>
-        <w:rPr>
-          <w:rFonts w:ascii="Verdana" w:hAnsi="Verdana"/>
-          <w:b/>
-          <w:sz w:val="48"/>
-        </w:rPr>
-      </w:pPr>
-      <w:r>
-        <w:rPr>
-          <w:rFonts w:ascii="Verdana" w:hAnsi="Verdana"/>
-          <w:b/>
-          <w:sz w:val="48"/>
-        </w:rPr>
-        <w:lastRenderedPageBreak/>
-        <w:t>Available commands:</w:t>
-      </w:r>
-    </w:p>
-    <w:p>
-      <w:pPr>
-        <w:pStyle w:val="NoSpacing"/>
-        <w:rPr>
-          <w:rFonts w:ascii="Verdana" w:hAnsi="Verdana"/>
-          <w:sz w:val="40"/>
-        </w:rPr>
-      </w:pPr>
-      <w:r>
-        <w:rPr>
-          <w:rFonts w:ascii="Verdana" w:hAnsi="Verdana"/>
-          <w:sz w:val="40"/>
-        </w:rPr>
-        <w:t xml:space="preserve">In order to type command </w:t>
-      </w:r>
-      <w:proofErr w:type="gramStart"/>
-      <w:r>
-        <w:rPr>
-          <w:rFonts w:ascii="Verdana" w:hAnsi="Verdana"/>
-          <w:sz w:val="40"/>
-        </w:rPr>
-        <w:t>which is equivalent to options setup press key “~”</w:t>
-      </w:r>
-      <w:r>
-        <w:rPr>
-          <w:rFonts w:ascii="Verdana" w:hAnsi="Verdana"/>
-          <w:sz w:val="40"/>
+          <w:sz w:val="32"/>
+          <w:szCs w:val="32"/>
+        </w:rPr>
+      </w:pPr>
+      <w:proofErr w:type="spellStart"/>
+      <w:r>
+        <w:rPr>
+          <w:rFonts w:ascii="Verdana" w:hAnsi="Verdana"/>
+          <w:sz w:val="32"/>
+          <w:szCs w:val="32"/>
+        </w:rPr>
+        <w:t>v_sync</w:t>
+      </w:r>
+      <w:proofErr w:type="spellEnd"/>
+      <w:r>
+        <w:rPr>
+          <w:rFonts w:ascii="Verdana" w:hAnsi="Verdana"/>
+          <w:sz w:val="32"/>
+          <w:szCs w:val="32"/>
+        </w:rPr>
+        <w:t xml:space="preserve"> &lt;bool&gt;</w:t>
+      </w:r>
+      <w:r>
+        <w:rPr>
+          <w:rFonts w:ascii="Verdana" w:hAnsi="Verdana"/>
+          <w:sz w:val="32"/>
+          <w:szCs w:val="32"/>
+        </w:rPr>
+        <w:t xml:space="preserve">, </w:t>
+      </w:r>
+      <w:proofErr w:type="spellStart"/>
+      <w:r>
+        <w:rPr>
+          <w:rFonts w:ascii="Verdana" w:hAnsi="Verdana"/>
+          <w:sz w:val="32"/>
+          <w:szCs w:val="32"/>
+        </w:rPr>
+        <w:t>vsync</w:t>
+      </w:r>
+      <w:proofErr w:type="spellEnd"/>
+      <w:r>
+        <w:rPr>
+          <w:rFonts w:ascii="Verdana" w:hAnsi="Verdana"/>
+          <w:sz w:val="32"/>
+          <w:szCs w:val="32"/>
+        </w:rPr>
+        <w:t>&lt;bool&gt;</w:t>
+      </w:r>
+      <w:r>
+        <w:rPr>
+          <w:rFonts w:ascii="Verdana" w:hAnsi="Verdana"/>
+          <w:sz w:val="32"/>
+          <w:szCs w:val="32"/>
+        </w:rPr>
+        <w:t>: whether</w:t>
+      </w:r>
+      <w:r>
+        <w:rPr>
+          <w:rFonts w:ascii="Verdana" w:hAnsi="Verdana"/>
+          <w:sz w:val="32"/>
+          <w:szCs w:val="32"/>
+        </w:rPr>
+        <w:t xml:space="preserve"> or not you</w:t>
+      </w:r>
+      <w:r>
+        <w:rPr>
+          <w:rFonts w:ascii="Verdana" w:hAnsi="Verdana"/>
+          <w:sz w:val="32"/>
+          <w:szCs w:val="32"/>
+        </w:rPr>
+        <w:t xml:space="preserve"> </w:t>
+      </w:r>
+      <w:proofErr w:type="spellStart"/>
+      <w:r>
+        <w:rPr>
+          <w:rFonts w:ascii="Verdana" w:hAnsi="Verdana"/>
+          <w:sz w:val="32"/>
+          <w:szCs w:val="32"/>
+        </w:rPr>
+        <w:t>wanna</w:t>
+      </w:r>
+      <w:proofErr w:type="spellEnd"/>
+      <w:r>
+        <w:rPr>
+          <w:rFonts w:ascii="Verdana" w:hAnsi="Verdana"/>
+          <w:sz w:val="32"/>
+          <w:szCs w:val="32"/>
+        </w:rPr>
+        <w:t xml:space="preserve"> </w:t>
+      </w:r>
+      <w:proofErr w:type="spellStart"/>
+      <w:r>
+        <w:rPr>
+          <w:rFonts w:ascii="Verdana" w:hAnsi="Verdana"/>
+          <w:sz w:val="32"/>
+          <w:szCs w:val="32"/>
+        </w:rPr>
+        <w:t>vsync</w:t>
+      </w:r>
+      <w:proofErr w:type="spellEnd"/>
+      <w:r>
+        <w:rPr>
+          <w:rFonts w:ascii="Verdana" w:hAnsi="Verdana"/>
+          <w:sz w:val="32"/>
+          <w:szCs w:val="32"/>
+        </w:rPr>
+        <w:t xml:space="preserve"> on or off</w:t>
+      </w:r>
+      <w:r>
+        <w:rPr>
+          <w:rFonts w:ascii="Verdana" w:hAnsi="Verdana"/>
+          <w:sz w:val="32"/>
+          <w:szCs w:val="32"/>
         </w:rPr>
         <w:t>.</w:t>
       </w:r>
-      <w:proofErr w:type="gramEnd"/>
+      <w:r>
+        <w:rPr>
+          <w:rFonts w:ascii="Verdana" w:hAnsi="Verdana"/>
+          <w:sz w:val="32"/>
+          <w:szCs w:val="32"/>
+        </w:rPr>
+        <w:t xml:space="preserve"> If it’s on (you’ve set it to true) your fps is capped to your monitor refresh rate.</w:t>
+      </w:r>
     </w:p>
     <w:p>
       <w:pPr>
@@ -598,7 +1011,7 @@
           <w:sz w:val="32"/>
           <w:szCs w:val="32"/>
         </w:rPr>
-        <w:t>fps_max</w:t>
+        <w:t>water_efects</w:t>
       </w:r>
       <w:proofErr w:type="spellEnd"/>
       <w:r>
@@ -607,95 +1020,7 @@
           <w:sz w:val="32"/>
           <w:szCs w:val="32"/>
         </w:rPr>
-        <w:t>&lt;</w:t>
-      </w:r>
-      <w:proofErr w:type="spellStart"/>
-      <w:r>
-        <w:rPr>
-          <w:rFonts w:ascii="Verdana" w:hAnsi="Verdana"/>
-          <w:sz w:val="32"/>
-          <w:szCs w:val="32"/>
-        </w:rPr>
-        <w:t>num</w:t>
-      </w:r>
-      <w:proofErr w:type="spellEnd"/>
-      <w:r>
-        <w:rPr>
-          <w:rFonts w:ascii="Verdana" w:hAnsi="Verdana"/>
-          <w:sz w:val="32"/>
-          <w:szCs w:val="32"/>
-        </w:rPr>
-        <w:t xml:space="preserve">&gt;, </w:t>
-      </w:r>
-      <w:proofErr w:type="spellStart"/>
-      <w:r>
-        <w:rPr>
-          <w:rFonts w:ascii="Verdana" w:hAnsi="Verdana"/>
-          <w:sz w:val="32"/>
-          <w:szCs w:val="32"/>
-        </w:rPr>
-        <w:t>fpsMax</w:t>
-      </w:r>
-      <w:proofErr w:type="spellEnd"/>
-      <w:r>
-        <w:rPr>
-          <w:rFonts w:ascii="Verdana" w:hAnsi="Verdana"/>
-          <w:sz w:val="32"/>
-          <w:szCs w:val="32"/>
-        </w:rPr>
-        <w:t>&lt;</w:t>
-      </w:r>
-      <w:proofErr w:type="spellStart"/>
-      <w:r>
-        <w:rPr>
-          <w:rFonts w:ascii="Verdana" w:hAnsi="Verdana"/>
-          <w:sz w:val="32"/>
-          <w:szCs w:val="32"/>
-        </w:rPr>
-        <w:t>num</w:t>
-      </w:r>
-      <w:proofErr w:type="spellEnd"/>
-      <w:r>
-        <w:rPr>
-          <w:rFonts w:ascii="Verdana" w:hAnsi="Verdana"/>
-          <w:sz w:val="32"/>
-          <w:szCs w:val="32"/>
-        </w:rPr>
-        <w:t xml:space="preserve">&gt;: allowing </w:t>
-      </w:r>
-      <w:proofErr w:type="gramStart"/>
-      <w:r>
-        <w:rPr>
-          <w:rFonts w:ascii="Verdana" w:hAnsi="Verdana"/>
-          <w:sz w:val="32"/>
-          <w:szCs w:val="32"/>
-        </w:rPr>
-        <w:t>to change</w:t>
-      </w:r>
-      <w:proofErr w:type="gramEnd"/>
-      <w:r>
-        <w:rPr>
-          <w:rFonts w:ascii="Verdana" w:hAnsi="Verdana"/>
-          <w:sz w:val="32"/>
-          <w:szCs w:val="32"/>
-        </w:rPr>
-        <w:t xml:space="preserve"> max fps</w:t>
-      </w:r>
-      <w:r>
-        <w:rPr>
-          <w:rFonts w:ascii="Verdana" w:hAnsi="Verdana"/>
-          <w:sz w:val="32"/>
-          <w:szCs w:val="32"/>
-        </w:rPr>
-        <w:t xml:space="preserve"> (it must be positive number)</w:t>
-      </w:r>
-      <w:r>
-        <w:rPr>
-          <w:rFonts w:ascii="Verdana" w:hAnsi="Verdana"/>
-          <w:sz w:val="32"/>
-          <w:szCs w:val="32"/>
-        </w:rPr>
-        <w:t>.</w:t>
+        <w:t xml:space="preserve"> &lt;bool&gt;: enables (true) or disables (false) water effects (such as reflection).</w:t>
       </w:r>
     </w:p>
     <w:p>
@@ -711,31 +1036,108 @@
           <w:szCs w:val="32"/>
         </w:rPr>
       </w:pPr>
-      <w:proofErr w:type="gramStart"/>
-      <w:r>
-        <w:rPr>
-          <w:rFonts w:ascii="Verdana" w:hAnsi="Verdana"/>
-          <w:sz w:val="32"/>
-          <w:szCs w:val="32"/>
-        </w:rPr>
-        <w:t>resolution&lt;</w:t>
-      </w:r>
-      <w:proofErr w:type="gramEnd"/>
-      <w:r>
-        <w:rPr>
-          <w:rFonts w:ascii="Verdana" w:hAnsi="Verdana"/>
-          <w:sz w:val="32"/>
-          <w:szCs w:val="32"/>
-        </w:rPr>
-        <w:t>width&gt;&lt;height&gt;, res&lt;width&gt;&lt;height&gt;: allowing to change resolution (min resolution is 640x480 whilst</w:t>
-      </w:r>
-      <w:r>
-        <w:rPr>
-          <w:rFonts w:ascii="Verdana" w:hAnsi="Verdana"/>
-          <w:sz w:val="32"/>
-          <w:szCs w:val="32"/>
-        </w:rPr>
-        <w:t xml:space="preserve"> max is your native resolution).</w:t>
+      <w:proofErr w:type="spellStart"/>
+      <w:r>
+        <w:rPr>
+          <w:rFonts w:ascii="Verdana" w:hAnsi="Verdana"/>
+          <w:sz w:val="32"/>
+          <w:szCs w:val="32"/>
+        </w:rPr>
+        <w:t>mouse_sensitivity</w:t>
+      </w:r>
+      <w:proofErr w:type="spellEnd"/>
+      <w:r>
+        <w:rPr>
+          <w:rFonts w:ascii="Verdana" w:hAnsi="Verdana"/>
+          <w:sz w:val="32"/>
+          <w:szCs w:val="32"/>
+        </w:rPr>
+        <w:t>&lt;</w:t>
+      </w:r>
+      <w:proofErr w:type="spellStart"/>
+      <w:r>
+        <w:rPr>
+          <w:rFonts w:ascii="Verdana" w:hAnsi="Verdana"/>
+          <w:sz w:val="32"/>
+          <w:szCs w:val="32"/>
+        </w:rPr>
+        <w:t>num</w:t>
+      </w:r>
+      <w:proofErr w:type="spellEnd"/>
+      <w:r>
+        <w:rPr>
+          <w:rFonts w:ascii="Verdana" w:hAnsi="Verdana"/>
+          <w:sz w:val="32"/>
+          <w:szCs w:val="32"/>
+        </w:rPr>
+        <w:t xml:space="preserve">&gt;, </w:t>
+      </w:r>
+      <w:proofErr w:type="spellStart"/>
+      <w:r>
+        <w:rPr>
+          <w:rFonts w:ascii="Verdana" w:hAnsi="Verdana"/>
+          <w:sz w:val="32"/>
+          <w:szCs w:val="32"/>
+        </w:rPr>
+        <w:t>msens</w:t>
+      </w:r>
+      <w:proofErr w:type="spellEnd"/>
+      <w:r>
+        <w:rPr>
+          <w:rFonts w:ascii="Verdana" w:hAnsi="Verdana"/>
+          <w:sz w:val="32"/>
+          <w:szCs w:val="32"/>
+        </w:rPr>
+        <w:t xml:space="preserve"> &lt;</w:t>
+      </w:r>
+      <w:proofErr w:type="spellStart"/>
+      <w:r>
+        <w:rPr>
+          <w:rFonts w:ascii="Verdana" w:hAnsi="Verdana"/>
+          <w:sz w:val="32"/>
+          <w:szCs w:val="32"/>
+        </w:rPr>
+        <w:t>num</w:t>
+      </w:r>
+      <w:proofErr w:type="spellEnd"/>
+      <w:r>
+        <w:rPr>
+          <w:rFonts w:ascii="Verdana" w:hAnsi="Verdana"/>
+          <w:sz w:val="32"/>
+          <w:szCs w:val="32"/>
+        </w:rPr>
+        <w:t>&gt;: sets mouse sensitivity to this value.</w:t>
+      </w:r>
+    </w:p>
+    <w:p>
+      <w:pPr>
+        <w:pStyle w:val="NoSpacing"/>
+        <w:ind w:left="360"/>
+        <w:rPr>
+          <w:rFonts w:ascii="Verdana" w:hAnsi="Verdana"/>
+          <w:sz w:val="32"/>
+          <w:szCs w:val="32"/>
+        </w:rPr>
+      </w:pPr>
+    </w:p>
+    <w:p>
+      <w:pPr>
+        <w:pStyle w:val="NoSpacing"/>
+        <w:rPr>
+          <w:rFonts w:ascii="Verdana" w:hAnsi="Verdana"/>
+          <w:b/>
+          <w:sz w:val="48"/>
+          <w:szCs w:val="32"/>
+        </w:rPr>
+      </w:pPr>
+      <w:r>
+        <w:rPr>
+          <w:rFonts w:ascii="Verdana" w:hAnsi="Verdana"/>
+          <w:b/>
+          <w:sz w:val="48"/>
+          <w:szCs w:val="32"/>
+        </w:rPr>
+        <w:t>Notes:</w:t>
       </w:r>
     </w:p>
     <w:p>
@@ -751,51 +1153,13 @@
           <w:szCs w:val="32"/>
         </w:rPr>
       </w:pPr>
-      <w:proofErr w:type="spellStart"/>
-      <w:proofErr w:type="gramStart"/>
-      <w:r>
-        <w:rPr>
-          <w:rFonts w:ascii="Verdana" w:hAnsi="Verdana"/>
-          <w:sz w:val="32"/>
-          <w:szCs w:val="32"/>
-        </w:rPr>
-        <w:t>fullscreen</w:t>
-      </w:r>
-      <w:proofErr w:type="spellEnd"/>
-      <w:proofErr w:type="gramEnd"/>
-      <w:r>
-        <w:rPr>
-          <w:rFonts w:ascii="Verdana" w:hAnsi="Verdana"/>
-          <w:sz w:val="32"/>
-          <w:szCs w:val="32"/>
-        </w:rPr>
-        <w:t>:</w:t>
-      </w:r>
-      <w:r>
-        <w:rPr>
-          <w:rFonts w:ascii="Verdana" w:hAnsi="Verdana"/>
-          <w:sz w:val="32"/>
-          <w:szCs w:val="32"/>
-        </w:rPr>
-        <w:t xml:space="preserve"> makes your game run </w:t>
-      </w:r>
-      <w:proofErr w:type="spellStart"/>
-      <w:r>
-        <w:rPr>
-          <w:rFonts w:ascii="Verdana" w:hAnsi="Verdana"/>
-          <w:sz w:val="32"/>
-          <w:szCs w:val="32"/>
-        </w:rPr>
-        <w:t>fullscreen</w:t>
-      </w:r>
-      <w:proofErr w:type="spellEnd"/>
-      <w:r>
-        <w:rPr>
-          <w:rFonts w:ascii="Verdana" w:hAnsi="Verdana"/>
-          <w:sz w:val="32"/>
-          <w:szCs w:val="32"/>
-        </w:rPr>
-        <w:t>.</w:t>
+      <w:r>
+        <w:rPr>
+          <w:rFonts w:ascii="Verdana" w:hAnsi="Verdana"/>
+          <w:sz w:val="32"/>
+          <w:szCs w:val="32"/>
+        </w:rPr>
+        <w:t>Game uses LWJGL 3.2.3 since v 02 (BELARUS).</w:t>
       </w:r>
     </w:p>
     <w:p>
@@ -811,31 +1175,93 @@
           <w:szCs w:val="32"/>
         </w:rPr>
       </w:pPr>
-      <w:proofErr w:type="gramStart"/>
-      <w:r>
-        <w:rPr>
-          <w:rFonts w:ascii="Verdana" w:hAnsi="Verdana"/>
-          <w:sz w:val="32"/>
-          <w:szCs w:val="32"/>
-        </w:rPr>
-        <w:t>windowed</w:t>
-      </w:r>
-      <w:proofErr w:type="gramEnd"/>
-      <w:r>
-        <w:rPr>
-          <w:rFonts w:ascii="Verdana" w:hAnsi="Verdana"/>
-          <w:sz w:val="32"/>
-          <w:szCs w:val="32"/>
-        </w:rPr>
-        <w:t xml:space="preserve">: makes your game run </w:t>
-      </w:r>
-      <w:r>
-        <w:rPr>
-          <w:rFonts w:ascii="Verdana" w:hAnsi="Verdana"/>
-          <w:sz w:val="32"/>
-          <w:szCs w:val="32"/>
-        </w:rPr>
-        <w:t>windowed mode.</w:t>
+      <w:r>
+        <w:rPr>
+          <w:rFonts w:ascii="Verdana" w:hAnsi="Verdana"/>
+          <w:sz w:val="32"/>
+          <w:szCs w:val="32"/>
+        </w:rPr>
+        <w:t>Game implementation is multithread</w:t>
+      </w:r>
+      <w:r>
+        <w:rPr>
+          <w:rFonts w:ascii="Verdana" w:hAnsi="Verdana"/>
+          <w:sz w:val="32"/>
+          <w:szCs w:val="32"/>
+        </w:rPr>
+        <w:t>ed</w:t>
+      </w:r>
+      <w:r>
+        <w:rPr>
+          <w:rFonts w:ascii="Verdana" w:hAnsi="Verdana"/>
+          <w:sz w:val="32"/>
+          <w:szCs w:val="32"/>
+        </w:rPr>
+        <w:t xml:space="preserve"> (</w:t>
+      </w:r>
+      <w:r>
+        <w:rPr>
+          <w:rFonts w:ascii="Verdana" w:hAnsi="Verdana"/>
+          <w:sz w:val="32"/>
+          <w:szCs w:val="32"/>
+        </w:rPr>
+        <w:t xml:space="preserve">at most time </w:t>
+      </w:r>
+      <w:r>
+        <w:rPr>
+          <w:rFonts w:ascii="Verdana" w:hAnsi="Verdana"/>
+          <w:sz w:val="32"/>
+          <w:szCs w:val="32"/>
+        </w:rPr>
+        <w:t>2</w:t>
+      </w:r>
+      <w:r>
+        <w:rPr>
+          <w:rFonts w:ascii="Verdana" w:hAnsi="Verdana"/>
+          <w:sz w:val="32"/>
+          <w:szCs w:val="32"/>
+        </w:rPr>
+        <w:t xml:space="preserve"> </w:t>
+      </w:r>
+      <w:r>
+        <w:rPr>
+          <w:rFonts w:ascii="Verdana" w:hAnsi="Verdana"/>
+          <w:sz w:val="32"/>
+          <w:szCs w:val="32"/>
+        </w:rPr>
+        <w:t>threads will</w:t>
+      </w:r>
+      <w:r>
+        <w:rPr>
+          <w:rFonts w:ascii="Verdana" w:hAnsi="Verdana"/>
+          <w:sz w:val="32"/>
+          <w:szCs w:val="32"/>
+        </w:rPr>
+        <w:t xml:space="preserve"> be active</w:t>
+      </w:r>
+      <w:r>
+        <w:rPr>
+          <w:rFonts w:ascii="Verdana" w:hAnsi="Verdana"/>
+          <w:sz w:val="32"/>
+          <w:szCs w:val="32"/>
+        </w:rPr>
+        <w:t xml:space="preserve"> + 1 additional thread if random level generator is being used</w:t>
+      </w:r>
+      <w:r>
+        <w:rPr>
+          <w:rFonts w:ascii="Verdana" w:hAnsi="Verdana"/>
+          <w:sz w:val="32"/>
+          <w:szCs w:val="32"/>
+        </w:rPr>
+        <w:t>)</w:t>
+      </w:r>
+      <w:r>
+        <w:rPr>
+          <w:rFonts w:ascii="Verdana" w:hAnsi="Verdana"/>
+          <w:sz w:val="32"/>
+          <w:szCs w:val="32"/>
+        </w:rPr>
+        <w:t>.</w:t>
       </w:r>
     </w:p>
     <w:p>
@@ -851,125 +1277,61 @@
           <w:szCs w:val="32"/>
         </w:rPr>
       </w:pPr>
-      <w:proofErr w:type="spellStart"/>
-      <w:r>
-        <w:rPr>
-          <w:rFonts w:ascii="Verdana" w:hAnsi="Verdana"/>
-          <w:sz w:val="32"/>
-          <w:szCs w:val="32"/>
-        </w:rPr>
-        <w:t>v_sync</w:t>
-      </w:r>
-      <w:proofErr w:type="spellEnd"/>
-      <w:r>
-        <w:rPr>
-          <w:rFonts w:ascii="Verdana" w:hAnsi="Verdana"/>
-          <w:sz w:val="32"/>
-          <w:szCs w:val="32"/>
-        </w:rPr>
-        <w:t xml:space="preserve"> &lt;bool&gt;</w:t>
-      </w:r>
-      <w:r>
-        <w:rPr>
-          <w:rFonts w:ascii="Verdana" w:hAnsi="Verdana"/>
-          <w:sz w:val="32"/>
-          <w:szCs w:val="32"/>
-        </w:rPr>
-        <w:t xml:space="preserve">, </w:t>
-      </w:r>
-      <w:proofErr w:type="spellStart"/>
-      <w:r>
-        <w:rPr>
-          <w:rFonts w:ascii="Verdana" w:hAnsi="Verdana"/>
-          <w:sz w:val="32"/>
-          <w:szCs w:val="32"/>
-        </w:rPr>
-        <w:t>vsync</w:t>
-      </w:r>
-      <w:proofErr w:type="spellEnd"/>
-      <w:r>
-        <w:rPr>
-          <w:rFonts w:ascii="Verdana" w:hAnsi="Verdana"/>
-          <w:sz w:val="32"/>
-          <w:szCs w:val="32"/>
-        </w:rPr>
-        <w:t>&lt;bool&gt;</w:t>
-      </w:r>
-      <w:r>
-        <w:rPr>
-          <w:rFonts w:ascii="Verdana" w:hAnsi="Verdana"/>
-          <w:sz w:val="32"/>
-          <w:szCs w:val="32"/>
-        </w:rPr>
-        <w:t>: whether</w:t>
-      </w:r>
-      <w:r>
-        <w:rPr>
-          <w:rFonts w:ascii="Verdana" w:hAnsi="Verdana"/>
-          <w:sz w:val="32"/>
-          <w:szCs w:val="32"/>
-        </w:rPr>
-        <w:t xml:space="preserve"> or not you</w:t>
-      </w:r>
-      <w:r>
-        <w:rPr>
-          <w:rFonts w:ascii="Verdana" w:hAnsi="Verdana"/>
-          <w:sz w:val="32"/>
-          <w:szCs w:val="32"/>
-        </w:rPr>
-        <w:t xml:space="preserve"> </w:t>
-      </w:r>
-      <w:proofErr w:type="spellStart"/>
-      <w:r>
-        <w:rPr>
-          <w:rFonts w:ascii="Verdana" w:hAnsi="Verdana"/>
-          <w:sz w:val="32"/>
-          <w:szCs w:val="32"/>
-        </w:rPr>
-        <w:t>wanna</w:t>
-      </w:r>
-      <w:proofErr w:type="spellEnd"/>
-      <w:r>
-        <w:rPr>
-          <w:rFonts w:ascii="Verdana" w:hAnsi="Verdana"/>
-          <w:sz w:val="32"/>
-          <w:szCs w:val="32"/>
-        </w:rPr>
-        <w:t xml:space="preserve"> </w:t>
-      </w:r>
-      <w:proofErr w:type="spellStart"/>
-      <w:r>
-        <w:rPr>
-          <w:rFonts w:ascii="Verdana" w:hAnsi="Verdana"/>
-          <w:sz w:val="32"/>
-          <w:szCs w:val="32"/>
-        </w:rPr>
-        <w:t>vsync</w:t>
-      </w:r>
-      <w:proofErr w:type="spellEnd"/>
-      <w:r>
-        <w:rPr>
-          <w:rFonts w:ascii="Verdana" w:hAnsi="Verdana"/>
-          <w:sz w:val="32"/>
-          <w:szCs w:val="32"/>
-        </w:rPr>
-        <w:t xml:space="preserve"> on or off</w:t>
-      </w:r>
-      <w:r>
-        <w:rPr>
-          <w:rFonts w:ascii="Verdana" w:hAnsi="Verdana"/>
-          <w:sz w:val="32"/>
-          <w:szCs w:val="32"/>
-        </w:rPr>
-        <w:t>.</w:t>
-      </w:r>
-      <w:r>
-        <w:rPr>
-          <w:rFonts w:ascii="Verdana" w:hAnsi="Verdana"/>
-          <w:sz w:val="32"/>
-          <w:szCs w:val="32"/>
-        </w:rPr>
-        <w:t xml:space="preserve"> If it’s on (you’ve set it to true) your fps is capped to your monitor refresh rate.</w:t>
+      <w:r>
+        <w:rPr>
+          <w:rFonts w:ascii="Verdana" w:hAnsi="Verdana"/>
+          <w:sz w:val="32"/>
+          <w:szCs w:val="32"/>
+        </w:rPr>
+        <w:t>Running the game requires</w:t>
+      </w:r>
+      <w:r>
+        <w:rPr>
+          <w:rFonts w:ascii="Verdana" w:hAnsi="Verdana"/>
+          <w:sz w:val="32"/>
+          <w:szCs w:val="32"/>
+        </w:rPr>
+        <w:t xml:space="preserve"> Open</w:t>
+      </w:r>
+      <w:r>
+        <w:rPr>
+          <w:rFonts w:ascii="Verdana" w:hAnsi="Verdana"/>
+          <w:sz w:val="32"/>
+          <w:szCs w:val="32"/>
+        </w:rPr>
+        <w:t>GL 3.3</w:t>
+      </w:r>
+      <w:r>
+        <w:rPr>
+          <w:rFonts w:ascii="Verdana" w:hAnsi="Verdana"/>
+          <w:sz w:val="32"/>
+          <w:szCs w:val="32"/>
+        </w:rPr>
+        <w:t xml:space="preserve"> (o</w:t>
+      </w:r>
+      <w:r>
+        <w:rPr>
+          <w:rFonts w:ascii="Verdana" w:hAnsi="Verdana"/>
+          <w:sz w:val="32"/>
+          <w:szCs w:val="32"/>
+        </w:rPr>
+        <w:t>n graphic cards since March 2010</w:t>
+      </w:r>
+      <w:r>
+        <w:rPr>
+          <w:rFonts w:ascii="Verdana" w:hAnsi="Verdana"/>
+          <w:sz w:val="32"/>
+          <w:szCs w:val="32"/>
+        </w:rPr>
+        <w:t>)</w:t>
+      </w:r>
+      <w:r>
+        <w:rPr>
+          <w:rFonts w:ascii="Verdana" w:hAnsi="Verdana"/>
+          <w:sz w:val="32"/>
+          <w:szCs w:val="32"/>
+        </w:rPr>
+        <w:t xml:space="preserve"> or later.</w:t>
       </w:r>
     </w:p>
     <w:p>
@@ -985,349 +1347,6 @@
           <w:szCs w:val="32"/>
         </w:rPr>
       </w:pPr>
-      <w:proofErr w:type="spellStart"/>
-      <w:r>
-        <w:rPr>
-          <w:rFonts w:ascii="Verdana" w:hAnsi="Verdana"/>
-          <w:sz w:val="32"/>
-          <w:szCs w:val="32"/>
-        </w:rPr>
-        <w:t>water_efects</w:t>
-      </w:r>
-      <w:proofErr w:type="spellEnd"/>
-      <w:r>
-        <w:rPr>
-          <w:rFonts w:ascii="Verdana" w:hAnsi="Verdana"/>
-          <w:sz w:val="32"/>
-          <w:szCs w:val="32"/>
-        </w:rPr>
-        <w:t xml:space="preserve"> &lt;bool&gt;: enables (true) or disables (false) water effects (such as reflection).</w:t>
-      </w:r>
-    </w:p>
-    <w:p>
-      <w:pPr>
-        <w:pStyle w:val="NoSpacing"/>
-        <w:numPr>
-          <w:ilvl w:val="0"/>
-          <w:numId w:val="19"/>
-        </w:numPr>
-        <w:rPr>
-          <w:rFonts w:ascii="Verdana" w:hAnsi="Verdana"/>
-          <w:sz w:val="32"/>
-          <w:szCs w:val="32"/>
-        </w:rPr>
-      </w:pPr>
-      <w:proofErr w:type="spellStart"/>
-      <w:r>
-        <w:rPr>
-          <w:rFonts w:ascii="Verdana" w:hAnsi="Verdana"/>
-          <w:sz w:val="32"/>
-          <w:szCs w:val="32"/>
-        </w:rPr>
-        <w:t>mouse_sensitivity</w:t>
-      </w:r>
-      <w:proofErr w:type="spellEnd"/>
-      <w:r>
-        <w:rPr>
-          <w:rFonts w:ascii="Verdana" w:hAnsi="Verdana"/>
-          <w:sz w:val="32"/>
-          <w:szCs w:val="32"/>
-        </w:rPr>
-        <w:t>&lt;</w:t>
-      </w:r>
-      <w:proofErr w:type="spellStart"/>
-      <w:r>
-        <w:rPr>
-          <w:rFonts w:ascii="Verdana" w:hAnsi="Verdana"/>
-          <w:sz w:val="32"/>
-          <w:szCs w:val="32"/>
-        </w:rPr>
-        <w:t>num</w:t>
-      </w:r>
-      <w:proofErr w:type="spellEnd"/>
-      <w:r>
-        <w:rPr>
-          <w:rFonts w:ascii="Verdana" w:hAnsi="Verdana"/>
-          <w:sz w:val="32"/>
-          <w:szCs w:val="32"/>
-        </w:rPr>
-        <w:t xml:space="preserve">&gt;, </w:t>
-      </w:r>
-      <w:proofErr w:type="spellStart"/>
-      <w:r>
-        <w:rPr>
-          <w:rFonts w:ascii="Verdana" w:hAnsi="Verdana"/>
-          <w:sz w:val="32"/>
-          <w:szCs w:val="32"/>
-        </w:rPr>
-        <w:t>msens</w:t>
-      </w:r>
-      <w:proofErr w:type="spellEnd"/>
-      <w:r>
-        <w:rPr>
-          <w:rFonts w:ascii="Verdana" w:hAnsi="Verdana"/>
-          <w:sz w:val="32"/>
-          <w:szCs w:val="32"/>
-        </w:rPr>
-        <w:t xml:space="preserve"> &lt;</w:t>
-      </w:r>
-      <w:proofErr w:type="spellStart"/>
-      <w:r>
-        <w:rPr>
-          <w:rFonts w:ascii="Verdana" w:hAnsi="Verdana"/>
-          <w:sz w:val="32"/>
-          <w:szCs w:val="32"/>
-        </w:rPr>
-        <w:t>num</w:t>
-      </w:r>
-      <w:proofErr w:type="spellEnd"/>
-      <w:r>
-        <w:rPr>
-          <w:rFonts w:ascii="Verdana" w:hAnsi="Verdana"/>
-          <w:sz w:val="32"/>
-          <w:szCs w:val="32"/>
-        </w:rPr>
-        <w:t>&gt;: sets mouse sensitivity to this value.</w:t>
-      </w:r>
-    </w:p>
-    <w:p>
-      <w:pPr>
-        <w:pStyle w:val="NoSpacing"/>
-        <w:ind w:left="360"/>
-        <w:rPr>
-          <w:rFonts w:ascii="Verdana" w:hAnsi="Verdana"/>
-          <w:sz w:val="32"/>
-          <w:szCs w:val="32"/>
-        </w:rPr>
-      </w:pPr>
-    </w:p>
-    <w:p>
-      <w:pPr>
-        <w:pStyle w:val="NoSpacing"/>
-        <w:rPr>
-          <w:rFonts w:ascii="Verdana" w:hAnsi="Verdana"/>
-          <w:b/>
-          <w:sz w:val="48"/>
-          <w:szCs w:val="32"/>
-        </w:rPr>
-      </w:pPr>
-      <w:r>
-        <w:rPr>
-          <w:rFonts w:ascii="Verdana" w:hAnsi="Verdana"/>
-          <w:b/>
-          <w:sz w:val="48"/>
-          <w:szCs w:val="32"/>
-        </w:rPr>
-        <w:t>Notes:</w:t>
-      </w:r>
-    </w:p>
-    <w:p>
-      <w:pPr>
-        <w:pStyle w:val="NoSpacing"/>
-        <w:numPr>
-          <w:ilvl w:val="0"/>
-          <w:numId w:val="19"/>
-        </w:numPr>
-        <w:rPr>
-          <w:rFonts w:ascii="Verdana" w:hAnsi="Verdana"/>
-          <w:sz w:val="32"/>
-          <w:szCs w:val="32"/>
-        </w:rPr>
-      </w:pPr>
-      <w:r>
-        <w:rPr>
-          <w:rFonts w:ascii="Verdana" w:hAnsi="Verdana"/>
-          <w:sz w:val="32"/>
-          <w:szCs w:val="32"/>
-        </w:rPr>
-        <w:t>Game uses LWJGL 3.2.3 since v 02 (BELARUS).</w:t>
-      </w:r>
-    </w:p>
-    <w:p>
-      <w:pPr>
-        <w:pStyle w:val="NoSpacing"/>
-        <w:numPr>
-          <w:ilvl w:val="0"/>
-          <w:numId w:val="19"/>
-        </w:numPr>
-        <w:rPr>
-          <w:rFonts w:ascii="Verdana" w:hAnsi="Verdana"/>
-          <w:sz w:val="32"/>
-          <w:szCs w:val="32"/>
-        </w:rPr>
-      </w:pPr>
-      <w:r>
-        <w:rPr>
-          <w:rFonts w:ascii="Verdana" w:hAnsi="Verdana"/>
-          <w:sz w:val="32"/>
-          <w:szCs w:val="32"/>
-        </w:rPr>
-        <w:t>Game implementation is multithread</w:t>
-      </w:r>
-      <w:r>
-        <w:rPr>
-          <w:rFonts w:ascii="Verdana" w:hAnsi="Verdana"/>
-          <w:sz w:val="32"/>
-          <w:szCs w:val="32"/>
-        </w:rPr>
-        <w:t>ed</w:t>
-      </w:r>
-      <w:r>
-        <w:rPr>
-          <w:rFonts w:ascii="Verdana" w:hAnsi="Verdana"/>
-          <w:sz w:val="32"/>
-          <w:szCs w:val="32"/>
-        </w:rPr>
-        <w:t xml:space="preserve"> (</w:t>
-      </w:r>
-      <w:r>
-        <w:rPr>
-          <w:rFonts w:ascii="Verdana" w:hAnsi="Verdana"/>
-          <w:sz w:val="32"/>
-          <w:szCs w:val="32"/>
-        </w:rPr>
-        <w:t xml:space="preserve">at most time </w:t>
-      </w:r>
-      <w:r>
-        <w:rPr>
-          <w:rFonts w:ascii="Verdana" w:hAnsi="Verdana"/>
-          <w:sz w:val="32"/>
-          <w:szCs w:val="32"/>
-        </w:rPr>
-        <w:t>2</w:t>
-      </w:r>
-      <w:r>
-        <w:rPr>
-          <w:rFonts w:ascii="Verdana" w:hAnsi="Verdana"/>
-          <w:sz w:val="32"/>
-          <w:szCs w:val="32"/>
-        </w:rPr>
-        <w:t xml:space="preserve"> </w:t>
-      </w:r>
-      <w:r>
-        <w:rPr>
-          <w:rFonts w:ascii="Verdana" w:hAnsi="Verdana"/>
-          <w:sz w:val="32"/>
-          <w:szCs w:val="32"/>
-        </w:rPr>
-        <w:t>threads will</w:t>
-      </w:r>
-      <w:r>
-        <w:rPr>
-          <w:rFonts w:ascii="Verdana" w:hAnsi="Verdana"/>
-          <w:sz w:val="32"/>
-          <w:szCs w:val="32"/>
-        </w:rPr>
-        <w:t xml:space="preserve"> be active</w:t>
-      </w:r>
-      <w:r>
-        <w:rPr>
-          <w:rFonts w:ascii="Verdana" w:hAnsi="Verdana"/>
-          <w:sz w:val="32"/>
-          <w:szCs w:val="32"/>
-        </w:rPr>
-        <w:t xml:space="preserve"> + 1 additional thread if random level generator is being used</w:t>
-      </w:r>
-      <w:r>
-        <w:rPr>
-          <w:rFonts w:ascii="Verdana" w:hAnsi="Verdana"/>
-          <w:sz w:val="32"/>
-          <w:szCs w:val="32"/>
-        </w:rPr>
-        <w:t>)</w:t>
-      </w:r>
-      <w:r>
-        <w:rPr>
-          <w:rFonts w:ascii="Verdana" w:hAnsi="Verdana"/>
-          <w:sz w:val="32"/>
-          <w:szCs w:val="32"/>
-        </w:rPr>
-        <w:t>.</w:t>
-      </w:r>
-    </w:p>
-    <w:p>
-      <w:pPr>
-        <w:pStyle w:val="NoSpacing"/>
-        <w:numPr>
-          <w:ilvl w:val="0"/>
-          <w:numId w:val="19"/>
-        </w:numPr>
-        <w:rPr>
-          <w:rFonts w:ascii="Verdana" w:hAnsi="Verdana"/>
-          <w:sz w:val="32"/>
-          <w:szCs w:val="32"/>
-        </w:rPr>
-      </w:pPr>
-      <w:r>
-        <w:rPr>
-          <w:rFonts w:ascii="Verdana" w:hAnsi="Verdana"/>
-          <w:sz w:val="32"/>
-          <w:szCs w:val="32"/>
-        </w:rPr>
-        <w:t>Running the game requires</w:t>
-      </w:r>
-      <w:r>
-        <w:rPr>
-          <w:rFonts w:ascii="Verdana" w:hAnsi="Verdana"/>
-          <w:sz w:val="32"/>
-          <w:szCs w:val="32"/>
-        </w:rPr>
-        <w:t xml:space="preserve"> Open</w:t>
-      </w:r>
-      <w:r>
-        <w:rPr>
-          <w:rFonts w:ascii="Verdana" w:hAnsi="Verdana"/>
-          <w:sz w:val="32"/>
-          <w:szCs w:val="32"/>
-        </w:rPr>
-        <w:t>GL 3.3</w:t>
-      </w:r>
-      <w:r>
-        <w:rPr>
-          <w:rFonts w:ascii="Verdana" w:hAnsi="Verdana"/>
-          <w:sz w:val="32"/>
-          <w:szCs w:val="32"/>
-        </w:rPr>
-        <w:t xml:space="preserve"> (o</w:t>
-      </w:r>
-      <w:r>
-        <w:rPr>
-          <w:rFonts w:ascii="Verdana" w:hAnsi="Verdana"/>
-          <w:sz w:val="32"/>
-          <w:szCs w:val="32"/>
-        </w:rPr>
-        <w:t>n graphic cards since March 2010</w:t>
-      </w:r>
-      <w:r>
-        <w:rPr>
-          <w:rFonts w:ascii="Verdana" w:hAnsi="Verdana"/>
-          <w:sz w:val="32"/>
-          <w:szCs w:val="32"/>
-        </w:rPr>
-        <w:t>)</w:t>
-      </w:r>
-      <w:r>
-        <w:rPr>
-          <w:rFonts w:ascii="Verdana" w:hAnsi="Verdana"/>
-          <w:sz w:val="32"/>
-          <w:szCs w:val="32"/>
-        </w:rPr>
-        <w:t xml:space="preserve"> or later.</w:t>
-      </w:r>
-    </w:p>
-    <w:p>
-      <w:pPr>
-        <w:pStyle w:val="NoSpacing"/>
-        <w:numPr>
-          <w:ilvl w:val="0"/>
-          <w:numId w:val="19"/>
-        </w:numPr>
-        <w:rPr>
-          <w:rFonts w:ascii="Verdana" w:hAnsi="Verdana"/>
-          <w:sz w:val="32"/>
-          <w:szCs w:val="32"/>
-        </w:rPr>
-      </w:pPr>
       <w:r>
         <w:rPr>
           <w:rFonts w:ascii="Verdana" w:hAnsi="Verdana"/>
@@ -1339,7 +1358,7 @@
     </w:p>
     <w:sectPr>
       <w:pgSz w:w="12240" w:h="15840"/>
-      <w:pgMar w:top="1440" w:right="1440" w:bottom="1440" w:left="1440" w:header="720" w:footer="720" w:gutter="0"/>
+      <w:pgMar w:top="720" w:right="720" w:bottom="720" w:left="720" w:header="720" w:footer="720" w:gutter="0"/>
       <w:cols w:space="720"/>
       <w:docGrid w:linePitch="360"/>
     </w:sectPr>
@@ -3277,6 +3296,119 @@
     </w:lvl>
   </w:abstractNum>
   <w:abstractNum w:abstractNumId="17">
+    <w:nsid w:val="774E37A9"/>
+    <w:multiLevelType w:val="hybridMultilevel"/>
+    <w:tmpl w:val="1E341DC4"/>
+    <w:lvl w:ilvl="0" w:tplc="04090001">
+      <w:start w:val="1"/>
+      <w:numFmt w:val="bullet"/>
+      <w:lvlText w:val=""/>
+      <w:lvlJc w:val="left"/>
+      <w:pPr>
+        <w:ind w:left="720" w:hanging="360"/>
+      </w:pPr>
+      <w:rPr>
+        <w:rFonts w:ascii="Symbol" w:hAnsi="Symbol" w:hint="default"/>
+      </w:rPr>
+    </w:lvl>
+    <w:lvl w:ilvl="1" w:tplc="04090003" w:tentative="1">
+      <w:start w:val="1"/>
+      <w:numFmt w:val="bullet"/>
+      <w:lvlText w:val="o"/>
+      <w:lvlJc w:val="left"/>
+      <w:pPr>
+        <w:ind w:left="1440" w:hanging="360"/>
+      </w:pPr>
+      <w:rPr>
+        <w:rFonts w:ascii="Courier New" w:hAnsi="Courier New" w:cs="Courier New" w:hint="default"/>
+      </w:rPr>
+    </w:lvl>
+    <w:lvl w:ilvl="2" w:tplc="04090005" w:tentative="1">
+      <w:start w:val="1"/>
+      <w:numFmt w:val="bullet"/>
+      <w:lvlText w:val=""/>
+      <w:lvlJc w:val="left"/>
+      <w:pPr>
+        <w:ind w:left="2160" w:hanging="360"/>
+      </w:pPr>
+      <w:rPr>
+        <w:rFonts w:ascii="Wingdings" w:hAnsi="Wingdings" w:hint="default"/>
+      </w:rPr>
+    </w:lvl>
+    <w:lvl w:ilvl="3" w:tplc="04090001" w:tentative="1">
+      <w:start w:val="1"/>
+      <w:numFmt w:val="bullet"/>
+      <w:lvlText w:val=""/>
+      <w:lvlJc w:val="left"/>
+      <w:pPr>
+        <w:ind w:left="2880" w:hanging="360"/>
+      </w:pPr>
+      <w:rPr>
+        <w:rFonts w:ascii="Symbol" w:hAnsi="Symbol" w:hint="default"/>
+      </w:rPr>
+    </w:lvl>
+    <w:lvl w:ilvl="4" w:tplc="04090003" w:tentative="1">
+      <w:start w:val="1"/>
+      <w:numFmt w:val="bullet"/>
+      <w:lvlText w:val="o"/>
+      <w:lvlJc w:val="left"/>
+      <w:pPr>
+        <w:ind w:left="3600" w:hanging="360"/>
+      </w:pPr>
+      <w:rPr>
+        <w:rFonts w:ascii="Courier New" w:hAnsi="Courier New" w:cs="Courier New" w:hint="default"/>
+      </w:rPr>
+    </w:lvl>
+    <w:lvl w:ilvl="5" w:tplc="04090005" w:tentative="1">
+      <w:start w:val="1"/>
+      <w:numFmt w:val="bullet"/>
+      <w:lvlText w:val=""/>
+      <w:lvlJc w:val="left"/>
+      <w:pPr>
+        <w:ind w:left="4320" w:hanging="360"/>
+      </w:pPr>
+      <w:rPr>
+        <w:rFonts w:ascii="Wingdings" w:hAnsi="Wingdings" w:hint="default"/>
+      </w:rPr>
+    </w:lvl>
+    <w:lvl w:ilvl="6" w:tplc="04090001" w:tentative="1">
+      <w:start w:val="1"/>
+      <w:numFmt w:val="bullet"/>
+      <w:lvlText w:val=""/>
+      <w:lvlJc w:val="left"/>
+      <w:pPr>
+        <w:ind w:left="5040" w:hanging="360"/>
+      </w:pPr>
+      <w:rPr>
+        <w:rFonts w:ascii="Symbol" w:hAnsi="Symbol" w:hint="default"/>
+      </w:rPr>
+    </w:lvl>
+    <w:lvl w:ilvl="7" w:tplc="04090003" w:tentative="1">
+      <w:start w:val="1"/>
+      <w:numFmt w:val="bullet"/>
+      <w:lvlText w:val="o"/>
+      <w:lvlJc w:val="left"/>
+      <w:pPr>
+        <w:ind w:left="5760" w:hanging="360"/>
+      </w:pPr>
+      <w:rPr>
+        <w:rFonts w:ascii="Courier New" w:hAnsi="Courier New" w:cs="Courier New" w:hint="default"/>
+      </w:rPr>
+    </w:lvl>
+    <w:lvl w:ilvl="8" w:tplc="04090005" w:tentative="1">
+      <w:start w:val="1"/>
+      <w:numFmt w:val="bullet"/>
+      <w:lvlText w:val=""/>
+      <w:lvlJc w:val="left"/>
+      <w:pPr>
+        <w:ind w:left="6480" w:hanging="360"/>
+      </w:pPr>
+      <w:rPr>
+        <w:rFonts w:ascii="Wingdings" w:hAnsi="Wingdings" w:hint="default"/>
+      </w:rPr>
+    </w:lvl>
+  </w:abstractNum>
+  <w:abstractNum w:abstractNumId="18">
     <w:nsid w:val="7C7B411A"/>
     <w:multiLevelType w:val="hybridMultilevel"/>
     <w:tmpl w:val="DD327E98"/>
@@ -3423,7 +3555,7 @@
     <w:abstractNumId w:val="0"/>
   </w:num>
   <w:num w:numId="12">
-    <w:abstractNumId w:val="17"/>
+    <w:abstractNumId w:val="18"/>
   </w:num>
   <w:num w:numId="13">
     <w:abstractNumId w:val="7"/>
@@ -3445,6 +3577,9 @@
   </w:num>
   <w:num w:numId="19">
     <w:abstractNumId w:val="8"/>
+  </w:num>
+  <w:num w:numId="20">
+    <w:abstractNumId w:val="17"/>
   </w:num>
 </w:numbering>
 </file>
@@ -4219,7 +4354,7 @@
 </file>
 
 <file path=customXml/itemProps1.xml><?xml version="1.0" encoding="utf-8"?>
-<ds:datastoreItem xmlns:ds="http://schemas.openxmlformats.org/officeDocument/2006/customXml" ds:itemID="{24C80AB0-7B7E-4D30-B193-391CB07909BD}">
+<ds:datastoreItem xmlns:ds="http://schemas.openxmlformats.org/officeDocument/2006/customXml" ds:itemID="{F9C93B0C-F6D6-4642-A750-E8E10390C0F8}">
   <ds:schemaRefs>
     <ds:schemaRef ds:uri="http://schemas.openxmlformats.org/officeDocument/2006/bibliography"/>
   </ds:schemaRefs>

</xml_diff>

<commit_message>
Editing word. For Version 1.0.2 - KOREANS U05!
</commit_message>
<xml_diff>
--- a/changelog.docx
+++ b/changelog.docx
@@ -231,47 +231,6 @@
     <w:p>
       <w:pPr>
         <w:pStyle w:val="NoSpacing"/>
-        <w:ind w:left="360"/>
-        <w:rPr>
-          <w:rFonts w:ascii="Verdana" w:hAnsi="Verdana"/>
-          <w:color w:val="00B050"/>
-          <w:sz w:val="32"/>
-          <w:szCs w:val="32"/>
-        </w:rPr>
-      </w:pPr>
-    </w:p>
-    <w:p>
-      <w:pPr>
-        <w:pStyle w:val="NoSpacing"/>
-        <w:rPr>
-          <w:rFonts w:ascii="Verdana" w:hAnsi="Verdana"/>
-          <w:b/>
-          <w:color w:val="FFC000"/>
-          <w:sz w:val="48"/>
-        </w:rPr>
-      </w:pPr>
-      <w:r>
-        <w:rPr>
-          <w:rFonts w:ascii="Verdana" w:hAnsi="Verdana"/>
-          <w:b/>
-          <w:color w:val="FFC000"/>
-          <w:sz w:val="48"/>
-        </w:rPr>
-        <w:t>CHANGES</w:t>
-      </w:r>
-      <w:r>
-        <w:rPr>
-          <w:rFonts w:ascii="Verdana" w:hAnsi="Verdana"/>
-          <w:b/>
-          <w:color w:val="FFC000"/>
-          <w:sz w:val="48"/>
-        </w:rPr>
-        <w:t>:</w:t>
-      </w:r>
-    </w:p>
-    <w:p>
-      <w:pPr>
-        <w:pStyle w:val="NoSpacing"/>
         <w:numPr>
           <w:ilvl w:val="0"/>
           <w:numId w:val="19"/>
@@ -289,6 +248,90 @@
           <w:sz w:val="32"/>
           <w:szCs w:val="32"/>
         </w:rPr>
+        <w:t>Introduced configuration file (with .</w:t>
+      </w:r>
+      <w:proofErr w:type="spellStart"/>
+      <w:r>
+        <w:rPr>
+          <w:rFonts w:ascii="Verdana" w:hAnsi="Verdana"/>
+          <w:sz w:val="32"/>
+          <w:szCs w:val="32"/>
+        </w:rPr>
+        <w:t>ini</w:t>
+      </w:r>
+      <w:proofErr w:type="spellEnd"/>
+      <w:r>
+        <w:rPr>
+          <w:rFonts w:ascii="Verdana" w:hAnsi="Verdana"/>
+          <w:sz w:val="32"/>
+          <w:szCs w:val="32"/>
+        </w:rPr>
+        <w:t xml:space="preserve"> extension).</w:t>
+      </w:r>
+      <w:bookmarkStart w:id="0" w:name="_GoBack"/>
+      <w:bookmarkEnd w:id="0"/>
+    </w:p>
+    <w:p>
+      <w:pPr>
+        <w:pStyle w:val="NoSpacing"/>
+        <w:ind w:left="360"/>
+        <w:rPr>
+          <w:rFonts w:ascii="Verdana" w:hAnsi="Verdana"/>
+          <w:color w:val="00B050"/>
+          <w:sz w:val="32"/>
+          <w:szCs w:val="32"/>
+        </w:rPr>
+      </w:pPr>
+    </w:p>
+    <w:p>
+      <w:pPr>
+        <w:pStyle w:val="NoSpacing"/>
+        <w:rPr>
+          <w:rFonts w:ascii="Verdana" w:hAnsi="Verdana"/>
+          <w:b/>
+          <w:color w:val="FFC000"/>
+          <w:sz w:val="48"/>
+        </w:rPr>
+      </w:pPr>
+      <w:r>
+        <w:rPr>
+          <w:rFonts w:ascii="Verdana" w:hAnsi="Verdana"/>
+          <w:b/>
+          <w:color w:val="FFC000"/>
+          <w:sz w:val="48"/>
+        </w:rPr>
+        <w:t>CHANGES</w:t>
+      </w:r>
+      <w:r>
+        <w:rPr>
+          <w:rFonts w:ascii="Verdana" w:hAnsi="Verdana"/>
+          <w:b/>
+          <w:color w:val="FFC000"/>
+          <w:sz w:val="48"/>
+        </w:rPr>
+        <w:t>:</w:t>
+      </w:r>
+    </w:p>
+    <w:p>
+      <w:pPr>
+        <w:pStyle w:val="NoSpacing"/>
+        <w:numPr>
+          <w:ilvl w:val="0"/>
+          <w:numId w:val="19"/>
+        </w:numPr>
+        <w:rPr>
+          <w:rFonts w:ascii="Verdana" w:hAnsi="Verdana"/>
+          <w:color w:val="00B050"/>
+          <w:sz w:val="32"/>
+          <w:szCs w:val="32"/>
+        </w:rPr>
+      </w:pPr>
+      <w:r>
+        <w:rPr>
+          <w:rFonts w:ascii="Verdana" w:hAnsi="Verdana"/>
+          <w:sz w:val="32"/>
+          <w:szCs w:val="32"/>
+        </w:rPr>
         <w:t>Improved framerate</w:t>
       </w:r>
       <w:r>
@@ -553,8 +596,6 @@
           <w:sz w:val="48"/>
         </w:rPr>
       </w:pPr>
-      <w:bookmarkStart w:id="0" w:name="_GoBack"/>
-      <w:bookmarkEnd w:id="0"/>
       <w:r>
         <w:rPr>
           <w:rFonts w:ascii="Verdana" w:hAnsi="Verdana"/>
@@ -4354,7 +4395,7 @@
 </file>
 
 <file path=customXml/itemProps1.xml><?xml version="1.0" encoding="utf-8"?>
-<ds:datastoreItem xmlns:ds="http://schemas.openxmlformats.org/officeDocument/2006/customXml" ds:itemID="{F9C93B0C-F6D6-4642-A750-E8E10390C0F8}">
+<ds:datastoreItem xmlns:ds="http://schemas.openxmlformats.org/officeDocument/2006/customXml" ds:itemID="{9116E863-30D0-42E8-9478-BB6F758F08C2}">
   <ds:schemaRefs>
     <ds:schemaRef ds:uri="http://schemas.openxmlformats.org/officeDocument/2006/bibliography"/>
   </ds:schemaRefs>

</xml_diff>

<commit_message>
Editing minigun texture [JSomnia]. For Version 1.0.2 - KOREANS U06!
</commit_message>
<xml_diff>
--- a/changelog.docx
+++ b/changelog.docx
@@ -268,8 +268,6 @@
         </w:rPr>
         <w:t xml:space="preserve"> extension).</w:t>
       </w:r>
-      <w:bookmarkStart w:id="0" w:name="_GoBack"/>
-      <w:bookmarkEnd w:id="0"/>
     </w:p>
     <w:p>
       <w:pPr>
@@ -354,52 +352,76 @@
     <w:p>
       <w:pPr>
         <w:pStyle w:val="NoSpacing"/>
+        <w:numPr>
+          <w:ilvl w:val="0"/>
+          <w:numId w:val="19"/>
+        </w:numPr>
+        <w:rPr>
+          <w:rFonts w:ascii="Verdana" w:hAnsi="Verdana"/>
+          <w:color w:val="00B050"/>
+          <w:sz w:val="32"/>
+          <w:szCs w:val="32"/>
+        </w:rPr>
+      </w:pPr>
+      <w:proofErr w:type="spellStart"/>
+      <w:r>
+        <w:rPr>
+          <w:rFonts w:ascii="Verdana" w:hAnsi="Verdana"/>
+          <w:sz w:val="32"/>
+          <w:szCs w:val="32"/>
+        </w:rPr>
+        <w:t>Minigun</w:t>
+      </w:r>
+      <w:proofErr w:type="spellEnd"/>
+      <w:r>
+        <w:rPr>
+          <w:rFonts w:ascii="Verdana" w:hAnsi="Verdana"/>
+          <w:sz w:val="32"/>
+          <w:szCs w:val="32"/>
+        </w:rPr>
+        <w:t xml:space="preserve"> texture is rotated 45 degrees to point right instead diagonal.</w:t>
+      </w:r>
+      <w:r>
+        <w:rPr>
+          <w:rFonts w:ascii="Verdana" w:hAnsi="Verdana"/>
+          <w:sz w:val="32"/>
+          <w:szCs w:val="32"/>
+        </w:rPr>
+        <w:t xml:space="preserve"> [JSomnia]</w:t>
+      </w:r>
+    </w:p>
+    <w:p>
+      <w:pPr>
+        <w:pStyle w:val="NoSpacing"/>
+        <w:numPr>
+          <w:ilvl w:val="0"/>
+          <w:numId w:val="19"/>
+        </w:numPr>
+        <w:rPr>
+          <w:rFonts w:ascii="Verdana" w:hAnsi="Verdana"/>
+          <w:color w:val="00B050"/>
+          <w:sz w:val="32"/>
+          <w:szCs w:val="32"/>
+        </w:rPr>
+      </w:pPr>
+      <w:r>
+        <w:rPr>
+          <w:rFonts w:ascii="Verdana" w:hAnsi="Verdana"/>
+          <w:sz w:val="32"/>
+          <w:szCs w:val="32"/>
+        </w:rPr>
+        <w:t>Skybox rotates slowly instead of being motionless.</w:t>
+      </w:r>
+    </w:p>
+    <w:p>
+      <w:pPr>
+        <w:pStyle w:val="NoSpacing"/>
         <w:ind w:left="360"/>
         <w:rPr>
           <w:rFonts w:ascii="Verdana" w:hAnsi="Verdana"/>
           <w:color w:val="00B050"/>
           <w:sz w:val="32"/>
           <w:szCs w:val="32"/>
-        </w:rPr>
-      </w:pPr>
-    </w:p>
-    <w:p>
-      <w:pPr>
-        <w:pStyle w:val="NoSpacing"/>
-        <w:rPr>
-          <w:rFonts w:ascii="Verdana" w:hAnsi="Verdana"/>
-        </w:rPr>
-      </w:pPr>
-    </w:p>
-    <w:p>
-      <w:pPr>
-        <w:pStyle w:val="NoSpacing"/>
-        <w:rPr>
-          <w:rFonts w:ascii="Verdana" w:hAnsi="Verdana"/>
-        </w:rPr>
-      </w:pPr>
-    </w:p>
-    <w:p>
-      <w:pPr>
-        <w:pStyle w:val="NoSpacing"/>
-        <w:rPr>
-          <w:rFonts w:ascii="Verdana" w:hAnsi="Verdana"/>
-        </w:rPr>
-      </w:pPr>
-    </w:p>
-    <w:p>
-      <w:pPr>
-        <w:pStyle w:val="NoSpacing"/>
-        <w:rPr>
-          <w:rFonts w:ascii="Verdana" w:hAnsi="Verdana"/>
-        </w:rPr>
-      </w:pPr>
-    </w:p>
-    <w:p>
-      <w:pPr>
-        <w:pStyle w:val="NoSpacing"/>
-        <w:rPr>
-          <w:rFonts w:ascii="Verdana" w:hAnsi="Verdana"/>
         </w:rPr>
       </w:pPr>
     </w:p>
@@ -596,6 +618,8 @@
           <w:sz w:val="48"/>
         </w:rPr>
       </w:pPr>
+      <w:bookmarkStart w:id="0" w:name="_GoBack"/>
+      <w:bookmarkEnd w:id="0"/>
       <w:r>
         <w:rPr>
           <w:rFonts w:ascii="Verdana" w:hAnsi="Verdana"/>
@@ -4395,7 +4419,7 @@
 </file>
 
 <file path=customXml/itemProps1.xml><?xml version="1.0" encoding="utf-8"?>
-<ds:datastoreItem xmlns:ds="http://schemas.openxmlformats.org/officeDocument/2006/customXml" ds:itemID="{9116E863-30D0-42E8-9478-BB6F758F08C2}">
+<ds:datastoreItem xmlns:ds="http://schemas.openxmlformats.org/officeDocument/2006/customXml" ds:itemID="{1CC7B0FE-9126-4AAA-8CFB-E768A9A62061}">
   <ds:schemaRefs>
     <ds:schemaRef ds:uri="http://schemas.openxmlformats.org/officeDocument/2006/bibliography"/>
   </ds:schemaRefs>

</xml_diff>

<commit_message>
Critical application fail on startup [JSomnia]. For 1.0.2 - KOREANS U07!
</commit_message>
<xml_diff>
--- a/changelog.docx
+++ b/changelog.docx
@@ -416,68 +416,93 @@
     <w:p>
       <w:pPr>
         <w:pStyle w:val="NoSpacing"/>
+        <w:rPr>
+          <w:rFonts w:ascii="Verdana" w:hAnsi="Verdana"/>
+          <w:sz w:val="32"/>
+          <w:szCs w:val="32"/>
+        </w:rPr>
+      </w:pPr>
+    </w:p>
+    <w:p>
+      <w:pPr>
+        <w:pStyle w:val="NoSpacing"/>
+        <w:rPr>
+          <w:rFonts w:ascii="Verdana" w:hAnsi="Verdana"/>
+          <w:b/>
+          <w:color w:val="FF0000"/>
+          <w:sz w:val="48"/>
+        </w:rPr>
+      </w:pPr>
+      <w:r>
+        <w:rPr>
+          <w:rFonts w:ascii="Verdana" w:hAnsi="Verdana"/>
+          <w:b/>
+          <w:color w:val="FF0000"/>
+          <w:sz w:val="48"/>
+        </w:rPr>
+        <w:t>FIXES:</w:t>
+      </w:r>
+    </w:p>
+    <w:p>
+      <w:pPr>
+        <w:pStyle w:val="NoSpacing"/>
+        <w:numPr>
+          <w:ilvl w:val="0"/>
+          <w:numId w:val="19"/>
+        </w:numPr>
+        <w:rPr>
+          <w:rFonts w:ascii="Verdana" w:hAnsi="Verdana"/>
+          <w:color w:val="00B050"/>
+          <w:sz w:val="32"/>
+          <w:szCs w:val="32"/>
+        </w:rPr>
+      </w:pPr>
+      <w:r>
+        <w:rPr>
+          <w:rFonts w:ascii="Verdana" w:hAnsi="Verdana"/>
+          <w:sz w:val="32"/>
+          <w:szCs w:val="32"/>
+        </w:rPr>
+        <w:t xml:space="preserve">Critical null pointer exception at program startup fix </w:t>
+      </w:r>
+      <w:bookmarkStart w:id="0" w:name="_GoBack"/>
+      <w:bookmarkEnd w:id="0"/>
+      <w:r>
+        <w:rPr>
+          <w:rFonts w:ascii="Verdana" w:hAnsi="Verdana"/>
+          <w:sz w:val="32"/>
+          <w:szCs w:val="32"/>
+        </w:rPr>
+        <w:t>(white screen application, not responding) [</w:t>
+      </w:r>
+      <w:proofErr w:type="spellStart"/>
+      <w:r>
+        <w:rPr>
+          <w:rFonts w:ascii="Verdana" w:hAnsi="Verdana"/>
+          <w:sz w:val="32"/>
+          <w:szCs w:val="32"/>
+        </w:rPr>
+        <w:t>JSomnia</w:t>
+      </w:r>
+      <w:proofErr w:type="spellEnd"/>
+      <w:r>
+        <w:rPr>
+          <w:rFonts w:ascii="Verdana" w:hAnsi="Verdana"/>
+          <w:sz w:val="32"/>
+          <w:szCs w:val="32"/>
+        </w:rPr>
+        <w:t>]</w:t>
+      </w:r>
+    </w:p>
+    <w:p>
+      <w:pPr>
+        <w:pStyle w:val="NoSpacing"/>
         <w:ind w:left="360"/>
         <w:rPr>
           <w:rFonts w:ascii="Verdana" w:hAnsi="Verdana"/>
           <w:color w:val="00B050"/>
           <w:sz w:val="32"/>
           <w:szCs w:val="32"/>
-        </w:rPr>
-      </w:pPr>
-    </w:p>
-    <w:p>
-      <w:pPr>
-        <w:pStyle w:val="NoSpacing"/>
-        <w:rPr>
-          <w:rFonts w:ascii="Verdana" w:hAnsi="Verdana"/>
-        </w:rPr>
-      </w:pPr>
-    </w:p>
-    <w:p>
-      <w:pPr>
-        <w:pStyle w:val="NoSpacing"/>
-        <w:rPr>
-          <w:rFonts w:ascii="Verdana" w:hAnsi="Verdana"/>
-        </w:rPr>
-      </w:pPr>
-    </w:p>
-    <w:p>
-      <w:pPr>
-        <w:pStyle w:val="NoSpacing"/>
-        <w:rPr>
-          <w:rFonts w:ascii="Verdana" w:hAnsi="Verdana"/>
-        </w:rPr>
-      </w:pPr>
-    </w:p>
-    <w:p>
-      <w:pPr>
-        <w:pStyle w:val="NoSpacing"/>
-        <w:rPr>
-          <w:rFonts w:ascii="Verdana" w:hAnsi="Verdana"/>
-        </w:rPr>
-      </w:pPr>
-    </w:p>
-    <w:p>
-      <w:pPr>
-        <w:pStyle w:val="NoSpacing"/>
-        <w:rPr>
-          <w:rFonts w:ascii="Verdana" w:hAnsi="Verdana"/>
-        </w:rPr>
-      </w:pPr>
-    </w:p>
-    <w:p>
-      <w:pPr>
-        <w:pStyle w:val="NoSpacing"/>
-        <w:rPr>
-          <w:rFonts w:ascii="Verdana" w:hAnsi="Verdana"/>
-        </w:rPr>
-      </w:pPr>
-    </w:p>
-    <w:p>
-      <w:pPr>
-        <w:pStyle w:val="NoSpacing"/>
-        <w:rPr>
-          <w:rFonts w:ascii="Verdana" w:hAnsi="Verdana"/>
         </w:rPr>
       </w:pPr>
     </w:p>
@@ -618,8 +643,6 @@
           <w:sz w:val="48"/>
         </w:rPr>
       </w:pPr>
-      <w:bookmarkStart w:id="0" w:name="_GoBack"/>
-      <w:bookmarkEnd w:id="0"/>
       <w:r>
         <w:rPr>
           <w:rFonts w:ascii="Verdana" w:hAnsi="Verdana"/>
@@ -4419,7 +4442,7 @@
 </file>
 
 <file path=customXml/itemProps1.xml><?xml version="1.0" encoding="utf-8"?>
-<ds:datastoreItem xmlns:ds="http://schemas.openxmlformats.org/officeDocument/2006/customXml" ds:itemID="{1CC7B0FE-9126-4AAA-8CFB-E768A9A62061}">
+<ds:datastoreItem xmlns:ds="http://schemas.openxmlformats.org/officeDocument/2006/customXml" ds:itemID="{8C0D937E-6E42-4E07-9DC6-54CDEAA54235}">
   <ds:schemaRefs>
     <ds:schemaRef ds:uri="http://schemas.openxmlformats.org/officeDocument/2006/bibliography"/>
   </ds:schemaRefs>

</xml_diff>

<commit_message>
Chunk based engine - Mega update. For Version 12 - LATVIA U01!
</commit_message>
<xml_diff>
--- a/changelog.docx
+++ b/changelog.docx
@@ -44,7 +44,7 @@
           <w:b/>
           <w:sz w:val="48"/>
         </w:rPr>
-        <w:t>1</w:t>
+        <w:t>2</w:t>
       </w:r>
       <w:r>
         <w:rPr>
@@ -60,7 +60,7 @@
           <w:b/>
           <w:sz w:val="48"/>
         </w:rPr>
-        <w:t>KOREANS</w:t>
+        <w:t>LATVIA</w:t>
       </w:r>
       <w:r>
         <w:rPr>
@@ -202,7 +202,16 @@
           <w:color w:val="00B050"/>
           <w:sz w:val="48"/>
         </w:rPr>
-        <w:t>FEATURES:</w:t>
+        <w:t>FEATURE</w:t>
+      </w:r>
+      <w:r>
+        <w:rPr>
+          <w:rFonts w:ascii="Verdana" w:hAnsi="Verdana"/>
+          <w:b/>
+          <w:color w:val="00B050"/>
+          <w:sz w:val="48"/>
+        </w:rPr>
+        <w:t>S:</w:t>
       </w:r>
     </w:p>
     <w:p>
@@ -225,7 +234,48 @@
           <w:sz w:val="32"/>
           <w:szCs w:val="32"/>
         </w:rPr>
-        <w:t>First fog implementation.</w:t>
+        <w:t>Block world is now split into chunks which are carefully chosen when to render.</w:t>
+      </w:r>
+    </w:p>
+    <w:p>
+      <w:pPr>
+        <w:pStyle w:val="NoSpacing"/>
+        <w:ind w:left="360"/>
+        <w:rPr>
+          <w:rFonts w:ascii="Verdana" w:hAnsi="Verdana"/>
+          <w:color w:val="00B050"/>
+          <w:sz w:val="32"/>
+          <w:szCs w:val="32"/>
+        </w:rPr>
+      </w:pPr>
+    </w:p>
+    <w:p>
+      <w:pPr>
+        <w:pStyle w:val="NoSpacing"/>
+        <w:rPr>
+          <w:rFonts w:ascii="Verdana" w:hAnsi="Verdana"/>
+          <w:b/>
+          <w:color w:val="FFC000"/>
+          <w:sz w:val="48"/>
+        </w:rPr>
+      </w:pPr>
+      <w:r>
+        <w:rPr>
+          <w:rFonts w:ascii="Verdana" w:hAnsi="Verdana"/>
+          <w:b/>
+          <w:color w:val="FFC000"/>
+          <w:sz w:val="48"/>
+        </w:rPr>
+        <w:t>CHANGES</w:t>
+      </w:r>
+      <w:r>
+        <w:rPr>
+          <w:rFonts w:ascii="Verdana" w:hAnsi="Verdana"/>
+          <w:b/>
+          <w:color w:val="FFC000"/>
+          <w:sz w:val="48"/>
+        </w:rPr>
+        <w:t>:</w:t>
       </w:r>
     </w:p>
     <w:p>
@@ -248,66 +298,31 @@
           <w:sz w:val="32"/>
           <w:szCs w:val="32"/>
         </w:rPr>
-        <w:t>Introduced configuration file (with .</w:t>
-      </w:r>
-      <w:proofErr w:type="spellStart"/>
-      <w:r>
-        <w:rPr>
-          <w:rFonts w:ascii="Verdana" w:hAnsi="Verdana"/>
-          <w:sz w:val="32"/>
-          <w:szCs w:val="32"/>
-        </w:rPr>
-        <w:t>ini</w:t>
-      </w:r>
-      <w:proofErr w:type="spellEnd"/>
-      <w:r>
-        <w:rPr>
-          <w:rFonts w:ascii="Verdana" w:hAnsi="Verdana"/>
-          <w:sz w:val="32"/>
-          <w:szCs w:val="32"/>
-        </w:rPr>
-        <w:t xml:space="preserve"> extension).</w:t>
-      </w:r>
-    </w:p>
-    <w:p>
-      <w:pPr>
-        <w:pStyle w:val="NoSpacing"/>
-        <w:ind w:left="360"/>
-        <w:rPr>
-          <w:rFonts w:ascii="Verdana" w:hAnsi="Verdana"/>
-          <w:color w:val="00B050"/>
-          <w:sz w:val="32"/>
-          <w:szCs w:val="32"/>
-        </w:rPr>
-      </w:pPr>
-    </w:p>
-    <w:p>
-      <w:pPr>
-        <w:pStyle w:val="NoSpacing"/>
-        <w:rPr>
-          <w:rFonts w:ascii="Verdana" w:hAnsi="Verdana"/>
-          <w:b/>
-          <w:color w:val="FFC000"/>
-          <w:sz w:val="48"/>
-        </w:rPr>
-      </w:pPr>
-      <w:r>
-        <w:rPr>
-          <w:rFonts w:ascii="Verdana" w:hAnsi="Verdana"/>
-          <w:b/>
-          <w:color w:val="FFC000"/>
-          <w:sz w:val="48"/>
-        </w:rPr>
-        <w:t>CHANGES</w:t>
-      </w:r>
-      <w:r>
-        <w:rPr>
-          <w:rFonts w:ascii="Verdana" w:hAnsi="Verdana"/>
-          <w:b/>
-          <w:color w:val="FFC000"/>
-          <w:sz w:val="48"/>
-        </w:rPr>
-        <w:t>:</w:t>
+        <w:t>I</w:t>
+      </w:r>
+      <w:r>
+        <w:rPr>
+          <w:rFonts w:ascii="Verdana" w:hAnsi="Verdana"/>
+          <w:sz w:val="32"/>
+          <w:szCs w:val="32"/>
+        </w:rPr>
+        <w:t>mproved engine can rend</w:t>
+      </w:r>
+      <w:r>
+        <w:rPr>
+          <w:rFonts w:ascii="Verdana" w:hAnsi="Verdana"/>
+          <w:sz w:val="32"/>
+          <w:szCs w:val="32"/>
+        </w:rPr>
+        <w:t xml:space="preserve">er now maximum amount of blocks, namely </w:t>
+      </w:r>
+      <w:r>
+        <w:rPr>
+          <w:rFonts w:ascii="Verdana" w:hAnsi="Verdana"/>
+          <w:sz w:val="32"/>
+          <w:szCs w:val="32"/>
+        </w:rPr>
+        <w:t>131070.</w:t>
       </w:r>
     </w:p>
     <w:p>
@@ -330,23 +345,7 @@
           <w:sz w:val="32"/>
           <w:szCs w:val="32"/>
         </w:rPr>
-        <w:t>Improved framerate</w:t>
-      </w:r>
-      <w:r>
-        <w:rPr>
-          <w:rFonts w:ascii="Verdana" w:hAnsi="Verdana"/>
-          <w:sz w:val="32"/>
-          <w:szCs w:val="32"/>
-        </w:rPr>
-        <w:t xml:space="preserve"> </w:t>
-      </w:r>
-      <w:r>
-        <w:rPr>
-          <w:rFonts w:ascii="Verdana" w:hAnsi="Verdana"/>
-          <w:sz w:val="32"/>
-          <w:szCs w:val="32"/>
-        </w:rPr>
-        <w:t>with more optimizations.</w:t>
+        <w:t>Random level generator generates level faster and levels load faster.</w:t>
       </w:r>
     </w:p>
     <w:p>
@@ -363,31 +362,21 @@
           <w:szCs w:val="32"/>
         </w:rPr>
       </w:pPr>
-      <w:proofErr w:type="spellStart"/>
-      <w:r>
-        <w:rPr>
-          <w:rFonts w:ascii="Verdana" w:hAnsi="Verdana"/>
-          <w:sz w:val="32"/>
-          <w:szCs w:val="32"/>
-        </w:rPr>
-        <w:t>Minigun</w:t>
-      </w:r>
-      <w:proofErr w:type="spellEnd"/>
-      <w:r>
-        <w:rPr>
-          <w:rFonts w:ascii="Verdana" w:hAnsi="Verdana"/>
-          <w:sz w:val="32"/>
-          <w:szCs w:val="32"/>
-        </w:rPr>
-        <w:t xml:space="preserve"> texture is rotated 45 degrees to point right instead diagonal.</w:t>
-      </w:r>
-      <w:r>
-        <w:rPr>
-          <w:rFonts w:ascii="Verdana" w:hAnsi="Verdana"/>
-          <w:sz w:val="32"/>
-          <w:szCs w:val="32"/>
-        </w:rPr>
-        <w:t xml:space="preserve"> [JSomnia]</w:t>
+      <w:r>
+        <w:rPr>
+          <w:rFonts w:ascii="Verdana" w:hAnsi="Verdana"/>
+          <w:sz w:val="32"/>
+          <w:szCs w:val="32"/>
+        </w:rPr>
+        <w:t>Program</w:t>
+      </w:r>
+      <w:r>
+        <w:rPr>
+          <w:rFonts w:ascii="Verdana" w:hAnsi="Verdana"/>
+          <w:sz w:val="32"/>
+          <w:szCs w:val="32"/>
+        </w:rPr>
+        <w:t xml:space="preserve"> consumes lesser memory due to removed redundant lists.</w:t>
       </w:r>
     </w:p>
     <w:p>
@@ -410,14 +399,16 @@
           <w:sz w:val="32"/>
           <w:szCs w:val="32"/>
         </w:rPr>
-        <w:t>Skybox rotates slowly instead of being motionless.</w:t>
+        <w:t>World size increased (skybox is larger).</w:t>
       </w:r>
     </w:p>
     <w:p>
       <w:pPr>
         <w:pStyle w:val="NoSpacing"/>
-        <w:rPr>
-          <w:rFonts w:ascii="Verdana" w:hAnsi="Verdana"/>
+        <w:ind w:left="360"/>
+        <w:rPr>
+          <w:rFonts w:ascii="Verdana" w:hAnsi="Verdana"/>
+          <w:color w:val="00B050"/>
           <w:sz w:val="32"/>
           <w:szCs w:val="32"/>
         </w:rPr>
@@ -426,30 +417,19 @@
     <w:p>
       <w:pPr>
         <w:pStyle w:val="NoSpacing"/>
-        <w:rPr>
-          <w:rFonts w:ascii="Verdana" w:hAnsi="Verdana"/>
-          <w:b/>
-          <w:color w:val="FF0000"/>
-          <w:sz w:val="48"/>
-        </w:rPr>
-      </w:pPr>
-      <w:r>
-        <w:rPr>
-          <w:rFonts w:ascii="Verdana" w:hAnsi="Verdana"/>
-          <w:b/>
-          <w:color w:val="FF0000"/>
-          <w:sz w:val="48"/>
-        </w:rPr>
-        <w:t>FIXES:</w:t>
-      </w:r>
+        <w:ind w:left="360"/>
+        <w:rPr>
+          <w:rFonts w:ascii="Verdana" w:hAnsi="Verdana"/>
+          <w:color w:val="00B050"/>
+          <w:sz w:val="32"/>
+          <w:szCs w:val="32"/>
+        </w:rPr>
+      </w:pPr>
     </w:p>
     <w:p>
       <w:pPr>
         <w:pStyle w:val="NoSpacing"/>
-        <w:numPr>
-          <w:ilvl w:val="0"/>
-          <w:numId w:val="19"/>
-        </w:numPr>
+        <w:ind w:left="360"/>
         <w:rPr>
           <w:rFonts w:ascii="Verdana" w:hAnsi="Verdana"/>
           <w:color w:val="00B050"/>
@@ -457,192 +437,154 @@
           <w:szCs w:val="32"/>
         </w:rPr>
       </w:pPr>
-      <w:r>
-        <w:rPr>
-          <w:rFonts w:ascii="Verdana" w:hAnsi="Verdana"/>
-          <w:sz w:val="32"/>
-          <w:szCs w:val="32"/>
-        </w:rPr>
-        <w:t xml:space="preserve">Critical null pointer exception at program startup fix </w:t>
-      </w:r>
+    </w:p>
+    <w:p>
+      <w:pPr>
+        <w:pStyle w:val="NoSpacing"/>
+        <w:ind w:left="360"/>
+        <w:rPr>
+          <w:rFonts w:ascii="Verdana" w:hAnsi="Verdana"/>
+          <w:color w:val="00B050"/>
+          <w:sz w:val="32"/>
+          <w:szCs w:val="32"/>
+        </w:rPr>
+      </w:pPr>
+    </w:p>
+    <w:p>
+      <w:pPr>
+        <w:pStyle w:val="NoSpacing"/>
+        <w:ind w:left="360"/>
+        <w:rPr>
+          <w:rFonts w:ascii="Verdana" w:hAnsi="Verdana"/>
+          <w:color w:val="00B050"/>
+          <w:sz w:val="32"/>
+          <w:szCs w:val="32"/>
+        </w:rPr>
+      </w:pPr>
+    </w:p>
+    <w:p>
+      <w:pPr>
+        <w:pStyle w:val="NoSpacing"/>
+        <w:ind w:left="360"/>
+        <w:rPr>
+          <w:rFonts w:ascii="Verdana" w:hAnsi="Verdana"/>
+          <w:color w:val="00B050"/>
+          <w:sz w:val="32"/>
+          <w:szCs w:val="32"/>
+        </w:rPr>
+      </w:pPr>
+    </w:p>
+    <w:p>
+      <w:pPr>
+        <w:pStyle w:val="NoSpacing"/>
+        <w:ind w:left="360"/>
+        <w:rPr>
+          <w:rFonts w:ascii="Verdana" w:hAnsi="Verdana"/>
+          <w:color w:val="00B050"/>
+          <w:sz w:val="32"/>
+          <w:szCs w:val="32"/>
+        </w:rPr>
+      </w:pPr>
+    </w:p>
+    <w:p>
+      <w:pPr>
+        <w:pStyle w:val="NoSpacing"/>
+        <w:ind w:left="360"/>
+        <w:rPr>
+          <w:rFonts w:ascii="Verdana" w:hAnsi="Verdana"/>
+          <w:color w:val="00B050"/>
+          <w:sz w:val="32"/>
+          <w:szCs w:val="32"/>
+        </w:rPr>
+      </w:pPr>
+    </w:p>
+    <w:p>
+      <w:pPr>
+        <w:pStyle w:val="NoSpacing"/>
+        <w:ind w:left="360"/>
+        <w:rPr>
+          <w:rFonts w:ascii="Verdana" w:hAnsi="Verdana"/>
+          <w:color w:val="00B050"/>
+          <w:sz w:val="32"/>
+          <w:szCs w:val="32"/>
+        </w:rPr>
+      </w:pPr>
+    </w:p>
+    <w:p>
+      <w:pPr>
+        <w:pStyle w:val="NoSpacing"/>
+        <w:ind w:left="360"/>
+        <w:rPr>
+          <w:rFonts w:ascii="Verdana" w:hAnsi="Verdana"/>
+          <w:color w:val="00B050"/>
+          <w:sz w:val="32"/>
+          <w:szCs w:val="32"/>
+        </w:rPr>
+      </w:pPr>
+    </w:p>
+    <w:p>
+      <w:pPr>
+        <w:pStyle w:val="NoSpacing"/>
+        <w:ind w:left="360"/>
+        <w:rPr>
+          <w:rFonts w:ascii="Verdana" w:hAnsi="Verdana"/>
+          <w:color w:val="00B050"/>
+          <w:sz w:val="32"/>
+          <w:szCs w:val="32"/>
+        </w:rPr>
+      </w:pPr>
+    </w:p>
+    <w:p>
+      <w:pPr>
+        <w:pStyle w:val="NoSpacing"/>
+        <w:ind w:left="360"/>
+        <w:rPr>
+          <w:rFonts w:ascii="Verdana" w:hAnsi="Verdana"/>
+          <w:color w:val="00B050"/>
+          <w:sz w:val="32"/>
+          <w:szCs w:val="32"/>
+        </w:rPr>
+      </w:pPr>
+    </w:p>
+    <w:p>
+      <w:pPr>
+        <w:pStyle w:val="NoSpacing"/>
+        <w:ind w:left="360"/>
+        <w:rPr>
+          <w:rFonts w:ascii="Verdana" w:hAnsi="Verdana"/>
+          <w:color w:val="00B050"/>
+          <w:sz w:val="32"/>
+          <w:szCs w:val="32"/>
+        </w:rPr>
+      </w:pPr>
+    </w:p>
+    <w:p>
+      <w:pPr>
+        <w:pStyle w:val="NoSpacing"/>
+        <w:rPr>
+          <w:rFonts w:ascii="Verdana" w:hAnsi="Verdana"/>
+        </w:rPr>
+      </w:pPr>
+    </w:p>
+    <w:p>
+      <w:pPr>
+        <w:pStyle w:val="NoSpacing"/>
+        <w:rPr>
+          <w:rFonts w:ascii="Verdana" w:hAnsi="Verdana"/>
+        </w:rPr>
+      </w:pPr>
+    </w:p>
+    <w:p>
+      <w:pPr>
+        <w:pStyle w:val="NoSpacing"/>
+        <w:rPr>
+          <w:rFonts w:ascii="Verdana" w:hAnsi="Verdana"/>
+          <w:b/>
+          <w:sz w:val="48"/>
+        </w:rPr>
+      </w:pPr>
       <w:bookmarkStart w:id="0" w:name="_GoBack"/>
       <w:bookmarkEnd w:id="0"/>
-      <w:r>
-        <w:rPr>
-          <w:rFonts w:ascii="Verdana" w:hAnsi="Verdana"/>
-          <w:sz w:val="32"/>
-          <w:szCs w:val="32"/>
-        </w:rPr>
-        <w:t>(white screen application, not responding) [</w:t>
-      </w:r>
-      <w:proofErr w:type="spellStart"/>
-      <w:r>
-        <w:rPr>
-          <w:rFonts w:ascii="Verdana" w:hAnsi="Verdana"/>
-          <w:sz w:val="32"/>
-          <w:szCs w:val="32"/>
-        </w:rPr>
-        <w:t>JSomnia</w:t>
-      </w:r>
-      <w:proofErr w:type="spellEnd"/>
-      <w:r>
-        <w:rPr>
-          <w:rFonts w:ascii="Verdana" w:hAnsi="Verdana"/>
-          <w:sz w:val="32"/>
-          <w:szCs w:val="32"/>
-        </w:rPr>
-        <w:t>]</w:t>
-      </w:r>
-    </w:p>
-    <w:p>
-      <w:pPr>
-        <w:pStyle w:val="NoSpacing"/>
-        <w:ind w:left="360"/>
-        <w:rPr>
-          <w:rFonts w:ascii="Verdana" w:hAnsi="Verdana"/>
-          <w:color w:val="00B050"/>
-          <w:sz w:val="32"/>
-          <w:szCs w:val="32"/>
-        </w:rPr>
-      </w:pPr>
-    </w:p>
-    <w:p>
-      <w:pPr>
-        <w:pStyle w:val="NoSpacing"/>
-        <w:rPr>
-          <w:rFonts w:ascii="Verdana" w:hAnsi="Verdana"/>
-        </w:rPr>
-      </w:pPr>
-    </w:p>
-    <w:p>
-      <w:pPr>
-        <w:pStyle w:val="NoSpacing"/>
-        <w:rPr>
-          <w:rFonts w:ascii="Verdana" w:hAnsi="Verdana"/>
-        </w:rPr>
-      </w:pPr>
-    </w:p>
-    <w:p>
-      <w:pPr>
-        <w:pStyle w:val="NoSpacing"/>
-        <w:rPr>
-          <w:rFonts w:ascii="Verdana" w:hAnsi="Verdana"/>
-        </w:rPr>
-      </w:pPr>
-    </w:p>
-    <w:p>
-      <w:pPr>
-        <w:pStyle w:val="NoSpacing"/>
-        <w:rPr>
-          <w:rFonts w:ascii="Verdana" w:hAnsi="Verdana"/>
-        </w:rPr>
-      </w:pPr>
-    </w:p>
-    <w:p>
-      <w:pPr>
-        <w:pStyle w:val="NoSpacing"/>
-        <w:rPr>
-          <w:rFonts w:ascii="Verdana" w:hAnsi="Verdana"/>
-        </w:rPr>
-      </w:pPr>
-    </w:p>
-    <w:p>
-      <w:pPr>
-        <w:pStyle w:val="NoSpacing"/>
-        <w:rPr>
-          <w:rFonts w:ascii="Verdana" w:hAnsi="Verdana"/>
-        </w:rPr>
-      </w:pPr>
-    </w:p>
-    <w:p>
-      <w:pPr>
-        <w:pStyle w:val="NoSpacing"/>
-        <w:rPr>
-          <w:rFonts w:ascii="Verdana" w:hAnsi="Verdana"/>
-        </w:rPr>
-      </w:pPr>
-    </w:p>
-    <w:p>
-      <w:pPr>
-        <w:pStyle w:val="NoSpacing"/>
-        <w:rPr>
-          <w:rFonts w:ascii="Verdana" w:hAnsi="Verdana"/>
-        </w:rPr>
-      </w:pPr>
-    </w:p>
-    <w:p>
-      <w:pPr>
-        <w:pStyle w:val="NoSpacing"/>
-        <w:rPr>
-          <w:rFonts w:ascii="Verdana" w:hAnsi="Verdana"/>
-        </w:rPr>
-      </w:pPr>
-    </w:p>
-    <w:p>
-      <w:pPr>
-        <w:pStyle w:val="NoSpacing"/>
-        <w:rPr>
-          <w:rFonts w:ascii="Verdana" w:hAnsi="Verdana"/>
-        </w:rPr>
-      </w:pPr>
-    </w:p>
-    <w:p>
-      <w:pPr>
-        <w:pStyle w:val="NoSpacing"/>
-        <w:rPr>
-          <w:rFonts w:ascii="Verdana" w:hAnsi="Verdana"/>
-        </w:rPr>
-      </w:pPr>
-    </w:p>
-    <w:p>
-      <w:pPr>
-        <w:pStyle w:val="NoSpacing"/>
-        <w:rPr>
-          <w:rFonts w:ascii="Verdana" w:hAnsi="Verdana"/>
-        </w:rPr>
-      </w:pPr>
-    </w:p>
-    <w:p>
-      <w:pPr>
-        <w:pStyle w:val="NoSpacing"/>
-        <w:rPr>
-          <w:rFonts w:ascii="Verdana" w:hAnsi="Verdana"/>
-        </w:rPr>
-      </w:pPr>
-    </w:p>
-    <w:p>
-      <w:pPr>
-        <w:pStyle w:val="NoSpacing"/>
-        <w:rPr>
-          <w:rFonts w:ascii="Verdana" w:hAnsi="Verdana"/>
-        </w:rPr>
-      </w:pPr>
-    </w:p>
-    <w:p>
-      <w:pPr>
-        <w:pStyle w:val="NoSpacing"/>
-        <w:rPr>
-          <w:rFonts w:ascii="Verdana" w:hAnsi="Verdana"/>
-        </w:rPr>
-      </w:pPr>
-    </w:p>
-    <w:p>
-      <w:pPr>
-        <w:pStyle w:val="NoSpacing"/>
-        <w:rPr>
-          <w:rFonts w:ascii="Verdana" w:hAnsi="Verdana"/>
-        </w:rPr>
-      </w:pPr>
-    </w:p>
-    <w:p>
-      <w:pPr>
-        <w:pStyle w:val="NoSpacing"/>
-        <w:rPr>
-          <w:rFonts w:ascii="Verdana" w:hAnsi="Verdana"/>
-          <w:b/>
-          <w:sz w:val="48"/>
-        </w:rPr>
-      </w:pPr>
       <w:r>
         <w:rPr>
           <w:rFonts w:ascii="Verdana" w:hAnsi="Verdana"/>
@@ -4442,7 +4384,7 @@
 </file>
 
 <file path=customXml/itemProps1.xml><?xml version="1.0" encoding="utf-8"?>
-<ds:datastoreItem xmlns:ds="http://schemas.openxmlformats.org/officeDocument/2006/customXml" ds:itemID="{8C0D937E-6E42-4E07-9DC6-54CDEAA54235}">
+<ds:datastoreItem xmlns:ds="http://schemas.openxmlformats.org/officeDocument/2006/customXml" ds:itemID="{AF8E00BA-9382-49BB-9CD0-D5018ECA2A01}">
   <ds:schemaRefs>
     <ds:schemaRef ds:uri="http://schemas.openxmlformats.org/officeDocument/2006/bibliography"/>
   </ds:schemaRefs>

</xml_diff>

<commit_message>
Made optimization for block addition. For Version 12 LATVIA U04!
</commit_message>
<xml_diff>
--- a/changelog.docx
+++ b/changelog.docx
@@ -202,16 +202,7 @@
           <w:color w:val="00B050"/>
           <w:sz w:val="48"/>
         </w:rPr>
-        <w:t>FEATURE</w:t>
-      </w:r>
-      <w:r>
-        <w:rPr>
-          <w:rFonts w:ascii="Verdana" w:hAnsi="Verdana"/>
-          <w:b/>
-          <w:color w:val="00B050"/>
-          <w:sz w:val="48"/>
-        </w:rPr>
-        <w:t>S:</w:t>
+        <w:t>FEATURES:</w:t>
       </w:r>
     </w:p>
     <w:p>
@@ -345,7 +336,15 @@
           <w:sz w:val="32"/>
           <w:szCs w:val="32"/>
         </w:rPr>
-        <w:t>Random level generator generates level faster and levels load faster.</w:t>
+        <w:t>Program</w:t>
+      </w:r>
+      <w:r>
+        <w:rPr>
+          <w:rFonts w:ascii="Verdana" w:hAnsi="Verdana"/>
+          <w:sz w:val="32"/>
+          <w:szCs w:val="32"/>
+        </w:rPr>
+        <w:t xml:space="preserve"> consumes lesser memory due to removed redundant lists.</w:t>
       </w:r>
     </w:p>
     <w:p>
@@ -368,15 +367,57 @@
           <w:sz w:val="32"/>
           <w:szCs w:val="32"/>
         </w:rPr>
-        <w:t>Program</w:t>
-      </w:r>
-      <w:r>
-        <w:rPr>
-          <w:rFonts w:ascii="Verdana" w:hAnsi="Verdana"/>
-          <w:sz w:val="32"/>
-          <w:szCs w:val="32"/>
-        </w:rPr>
-        <w:t xml:space="preserve"> consumes lesser memory due to removed redundant lists.</w:t>
+        <w:t>World size increased (skybox is larger).</w:t>
+      </w:r>
+    </w:p>
+    <w:p>
+      <w:pPr>
+        <w:pStyle w:val="NoSpacing"/>
+        <w:ind w:left="360"/>
+        <w:rPr>
+          <w:rFonts w:ascii="Verdana" w:hAnsi="Verdana"/>
+          <w:color w:val="00B050"/>
+          <w:sz w:val="32"/>
+          <w:szCs w:val="32"/>
+        </w:rPr>
+      </w:pPr>
+    </w:p>
+    <w:p>
+      <w:pPr>
+        <w:pStyle w:val="NoSpacing"/>
+        <w:rPr>
+          <w:rFonts w:ascii="Verdana" w:hAnsi="Verdana"/>
+          <w:b/>
+          <w:color w:val="FF0000"/>
+          <w:sz w:val="48"/>
+        </w:rPr>
+      </w:pPr>
+      <w:r>
+        <w:rPr>
+          <w:rFonts w:ascii="Verdana" w:hAnsi="Verdana"/>
+          <w:b/>
+          <w:color w:val="FF0000"/>
+          <w:sz w:val="48"/>
+        </w:rPr>
+        <w:t>F</w:t>
+      </w:r>
+      <w:r>
+        <w:rPr>
+          <w:rFonts w:ascii="Verdana" w:hAnsi="Verdana"/>
+          <w:b/>
+          <w:color w:val="FF0000"/>
+          <w:sz w:val="48"/>
+        </w:rPr>
+        <w:t>IXE</w:t>
+      </w:r>
+      <w:r>
+        <w:rPr>
+          <w:rFonts w:ascii="Verdana" w:hAnsi="Verdana"/>
+          <w:b/>
+          <w:color w:val="FF0000"/>
+          <w:sz w:val="48"/>
+        </w:rPr>
+        <w:t>S:</w:t>
       </w:r>
     </w:p>
     <w:p>
@@ -399,7 +440,31 @@
           <w:sz w:val="32"/>
           <w:szCs w:val="32"/>
         </w:rPr>
-        <w:t>World size increased (skybox is larger).</w:t>
+        <w:t>Level renderer does not animate</w:t>
+      </w:r>
+      <w:r>
+        <w:rPr>
+          <w:rFonts w:ascii="Verdana" w:hAnsi="Verdana"/>
+          <w:sz w:val="32"/>
+          <w:szCs w:val="32"/>
+        </w:rPr>
+        <w:t xml:space="preserve"> (fix)</w:t>
+      </w:r>
+      <w:r>
+        <w:rPr>
+          <w:rFonts w:ascii="Verdana" w:hAnsi="Verdana"/>
+          <w:sz w:val="32"/>
+          <w:szCs w:val="32"/>
+        </w:rPr>
+        <w:t xml:space="preserve"> when level is loading</w:t>
+      </w:r>
+      <w:r>
+        <w:rPr>
+          <w:rFonts w:ascii="Verdana" w:hAnsi="Verdana"/>
+          <w:sz w:val="32"/>
+          <w:szCs w:val="32"/>
+        </w:rPr>
+        <w:t>.</w:t>
       </w:r>
     </w:p>
     <w:p>
@@ -537,7 +602,6 @@
     <w:p>
       <w:pPr>
         <w:pStyle w:val="NoSpacing"/>
-        <w:ind w:left="360"/>
         <w:rPr>
           <w:rFonts w:ascii="Verdana" w:hAnsi="Verdana"/>
           <w:color w:val="00B050"/>
@@ -549,42 +613,22 @@
     <w:p>
       <w:pPr>
         <w:pStyle w:val="NoSpacing"/>
-        <w:ind w:left="360"/>
-        <w:rPr>
-          <w:rFonts w:ascii="Verdana" w:hAnsi="Verdana"/>
-          <w:color w:val="00B050"/>
-          <w:sz w:val="32"/>
-          <w:szCs w:val="32"/>
-        </w:rPr>
-      </w:pPr>
+        <w:rPr>
+          <w:rFonts w:ascii="Verdana" w:hAnsi="Verdana"/>
+        </w:rPr>
+      </w:pPr>
+      <w:bookmarkStart w:id="0" w:name="_GoBack"/>
+      <w:bookmarkEnd w:id="0"/>
     </w:p>
     <w:p>
       <w:pPr>
         <w:pStyle w:val="NoSpacing"/>
         <w:rPr>
           <w:rFonts w:ascii="Verdana" w:hAnsi="Verdana"/>
-        </w:rPr>
-      </w:pPr>
-    </w:p>
-    <w:p>
-      <w:pPr>
-        <w:pStyle w:val="NoSpacing"/>
-        <w:rPr>
-          <w:rFonts w:ascii="Verdana" w:hAnsi="Verdana"/>
-        </w:rPr>
-      </w:pPr>
-    </w:p>
-    <w:p>
-      <w:pPr>
-        <w:pStyle w:val="NoSpacing"/>
-        <w:rPr>
-          <w:rFonts w:ascii="Verdana" w:hAnsi="Verdana"/>
           <w:b/>
           <w:sz w:val="48"/>
         </w:rPr>
       </w:pPr>
-      <w:bookmarkStart w:id="0" w:name="_GoBack"/>
-      <w:bookmarkEnd w:id="0"/>
       <w:r>
         <w:rPr>
           <w:rFonts w:ascii="Verdana" w:hAnsi="Verdana"/>
@@ -4384,7 +4428,7 @@
 </file>
 
 <file path=customXml/itemProps1.xml><?xml version="1.0" encoding="utf-8"?>
-<ds:datastoreItem xmlns:ds="http://schemas.openxmlformats.org/officeDocument/2006/customXml" ds:itemID="{AF8E00BA-9382-49BB-9CD0-D5018ECA2A01}">
+<ds:datastoreItem xmlns:ds="http://schemas.openxmlformats.org/officeDocument/2006/customXml" ds:itemID="{516CA0EE-F8CE-4A7D-915D-246B7587D964}">
   <ds:schemaRefs>
     <ds:schemaRef ds:uri="http://schemas.openxmlformats.org/officeDocument/2006/bibliography"/>
   </ds:schemaRefs>

</xml_diff>

<commit_message>
Progress bar in loading level more precise. For Version 12 LATVIA U05!
</commit_message>
<xml_diff>
--- a/changelog.docx
+++ b/changelog.docx
@@ -373,7 +373,10 @@
     <w:p>
       <w:pPr>
         <w:pStyle w:val="NoSpacing"/>
-        <w:ind w:left="360"/>
+        <w:numPr>
+          <w:ilvl w:val="0"/>
+          <w:numId w:val="19"/>
+        </w:numPr>
         <w:rPr>
           <w:rFonts w:ascii="Verdana" w:hAnsi="Verdana"/>
           <w:color w:val="00B050"/>
@@ -381,43 +384,21 @@
           <w:szCs w:val="32"/>
         </w:rPr>
       </w:pPr>
-    </w:p>
-    <w:p>
-      <w:pPr>
-        <w:pStyle w:val="NoSpacing"/>
-        <w:rPr>
-          <w:rFonts w:ascii="Verdana" w:hAnsi="Verdana"/>
-          <w:b/>
-          <w:color w:val="FF0000"/>
-          <w:sz w:val="48"/>
-        </w:rPr>
-      </w:pPr>
-      <w:r>
-        <w:rPr>
-          <w:rFonts w:ascii="Verdana" w:hAnsi="Verdana"/>
-          <w:b/>
-          <w:color w:val="FF0000"/>
-          <w:sz w:val="48"/>
-        </w:rPr>
-        <w:t>F</w:t>
-      </w:r>
-      <w:r>
-        <w:rPr>
-          <w:rFonts w:ascii="Verdana" w:hAnsi="Verdana"/>
-          <w:b/>
-          <w:color w:val="FF0000"/>
-          <w:sz w:val="48"/>
-        </w:rPr>
-        <w:t>IXE</w:t>
-      </w:r>
-      <w:r>
-        <w:rPr>
-          <w:rFonts w:ascii="Verdana" w:hAnsi="Verdana"/>
-          <w:b/>
-          <w:color w:val="FF0000"/>
-          <w:sz w:val="48"/>
-        </w:rPr>
-        <w:t>S:</w:t>
+      <w:r>
+        <w:rPr>
+          <w:rFonts w:ascii="Verdana" w:hAnsi="Verdana"/>
+          <w:sz w:val="32"/>
+          <w:szCs w:val="32"/>
+        </w:rPr>
+        <w:t>Progr</w:t>
+      </w:r>
+      <w:r>
+        <w:rPr>
+          <w:rFonts w:ascii="Verdana" w:hAnsi="Verdana"/>
+          <w:sz w:val="32"/>
+          <w:szCs w:val="32"/>
+        </w:rPr>
+        <w:t>ess when loading bar is more precise.</w:t>
       </w:r>
     </w:p>
     <w:p>
@@ -440,192 +421,16 @@
           <w:sz w:val="32"/>
           <w:szCs w:val="32"/>
         </w:rPr>
-        <w:t>Level renderer does not animate</w:t>
-      </w:r>
-      <w:r>
-        <w:rPr>
-          <w:rFonts w:ascii="Verdana" w:hAnsi="Verdana"/>
-          <w:sz w:val="32"/>
-          <w:szCs w:val="32"/>
-        </w:rPr>
-        <w:t xml:space="preserve"> (fix)</w:t>
-      </w:r>
-      <w:r>
-        <w:rPr>
-          <w:rFonts w:ascii="Verdana" w:hAnsi="Verdana"/>
-          <w:sz w:val="32"/>
-          <w:szCs w:val="32"/>
-        </w:rPr>
-        <w:t xml:space="preserve"> when level is loading</w:t>
-      </w:r>
-      <w:r>
-        <w:rPr>
-          <w:rFonts w:ascii="Verdana" w:hAnsi="Verdana"/>
-          <w:sz w:val="32"/>
-          <w:szCs w:val="32"/>
-        </w:rPr>
-        <w:t>.</w:t>
+        <w:t>Saving level and loading level can be more easily terminated when exiting application.</w:t>
       </w:r>
     </w:p>
     <w:p>
       <w:pPr>
         <w:pStyle w:val="NoSpacing"/>
-        <w:ind w:left="360"/>
-        <w:rPr>
-          <w:rFonts w:ascii="Verdana" w:hAnsi="Verdana"/>
-          <w:color w:val="00B050"/>
-          <w:sz w:val="32"/>
-          <w:szCs w:val="32"/>
-        </w:rPr>
-      </w:pPr>
-    </w:p>
-    <w:p>
-      <w:pPr>
-        <w:pStyle w:val="NoSpacing"/>
-        <w:ind w:left="360"/>
-        <w:rPr>
-          <w:rFonts w:ascii="Verdana" w:hAnsi="Verdana"/>
-          <w:color w:val="00B050"/>
-          <w:sz w:val="32"/>
-          <w:szCs w:val="32"/>
-        </w:rPr>
-      </w:pPr>
-    </w:p>
-    <w:p>
-      <w:pPr>
-        <w:pStyle w:val="NoSpacing"/>
-        <w:ind w:left="360"/>
-        <w:rPr>
-          <w:rFonts w:ascii="Verdana" w:hAnsi="Verdana"/>
-          <w:color w:val="00B050"/>
-          <w:sz w:val="32"/>
-          <w:szCs w:val="32"/>
-        </w:rPr>
-      </w:pPr>
-    </w:p>
-    <w:p>
-      <w:pPr>
-        <w:pStyle w:val="NoSpacing"/>
-        <w:ind w:left="360"/>
-        <w:rPr>
-          <w:rFonts w:ascii="Verdana" w:hAnsi="Verdana"/>
-          <w:color w:val="00B050"/>
-          <w:sz w:val="32"/>
-          <w:szCs w:val="32"/>
-        </w:rPr>
-      </w:pPr>
-    </w:p>
-    <w:p>
-      <w:pPr>
-        <w:pStyle w:val="NoSpacing"/>
-        <w:ind w:left="360"/>
-        <w:rPr>
-          <w:rFonts w:ascii="Verdana" w:hAnsi="Verdana"/>
-          <w:color w:val="00B050"/>
-          <w:sz w:val="32"/>
-          <w:szCs w:val="32"/>
-        </w:rPr>
-      </w:pPr>
-    </w:p>
-    <w:p>
-      <w:pPr>
-        <w:pStyle w:val="NoSpacing"/>
-        <w:ind w:left="360"/>
-        <w:rPr>
-          <w:rFonts w:ascii="Verdana" w:hAnsi="Verdana"/>
-          <w:color w:val="00B050"/>
-          <w:sz w:val="32"/>
-          <w:szCs w:val="32"/>
-        </w:rPr>
-      </w:pPr>
-    </w:p>
-    <w:p>
-      <w:pPr>
-        <w:pStyle w:val="NoSpacing"/>
-        <w:ind w:left="360"/>
-        <w:rPr>
-          <w:rFonts w:ascii="Verdana" w:hAnsi="Verdana"/>
-          <w:color w:val="00B050"/>
-          <w:sz w:val="32"/>
-          <w:szCs w:val="32"/>
-        </w:rPr>
-      </w:pPr>
-    </w:p>
-    <w:p>
-      <w:pPr>
-        <w:pStyle w:val="NoSpacing"/>
-        <w:ind w:left="360"/>
-        <w:rPr>
-          <w:rFonts w:ascii="Verdana" w:hAnsi="Verdana"/>
-          <w:color w:val="00B050"/>
-          <w:sz w:val="32"/>
-          <w:szCs w:val="32"/>
-        </w:rPr>
-      </w:pPr>
-    </w:p>
-    <w:p>
-      <w:pPr>
-        <w:pStyle w:val="NoSpacing"/>
-        <w:ind w:left="360"/>
-        <w:rPr>
-          <w:rFonts w:ascii="Verdana" w:hAnsi="Verdana"/>
-          <w:color w:val="00B050"/>
-          <w:sz w:val="32"/>
-          <w:szCs w:val="32"/>
-        </w:rPr>
-      </w:pPr>
-    </w:p>
-    <w:p>
-      <w:pPr>
-        <w:pStyle w:val="NoSpacing"/>
-        <w:ind w:left="360"/>
-        <w:rPr>
-          <w:rFonts w:ascii="Verdana" w:hAnsi="Verdana"/>
-          <w:color w:val="00B050"/>
-          <w:sz w:val="32"/>
-          <w:szCs w:val="32"/>
-        </w:rPr>
-      </w:pPr>
-    </w:p>
-    <w:p>
-      <w:pPr>
-        <w:pStyle w:val="NoSpacing"/>
-        <w:ind w:left="360"/>
-        <w:rPr>
-          <w:rFonts w:ascii="Verdana" w:hAnsi="Verdana"/>
-          <w:color w:val="00B050"/>
-          <w:sz w:val="32"/>
-          <w:szCs w:val="32"/>
-        </w:rPr>
-      </w:pPr>
-    </w:p>
-    <w:p>
-      <w:pPr>
-        <w:pStyle w:val="NoSpacing"/>
-        <w:rPr>
-          <w:rFonts w:ascii="Verdana" w:hAnsi="Verdana"/>
-          <w:color w:val="00B050"/>
-          <w:sz w:val="32"/>
-          <w:szCs w:val="32"/>
-        </w:rPr>
-      </w:pPr>
-    </w:p>
-    <w:p>
-      <w:pPr>
-        <w:pStyle w:val="NoSpacing"/>
-        <w:rPr>
-          <w:rFonts w:ascii="Verdana" w:hAnsi="Verdana"/>
-        </w:rPr>
-      </w:pPr>
-      <w:bookmarkStart w:id="0" w:name="_GoBack"/>
-      <w:bookmarkEnd w:id="0"/>
-    </w:p>
-    <w:p>
-      <w:pPr>
-        <w:pStyle w:val="NoSpacing"/>
         <w:rPr>
           <w:rFonts w:ascii="Verdana" w:hAnsi="Verdana"/>
           <w:b/>
+          <w:color w:val="FF0000"/>
           <w:sz w:val="48"/>
         </w:rPr>
       </w:pPr>
@@ -633,43 +438,11 @@
         <w:rPr>
           <w:rFonts w:ascii="Verdana" w:hAnsi="Verdana"/>
           <w:b/>
+          <w:color w:val="FF0000"/>
           <w:sz w:val="48"/>
         </w:rPr>
-        <w:lastRenderedPageBreak/>
-        <w:t>Available commands:</w:t>
-      </w:r>
-    </w:p>
-    <w:p>
-      <w:pPr>
-        <w:pStyle w:val="NoSpacing"/>
-        <w:rPr>
-          <w:rFonts w:ascii="Verdana" w:hAnsi="Verdana"/>
-          <w:sz w:val="40"/>
-        </w:rPr>
-      </w:pPr>
-      <w:r>
-        <w:rPr>
-          <w:rFonts w:ascii="Verdana" w:hAnsi="Verdana"/>
-          <w:sz w:val="40"/>
-        </w:rPr>
-        <w:t xml:space="preserve">In order to type command </w:t>
-      </w:r>
-      <w:proofErr w:type="gramStart"/>
-      <w:r>
-        <w:rPr>
-          <w:rFonts w:ascii="Verdana" w:hAnsi="Verdana"/>
-          <w:sz w:val="40"/>
-        </w:rPr>
-        <w:t>which is equivalent to options setup press key “~”</w:t>
-      </w:r>
-      <w:r>
-        <w:rPr>
-          <w:rFonts w:ascii="Verdana" w:hAnsi="Verdana"/>
-          <w:sz w:val="40"/>
-        </w:rPr>
-        <w:t>.</w:t>
-      </w:r>
-      <w:proofErr w:type="gramEnd"/>
+        <w:t>FIXES:</w:t>
+      </w:r>
     </w:p>
     <w:p>
       <w:pPr>
@@ -680,116 +453,222 @@
         </w:numPr>
         <w:rPr>
           <w:rFonts w:ascii="Verdana" w:hAnsi="Verdana"/>
-          <w:sz w:val="32"/>
-          <w:szCs w:val="32"/>
-        </w:rPr>
-      </w:pPr>
-      <w:proofErr w:type="spellStart"/>
-      <w:r>
-        <w:rPr>
-          <w:rFonts w:ascii="Verdana" w:hAnsi="Verdana"/>
-          <w:sz w:val="32"/>
-          <w:szCs w:val="32"/>
-        </w:rPr>
-        <w:t>fps_max</w:t>
-      </w:r>
-      <w:proofErr w:type="spellEnd"/>
-      <w:r>
-        <w:rPr>
-          <w:rFonts w:ascii="Verdana" w:hAnsi="Verdana"/>
-          <w:sz w:val="32"/>
-          <w:szCs w:val="32"/>
-        </w:rPr>
-        <w:t>&lt;</w:t>
-      </w:r>
-      <w:proofErr w:type="spellStart"/>
-      <w:r>
-        <w:rPr>
-          <w:rFonts w:ascii="Verdana" w:hAnsi="Verdana"/>
-          <w:sz w:val="32"/>
-          <w:szCs w:val="32"/>
-        </w:rPr>
-        <w:t>num</w:t>
-      </w:r>
-      <w:proofErr w:type="spellEnd"/>
-      <w:r>
-        <w:rPr>
-          <w:rFonts w:ascii="Verdana" w:hAnsi="Verdana"/>
-          <w:sz w:val="32"/>
-          <w:szCs w:val="32"/>
-        </w:rPr>
-        <w:t xml:space="preserve">&gt;, </w:t>
-      </w:r>
-      <w:proofErr w:type="spellStart"/>
-      <w:r>
-        <w:rPr>
-          <w:rFonts w:ascii="Verdana" w:hAnsi="Verdana"/>
-          <w:sz w:val="32"/>
-          <w:szCs w:val="32"/>
-        </w:rPr>
-        <w:t>fpsMax</w:t>
-      </w:r>
-      <w:proofErr w:type="spellEnd"/>
-      <w:r>
-        <w:rPr>
-          <w:rFonts w:ascii="Verdana" w:hAnsi="Verdana"/>
-          <w:sz w:val="32"/>
-          <w:szCs w:val="32"/>
-        </w:rPr>
-        <w:t>&lt;</w:t>
-      </w:r>
-      <w:proofErr w:type="spellStart"/>
-      <w:r>
-        <w:rPr>
-          <w:rFonts w:ascii="Verdana" w:hAnsi="Verdana"/>
-          <w:sz w:val="32"/>
-          <w:szCs w:val="32"/>
-        </w:rPr>
-        <w:t>num</w:t>
-      </w:r>
-      <w:proofErr w:type="spellEnd"/>
-      <w:r>
-        <w:rPr>
-          <w:rFonts w:ascii="Verdana" w:hAnsi="Verdana"/>
-          <w:sz w:val="32"/>
-          <w:szCs w:val="32"/>
-        </w:rPr>
-        <w:t xml:space="preserve">&gt;: allowing </w:t>
+          <w:color w:val="00B050"/>
+          <w:sz w:val="32"/>
+          <w:szCs w:val="32"/>
+        </w:rPr>
+      </w:pPr>
+      <w:r>
+        <w:rPr>
+          <w:rFonts w:ascii="Verdana" w:hAnsi="Verdana"/>
+          <w:sz w:val="32"/>
+          <w:szCs w:val="32"/>
+        </w:rPr>
+        <w:t>Level renderer does not animate</w:t>
+      </w:r>
+      <w:r>
+        <w:rPr>
+          <w:rFonts w:ascii="Verdana" w:hAnsi="Verdana"/>
+          <w:sz w:val="32"/>
+          <w:szCs w:val="32"/>
+        </w:rPr>
+        <w:t xml:space="preserve"> (fix)</w:t>
+      </w:r>
+      <w:r>
+        <w:rPr>
+          <w:rFonts w:ascii="Verdana" w:hAnsi="Verdana"/>
+          <w:sz w:val="32"/>
+          <w:szCs w:val="32"/>
+        </w:rPr>
+        <w:t xml:space="preserve"> when level is loading</w:t>
+      </w:r>
+      <w:r>
+        <w:rPr>
+          <w:rFonts w:ascii="Verdana" w:hAnsi="Verdana"/>
+          <w:sz w:val="32"/>
+          <w:szCs w:val="32"/>
+        </w:rPr>
+        <w:t>.</w:t>
+      </w:r>
+    </w:p>
+    <w:p>
+      <w:pPr>
+        <w:pStyle w:val="NoSpacing"/>
+        <w:ind w:left="360"/>
+        <w:rPr>
+          <w:rFonts w:ascii="Verdana" w:hAnsi="Verdana"/>
+          <w:color w:val="00B050"/>
+          <w:sz w:val="32"/>
+          <w:szCs w:val="32"/>
+        </w:rPr>
+      </w:pPr>
+    </w:p>
+    <w:p>
+      <w:pPr>
+        <w:pStyle w:val="NoSpacing"/>
+        <w:ind w:left="360"/>
+        <w:rPr>
+          <w:rFonts w:ascii="Verdana" w:hAnsi="Verdana"/>
+          <w:color w:val="00B050"/>
+          <w:sz w:val="32"/>
+          <w:szCs w:val="32"/>
+        </w:rPr>
+      </w:pPr>
+    </w:p>
+    <w:p>
+      <w:pPr>
+        <w:pStyle w:val="NoSpacing"/>
+        <w:ind w:left="360"/>
+        <w:rPr>
+          <w:rFonts w:ascii="Verdana" w:hAnsi="Verdana"/>
+          <w:color w:val="00B050"/>
+          <w:sz w:val="32"/>
+          <w:szCs w:val="32"/>
+        </w:rPr>
+      </w:pPr>
+    </w:p>
+    <w:p>
+      <w:pPr>
+        <w:pStyle w:val="NoSpacing"/>
+        <w:ind w:left="360"/>
+        <w:rPr>
+          <w:rFonts w:ascii="Verdana" w:hAnsi="Verdana"/>
+          <w:color w:val="00B050"/>
+          <w:sz w:val="32"/>
+          <w:szCs w:val="32"/>
+        </w:rPr>
+      </w:pPr>
+    </w:p>
+    <w:p>
+      <w:pPr>
+        <w:pStyle w:val="NoSpacing"/>
+        <w:ind w:left="360"/>
+        <w:rPr>
+          <w:rFonts w:ascii="Verdana" w:hAnsi="Verdana"/>
+          <w:color w:val="00B050"/>
+          <w:sz w:val="32"/>
+          <w:szCs w:val="32"/>
+        </w:rPr>
+      </w:pPr>
+    </w:p>
+    <w:p>
+      <w:pPr>
+        <w:pStyle w:val="NoSpacing"/>
+        <w:ind w:left="360"/>
+        <w:rPr>
+          <w:rFonts w:ascii="Verdana" w:hAnsi="Verdana"/>
+          <w:color w:val="00B050"/>
+          <w:sz w:val="32"/>
+          <w:szCs w:val="32"/>
+        </w:rPr>
+      </w:pPr>
+    </w:p>
+    <w:p>
+      <w:pPr>
+        <w:pStyle w:val="NoSpacing"/>
+        <w:ind w:left="360"/>
+        <w:rPr>
+          <w:rFonts w:ascii="Verdana" w:hAnsi="Verdana"/>
+          <w:color w:val="00B050"/>
+          <w:sz w:val="32"/>
+          <w:szCs w:val="32"/>
+        </w:rPr>
+      </w:pPr>
+    </w:p>
+    <w:p>
+      <w:pPr>
+        <w:pStyle w:val="NoSpacing"/>
+        <w:ind w:left="360"/>
+        <w:rPr>
+          <w:rFonts w:ascii="Verdana" w:hAnsi="Verdana"/>
+          <w:color w:val="00B050"/>
+          <w:sz w:val="32"/>
+          <w:szCs w:val="32"/>
+        </w:rPr>
+      </w:pPr>
+    </w:p>
+    <w:p>
+      <w:pPr>
+        <w:pStyle w:val="NoSpacing"/>
+        <w:ind w:left="360"/>
+        <w:rPr>
+          <w:rFonts w:ascii="Verdana" w:hAnsi="Verdana"/>
+          <w:color w:val="00B050"/>
+          <w:sz w:val="32"/>
+          <w:szCs w:val="32"/>
+        </w:rPr>
+      </w:pPr>
+    </w:p>
+    <w:p>
+      <w:pPr>
+        <w:pStyle w:val="NoSpacing"/>
+        <w:ind w:left="360"/>
+        <w:rPr>
+          <w:rFonts w:ascii="Verdana" w:hAnsi="Verdana"/>
+          <w:color w:val="00B050"/>
+          <w:sz w:val="32"/>
+          <w:szCs w:val="32"/>
+        </w:rPr>
+      </w:pPr>
+    </w:p>
+    <w:p>
+      <w:pPr>
+        <w:pStyle w:val="NoSpacing"/>
+        <w:rPr>
+          <w:rFonts w:ascii="Verdana" w:hAnsi="Verdana"/>
+        </w:rPr>
+      </w:pPr>
+    </w:p>
+    <w:p>
+      <w:pPr>
+        <w:pStyle w:val="NoSpacing"/>
+        <w:rPr>
+          <w:rFonts w:ascii="Verdana" w:hAnsi="Verdana"/>
+          <w:b/>
+          <w:sz w:val="48"/>
+        </w:rPr>
+      </w:pPr>
+      <w:r>
+        <w:rPr>
+          <w:rFonts w:ascii="Verdana" w:hAnsi="Verdana"/>
+          <w:b/>
+          <w:sz w:val="48"/>
+        </w:rPr>
+        <w:lastRenderedPageBreak/>
+        <w:t>Available commands:</w:t>
+      </w:r>
+    </w:p>
+    <w:p>
+      <w:pPr>
+        <w:pStyle w:val="NoSpacing"/>
+        <w:rPr>
+          <w:rFonts w:ascii="Verdana" w:hAnsi="Verdana"/>
+          <w:sz w:val="40"/>
+        </w:rPr>
+      </w:pPr>
+      <w:r>
+        <w:rPr>
+          <w:rFonts w:ascii="Verdana" w:hAnsi="Verdana"/>
+          <w:sz w:val="40"/>
+        </w:rPr>
+        <w:t xml:space="preserve">In order to type command </w:t>
       </w:r>
       <w:proofErr w:type="gramStart"/>
       <w:r>
         <w:rPr>
           <w:rFonts w:ascii="Verdana" w:hAnsi="Verdana"/>
-          <w:sz w:val="32"/>
-          <w:szCs w:val="32"/>
-        </w:rPr>
-        <w:t>to change</w:t>
+          <w:sz w:val="40"/>
+        </w:rPr>
+        <w:t>which is equivalent to options setup press key “~”</w:t>
+      </w:r>
+      <w:r>
+        <w:rPr>
+          <w:rFonts w:ascii="Verdana" w:hAnsi="Verdana"/>
+          <w:sz w:val="40"/>
+        </w:rPr>
+        <w:t>.</w:t>
       </w:r>
       <w:proofErr w:type="gramEnd"/>
-      <w:r>
-        <w:rPr>
-          <w:rFonts w:ascii="Verdana" w:hAnsi="Verdana"/>
-          <w:sz w:val="32"/>
-          <w:szCs w:val="32"/>
-        </w:rPr>
-        <w:t xml:space="preserve"> max fps</w:t>
-      </w:r>
-      <w:r>
-        <w:rPr>
-          <w:rFonts w:ascii="Verdana" w:hAnsi="Verdana"/>
-          <w:sz w:val="32"/>
-          <w:szCs w:val="32"/>
-        </w:rPr>
-        <w:t xml:space="preserve"> (it must be positive number)</w:t>
-      </w:r>
-      <w:r>
-        <w:rPr>
-          <w:rFonts w:ascii="Verdana" w:hAnsi="Verdana"/>
-          <w:sz w:val="32"/>
-          <w:szCs w:val="32"/>
-        </w:rPr>
-        <w:t>.</w:t>
-      </w:r>
     </w:p>
     <w:p>
       <w:pPr>
@@ -804,6 +683,78 @@
           <w:szCs w:val="32"/>
         </w:rPr>
       </w:pPr>
+      <w:proofErr w:type="spellStart"/>
+      <w:r>
+        <w:rPr>
+          <w:rFonts w:ascii="Verdana" w:hAnsi="Verdana"/>
+          <w:sz w:val="32"/>
+          <w:szCs w:val="32"/>
+        </w:rPr>
+        <w:t>fps_max</w:t>
+      </w:r>
+      <w:proofErr w:type="spellEnd"/>
+      <w:r>
+        <w:rPr>
+          <w:rFonts w:ascii="Verdana" w:hAnsi="Verdana"/>
+          <w:sz w:val="32"/>
+          <w:szCs w:val="32"/>
+        </w:rPr>
+        <w:t>&lt;</w:t>
+      </w:r>
+      <w:proofErr w:type="spellStart"/>
+      <w:r>
+        <w:rPr>
+          <w:rFonts w:ascii="Verdana" w:hAnsi="Verdana"/>
+          <w:sz w:val="32"/>
+          <w:szCs w:val="32"/>
+        </w:rPr>
+        <w:t>num</w:t>
+      </w:r>
+      <w:proofErr w:type="spellEnd"/>
+      <w:r>
+        <w:rPr>
+          <w:rFonts w:ascii="Verdana" w:hAnsi="Verdana"/>
+          <w:sz w:val="32"/>
+          <w:szCs w:val="32"/>
+        </w:rPr>
+        <w:t xml:space="preserve">&gt;, </w:t>
+      </w:r>
+      <w:proofErr w:type="spellStart"/>
+      <w:r>
+        <w:rPr>
+          <w:rFonts w:ascii="Verdana" w:hAnsi="Verdana"/>
+          <w:sz w:val="32"/>
+          <w:szCs w:val="32"/>
+        </w:rPr>
+        <w:t>fpsMax</w:t>
+      </w:r>
+      <w:proofErr w:type="spellEnd"/>
+      <w:r>
+        <w:rPr>
+          <w:rFonts w:ascii="Verdana" w:hAnsi="Verdana"/>
+          <w:sz w:val="32"/>
+          <w:szCs w:val="32"/>
+        </w:rPr>
+        <w:t>&lt;</w:t>
+      </w:r>
+      <w:proofErr w:type="spellStart"/>
+      <w:r>
+        <w:rPr>
+          <w:rFonts w:ascii="Verdana" w:hAnsi="Verdana"/>
+          <w:sz w:val="32"/>
+          <w:szCs w:val="32"/>
+        </w:rPr>
+        <w:t>num</w:t>
+      </w:r>
+      <w:proofErr w:type="spellEnd"/>
+      <w:r>
+        <w:rPr>
+          <w:rFonts w:ascii="Verdana" w:hAnsi="Verdana"/>
+          <w:sz w:val="32"/>
+          <w:szCs w:val="32"/>
+        </w:rPr>
+        <w:t xml:space="preserve">&gt;: allowing </w:t>
+      </w:r>
       <w:proofErr w:type="gramStart"/>
       <w:r>
         <w:rPr>
@@ -811,7 +762,7 @@
           <w:sz w:val="32"/>
           <w:szCs w:val="32"/>
         </w:rPr>
-        <w:t>resolution&lt;</w:t>
+        <w:t>to change</w:t>
       </w:r>
       <w:proofErr w:type="gramEnd"/>
       <w:r>
@@ -820,15 +771,23 @@
           <w:sz w:val="32"/>
           <w:szCs w:val="32"/>
         </w:rPr>
-        <w:t>width&gt;&lt;height&gt;, res&lt;width&gt;&lt;height&gt;: allowing to change resolution (min resolution is 640x480 whilst</w:t>
-      </w:r>
-      <w:r>
-        <w:rPr>
-          <w:rFonts w:ascii="Verdana" w:hAnsi="Verdana"/>
-          <w:sz w:val="32"/>
-          <w:szCs w:val="32"/>
-        </w:rPr>
-        <w:t xml:space="preserve"> max is your native resolution).</w:t>
+        <w:t xml:space="preserve"> max fps</w:t>
+      </w:r>
+      <w:r>
+        <w:rPr>
+          <w:rFonts w:ascii="Verdana" w:hAnsi="Verdana"/>
+          <w:sz w:val="32"/>
+          <w:szCs w:val="32"/>
+        </w:rPr>
+        <w:t xml:space="preserve"> (it must be positive number)</w:t>
+      </w:r>
+      <w:r>
+        <w:rPr>
+          <w:rFonts w:ascii="Verdana" w:hAnsi="Verdana"/>
+          <w:sz w:val="32"/>
+          <w:szCs w:val="32"/>
+        </w:rPr>
+        <w:t>.</w:t>
       </w:r>
     </w:p>
     <w:p>
@@ -844,7 +803,6 @@
           <w:szCs w:val="32"/>
         </w:rPr>
       </w:pPr>
-      <w:proofErr w:type="spellStart"/>
       <w:proofErr w:type="gramStart"/>
       <w:r>
         <w:rPr>
@@ -852,9 +810,8 @@
           <w:sz w:val="32"/>
           <w:szCs w:val="32"/>
         </w:rPr>
-        <w:t>fullscreen</w:t>
-      </w:r>
-      <w:proofErr w:type="spellEnd"/>
+        <w:t>resolution&lt;</w:t>
+      </w:r>
       <w:proofErr w:type="gramEnd"/>
       <w:r>
         <w:rPr>
@@ -862,33 +819,15 @@
           <w:sz w:val="32"/>
           <w:szCs w:val="32"/>
         </w:rPr>
-        <w:t>:</w:t>
-      </w:r>
-      <w:r>
-        <w:rPr>
-          <w:rFonts w:ascii="Verdana" w:hAnsi="Verdana"/>
-          <w:sz w:val="32"/>
-          <w:szCs w:val="32"/>
-        </w:rPr>
-        <w:t xml:space="preserve"> makes your game run </w:t>
-      </w:r>
-      <w:proofErr w:type="spellStart"/>
-      <w:r>
-        <w:rPr>
-          <w:rFonts w:ascii="Verdana" w:hAnsi="Verdana"/>
-          <w:sz w:val="32"/>
-          <w:szCs w:val="32"/>
-        </w:rPr>
-        <w:t>fullscreen</w:t>
-      </w:r>
-      <w:proofErr w:type="spellEnd"/>
-      <w:r>
-        <w:rPr>
-          <w:rFonts w:ascii="Verdana" w:hAnsi="Verdana"/>
-          <w:sz w:val="32"/>
-          <w:szCs w:val="32"/>
-        </w:rPr>
-        <w:t>.</w:t>
+        <w:t>width&gt;&lt;height&gt;, res&lt;width&gt;&lt;height&gt;: allowing to change resolution (min resolution is 640x480 whilst</w:t>
+      </w:r>
+      <w:r>
+        <w:rPr>
+          <w:rFonts w:ascii="Verdana" w:hAnsi="Verdana"/>
+          <w:sz w:val="32"/>
+          <w:szCs w:val="32"/>
+        </w:rPr>
+        <w:t xml:space="preserve"> max is your native resolution).</w:t>
       </w:r>
     </w:p>
     <w:p>
@@ -904,6 +843,7 @@
           <w:szCs w:val="32"/>
         </w:rPr>
       </w:pPr>
+      <w:proofErr w:type="spellStart"/>
       <w:proofErr w:type="gramStart"/>
       <w:r>
         <w:rPr>
@@ -911,8 +851,9 @@
           <w:sz w:val="32"/>
           <w:szCs w:val="32"/>
         </w:rPr>
-        <w:t>windowed</w:t>
-      </w:r>
+        <w:t>fullscreen</w:t>
+      </w:r>
+      <w:proofErr w:type="spellEnd"/>
       <w:proofErr w:type="gramEnd"/>
       <w:r>
         <w:rPr>
@@ -920,15 +861,33 @@
           <w:sz w:val="32"/>
           <w:szCs w:val="32"/>
         </w:rPr>
-        <w:t xml:space="preserve">: makes your game run </w:t>
-      </w:r>
-      <w:r>
-        <w:rPr>
-          <w:rFonts w:ascii="Verdana" w:hAnsi="Verdana"/>
-          <w:sz w:val="32"/>
-          <w:szCs w:val="32"/>
-        </w:rPr>
-        <w:t>windowed mode.</w:t>
+        <w:t>:</w:t>
+      </w:r>
+      <w:r>
+        <w:rPr>
+          <w:rFonts w:ascii="Verdana" w:hAnsi="Verdana"/>
+          <w:sz w:val="32"/>
+          <w:szCs w:val="32"/>
+        </w:rPr>
+        <w:t xml:space="preserve"> makes your game run </w:t>
+      </w:r>
+      <w:proofErr w:type="spellStart"/>
+      <w:r>
+        <w:rPr>
+          <w:rFonts w:ascii="Verdana" w:hAnsi="Verdana"/>
+          <w:sz w:val="32"/>
+          <w:szCs w:val="32"/>
+        </w:rPr>
+        <w:t>fullscreen</w:t>
+      </w:r>
+      <w:proofErr w:type="spellEnd"/>
+      <w:r>
+        <w:rPr>
+          <w:rFonts w:ascii="Verdana" w:hAnsi="Verdana"/>
+          <w:sz w:val="32"/>
+          <w:szCs w:val="32"/>
+        </w:rPr>
+        <w:t>.</w:t>
       </w:r>
     </w:p>
     <w:p>
@@ -944,125 +903,31 @@
           <w:szCs w:val="32"/>
         </w:rPr>
       </w:pPr>
-      <w:proofErr w:type="spellStart"/>
-      <w:r>
-        <w:rPr>
-          <w:rFonts w:ascii="Verdana" w:hAnsi="Verdana"/>
-          <w:sz w:val="32"/>
-          <w:szCs w:val="32"/>
-        </w:rPr>
-        <w:t>v_sync</w:t>
-      </w:r>
-      <w:proofErr w:type="spellEnd"/>
-      <w:r>
-        <w:rPr>
-          <w:rFonts w:ascii="Verdana" w:hAnsi="Verdana"/>
-          <w:sz w:val="32"/>
-          <w:szCs w:val="32"/>
-        </w:rPr>
-        <w:t xml:space="preserve"> &lt;bool&gt;</w:t>
-      </w:r>
-      <w:r>
-        <w:rPr>
-          <w:rFonts w:ascii="Verdana" w:hAnsi="Verdana"/>
-          <w:sz w:val="32"/>
-          <w:szCs w:val="32"/>
-        </w:rPr>
-        <w:t xml:space="preserve">, </w:t>
-      </w:r>
-      <w:proofErr w:type="spellStart"/>
-      <w:r>
-        <w:rPr>
-          <w:rFonts w:ascii="Verdana" w:hAnsi="Verdana"/>
-          <w:sz w:val="32"/>
-          <w:szCs w:val="32"/>
-        </w:rPr>
-        <w:t>vsync</w:t>
-      </w:r>
-      <w:proofErr w:type="spellEnd"/>
-      <w:r>
-        <w:rPr>
-          <w:rFonts w:ascii="Verdana" w:hAnsi="Verdana"/>
-          <w:sz w:val="32"/>
-          <w:szCs w:val="32"/>
-        </w:rPr>
-        <w:t>&lt;bool&gt;</w:t>
-      </w:r>
-      <w:r>
-        <w:rPr>
-          <w:rFonts w:ascii="Verdana" w:hAnsi="Verdana"/>
-          <w:sz w:val="32"/>
-          <w:szCs w:val="32"/>
-        </w:rPr>
-        <w:t>: whether</w:t>
-      </w:r>
-      <w:r>
-        <w:rPr>
-          <w:rFonts w:ascii="Verdana" w:hAnsi="Verdana"/>
-          <w:sz w:val="32"/>
-          <w:szCs w:val="32"/>
-        </w:rPr>
-        <w:t xml:space="preserve"> or not you</w:t>
-      </w:r>
-      <w:r>
-        <w:rPr>
-          <w:rFonts w:ascii="Verdana" w:hAnsi="Verdana"/>
-          <w:sz w:val="32"/>
-          <w:szCs w:val="32"/>
-        </w:rPr>
-        <w:t xml:space="preserve"> </w:t>
-      </w:r>
-      <w:proofErr w:type="spellStart"/>
-      <w:r>
-        <w:rPr>
-          <w:rFonts w:ascii="Verdana" w:hAnsi="Verdana"/>
-          <w:sz w:val="32"/>
-          <w:szCs w:val="32"/>
-        </w:rPr>
-        <w:t>wanna</w:t>
-      </w:r>
-      <w:proofErr w:type="spellEnd"/>
-      <w:r>
-        <w:rPr>
-          <w:rFonts w:ascii="Verdana" w:hAnsi="Verdana"/>
-          <w:sz w:val="32"/>
-          <w:szCs w:val="32"/>
-        </w:rPr>
-        <w:t xml:space="preserve"> </w:t>
-      </w:r>
-      <w:proofErr w:type="spellStart"/>
-      <w:r>
-        <w:rPr>
-          <w:rFonts w:ascii="Verdana" w:hAnsi="Verdana"/>
-          <w:sz w:val="32"/>
-          <w:szCs w:val="32"/>
-        </w:rPr>
-        <w:t>vsync</w:t>
-      </w:r>
-      <w:proofErr w:type="spellEnd"/>
-      <w:r>
-        <w:rPr>
-          <w:rFonts w:ascii="Verdana" w:hAnsi="Verdana"/>
-          <w:sz w:val="32"/>
-          <w:szCs w:val="32"/>
-        </w:rPr>
-        <w:t xml:space="preserve"> on or off</w:t>
-      </w:r>
-      <w:r>
-        <w:rPr>
-          <w:rFonts w:ascii="Verdana" w:hAnsi="Verdana"/>
-          <w:sz w:val="32"/>
-          <w:szCs w:val="32"/>
-        </w:rPr>
-        <w:t>.</w:t>
-      </w:r>
-      <w:r>
-        <w:rPr>
-          <w:rFonts w:ascii="Verdana" w:hAnsi="Verdana"/>
-          <w:sz w:val="32"/>
-          <w:szCs w:val="32"/>
-        </w:rPr>
-        <w:t xml:space="preserve"> If it’s on (you’ve set it to true) your fps is capped to your monitor refresh rate.</w:t>
+      <w:proofErr w:type="gramStart"/>
+      <w:r>
+        <w:rPr>
+          <w:rFonts w:ascii="Verdana" w:hAnsi="Verdana"/>
+          <w:sz w:val="32"/>
+          <w:szCs w:val="32"/>
+        </w:rPr>
+        <w:t>windowed</w:t>
+      </w:r>
+      <w:proofErr w:type="gramEnd"/>
+      <w:r>
+        <w:rPr>
+          <w:rFonts w:ascii="Verdana" w:hAnsi="Verdana"/>
+          <w:sz w:val="32"/>
+          <w:szCs w:val="32"/>
+        </w:rPr>
+        <w:t xml:space="preserve">: makes your game run </w:t>
+      </w:r>
+      <w:r>
+        <w:rPr>
+          <w:rFonts w:ascii="Verdana" w:hAnsi="Verdana"/>
+          <w:sz w:val="32"/>
+          <w:szCs w:val="32"/>
+        </w:rPr>
+        <w:t>windowed mode.</w:t>
       </w:r>
     </w:p>
     <w:p>
@@ -1085,7 +950,7 @@
           <w:sz w:val="32"/>
           <w:szCs w:val="32"/>
         </w:rPr>
-        <w:t>water_efects</w:t>
+        <w:t>v_sync</w:t>
       </w:r>
       <w:proofErr w:type="spellEnd"/>
       <w:r>
@@ -1094,7 +959,109 @@
           <w:sz w:val="32"/>
           <w:szCs w:val="32"/>
         </w:rPr>
-        <w:t xml:space="preserve"> &lt;bool&gt;: enables (true) or disables (false) water effects (such as reflection).</w:t>
+        <w:t xml:space="preserve"> &lt;bool&gt;</w:t>
+      </w:r>
+      <w:r>
+        <w:rPr>
+          <w:rFonts w:ascii="Verdana" w:hAnsi="Verdana"/>
+          <w:sz w:val="32"/>
+          <w:szCs w:val="32"/>
+        </w:rPr>
+        <w:t xml:space="preserve">, </w:t>
+      </w:r>
+      <w:proofErr w:type="spellStart"/>
+      <w:r>
+        <w:rPr>
+          <w:rFonts w:ascii="Verdana" w:hAnsi="Verdana"/>
+          <w:sz w:val="32"/>
+          <w:szCs w:val="32"/>
+        </w:rPr>
+        <w:t>vsync</w:t>
+      </w:r>
+      <w:proofErr w:type="spellEnd"/>
+      <w:r>
+        <w:rPr>
+          <w:rFonts w:ascii="Verdana" w:hAnsi="Verdana"/>
+          <w:sz w:val="32"/>
+          <w:szCs w:val="32"/>
+        </w:rPr>
+        <w:t>&lt;bool&gt;</w:t>
+      </w:r>
+      <w:r>
+        <w:rPr>
+          <w:rFonts w:ascii="Verdana" w:hAnsi="Verdana"/>
+          <w:sz w:val="32"/>
+          <w:szCs w:val="32"/>
+        </w:rPr>
+        <w:t>: whether</w:t>
+      </w:r>
+      <w:r>
+        <w:rPr>
+          <w:rFonts w:ascii="Verdana" w:hAnsi="Verdana"/>
+          <w:sz w:val="32"/>
+          <w:szCs w:val="32"/>
+        </w:rPr>
+        <w:t xml:space="preserve"> or not you</w:t>
+      </w:r>
+      <w:r>
+        <w:rPr>
+          <w:rFonts w:ascii="Verdana" w:hAnsi="Verdana"/>
+          <w:sz w:val="32"/>
+          <w:szCs w:val="32"/>
+        </w:rPr>
+        <w:t xml:space="preserve"> </w:t>
+      </w:r>
+      <w:proofErr w:type="spellStart"/>
+      <w:r>
+        <w:rPr>
+          <w:rFonts w:ascii="Verdana" w:hAnsi="Verdana"/>
+          <w:sz w:val="32"/>
+          <w:szCs w:val="32"/>
+        </w:rPr>
+        <w:t>wanna</w:t>
+      </w:r>
+      <w:proofErr w:type="spellEnd"/>
+      <w:r>
+        <w:rPr>
+          <w:rFonts w:ascii="Verdana" w:hAnsi="Verdana"/>
+          <w:sz w:val="32"/>
+          <w:szCs w:val="32"/>
+        </w:rPr>
+        <w:t xml:space="preserve"> </w:t>
+      </w:r>
+      <w:proofErr w:type="spellStart"/>
+      <w:r>
+        <w:rPr>
+          <w:rFonts w:ascii="Verdana" w:hAnsi="Verdana"/>
+          <w:sz w:val="32"/>
+          <w:szCs w:val="32"/>
+        </w:rPr>
+        <w:t>vsync</w:t>
+      </w:r>
+      <w:proofErr w:type="spellEnd"/>
+      <w:r>
+        <w:rPr>
+          <w:rFonts w:ascii="Verdana" w:hAnsi="Verdana"/>
+          <w:sz w:val="32"/>
+          <w:szCs w:val="32"/>
+        </w:rPr>
+        <w:t xml:space="preserve"> on or off</w:t>
+      </w:r>
+      <w:r>
+        <w:rPr>
+          <w:rFonts w:ascii="Verdana" w:hAnsi="Verdana"/>
+          <w:sz w:val="32"/>
+          <w:szCs w:val="32"/>
+        </w:rPr>
+        <w:t>.</w:t>
+      </w:r>
+      <w:r>
+        <w:rPr>
+          <w:rFonts w:ascii="Verdana" w:hAnsi="Verdana"/>
+          <w:sz w:val="32"/>
+          <w:szCs w:val="32"/>
+        </w:rPr>
+        <w:t xml:space="preserve"> If it’s on (you’ve set it to true) your fps is capped to your monitor refresh rate.</w:t>
       </w:r>
     </w:p>
     <w:p>
@@ -1117,7 +1084,7 @@
           <w:sz w:val="32"/>
           <w:szCs w:val="32"/>
         </w:rPr>
-        <w:t>mouse_sensitivity</w:t>
+        <w:t>water_efects</w:t>
       </w:r>
       <w:proofErr w:type="spellEnd"/>
       <w:r>
@@ -1126,92 +1093,7 @@
           <w:sz w:val="32"/>
           <w:szCs w:val="32"/>
         </w:rPr>
-        <w:t>&lt;</w:t>
-      </w:r>
-      <w:proofErr w:type="spellStart"/>
-      <w:r>
-        <w:rPr>
-          <w:rFonts w:ascii="Verdana" w:hAnsi="Verdana"/>
-          <w:sz w:val="32"/>
-          <w:szCs w:val="32"/>
-        </w:rPr>
-        <w:t>num</w:t>
-      </w:r>
-      <w:proofErr w:type="spellEnd"/>
-      <w:r>
-        <w:rPr>
-          <w:rFonts w:ascii="Verdana" w:hAnsi="Verdana"/>
-          <w:sz w:val="32"/>
-          <w:szCs w:val="32"/>
-        </w:rPr>
-        <w:t xml:space="preserve">&gt;, </w:t>
-      </w:r>
-      <w:proofErr w:type="spellStart"/>
-      <w:r>
-        <w:rPr>
-          <w:rFonts w:ascii="Verdana" w:hAnsi="Verdana"/>
-          <w:sz w:val="32"/>
-          <w:szCs w:val="32"/>
-        </w:rPr>
-        <w:t>msens</w:t>
-      </w:r>
-      <w:proofErr w:type="spellEnd"/>
-      <w:r>
-        <w:rPr>
-          <w:rFonts w:ascii="Verdana" w:hAnsi="Verdana"/>
-          <w:sz w:val="32"/>
-          <w:szCs w:val="32"/>
-        </w:rPr>
-        <w:t xml:space="preserve"> &lt;</w:t>
-      </w:r>
-      <w:proofErr w:type="spellStart"/>
-      <w:r>
-        <w:rPr>
-          <w:rFonts w:ascii="Verdana" w:hAnsi="Verdana"/>
-          <w:sz w:val="32"/>
-          <w:szCs w:val="32"/>
-        </w:rPr>
-        <w:t>num</w:t>
-      </w:r>
-      <w:proofErr w:type="spellEnd"/>
-      <w:r>
-        <w:rPr>
-          <w:rFonts w:ascii="Verdana" w:hAnsi="Verdana"/>
-          <w:sz w:val="32"/>
-          <w:szCs w:val="32"/>
-        </w:rPr>
-        <w:t>&gt;: sets mouse sensitivity to this value.</w:t>
-      </w:r>
-    </w:p>
-    <w:p>
-      <w:pPr>
-        <w:pStyle w:val="NoSpacing"/>
-        <w:ind w:left="360"/>
-        <w:rPr>
-          <w:rFonts w:ascii="Verdana" w:hAnsi="Verdana"/>
-          <w:sz w:val="32"/>
-          <w:szCs w:val="32"/>
-        </w:rPr>
-      </w:pPr>
-    </w:p>
-    <w:p>
-      <w:pPr>
-        <w:pStyle w:val="NoSpacing"/>
-        <w:rPr>
-          <w:rFonts w:ascii="Verdana" w:hAnsi="Verdana"/>
-          <w:b/>
-          <w:sz w:val="48"/>
-          <w:szCs w:val="32"/>
-        </w:rPr>
-      </w:pPr>
-      <w:r>
-        <w:rPr>
-          <w:rFonts w:ascii="Verdana" w:hAnsi="Verdana"/>
-          <w:b/>
-          <w:sz w:val="48"/>
-          <w:szCs w:val="32"/>
-        </w:rPr>
-        <w:t>Notes:</w:t>
+        <w:t xml:space="preserve"> &lt;bool&gt;: enables (true) or disables (false) water effects (such as reflection).</w:t>
       </w:r>
     </w:p>
     <w:p>
@@ -1227,13 +1109,108 @@
           <w:szCs w:val="32"/>
         </w:rPr>
       </w:pPr>
-      <w:r>
-        <w:rPr>
-          <w:rFonts w:ascii="Verdana" w:hAnsi="Verdana"/>
-          <w:sz w:val="32"/>
-          <w:szCs w:val="32"/>
-        </w:rPr>
-        <w:t>Game uses LWJGL 3.2.3 since v 02 (BELARUS).</w:t>
+      <w:proofErr w:type="spellStart"/>
+      <w:r>
+        <w:rPr>
+          <w:rFonts w:ascii="Verdana" w:hAnsi="Verdana"/>
+          <w:sz w:val="32"/>
+          <w:szCs w:val="32"/>
+        </w:rPr>
+        <w:t>mouse_sensitivity</w:t>
+      </w:r>
+      <w:proofErr w:type="spellEnd"/>
+      <w:r>
+        <w:rPr>
+          <w:rFonts w:ascii="Verdana" w:hAnsi="Verdana"/>
+          <w:sz w:val="32"/>
+          <w:szCs w:val="32"/>
+        </w:rPr>
+        <w:t>&lt;</w:t>
+      </w:r>
+      <w:proofErr w:type="spellStart"/>
+      <w:r>
+        <w:rPr>
+          <w:rFonts w:ascii="Verdana" w:hAnsi="Verdana"/>
+          <w:sz w:val="32"/>
+          <w:szCs w:val="32"/>
+        </w:rPr>
+        <w:t>num</w:t>
+      </w:r>
+      <w:proofErr w:type="spellEnd"/>
+      <w:r>
+        <w:rPr>
+          <w:rFonts w:ascii="Verdana" w:hAnsi="Verdana"/>
+          <w:sz w:val="32"/>
+          <w:szCs w:val="32"/>
+        </w:rPr>
+        <w:t xml:space="preserve">&gt;, </w:t>
+      </w:r>
+      <w:proofErr w:type="spellStart"/>
+      <w:r>
+        <w:rPr>
+          <w:rFonts w:ascii="Verdana" w:hAnsi="Verdana"/>
+          <w:sz w:val="32"/>
+          <w:szCs w:val="32"/>
+        </w:rPr>
+        <w:t>msens</w:t>
+      </w:r>
+      <w:proofErr w:type="spellEnd"/>
+      <w:r>
+        <w:rPr>
+          <w:rFonts w:ascii="Verdana" w:hAnsi="Verdana"/>
+          <w:sz w:val="32"/>
+          <w:szCs w:val="32"/>
+        </w:rPr>
+        <w:t xml:space="preserve"> &lt;</w:t>
+      </w:r>
+      <w:proofErr w:type="spellStart"/>
+      <w:r>
+        <w:rPr>
+          <w:rFonts w:ascii="Verdana" w:hAnsi="Verdana"/>
+          <w:sz w:val="32"/>
+          <w:szCs w:val="32"/>
+        </w:rPr>
+        <w:t>num</w:t>
+      </w:r>
+      <w:proofErr w:type="spellEnd"/>
+      <w:r>
+        <w:rPr>
+          <w:rFonts w:ascii="Verdana" w:hAnsi="Verdana"/>
+          <w:sz w:val="32"/>
+          <w:szCs w:val="32"/>
+        </w:rPr>
+        <w:t>&gt;: sets mouse sensitivity to this value.</w:t>
+      </w:r>
+    </w:p>
+    <w:p>
+      <w:pPr>
+        <w:pStyle w:val="NoSpacing"/>
+        <w:ind w:left="360"/>
+        <w:rPr>
+          <w:rFonts w:ascii="Verdana" w:hAnsi="Verdana"/>
+          <w:sz w:val="32"/>
+          <w:szCs w:val="32"/>
+        </w:rPr>
+      </w:pPr>
+    </w:p>
+    <w:p>
+      <w:pPr>
+        <w:pStyle w:val="NoSpacing"/>
+        <w:rPr>
+          <w:rFonts w:ascii="Verdana" w:hAnsi="Verdana"/>
+          <w:b/>
+          <w:sz w:val="48"/>
+          <w:szCs w:val="32"/>
+        </w:rPr>
+      </w:pPr>
+      <w:r>
+        <w:rPr>
+          <w:rFonts w:ascii="Verdana" w:hAnsi="Verdana"/>
+          <w:b/>
+          <w:sz w:val="48"/>
+          <w:szCs w:val="32"/>
+        </w:rPr>
+        <w:t>Notes:</w:t>
       </w:r>
     </w:p>
     <w:p>
@@ -1255,6 +1232,28 @@
           <w:sz w:val="32"/>
           <w:szCs w:val="32"/>
         </w:rPr>
+        <w:t>Game uses LWJGL 3.2.3 since v 02 (BELARUS).</w:t>
+      </w:r>
+    </w:p>
+    <w:p>
+      <w:pPr>
+        <w:pStyle w:val="NoSpacing"/>
+        <w:numPr>
+          <w:ilvl w:val="0"/>
+          <w:numId w:val="19"/>
+        </w:numPr>
+        <w:rPr>
+          <w:rFonts w:ascii="Verdana" w:hAnsi="Verdana"/>
+          <w:sz w:val="32"/>
+          <w:szCs w:val="32"/>
+        </w:rPr>
+      </w:pPr>
+      <w:r>
+        <w:rPr>
+          <w:rFonts w:ascii="Verdana" w:hAnsi="Verdana"/>
+          <w:sz w:val="32"/>
+          <w:szCs w:val="32"/>
+        </w:rPr>
         <w:t>Game implementation is multithread</w:t>
       </w:r>
       <w:r>
@@ -1321,6 +1320,16 @@
         </w:rPr>
         <w:t xml:space="preserve"> + 1 additional thread if random level generator is being used</w:t>
       </w:r>
+      <w:r>
+        <w:rPr>
+          <w:rFonts w:ascii="Verdana" w:hAnsi="Verdana"/>
+          <w:sz w:val="32"/>
+          <w:szCs w:val="32"/>
+        </w:rPr>
+        <w:t xml:space="preserve"> or when loading or saving level is in progress</w:t>
+      </w:r>
+      <w:bookmarkStart w:id="0" w:name="_GoBack"/>
+      <w:bookmarkEnd w:id="0"/>
       <w:r>
         <w:rPr>
           <w:rFonts w:ascii="Verdana" w:hAnsi="Verdana"/>
@@ -4428,7 +4437,7 @@
 </file>
 
 <file path=customXml/itemProps1.xml><?xml version="1.0" encoding="utf-8"?>
-<ds:datastoreItem xmlns:ds="http://schemas.openxmlformats.org/officeDocument/2006/customXml" ds:itemID="{516CA0EE-F8CE-4A7D-915D-246B7587D964}">
+<ds:datastoreItem xmlns:ds="http://schemas.openxmlformats.org/officeDocument/2006/customXml" ds:itemID="{4CC6368D-BA2F-4FD9-9AC3-ECF898C3A11D}">
   <ds:schemaRefs>
     <ds:schemaRef ds:uri="http://schemas.openxmlformats.org/officeDocument/2006/bibliography"/>
   </ds:schemaRefs>

</xml_diff>

<commit_message>
Game files moved out in zip archive. Implementing audio. For V13 MONGOLS U01!
</commit_message>
<xml_diff>
--- a/changelog.docx
+++ b/changelog.docx
@@ -44,7 +44,7 @@
           <w:b/>
           <w:sz w:val="48"/>
         </w:rPr>
-        <w:t>2</w:t>
+        <w:t>3</w:t>
       </w:r>
       <w:r>
         <w:rPr>
@@ -60,8 +60,10 @@
           <w:b/>
           <w:sz w:val="48"/>
         </w:rPr>
-        <w:t>LATVIA</w:t>
-      </w:r>
+        <w:t>MONGOLS</w:t>
+      </w:r>
+      <w:bookmarkStart w:id="0" w:name="_GoBack"/>
+      <w:bookmarkEnd w:id="0"/>
       <w:r>
         <w:rPr>
           <w:rFonts w:ascii="Verdana" w:hAnsi="Verdana"/>
@@ -225,48 +227,15 @@
           <w:sz w:val="32"/>
           <w:szCs w:val="32"/>
         </w:rPr>
-        <w:t>Block world is now split into chunks which are carefully chosen when to render.</w:t>
-      </w:r>
-    </w:p>
-    <w:p>
-      <w:pPr>
-        <w:pStyle w:val="NoSpacing"/>
-        <w:ind w:left="360"/>
-        <w:rPr>
-          <w:rFonts w:ascii="Verdana" w:hAnsi="Verdana"/>
-          <w:color w:val="00B050"/>
-          <w:sz w:val="32"/>
-          <w:szCs w:val="32"/>
-        </w:rPr>
-      </w:pPr>
-    </w:p>
-    <w:p>
-      <w:pPr>
-        <w:pStyle w:val="NoSpacing"/>
-        <w:rPr>
-          <w:rFonts w:ascii="Verdana" w:hAnsi="Verdana"/>
-          <w:b/>
-          <w:color w:val="FFC000"/>
-          <w:sz w:val="48"/>
-        </w:rPr>
-      </w:pPr>
-      <w:r>
-        <w:rPr>
-          <w:rFonts w:ascii="Verdana" w:hAnsi="Verdana"/>
-          <w:b/>
-          <w:color w:val="FFC000"/>
-          <w:sz w:val="48"/>
-        </w:rPr>
-        <w:t>CHANGES</w:t>
-      </w:r>
-      <w:r>
-        <w:rPr>
-          <w:rFonts w:ascii="Verdana" w:hAnsi="Verdana"/>
-          <w:b/>
-          <w:color w:val="FFC000"/>
-          <w:sz w:val="48"/>
-        </w:rPr>
-        <w:t>:</w:t>
+        <w:t>Music and sounds can be played from the game</w:t>
+      </w:r>
+      <w:r>
+        <w:rPr>
+          <w:rFonts w:ascii="Verdana" w:hAnsi="Verdana"/>
+          <w:sz w:val="32"/>
+          <w:szCs w:val="32"/>
+        </w:rPr>
+        <w:t>.</w:t>
       </w:r>
     </w:p>
     <w:p>
@@ -289,32 +258,337 @@
           <w:sz w:val="32"/>
           <w:szCs w:val="32"/>
         </w:rPr>
-        <w:t>I</w:t>
-      </w:r>
-      <w:r>
-        <w:rPr>
-          <w:rFonts w:ascii="Verdana" w:hAnsi="Verdana"/>
-          <w:sz w:val="32"/>
-          <w:szCs w:val="32"/>
-        </w:rPr>
-        <w:t>mproved engine can rend</w:t>
-      </w:r>
-      <w:r>
-        <w:rPr>
-          <w:rFonts w:ascii="Verdana" w:hAnsi="Verdana"/>
-          <w:sz w:val="32"/>
-          <w:szCs w:val="32"/>
-        </w:rPr>
-        <w:t xml:space="preserve">er now maximum amount of blocks, namely </w:t>
-      </w:r>
-      <w:r>
-        <w:rPr>
-          <w:rFonts w:ascii="Verdana" w:hAnsi="Verdana"/>
-          <w:sz w:val="32"/>
-          <w:szCs w:val="32"/>
-        </w:rPr>
-        <w:t>131070.</w:t>
-      </w:r>
+        <w:t>Game can be run in debug mode (requires setting it to true in .</w:t>
+      </w:r>
+      <w:proofErr w:type="spellStart"/>
+      <w:r>
+        <w:rPr>
+          <w:rFonts w:ascii="Verdana" w:hAnsi="Verdana"/>
+          <w:sz w:val="32"/>
+          <w:szCs w:val="32"/>
+        </w:rPr>
+        <w:t>ini</w:t>
+      </w:r>
+      <w:proofErr w:type="spellEnd"/>
+      <w:r>
+        <w:rPr>
+          <w:rFonts w:ascii="Verdana" w:hAnsi="Verdana"/>
+          <w:sz w:val="32"/>
+          <w:szCs w:val="32"/>
+        </w:rPr>
+        <w:t xml:space="preserve"> file).</w:t>
+      </w:r>
+    </w:p>
+    <w:p>
+      <w:pPr>
+        <w:pStyle w:val="NoSpacing"/>
+        <w:ind w:left="360"/>
+        <w:rPr>
+          <w:rFonts w:ascii="Verdana" w:hAnsi="Verdana"/>
+          <w:color w:val="00B050"/>
+          <w:sz w:val="32"/>
+          <w:szCs w:val="32"/>
+        </w:rPr>
+      </w:pPr>
+    </w:p>
+    <w:p>
+      <w:pPr>
+        <w:pStyle w:val="NoSpacing"/>
+        <w:ind w:left="360"/>
+        <w:rPr>
+          <w:rFonts w:ascii="Verdana" w:hAnsi="Verdana"/>
+          <w:color w:val="00B050"/>
+          <w:sz w:val="32"/>
+          <w:szCs w:val="32"/>
+        </w:rPr>
+      </w:pPr>
+    </w:p>
+    <w:p>
+      <w:pPr>
+        <w:pStyle w:val="NoSpacing"/>
+        <w:ind w:left="360"/>
+        <w:rPr>
+          <w:rFonts w:ascii="Verdana" w:hAnsi="Verdana"/>
+          <w:color w:val="00B050"/>
+          <w:sz w:val="32"/>
+          <w:szCs w:val="32"/>
+        </w:rPr>
+      </w:pPr>
+    </w:p>
+    <w:p>
+      <w:pPr>
+        <w:pStyle w:val="NoSpacing"/>
+        <w:ind w:left="360"/>
+        <w:rPr>
+          <w:rFonts w:ascii="Verdana" w:hAnsi="Verdana"/>
+          <w:color w:val="00B050"/>
+          <w:sz w:val="32"/>
+          <w:szCs w:val="32"/>
+        </w:rPr>
+      </w:pPr>
+    </w:p>
+    <w:p>
+      <w:pPr>
+        <w:pStyle w:val="NoSpacing"/>
+        <w:ind w:left="360"/>
+        <w:rPr>
+          <w:rFonts w:ascii="Verdana" w:hAnsi="Verdana"/>
+          <w:color w:val="00B050"/>
+          <w:sz w:val="32"/>
+          <w:szCs w:val="32"/>
+        </w:rPr>
+      </w:pPr>
+    </w:p>
+    <w:p>
+      <w:pPr>
+        <w:pStyle w:val="NoSpacing"/>
+        <w:ind w:left="360"/>
+        <w:rPr>
+          <w:rFonts w:ascii="Verdana" w:hAnsi="Verdana"/>
+          <w:color w:val="00B050"/>
+          <w:sz w:val="32"/>
+          <w:szCs w:val="32"/>
+        </w:rPr>
+      </w:pPr>
+    </w:p>
+    <w:p>
+      <w:pPr>
+        <w:pStyle w:val="NoSpacing"/>
+        <w:ind w:left="360"/>
+        <w:rPr>
+          <w:rFonts w:ascii="Verdana" w:hAnsi="Verdana"/>
+          <w:color w:val="00B050"/>
+          <w:sz w:val="32"/>
+          <w:szCs w:val="32"/>
+        </w:rPr>
+      </w:pPr>
+    </w:p>
+    <w:p>
+      <w:pPr>
+        <w:pStyle w:val="NoSpacing"/>
+        <w:ind w:left="360"/>
+        <w:rPr>
+          <w:rFonts w:ascii="Verdana" w:hAnsi="Verdana"/>
+          <w:color w:val="00B050"/>
+          <w:sz w:val="32"/>
+          <w:szCs w:val="32"/>
+        </w:rPr>
+      </w:pPr>
+    </w:p>
+    <w:p>
+      <w:pPr>
+        <w:pStyle w:val="NoSpacing"/>
+        <w:ind w:left="360"/>
+        <w:rPr>
+          <w:rFonts w:ascii="Verdana" w:hAnsi="Verdana"/>
+          <w:color w:val="00B050"/>
+          <w:sz w:val="32"/>
+          <w:szCs w:val="32"/>
+        </w:rPr>
+      </w:pPr>
+    </w:p>
+    <w:p>
+      <w:pPr>
+        <w:pStyle w:val="NoSpacing"/>
+        <w:ind w:left="360"/>
+        <w:rPr>
+          <w:rFonts w:ascii="Verdana" w:hAnsi="Verdana"/>
+          <w:color w:val="00B050"/>
+          <w:sz w:val="32"/>
+          <w:szCs w:val="32"/>
+        </w:rPr>
+      </w:pPr>
+    </w:p>
+    <w:p>
+      <w:pPr>
+        <w:pStyle w:val="NoSpacing"/>
+        <w:ind w:left="360"/>
+        <w:rPr>
+          <w:rFonts w:ascii="Verdana" w:hAnsi="Verdana"/>
+          <w:color w:val="00B050"/>
+          <w:sz w:val="32"/>
+          <w:szCs w:val="32"/>
+        </w:rPr>
+      </w:pPr>
+    </w:p>
+    <w:p>
+      <w:pPr>
+        <w:pStyle w:val="NoSpacing"/>
+        <w:ind w:left="360"/>
+        <w:rPr>
+          <w:rFonts w:ascii="Verdana" w:hAnsi="Verdana"/>
+          <w:color w:val="00B050"/>
+          <w:sz w:val="32"/>
+          <w:szCs w:val="32"/>
+        </w:rPr>
+      </w:pPr>
+    </w:p>
+    <w:p>
+      <w:pPr>
+        <w:pStyle w:val="NoSpacing"/>
+        <w:ind w:left="360"/>
+        <w:rPr>
+          <w:rFonts w:ascii="Verdana" w:hAnsi="Verdana"/>
+          <w:color w:val="00B050"/>
+          <w:sz w:val="32"/>
+          <w:szCs w:val="32"/>
+        </w:rPr>
+      </w:pPr>
+    </w:p>
+    <w:p>
+      <w:pPr>
+        <w:pStyle w:val="NoSpacing"/>
+        <w:ind w:left="360"/>
+        <w:rPr>
+          <w:rFonts w:ascii="Verdana" w:hAnsi="Verdana"/>
+          <w:color w:val="00B050"/>
+          <w:sz w:val="32"/>
+          <w:szCs w:val="32"/>
+        </w:rPr>
+      </w:pPr>
+    </w:p>
+    <w:p>
+      <w:pPr>
+        <w:pStyle w:val="NoSpacing"/>
+        <w:ind w:left="360"/>
+        <w:rPr>
+          <w:rFonts w:ascii="Verdana" w:hAnsi="Verdana"/>
+          <w:color w:val="00B050"/>
+          <w:sz w:val="32"/>
+          <w:szCs w:val="32"/>
+        </w:rPr>
+      </w:pPr>
+    </w:p>
+    <w:p>
+      <w:pPr>
+        <w:pStyle w:val="NoSpacing"/>
+        <w:ind w:left="360"/>
+        <w:rPr>
+          <w:rFonts w:ascii="Verdana" w:hAnsi="Verdana"/>
+          <w:color w:val="00B050"/>
+          <w:sz w:val="32"/>
+          <w:szCs w:val="32"/>
+        </w:rPr>
+      </w:pPr>
+    </w:p>
+    <w:p>
+      <w:pPr>
+        <w:pStyle w:val="NoSpacing"/>
+        <w:ind w:left="360"/>
+        <w:rPr>
+          <w:rFonts w:ascii="Verdana" w:hAnsi="Verdana"/>
+          <w:color w:val="00B050"/>
+          <w:sz w:val="32"/>
+          <w:szCs w:val="32"/>
+        </w:rPr>
+      </w:pPr>
+    </w:p>
+    <w:p>
+      <w:pPr>
+        <w:pStyle w:val="NoSpacing"/>
+        <w:ind w:left="360"/>
+        <w:rPr>
+          <w:rFonts w:ascii="Verdana" w:hAnsi="Verdana"/>
+          <w:color w:val="00B050"/>
+          <w:sz w:val="32"/>
+          <w:szCs w:val="32"/>
+        </w:rPr>
+      </w:pPr>
+    </w:p>
+    <w:p>
+      <w:pPr>
+        <w:pStyle w:val="NoSpacing"/>
+        <w:ind w:left="360"/>
+        <w:rPr>
+          <w:rFonts w:ascii="Verdana" w:hAnsi="Verdana"/>
+          <w:color w:val="00B050"/>
+          <w:sz w:val="32"/>
+          <w:szCs w:val="32"/>
+        </w:rPr>
+      </w:pPr>
+    </w:p>
+    <w:p>
+      <w:pPr>
+        <w:pStyle w:val="NoSpacing"/>
+        <w:ind w:left="360"/>
+        <w:rPr>
+          <w:rFonts w:ascii="Verdana" w:hAnsi="Verdana"/>
+          <w:color w:val="00B050"/>
+          <w:sz w:val="32"/>
+          <w:szCs w:val="32"/>
+        </w:rPr>
+      </w:pPr>
+    </w:p>
+    <w:p>
+      <w:pPr>
+        <w:pStyle w:val="NoSpacing"/>
+        <w:ind w:left="360"/>
+        <w:rPr>
+          <w:rFonts w:ascii="Verdana" w:hAnsi="Verdana"/>
+          <w:color w:val="00B050"/>
+          <w:sz w:val="32"/>
+          <w:szCs w:val="32"/>
+        </w:rPr>
+      </w:pPr>
+    </w:p>
+    <w:p>
+      <w:pPr>
+        <w:pStyle w:val="NoSpacing"/>
+        <w:rPr>
+          <w:rFonts w:ascii="Verdana" w:hAnsi="Verdana"/>
+        </w:rPr>
+      </w:pPr>
+    </w:p>
+    <w:p>
+      <w:pPr>
+        <w:pStyle w:val="NoSpacing"/>
+        <w:rPr>
+          <w:rFonts w:ascii="Verdana" w:hAnsi="Verdana"/>
+          <w:b/>
+          <w:sz w:val="48"/>
+        </w:rPr>
+      </w:pPr>
+      <w:r>
+        <w:rPr>
+          <w:rFonts w:ascii="Verdana" w:hAnsi="Verdana"/>
+          <w:b/>
+          <w:sz w:val="48"/>
+        </w:rPr>
+        <w:lastRenderedPageBreak/>
+        <w:t>Available commands:</w:t>
+      </w:r>
+    </w:p>
+    <w:p>
+      <w:pPr>
+        <w:pStyle w:val="NoSpacing"/>
+        <w:rPr>
+          <w:rFonts w:ascii="Verdana" w:hAnsi="Verdana"/>
+          <w:sz w:val="40"/>
+        </w:rPr>
+      </w:pPr>
+      <w:r>
+        <w:rPr>
+          <w:rFonts w:ascii="Verdana" w:hAnsi="Verdana"/>
+          <w:sz w:val="40"/>
+        </w:rPr>
+        <w:t xml:space="preserve">In order to type command </w:t>
+      </w:r>
+      <w:proofErr w:type="gramStart"/>
+      <w:r>
+        <w:rPr>
+          <w:rFonts w:ascii="Verdana" w:hAnsi="Verdana"/>
+          <w:sz w:val="40"/>
+        </w:rPr>
+        <w:t>which is equivalent to options setup press key “~”</w:t>
+      </w:r>
+      <w:r>
+        <w:rPr>
+          <w:rFonts w:ascii="Verdana" w:hAnsi="Verdana"/>
+          <w:sz w:val="40"/>
+        </w:rPr>
+        <w:t>.</w:t>
+      </w:r>
+      <w:proofErr w:type="gramEnd"/>
     </w:p>
     <w:p>
       <w:pPr>
@@ -325,26 +599,115 @@
         </w:numPr>
         <w:rPr>
           <w:rFonts w:ascii="Verdana" w:hAnsi="Verdana"/>
-          <w:color w:val="00B050"/>
-          <w:sz w:val="32"/>
-          <w:szCs w:val="32"/>
-        </w:rPr>
-      </w:pPr>
-      <w:r>
-        <w:rPr>
-          <w:rFonts w:ascii="Verdana" w:hAnsi="Verdana"/>
-          <w:sz w:val="32"/>
-          <w:szCs w:val="32"/>
-        </w:rPr>
-        <w:t>Program</w:t>
-      </w:r>
-      <w:r>
-        <w:rPr>
-          <w:rFonts w:ascii="Verdana" w:hAnsi="Verdana"/>
-          <w:sz w:val="32"/>
-          <w:szCs w:val="32"/>
-        </w:rPr>
-        <w:t xml:space="preserve"> consumes lesser memory due to removed redundant lists.</w:t>
+          <w:sz w:val="32"/>
+          <w:szCs w:val="32"/>
+        </w:rPr>
+      </w:pPr>
+      <w:proofErr w:type="spellStart"/>
+      <w:r>
+        <w:rPr>
+          <w:rFonts w:ascii="Verdana" w:hAnsi="Verdana"/>
+          <w:sz w:val="32"/>
+          <w:szCs w:val="32"/>
+        </w:rPr>
+        <w:t>fps_max</w:t>
+      </w:r>
+      <w:proofErr w:type="spellEnd"/>
+      <w:r>
+        <w:rPr>
+          <w:rFonts w:ascii="Verdana" w:hAnsi="Verdana"/>
+          <w:sz w:val="32"/>
+          <w:szCs w:val="32"/>
+        </w:rPr>
+        <w:t>&lt;</w:t>
+      </w:r>
+      <w:proofErr w:type="spellStart"/>
+      <w:r>
+        <w:rPr>
+          <w:rFonts w:ascii="Verdana" w:hAnsi="Verdana"/>
+          <w:sz w:val="32"/>
+          <w:szCs w:val="32"/>
+        </w:rPr>
+        <w:t>num</w:t>
+      </w:r>
+      <w:proofErr w:type="spellEnd"/>
+      <w:r>
+        <w:rPr>
+          <w:rFonts w:ascii="Verdana" w:hAnsi="Verdana"/>
+          <w:sz w:val="32"/>
+          <w:szCs w:val="32"/>
+        </w:rPr>
+        <w:t xml:space="preserve">&gt;, </w:t>
+      </w:r>
+      <w:proofErr w:type="spellStart"/>
+      <w:r>
+        <w:rPr>
+          <w:rFonts w:ascii="Verdana" w:hAnsi="Verdana"/>
+          <w:sz w:val="32"/>
+          <w:szCs w:val="32"/>
+        </w:rPr>
+        <w:t>fpsMax</w:t>
+      </w:r>
+      <w:proofErr w:type="spellEnd"/>
+      <w:r>
+        <w:rPr>
+          <w:rFonts w:ascii="Verdana" w:hAnsi="Verdana"/>
+          <w:sz w:val="32"/>
+          <w:szCs w:val="32"/>
+        </w:rPr>
+        <w:t>&lt;</w:t>
+      </w:r>
+      <w:proofErr w:type="spellStart"/>
+      <w:r>
+        <w:rPr>
+          <w:rFonts w:ascii="Verdana" w:hAnsi="Verdana"/>
+          <w:sz w:val="32"/>
+          <w:szCs w:val="32"/>
+        </w:rPr>
+        <w:t>num</w:t>
+      </w:r>
+      <w:proofErr w:type="spellEnd"/>
+      <w:r>
+        <w:rPr>
+          <w:rFonts w:ascii="Verdana" w:hAnsi="Verdana"/>
+          <w:sz w:val="32"/>
+          <w:szCs w:val="32"/>
+        </w:rPr>
+        <w:t xml:space="preserve">&gt;: allowing </w:t>
+      </w:r>
+      <w:proofErr w:type="gramStart"/>
+      <w:r>
+        <w:rPr>
+          <w:rFonts w:ascii="Verdana" w:hAnsi="Verdana"/>
+          <w:sz w:val="32"/>
+          <w:szCs w:val="32"/>
+        </w:rPr>
+        <w:t>to change</w:t>
+      </w:r>
+      <w:proofErr w:type="gramEnd"/>
+      <w:r>
+        <w:rPr>
+          <w:rFonts w:ascii="Verdana" w:hAnsi="Verdana"/>
+          <w:sz w:val="32"/>
+          <w:szCs w:val="32"/>
+        </w:rPr>
+        <w:t xml:space="preserve"> max fps</w:t>
+      </w:r>
+      <w:r>
+        <w:rPr>
+          <w:rFonts w:ascii="Verdana" w:hAnsi="Verdana"/>
+          <w:sz w:val="32"/>
+          <w:szCs w:val="32"/>
+        </w:rPr>
+        <w:t xml:space="preserve"> (it must be positive number)</w:t>
+      </w:r>
+      <w:r>
+        <w:rPr>
+          <w:rFonts w:ascii="Verdana" w:hAnsi="Verdana"/>
+          <w:sz w:val="32"/>
+          <w:szCs w:val="32"/>
+        </w:rPr>
+        <w:t>.</w:t>
       </w:r>
     </w:p>
     <w:p>
@@ -356,18 +719,35 @@
         </w:numPr>
         <w:rPr>
           <w:rFonts w:ascii="Verdana" w:hAnsi="Verdana"/>
-          <w:color w:val="00B050"/>
-          <w:sz w:val="32"/>
-          <w:szCs w:val="32"/>
-        </w:rPr>
-      </w:pPr>
-      <w:r>
-        <w:rPr>
-          <w:rFonts w:ascii="Verdana" w:hAnsi="Verdana"/>
-          <w:sz w:val="32"/>
-          <w:szCs w:val="32"/>
-        </w:rPr>
-        <w:t>World size increased (skybox is larger).</w:t>
+          <w:sz w:val="32"/>
+          <w:szCs w:val="32"/>
+        </w:rPr>
+      </w:pPr>
+      <w:proofErr w:type="gramStart"/>
+      <w:r>
+        <w:rPr>
+          <w:rFonts w:ascii="Verdana" w:hAnsi="Verdana"/>
+          <w:sz w:val="32"/>
+          <w:szCs w:val="32"/>
+        </w:rPr>
+        <w:t>resolution&lt;</w:t>
+      </w:r>
+      <w:proofErr w:type="gramEnd"/>
+      <w:r>
+        <w:rPr>
+          <w:rFonts w:ascii="Verdana" w:hAnsi="Verdana"/>
+          <w:sz w:val="32"/>
+          <w:szCs w:val="32"/>
+        </w:rPr>
+        <w:t>width&gt;&lt;height&gt;, res&lt;width&gt;&lt;height&gt;: allowing to change resolution (min resolution is 640x480 whilst</w:t>
+      </w:r>
+      <w:r>
+        <w:rPr>
+          <w:rFonts w:ascii="Verdana" w:hAnsi="Verdana"/>
+          <w:sz w:val="32"/>
+          <w:szCs w:val="32"/>
+        </w:rPr>
+        <w:t xml:space="preserve"> max is your native resolution).</w:t>
       </w:r>
     </w:p>
     <w:p>
@@ -379,26 +759,55 @@
         </w:numPr>
         <w:rPr>
           <w:rFonts w:ascii="Verdana" w:hAnsi="Verdana"/>
-          <w:color w:val="00B050"/>
-          <w:sz w:val="32"/>
-          <w:szCs w:val="32"/>
-        </w:rPr>
-      </w:pPr>
-      <w:r>
-        <w:rPr>
-          <w:rFonts w:ascii="Verdana" w:hAnsi="Verdana"/>
-          <w:sz w:val="32"/>
-          <w:szCs w:val="32"/>
-        </w:rPr>
-        <w:t>Progr</w:t>
-      </w:r>
-      <w:r>
-        <w:rPr>
-          <w:rFonts w:ascii="Verdana" w:hAnsi="Verdana"/>
-          <w:sz w:val="32"/>
-          <w:szCs w:val="32"/>
-        </w:rPr>
-        <w:t>ess when loading bar is more precise.</w:t>
+          <w:sz w:val="32"/>
+          <w:szCs w:val="32"/>
+        </w:rPr>
+      </w:pPr>
+      <w:proofErr w:type="spellStart"/>
+      <w:proofErr w:type="gramStart"/>
+      <w:r>
+        <w:rPr>
+          <w:rFonts w:ascii="Verdana" w:hAnsi="Verdana"/>
+          <w:sz w:val="32"/>
+          <w:szCs w:val="32"/>
+        </w:rPr>
+        <w:t>fullscreen</w:t>
+      </w:r>
+      <w:proofErr w:type="spellEnd"/>
+      <w:proofErr w:type="gramEnd"/>
+      <w:r>
+        <w:rPr>
+          <w:rFonts w:ascii="Verdana" w:hAnsi="Verdana"/>
+          <w:sz w:val="32"/>
+          <w:szCs w:val="32"/>
+        </w:rPr>
+        <w:t>:</w:t>
+      </w:r>
+      <w:r>
+        <w:rPr>
+          <w:rFonts w:ascii="Verdana" w:hAnsi="Verdana"/>
+          <w:sz w:val="32"/>
+          <w:szCs w:val="32"/>
+        </w:rPr>
+        <w:t xml:space="preserve"> makes your game run </w:t>
+      </w:r>
+      <w:proofErr w:type="spellStart"/>
+      <w:r>
+        <w:rPr>
+          <w:rFonts w:ascii="Verdana" w:hAnsi="Verdana"/>
+          <w:sz w:val="32"/>
+          <w:szCs w:val="32"/>
+        </w:rPr>
+        <w:t>fullscreen</w:t>
+      </w:r>
+      <w:proofErr w:type="spellEnd"/>
+      <w:r>
+        <w:rPr>
+          <w:rFonts w:ascii="Verdana" w:hAnsi="Verdana"/>
+          <w:sz w:val="32"/>
+          <w:szCs w:val="32"/>
+        </w:rPr>
+        <w:t>.</w:t>
       </w:r>
     </w:p>
     <w:p>
@@ -410,38 +819,35 @@
         </w:numPr>
         <w:rPr>
           <w:rFonts w:ascii="Verdana" w:hAnsi="Verdana"/>
-          <w:color w:val="00B050"/>
-          <w:sz w:val="32"/>
-          <w:szCs w:val="32"/>
-        </w:rPr>
-      </w:pPr>
-      <w:r>
-        <w:rPr>
-          <w:rFonts w:ascii="Verdana" w:hAnsi="Verdana"/>
-          <w:sz w:val="32"/>
-          <w:szCs w:val="32"/>
-        </w:rPr>
-        <w:t>Saving level and loading level can be more easily terminated when exiting application.</w:t>
-      </w:r>
-    </w:p>
-    <w:p>
-      <w:pPr>
-        <w:pStyle w:val="NoSpacing"/>
-        <w:rPr>
-          <w:rFonts w:ascii="Verdana" w:hAnsi="Verdana"/>
-          <w:b/>
-          <w:color w:val="FF0000"/>
-          <w:sz w:val="48"/>
-        </w:rPr>
-      </w:pPr>
-      <w:r>
-        <w:rPr>
-          <w:rFonts w:ascii="Verdana" w:hAnsi="Verdana"/>
-          <w:b/>
-          <w:color w:val="FF0000"/>
-          <w:sz w:val="48"/>
-        </w:rPr>
-        <w:t>FIXES:</w:t>
+          <w:sz w:val="32"/>
+          <w:szCs w:val="32"/>
+        </w:rPr>
+      </w:pPr>
+      <w:proofErr w:type="gramStart"/>
+      <w:r>
+        <w:rPr>
+          <w:rFonts w:ascii="Verdana" w:hAnsi="Verdana"/>
+          <w:sz w:val="32"/>
+          <w:szCs w:val="32"/>
+        </w:rPr>
+        <w:t>windowed</w:t>
+      </w:r>
+      <w:proofErr w:type="gramEnd"/>
+      <w:r>
+        <w:rPr>
+          <w:rFonts w:ascii="Verdana" w:hAnsi="Verdana"/>
+          <w:sz w:val="32"/>
+          <w:szCs w:val="32"/>
+        </w:rPr>
+        <w:t xml:space="preserve">: makes your game run </w:t>
+      </w:r>
+      <w:r>
+        <w:rPr>
+          <w:rFonts w:ascii="Verdana" w:hAnsi="Verdana"/>
+          <w:sz w:val="32"/>
+          <w:szCs w:val="32"/>
+        </w:rPr>
+        <w:t>windowed mode.</w:t>
       </w:r>
     </w:p>
     <w:p>
@@ -453,34 +859,113 @@
         </w:numPr>
         <w:rPr>
           <w:rFonts w:ascii="Verdana" w:hAnsi="Verdana"/>
-          <w:color w:val="00B050"/>
-          <w:sz w:val="32"/>
-          <w:szCs w:val="32"/>
-        </w:rPr>
-      </w:pPr>
-      <w:r>
-        <w:rPr>
-          <w:rFonts w:ascii="Verdana" w:hAnsi="Verdana"/>
-          <w:sz w:val="32"/>
-          <w:szCs w:val="32"/>
-        </w:rPr>
-        <w:t>Level renderer does not animate</w:t>
-      </w:r>
-      <w:r>
-        <w:rPr>
-          <w:rFonts w:ascii="Verdana" w:hAnsi="Verdana"/>
-          <w:sz w:val="32"/>
-          <w:szCs w:val="32"/>
-        </w:rPr>
-        <w:t xml:space="preserve"> (fix)</w:t>
-      </w:r>
-      <w:r>
-        <w:rPr>
-          <w:rFonts w:ascii="Verdana" w:hAnsi="Verdana"/>
-          <w:sz w:val="32"/>
-          <w:szCs w:val="32"/>
-        </w:rPr>
-        <w:t xml:space="preserve"> when level is loading</w:t>
+          <w:sz w:val="32"/>
+          <w:szCs w:val="32"/>
+        </w:rPr>
+      </w:pPr>
+      <w:proofErr w:type="spellStart"/>
+      <w:r>
+        <w:rPr>
+          <w:rFonts w:ascii="Verdana" w:hAnsi="Verdana"/>
+          <w:sz w:val="32"/>
+          <w:szCs w:val="32"/>
+        </w:rPr>
+        <w:t>v_sync</w:t>
+      </w:r>
+      <w:proofErr w:type="spellEnd"/>
+      <w:r>
+        <w:rPr>
+          <w:rFonts w:ascii="Verdana" w:hAnsi="Verdana"/>
+          <w:sz w:val="32"/>
+          <w:szCs w:val="32"/>
+        </w:rPr>
+        <w:t xml:space="preserve"> &lt;bool&gt;</w:t>
+      </w:r>
+      <w:r>
+        <w:rPr>
+          <w:rFonts w:ascii="Verdana" w:hAnsi="Verdana"/>
+          <w:sz w:val="32"/>
+          <w:szCs w:val="32"/>
+        </w:rPr>
+        <w:t xml:space="preserve">, </w:t>
+      </w:r>
+      <w:proofErr w:type="spellStart"/>
+      <w:r>
+        <w:rPr>
+          <w:rFonts w:ascii="Verdana" w:hAnsi="Verdana"/>
+          <w:sz w:val="32"/>
+          <w:szCs w:val="32"/>
+        </w:rPr>
+        <w:t>vsync</w:t>
+      </w:r>
+      <w:proofErr w:type="spellEnd"/>
+      <w:r>
+        <w:rPr>
+          <w:rFonts w:ascii="Verdana" w:hAnsi="Verdana"/>
+          <w:sz w:val="32"/>
+          <w:szCs w:val="32"/>
+        </w:rPr>
+        <w:t>&lt;bool&gt;</w:t>
+      </w:r>
+      <w:r>
+        <w:rPr>
+          <w:rFonts w:ascii="Verdana" w:hAnsi="Verdana"/>
+          <w:sz w:val="32"/>
+          <w:szCs w:val="32"/>
+        </w:rPr>
+        <w:t>: whether</w:t>
+      </w:r>
+      <w:r>
+        <w:rPr>
+          <w:rFonts w:ascii="Verdana" w:hAnsi="Verdana"/>
+          <w:sz w:val="32"/>
+          <w:szCs w:val="32"/>
+        </w:rPr>
+        <w:t xml:space="preserve"> or not you</w:t>
+      </w:r>
+      <w:r>
+        <w:rPr>
+          <w:rFonts w:ascii="Verdana" w:hAnsi="Verdana"/>
+          <w:sz w:val="32"/>
+          <w:szCs w:val="32"/>
+        </w:rPr>
+        <w:t xml:space="preserve"> </w:t>
+      </w:r>
+      <w:proofErr w:type="spellStart"/>
+      <w:r>
+        <w:rPr>
+          <w:rFonts w:ascii="Verdana" w:hAnsi="Verdana"/>
+          <w:sz w:val="32"/>
+          <w:szCs w:val="32"/>
+        </w:rPr>
+        <w:t>wanna</w:t>
+      </w:r>
+      <w:proofErr w:type="spellEnd"/>
+      <w:r>
+        <w:rPr>
+          <w:rFonts w:ascii="Verdana" w:hAnsi="Verdana"/>
+          <w:sz w:val="32"/>
+          <w:szCs w:val="32"/>
+        </w:rPr>
+        <w:t xml:space="preserve"> </w:t>
+      </w:r>
+      <w:proofErr w:type="spellStart"/>
+      <w:r>
+        <w:rPr>
+          <w:rFonts w:ascii="Verdana" w:hAnsi="Verdana"/>
+          <w:sz w:val="32"/>
+          <w:szCs w:val="32"/>
+        </w:rPr>
+        <w:t>vsync</w:t>
+      </w:r>
+      <w:proofErr w:type="spellEnd"/>
+      <w:r>
+        <w:rPr>
+          <w:rFonts w:ascii="Verdana" w:hAnsi="Verdana"/>
+          <w:sz w:val="32"/>
+          <w:szCs w:val="32"/>
+        </w:rPr>
+        <w:t xml:space="preserve"> on or off</w:t>
       </w:r>
       <w:r>
         <w:rPr>
@@ -490,185 +975,14 @@
         </w:rPr>
         <w:t>.</w:t>
       </w:r>
-    </w:p>
-    <w:p>
-      <w:pPr>
-        <w:pStyle w:val="NoSpacing"/>
-        <w:ind w:left="360"/>
-        <w:rPr>
-          <w:rFonts w:ascii="Verdana" w:hAnsi="Verdana"/>
-          <w:color w:val="00B050"/>
-          <w:sz w:val="32"/>
-          <w:szCs w:val="32"/>
-        </w:rPr>
-      </w:pPr>
-    </w:p>
-    <w:p>
-      <w:pPr>
-        <w:pStyle w:val="NoSpacing"/>
-        <w:ind w:left="360"/>
-        <w:rPr>
-          <w:rFonts w:ascii="Verdana" w:hAnsi="Verdana"/>
-          <w:color w:val="00B050"/>
-          <w:sz w:val="32"/>
-          <w:szCs w:val="32"/>
-        </w:rPr>
-      </w:pPr>
-    </w:p>
-    <w:p>
-      <w:pPr>
-        <w:pStyle w:val="NoSpacing"/>
-        <w:ind w:left="360"/>
-        <w:rPr>
-          <w:rFonts w:ascii="Verdana" w:hAnsi="Verdana"/>
-          <w:color w:val="00B050"/>
-          <w:sz w:val="32"/>
-          <w:szCs w:val="32"/>
-        </w:rPr>
-      </w:pPr>
-    </w:p>
-    <w:p>
-      <w:pPr>
-        <w:pStyle w:val="NoSpacing"/>
-        <w:ind w:left="360"/>
-        <w:rPr>
-          <w:rFonts w:ascii="Verdana" w:hAnsi="Verdana"/>
-          <w:color w:val="00B050"/>
-          <w:sz w:val="32"/>
-          <w:szCs w:val="32"/>
-        </w:rPr>
-      </w:pPr>
-    </w:p>
-    <w:p>
-      <w:pPr>
-        <w:pStyle w:val="NoSpacing"/>
-        <w:ind w:left="360"/>
-        <w:rPr>
-          <w:rFonts w:ascii="Verdana" w:hAnsi="Verdana"/>
-          <w:color w:val="00B050"/>
-          <w:sz w:val="32"/>
-          <w:szCs w:val="32"/>
-        </w:rPr>
-      </w:pPr>
-    </w:p>
-    <w:p>
-      <w:pPr>
-        <w:pStyle w:val="NoSpacing"/>
-        <w:ind w:left="360"/>
-        <w:rPr>
-          <w:rFonts w:ascii="Verdana" w:hAnsi="Verdana"/>
-          <w:color w:val="00B050"/>
-          <w:sz w:val="32"/>
-          <w:szCs w:val="32"/>
-        </w:rPr>
-      </w:pPr>
-    </w:p>
-    <w:p>
-      <w:pPr>
-        <w:pStyle w:val="NoSpacing"/>
-        <w:ind w:left="360"/>
-        <w:rPr>
-          <w:rFonts w:ascii="Verdana" w:hAnsi="Verdana"/>
-          <w:color w:val="00B050"/>
-          <w:sz w:val="32"/>
-          <w:szCs w:val="32"/>
-        </w:rPr>
-      </w:pPr>
-    </w:p>
-    <w:p>
-      <w:pPr>
-        <w:pStyle w:val="NoSpacing"/>
-        <w:ind w:left="360"/>
-        <w:rPr>
-          <w:rFonts w:ascii="Verdana" w:hAnsi="Verdana"/>
-          <w:color w:val="00B050"/>
-          <w:sz w:val="32"/>
-          <w:szCs w:val="32"/>
-        </w:rPr>
-      </w:pPr>
-    </w:p>
-    <w:p>
-      <w:pPr>
-        <w:pStyle w:val="NoSpacing"/>
-        <w:ind w:left="360"/>
-        <w:rPr>
-          <w:rFonts w:ascii="Verdana" w:hAnsi="Verdana"/>
-          <w:color w:val="00B050"/>
-          <w:sz w:val="32"/>
-          <w:szCs w:val="32"/>
-        </w:rPr>
-      </w:pPr>
-    </w:p>
-    <w:p>
-      <w:pPr>
-        <w:pStyle w:val="NoSpacing"/>
-        <w:ind w:left="360"/>
-        <w:rPr>
-          <w:rFonts w:ascii="Verdana" w:hAnsi="Verdana"/>
-          <w:color w:val="00B050"/>
-          <w:sz w:val="32"/>
-          <w:szCs w:val="32"/>
-        </w:rPr>
-      </w:pPr>
-    </w:p>
-    <w:p>
-      <w:pPr>
-        <w:pStyle w:val="NoSpacing"/>
-        <w:rPr>
-          <w:rFonts w:ascii="Verdana" w:hAnsi="Verdana"/>
-        </w:rPr>
-      </w:pPr>
-    </w:p>
-    <w:p>
-      <w:pPr>
-        <w:pStyle w:val="NoSpacing"/>
-        <w:rPr>
-          <w:rFonts w:ascii="Verdana" w:hAnsi="Verdana"/>
-          <w:b/>
-          <w:sz w:val="48"/>
-        </w:rPr>
-      </w:pPr>
-      <w:r>
-        <w:rPr>
-          <w:rFonts w:ascii="Verdana" w:hAnsi="Verdana"/>
-          <w:b/>
-          <w:sz w:val="48"/>
-        </w:rPr>
-        <w:lastRenderedPageBreak/>
-        <w:t>Available commands:</w:t>
-      </w:r>
-    </w:p>
-    <w:p>
-      <w:pPr>
-        <w:pStyle w:val="NoSpacing"/>
-        <w:rPr>
-          <w:rFonts w:ascii="Verdana" w:hAnsi="Verdana"/>
-          <w:sz w:val="40"/>
-        </w:rPr>
-      </w:pPr>
-      <w:r>
-        <w:rPr>
-          <w:rFonts w:ascii="Verdana" w:hAnsi="Verdana"/>
-          <w:sz w:val="40"/>
-        </w:rPr>
-        <w:t xml:space="preserve">In order to type command </w:t>
-      </w:r>
-      <w:proofErr w:type="gramStart"/>
-      <w:r>
-        <w:rPr>
-          <w:rFonts w:ascii="Verdana" w:hAnsi="Verdana"/>
-          <w:sz w:val="40"/>
-        </w:rPr>
-        <w:t>which is equivalent to options setup press key “~”</w:t>
-      </w:r>
-      <w:r>
-        <w:rPr>
-          <w:rFonts w:ascii="Verdana" w:hAnsi="Verdana"/>
-          <w:sz w:val="40"/>
-        </w:rPr>
-        <w:t>.</w:t>
-      </w:r>
-      <w:proofErr w:type="gramEnd"/>
+      <w:r>
+        <w:rPr>
+          <w:rFonts w:ascii="Verdana" w:hAnsi="Verdana"/>
+          <w:sz w:val="32"/>
+          <w:szCs w:val="32"/>
+        </w:rPr>
+        <w:t xml:space="preserve"> If it’s on (you’ve set it to true) your fps is capped to your monitor refresh rate.</w:t>
+      </w:r>
     </w:p>
     <w:p>
       <w:pPr>
@@ -690,7 +1004,7 @@
           <w:sz w:val="32"/>
           <w:szCs w:val="32"/>
         </w:rPr>
-        <w:t>fps_max</w:t>
+        <w:t>water_efects</w:t>
       </w:r>
       <w:proofErr w:type="spellEnd"/>
       <w:r>
@@ -699,95 +1013,7 @@
           <w:sz w:val="32"/>
           <w:szCs w:val="32"/>
         </w:rPr>
-        <w:t>&lt;</w:t>
-      </w:r>
-      <w:proofErr w:type="spellStart"/>
-      <w:r>
-        <w:rPr>
-          <w:rFonts w:ascii="Verdana" w:hAnsi="Verdana"/>
-          <w:sz w:val="32"/>
-          <w:szCs w:val="32"/>
-        </w:rPr>
-        <w:t>num</w:t>
-      </w:r>
-      <w:proofErr w:type="spellEnd"/>
-      <w:r>
-        <w:rPr>
-          <w:rFonts w:ascii="Verdana" w:hAnsi="Verdana"/>
-          <w:sz w:val="32"/>
-          <w:szCs w:val="32"/>
-        </w:rPr>
-        <w:t xml:space="preserve">&gt;, </w:t>
-      </w:r>
-      <w:proofErr w:type="spellStart"/>
-      <w:r>
-        <w:rPr>
-          <w:rFonts w:ascii="Verdana" w:hAnsi="Verdana"/>
-          <w:sz w:val="32"/>
-          <w:szCs w:val="32"/>
-        </w:rPr>
-        <w:t>fpsMax</w:t>
-      </w:r>
-      <w:proofErr w:type="spellEnd"/>
-      <w:r>
-        <w:rPr>
-          <w:rFonts w:ascii="Verdana" w:hAnsi="Verdana"/>
-          <w:sz w:val="32"/>
-          <w:szCs w:val="32"/>
-        </w:rPr>
-        <w:t>&lt;</w:t>
-      </w:r>
-      <w:proofErr w:type="spellStart"/>
-      <w:r>
-        <w:rPr>
-          <w:rFonts w:ascii="Verdana" w:hAnsi="Verdana"/>
-          <w:sz w:val="32"/>
-          <w:szCs w:val="32"/>
-        </w:rPr>
-        <w:t>num</w:t>
-      </w:r>
-      <w:proofErr w:type="spellEnd"/>
-      <w:r>
-        <w:rPr>
-          <w:rFonts w:ascii="Verdana" w:hAnsi="Verdana"/>
-          <w:sz w:val="32"/>
-          <w:szCs w:val="32"/>
-        </w:rPr>
-        <w:t xml:space="preserve">&gt;: allowing </w:t>
-      </w:r>
-      <w:proofErr w:type="gramStart"/>
-      <w:r>
-        <w:rPr>
-          <w:rFonts w:ascii="Verdana" w:hAnsi="Verdana"/>
-          <w:sz w:val="32"/>
-          <w:szCs w:val="32"/>
-        </w:rPr>
-        <w:t>to change</w:t>
-      </w:r>
-      <w:proofErr w:type="gramEnd"/>
-      <w:r>
-        <w:rPr>
-          <w:rFonts w:ascii="Verdana" w:hAnsi="Verdana"/>
-          <w:sz w:val="32"/>
-          <w:szCs w:val="32"/>
-        </w:rPr>
-        <w:t xml:space="preserve"> max fps</w:t>
-      </w:r>
-      <w:r>
-        <w:rPr>
-          <w:rFonts w:ascii="Verdana" w:hAnsi="Verdana"/>
-          <w:sz w:val="32"/>
-          <w:szCs w:val="32"/>
-        </w:rPr>
-        <w:t xml:space="preserve"> (it must be positive number)</w:t>
-      </w:r>
-      <w:r>
-        <w:rPr>
-          <w:rFonts w:ascii="Verdana" w:hAnsi="Verdana"/>
-          <w:sz w:val="32"/>
-          <w:szCs w:val="32"/>
-        </w:rPr>
-        <w:t>.</w:t>
+        <w:t xml:space="preserve"> &lt;bool&gt;: enables (true) or disables (false) water effects (such as reflection).</w:t>
       </w:r>
     </w:p>
     <w:p>
@@ -803,31 +1029,108 @@
           <w:szCs w:val="32"/>
         </w:rPr>
       </w:pPr>
-      <w:proofErr w:type="gramStart"/>
-      <w:r>
-        <w:rPr>
-          <w:rFonts w:ascii="Verdana" w:hAnsi="Verdana"/>
-          <w:sz w:val="32"/>
-          <w:szCs w:val="32"/>
-        </w:rPr>
-        <w:t>resolution&lt;</w:t>
-      </w:r>
-      <w:proofErr w:type="gramEnd"/>
-      <w:r>
-        <w:rPr>
-          <w:rFonts w:ascii="Verdana" w:hAnsi="Verdana"/>
-          <w:sz w:val="32"/>
-          <w:szCs w:val="32"/>
-        </w:rPr>
-        <w:t>width&gt;&lt;height&gt;, res&lt;width&gt;&lt;height&gt;: allowing to change resolution (min resolution is 640x480 whilst</w:t>
-      </w:r>
-      <w:r>
-        <w:rPr>
-          <w:rFonts w:ascii="Verdana" w:hAnsi="Verdana"/>
-          <w:sz w:val="32"/>
-          <w:szCs w:val="32"/>
-        </w:rPr>
-        <w:t xml:space="preserve"> max is your native resolution).</w:t>
+      <w:proofErr w:type="spellStart"/>
+      <w:r>
+        <w:rPr>
+          <w:rFonts w:ascii="Verdana" w:hAnsi="Verdana"/>
+          <w:sz w:val="32"/>
+          <w:szCs w:val="32"/>
+        </w:rPr>
+        <w:t>mouse_sensitivity</w:t>
+      </w:r>
+      <w:proofErr w:type="spellEnd"/>
+      <w:r>
+        <w:rPr>
+          <w:rFonts w:ascii="Verdana" w:hAnsi="Verdana"/>
+          <w:sz w:val="32"/>
+          <w:szCs w:val="32"/>
+        </w:rPr>
+        <w:t>&lt;</w:t>
+      </w:r>
+      <w:proofErr w:type="spellStart"/>
+      <w:r>
+        <w:rPr>
+          <w:rFonts w:ascii="Verdana" w:hAnsi="Verdana"/>
+          <w:sz w:val="32"/>
+          <w:szCs w:val="32"/>
+        </w:rPr>
+        <w:t>num</w:t>
+      </w:r>
+      <w:proofErr w:type="spellEnd"/>
+      <w:r>
+        <w:rPr>
+          <w:rFonts w:ascii="Verdana" w:hAnsi="Verdana"/>
+          <w:sz w:val="32"/>
+          <w:szCs w:val="32"/>
+        </w:rPr>
+        <w:t xml:space="preserve">&gt;, </w:t>
+      </w:r>
+      <w:proofErr w:type="spellStart"/>
+      <w:r>
+        <w:rPr>
+          <w:rFonts w:ascii="Verdana" w:hAnsi="Verdana"/>
+          <w:sz w:val="32"/>
+          <w:szCs w:val="32"/>
+        </w:rPr>
+        <w:t>msens</w:t>
+      </w:r>
+      <w:proofErr w:type="spellEnd"/>
+      <w:r>
+        <w:rPr>
+          <w:rFonts w:ascii="Verdana" w:hAnsi="Verdana"/>
+          <w:sz w:val="32"/>
+          <w:szCs w:val="32"/>
+        </w:rPr>
+        <w:t xml:space="preserve"> &lt;</w:t>
+      </w:r>
+      <w:proofErr w:type="spellStart"/>
+      <w:r>
+        <w:rPr>
+          <w:rFonts w:ascii="Verdana" w:hAnsi="Verdana"/>
+          <w:sz w:val="32"/>
+          <w:szCs w:val="32"/>
+        </w:rPr>
+        <w:t>num</w:t>
+      </w:r>
+      <w:proofErr w:type="spellEnd"/>
+      <w:r>
+        <w:rPr>
+          <w:rFonts w:ascii="Verdana" w:hAnsi="Verdana"/>
+          <w:sz w:val="32"/>
+          <w:szCs w:val="32"/>
+        </w:rPr>
+        <w:t>&gt;: sets mouse sensitivity to this value.</w:t>
+      </w:r>
+    </w:p>
+    <w:p>
+      <w:pPr>
+        <w:pStyle w:val="NoSpacing"/>
+        <w:ind w:left="360"/>
+        <w:rPr>
+          <w:rFonts w:ascii="Verdana" w:hAnsi="Verdana"/>
+          <w:sz w:val="32"/>
+          <w:szCs w:val="32"/>
+        </w:rPr>
+      </w:pPr>
+    </w:p>
+    <w:p>
+      <w:pPr>
+        <w:pStyle w:val="NoSpacing"/>
+        <w:rPr>
+          <w:rFonts w:ascii="Verdana" w:hAnsi="Verdana"/>
+          <w:b/>
+          <w:sz w:val="48"/>
+          <w:szCs w:val="32"/>
+        </w:rPr>
+      </w:pPr>
+      <w:r>
+        <w:rPr>
+          <w:rFonts w:ascii="Verdana" w:hAnsi="Verdana"/>
+          <w:b/>
+          <w:sz w:val="48"/>
+          <w:szCs w:val="32"/>
+        </w:rPr>
+        <w:t>Notes:</w:t>
       </w:r>
     </w:p>
     <w:p>
@@ -843,51 +1146,13 @@
           <w:szCs w:val="32"/>
         </w:rPr>
       </w:pPr>
-      <w:proofErr w:type="spellStart"/>
-      <w:proofErr w:type="gramStart"/>
-      <w:r>
-        <w:rPr>
-          <w:rFonts w:ascii="Verdana" w:hAnsi="Verdana"/>
-          <w:sz w:val="32"/>
-          <w:szCs w:val="32"/>
-        </w:rPr>
-        <w:t>fullscreen</w:t>
-      </w:r>
-      <w:proofErr w:type="spellEnd"/>
-      <w:proofErr w:type="gramEnd"/>
-      <w:r>
-        <w:rPr>
-          <w:rFonts w:ascii="Verdana" w:hAnsi="Verdana"/>
-          <w:sz w:val="32"/>
-          <w:szCs w:val="32"/>
-        </w:rPr>
-        <w:t>:</w:t>
-      </w:r>
-      <w:r>
-        <w:rPr>
-          <w:rFonts w:ascii="Verdana" w:hAnsi="Verdana"/>
-          <w:sz w:val="32"/>
-          <w:szCs w:val="32"/>
-        </w:rPr>
-        <w:t xml:space="preserve"> makes your game run </w:t>
-      </w:r>
-      <w:proofErr w:type="spellStart"/>
-      <w:r>
-        <w:rPr>
-          <w:rFonts w:ascii="Verdana" w:hAnsi="Verdana"/>
-          <w:sz w:val="32"/>
-          <w:szCs w:val="32"/>
-        </w:rPr>
-        <w:t>fullscreen</w:t>
-      </w:r>
-      <w:proofErr w:type="spellEnd"/>
-      <w:r>
-        <w:rPr>
-          <w:rFonts w:ascii="Verdana" w:hAnsi="Verdana"/>
-          <w:sz w:val="32"/>
-          <w:szCs w:val="32"/>
-        </w:rPr>
-        <w:t>.</w:t>
+      <w:r>
+        <w:rPr>
+          <w:rFonts w:ascii="Verdana" w:hAnsi="Verdana"/>
+          <w:sz w:val="32"/>
+          <w:szCs w:val="32"/>
+        </w:rPr>
+        <w:t>Game uses LWJGL 3.2.3 since v 02 (BELARUS).</w:t>
       </w:r>
     </w:p>
     <w:p>
@@ -903,105 +1168,45 @@
           <w:szCs w:val="32"/>
         </w:rPr>
       </w:pPr>
-      <w:proofErr w:type="gramStart"/>
-      <w:r>
-        <w:rPr>
-          <w:rFonts w:ascii="Verdana" w:hAnsi="Verdana"/>
-          <w:sz w:val="32"/>
-          <w:szCs w:val="32"/>
-        </w:rPr>
-        <w:t>windowed</w:t>
-      </w:r>
-      <w:proofErr w:type="gramEnd"/>
-      <w:r>
-        <w:rPr>
-          <w:rFonts w:ascii="Verdana" w:hAnsi="Verdana"/>
-          <w:sz w:val="32"/>
-          <w:szCs w:val="32"/>
-        </w:rPr>
-        <w:t xml:space="preserve">: makes your game run </w:t>
-      </w:r>
-      <w:r>
-        <w:rPr>
-          <w:rFonts w:ascii="Verdana" w:hAnsi="Verdana"/>
-          <w:sz w:val="32"/>
-          <w:szCs w:val="32"/>
-        </w:rPr>
-        <w:t>windowed mode.</w:t>
-      </w:r>
-    </w:p>
-    <w:p>
-      <w:pPr>
-        <w:pStyle w:val="NoSpacing"/>
-        <w:numPr>
-          <w:ilvl w:val="0"/>
-          <w:numId w:val="19"/>
-        </w:numPr>
-        <w:rPr>
-          <w:rFonts w:ascii="Verdana" w:hAnsi="Verdana"/>
-          <w:sz w:val="32"/>
-          <w:szCs w:val="32"/>
-        </w:rPr>
-      </w:pPr>
-      <w:proofErr w:type="spellStart"/>
-      <w:r>
-        <w:rPr>
-          <w:rFonts w:ascii="Verdana" w:hAnsi="Verdana"/>
-          <w:sz w:val="32"/>
-          <w:szCs w:val="32"/>
-        </w:rPr>
-        <w:t>v_sync</w:t>
-      </w:r>
-      <w:proofErr w:type="spellEnd"/>
-      <w:r>
-        <w:rPr>
-          <w:rFonts w:ascii="Verdana" w:hAnsi="Verdana"/>
-          <w:sz w:val="32"/>
-          <w:szCs w:val="32"/>
-        </w:rPr>
-        <w:t xml:space="preserve"> &lt;bool&gt;</w:t>
-      </w:r>
-      <w:r>
-        <w:rPr>
-          <w:rFonts w:ascii="Verdana" w:hAnsi="Verdana"/>
-          <w:sz w:val="32"/>
-          <w:szCs w:val="32"/>
-        </w:rPr>
-        <w:t xml:space="preserve">, </w:t>
-      </w:r>
-      <w:proofErr w:type="spellStart"/>
-      <w:r>
-        <w:rPr>
-          <w:rFonts w:ascii="Verdana" w:hAnsi="Verdana"/>
-          <w:sz w:val="32"/>
-          <w:szCs w:val="32"/>
-        </w:rPr>
-        <w:t>vsync</w:t>
-      </w:r>
-      <w:proofErr w:type="spellEnd"/>
-      <w:r>
-        <w:rPr>
-          <w:rFonts w:ascii="Verdana" w:hAnsi="Verdana"/>
-          <w:sz w:val="32"/>
-          <w:szCs w:val="32"/>
-        </w:rPr>
-        <w:t>&lt;bool&gt;</w:t>
-      </w:r>
-      <w:r>
-        <w:rPr>
-          <w:rFonts w:ascii="Verdana" w:hAnsi="Verdana"/>
-          <w:sz w:val="32"/>
-          <w:szCs w:val="32"/>
-        </w:rPr>
-        <w:t>: whether</w:t>
-      </w:r>
-      <w:r>
-        <w:rPr>
-          <w:rFonts w:ascii="Verdana" w:hAnsi="Verdana"/>
-          <w:sz w:val="32"/>
-          <w:szCs w:val="32"/>
-        </w:rPr>
-        <w:t xml:space="preserve"> or not you</w:t>
+      <w:r>
+        <w:rPr>
+          <w:rFonts w:ascii="Verdana" w:hAnsi="Verdana"/>
+          <w:sz w:val="32"/>
+          <w:szCs w:val="32"/>
+        </w:rPr>
+        <w:t>Game implementation is multithread</w:t>
+      </w:r>
+      <w:r>
+        <w:rPr>
+          <w:rFonts w:ascii="Verdana" w:hAnsi="Verdana"/>
+          <w:sz w:val="32"/>
+          <w:szCs w:val="32"/>
+        </w:rPr>
+        <w:t>ed</w:t>
+      </w:r>
+      <w:r>
+        <w:rPr>
+          <w:rFonts w:ascii="Verdana" w:hAnsi="Verdana"/>
+          <w:sz w:val="32"/>
+          <w:szCs w:val="32"/>
+        </w:rPr>
+        <w:t xml:space="preserve"> (</w:t>
+      </w:r>
+      <w:r>
+        <w:rPr>
+          <w:rFonts w:ascii="Verdana" w:hAnsi="Verdana"/>
+          <w:sz w:val="32"/>
+          <w:szCs w:val="32"/>
+        </w:rPr>
+        <w:t xml:space="preserve">at most time </w:t>
+      </w:r>
+      <w:r>
+        <w:rPr>
+          <w:rFonts w:ascii="Verdana" w:hAnsi="Verdana"/>
+          <w:sz w:val="32"/>
+          <w:szCs w:val="32"/>
+        </w:rPr>
+        <w:t>2</w:t>
       </w:r>
       <w:r>
         <w:rPr>
@@ -1011,291 +1216,6 @@
         </w:rPr>
         <w:t xml:space="preserve"> </w:t>
       </w:r>
-      <w:proofErr w:type="spellStart"/>
-      <w:r>
-        <w:rPr>
-          <w:rFonts w:ascii="Verdana" w:hAnsi="Verdana"/>
-          <w:sz w:val="32"/>
-          <w:szCs w:val="32"/>
-        </w:rPr>
-        <w:t>wanna</w:t>
-      </w:r>
-      <w:proofErr w:type="spellEnd"/>
-      <w:r>
-        <w:rPr>
-          <w:rFonts w:ascii="Verdana" w:hAnsi="Verdana"/>
-          <w:sz w:val="32"/>
-          <w:szCs w:val="32"/>
-        </w:rPr>
-        <w:t xml:space="preserve"> </w:t>
-      </w:r>
-      <w:proofErr w:type="spellStart"/>
-      <w:r>
-        <w:rPr>
-          <w:rFonts w:ascii="Verdana" w:hAnsi="Verdana"/>
-          <w:sz w:val="32"/>
-          <w:szCs w:val="32"/>
-        </w:rPr>
-        <w:t>vsync</w:t>
-      </w:r>
-      <w:proofErr w:type="spellEnd"/>
-      <w:r>
-        <w:rPr>
-          <w:rFonts w:ascii="Verdana" w:hAnsi="Verdana"/>
-          <w:sz w:val="32"/>
-          <w:szCs w:val="32"/>
-        </w:rPr>
-        <w:t xml:space="preserve"> on or off</w:t>
-      </w:r>
-      <w:r>
-        <w:rPr>
-          <w:rFonts w:ascii="Verdana" w:hAnsi="Verdana"/>
-          <w:sz w:val="32"/>
-          <w:szCs w:val="32"/>
-        </w:rPr>
-        <w:t>.</w:t>
-      </w:r>
-      <w:r>
-        <w:rPr>
-          <w:rFonts w:ascii="Verdana" w:hAnsi="Verdana"/>
-          <w:sz w:val="32"/>
-          <w:szCs w:val="32"/>
-        </w:rPr>
-        <w:t xml:space="preserve"> If it’s on (you’ve set it to true) your fps is capped to your monitor refresh rate.</w:t>
-      </w:r>
-    </w:p>
-    <w:p>
-      <w:pPr>
-        <w:pStyle w:val="NoSpacing"/>
-        <w:numPr>
-          <w:ilvl w:val="0"/>
-          <w:numId w:val="19"/>
-        </w:numPr>
-        <w:rPr>
-          <w:rFonts w:ascii="Verdana" w:hAnsi="Verdana"/>
-          <w:sz w:val="32"/>
-          <w:szCs w:val="32"/>
-        </w:rPr>
-      </w:pPr>
-      <w:proofErr w:type="spellStart"/>
-      <w:r>
-        <w:rPr>
-          <w:rFonts w:ascii="Verdana" w:hAnsi="Verdana"/>
-          <w:sz w:val="32"/>
-          <w:szCs w:val="32"/>
-        </w:rPr>
-        <w:t>water_efects</w:t>
-      </w:r>
-      <w:proofErr w:type="spellEnd"/>
-      <w:r>
-        <w:rPr>
-          <w:rFonts w:ascii="Verdana" w:hAnsi="Verdana"/>
-          <w:sz w:val="32"/>
-          <w:szCs w:val="32"/>
-        </w:rPr>
-        <w:t xml:space="preserve"> &lt;bool&gt;: enables (true) or disables (false) water effects (such as reflection).</w:t>
-      </w:r>
-    </w:p>
-    <w:p>
-      <w:pPr>
-        <w:pStyle w:val="NoSpacing"/>
-        <w:numPr>
-          <w:ilvl w:val="0"/>
-          <w:numId w:val="19"/>
-        </w:numPr>
-        <w:rPr>
-          <w:rFonts w:ascii="Verdana" w:hAnsi="Verdana"/>
-          <w:sz w:val="32"/>
-          <w:szCs w:val="32"/>
-        </w:rPr>
-      </w:pPr>
-      <w:proofErr w:type="spellStart"/>
-      <w:r>
-        <w:rPr>
-          <w:rFonts w:ascii="Verdana" w:hAnsi="Verdana"/>
-          <w:sz w:val="32"/>
-          <w:szCs w:val="32"/>
-        </w:rPr>
-        <w:t>mouse_sensitivity</w:t>
-      </w:r>
-      <w:proofErr w:type="spellEnd"/>
-      <w:r>
-        <w:rPr>
-          <w:rFonts w:ascii="Verdana" w:hAnsi="Verdana"/>
-          <w:sz w:val="32"/>
-          <w:szCs w:val="32"/>
-        </w:rPr>
-        <w:t>&lt;</w:t>
-      </w:r>
-      <w:proofErr w:type="spellStart"/>
-      <w:r>
-        <w:rPr>
-          <w:rFonts w:ascii="Verdana" w:hAnsi="Verdana"/>
-          <w:sz w:val="32"/>
-          <w:szCs w:val="32"/>
-        </w:rPr>
-        <w:t>num</w:t>
-      </w:r>
-      <w:proofErr w:type="spellEnd"/>
-      <w:r>
-        <w:rPr>
-          <w:rFonts w:ascii="Verdana" w:hAnsi="Verdana"/>
-          <w:sz w:val="32"/>
-          <w:szCs w:val="32"/>
-        </w:rPr>
-        <w:t xml:space="preserve">&gt;, </w:t>
-      </w:r>
-      <w:proofErr w:type="spellStart"/>
-      <w:r>
-        <w:rPr>
-          <w:rFonts w:ascii="Verdana" w:hAnsi="Verdana"/>
-          <w:sz w:val="32"/>
-          <w:szCs w:val="32"/>
-        </w:rPr>
-        <w:t>msens</w:t>
-      </w:r>
-      <w:proofErr w:type="spellEnd"/>
-      <w:r>
-        <w:rPr>
-          <w:rFonts w:ascii="Verdana" w:hAnsi="Verdana"/>
-          <w:sz w:val="32"/>
-          <w:szCs w:val="32"/>
-        </w:rPr>
-        <w:t xml:space="preserve"> &lt;</w:t>
-      </w:r>
-      <w:proofErr w:type="spellStart"/>
-      <w:r>
-        <w:rPr>
-          <w:rFonts w:ascii="Verdana" w:hAnsi="Verdana"/>
-          <w:sz w:val="32"/>
-          <w:szCs w:val="32"/>
-        </w:rPr>
-        <w:t>num</w:t>
-      </w:r>
-      <w:proofErr w:type="spellEnd"/>
-      <w:r>
-        <w:rPr>
-          <w:rFonts w:ascii="Verdana" w:hAnsi="Verdana"/>
-          <w:sz w:val="32"/>
-          <w:szCs w:val="32"/>
-        </w:rPr>
-        <w:t>&gt;: sets mouse sensitivity to this value.</w:t>
-      </w:r>
-    </w:p>
-    <w:p>
-      <w:pPr>
-        <w:pStyle w:val="NoSpacing"/>
-        <w:ind w:left="360"/>
-        <w:rPr>
-          <w:rFonts w:ascii="Verdana" w:hAnsi="Verdana"/>
-          <w:sz w:val="32"/>
-          <w:szCs w:val="32"/>
-        </w:rPr>
-      </w:pPr>
-    </w:p>
-    <w:p>
-      <w:pPr>
-        <w:pStyle w:val="NoSpacing"/>
-        <w:rPr>
-          <w:rFonts w:ascii="Verdana" w:hAnsi="Verdana"/>
-          <w:b/>
-          <w:sz w:val="48"/>
-          <w:szCs w:val="32"/>
-        </w:rPr>
-      </w:pPr>
-      <w:r>
-        <w:rPr>
-          <w:rFonts w:ascii="Verdana" w:hAnsi="Verdana"/>
-          <w:b/>
-          <w:sz w:val="48"/>
-          <w:szCs w:val="32"/>
-        </w:rPr>
-        <w:t>Notes:</w:t>
-      </w:r>
-    </w:p>
-    <w:p>
-      <w:pPr>
-        <w:pStyle w:val="NoSpacing"/>
-        <w:numPr>
-          <w:ilvl w:val="0"/>
-          <w:numId w:val="19"/>
-        </w:numPr>
-        <w:rPr>
-          <w:rFonts w:ascii="Verdana" w:hAnsi="Verdana"/>
-          <w:sz w:val="32"/>
-          <w:szCs w:val="32"/>
-        </w:rPr>
-      </w:pPr>
-      <w:r>
-        <w:rPr>
-          <w:rFonts w:ascii="Verdana" w:hAnsi="Verdana"/>
-          <w:sz w:val="32"/>
-          <w:szCs w:val="32"/>
-        </w:rPr>
-        <w:t>Game uses LWJGL 3.2.3 since v 02 (BELARUS).</w:t>
-      </w:r>
-    </w:p>
-    <w:p>
-      <w:pPr>
-        <w:pStyle w:val="NoSpacing"/>
-        <w:numPr>
-          <w:ilvl w:val="0"/>
-          <w:numId w:val="19"/>
-        </w:numPr>
-        <w:rPr>
-          <w:rFonts w:ascii="Verdana" w:hAnsi="Verdana"/>
-          <w:sz w:val="32"/>
-          <w:szCs w:val="32"/>
-        </w:rPr>
-      </w:pPr>
-      <w:r>
-        <w:rPr>
-          <w:rFonts w:ascii="Verdana" w:hAnsi="Verdana"/>
-          <w:sz w:val="32"/>
-          <w:szCs w:val="32"/>
-        </w:rPr>
-        <w:t>Game implementation is multithread</w:t>
-      </w:r>
-      <w:r>
-        <w:rPr>
-          <w:rFonts w:ascii="Verdana" w:hAnsi="Verdana"/>
-          <w:sz w:val="32"/>
-          <w:szCs w:val="32"/>
-        </w:rPr>
-        <w:t>ed</w:t>
-      </w:r>
-      <w:r>
-        <w:rPr>
-          <w:rFonts w:ascii="Verdana" w:hAnsi="Verdana"/>
-          <w:sz w:val="32"/>
-          <w:szCs w:val="32"/>
-        </w:rPr>
-        <w:t xml:space="preserve"> (</w:t>
-      </w:r>
-      <w:r>
-        <w:rPr>
-          <w:rFonts w:ascii="Verdana" w:hAnsi="Verdana"/>
-          <w:sz w:val="32"/>
-          <w:szCs w:val="32"/>
-        </w:rPr>
-        <w:t xml:space="preserve">at most time </w:t>
-      </w:r>
-      <w:r>
-        <w:rPr>
-          <w:rFonts w:ascii="Verdana" w:hAnsi="Verdana"/>
-          <w:sz w:val="32"/>
-          <w:szCs w:val="32"/>
-        </w:rPr>
-        <w:t>2</w:t>
-      </w:r>
-      <w:r>
-        <w:rPr>
-          <w:rFonts w:ascii="Verdana" w:hAnsi="Verdana"/>
-          <w:sz w:val="32"/>
-          <w:szCs w:val="32"/>
-        </w:rPr>
-        <w:t xml:space="preserve"> </w:t>
-      </w:r>
       <w:r>
         <w:rPr>
           <w:rFonts w:ascii="Verdana" w:hAnsi="Verdana"/>
@@ -1328,8 +1248,6 @@
         </w:rPr>
         <w:t xml:space="preserve"> or when loading or saving level is in progress</w:t>
       </w:r>
-      <w:bookmarkStart w:id="0" w:name="_GoBack"/>
-      <w:bookmarkEnd w:id="0"/>
       <w:r>
         <w:rPr>
           <w:rFonts w:ascii="Verdana" w:hAnsi="Verdana"/>
@@ -4437,7 +4355,7 @@
 </file>
 
 <file path=customXml/itemProps1.xml><?xml version="1.0" encoding="utf-8"?>
-<ds:datastoreItem xmlns:ds="http://schemas.openxmlformats.org/officeDocument/2006/customXml" ds:itemID="{4CC6368D-BA2F-4FD9-9AC3-ECF898C3A11D}">
+<ds:datastoreItem xmlns:ds="http://schemas.openxmlformats.org/officeDocument/2006/customXml" ds:itemID="{3D37B705-3424-40D7-A8C9-0083554D10C8}">
   <ds:schemaRefs>
     <ds:schemaRef ds:uri="http://schemas.openxmlformats.org/officeDocument/2006/bibliography"/>
   </ds:schemaRefs>

</xml_diff>

<commit_message>
Debug option is now included in the ini. For Version 13 MONGOLS U02!
</commit_message>
<xml_diff>
--- a/changelog.docx
+++ b/changelog.docx
@@ -62,8 +62,6 @@
         </w:rPr>
         <w:t>MONGOLS</w:t>
       </w:r>
-      <w:bookmarkStart w:id="0" w:name="_GoBack"/>
-      <w:bookmarkEnd w:id="0"/>
       <w:r>
         <w:rPr>
           <w:rFonts w:ascii="Verdana" w:hAnsi="Verdana"/>
@@ -277,6 +275,44 @@
           <w:szCs w:val="32"/>
         </w:rPr>
         <w:t xml:space="preserve"> file).</w:t>
+      </w:r>
+      <w:r>
+        <w:rPr>
+          <w:rFonts w:ascii="Verdana" w:hAnsi="Verdana"/>
+          <w:sz w:val="32"/>
+          <w:szCs w:val="32"/>
+        </w:rPr>
+        <w:t xml:space="preserve"> It includes writing log into the file.</w:t>
+      </w:r>
+    </w:p>
+    <w:p>
+      <w:pPr>
+        <w:pStyle w:val="NoSpacing"/>
+        <w:ind w:left="360"/>
+        <w:rPr>
+          <w:rFonts w:ascii="Verdana" w:hAnsi="Verdana"/>
+          <w:color w:val="00B050"/>
+          <w:sz w:val="32"/>
+          <w:szCs w:val="32"/>
+        </w:rPr>
+      </w:pPr>
+      <w:r>
+        <w:rPr>
+          <w:rFonts w:ascii="Verdana" w:hAnsi="Verdana"/>
+          <w:sz w:val="32"/>
+          <w:szCs w:val="32"/>
+        </w:rPr>
+        <w:t>File is named according to the</w:t>
+      </w:r>
+      <w:bookmarkStart w:id="0" w:name="_GoBack"/>
+      <w:bookmarkEnd w:id="0"/>
+      <w:r>
+        <w:rPr>
+          <w:rFonts w:ascii="Verdana" w:hAnsi="Verdana"/>
+          <w:sz w:val="32"/>
+          <w:szCs w:val="32"/>
+        </w:rPr>
+        <w:t xml:space="preserve"> current date and time.</w:t>
       </w:r>
     </w:p>
     <w:p>
@@ -4355,7 +4391,7 @@
 </file>
 
 <file path=customXml/itemProps1.xml><?xml version="1.0" encoding="utf-8"?>
-<ds:datastoreItem xmlns:ds="http://schemas.openxmlformats.org/officeDocument/2006/customXml" ds:itemID="{3D37B705-3424-40D7-A8C9-0083554D10C8}">
+<ds:datastoreItem xmlns:ds="http://schemas.openxmlformats.org/officeDocument/2006/customXml" ds:itemID="{D287FC7B-418E-43E8-A3A6-BD36081047F6}">
   <ds:schemaRefs>
     <ds:schemaRef ds:uri="http://schemas.openxmlformats.org/officeDocument/2006/bibliography"/>
   </ds:schemaRefs>

</xml_diff>

<commit_message>
Fixes for Music volume. For Version 13 MONGOLS U05!
</commit_message>
<xml_diff>
--- a/changelog.docx
+++ b/changelog.docx
@@ -302,8 +302,73 @@
           <w:sz w:val="32"/>
           <w:szCs w:val="32"/>
         </w:rPr>
-        <w:t>File is named according to the</w:t>
-      </w:r>
+        <w:t>File is named according to the current date and time.</w:t>
+      </w:r>
+    </w:p>
+    <w:p>
+      <w:pPr>
+        <w:pStyle w:val="NoSpacing"/>
+        <w:ind w:left="360"/>
+        <w:rPr>
+          <w:rFonts w:ascii="Verdana" w:hAnsi="Verdana"/>
+          <w:color w:val="00B050"/>
+          <w:sz w:val="32"/>
+          <w:szCs w:val="32"/>
+        </w:rPr>
+      </w:pPr>
+    </w:p>
+    <w:p>
+      <w:pPr>
+        <w:pStyle w:val="NoSpacing"/>
+        <w:rPr>
+          <w:rFonts w:ascii="Verdana" w:hAnsi="Verdana"/>
+          <w:b/>
+          <w:color w:val="FF0000"/>
+          <w:sz w:val="48"/>
+        </w:rPr>
+      </w:pPr>
+      <w:r>
+        <w:rPr>
+          <w:rFonts w:ascii="Verdana" w:hAnsi="Verdana"/>
+          <w:b/>
+          <w:color w:val="FF0000"/>
+          <w:sz w:val="48"/>
+        </w:rPr>
+        <w:t>F</w:t>
+      </w:r>
+      <w:r>
+        <w:rPr>
+          <w:rFonts w:ascii="Verdana" w:hAnsi="Verdana"/>
+          <w:b/>
+          <w:color w:val="FF0000"/>
+          <w:sz w:val="48"/>
+        </w:rPr>
+        <w:t>IXE</w:t>
+      </w:r>
+      <w:r>
+        <w:rPr>
+          <w:rFonts w:ascii="Verdana" w:hAnsi="Verdana"/>
+          <w:b/>
+          <w:color w:val="FF0000"/>
+          <w:sz w:val="48"/>
+        </w:rPr>
+        <w:t>S:</w:t>
+      </w:r>
+    </w:p>
+    <w:p>
+      <w:pPr>
+        <w:pStyle w:val="NoSpacing"/>
+        <w:numPr>
+          <w:ilvl w:val="0"/>
+          <w:numId w:val="19"/>
+        </w:numPr>
+        <w:rPr>
+          <w:rFonts w:ascii="Verdana" w:hAnsi="Verdana"/>
+          <w:color w:val="00B050"/>
+          <w:sz w:val="32"/>
+          <w:szCs w:val="32"/>
+        </w:rPr>
+      </w:pPr>
       <w:bookmarkStart w:id="0" w:name="_GoBack"/>
       <w:bookmarkEnd w:id="0"/>
       <w:r>
@@ -312,13 +377,41 @@
           <w:sz w:val="32"/>
           <w:szCs w:val="32"/>
         </w:rPr>
-        <w:t xml:space="preserve"> current date and time.</w:t>
-      </w:r>
-    </w:p>
-    <w:p>
-      <w:pPr>
-        <w:pStyle w:val="NoSpacing"/>
-        <w:ind w:left="360"/>
+        <w:t xml:space="preserve">Reading water effects from the </w:t>
+      </w:r>
+      <w:proofErr w:type="spellStart"/>
+      <w:r>
+        <w:rPr>
+          <w:rFonts w:ascii="Verdana" w:hAnsi="Verdana"/>
+          <w:sz w:val="32"/>
+          <w:szCs w:val="32"/>
+        </w:rPr>
+        <w:t>ini</w:t>
+      </w:r>
+      <w:proofErr w:type="spellEnd"/>
+      <w:r>
+        <w:rPr>
+          <w:rFonts w:ascii="Verdana" w:hAnsi="Verdana"/>
+          <w:sz w:val="32"/>
+          <w:szCs w:val="32"/>
+        </w:rPr>
+        <w:t>.</w:t>
+      </w:r>
+    </w:p>
+    <w:p>
+      <w:pPr>
+        <w:pStyle w:val="NoSpacing"/>
+        <w:rPr>
+          <w:rFonts w:ascii="Verdana" w:hAnsi="Verdana"/>
+          <w:b/>
+          <w:color w:val="FF0000"/>
+          <w:sz w:val="48"/>
+        </w:rPr>
+      </w:pPr>
+    </w:p>
+    <w:p>
+      <w:pPr>
+        <w:pStyle w:val="NoSpacing"/>
         <w:rPr>
           <w:rFonts w:ascii="Verdana" w:hAnsi="Verdana"/>
           <w:color w:val="00B050"/>
@@ -330,19 +423,6 @@
     <w:p>
       <w:pPr>
         <w:pStyle w:val="NoSpacing"/>
-        <w:ind w:left="360"/>
-        <w:rPr>
-          <w:rFonts w:ascii="Verdana" w:hAnsi="Verdana"/>
-          <w:color w:val="00B050"/>
-          <w:sz w:val="32"/>
-          <w:szCs w:val="32"/>
-        </w:rPr>
-      </w:pPr>
-    </w:p>
-    <w:p>
-      <w:pPr>
-        <w:pStyle w:val="NoSpacing"/>
-        <w:ind w:left="360"/>
         <w:rPr>
           <w:rFonts w:ascii="Verdana" w:hAnsi="Verdana"/>
           <w:color w:val="00B050"/>
@@ -590,7 +670,6 @@
           <w:b/>
           <w:sz w:val="48"/>
         </w:rPr>
-        <w:lastRenderedPageBreak/>
         <w:t>Available commands:</w:t>
       </w:r>
     </w:p>
@@ -4391,7 +4470,7 @@
 </file>
 
 <file path=customXml/itemProps1.xml><?xml version="1.0" encoding="utf-8"?>
-<ds:datastoreItem xmlns:ds="http://schemas.openxmlformats.org/officeDocument/2006/customXml" ds:itemID="{D287FC7B-418E-43E8-A3A6-BD36081047F6}">
+<ds:datastoreItem xmlns:ds="http://schemas.openxmlformats.org/officeDocument/2006/customXml" ds:itemID="{EB3FCBDA-5BD4-4D42-AC25-4C40F0830A62}">
   <ds:schemaRefs>
     <ds:schemaRef ds:uri="http://schemas.openxmlformats.org/officeDocument/2006/bibliography"/>
   </ds:schemaRefs>

</xml_diff>

<commit_message>
Updating changelog. For Version 13 MONGOLS U05!
</commit_message>
<xml_diff>
--- a/changelog.docx
+++ b/changelog.docx
@@ -334,25 +334,7 @@
           <w:color w:val="FF0000"/>
           <w:sz w:val="48"/>
         </w:rPr>
-        <w:t>F</w:t>
-      </w:r>
-      <w:r>
-        <w:rPr>
-          <w:rFonts w:ascii="Verdana" w:hAnsi="Verdana"/>
-          <w:b/>
-          <w:color w:val="FF0000"/>
-          <w:sz w:val="48"/>
-        </w:rPr>
-        <w:t>IXE</w:t>
-      </w:r>
-      <w:r>
-        <w:rPr>
-          <w:rFonts w:ascii="Verdana" w:hAnsi="Verdana"/>
-          <w:b/>
-          <w:color w:val="FF0000"/>
-          <w:sz w:val="48"/>
-        </w:rPr>
-        <w:t>S:</w:t>
+        <w:t>FIXES:</w:t>
       </w:r>
     </w:p>
     <w:p>
@@ -369,8 +351,6 @@
           <w:szCs w:val="32"/>
         </w:rPr>
       </w:pPr>
-      <w:bookmarkStart w:id="0" w:name="_GoBack"/>
-      <w:bookmarkEnd w:id="0"/>
       <w:r>
         <w:rPr>
           <w:rFonts w:ascii="Verdana" w:hAnsi="Verdana"/>
@@ -397,6 +377,62 @@
         </w:rPr>
         <w:t>.</w:t>
       </w:r>
+    </w:p>
+    <w:p>
+      <w:pPr>
+        <w:pStyle w:val="NoSpacing"/>
+        <w:numPr>
+          <w:ilvl w:val="0"/>
+          <w:numId w:val="19"/>
+        </w:numPr>
+        <w:rPr>
+          <w:rFonts w:ascii="Verdana" w:hAnsi="Verdana"/>
+          <w:color w:val="00B050"/>
+          <w:sz w:val="32"/>
+          <w:szCs w:val="32"/>
+        </w:rPr>
+      </w:pPr>
+      <w:r>
+        <w:rPr>
+          <w:rFonts w:ascii="Verdana" w:hAnsi="Verdana"/>
+          <w:sz w:val="32"/>
+          <w:szCs w:val="32"/>
+        </w:rPr>
+        <w:t>Random level generator generates blocks correctly (same number that was requested).</w:t>
+      </w:r>
+    </w:p>
+    <w:p>
+      <w:pPr>
+        <w:pStyle w:val="NoSpacing"/>
+        <w:numPr>
+          <w:ilvl w:val="0"/>
+          <w:numId w:val="19"/>
+        </w:numPr>
+        <w:rPr>
+          <w:rFonts w:ascii="Verdana" w:hAnsi="Verdana"/>
+          <w:color w:val="00B050"/>
+          <w:sz w:val="32"/>
+          <w:szCs w:val="32"/>
+        </w:rPr>
+      </w:pPr>
+      <w:r>
+        <w:rPr>
+          <w:rFonts w:ascii="Verdana" w:hAnsi="Verdana"/>
+          <w:sz w:val="32"/>
+          <w:szCs w:val="32"/>
+        </w:rPr>
+        <w:t>Loading randmax.dat doesn’t result in “loading level failed!</w:t>
+      </w:r>
+      <w:proofErr w:type="gramStart"/>
+      <w:r>
+        <w:rPr>
+          <w:rFonts w:ascii="Verdana" w:hAnsi="Verdana"/>
+          <w:sz w:val="32"/>
+          <w:szCs w:val="32"/>
+        </w:rPr>
+        <w:t>”.</w:t>
+      </w:r>
+      <w:proofErr w:type="gramEnd"/>
     </w:p>
     <w:p>
       <w:pPr>
@@ -542,7 +578,6 @@
     <w:p>
       <w:pPr>
         <w:pStyle w:val="NoSpacing"/>
-        <w:ind w:left="360"/>
         <w:rPr>
           <w:rFonts w:ascii="Verdana" w:hAnsi="Verdana"/>
           <w:color w:val="00B050"/>
@@ -554,110 +589,16 @@
     <w:p>
       <w:pPr>
         <w:pStyle w:val="NoSpacing"/>
-        <w:ind w:left="360"/>
-        <w:rPr>
-          <w:rFonts w:ascii="Verdana" w:hAnsi="Verdana"/>
-          <w:color w:val="00B050"/>
-          <w:sz w:val="32"/>
-          <w:szCs w:val="32"/>
-        </w:rPr>
-      </w:pPr>
+        <w:rPr>
+          <w:rFonts w:ascii="Verdana" w:hAnsi="Verdana"/>
+        </w:rPr>
+      </w:pPr>
+      <w:bookmarkStart w:id="0" w:name="_GoBack"/>
+      <w:bookmarkEnd w:id="0"/>
     </w:p>
     <w:p>
       <w:pPr>
         <w:pStyle w:val="NoSpacing"/>
-        <w:ind w:left="360"/>
-        <w:rPr>
-          <w:rFonts w:ascii="Verdana" w:hAnsi="Verdana"/>
-          <w:color w:val="00B050"/>
-          <w:sz w:val="32"/>
-          <w:szCs w:val="32"/>
-        </w:rPr>
-      </w:pPr>
-    </w:p>
-    <w:p>
-      <w:pPr>
-        <w:pStyle w:val="NoSpacing"/>
-        <w:ind w:left="360"/>
-        <w:rPr>
-          <w:rFonts w:ascii="Verdana" w:hAnsi="Verdana"/>
-          <w:color w:val="00B050"/>
-          <w:sz w:val="32"/>
-          <w:szCs w:val="32"/>
-        </w:rPr>
-      </w:pPr>
-    </w:p>
-    <w:p>
-      <w:pPr>
-        <w:pStyle w:val="NoSpacing"/>
-        <w:ind w:left="360"/>
-        <w:rPr>
-          <w:rFonts w:ascii="Verdana" w:hAnsi="Verdana"/>
-          <w:color w:val="00B050"/>
-          <w:sz w:val="32"/>
-          <w:szCs w:val="32"/>
-        </w:rPr>
-      </w:pPr>
-    </w:p>
-    <w:p>
-      <w:pPr>
-        <w:pStyle w:val="NoSpacing"/>
-        <w:ind w:left="360"/>
-        <w:rPr>
-          <w:rFonts w:ascii="Verdana" w:hAnsi="Verdana"/>
-          <w:color w:val="00B050"/>
-          <w:sz w:val="32"/>
-          <w:szCs w:val="32"/>
-        </w:rPr>
-      </w:pPr>
-    </w:p>
-    <w:p>
-      <w:pPr>
-        <w:pStyle w:val="NoSpacing"/>
-        <w:ind w:left="360"/>
-        <w:rPr>
-          <w:rFonts w:ascii="Verdana" w:hAnsi="Verdana"/>
-          <w:color w:val="00B050"/>
-          <w:sz w:val="32"/>
-          <w:szCs w:val="32"/>
-        </w:rPr>
-      </w:pPr>
-    </w:p>
-    <w:p>
-      <w:pPr>
-        <w:pStyle w:val="NoSpacing"/>
-        <w:ind w:left="360"/>
-        <w:rPr>
-          <w:rFonts w:ascii="Verdana" w:hAnsi="Verdana"/>
-          <w:color w:val="00B050"/>
-          <w:sz w:val="32"/>
-          <w:szCs w:val="32"/>
-        </w:rPr>
-      </w:pPr>
-    </w:p>
-    <w:p>
-      <w:pPr>
-        <w:pStyle w:val="NoSpacing"/>
-        <w:ind w:left="360"/>
-        <w:rPr>
-          <w:rFonts w:ascii="Verdana" w:hAnsi="Verdana"/>
-          <w:color w:val="00B050"/>
-          <w:sz w:val="32"/>
-          <w:szCs w:val="32"/>
-        </w:rPr>
-      </w:pPr>
-    </w:p>
-    <w:p>
-      <w:pPr>
-        <w:pStyle w:val="NoSpacing"/>
-        <w:rPr>
-          <w:rFonts w:ascii="Verdana" w:hAnsi="Verdana"/>
-        </w:rPr>
-      </w:pPr>
-    </w:p>
-    <w:p>
-      <w:pPr>
-        <w:pStyle w:val="NoSpacing"/>
         <w:rPr>
           <w:rFonts w:ascii="Verdana" w:hAnsi="Verdana"/>
           <w:b/>
@@ -670,6 +611,7 @@
           <w:b/>
           <w:sz w:val="48"/>
         </w:rPr>
+        <w:lastRenderedPageBreak/>
         <w:t>Available commands:</w:t>
       </w:r>
     </w:p>
@@ -4470,7 +4412,7 @@
 </file>
 
 <file path=customXml/itemProps1.xml><?xml version="1.0" encoding="utf-8"?>
-<ds:datastoreItem xmlns:ds="http://schemas.openxmlformats.org/officeDocument/2006/customXml" ds:itemID="{EB3FCBDA-5BD4-4D42-AC25-4C40F0830A62}">
+<ds:datastoreItem xmlns:ds="http://schemas.openxmlformats.org/officeDocument/2006/customXml" ds:itemID="{CBC32EF3-E92E-4BD5-9692-ED9B723FA2C6}">
   <ds:schemaRefs>
     <ds:schemaRef ds:uri="http://schemas.openxmlformats.org/officeDocument/2006/bibliography"/>
   </ds:schemaRefs>

</xml_diff>

<commit_message>
Hotfix for options menu bug for water effects. For V14 NYTROGEN U02!
</commit_message>
<xml_diff>
--- a/changelog.docx
+++ b/changelog.docx
@@ -44,7 +44,7 @@
           <w:b/>
           <w:sz w:val="48"/>
         </w:rPr>
-        <w:t>3</w:t>
+        <w:t>4</w:t>
       </w:r>
       <w:r>
         <w:rPr>
@@ -60,7 +60,7 @@
           <w:b/>
           <w:sz w:val="48"/>
         </w:rPr>
-        <w:t>MONGOLS</w:t>
+        <w:t>NYTROGEN</w:t>
       </w:r>
       <w:r>
         <w:rPr>
@@ -225,7 +225,15 @@
           <w:sz w:val="32"/>
           <w:szCs w:val="32"/>
         </w:rPr>
-        <w:t>Music and sounds can be played from the game</w:t>
+        <w:t>Both m</w:t>
+      </w:r>
+      <w:r>
+        <w:rPr>
+          <w:rFonts w:ascii="Verdana" w:hAnsi="Verdana"/>
+          <w:sz w:val="32"/>
+          <w:szCs w:val="32"/>
+        </w:rPr>
+        <w:t>usic and sounds can be played from the game</w:t>
       </w:r>
       <w:r>
         <w:rPr>
@@ -284,6 +292,32 @@
         </w:rPr>
         <w:t xml:space="preserve"> It includes writing log into the file.</w:t>
       </w:r>
+      <w:r>
+        <w:rPr>
+          <w:rFonts w:ascii="Verdana" w:hAnsi="Verdana"/>
+          <w:sz w:val="32"/>
+          <w:szCs w:val="32"/>
+        </w:rPr>
+        <w:t xml:space="preserve"> [</w:t>
+      </w:r>
+      <w:proofErr w:type="spellStart"/>
+      <w:r>
+        <w:rPr>
+          <w:rFonts w:ascii="Verdana" w:hAnsi="Verdana"/>
+          <w:sz w:val="32"/>
+          <w:szCs w:val="32"/>
+        </w:rPr>
+        <w:t>JSomnia</w:t>
+      </w:r>
+      <w:proofErr w:type="spellEnd"/>
+      <w:r>
+        <w:rPr>
+          <w:rFonts w:ascii="Verdana" w:hAnsi="Verdana"/>
+          <w:sz w:val="32"/>
+          <w:szCs w:val="32"/>
+        </w:rPr>
+        <w:t>]</w:t>
+      </w:r>
     </w:p>
     <w:p>
       <w:pPr>
@@ -437,17 +471,10 @@
     <w:p>
       <w:pPr>
         <w:pStyle w:val="NoSpacing"/>
-        <w:rPr>
-          <w:rFonts w:ascii="Verdana" w:hAnsi="Verdana"/>
-          <w:b/>
-          <w:color w:val="FF0000"/>
-          <w:sz w:val="48"/>
-        </w:rPr>
-      </w:pPr>
-    </w:p>
-    <w:p>
-      <w:pPr>
-        <w:pStyle w:val="NoSpacing"/>
+        <w:numPr>
+          <w:ilvl w:val="0"/>
+          <w:numId w:val="19"/>
+        </w:numPr>
         <w:rPr>
           <w:rFonts w:ascii="Verdana" w:hAnsi="Verdana"/>
           <w:color w:val="00B050"/>
@@ -455,197 +482,38 @@
           <w:szCs w:val="32"/>
         </w:rPr>
       </w:pPr>
-    </w:p>
-    <w:p>
-      <w:pPr>
-        <w:pStyle w:val="NoSpacing"/>
-        <w:rPr>
-          <w:rFonts w:ascii="Verdana" w:hAnsi="Verdana"/>
-          <w:color w:val="00B050"/>
-          <w:sz w:val="32"/>
-          <w:szCs w:val="32"/>
-        </w:rPr>
-      </w:pPr>
-    </w:p>
-    <w:p>
-      <w:pPr>
-        <w:pStyle w:val="NoSpacing"/>
-        <w:ind w:left="360"/>
-        <w:rPr>
-          <w:rFonts w:ascii="Verdana" w:hAnsi="Verdana"/>
-          <w:color w:val="00B050"/>
-          <w:sz w:val="32"/>
-          <w:szCs w:val="32"/>
-        </w:rPr>
-      </w:pPr>
-    </w:p>
-    <w:p>
-      <w:pPr>
-        <w:pStyle w:val="NoSpacing"/>
-        <w:ind w:left="360"/>
-        <w:rPr>
-          <w:rFonts w:ascii="Verdana" w:hAnsi="Verdana"/>
-          <w:color w:val="00B050"/>
-          <w:sz w:val="32"/>
-          <w:szCs w:val="32"/>
-        </w:rPr>
-      </w:pPr>
-    </w:p>
-    <w:p>
-      <w:pPr>
-        <w:pStyle w:val="NoSpacing"/>
-        <w:ind w:left="360"/>
-        <w:rPr>
-          <w:rFonts w:ascii="Verdana" w:hAnsi="Verdana"/>
-          <w:color w:val="00B050"/>
-          <w:sz w:val="32"/>
-          <w:szCs w:val="32"/>
-        </w:rPr>
-      </w:pPr>
-    </w:p>
-    <w:p>
-      <w:pPr>
-        <w:pStyle w:val="NoSpacing"/>
-        <w:ind w:left="360"/>
-        <w:rPr>
-          <w:rFonts w:ascii="Verdana" w:hAnsi="Verdana"/>
-          <w:color w:val="00B050"/>
-          <w:sz w:val="32"/>
-          <w:szCs w:val="32"/>
-        </w:rPr>
-      </w:pPr>
-    </w:p>
-    <w:p>
-      <w:pPr>
-        <w:pStyle w:val="NoSpacing"/>
-        <w:ind w:left="360"/>
-        <w:rPr>
-          <w:rFonts w:ascii="Verdana" w:hAnsi="Verdana"/>
-          <w:color w:val="00B050"/>
-          <w:sz w:val="32"/>
-          <w:szCs w:val="32"/>
-        </w:rPr>
-      </w:pPr>
-    </w:p>
-    <w:p>
-      <w:pPr>
-        <w:pStyle w:val="NoSpacing"/>
-        <w:ind w:left="360"/>
-        <w:rPr>
-          <w:rFonts w:ascii="Verdana" w:hAnsi="Verdana"/>
-          <w:color w:val="00B050"/>
-          <w:sz w:val="32"/>
-          <w:szCs w:val="32"/>
-        </w:rPr>
-      </w:pPr>
-    </w:p>
-    <w:p>
-      <w:pPr>
-        <w:pStyle w:val="NoSpacing"/>
-        <w:ind w:left="360"/>
-        <w:rPr>
-          <w:rFonts w:ascii="Verdana" w:hAnsi="Verdana"/>
-          <w:color w:val="00B050"/>
-          <w:sz w:val="32"/>
-          <w:szCs w:val="32"/>
-        </w:rPr>
-      </w:pPr>
-    </w:p>
-    <w:p>
-      <w:pPr>
-        <w:pStyle w:val="NoSpacing"/>
-        <w:ind w:left="360"/>
-        <w:rPr>
-          <w:rFonts w:ascii="Verdana" w:hAnsi="Verdana"/>
-          <w:color w:val="00B050"/>
-          <w:sz w:val="32"/>
-          <w:szCs w:val="32"/>
-        </w:rPr>
-      </w:pPr>
-    </w:p>
-    <w:p>
-      <w:pPr>
-        <w:pStyle w:val="NoSpacing"/>
-        <w:ind w:left="360"/>
-        <w:rPr>
-          <w:rFonts w:ascii="Verdana" w:hAnsi="Verdana"/>
-          <w:color w:val="00B050"/>
-          <w:sz w:val="32"/>
-          <w:szCs w:val="32"/>
-        </w:rPr>
-      </w:pPr>
-    </w:p>
-    <w:p>
-      <w:pPr>
-        <w:pStyle w:val="NoSpacing"/>
-        <w:rPr>
-          <w:rFonts w:ascii="Verdana" w:hAnsi="Verdana"/>
-          <w:color w:val="00B050"/>
-          <w:sz w:val="32"/>
-          <w:szCs w:val="32"/>
-        </w:rPr>
-      </w:pPr>
-    </w:p>
-    <w:p>
-      <w:pPr>
-        <w:pStyle w:val="NoSpacing"/>
-        <w:rPr>
-          <w:rFonts w:ascii="Verdana" w:hAnsi="Verdana"/>
-        </w:rPr>
-      </w:pPr>
-      <w:bookmarkStart w:id="0" w:name="_GoBack"/>
-      <w:bookmarkEnd w:id="0"/>
-    </w:p>
-    <w:p>
-      <w:pPr>
-        <w:pStyle w:val="NoSpacing"/>
-        <w:rPr>
-          <w:rFonts w:ascii="Verdana" w:hAnsi="Verdana"/>
-          <w:b/>
-          <w:sz w:val="48"/>
-        </w:rPr>
-      </w:pPr>
-      <w:r>
-        <w:rPr>
-          <w:rFonts w:ascii="Verdana" w:hAnsi="Verdana"/>
-          <w:b/>
-          <w:sz w:val="48"/>
-        </w:rPr>
-        <w:lastRenderedPageBreak/>
-        <w:t>Available commands:</w:t>
-      </w:r>
-    </w:p>
-    <w:p>
-      <w:pPr>
-        <w:pStyle w:val="NoSpacing"/>
-        <w:rPr>
-          <w:rFonts w:ascii="Verdana" w:hAnsi="Verdana"/>
-          <w:sz w:val="40"/>
-        </w:rPr>
-      </w:pPr>
-      <w:r>
-        <w:rPr>
-          <w:rFonts w:ascii="Verdana" w:hAnsi="Verdana"/>
-          <w:sz w:val="40"/>
-        </w:rPr>
-        <w:t xml:space="preserve">In order to type command </w:t>
-      </w:r>
-      <w:proofErr w:type="gramStart"/>
-      <w:r>
-        <w:rPr>
-          <w:rFonts w:ascii="Verdana" w:hAnsi="Verdana"/>
-          <w:sz w:val="40"/>
-        </w:rPr>
-        <w:t>which is equivalent to options setup press key “~”</w:t>
-      </w:r>
-      <w:r>
-        <w:rPr>
-          <w:rFonts w:ascii="Verdana" w:hAnsi="Verdana"/>
-          <w:sz w:val="40"/>
+      <w:r>
+        <w:rPr>
+          <w:rFonts w:ascii="Verdana" w:hAnsi="Verdana"/>
+          <w:sz w:val="32"/>
+          <w:szCs w:val="32"/>
+        </w:rPr>
+        <w:t>Removing fluid blocks doesn’t result in crash when level is loaded. [</w:t>
+      </w:r>
+      <w:r>
+        <w:rPr>
+          <w:rFonts w:ascii="Verdana" w:hAnsi="Verdana"/>
+          <w:sz w:val="32"/>
+          <w:szCs w:val="32"/>
+        </w:rPr>
+        <w:t xml:space="preserve">TODO </w:t>
+      </w:r>
+      <w:r>
+        <w:rPr>
+          <w:rFonts w:ascii="Verdana" w:hAnsi="Verdana"/>
+          <w:sz w:val="32"/>
+          <w:szCs w:val="32"/>
+        </w:rPr>
+        <w:t>updating camera and fluids]</w:t>
+      </w:r>
+      <w:r>
+        <w:rPr>
+          <w:rFonts w:ascii="Verdana" w:hAnsi="Verdana"/>
+          <w:sz w:val="32"/>
+          <w:szCs w:val="32"/>
         </w:rPr>
         <w:t>.</w:t>
       </w:r>
-      <w:proofErr w:type="gramEnd"/>
     </w:p>
     <w:p>
       <w:pPr>
@@ -656,116 +524,239 @@
         </w:numPr>
         <w:rPr>
           <w:rFonts w:ascii="Verdana" w:hAnsi="Verdana"/>
-          <w:sz w:val="32"/>
-          <w:szCs w:val="32"/>
-        </w:rPr>
-      </w:pPr>
-      <w:proofErr w:type="spellStart"/>
-      <w:r>
-        <w:rPr>
-          <w:rFonts w:ascii="Verdana" w:hAnsi="Verdana"/>
-          <w:sz w:val="32"/>
-          <w:szCs w:val="32"/>
-        </w:rPr>
-        <w:t>fps_max</w:t>
-      </w:r>
-      <w:proofErr w:type="spellEnd"/>
-      <w:r>
-        <w:rPr>
-          <w:rFonts w:ascii="Verdana" w:hAnsi="Verdana"/>
-          <w:sz w:val="32"/>
-          <w:szCs w:val="32"/>
-        </w:rPr>
-        <w:t>&lt;</w:t>
-      </w:r>
-      <w:proofErr w:type="spellStart"/>
-      <w:r>
-        <w:rPr>
-          <w:rFonts w:ascii="Verdana" w:hAnsi="Verdana"/>
-          <w:sz w:val="32"/>
-          <w:szCs w:val="32"/>
-        </w:rPr>
-        <w:t>num</w:t>
-      </w:r>
-      <w:proofErr w:type="spellEnd"/>
-      <w:r>
-        <w:rPr>
-          <w:rFonts w:ascii="Verdana" w:hAnsi="Verdana"/>
-          <w:sz w:val="32"/>
-          <w:szCs w:val="32"/>
-        </w:rPr>
-        <w:t xml:space="preserve">&gt;, </w:t>
-      </w:r>
-      <w:proofErr w:type="spellStart"/>
-      <w:r>
-        <w:rPr>
-          <w:rFonts w:ascii="Verdana" w:hAnsi="Verdana"/>
-          <w:sz w:val="32"/>
-          <w:szCs w:val="32"/>
-        </w:rPr>
-        <w:t>fpsMax</w:t>
-      </w:r>
-      <w:proofErr w:type="spellEnd"/>
-      <w:r>
-        <w:rPr>
-          <w:rFonts w:ascii="Verdana" w:hAnsi="Verdana"/>
-          <w:sz w:val="32"/>
-          <w:szCs w:val="32"/>
-        </w:rPr>
-        <w:t>&lt;</w:t>
-      </w:r>
-      <w:proofErr w:type="spellStart"/>
-      <w:r>
-        <w:rPr>
-          <w:rFonts w:ascii="Verdana" w:hAnsi="Verdana"/>
-          <w:sz w:val="32"/>
-          <w:szCs w:val="32"/>
-        </w:rPr>
-        <w:t>num</w:t>
-      </w:r>
-      <w:proofErr w:type="spellEnd"/>
-      <w:r>
-        <w:rPr>
-          <w:rFonts w:ascii="Verdana" w:hAnsi="Verdana"/>
-          <w:sz w:val="32"/>
-          <w:szCs w:val="32"/>
-        </w:rPr>
-        <w:t xml:space="preserve">&gt;: allowing </w:t>
+          <w:color w:val="00B050"/>
+          <w:sz w:val="32"/>
+          <w:szCs w:val="32"/>
+        </w:rPr>
+      </w:pPr>
+      <w:r>
+        <w:rPr>
+          <w:rFonts w:ascii="Verdana" w:hAnsi="Verdana"/>
+          <w:sz w:val="32"/>
+          <w:szCs w:val="32"/>
+        </w:rPr>
+        <w:t xml:space="preserve">Chunk function which check in which chunk is </w:t>
+      </w:r>
+      <w:bookmarkStart w:id="0" w:name="_GoBack"/>
+      <w:bookmarkEnd w:id="0"/>
+      <w:r>
+        <w:rPr>
+          <w:rFonts w:ascii="Verdana" w:hAnsi="Verdana"/>
+          <w:sz w:val="32"/>
+          <w:szCs w:val="32"/>
+        </w:rPr>
+        <w:t>certain block is now fixed.</w:t>
+      </w:r>
+    </w:p>
+    <w:p>
+      <w:pPr>
+        <w:pStyle w:val="NoSpacing"/>
+        <w:rPr>
+          <w:rFonts w:ascii="Verdana" w:hAnsi="Verdana"/>
+          <w:b/>
+          <w:color w:val="FF0000"/>
+          <w:sz w:val="48"/>
+        </w:rPr>
+      </w:pPr>
+    </w:p>
+    <w:p>
+      <w:pPr>
+        <w:pStyle w:val="NoSpacing"/>
+        <w:rPr>
+          <w:rFonts w:ascii="Verdana" w:hAnsi="Verdana"/>
+          <w:color w:val="00B050"/>
+          <w:sz w:val="32"/>
+          <w:szCs w:val="32"/>
+        </w:rPr>
+      </w:pPr>
+    </w:p>
+    <w:p>
+      <w:pPr>
+        <w:pStyle w:val="NoSpacing"/>
+        <w:rPr>
+          <w:rFonts w:ascii="Verdana" w:hAnsi="Verdana"/>
+          <w:color w:val="00B050"/>
+          <w:sz w:val="32"/>
+          <w:szCs w:val="32"/>
+        </w:rPr>
+      </w:pPr>
+    </w:p>
+    <w:p>
+      <w:pPr>
+        <w:pStyle w:val="NoSpacing"/>
+        <w:ind w:left="360"/>
+        <w:rPr>
+          <w:rFonts w:ascii="Verdana" w:hAnsi="Verdana"/>
+          <w:color w:val="00B050"/>
+          <w:sz w:val="32"/>
+          <w:szCs w:val="32"/>
+        </w:rPr>
+      </w:pPr>
+    </w:p>
+    <w:p>
+      <w:pPr>
+        <w:pStyle w:val="NoSpacing"/>
+        <w:ind w:left="360"/>
+        <w:rPr>
+          <w:rFonts w:ascii="Verdana" w:hAnsi="Verdana"/>
+          <w:color w:val="00B050"/>
+          <w:sz w:val="32"/>
+          <w:szCs w:val="32"/>
+        </w:rPr>
+      </w:pPr>
+    </w:p>
+    <w:p>
+      <w:pPr>
+        <w:pStyle w:val="NoSpacing"/>
+        <w:ind w:left="360"/>
+        <w:rPr>
+          <w:rFonts w:ascii="Verdana" w:hAnsi="Verdana"/>
+          <w:color w:val="00B050"/>
+          <w:sz w:val="32"/>
+          <w:szCs w:val="32"/>
+        </w:rPr>
+      </w:pPr>
+    </w:p>
+    <w:p>
+      <w:pPr>
+        <w:pStyle w:val="NoSpacing"/>
+        <w:ind w:left="360"/>
+        <w:rPr>
+          <w:rFonts w:ascii="Verdana" w:hAnsi="Verdana"/>
+          <w:color w:val="00B050"/>
+          <w:sz w:val="32"/>
+          <w:szCs w:val="32"/>
+        </w:rPr>
+      </w:pPr>
+    </w:p>
+    <w:p>
+      <w:pPr>
+        <w:pStyle w:val="NoSpacing"/>
+        <w:ind w:left="360"/>
+        <w:rPr>
+          <w:rFonts w:ascii="Verdana" w:hAnsi="Verdana"/>
+          <w:color w:val="00B050"/>
+          <w:sz w:val="32"/>
+          <w:szCs w:val="32"/>
+        </w:rPr>
+      </w:pPr>
+    </w:p>
+    <w:p>
+      <w:pPr>
+        <w:pStyle w:val="NoSpacing"/>
+        <w:ind w:left="360"/>
+        <w:rPr>
+          <w:rFonts w:ascii="Verdana" w:hAnsi="Verdana"/>
+          <w:color w:val="00B050"/>
+          <w:sz w:val="32"/>
+          <w:szCs w:val="32"/>
+        </w:rPr>
+      </w:pPr>
+    </w:p>
+    <w:p>
+      <w:pPr>
+        <w:pStyle w:val="NoSpacing"/>
+        <w:ind w:left="360"/>
+        <w:rPr>
+          <w:rFonts w:ascii="Verdana" w:hAnsi="Verdana"/>
+          <w:color w:val="00B050"/>
+          <w:sz w:val="32"/>
+          <w:szCs w:val="32"/>
+        </w:rPr>
+      </w:pPr>
+    </w:p>
+    <w:p>
+      <w:pPr>
+        <w:pStyle w:val="NoSpacing"/>
+        <w:ind w:left="360"/>
+        <w:rPr>
+          <w:rFonts w:ascii="Verdana" w:hAnsi="Verdana"/>
+          <w:color w:val="00B050"/>
+          <w:sz w:val="32"/>
+          <w:szCs w:val="32"/>
+        </w:rPr>
+      </w:pPr>
+    </w:p>
+    <w:p>
+      <w:pPr>
+        <w:pStyle w:val="NoSpacing"/>
+        <w:ind w:left="360"/>
+        <w:rPr>
+          <w:rFonts w:ascii="Verdana" w:hAnsi="Verdana"/>
+          <w:color w:val="00B050"/>
+          <w:sz w:val="32"/>
+          <w:szCs w:val="32"/>
+        </w:rPr>
+      </w:pPr>
+    </w:p>
+    <w:p>
+      <w:pPr>
+        <w:pStyle w:val="NoSpacing"/>
+        <w:rPr>
+          <w:rFonts w:ascii="Verdana" w:hAnsi="Verdana"/>
+          <w:color w:val="00B050"/>
+          <w:sz w:val="32"/>
+          <w:szCs w:val="32"/>
+        </w:rPr>
+      </w:pPr>
+    </w:p>
+    <w:p>
+      <w:pPr>
+        <w:pStyle w:val="NoSpacing"/>
+        <w:rPr>
+          <w:rFonts w:ascii="Verdana" w:hAnsi="Verdana"/>
+        </w:rPr>
+      </w:pPr>
+    </w:p>
+    <w:p>
+      <w:pPr>
+        <w:pStyle w:val="NoSpacing"/>
+        <w:rPr>
+          <w:rFonts w:ascii="Verdana" w:hAnsi="Verdana"/>
+          <w:b/>
+          <w:sz w:val="48"/>
+        </w:rPr>
+      </w:pPr>
+      <w:r>
+        <w:rPr>
+          <w:rFonts w:ascii="Verdana" w:hAnsi="Verdana"/>
+          <w:b/>
+          <w:sz w:val="48"/>
+        </w:rPr>
+        <w:t>Available commands:</w:t>
+      </w:r>
+    </w:p>
+    <w:p>
+      <w:pPr>
+        <w:pStyle w:val="NoSpacing"/>
+        <w:rPr>
+          <w:rFonts w:ascii="Verdana" w:hAnsi="Verdana"/>
+          <w:sz w:val="40"/>
+        </w:rPr>
+      </w:pPr>
+      <w:r>
+        <w:rPr>
+          <w:rFonts w:ascii="Verdana" w:hAnsi="Verdana"/>
+          <w:sz w:val="40"/>
+        </w:rPr>
+        <w:t xml:space="preserve">In order to type command </w:t>
       </w:r>
       <w:proofErr w:type="gramStart"/>
       <w:r>
         <w:rPr>
           <w:rFonts w:ascii="Verdana" w:hAnsi="Verdana"/>
-          <w:sz w:val="32"/>
-          <w:szCs w:val="32"/>
-        </w:rPr>
-        <w:t>to change</w:t>
+          <w:sz w:val="40"/>
+        </w:rPr>
+        <w:t>which is equivalent to options setup press key “~”</w:t>
+      </w:r>
+      <w:r>
+        <w:rPr>
+          <w:rFonts w:ascii="Verdana" w:hAnsi="Verdana"/>
+          <w:sz w:val="40"/>
+        </w:rPr>
+        <w:t>.</w:t>
       </w:r>
       <w:proofErr w:type="gramEnd"/>
-      <w:r>
-        <w:rPr>
-          <w:rFonts w:ascii="Verdana" w:hAnsi="Verdana"/>
-          <w:sz w:val="32"/>
-          <w:szCs w:val="32"/>
-        </w:rPr>
-        <w:t xml:space="preserve"> max fps</w:t>
-      </w:r>
-      <w:r>
-        <w:rPr>
-          <w:rFonts w:ascii="Verdana" w:hAnsi="Verdana"/>
-          <w:sz w:val="32"/>
-          <w:szCs w:val="32"/>
-        </w:rPr>
-        <w:t xml:space="preserve"> (it must be positive number)</w:t>
-      </w:r>
-      <w:r>
-        <w:rPr>
-          <w:rFonts w:ascii="Verdana" w:hAnsi="Verdana"/>
-          <w:sz w:val="32"/>
-          <w:szCs w:val="32"/>
-        </w:rPr>
-        <w:t>.</w:t>
-      </w:r>
     </w:p>
     <w:p>
       <w:pPr>
@@ -780,6 +771,78 @@
           <w:szCs w:val="32"/>
         </w:rPr>
       </w:pPr>
+      <w:proofErr w:type="spellStart"/>
+      <w:r>
+        <w:rPr>
+          <w:rFonts w:ascii="Verdana" w:hAnsi="Verdana"/>
+          <w:sz w:val="32"/>
+          <w:szCs w:val="32"/>
+        </w:rPr>
+        <w:t>fps_max</w:t>
+      </w:r>
+      <w:proofErr w:type="spellEnd"/>
+      <w:r>
+        <w:rPr>
+          <w:rFonts w:ascii="Verdana" w:hAnsi="Verdana"/>
+          <w:sz w:val="32"/>
+          <w:szCs w:val="32"/>
+        </w:rPr>
+        <w:t>&lt;</w:t>
+      </w:r>
+      <w:proofErr w:type="spellStart"/>
+      <w:r>
+        <w:rPr>
+          <w:rFonts w:ascii="Verdana" w:hAnsi="Verdana"/>
+          <w:sz w:val="32"/>
+          <w:szCs w:val="32"/>
+        </w:rPr>
+        <w:t>num</w:t>
+      </w:r>
+      <w:proofErr w:type="spellEnd"/>
+      <w:r>
+        <w:rPr>
+          <w:rFonts w:ascii="Verdana" w:hAnsi="Verdana"/>
+          <w:sz w:val="32"/>
+          <w:szCs w:val="32"/>
+        </w:rPr>
+        <w:t xml:space="preserve">&gt;, </w:t>
+      </w:r>
+      <w:proofErr w:type="spellStart"/>
+      <w:r>
+        <w:rPr>
+          <w:rFonts w:ascii="Verdana" w:hAnsi="Verdana"/>
+          <w:sz w:val="32"/>
+          <w:szCs w:val="32"/>
+        </w:rPr>
+        <w:t>fpsMax</w:t>
+      </w:r>
+      <w:proofErr w:type="spellEnd"/>
+      <w:r>
+        <w:rPr>
+          <w:rFonts w:ascii="Verdana" w:hAnsi="Verdana"/>
+          <w:sz w:val="32"/>
+          <w:szCs w:val="32"/>
+        </w:rPr>
+        <w:t>&lt;</w:t>
+      </w:r>
+      <w:proofErr w:type="spellStart"/>
+      <w:r>
+        <w:rPr>
+          <w:rFonts w:ascii="Verdana" w:hAnsi="Verdana"/>
+          <w:sz w:val="32"/>
+          <w:szCs w:val="32"/>
+        </w:rPr>
+        <w:t>num</w:t>
+      </w:r>
+      <w:proofErr w:type="spellEnd"/>
+      <w:r>
+        <w:rPr>
+          <w:rFonts w:ascii="Verdana" w:hAnsi="Verdana"/>
+          <w:sz w:val="32"/>
+          <w:szCs w:val="32"/>
+        </w:rPr>
+        <w:t xml:space="preserve">&gt;: allowing </w:t>
+      </w:r>
       <w:proofErr w:type="gramStart"/>
       <w:r>
         <w:rPr>
@@ -787,7 +850,7 @@
           <w:sz w:val="32"/>
           <w:szCs w:val="32"/>
         </w:rPr>
-        <w:t>resolution&lt;</w:t>
+        <w:t>to change</w:t>
       </w:r>
       <w:proofErr w:type="gramEnd"/>
       <w:r>
@@ -796,15 +859,23 @@
           <w:sz w:val="32"/>
           <w:szCs w:val="32"/>
         </w:rPr>
-        <w:t>width&gt;&lt;height&gt;, res&lt;width&gt;&lt;height&gt;: allowing to change resolution (min resolution is 640x480 whilst</w:t>
-      </w:r>
-      <w:r>
-        <w:rPr>
-          <w:rFonts w:ascii="Verdana" w:hAnsi="Verdana"/>
-          <w:sz w:val="32"/>
-          <w:szCs w:val="32"/>
-        </w:rPr>
-        <w:t xml:space="preserve"> max is your native resolution).</w:t>
+        <w:t xml:space="preserve"> max fps</w:t>
+      </w:r>
+      <w:r>
+        <w:rPr>
+          <w:rFonts w:ascii="Verdana" w:hAnsi="Verdana"/>
+          <w:sz w:val="32"/>
+          <w:szCs w:val="32"/>
+        </w:rPr>
+        <w:t xml:space="preserve"> (it must be positive number)</w:t>
+      </w:r>
+      <w:r>
+        <w:rPr>
+          <w:rFonts w:ascii="Verdana" w:hAnsi="Verdana"/>
+          <w:sz w:val="32"/>
+          <w:szCs w:val="32"/>
+        </w:rPr>
+        <w:t>.</w:t>
       </w:r>
     </w:p>
     <w:p>
@@ -820,7 +891,6 @@
           <w:szCs w:val="32"/>
         </w:rPr>
       </w:pPr>
-      <w:proofErr w:type="spellStart"/>
       <w:proofErr w:type="gramStart"/>
       <w:r>
         <w:rPr>
@@ -828,9 +898,8 @@
           <w:sz w:val="32"/>
           <w:szCs w:val="32"/>
         </w:rPr>
-        <w:t>fullscreen</w:t>
-      </w:r>
-      <w:proofErr w:type="spellEnd"/>
+        <w:t>resolution&lt;</w:t>
+      </w:r>
       <w:proofErr w:type="gramEnd"/>
       <w:r>
         <w:rPr>
@@ -838,33 +907,15 @@
           <w:sz w:val="32"/>
           <w:szCs w:val="32"/>
         </w:rPr>
-        <w:t>:</w:t>
-      </w:r>
-      <w:r>
-        <w:rPr>
-          <w:rFonts w:ascii="Verdana" w:hAnsi="Verdana"/>
-          <w:sz w:val="32"/>
-          <w:szCs w:val="32"/>
-        </w:rPr>
-        <w:t xml:space="preserve"> makes your game run </w:t>
-      </w:r>
-      <w:proofErr w:type="spellStart"/>
-      <w:r>
-        <w:rPr>
-          <w:rFonts w:ascii="Verdana" w:hAnsi="Verdana"/>
-          <w:sz w:val="32"/>
-          <w:szCs w:val="32"/>
-        </w:rPr>
-        <w:t>fullscreen</w:t>
-      </w:r>
-      <w:proofErr w:type="spellEnd"/>
-      <w:r>
-        <w:rPr>
-          <w:rFonts w:ascii="Verdana" w:hAnsi="Verdana"/>
-          <w:sz w:val="32"/>
-          <w:szCs w:val="32"/>
-        </w:rPr>
-        <w:t>.</w:t>
+        <w:t>width&gt;&lt;height&gt;, res&lt;width&gt;&lt;height&gt;: allowing to change resolution (min resolution is 640x480 whilst</w:t>
+      </w:r>
+      <w:r>
+        <w:rPr>
+          <w:rFonts w:ascii="Verdana" w:hAnsi="Verdana"/>
+          <w:sz w:val="32"/>
+          <w:szCs w:val="32"/>
+        </w:rPr>
+        <w:t xml:space="preserve"> max is your native resolution).</w:t>
       </w:r>
     </w:p>
     <w:p>
@@ -880,6 +931,7 @@
           <w:szCs w:val="32"/>
         </w:rPr>
       </w:pPr>
+      <w:proofErr w:type="spellStart"/>
       <w:proofErr w:type="gramStart"/>
       <w:r>
         <w:rPr>
@@ -887,8 +939,9 @@
           <w:sz w:val="32"/>
           <w:szCs w:val="32"/>
         </w:rPr>
-        <w:t>windowed</w:t>
-      </w:r>
+        <w:t>fullscreen</w:t>
+      </w:r>
+      <w:proofErr w:type="spellEnd"/>
       <w:proofErr w:type="gramEnd"/>
       <w:r>
         <w:rPr>
@@ -896,15 +949,33 @@
           <w:sz w:val="32"/>
           <w:szCs w:val="32"/>
         </w:rPr>
-        <w:t xml:space="preserve">: makes your game run </w:t>
-      </w:r>
-      <w:r>
-        <w:rPr>
-          <w:rFonts w:ascii="Verdana" w:hAnsi="Verdana"/>
-          <w:sz w:val="32"/>
-          <w:szCs w:val="32"/>
-        </w:rPr>
-        <w:t>windowed mode.</w:t>
+        <w:t>:</w:t>
+      </w:r>
+      <w:r>
+        <w:rPr>
+          <w:rFonts w:ascii="Verdana" w:hAnsi="Verdana"/>
+          <w:sz w:val="32"/>
+          <w:szCs w:val="32"/>
+        </w:rPr>
+        <w:t xml:space="preserve"> makes your game run </w:t>
+      </w:r>
+      <w:proofErr w:type="spellStart"/>
+      <w:r>
+        <w:rPr>
+          <w:rFonts w:ascii="Verdana" w:hAnsi="Verdana"/>
+          <w:sz w:val="32"/>
+          <w:szCs w:val="32"/>
+        </w:rPr>
+        <w:t>fullscreen</w:t>
+      </w:r>
+      <w:proofErr w:type="spellEnd"/>
+      <w:r>
+        <w:rPr>
+          <w:rFonts w:ascii="Verdana" w:hAnsi="Verdana"/>
+          <w:sz w:val="32"/>
+          <w:szCs w:val="32"/>
+        </w:rPr>
+        <w:t>.</w:t>
       </w:r>
     </w:p>
     <w:p>
@@ -920,125 +991,31 @@
           <w:szCs w:val="32"/>
         </w:rPr>
       </w:pPr>
-      <w:proofErr w:type="spellStart"/>
-      <w:r>
-        <w:rPr>
-          <w:rFonts w:ascii="Verdana" w:hAnsi="Verdana"/>
-          <w:sz w:val="32"/>
-          <w:szCs w:val="32"/>
-        </w:rPr>
-        <w:t>v_sync</w:t>
-      </w:r>
-      <w:proofErr w:type="spellEnd"/>
-      <w:r>
-        <w:rPr>
-          <w:rFonts w:ascii="Verdana" w:hAnsi="Verdana"/>
-          <w:sz w:val="32"/>
-          <w:szCs w:val="32"/>
-        </w:rPr>
-        <w:t xml:space="preserve"> &lt;bool&gt;</w:t>
-      </w:r>
-      <w:r>
-        <w:rPr>
-          <w:rFonts w:ascii="Verdana" w:hAnsi="Verdana"/>
-          <w:sz w:val="32"/>
-          <w:szCs w:val="32"/>
-        </w:rPr>
-        <w:t xml:space="preserve">, </w:t>
-      </w:r>
-      <w:proofErr w:type="spellStart"/>
-      <w:r>
-        <w:rPr>
-          <w:rFonts w:ascii="Verdana" w:hAnsi="Verdana"/>
-          <w:sz w:val="32"/>
-          <w:szCs w:val="32"/>
-        </w:rPr>
-        <w:t>vsync</w:t>
-      </w:r>
-      <w:proofErr w:type="spellEnd"/>
-      <w:r>
-        <w:rPr>
-          <w:rFonts w:ascii="Verdana" w:hAnsi="Verdana"/>
-          <w:sz w:val="32"/>
-          <w:szCs w:val="32"/>
-        </w:rPr>
-        <w:t>&lt;bool&gt;</w:t>
-      </w:r>
-      <w:r>
-        <w:rPr>
-          <w:rFonts w:ascii="Verdana" w:hAnsi="Verdana"/>
-          <w:sz w:val="32"/>
-          <w:szCs w:val="32"/>
-        </w:rPr>
-        <w:t>: whether</w:t>
-      </w:r>
-      <w:r>
-        <w:rPr>
-          <w:rFonts w:ascii="Verdana" w:hAnsi="Verdana"/>
-          <w:sz w:val="32"/>
-          <w:szCs w:val="32"/>
-        </w:rPr>
-        <w:t xml:space="preserve"> or not you</w:t>
-      </w:r>
-      <w:r>
-        <w:rPr>
-          <w:rFonts w:ascii="Verdana" w:hAnsi="Verdana"/>
-          <w:sz w:val="32"/>
-          <w:szCs w:val="32"/>
-        </w:rPr>
-        <w:t xml:space="preserve"> </w:t>
-      </w:r>
-      <w:proofErr w:type="spellStart"/>
-      <w:r>
-        <w:rPr>
-          <w:rFonts w:ascii="Verdana" w:hAnsi="Verdana"/>
-          <w:sz w:val="32"/>
-          <w:szCs w:val="32"/>
-        </w:rPr>
-        <w:t>wanna</w:t>
-      </w:r>
-      <w:proofErr w:type="spellEnd"/>
-      <w:r>
-        <w:rPr>
-          <w:rFonts w:ascii="Verdana" w:hAnsi="Verdana"/>
-          <w:sz w:val="32"/>
-          <w:szCs w:val="32"/>
-        </w:rPr>
-        <w:t xml:space="preserve"> </w:t>
-      </w:r>
-      <w:proofErr w:type="spellStart"/>
-      <w:r>
-        <w:rPr>
-          <w:rFonts w:ascii="Verdana" w:hAnsi="Verdana"/>
-          <w:sz w:val="32"/>
-          <w:szCs w:val="32"/>
-        </w:rPr>
-        <w:t>vsync</w:t>
-      </w:r>
-      <w:proofErr w:type="spellEnd"/>
-      <w:r>
-        <w:rPr>
-          <w:rFonts w:ascii="Verdana" w:hAnsi="Verdana"/>
-          <w:sz w:val="32"/>
-          <w:szCs w:val="32"/>
-        </w:rPr>
-        <w:t xml:space="preserve"> on or off</w:t>
-      </w:r>
-      <w:r>
-        <w:rPr>
-          <w:rFonts w:ascii="Verdana" w:hAnsi="Verdana"/>
-          <w:sz w:val="32"/>
-          <w:szCs w:val="32"/>
-        </w:rPr>
-        <w:t>.</w:t>
-      </w:r>
-      <w:r>
-        <w:rPr>
-          <w:rFonts w:ascii="Verdana" w:hAnsi="Verdana"/>
-          <w:sz w:val="32"/>
-          <w:szCs w:val="32"/>
-        </w:rPr>
-        <w:t xml:space="preserve"> If it’s on (you’ve set it to true) your fps is capped to your monitor refresh rate.</w:t>
+      <w:proofErr w:type="gramStart"/>
+      <w:r>
+        <w:rPr>
+          <w:rFonts w:ascii="Verdana" w:hAnsi="Verdana"/>
+          <w:sz w:val="32"/>
+          <w:szCs w:val="32"/>
+        </w:rPr>
+        <w:t>windowed</w:t>
+      </w:r>
+      <w:proofErr w:type="gramEnd"/>
+      <w:r>
+        <w:rPr>
+          <w:rFonts w:ascii="Verdana" w:hAnsi="Verdana"/>
+          <w:sz w:val="32"/>
+          <w:szCs w:val="32"/>
+        </w:rPr>
+        <w:t xml:space="preserve">: makes your game run </w:t>
+      </w:r>
+      <w:r>
+        <w:rPr>
+          <w:rFonts w:ascii="Verdana" w:hAnsi="Verdana"/>
+          <w:sz w:val="32"/>
+          <w:szCs w:val="32"/>
+        </w:rPr>
+        <w:t>windowed mode.</w:t>
       </w:r>
     </w:p>
     <w:p>
@@ -1061,7 +1038,7 @@
           <w:sz w:val="32"/>
           <w:szCs w:val="32"/>
         </w:rPr>
-        <w:t>water_efects</w:t>
+        <w:t>v_sync</w:t>
       </w:r>
       <w:proofErr w:type="spellEnd"/>
       <w:r>
@@ -1070,7 +1047,109 @@
           <w:sz w:val="32"/>
           <w:szCs w:val="32"/>
         </w:rPr>
-        <w:t xml:space="preserve"> &lt;bool&gt;: enables (true) or disables (false) water effects (such as reflection).</w:t>
+        <w:t xml:space="preserve"> &lt;bool&gt;</w:t>
+      </w:r>
+      <w:r>
+        <w:rPr>
+          <w:rFonts w:ascii="Verdana" w:hAnsi="Verdana"/>
+          <w:sz w:val="32"/>
+          <w:szCs w:val="32"/>
+        </w:rPr>
+        <w:t xml:space="preserve">, </w:t>
+      </w:r>
+      <w:proofErr w:type="spellStart"/>
+      <w:r>
+        <w:rPr>
+          <w:rFonts w:ascii="Verdana" w:hAnsi="Verdana"/>
+          <w:sz w:val="32"/>
+          <w:szCs w:val="32"/>
+        </w:rPr>
+        <w:t>vsync</w:t>
+      </w:r>
+      <w:proofErr w:type="spellEnd"/>
+      <w:r>
+        <w:rPr>
+          <w:rFonts w:ascii="Verdana" w:hAnsi="Verdana"/>
+          <w:sz w:val="32"/>
+          <w:szCs w:val="32"/>
+        </w:rPr>
+        <w:t>&lt;bool&gt;</w:t>
+      </w:r>
+      <w:r>
+        <w:rPr>
+          <w:rFonts w:ascii="Verdana" w:hAnsi="Verdana"/>
+          <w:sz w:val="32"/>
+          <w:szCs w:val="32"/>
+        </w:rPr>
+        <w:t>: whether</w:t>
+      </w:r>
+      <w:r>
+        <w:rPr>
+          <w:rFonts w:ascii="Verdana" w:hAnsi="Verdana"/>
+          <w:sz w:val="32"/>
+          <w:szCs w:val="32"/>
+        </w:rPr>
+        <w:t xml:space="preserve"> or not you</w:t>
+      </w:r>
+      <w:r>
+        <w:rPr>
+          <w:rFonts w:ascii="Verdana" w:hAnsi="Verdana"/>
+          <w:sz w:val="32"/>
+          <w:szCs w:val="32"/>
+        </w:rPr>
+        <w:t xml:space="preserve"> </w:t>
+      </w:r>
+      <w:proofErr w:type="spellStart"/>
+      <w:r>
+        <w:rPr>
+          <w:rFonts w:ascii="Verdana" w:hAnsi="Verdana"/>
+          <w:sz w:val="32"/>
+          <w:szCs w:val="32"/>
+        </w:rPr>
+        <w:t>wanna</w:t>
+      </w:r>
+      <w:proofErr w:type="spellEnd"/>
+      <w:r>
+        <w:rPr>
+          <w:rFonts w:ascii="Verdana" w:hAnsi="Verdana"/>
+          <w:sz w:val="32"/>
+          <w:szCs w:val="32"/>
+        </w:rPr>
+        <w:t xml:space="preserve"> </w:t>
+      </w:r>
+      <w:proofErr w:type="spellStart"/>
+      <w:r>
+        <w:rPr>
+          <w:rFonts w:ascii="Verdana" w:hAnsi="Verdana"/>
+          <w:sz w:val="32"/>
+          <w:szCs w:val="32"/>
+        </w:rPr>
+        <w:t>vsync</w:t>
+      </w:r>
+      <w:proofErr w:type="spellEnd"/>
+      <w:r>
+        <w:rPr>
+          <w:rFonts w:ascii="Verdana" w:hAnsi="Verdana"/>
+          <w:sz w:val="32"/>
+          <w:szCs w:val="32"/>
+        </w:rPr>
+        <w:t xml:space="preserve"> on or off</w:t>
+      </w:r>
+      <w:r>
+        <w:rPr>
+          <w:rFonts w:ascii="Verdana" w:hAnsi="Verdana"/>
+          <w:sz w:val="32"/>
+          <w:szCs w:val="32"/>
+        </w:rPr>
+        <w:t>.</w:t>
+      </w:r>
+      <w:r>
+        <w:rPr>
+          <w:rFonts w:ascii="Verdana" w:hAnsi="Verdana"/>
+          <w:sz w:val="32"/>
+          <w:szCs w:val="32"/>
+        </w:rPr>
+        <w:t xml:space="preserve"> If it’s on (you’ve set it to true) your fps is capped to your monitor refresh rate.</w:t>
       </w:r>
     </w:p>
     <w:p>
@@ -1093,7 +1172,7 @@
           <w:sz w:val="32"/>
           <w:szCs w:val="32"/>
         </w:rPr>
-        <w:t>mouse_sensitivity</w:t>
+        <w:t>water_efects</w:t>
       </w:r>
       <w:proofErr w:type="spellEnd"/>
       <w:r>
@@ -1102,92 +1181,7 @@
           <w:sz w:val="32"/>
           <w:szCs w:val="32"/>
         </w:rPr>
-        <w:t>&lt;</w:t>
-      </w:r>
-      <w:proofErr w:type="spellStart"/>
-      <w:r>
-        <w:rPr>
-          <w:rFonts w:ascii="Verdana" w:hAnsi="Verdana"/>
-          <w:sz w:val="32"/>
-          <w:szCs w:val="32"/>
-        </w:rPr>
-        <w:t>num</w:t>
-      </w:r>
-      <w:proofErr w:type="spellEnd"/>
-      <w:r>
-        <w:rPr>
-          <w:rFonts w:ascii="Verdana" w:hAnsi="Verdana"/>
-          <w:sz w:val="32"/>
-          <w:szCs w:val="32"/>
-        </w:rPr>
-        <w:t xml:space="preserve">&gt;, </w:t>
-      </w:r>
-      <w:proofErr w:type="spellStart"/>
-      <w:r>
-        <w:rPr>
-          <w:rFonts w:ascii="Verdana" w:hAnsi="Verdana"/>
-          <w:sz w:val="32"/>
-          <w:szCs w:val="32"/>
-        </w:rPr>
-        <w:t>msens</w:t>
-      </w:r>
-      <w:proofErr w:type="spellEnd"/>
-      <w:r>
-        <w:rPr>
-          <w:rFonts w:ascii="Verdana" w:hAnsi="Verdana"/>
-          <w:sz w:val="32"/>
-          <w:szCs w:val="32"/>
-        </w:rPr>
-        <w:t xml:space="preserve"> &lt;</w:t>
-      </w:r>
-      <w:proofErr w:type="spellStart"/>
-      <w:r>
-        <w:rPr>
-          <w:rFonts w:ascii="Verdana" w:hAnsi="Verdana"/>
-          <w:sz w:val="32"/>
-          <w:szCs w:val="32"/>
-        </w:rPr>
-        <w:t>num</w:t>
-      </w:r>
-      <w:proofErr w:type="spellEnd"/>
-      <w:r>
-        <w:rPr>
-          <w:rFonts w:ascii="Verdana" w:hAnsi="Verdana"/>
-          <w:sz w:val="32"/>
-          <w:szCs w:val="32"/>
-        </w:rPr>
-        <w:t>&gt;: sets mouse sensitivity to this value.</w:t>
-      </w:r>
-    </w:p>
-    <w:p>
-      <w:pPr>
-        <w:pStyle w:val="NoSpacing"/>
-        <w:ind w:left="360"/>
-        <w:rPr>
-          <w:rFonts w:ascii="Verdana" w:hAnsi="Verdana"/>
-          <w:sz w:val="32"/>
-          <w:szCs w:val="32"/>
-        </w:rPr>
-      </w:pPr>
-    </w:p>
-    <w:p>
-      <w:pPr>
-        <w:pStyle w:val="NoSpacing"/>
-        <w:rPr>
-          <w:rFonts w:ascii="Verdana" w:hAnsi="Verdana"/>
-          <w:b/>
-          <w:sz w:val="48"/>
-          <w:szCs w:val="32"/>
-        </w:rPr>
-      </w:pPr>
-      <w:r>
-        <w:rPr>
-          <w:rFonts w:ascii="Verdana" w:hAnsi="Verdana"/>
-          <w:b/>
-          <w:sz w:val="48"/>
-          <w:szCs w:val="32"/>
-        </w:rPr>
-        <w:t>Notes:</w:t>
+        <w:t xml:space="preserve"> &lt;bool&gt;: enables (true) or disables (false) water effects (such as reflection).</w:t>
       </w:r>
     </w:p>
     <w:p>
@@ -1203,13 +1197,77 @@
           <w:szCs w:val="32"/>
         </w:rPr>
       </w:pPr>
-      <w:r>
-        <w:rPr>
-          <w:rFonts w:ascii="Verdana" w:hAnsi="Verdana"/>
-          <w:sz w:val="32"/>
-          <w:szCs w:val="32"/>
-        </w:rPr>
-        <w:t>Game uses LWJGL 3.2.3 since v 02 (BELARUS).</w:t>
+      <w:proofErr w:type="spellStart"/>
+      <w:r>
+        <w:rPr>
+          <w:rFonts w:ascii="Verdana" w:hAnsi="Verdana"/>
+          <w:sz w:val="32"/>
+          <w:szCs w:val="32"/>
+        </w:rPr>
+        <w:t>mouse_sensitivity</w:t>
+      </w:r>
+      <w:proofErr w:type="spellEnd"/>
+      <w:r>
+        <w:rPr>
+          <w:rFonts w:ascii="Verdana" w:hAnsi="Verdana"/>
+          <w:sz w:val="32"/>
+          <w:szCs w:val="32"/>
+        </w:rPr>
+        <w:t>&lt;</w:t>
+      </w:r>
+      <w:proofErr w:type="spellStart"/>
+      <w:r>
+        <w:rPr>
+          <w:rFonts w:ascii="Verdana" w:hAnsi="Verdana"/>
+          <w:sz w:val="32"/>
+          <w:szCs w:val="32"/>
+        </w:rPr>
+        <w:t>num</w:t>
+      </w:r>
+      <w:proofErr w:type="spellEnd"/>
+      <w:r>
+        <w:rPr>
+          <w:rFonts w:ascii="Verdana" w:hAnsi="Verdana"/>
+          <w:sz w:val="32"/>
+          <w:szCs w:val="32"/>
+        </w:rPr>
+        <w:t xml:space="preserve">&gt;, </w:t>
+      </w:r>
+      <w:proofErr w:type="spellStart"/>
+      <w:r>
+        <w:rPr>
+          <w:rFonts w:ascii="Verdana" w:hAnsi="Verdana"/>
+          <w:sz w:val="32"/>
+          <w:szCs w:val="32"/>
+        </w:rPr>
+        <w:t>msens</w:t>
+      </w:r>
+      <w:proofErr w:type="spellEnd"/>
+      <w:r>
+        <w:rPr>
+          <w:rFonts w:ascii="Verdana" w:hAnsi="Verdana"/>
+          <w:sz w:val="32"/>
+          <w:szCs w:val="32"/>
+        </w:rPr>
+        <w:t xml:space="preserve"> &lt;</w:t>
+      </w:r>
+      <w:proofErr w:type="spellStart"/>
+      <w:r>
+        <w:rPr>
+          <w:rFonts w:ascii="Verdana" w:hAnsi="Verdana"/>
+          <w:sz w:val="32"/>
+          <w:szCs w:val="32"/>
+        </w:rPr>
+        <w:t>num</w:t>
+      </w:r>
+      <w:proofErr w:type="spellEnd"/>
+      <w:r>
+        <w:rPr>
+          <w:rFonts w:ascii="Verdana" w:hAnsi="Verdana"/>
+          <w:sz w:val="32"/>
+          <w:szCs w:val="32"/>
+        </w:rPr>
+        <w:t>&gt;: sets mouse sensitivity to this value.</w:t>
       </w:r>
     </w:p>
     <w:p>
@@ -1225,6 +1283,158 @@
           <w:szCs w:val="32"/>
         </w:rPr>
       </w:pPr>
+      <w:proofErr w:type="gramStart"/>
+      <w:r>
+        <w:rPr>
+          <w:rFonts w:ascii="Verdana" w:hAnsi="Verdana"/>
+          <w:sz w:val="32"/>
+          <w:szCs w:val="32"/>
+        </w:rPr>
+        <w:t>music</w:t>
+      </w:r>
+      <w:proofErr w:type="gramEnd"/>
+      <w:r>
+        <w:rPr>
+          <w:rFonts w:ascii="Verdana" w:hAnsi="Verdana"/>
+          <w:sz w:val="32"/>
+          <w:szCs w:val="32"/>
+        </w:rPr>
+        <w:t xml:space="preserve"> &lt;</w:t>
+      </w:r>
+      <w:proofErr w:type="spellStart"/>
+      <w:r>
+        <w:rPr>
+          <w:rFonts w:ascii="Verdana" w:hAnsi="Verdana"/>
+          <w:sz w:val="32"/>
+          <w:szCs w:val="32"/>
+        </w:rPr>
+        <w:t>num</w:t>
+      </w:r>
+      <w:proofErr w:type="spellEnd"/>
+      <w:r>
+        <w:rPr>
+          <w:rFonts w:ascii="Verdana" w:hAnsi="Verdana"/>
+          <w:sz w:val="32"/>
+          <w:szCs w:val="32"/>
+        </w:rPr>
+        <w:t>&gt;, sound &lt;</w:t>
+      </w:r>
+      <w:proofErr w:type="spellStart"/>
+      <w:r>
+        <w:rPr>
+          <w:rFonts w:ascii="Verdana" w:hAnsi="Verdana"/>
+          <w:sz w:val="32"/>
+          <w:szCs w:val="32"/>
+        </w:rPr>
+        <w:t>num</w:t>
+      </w:r>
+      <w:proofErr w:type="spellEnd"/>
+      <w:r>
+        <w:rPr>
+          <w:rFonts w:ascii="Verdana" w:hAnsi="Verdana"/>
+          <w:sz w:val="32"/>
+          <w:szCs w:val="32"/>
+        </w:rPr>
+        <w:t>&gt; : sets respectively music and sound</w:t>
+      </w:r>
+      <w:r>
+        <w:rPr>
+          <w:rFonts w:ascii="Verdana" w:hAnsi="Verdana"/>
+          <w:sz w:val="32"/>
+          <w:szCs w:val="32"/>
+        </w:rPr>
+        <w:t xml:space="preserve"> volume</w:t>
+      </w:r>
+      <w:r>
+        <w:rPr>
+          <w:rFonts w:ascii="Verdana" w:hAnsi="Verdana"/>
+          <w:sz w:val="32"/>
+          <w:szCs w:val="32"/>
+        </w:rPr>
+        <w:t xml:space="preserve"> </w:t>
+      </w:r>
+      <w:r>
+        <w:rPr>
+          <w:rFonts w:ascii="Verdana" w:hAnsi="Verdana"/>
+          <w:sz w:val="32"/>
+          <w:szCs w:val="32"/>
+        </w:rPr>
+        <w:t>to this value.</w:t>
+      </w:r>
+    </w:p>
+    <w:p>
+      <w:pPr>
+        <w:pStyle w:val="NoSpacing"/>
+        <w:rPr>
+          <w:rFonts w:ascii="Verdana" w:hAnsi="Verdana"/>
+          <w:sz w:val="32"/>
+          <w:szCs w:val="32"/>
+        </w:rPr>
+      </w:pPr>
+    </w:p>
+    <w:p>
+      <w:pPr>
+        <w:pStyle w:val="NoSpacing"/>
+        <w:rPr>
+          <w:rFonts w:ascii="Verdana" w:hAnsi="Verdana"/>
+          <w:b/>
+          <w:sz w:val="48"/>
+          <w:szCs w:val="32"/>
+        </w:rPr>
+      </w:pPr>
+      <w:r>
+        <w:rPr>
+          <w:rFonts w:ascii="Verdana" w:hAnsi="Verdana"/>
+          <w:b/>
+          <w:sz w:val="48"/>
+          <w:szCs w:val="32"/>
+        </w:rPr>
+        <w:t>Notes:</w:t>
+      </w:r>
+    </w:p>
+    <w:p>
+      <w:pPr>
+        <w:pStyle w:val="NoSpacing"/>
+        <w:numPr>
+          <w:ilvl w:val="0"/>
+          <w:numId w:val="19"/>
+        </w:numPr>
+        <w:rPr>
+          <w:rFonts w:ascii="Verdana" w:hAnsi="Verdana"/>
+          <w:sz w:val="32"/>
+          <w:szCs w:val="32"/>
+        </w:rPr>
+      </w:pPr>
+      <w:r>
+        <w:rPr>
+          <w:rFonts w:ascii="Verdana" w:hAnsi="Verdana"/>
+          <w:sz w:val="32"/>
+          <w:szCs w:val="32"/>
+        </w:rPr>
+        <w:t>Game uses LWJGL 3.2.3 since v 02 (BELARUS).</w:t>
+      </w:r>
+    </w:p>
+    <w:p>
+      <w:pPr>
+        <w:pStyle w:val="NoSpacing"/>
+        <w:numPr>
+          <w:ilvl w:val="0"/>
+          <w:numId w:val="19"/>
+        </w:numPr>
+        <w:rPr>
+          <w:rFonts w:ascii="Verdana" w:hAnsi="Verdana"/>
+          <w:sz w:val="32"/>
+          <w:szCs w:val="32"/>
+        </w:rPr>
+      </w:pPr>
+      <w:r>
+        <w:rPr>
+          <w:rFonts w:ascii="Verdana" w:hAnsi="Verdana"/>
+          <w:sz w:val="32"/>
+          <w:szCs w:val="32"/>
+        </w:rPr>
+        <w:t xml:space="preserve">Game requires Quad Core processor with support for at least 4 threads. </w:t>
+      </w:r>
       <w:r>
         <w:rPr>
           <w:rFonts w:ascii="Verdana" w:hAnsi="Verdana"/>
@@ -4412,7 +4622,7 @@
 </file>
 
 <file path=customXml/itemProps1.xml><?xml version="1.0" encoding="utf-8"?>
-<ds:datastoreItem xmlns:ds="http://schemas.openxmlformats.org/officeDocument/2006/customXml" ds:itemID="{CBC32EF3-E92E-4BD5-9692-ED9B723FA2C6}">
+<ds:datastoreItem xmlns:ds="http://schemas.openxmlformats.org/officeDocument/2006/customXml" ds:itemID="{CD5F7EAC-1E0F-4051-BA71-2F2138859D31}">
   <ds:schemaRefs>
     <ds:schemaRef ds:uri="http://schemas.openxmlformats.org/officeDocument/2006/bibliography"/>
   </ds:schemaRefs>

</xml_diff>

<commit_message>
Shader Program prints error in the log. For V14 NITROGEN U07!
</commit_message>
<xml_diff>
--- a/changelog.docx
+++ b/changelog.docx
@@ -60,7 +60,25 @@
           <w:b/>
           <w:sz w:val="48"/>
         </w:rPr>
-        <w:t>NYTROGEN</w:t>
+        <w:t>N</w:t>
+      </w:r>
+      <w:r>
+        <w:rPr>
+          <w:rFonts w:ascii="Verdana" w:hAnsi="Verdana"/>
+          <w:b/>
+          <w:sz w:val="48"/>
+        </w:rPr>
+        <w:t>I</w:t>
+      </w:r>
+      <w:bookmarkStart w:id="0" w:name="_GoBack"/>
+      <w:bookmarkEnd w:id="0"/>
+      <w:r>
+        <w:rPr>
+          <w:rFonts w:ascii="Verdana" w:hAnsi="Verdana"/>
+          <w:b/>
+          <w:sz w:val="48"/>
+        </w:rPr>
+        <w:t>TROGEN</w:t>
       </w:r>
       <w:r>
         <w:rPr>
@@ -535,17 +553,7 @@
           <w:sz w:val="32"/>
           <w:szCs w:val="32"/>
         </w:rPr>
-        <w:t xml:space="preserve">Chunk function which check in which chunk is </w:t>
-      </w:r>
-      <w:bookmarkStart w:id="0" w:name="_GoBack"/>
-      <w:bookmarkEnd w:id="0"/>
-      <w:r>
-        <w:rPr>
-          <w:rFonts w:ascii="Verdana" w:hAnsi="Verdana"/>
-          <w:sz w:val="32"/>
-          <w:szCs w:val="32"/>
-        </w:rPr>
-        <w:t>certain block is now fixed.</w:t>
+        <w:t>Chunk function which check in which chunk is certain block is now fixed.</w:t>
       </w:r>
     </w:p>
     <w:p>
@@ -4622,7 +4630,7 @@
 </file>
 
 <file path=customXml/itemProps1.xml><?xml version="1.0" encoding="utf-8"?>
-<ds:datastoreItem xmlns:ds="http://schemas.openxmlformats.org/officeDocument/2006/customXml" ds:itemID="{CD5F7EAC-1E0F-4051-BA71-2F2138859D31}">
+<ds:datastoreItem xmlns:ds="http://schemas.openxmlformats.org/officeDocument/2006/customXml" ds:itemID="{EE8A95BD-3968-4B06-B0B5-30E7D3CBF6B7}">
   <ds:schemaRefs>
     <ds:schemaRef ds:uri="http://schemas.openxmlformats.org/officeDocument/2006/bibliography"/>
   </ds:schemaRefs>

</xml_diff>

<commit_message>
Implementing weapon models. First guns! For V15 OXYGEN U01!
</commit_message>
<xml_diff>
--- a/changelog.docx
+++ b/changelog.docx
@@ -44,7 +44,7 @@
           <w:b/>
           <w:sz w:val="48"/>
         </w:rPr>
-        <w:t>4</w:t>
+        <w:t>5</w:t>
       </w:r>
       <w:r>
         <w:rPr>
@@ -60,25 +60,7 @@
           <w:b/>
           <w:sz w:val="48"/>
         </w:rPr>
-        <w:t>N</w:t>
-      </w:r>
-      <w:r>
-        <w:rPr>
-          <w:rFonts w:ascii="Verdana" w:hAnsi="Verdana"/>
-          <w:b/>
-          <w:sz w:val="48"/>
-        </w:rPr>
-        <w:t>I</w:t>
-      </w:r>
-      <w:bookmarkStart w:id="0" w:name="_GoBack"/>
-      <w:bookmarkEnd w:id="0"/>
-      <w:r>
-        <w:rPr>
-          <w:rFonts w:ascii="Verdana" w:hAnsi="Verdana"/>
-          <w:b/>
-          <w:sz w:val="48"/>
-        </w:rPr>
-        <w:t>TROGEN</w:t>
+        <w:t>OXYGEN</w:t>
       </w:r>
       <w:r>
         <w:rPr>
@@ -176,7 +158,7 @@
                     <pic:cNvPicPr/>
                   </pic:nvPicPr>
                   <pic:blipFill>
-                    <a:blip r:embed="rId7" cstate="print">
+                    <a:blip r:embed="rId9" cstate="print">
                       <a:extLst>
                         <a:ext uri="{28A0092B-C50C-407E-A947-70E740481C1C}">
                           <a14:useLocalDpi xmlns:a14="http://schemas.microsoft.com/office/drawing/2010/main" val="0"/>
@@ -228,39 +210,750 @@
         <w:pStyle w:val="NoSpacing"/>
         <w:numPr>
           <w:ilvl w:val="0"/>
-          <w:numId w:val="19"/>
+          <w:numId w:val="22"/>
         </w:numPr>
         <w:rPr>
           <w:rFonts w:ascii="Verdana" w:hAnsi="Verdana"/>
+          <w:sz w:val="32"/>
+          <w:szCs w:val="32"/>
+        </w:rPr>
+      </w:pPr>
+      <w:r>
+        <w:rPr>
+          <w:rFonts w:ascii="Verdana" w:hAnsi="Verdana"/>
+          <w:sz w:val="32"/>
+          <w:szCs w:val="32"/>
+        </w:rPr>
+        <w:t xml:space="preserve">Single player has been unlocked. Player is able to wield one of the six guns (Beretta pistol, </w:t>
+      </w:r>
+      <w:r>
+        <w:rPr>
+          <w:rFonts w:ascii="Verdana" w:hAnsi="Verdana"/>
+          <w:sz w:val="32"/>
+          <w:szCs w:val="32"/>
+        </w:rPr>
+        <w:t>SMG P90</w:t>
+      </w:r>
+      <w:r>
+        <w:rPr>
+          <w:rFonts w:ascii="Verdana" w:hAnsi="Verdana"/>
+          <w:sz w:val="32"/>
+          <w:szCs w:val="32"/>
+        </w:rPr>
+        <w:t xml:space="preserve">, Shotgun, </w:t>
+      </w:r>
+      <w:bookmarkStart w:id="0" w:name="_GoBack"/>
+      <w:bookmarkEnd w:id="0"/>
+      <w:r>
+        <w:rPr>
+          <w:rFonts w:ascii="Verdana" w:hAnsi="Verdana"/>
+          <w:sz w:val="32"/>
+          <w:szCs w:val="32"/>
+        </w:rPr>
+        <w:t>Assault rifle AK-47</w:t>
+      </w:r>
+      <w:r>
+        <w:rPr>
+          <w:rFonts w:ascii="Verdana" w:hAnsi="Verdana"/>
+          <w:sz w:val="32"/>
+          <w:szCs w:val="32"/>
+        </w:rPr>
+        <w:t>, M60, Sniper Rifle). However there’re no animations for these guns.</w:t>
+      </w:r>
+      <w:r>
+        <w:rPr>
+          <w:rFonts w:ascii="Verdana" w:hAnsi="Verdana"/>
+          <w:sz w:val="32"/>
+          <w:szCs w:val="32"/>
+        </w:rPr>
+        <w:t xml:space="preserve"> Neither fire or alt-fire have been implemented yet.</w:t>
+      </w:r>
+    </w:p>
+    <w:p>
+      <w:pPr>
+        <w:pStyle w:val="NoSpacing"/>
+        <w:ind w:left="360"/>
+        <w:rPr>
+          <w:rFonts w:ascii="Verdana" w:hAnsi="Verdana"/>
+          <w:sz w:val="32"/>
+          <w:szCs w:val="32"/>
+        </w:rPr>
+      </w:pPr>
+    </w:p>
+    <w:p>
+      <w:pPr>
+        <w:pStyle w:val="NoSpacing"/>
+        <w:numPr>
+          <w:ilvl w:val="0"/>
+          <w:numId w:val="22"/>
+        </w:numPr>
+        <w:rPr>
+          <w:rFonts w:ascii="Verdana" w:hAnsi="Verdana"/>
+          <w:sz w:val="32"/>
+          <w:szCs w:val="32"/>
+        </w:rPr>
+      </w:pPr>
+      <w:r>
+        <w:rPr>
+          <w:rFonts w:ascii="Verdana" w:hAnsi="Verdana"/>
+          <w:sz w:val="32"/>
+          <w:szCs w:val="32"/>
+        </w:rPr>
+        <w:t xml:space="preserve">Entering single player will cancel editor mode and prevent modifying the level unless player choose to go into editor and load level again. </w:t>
+      </w:r>
+      <w:r>
+        <w:rPr>
+          <w:rFonts w:ascii="Verdana" w:hAnsi="Verdana"/>
+          <w:sz w:val="32"/>
+          <w:szCs w:val="32"/>
+        </w:rPr>
+        <w:t>Player</w:t>
+      </w:r>
+      <w:r>
+        <w:rPr>
+          <w:rFonts w:ascii="Verdana" w:hAnsi="Verdana"/>
+          <w:sz w:val="32"/>
+          <w:szCs w:val="32"/>
+        </w:rPr>
+        <w:t xml:space="preserve"> will be prompted “</w:t>
+      </w:r>
+      <w:r>
+        <w:rPr>
+          <w:rFonts w:ascii="Verdana" w:hAnsi="Verdana"/>
+          <w:sz w:val="32"/>
+          <w:szCs w:val="32"/>
+        </w:rPr>
+        <w:t>Start New G</w:t>
+      </w:r>
+      <w:r>
+        <w:rPr>
+          <w:rFonts w:ascii="Verdana" w:hAnsi="Verdana"/>
+          <w:sz w:val="32"/>
+          <w:szCs w:val="32"/>
+        </w:rPr>
+        <w:t>ame?”</w:t>
+      </w:r>
+      <w:r>
+        <w:rPr>
+          <w:rFonts w:ascii="Verdana" w:hAnsi="Verdana"/>
+          <w:sz w:val="32"/>
+          <w:szCs w:val="32"/>
+        </w:rPr>
+        <w:t xml:space="preserve"> and if answer is yes or y game will switch to Single Player mode.</w:t>
+      </w:r>
+    </w:p>
+    <w:p>
+      <w:pPr>
+        <w:pStyle w:val="NoSpacing"/>
+        <w:rPr>
+          <w:rFonts w:ascii="Verdana" w:hAnsi="Verdana"/>
+          <w:sz w:val="32"/>
+          <w:szCs w:val="32"/>
+        </w:rPr>
+      </w:pPr>
+    </w:p>
+    <w:p>
+      <w:pPr>
+        <w:pStyle w:val="NoSpacing"/>
+        <w:rPr>
+          <w:rFonts w:ascii="Verdana" w:hAnsi="Verdana"/>
+          <w:b/>
+          <w:color w:val="FFC000"/>
+          <w:sz w:val="48"/>
+        </w:rPr>
+      </w:pPr>
+      <w:r>
+        <w:rPr>
+          <w:rFonts w:ascii="Verdana" w:hAnsi="Verdana"/>
+          <w:b/>
+          <w:color w:val="FFC000"/>
+          <w:sz w:val="48"/>
+        </w:rPr>
+        <w:t>CHANGES:</w:t>
+      </w:r>
+    </w:p>
+    <w:p>
+      <w:pPr>
+        <w:pStyle w:val="NoSpacing"/>
+        <w:numPr>
+          <w:ilvl w:val="0"/>
+          <w:numId w:val="22"/>
+        </w:numPr>
+        <w:rPr>
+          <w:rFonts w:ascii="Verdana" w:hAnsi="Verdana"/>
+          <w:sz w:val="32"/>
+          <w:szCs w:val="32"/>
+        </w:rPr>
+      </w:pPr>
+      <w:r>
+        <w:rPr>
+          <w:rFonts w:ascii="Verdana" w:hAnsi="Verdana"/>
+          <w:sz w:val="32"/>
+          <w:szCs w:val="32"/>
+        </w:rPr>
+        <w:t xml:space="preserve">Game support modifications. Make your own dsynergy.zip archive or make folders </w:t>
+      </w:r>
+      <w:r>
+        <w:rPr>
+          <w:rFonts w:ascii="Verdana" w:hAnsi="Verdana"/>
+          <w:sz w:val="32"/>
+          <w:szCs w:val="32"/>
+        </w:rPr>
+        <w:t>as they’re in archive structure by entries.</w:t>
+      </w:r>
+      <w:r>
+        <w:rPr>
+          <w:rFonts w:ascii="Verdana" w:hAnsi="Verdana"/>
+          <w:sz w:val="32"/>
+          <w:szCs w:val="32"/>
+        </w:rPr>
+        <w:t xml:space="preserve"> Game will first check for files in those folders and if they’re not found then will those from archive. Not having game assets at all will result in error.</w:t>
+      </w:r>
+    </w:p>
+    <w:p>
+      <w:pPr>
+        <w:pStyle w:val="ListParagraph"/>
+        <w:rPr>
+          <w:rFonts w:ascii="Verdana" w:hAnsi="Verdana"/>
+          <w:sz w:val="32"/>
+          <w:szCs w:val="32"/>
+        </w:rPr>
+      </w:pPr>
+    </w:p>
+    <w:p>
+      <w:pPr>
+        <w:pStyle w:val="NoSpacing"/>
+        <w:rPr>
+          <w:rFonts w:ascii="Verdana" w:hAnsi="Verdana"/>
+          <w:b/>
+          <w:color w:val="A6A6A6" w:themeColor="background1" w:themeShade="A6"/>
+          <w:sz w:val="48"/>
+        </w:rPr>
+      </w:pPr>
+      <w:r>
+        <w:rPr>
+          <w:rFonts w:ascii="Verdana" w:hAnsi="Verdana"/>
+          <w:b/>
+          <w:color w:val="A6A6A6" w:themeColor="background1" w:themeShade="A6"/>
+          <w:sz w:val="48"/>
+        </w:rPr>
+        <w:t>KNOWN ISSUESS:</w:t>
+      </w:r>
+    </w:p>
+    <w:p>
+      <w:pPr>
+        <w:pStyle w:val="NoSpacing"/>
+        <w:numPr>
+          <w:ilvl w:val="0"/>
+          <w:numId w:val="23"/>
+        </w:numPr>
+        <w:rPr>
+          <w:rFonts w:ascii="Verdana" w:hAnsi="Verdana"/>
+          <w:b/>
+          <w:sz w:val="48"/>
+        </w:rPr>
+      </w:pPr>
+      <w:r>
+        <w:rPr>
+          <w:rFonts w:ascii="Verdana" w:hAnsi="Verdana"/>
+          <w:sz w:val="32"/>
+          <w:szCs w:val="32"/>
+        </w:rPr>
+        <w:t>Player weapon will be drawn behind blocks if player is close enough to blocks or cause collision with them.</w:t>
+      </w:r>
+    </w:p>
+    <w:p>
+      <w:pPr>
+        <w:pStyle w:val="NoSpacing"/>
+        <w:ind w:left="360"/>
+        <w:rPr>
+          <w:rFonts w:ascii="Verdana" w:hAnsi="Verdana"/>
+          <w:sz w:val="32"/>
+          <w:szCs w:val="32"/>
+        </w:rPr>
+      </w:pPr>
+    </w:p>
+    <w:p>
+      <w:pPr>
+        <w:pStyle w:val="NoSpacing"/>
+        <w:rPr>
+          <w:rFonts w:ascii="Verdana" w:hAnsi="Verdana"/>
           <w:color w:val="00B050"/>
           <w:sz w:val="32"/>
           <w:szCs w:val="32"/>
         </w:rPr>
       </w:pPr>
-      <w:r>
-        <w:rPr>
-          <w:rFonts w:ascii="Verdana" w:hAnsi="Verdana"/>
-          <w:sz w:val="32"/>
-          <w:szCs w:val="32"/>
-        </w:rPr>
-        <w:t>Both m</w:t>
-      </w:r>
-      <w:r>
-        <w:rPr>
-          <w:rFonts w:ascii="Verdana" w:hAnsi="Verdana"/>
-          <w:sz w:val="32"/>
-          <w:szCs w:val="32"/>
-        </w:rPr>
-        <w:t>usic and sounds can be played from the game</w:t>
-      </w:r>
-      <w:r>
-        <w:rPr>
-          <w:rFonts w:ascii="Verdana" w:hAnsi="Verdana"/>
-          <w:sz w:val="32"/>
-          <w:szCs w:val="32"/>
+    </w:p>
+    <w:p>
+      <w:pPr>
+        <w:pStyle w:val="NoSpacing"/>
+        <w:rPr>
+          <w:rFonts w:ascii="Verdana" w:hAnsi="Verdana"/>
+          <w:color w:val="00B050"/>
+          <w:sz w:val="32"/>
+          <w:szCs w:val="32"/>
+        </w:rPr>
+      </w:pPr>
+    </w:p>
+    <w:p>
+      <w:pPr>
+        <w:pStyle w:val="NoSpacing"/>
+        <w:rPr>
+          <w:rFonts w:ascii="Verdana" w:hAnsi="Verdana"/>
+          <w:color w:val="00B050"/>
+          <w:sz w:val="32"/>
+          <w:szCs w:val="32"/>
+        </w:rPr>
+      </w:pPr>
+    </w:p>
+    <w:p>
+      <w:pPr>
+        <w:pStyle w:val="NoSpacing"/>
+        <w:rPr>
+          <w:rFonts w:ascii="Verdana" w:hAnsi="Verdana"/>
+          <w:b/>
+          <w:sz w:val="48"/>
+        </w:rPr>
+      </w:pPr>
+      <w:r>
+        <w:rPr>
+          <w:rFonts w:ascii="Verdana" w:hAnsi="Verdana"/>
+          <w:b/>
+          <w:sz w:val="48"/>
+        </w:rPr>
+        <w:t>Game assets structure (by entries)</w:t>
+      </w:r>
+      <w:r>
+        <w:rPr>
+          <w:rFonts w:ascii="Verdana" w:hAnsi="Verdana"/>
+          <w:b/>
+          <w:sz w:val="48"/>
+        </w:rPr>
+        <w:t>:</w:t>
+      </w:r>
+    </w:p>
+    <w:p>
+      <w:pPr>
+        <w:pStyle w:val="NoSpacing"/>
+        <w:numPr>
+          <w:ilvl w:val="0"/>
+          <w:numId w:val="22"/>
+        </w:numPr>
+        <w:rPr>
+          <w:rFonts w:ascii="Verdana" w:hAnsi="Verdana"/>
+          <w:b/>
+          <w:sz w:val="48"/>
+        </w:rPr>
+      </w:pPr>
+      <w:r>
+        <w:rPr>
+          <w:rFonts w:ascii="Verdana" w:hAnsi="Verdana"/>
+          <w:b/>
+          <w:sz w:val="48"/>
+        </w:rPr>
+        <w:t xml:space="preserve">effects </w:t>
+      </w:r>
+      <w:r>
+        <w:rPr>
+          <w:rFonts w:ascii="Verdana" w:hAnsi="Verdana"/>
+          <w:sz w:val="48"/>
+        </w:rPr>
+        <w:t xml:space="preserve">– contains </w:t>
+      </w:r>
+      <w:proofErr w:type="spellStart"/>
+      <w:r>
+        <w:rPr>
+          <w:rFonts w:ascii="Verdana" w:hAnsi="Verdana"/>
+          <w:sz w:val="48"/>
+        </w:rPr>
+        <w:t>shaders</w:t>
+      </w:r>
+      <w:proofErr w:type="spellEnd"/>
+      <w:r>
+        <w:rPr>
+          <w:rFonts w:ascii="Verdana" w:hAnsi="Verdana"/>
+          <w:sz w:val="48"/>
+        </w:rPr>
+        <w:t xml:space="preserve"> (according to the OpenGL 3.3 and GLSL 3.3)</w:t>
+      </w:r>
+      <w:r>
+        <w:rPr>
+          <w:rFonts w:ascii="Verdana" w:hAnsi="Verdana"/>
+          <w:sz w:val="48"/>
+        </w:rPr>
+        <w:t>;</w:t>
+      </w:r>
+    </w:p>
+    <w:p>
+      <w:pPr>
+        <w:pStyle w:val="NoSpacing"/>
+        <w:numPr>
+          <w:ilvl w:val="0"/>
+          <w:numId w:val="22"/>
+        </w:numPr>
+        <w:rPr>
+          <w:rFonts w:ascii="Verdana" w:hAnsi="Verdana"/>
+          <w:b/>
+          <w:sz w:val="48"/>
+        </w:rPr>
+      </w:pPr>
+      <w:proofErr w:type="spellStart"/>
+      <w:r>
+        <w:rPr>
+          <w:rFonts w:ascii="Verdana" w:hAnsi="Verdana"/>
+          <w:b/>
+          <w:sz w:val="48"/>
+        </w:rPr>
+        <w:t>intrface</w:t>
+      </w:r>
+      <w:proofErr w:type="spellEnd"/>
+      <w:r>
+        <w:rPr>
+          <w:rFonts w:ascii="Verdana" w:hAnsi="Verdana"/>
+          <w:b/>
+          <w:sz w:val="48"/>
+        </w:rPr>
+        <w:t xml:space="preserve"> </w:t>
+      </w:r>
+      <w:r>
+        <w:rPr>
+          <w:rFonts w:ascii="Verdana" w:hAnsi="Verdana"/>
+          <w:sz w:val="48"/>
+        </w:rPr>
+        <w:t>– loading images for interface such as crosshairs, fonts (F2IBuilder) and stuff for menus;</w:t>
+      </w:r>
+    </w:p>
+    <w:p>
+      <w:pPr>
+        <w:pStyle w:val="NoSpacing"/>
+        <w:numPr>
+          <w:ilvl w:val="0"/>
+          <w:numId w:val="22"/>
+        </w:numPr>
+        <w:rPr>
+          <w:rFonts w:ascii="Verdana" w:hAnsi="Verdana"/>
+          <w:b/>
+          <w:sz w:val="48"/>
+        </w:rPr>
+      </w:pPr>
+      <w:r>
+        <w:rPr>
+          <w:rFonts w:ascii="Verdana" w:hAnsi="Verdana"/>
+          <w:b/>
+          <w:sz w:val="48"/>
+        </w:rPr>
+        <w:t xml:space="preserve">player </w:t>
+      </w:r>
+      <w:r>
+        <w:rPr>
+          <w:rFonts w:ascii="Verdana" w:hAnsi="Verdana"/>
+          <w:sz w:val="48"/>
+        </w:rPr>
+        <w:t>– models (.</w:t>
+      </w:r>
+      <w:proofErr w:type="spellStart"/>
+      <w:r>
+        <w:rPr>
+          <w:rFonts w:ascii="Verdana" w:hAnsi="Verdana"/>
+          <w:sz w:val="48"/>
+        </w:rPr>
+        <w:t>obj</w:t>
+      </w:r>
+      <w:proofErr w:type="spellEnd"/>
+      <w:r>
+        <w:rPr>
+          <w:rFonts w:ascii="Verdana" w:hAnsi="Verdana"/>
+          <w:sz w:val="48"/>
+        </w:rPr>
+        <w:t xml:space="preserve"> format) and textures (.</w:t>
+      </w:r>
+      <w:proofErr w:type="spellStart"/>
+      <w:r>
+        <w:rPr>
+          <w:rFonts w:ascii="Verdana" w:hAnsi="Verdana"/>
+          <w:sz w:val="48"/>
+        </w:rPr>
+        <w:t>png</w:t>
+      </w:r>
+      <w:proofErr w:type="spellEnd"/>
+      <w:r>
+        <w:rPr>
+          <w:rFonts w:ascii="Verdana" w:hAnsi="Verdana"/>
+          <w:sz w:val="48"/>
+        </w:rPr>
+        <w:t xml:space="preserve"> format) for the player assets;</w:t>
+      </w:r>
+    </w:p>
+    <w:p>
+      <w:pPr>
+        <w:pStyle w:val="NoSpacing"/>
+        <w:numPr>
+          <w:ilvl w:val="0"/>
+          <w:numId w:val="22"/>
+        </w:numPr>
+        <w:rPr>
+          <w:rFonts w:ascii="Verdana" w:hAnsi="Verdana"/>
+          <w:b/>
+          <w:sz w:val="48"/>
+        </w:rPr>
+      </w:pPr>
+      <w:r>
+        <w:rPr>
+          <w:rFonts w:ascii="Verdana" w:hAnsi="Verdana"/>
+          <w:b/>
+          <w:sz w:val="48"/>
+        </w:rPr>
+        <w:t xml:space="preserve">sound </w:t>
+      </w:r>
+      <w:r>
+        <w:rPr>
+          <w:rFonts w:ascii="Verdana" w:hAnsi="Verdana"/>
+          <w:sz w:val="48"/>
+        </w:rPr>
+        <w:t xml:space="preserve">– contains music and sound </w:t>
+      </w:r>
+      <w:proofErr w:type="spellStart"/>
+      <w:r>
+        <w:rPr>
+          <w:rFonts w:ascii="Verdana" w:hAnsi="Verdana"/>
+          <w:sz w:val="48"/>
+        </w:rPr>
+        <w:t>fx</w:t>
+      </w:r>
+      <w:proofErr w:type="spellEnd"/>
+      <w:r>
+        <w:rPr>
+          <w:rFonts w:ascii="Verdana" w:hAnsi="Verdana"/>
+          <w:sz w:val="48"/>
+        </w:rPr>
+        <w:t xml:space="preserve"> audio files (.</w:t>
+      </w:r>
+      <w:proofErr w:type="spellStart"/>
+      <w:r>
+        <w:rPr>
+          <w:rFonts w:ascii="Verdana" w:hAnsi="Verdana"/>
+          <w:sz w:val="48"/>
+        </w:rPr>
+        <w:t>ogg</w:t>
+      </w:r>
+      <w:proofErr w:type="spellEnd"/>
+      <w:r>
+        <w:rPr>
+          <w:rFonts w:ascii="Verdana" w:hAnsi="Verdana"/>
+          <w:sz w:val="48"/>
+        </w:rPr>
+        <w:t xml:space="preserve"> format);</w:t>
+      </w:r>
+    </w:p>
+    <w:p>
+      <w:pPr>
+        <w:pStyle w:val="NoSpacing"/>
+        <w:numPr>
+          <w:ilvl w:val="0"/>
+          <w:numId w:val="22"/>
+        </w:numPr>
+        <w:rPr>
+          <w:rFonts w:ascii="Verdana" w:hAnsi="Verdana"/>
+          <w:b/>
+          <w:sz w:val="48"/>
+        </w:rPr>
+      </w:pPr>
+      <w:proofErr w:type="gramStart"/>
+      <w:r>
+        <w:rPr>
+          <w:rFonts w:ascii="Verdana" w:hAnsi="Verdana"/>
+          <w:b/>
+          <w:sz w:val="48"/>
+        </w:rPr>
+        <w:t>world</w:t>
+      </w:r>
+      <w:proofErr w:type="gramEnd"/>
+      <w:r>
+        <w:rPr>
+          <w:rFonts w:ascii="Verdana" w:hAnsi="Verdana"/>
+          <w:b/>
+          <w:sz w:val="48"/>
+        </w:rPr>
+        <w:t xml:space="preserve"> </w:t>
+      </w:r>
+      <w:r>
+        <w:rPr>
+          <w:rFonts w:ascii="Verdana" w:hAnsi="Verdana"/>
+          <w:sz w:val="48"/>
+        </w:rPr>
+        <w:t>– contains models (.</w:t>
+      </w:r>
+      <w:proofErr w:type="spellStart"/>
+      <w:r>
+        <w:rPr>
+          <w:rFonts w:ascii="Verdana" w:hAnsi="Verdana"/>
+          <w:sz w:val="48"/>
+        </w:rPr>
+        <w:t>obj</w:t>
+      </w:r>
+      <w:proofErr w:type="spellEnd"/>
+      <w:r>
+        <w:rPr>
+          <w:rFonts w:ascii="Verdana" w:hAnsi="Verdana"/>
+          <w:sz w:val="48"/>
+        </w:rPr>
+        <w:t xml:space="preserve"> format) and textures (.</w:t>
+      </w:r>
+      <w:proofErr w:type="spellStart"/>
+      <w:r>
+        <w:rPr>
+          <w:rFonts w:ascii="Verdana" w:hAnsi="Verdana"/>
+          <w:sz w:val="48"/>
+        </w:rPr>
+        <w:t>png</w:t>
+      </w:r>
+      <w:proofErr w:type="spellEnd"/>
+      <w:r>
+        <w:rPr>
+          <w:rFonts w:ascii="Verdana" w:hAnsi="Verdana"/>
+          <w:sz w:val="48"/>
+        </w:rPr>
+        <w:t xml:space="preserve"> format) for blocks which make environment as it is.</w:t>
+      </w:r>
+    </w:p>
+    <w:p>
+      <w:pPr>
+        <w:pStyle w:val="NoSpacing"/>
+        <w:rPr>
+          <w:rFonts w:ascii="Verdana" w:hAnsi="Verdana"/>
+          <w:b/>
+          <w:sz w:val="48"/>
+        </w:rPr>
+      </w:pPr>
+      <w:r>
+        <w:rPr>
+          <w:rFonts w:ascii="Verdana" w:hAnsi="Verdana"/>
+          <w:b/>
+          <w:sz w:val="48"/>
+        </w:rPr>
+        <w:t>All five entries constitute together one archive which is dsynergy.zip.</w:t>
+      </w:r>
+    </w:p>
+    <w:p>
+      <w:pPr>
+        <w:pStyle w:val="NoSpacing"/>
+        <w:rPr>
+          <w:rFonts w:ascii="Verdana" w:hAnsi="Verdana"/>
+          <w:b/>
+          <w:sz w:val="48"/>
+        </w:rPr>
+      </w:pPr>
+    </w:p>
+    <w:p>
+      <w:pPr>
+        <w:pStyle w:val="NoSpacing"/>
+        <w:rPr>
+          <w:rFonts w:ascii="Verdana" w:hAnsi="Verdana"/>
+          <w:b/>
+          <w:sz w:val="48"/>
+        </w:rPr>
+      </w:pPr>
+    </w:p>
+    <w:p>
+      <w:pPr>
+        <w:pStyle w:val="NoSpacing"/>
+        <w:rPr>
+          <w:rFonts w:ascii="Verdana" w:hAnsi="Verdana"/>
+          <w:b/>
+          <w:sz w:val="48"/>
+        </w:rPr>
+      </w:pPr>
+    </w:p>
+    <w:p>
+      <w:pPr>
+        <w:pStyle w:val="NoSpacing"/>
+        <w:rPr>
+          <w:rFonts w:ascii="Verdana" w:hAnsi="Verdana"/>
+          <w:b/>
+          <w:sz w:val="48"/>
+        </w:rPr>
+      </w:pPr>
+    </w:p>
+    <w:p>
+      <w:pPr>
+        <w:pStyle w:val="NoSpacing"/>
+        <w:rPr>
+          <w:rFonts w:ascii="Verdana" w:hAnsi="Verdana"/>
+          <w:b/>
+          <w:sz w:val="48"/>
+        </w:rPr>
+      </w:pPr>
+    </w:p>
+    <w:p>
+      <w:pPr>
+        <w:pStyle w:val="NoSpacing"/>
+        <w:rPr>
+          <w:rFonts w:ascii="Verdana" w:hAnsi="Verdana"/>
+          <w:b/>
+          <w:sz w:val="48"/>
+        </w:rPr>
+      </w:pPr>
+    </w:p>
+    <w:p>
+      <w:pPr>
+        <w:pStyle w:val="NoSpacing"/>
+        <w:rPr>
+          <w:rFonts w:ascii="Verdana" w:hAnsi="Verdana"/>
+          <w:b/>
+          <w:sz w:val="48"/>
+        </w:rPr>
+      </w:pPr>
+    </w:p>
+    <w:p>
+      <w:pPr>
+        <w:pStyle w:val="NoSpacing"/>
+        <w:rPr>
+          <w:rFonts w:ascii="Verdana" w:hAnsi="Verdana"/>
+          <w:b/>
+          <w:sz w:val="48"/>
+        </w:rPr>
+      </w:pPr>
+      <w:r>
+        <w:rPr>
+          <w:rFonts w:ascii="Verdana" w:hAnsi="Verdana"/>
+          <w:b/>
+          <w:sz w:val="48"/>
+        </w:rPr>
+        <w:lastRenderedPageBreak/>
+        <w:t>Available commands:</w:t>
+      </w:r>
+    </w:p>
+    <w:p>
+      <w:pPr>
+        <w:pStyle w:val="NoSpacing"/>
+        <w:rPr>
+          <w:rFonts w:ascii="Verdana" w:hAnsi="Verdana"/>
+          <w:sz w:val="40"/>
+        </w:rPr>
+      </w:pPr>
+      <w:r>
+        <w:rPr>
+          <w:rFonts w:ascii="Verdana" w:hAnsi="Verdana"/>
+          <w:sz w:val="40"/>
+        </w:rPr>
+        <w:t xml:space="preserve">In order to type command </w:t>
+      </w:r>
+      <w:proofErr w:type="gramStart"/>
+      <w:r>
+        <w:rPr>
+          <w:rFonts w:ascii="Verdana" w:hAnsi="Verdana"/>
+          <w:sz w:val="40"/>
+        </w:rPr>
+        <w:t>which is equivalent to options setup press key “~”</w:t>
+      </w:r>
+      <w:r>
+        <w:rPr>
+          <w:rFonts w:ascii="Verdana" w:hAnsi="Verdana"/>
+          <w:sz w:val="40"/>
         </w:rPr>
         <w:t>.</w:t>
       </w:r>
+      <w:proofErr w:type="gramEnd"/>
     </w:p>
     <w:p>
       <w:pPr>
@@ -271,19 +964,10 @@
         </w:numPr>
         <w:rPr>
           <w:rFonts w:ascii="Verdana" w:hAnsi="Verdana"/>
-          <w:color w:val="00B050"/>
-          <w:sz w:val="32"/>
-          <w:szCs w:val="32"/>
-        </w:rPr>
-      </w:pPr>
-      <w:r>
-        <w:rPr>
-          <w:rFonts w:ascii="Verdana" w:hAnsi="Verdana"/>
-          <w:sz w:val="32"/>
-          <w:szCs w:val="32"/>
-        </w:rPr>
-        <w:t>Game can be run in debug mode (requires setting it to true in .</w:t>
-      </w:r>
+          <w:sz w:val="32"/>
+          <w:szCs w:val="32"/>
+        </w:rPr>
+      </w:pPr>
       <w:proofErr w:type="spellStart"/>
       <w:r>
         <w:rPr>
@@ -291,7 +975,7 @@
           <w:sz w:val="32"/>
           <w:szCs w:val="32"/>
         </w:rPr>
-        <w:t>ini</w:t>
+        <w:t>fps_max</w:t>
       </w:r>
       <w:proofErr w:type="spellEnd"/>
       <w:r>
@@ -300,23 +984,7 @@
           <w:sz w:val="32"/>
           <w:szCs w:val="32"/>
         </w:rPr>
-        <w:t xml:space="preserve"> file).</w:t>
-      </w:r>
-      <w:r>
-        <w:rPr>
-          <w:rFonts w:ascii="Verdana" w:hAnsi="Verdana"/>
-          <w:sz w:val="32"/>
-          <w:szCs w:val="32"/>
-        </w:rPr>
-        <w:t xml:space="preserve"> It includes writing log into the file.</w:t>
-      </w:r>
-      <w:r>
-        <w:rPr>
-          <w:rFonts w:ascii="Verdana" w:hAnsi="Verdana"/>
-          <w:sz w:val="32"/>
-          <w:szCs w:val="32"/>
-        </w:rPr>
-        <w:t xml:space="preserve"> [</w:t>
+        <w:t>&lt;</w:t>
       </w:r>
       <w:proofErr w:type="spellStart"/>
       <w:r>
@@ -325,7 +993,7 @@
           <w:sz w:val="32"/>
           <w:szCs w:val="32"/>
         </w:rPr>
-        <w:t>JSomnia</w:t>
+        <w:t>num</w:t>
       </w:r>
       <w:proofErr w:type="spellEnd"/>
       <w:r>
@@ -334,59 +1002,77 @@
           <w:sz w:val="32"/>
           <w:szCs w:val="32"/>
         </w:rPr>
-        <w:t>]</w:t>
-      </w:r>
-    </w:p>
-    <w:p>
-      <w:pPr>
-        <w:pStyle w:val="NoSpacing"/>
-        <w:ind w:left="360"/>
-        <w:rPr>
-          <w:rFonts w:ascii="Verdana" w:hAnsi="Verdana"/>
-          <w:color w:val="00B050"/>
-          <w:sz w:val="32"/>
-          <w:szCs w:val="32"/>
-        </w:rPr>
-      </w:pPr>
-      <w:r>
-        <w:rPr>
-          <w:rFonts w:ascii="Verdana" w:hAnsi="Verdana"/>
-          <w:sz w:val="32"/>
-          <w:szCs w:val="32"/>
-        </w:rPr>
-        <w:t>File is named according to the current date and time.</w:t>
-      </w:r>
-    </w:p>
-    <w:p>
-      <w:pPr>
-        <w:pStyle w:val="NoSpacing"/>
-        <w:ind w:left="360"/>
-        <w:rPr>
-          <w:rFonts w:ascii="Verdana" w:hAnsi="Verdana"/>
-          <w:color w:val="00B050"/>
-          <w:sz w:val="32"/>
-          <w:szCs w:val="32"/>
-        </w:rPr>
-      </w:pPr>
-    </w:p>
-    <w:p>
-      <w:pPr>
-        <w:pStyle w:val="NoSpacing"/>
-        <w:rPr>
-          <w:rFonts w:ascii="Verdana" w:hAnsi="Verdana"/>
-          <w:b/>
-          <w:color w:val="FF0000"/>
-          <w:sz w:val="48"/>
-        </w:rPr>
-      </w:pPr>
-      <w:r>
-        <w:rPr>
-          <w:rFonts w:ascii="Verdana" w:hAnsi="Verdana"/>
-          <w:b/>
-          <w:color w:val="FF0000"/>
-          <w:sz w:val="48"/>
-        </w:rPr>
-        <w:t>FIXES:</w:t>
+        <w:t xml:space="preserve">&gt;, </w:t>
+      </w:r>
+      <w:proofErr w:type="spellStart"/>
+      <w:r>
+        <w:rPr>
+          <w:rFonts w:ascii="Verdana" w:hAnsi="Verdana"/>
+          <w:sz w:val="32"/>
+          <w:szCs w:val="32"/>
+        </w:rPr>
+        <w:t>fpsMax</w:t>
+      </w:r>
+      <w:proofErr w:type="spellEnd"/>
+      <w:r>
+        <w:rPr>
+          <w:rFonts w:ascii="Verdana" w:hAnsi="Verdana"/>
+          <w:sz w:val="32"/>
+          <w:szCs w:val="32"/>
+        </w:rPr>
+        <w:t>&lt;</w:t>
+      </w:r>
+      <w:proofErr w:type="spellStart"/>
+      <w:r>
+        <w:rPr>
+          <w:rFonts w:ascii="Verdana" w:hAnsi="Verdana"/>
+          <w:sz w:val="32"/>
+          <w:szCs w:val="32"/>
+        </w:rPr>
+        <w:t>num</w:t>
+      </w:r>
+      <w:proofErr w:type="spellEnd"/>
+      <w:r>
+        <w:rPr>
+          <w:rFonts w:ascii="Verdana" w:hAnsi="Verdana"/>
+          <w:sz w:val="32"/>
+          <w:szCs w:val="32"/>
+        </w:rPr>
+        <w:t xml:space="preserve">&gt;: allowing </w:t>
+      </w:r>
+      <w:proofErr w:type="gramStart"/>
+      <w:r>
+        <w:rPr>
+          <w:rFonts w:ascii="Verdana" w:hAnsi="Verdana"/>
+          <w:sz w:val="32"/>
+          <w:szCs w:val="32"/>
+        </w:rPr>
+        <w:t>to change</w:t>
+      </w:r>
+      <w:proofErr w:type="gramEnd"/>
+      <w:r>
+        <w:rPr>
+          <w:rFonts w:ascii="Verdana" w:hAnsi="Verdana"/>
+          <w:sz w:val="32"/>
+          <w:szCs w:val="32"/>
+        </w:rPr>
+        <w:t xml:space="preserve"> max fps</w:t>
+      </w:r>
+      <w:r>
+        <w:rPr>
+          <w:rFonts w:ascii="Verdana" w:hAnsi="Verdana"/>
+          <w:sz w:val="32"/>
+          <w:szCs w:val="32"/>
+        </w:rPr>
+        <w:t xml:space="preserve"> (it must be positive number)</w:t>
+      </w:r>
+      <w:r>
+        <w:rPr>
+          <w:rFonts w:ascii="Verdana" w:hAnsi="Verdana"/>
+          <w:sz w:val="32"/>
+          <w:szCs w:val="32"/>
+        </w:rPr>
+        <w:t>.</w:t>
       </w:r>
     </w:p>
     <w:p>
@@ -398,36 +1084,35 @@
         </w:numPr>
         <w:rPr>
           <w:rFonts w:ascii="Verdana" w:hAnsi="Verdana"/>
-          <w:color w:val="00B050"/>
-          <w:sz w:val="32"/>
-          <w:szCs w:val="32"/>
-        </w:rPr>
-      </w:pPr>
-      <w:r>
-        <w:rPr>
-          <w:rFonts w:ascii="Verdana" w:hAnsi="Verdana"/>
-          <w:sz w:val="32"/>
-          <w:szCs w:val="32"/>
-        </w:rPr>
-        <w:t xml:space="preserve">Reading water effects from the </w:t>
-      </w:r>
-      <w:proofErr w:type="spellStart"/>
-      <w:r>
-        <w:rPr>
-          <w:rFonts w:ascii="Verdana" w:hAnsi="Verdana"/>
-          <w:sz w:val="32"/>
-          <w:szCs w:val="32"/>
-        </w:rPr>
-        <w:t>ini</w:t>
-      </w:r>
-      <w:proofErr w:type="spellEnd"/>
-      <w:r>
-        <w:rPr>
-          <w:rFonts w:ascii="Verdana" w:hAnsi="Verdana"/>
-          <w:sz w:val="32"/>
-          <w:szCs w:val="32"/>
-        </w:rPr>
-        <w:t>.</w:t>
+          <w:sz w:val="32"/>
+          <w:szCs w:val="32"/>
+        </w:rPr>
+      </w:pPr>
+      <w:proofErr w:type="gramStart"/>
+      <w:r>
+        <w:rPr>
+          <w:rFonts w:ascii="Verdana" w:hAnsi="Verdana"/>
+          <w:sz w:val="32"/>
+          <w:szCs w:val="32"/>
+        </w:rPr>
+        <w:t>resolution&lt;</w:t>
+      </w:r>
+      <w:proofErr w:type="gramEnd"/>
+      <w:r>
+        <w:rPr>
+          <w:rFonts w:ascii="Verdana" w:hAnsi="Verdana"/>
+          <w:sz w:val="32"/>
+          <w:szCs w:val="32"/>
+        </w:rPr>
+        <w:t>width&gt;&lt;height&gt;, res&lt;width&gt;&lt;height&gt;: allowing to change resolution (min resolution is 640x480 whilst</w:t>
+      </w:r>
+      <w:r>
+        <w:rPr>
+          <w:rFonts w:ascii="Verdana" w:hAnsi="Verdana"/>
+          <w:sz w:val="32"/>
+          <w:szCs w:val="32"/>
+        </w:rPr>
+        <w:t xml:space="preserve"> max is your native resolution).</w:t>
       </w:r>
     </w:p>
     <w:p>
@@ -439,18 +1124,55 @@
         </w:numPr>
         <w:rPr>
           <w:rFonts w:ascii="Verdana" w:hAnsi="Verdana"/>
-          <w:color w:val="00B050"/>
-          <w:sz w:val="32"/>
-          <w:szCs w:val="32"/>
-        </w:rPr>
-      </w:pPr>
-      <w:r>
-        <w:rPr>
-          <w:rFonts w:ascii="Verdana" w:hAnsi="Verdana"/>
-          <w:sz w:val="32"/>
-          <w:szCs w:val="32"/>
-        </w:rPr>
-        <w:t>Random level generator generates blocks correctly (same number that was requested).</w:t>
+          <w:sz w:val="32"/>
+          <w:szCs w:val="32"/>
+        </w:rPr>
+      </w:pPr>
+      <w:proofErr w:type="spellStart"/>
+      <w:proofErr w:type="gramStart"/>
+      <w:r>
+        <w:rPr>
+          <w:rFonts w:ascii="Verdana" w:hAnsi="Verdana"/>
+          <w:sz w:val="32"/>
+          <w:szCs w:val="32"/>
+        </w:rPr>
+        <w:t>fullscreen</w:t>
+      </w:r>
+      <w:proofErr w:type="spellEnd"/>
+      <w:proofErr w:type="gramEnd"/>
+      <w:r>
+        <w:rPr>
+          <w:rFonts w:ascii="Verdana" w:hAnsi="Verdana"/>
+          <w:sz w:val="32"/>
+          <w:szCs w:val="32"/>
+        </w:rPr>
+        <w:t>:</w:t>
+      </w:r>
+      <w:r>
+        <w:rPr>
+          <w:rFonts w:ascii="Verdana" w:hAnsi="Verdana"/>
+          <w:sz w:val="32"/>
+          <w:szCs w:val="32"/>
+        </w:rPr>
+        <w:t xml:space="preserve"> makes your game run </w:t>
+      </w:r>
+      <w:proofErr w:type="spellStart"/>
+      <w:r>
+        <w:rPr>
+          <w:rFonts w:ascii="Verdana" w:hAnsi="Verdana"/>
+          <w:sz w:val="32"/>
+          <w:szCs w:val="32"/>
+        </w:rPr>
+        <w:t>fullscreen</w:t>
+      </w:r>
+      <w:proofErr w:type="spellEnd"/>
+      <w:r>
+        <w:rPr>
+          <w:rFonts w:ascii="Verdana" w:hAnsi="Verdana"/>
+          <w:sz w:val="32"/>
+          <w:szCs w:val="32"/>
+        </w:rPr>
+        <w:t>.</w:t>
       </w:r>
     </w:p>
     <w:p>
@@ -462,19 +1184,10 @@
         </w:numPr>
         <w:rPr>
           <w:rFonts w:ascii="Verdana" w:hAnsi="Verdana"/>
-          <w:color w:val="00B050"/>
-          <w:sz w:val="32"/>
-          <w:szCs w:val="32"/>
-        </w:rPr>
-      </w:pPr>
-      <w:r>
-        <w:rPr>
-          <w:rFonts w:ascii="Verdana" w:hAnsi="Verdana"/>
-          <w:sz w:val="32"/>
-          <w:szCs w:val="32"/>
-        </w:rPr>
-        <w:t>Loading randmax.dat doesn’t result in “loading level failed!</w:t>
-      </w:r>
+          <w:sz w:val="32"/>
+          <w:szCs w:val="32"/>
+        </w:rPr>
+      </w:pPr>
       <w:proofErr w:type="gramStart"/>
       <w:r>
         <w:rPr>
@@ -482,9 +1195,25 @@
           <w:sz w:val="32"/>
           <w:szCs w:val="32"/>
         </w:rPr>
-        <w:t>”.</w:t>
+        <w:t>windowed</w:t>
       </w:r>
       <w:proofErr w:type="gramEnd"/>
+      <w:r>
+        <w:rPr>
+          <w:rFonts w:ascii="Verdana" w:hAnsi="Verdana"/>
+          <w:sz w:val="32"/>
+          <w:szCs w:val="32"/>
+        </w:rPr>
+        <w:t xml:space="preserve">: makes your game run </w:t>
+      </w:r>
+      <w:r>
+        <w:rPr>
+          <w:rFonts w:ascii="Verdana" w:hAnsi="Verdana"/>
+          <w:sz w:val="32"/>
+          <w:szCs w:val="32"/>
+        </w:rPr>
+        <w:t>windowed mode.</w:t>
+      </w:r>
     </w:p>
     <w:p>
       <w:pPr>
@@ -495,34 +1224,113 @@
         </w:numPr>
         <w:rPr>
           <w:rFonts w:ascii="Verdana" w:hAnsi="Verdana"/>
-          <w:color w:val="00B050"/>
-          <w:sz w:val="32"/>
-          <w:szCs w:val="32"/>
-        </w:rPr>
-      </w:pPr>
-      <w:r>
-        <w:rPr>
-          <w:rFonts w:ascii="Verdana" w:hAnsi="Verdana"/>
-          <w:sz w:val="32"/>
-          <w:szCs w:val="32"/>
-        </w:rPr>
-        <w:t>Removing fluid blocks doesn’t result in crash when level is loaded. [</w:t>
-      </w:r>
-      <w:r>
-        <w:rPr>
-          <w:rFonts w:ascii="Verdana" w:hAnsi="Verdana"/>
-          <w:sz w:val="32"/>
-          <w:szCs w:val="32"/>
-        </w:rPr>
-        <w:t xml:space="preserve">TODO </w:t>
-      </w:r>
-      <w:r>
-        <w:rPr>
-          <w:rFonts w:ascii="Verdana" w:hAnsi="Verdana"/>
-          <w:sz w:val="32"/>
-          <w:szCs w:val="32"/>
-        </w:rPr>
-        <w:t>updating camera and fluids]</w:t>
+          <w:sz w:val="32"/>
+          <w:szCs w:val="32"/>
+        </w:rPr>
+      </w:pPr>
+      <w:proofErr w:type="spellStart"/>
+      <w:r>
+        <w:rPr>
+          <w:rFonts w:ascii="Verdana" w:hAnsi="Verdana"/>
+          <w:sz w:val="32"/>
+          <w:szCs w:val="32"/>
+        </w:rPr>
+        <w:t>v_sync</w:t>
+      </w:r>
+      <w:proofErr w:type="spellEnd"/>
+      <w:r>
+        <w:rPr>
+          <w:rFonts w:ascii="Verdana" w:hAnsi="Verdana"/>
+          <w:sz w:val="32"/>
+          <w:szCs w:val="32"/>
+        </w:rPr>
+        <w:t xml:space="preserve"> &lt;bool&gt;</w:t>
+      </w:r>
+      <w:r>
+        <w:rPr>
+          <w:rFonts w:ascii="Verdana" w:hAnsi="Verdana"/>
+          <w:sz w:val="32"/>
+          <w:szCs w:val="32"/>
+        </w:rPr>
+        <w:t xml:space="preserve">, </w:t>
+      </w:r>
+      <w:proofErr w:type="spellStart"/>
+      <w:r>
+        <w:rPr>
+          <w:rFonts w:ascii="Verdana" w:hAnsi="Verdana"/>
+          <w:sz w:val="32"/>
+          <w:szCs w:val="32"/>
+        </w:rPr>
+        <w:t>vsync</w:t>
+      </w:r>
+      <w:proofErr w:type="spellEnd"/>
+      <w:r>
+        <w:rPr>
+          <w:rFonts w:ascii="Verdana" w:hAnsi="Verdana"/>
+          <w:sz w:val="32"/>
+          <w:szCs w:val="32"/>
+        </w:rPr>
+        <w:t>&lt;bool&gt;</w:t>
+      </w:r>
+      <w:r>
+        <w:rPr>
+          <w:rFonts w:ascii="Verdana" w:hAnsi="Verdana"/>
+          <w:sz w:val="32"/>
+          <w:szCs w:val="32"/>
+        </w:rPr>
+        <w:t>: whether</w:t>
+      </w:r>
+      <w:r>
+        <w:rPr>
+          <w:rFonts w:ascii="Verdana" w:hAnsi="Verdana"/>
+          <w:sz w:val="32"/>
+          <w:szCs w:val="32"/>
+        </w:rPr>
+        <w:t xml:space="preserve"> or not you</w:t>
+      </w:r>
+      <w:r>
+        <w:rPr>
+          <w:rFonts w:ascii="Verdana" w:hAnsi="Verdana"/>
+          <w:sz w:val="32"/>
+          <w:szCs w:val="32"/>
+        </w:rPr>
+        <w:t xml:space="preserve"> </w:t>
+      </w:r>
+      <w:proofErr w:type="spellStart"/>
+      <w:r>
+        <w:rPr>
+          <w:rFonts w:ascii="Verdana" w:hAnsi="Verdana"/>
+          <w:sz w:val="32"/>
+          <w:szCs w:val="32"/>
+        </w:rPr>
+        <w:t>wanna</w:t>
+      </w:r>
+      <w:proofErr w:type="spellEnd"/>
+      <w:r>
+        <w:rPr>
+          <w:rFonts w:ascii="Verdana" w:hAnsi="Verdana"/>
+          <w:sz w:val="32"/>
+          <w:szCs w:val="32"/>
+        </w:rPr>
+        <w:t xml:space="preserve"> </w:t>
+      </w:r>
+      <w:proofErr w:type="spellStart"/>
+      <w:r>
+        <w:rPr>
+          <w:rFonts w:ascii="Verdana" w:hAnsi="Verdana"/>
+          <w:sz w:val="32"/>
+          <w:szCs w:val="32"/>
+        </w:rPr>
+        <w:t>vsync</w:t>
+      </w:r>
+      <w:proofErr w:type="spellEnd"/>
+      <w:r>
+        <w:rPr>
+          <w:rFonts w:ascii="Verdana" w:hAnsi="Verdana"/>
+          <w:sz w:val="32"/>
+          <w:szCs w:val="32"/>
+        </w:rPr>
+        <w:t xml:space="preserve"> on or off</w:t>
       </w:r>
       <w:r>
         <w:rPr>
@@ -531,6 +1339,14 @@
           <w:szCs w:val="32"/>
         </w:rPr>
         <w:t>.</w:t>
+      </w:r>
+      <w:r>
+        <w:rPr>
+          <w:rFonts w:ascii="Verdana" w:hAnsi="Verdana"/>
+          <w:sz w:val="32"/>
+          <w:szCs w:val="32"/>
+        </w:rPr>
+        <w:t xml:space="preserve"> If it’s on (you’ve set it to true) your fps is capped to your monitor refresh rate.</w:t>
       </w:r>
     </w:p>
     <w:p>
@@ -542,229 +1358,28 @@
         </w:numPr>
         <w:rPr>
           <w:rFonts w:ascii="Verdana" w:hAnsi="Verdana"/>
-          <w:color w:val="00B050"/>
-          <w:sz w:val="32"/>
-          <w:szCs w:val="32"/>
-        </w:rPr>
-      </w:pPr>
-      <w:r>
-        <w:rPr>
-          <w:rFonts w:ascii="Verdana" w:hAnsi="Verdana"/>
-          <w:sz w:val="32"/>
-          <w:szCs w:val="32"/>
-        </w:rPr>
-        <w:t>Chunk function which check in which chunk is certain block is now fixed.</w:t>
-      </w:r>
-    </w:p>
-    <w:p>
-      <w:pPr>
-        <w:pStyle w:val="NoSpacing"/>
-        <w:rPr>
-          <w:rFonts w:ascii="Verdana" w:hAnsi="Verdana"/>
-          <w:b/>
-          <w:color w:val="FF0000"/>
-          <w:sz w:val="48"/>
-        </w:rPr>
-      </w:pPr>
-    </w:p>
-    <w:p>
-      <w:pPr>
-        <w:pStyle w:val="NoSpacing"/>
-        <w:rPr>
-          <w:rFonts w:ascii="Verdana" w:hAnsi="Verdana"/>
-          <w:color w:val="00B050"/>
-          <w:sz w:val="32"/>
-          <w:szCs w:val="32"/>
-        </w:rPr>
-      </w:pPr>
-    </w:p>
-    <w:p>
-      <w:pPr>
-        <w:pStyle w:val="NoSpacing"/>
-        <w:rPr>
-          <w:rFonts w:ascii="Verdana" w:hAnsi="Verdana"/>
-          <w:color w:val="00B050"/>
-          <w:sz w:val="32"/>
-          <w:szCs w:val="32"/>
-        </w:rPr>
-      </w:pPr>
-    </w:p>
-    <w:p>
-      <w:pPr>
-        <w:pStyle w:val="NoSpacing"/>
-        <w:ind w:left="360"/>
-        <w:rPr>
-          <w:rFonts w:ascii="Verdana" w:hAnsi="Verdana"/>
-          <w:color w:val="00B050"/>
-          <w:sz w:val="32"/>
-          <w:szCs w:val="32"/>
-        </w:rPr>
-      </w:pPr>
-    </w:p>
-    <w:p>
-      <w:pPr>
-        <w:pStyle w:val="NoSpacing"/>
-        <w:ind w:left="360"/>
-        <w:rPr>
-          <w:rFonts w:ascii="Verdana" w:hAnsi="Verdana"/>
-          <w:color w:val="00B050"/>
-          <w:sz w:val="32"/>
-          <w:szCs w:val="32"/>
-        </w:rPr>
-      </w:pPr>
-    </w:p>
-    <w:p>
-      <w:pPr>
-        <w:pStyle w:val="NoSpacing"/>
-        <w:ind w:left="360"/>
-        <w:rPr>
-          <w:rFonts w:ascii="Verdana" w:hAnsi="Verdana"/>
-          <w:color w:val="00B050"/>
-          <w:sz w:val="32"/>
-          <w:szCs w:val="32"/>
-        </w:rPr>
-      </w:pPr>
-    </w:p>
-    <w:p>
-      <w:pPr>
-        <w:pStyle w:val="NoSpacing"/>
-        <w:ind w:left="360"/>
-        <w:rPr>
-          <w:rFonts w:ascii="Verdana" w:hAnsi="Verdana"/>
-          <w:color w:val="00B050"/>
-          <w:sz w:val="32"/>
-          <w:szCs w:val="32"/>
-        </w:rPr>
-      </w:pPr>
-    </w:p>
-    <w:p>
-      <w:pPr>
-        <w:pStyle w:val="NoSpacing"/>
-        <w:ind w:left="360"/>
-        <w:rPr>
-          <w:rFonts w:ascii="Verdana" w:hAnsi="Verdana"/>
-          <w:color w:val="00B050"/>
-          <w:sz w:val="32"/>
-          <w:szCs w:val="32"/>
-        </w:rPr>
-      </w:pPr>
-    </w:p>
-    <w:p>
-      <w:pPr>
-        <w:pStyle w:val="NoSpacing"/>
-        <w:ind w:left="360"/>
-        <w:rPr>
-          <w:rFonts w:ascii="Verdana" w:hAnsi="Verdana"/>
-          <w:color w:val="00B050"/>
-          <w:sz w:val="32"/>
-          <w:szCs w:val="32"/>
-        </w:rPr>
-      </w:pPr>
-    </w:p>
-    <w:p>
-      <w:pPr>
-        <w:pStyle w:val="NoSpacing"/>
-        <w:ind w:left="360"/>
-        <w:rPr>
-          <w:rFonts w:ascii="Verdana" w:hAnsi="Verdana"/>
-          <w:color w:val="00B050"/>
-          <w:sz w:val="32"/>
-          <w:szCs w:val="32"/>
-        </w:rPr>
-      </w:pPr>
-    </w:p>
-    <w:p>
-      <w:pPr>
-        <w:pStyle w:val="NoSpacing"/>
-        <w:ind w:left="360"/>
-        <w:rPr>
-          <w:rFonts w:ascii="Verdana" w:hAnsi="Verdana"/>
-          <w:color w:val="00B050"/>
-          <w:sz w:val="32"/>
-          <w:szCs w:val="32"/>
-        </w:rPr>
-      </w:pPr>
-    </w:p>
-    <w:p>
-      <w:pPr>
-        <w:pStyle w:val="NoSpacing"/>
-        <w:ind w:left="360"/>
-        <w:rPr>
-          <w:rFonts w:ascii="Verdana" w:hAnsi="Verdana"/>
-          <w:color w:val="00B050"/>
-          <w:sz w:val="32"/>
-          <w:szCs w:val="32"/>
-        </w:rPr>
-      </w:pPr>
-    </w:p>
-    <w:p>
-      <w:pPr>
-        <w:pStyle w:val="NoSpacing"/>
-        <w:rPr>
-          <w:rFonts w:ascii="Verdana" w:hAnsi="Verdana"/>
-          <w:color w:val="00B050"/>
-          <w:sz w:val="32"/>
-          <w:szCs w:val="32"/>
-        </w:rPr>
-      </w:pPr>
-    </w:p>
-    <w:p>
-      <w:pPr>
-        <w:pStyle w:val="NoSpacing"/>
-        <w:rPr>
-          <w:rFonts w:ascii="Verdana" w:hAnsi="Verdana"/>
-        </w:rPr>
-      </w:pPr>
-    </w:p>
-    <w:p>
-      <w:pPr>
-        <w:pStyle w:val="NoSpacing"/>
-        <w:rPr>
-          <w:rFonts w:ascii="Verdana" w:hAnsi="Verdana"/>
-          <w:b/>
-          <w:sz w:val="48"/>
-        </w:rPr>
-      </w:pPr>
-      <w:r>
-        <w:rPr>
-          <w:rFonts w:ascii="Verdana" w:hAnsi="Verdana"/>
-          <w:b/>
-          <w:sz w:val="48"/>
-        </w:rPr>
-        <w:t>Available commands:</w:t>
-      </w:r>
-    </w:p>
-    <w:p>
-      <w:pPr>
-        <w:pStyle w:val="NoSpacing"/>
-        <w:rPr>
-          <w:rFonts w:ascii="Verdana" w:hAnsi="Verdana"/>
-          <w:sz w:val="40"/>
-        </w:rPr>
-      </w:pPr>
-      <w:r>
-        <w:rPr>
-          <w:rFonts w:ascii="Verdana" w:hAnsi="Verdana"/>
-          <w:sz w:val="40"/>
-        </w:rPr>
-        <w:t xml:space="preserve">In order to type command </w:t>
-      </w:r>
-      <w:proofErr w:type="gramStart"/>
-      <w:r>
-        <w:rPr>
-          <w:rFonts w:ascii="Verdana" w:hAnsi="Verdana"/>
-          <w:sz w:val="40"/>
-        </w:rPr>
-        <w:t>which is equivalent to options setup press key “~”</w:t>
-      </w:r>
-      <w:r>
-        <w:rPr>
-          <w:rFonts w:ascii="Verdana" w:hAnsi="Verdana"/>
-          <w:sz w:val="40"/>
-        </w:rPr>
-        <w:t>.</w:t>
-      </w:r>
-      <w:proofErr w:type="gramEnd"/>
+          <w:sz w:val="32"/>
+          <w:szCs w:val="32"/>
+        </w:rPr>
+      </w:pPr>
+      <w:proofErr w:type="spellStart"/>
+      <w:r>
+        <w:rPr>
+          <w:rFonts w:ascii="Verdana" w:hAnsi="Verdana"/>
+          <w:sz w:val="32"/>
+          <w:szCs w:val="32"/>
+        </w:rPr>
+        <w:t>water_efects</w:t>
+      </w:r>
+      <w:proofErr w:type="spellEnd"/>
+      <w:r>
+        <w:rPr>
+          <w:rFonts w:ascii="Verdana" w:hAnsi="Verdana"/>
+          <w:sz w:val="32"/>
+          <w:szCs w:val="32"/>
+        </w:rPr>
+        <w:t xml:space="preserve"> &lt;bool&gt;: enables (true) or disables (false) water effects (such as reflection).</w:t>
+      </w:r>
     </w:p>
     <w:p>
       <w:pPr>
@@ -786,7 +1401,7 @@
           <w:sz w:val="32"/>
           <w:szCs w:val="32"/>
         </w:rPr>
-        <w:t>fps_max</w:t>
+        <w:t>mouse_sensitivity</w:t>
       </w:r>
       <w:proofErr w:type="spellEnd"/>
       <w:r>
@@ -822,7 +1437,7 @@
           <w:sz w:val="32"/>
           <w:szCs w:val="32"/>
         </w:rPr>
-        <w:t>fpsMax</w:t>
+        <w:t>msens</w:t>
       </w:r>
       <w:proofErr w:type="spellEnd"/>
       <w:r>
@@ -831,7 +1446,7 @@
           <w:sz w:val="32"/>
           <w:szCs w:val="32"/>
         </w:rPr>
-        <w:t>&lt;</w:t>
+        <w:t xml:space="preserve"> &lt;</w:t>
       </w:r>
       <w:proofErr w:type="spellStart"/>
       <w:r>
@@ -849,41 +1464,7 @@
           <w:sz w:val="32"/>
           <w:szCs w:val="32"/>
         </w:rPr>
-        <w:t xml:space="preserve">&gt;: allowing </w:t>
-      </w:r>
-      <w:proofErr w:type="gramStart"/>
-      <w:r>
-        <w:rPr>
-          <w:rFonts w:ascii="Verdana" w:hAnsi="Verdana"/>
-          <w:sz w:val="32"/>
-          <w:szCs w:val="32"/>
-        </w:rPr>
-        <w:t>to change</w:t>
-      </w:r>
-      <w:proofErr w:type="gramEnd"/>
-      <w:r>
-        <w:rPr>
-          <w:rFonts w:ascii="Verdana" w:hAnsi="Verdana"/>
-          <w:sz w:val="32"/>
-          <w:szCs w:val="32"/>
-        </w:rPr>
-        <w:t xml:space="preserve"> max fps</w:t>
-      </w:r>
-      <w:r>
-        <w:rPr>
-          <w:rFonts w:ascii="Verdana" w:hAnsi="Verdana"/>
-          <w:sz w:val="32"/>
-          <w:szCs w:val="32"/>
-        </w:rPr>
-        <w:t xml:space="preserve"> (it must be positive number)</w:t>
-      </w:r>
-      <w:r>
-        <w:rPr>
-          <w:rFonts w:ascii="Verdana" w:hAnsi="Verdana"/>
-          <w:sz w:val="32"/>
-          <w:szCs w:val="32"/>
-        </w:rPr>
-        <w:t>.</w:t>
+        <w:t>&gt;: sets mouse sensitivity to this value.</w:t>
       </w:r>
     </w:p>
     <w:p>
@@ -906,7 +1487,7 @@
           <w:sz w:val="32"/>
           <w:szCs w:val="32"/>
         </w:rPr>
-        <w:t>resolution&lt;</w:t>
+        <w:t>music</w:t>
       </w:r>
       <w:proofErr w:type="gramEnd"/>
       <w:r>
@@ -915,15 +1496,97 @@
           <w:sz w:val="32"/>
           <w:szCs w:val="32"/>
         </w:rPr>
-        <w:t>width&gt;&lt;height&gt;, res&lt;width&gt;&lt;height&gt;: allowing to change resolution (min resolution is 640x480 whilst</w:t>
-      </w:r>
-      <w:r>
-        <w:rPr>
-          <w:rFonts w:ascii="Verdana" w:hAnsi="Verdana"/>
-          <w:sz w:val="32"/>
-          <w:szCs w:val="32"/>
-        </w:rPr>
-        <w:t xml:space="preserve"> max is your native resolution).</w:t>
+        <w:t xml:space="preserve"> &lt;</w:t>
+      </w:r>
+      <w:proofErr w:type="spellStart"/>
+      <w:r>
+        <w:rPr>
+          <w:rFonts w:ascii="Verdana" w:hAnsi="Verdana"/>
+          <w:sz w:val="32"/>
+          <w:szCs w:val="32"/>
+        </w:rPr>
+        <w:t>num</w:t>
+      </w:r>
+      <w:proofErr w:type="spellEnd"/>
+      <w:r>
+        <w:rPr>
+          <w:rFonts w:ascii="Verdana" w:hAnsi="Verdana"/>
+          <w:sz w:val="32"/>
+          <w:szCs w:val="32"/>
+        </w:rPr>
+        <w:t>&gt;, sound &lt;</w:t>
+      </w:r>
+      <w:proofErr w:type="spellStart"/>
+      <w:r>
+        <w:rPr>
+          <w:rFonts w:ascii="Verdana" w:hAnsi="Verdana"/>
+          <w:sz w:val="32"/>
+          <w:szCs w:val="32"/>
+        </w:rPr>
+        <w:t>num</w:t>
+      </w:r>
+      <w:proofErr w:type="spellEnd"/>
+      <w:r>
+        <w:rPr>
+          <w:rFonts w:ascii="Verdana" w:hAnsi="Verdana"/>
+          <w:sz w:val="32"/>
+          <w:szCs w:val="32"/>
+        </w:rPr>
+        <w:t>&gt; : sets respectively music and sound</w:t>
+      </w:r>
+      <w:r>
+        <w:rPr>
+          <w:rFonts w:ascii="Verdana" w:hAnsi="Verdana"/>
+          <w:sz w:val="32"/>
+          <w:szCs w:val="32"/>
+        </w:rPr>
+        <w:t xml:space="preserve"> volume</w:t>
+      </w:r>
+      <w:r>
+        <w:rPr>
+          <w:rFonts w:ascii="Verdana" w:hAnsi="Verdana"/>
+          <w:sz w:val="32"/>
+          <w:szCs w:val="32"/>
+        </w:rPr>
+        <w:t xml:space="preserve"> </w:t>
+      </w:r>
+      <w:r>
+        <w:rPr>
+          <w:rFonts w:ascii="Verdana" w:hAnsi="Verdana"/>
+          <w:sz w:val="32"/>
+          <w:szCs w:val="32"/>
+        </w:rPr>
+        <w:t>to this value.</w:t>
+      </w:r>
+    </w:p>
+    <w:p>
+      <w:pPr>
+        <w:pStyle w:val="NoSpacing"/>
+        <w:rPr>
+          <w:rFonts w:ascii="Verdana" w:hAnsi="Verdana"/>
+          <w:sz w:val="32"/>
+          <w:szCs w:val="32"/>
+        </w:rPr>
+      </w:pPr>
+    </w:p>
+    <w:p>
+      <w:pPr>
+        <w:pStyle w:val="NoSpacing"/>
+        <w:rPr>
+          <w:rFonts w:ascii="Verdana" w:hAnsi="Verdana"/>
+          <w:b/>
+          <w:sz w:val="48"/>
+          <w:szCs w:val="32"/>
+        </w:rPr>
+      </w:pPr>
+      <w:r>
+        <w:rPr>
+          <w:rFonts w:ascii="Verdana" w:hAnsi="Verdana"/>
+          <w:b/>
+          <w:sz w:val="48"/>
+          <w:szCs w:val="32"/>
+        </w:rPr>
+        <w:t>Notes:</w:t>
       </w:r>
     </w:p>
     <w:p>
@@ -939,51 +1602,13 @@
           <w:szCs w:val="32"/>
         </w:rPr>
       </w:pPr>
-      <w:proofErr w:type="spellStart"/>
-      <w:proofErr w:type="gramStart"/>
-      <w:r>
-        <w:rPr>
-          <w:rFonts w:ascii="Verdana" w:hAnsi="Verdana"/>
-          <w:sz w:val="32"/>
-          <w:szCs w:val="32"/>
-        </w:rPr>
-        <w:t>fullscreen</w:t>
-      </w:r>
-      <w:proofErr w:type="spellEnd"/>
-      <w:proofErr w:type="gramEnd"/>
-      <w:r>
-        <w:rPr>
-          <w:rFonts w:ascii="Verdana" w:hAnsi="Verdana"/>
-          <w:sz w:val="32"/>
-          <w:szCs w:val="32"/>
-        </w:rPr>
-        <w:t>:</w:t>
-      </w:r>
-      <w:r>
-        <w:rPr>
-          <w:rFonts w:ascii="Verdana" w:hAnsi="Verdana"/>
-          <w:sz w:val="32"/>
-          <w:szCs w:val="32"/>
-        </w:rPr>
-        <w:t xml:space="preserve"> makes your game run </w:t>
-      </w:r>
-      <w:proofErr w:type="spellStart"/>
-      <w:r>
-        <w:rPr>
-          <w:rFonts w:ascii="Verdana" w:hAnsi="Verdana"/>
-          <w:sz w:val="32"/>
-          <w:szCs w:val="32"/>
-        </w:rPr>
-        <w:t>fullscreen</w:t>
-      </w:r>
-      <w:proofErr w:type="spellEnd"/>
-      <w:r>
-        <w:rPr>
-          <w:rFonts w:ascii="Verdana" w:hAnsi="Verdana"/>
-          <w:sz w:val="32"/>
-          <w:szCs w:val="32"/>
-        </w:rPr>
-        <w:t>.</w:t>
+      <w:r>
+        <w:rPr>
+          <w:rFonts w:ascii="Verdana" w:hAnsi="Verdana"/>
+          <w:sz w:val="32"/>
+          <w:szCs w:val="32"/>
+        </w:rPr>
+        <w:t>Game uses LWJGL 3.2.3 since v 02 (BELARUS).</w:t>
       </w:r>
     </w:p>
     <w:p>
@@ -999,31 +1624,109 @@
           <w:szCs w:val="32"/>
         </w:rPr>
       </w:pPr>
-      <w:proofErr w:type="gramStart"/>
-      <w:r>
-        <w:rPr>
-          <w:rFonts w:ascii="Verdana" w:hAnsi="Verdana"/>
-          <w:sz w:val="32"/>
-          <w:szCs w:val="32"/>
-        </w:rPr>
-        <w:t>windowed</w:t>
-      </w:r>
-      <w:proofErr w:type="gramEnd"/>
-      <w:r>
-        <w:rPr>
-          <w:rFonts w:ascii="Verdana" w:hAnsi="Verdana"/>
-          <w:sz w:val="32"/>
-          <w:szCs w:val="32"/>
-        </w:rPr>
-        <w:t xml:space="preserve">: makes your game run </w:t>
-      </w:r>
-      <w:r>
-        <w:rPr>
-          <w:rFonts w:ascii="Verdana" w:hAnsi="Verdana"/>
-          <w:sz w:val="32"/>
-          <w:szCs w:val="32"/>
-        </w:rPr>
-        <w:t>windowed mode.</w:t>
+      <w:r>
+        <w:rPr>
+          <w:rFonts w:ascii="Verdana" w:hAnsi="Verdana"/>
+          <w:sz w:val="32"/>
+          <w:szCs w:val="32"/>
+        </w:rPr>
+        <w:t xml:space="preserve">Game requires Quad Core processor with support for at least 4 threads. </w:t>
+      </w:r>
+      <w:r>
+        <w:rPr>
+          <w:rFonts w:ascii="Verdana" w:hAnsi="Verdana"/>
+          <w:sz w:val="32"/>
+          <w:szCs w:val="32"/>
+        </w:rPr>
+        <w:t>Game implementation is multithread</w:t>
+      </w:r>
+      <w:r>
+        <w:rPr>
+          <w:rFonts w:ascii="Verdana" w:hAnsi="Verdana"/>
+          <w:sz w:val="32"/>
+          <w:szCs w:val="32"/>
+        </w:rPr>
+        <w:t>ed</w:t>
+      </w:r>
+      <w:r>
+        <w:rPr>
+          <w:rFonts w:ascii="Verdana" w:hAnsi="Verdana"/>
+          <w:sz w:val="32"/>
+          <w:szCs w:val="32"/>
+        </w:rPr>
+        <w:t xml:space="preserve"> (</w:t>
+      </w:r>
+      <w:r>
+        <w:rPr>
+          <w:rFonts w:ascii="Verdana" w:hAnsi="Verdana"/>
+          <w:sz w:val="32"/>
+          <w:szCs w:val="32"/>
+        </w:rPr>
+        <w:t xml:space="preserve">at most time </w:t>
+      </w:r>
+      <w:r>
+        <w:rPr>
+          <w:rFonts w:ascii="Verdana" w:hAnsi="Verdana"/>
+          <w:sz w:val="32"/>
+          <w:szCs w:val="32"/>
+        </w:rPr>
+        <w:t>2</w:t>
+      </w:r>
+      <w:r>
+        <w:rPr>
+          <w:rFonts w:ascii="Verdana" w:hAnsi="Verdana"/>
+          <w:sz w:val="32"/>
+          <w:szCs w:val="32"/>
+        </w:rPr>
+        <w:t xml:space="preserve"> </w:t>
+      </w:r>
+      <w:r>
+        <w:rPr>
+          <w:rFonts w:ascii="Verdana" w:hAnsi="Verdana"/>
+          <w:sz w:val="32"/>
+          <w:szCs w:val="32"/>
+        </w:rPr>
+        <w:t>threads will</w:t>
+      </w:r>
+      <w:r>
+        <w:rPr>
+          <w:rFonts w:ascii="Verdana" w:hAnsi="Verdana"/>
+          <w:sz w:val="32"/>
+          <w:szCs w:val="32"/>
+        </w:rPr>
+        <w:t xml:space="preserve"> be active</w:t>
+      </w:r>
+      <w:r>
+        <w:rPr>
+          <w:rFonts w:ascii="Verdana" w:hAnsi="Verdana"/>
+          <w:sz w:val="32"/>
+          <w:szCs w:val="32"/>
+        </w:rPr>
+        <w:t xml:space="preserve"> + 1 additional thread if random level generator is being used</w:t>
+      </w:r>
+      <w:r>
+        <w:rPr>
+          <w:rFonts w:ascii="Verdana" w:hAnsi="Verdana"/>
+          <w:sz w:val="32"/>
+          <w:szCs w:val="32"/>
+        </w:rPr>
+        <w:t xml:space="preserve"> or when loading or saving level is in progress</w:t>
+      </w:r>
+      <w:r>
+        <w:rPr>
+          <w:rFonts w:ascii="Verdana" w:hAnsi="Verdana"/>
+          <w:sz w:val="32"/>
+          <w:szCs w:val="32"/>
+        </w:rPr>
+        <w:t>)</w:t>
+      </w:r>
+      <w:r>
+        <w:rPr>
+          <w:rFonts w:ascii="Verdana" w:hAnsi="Verdana"/>
+          <w:sz w:val="32"/>
+          <w:szCs w:val="32"/>
+        </w:rPr>
+        <w:t>.</w:t>
       </w:r>
     </w:p>
     <w:p>
@@ -1039,125 +1742,61 @@
           <w:szCs w:val="32"/>
         </w:rPr>
       </w:pPr>
-      <w:proofErr w:type="spellStart"/>
-      <w:r>
-        <w:rPr>
-          <w:rFonts w:ascii="Verdana" w:hAnsi="Verdana"/>
-          <w:sz w:val="32"/>
-          <w:szCs w:val="32"/>
-        </w:rPr>
-        <w:t>v_sync</w:t>
-      </w:r>
-      <w:proofErr w:type="spellEnd"/>
-      <w:r>
-        <w:rPr>
-          <w:rFonts w:ascii="Verdana" w:hAnsi="Verdana"/>
-          <w:sz w:val="32"/>
-          <w:szCs w:val="32"/>
-        </w:rPr>
-        <w:t xml:space="preserve"> &lt;bool&gt;</w:t>
-      </w:r>
-      <w:r>
-        <w:rPr>
-          <w:rFonts w:ascii="Verdana" w:hAnsi="Verdana"/>
-          <w:sz w:val="32"/>
-          <w:szCs w:val="32"/>
-        </w:rPr>
-        <w:t xml:space="preserve">, </w:t>
-      </w:r>
-      <w:proofErr w:type="spellStart"/>
-      <w:r>
-        <w:rPr>
-          <w:rFonts w:ascii="Verdana" w:hAnsi="Verdana"/>
-          <w:sz w:val="32"/>
-          <w:szCs w:val="32"/>
-        </w:rPr>
-        <w:t>vsync</w:t>
-      </w:r>
-      <w:proofErr w:type="spellEnd"/>
-      <w:r>
-        <w:rPr>
-          <w:rFonts w:ascii="Verdana" w:hAnsi="Verdana"/>
-          <w:sz w:val="32"/>
-          <w:szCs w:val="32"/>
-        </w:rPr>
-        <w:t>&lt;bool&gt;</w:t>
-      </w:r>
-      <w:r>
-        <w:rPr>
-          <w:rFonts w:ascii="Verdana" w:hAnsi="Verdana"/>
-          <w:sz w:val="32"/>
-          <w:szCs w:val="32"/>
-        </w:rPr>
-        <w:t>: whether</w:t>
-      </w:r>
-      <w:r>
-        <w:rPr>
-          <w:rFonts w:ascii="Verdana" w:hAnsi="Verdana"/>
-          <w:sz w:val="32"/>
-          <w:szCs w:val="32"/>
-        </w:rPr>
-        <w:t xml:space="preserve"> or not you</w:t>
-      </w:r>
-      <w:r>
-        <w:rPr>
-          <w:rFonts w:ascii="Verdana" w:hAnsi="Verdana"/>
-          <w:sz w:val="32"/>
-          <w:szCs w:val="32"/>
-        </w:rPr>
-        <w:t xml:space="preserve"> </w:t>
-      </w:r>
-      <w:proofErr w:type="spellStart"/>
-      <w:r>
-        <w:rPr>
-          <w:rFonts w:ascii="Verdana" w:hAnsi="Verdana"/>
-          <w:sz w:val="32"/>
-          <w:szCs w:val="32"/>
-        </w:rPr>
-        <w:t>wanna</w:t>
-      </w:r>
-      <w:proofErr w:type="spellEnd"/>
-      <w:r>
-        <w:rPr>
-          <w:rFonts w:ascii="Verdana" w:hAnsi="Verdana"/>
-          <w:sz w:val="32"/>
-          <w:szCs w:val="32"/>
-        </w:rPr>
-        <w:t xml:space="preserve"> </w:t>
-      </w:r>
-      <w:proofErr w:type="spellStart"/>
-      <w:r>
-        <w:rPr>
-          <w:rFonts w:ascii="Verdana" w:hAnsi="Verdana"/>
-          <w:sz w:val="32"/>
-          <w:szCs w:val="32"/>
-        </w:rPr>
-        <w:t>vsync</w:t>
-      </w:r>
-      <w:proofErr w:type="spellEnd"/>
-      <w:r>
-        <w:rPr>
-          <w:rFonts w:ascii="Verdana" w:hAnsi="Verdana"/>
-          <w:sz w:val="32"/>
-          <w:szCs w:val="32"/>
-        </w:rPr>
-        <w:t xml:space="preserve"> on or off</w:t>
-      </w:r>
-      <w:r>
-        <w:rPr>
-          <w:rFonts w:ascii="Verdana" w:hAnsi="Verdana"/>
-          <w:sz w:val="32"/>
-          <w:szCs w:val="32"/>
-        </w:rPr>
-        <w:t>.</w:t>
-      </w:r>
-      <w:r>
-        <w:rPr>
-          <w:rFonts w:ascii="Verdana" w:hAnsi="Verdana"/>
-          <w:sz w:val="32"/>
-          <w:szCs w:val="32"/>
-        </w:rPr>
-        <w:t xml:space="preserve"> If it’s on (you’ve set it to true) your fps is capped to your monitor refresh rate.</w:t>
+      <w:r>
+        <w:rPr>
+          <w:rFonts w:ascii="Verdana" w:hAnsi="Verdana"/>
+          <w:sz w:val="32"/>
+          <w:szCs w:val="32"/>
+        </w:rPr>
+        <w:t>Running the game requires</w:t>
+      </w:r>
+      <w:r>
+        <w:rPr>
+          <w:rFonts w:ascii="Verdana" w:hAnsi="Verdana"/>
+          <w:sz w:val="32"/>
+          <w:szCs w:val="32"/>
+        </w:rPr>
+        <w:t xml:space="preserve"> Open</w:t>
+      </w:r>
+      <w:r>
+        <w:rPr>
+          <w:rFonts w:ascii="Verdana" w:hAnsi="Verdana"/>
+          <w:sz w:val="32"/>
+          <w:szCs w:val="32"/>
+        </w:rPr>
+        <w:t>GL 3.3</w:t>
+      </w:r>
+      <w:r>
+        <w:rPr>
+          <w:rFonts w:ascii="Verdana" w:hAnsi="Verdana"/>
+          <w:sz w:val="32"/>
+          <w:szCs w:val="32"/>
+        </w:rPr>
+        <w:t xml:space="preserve"> (o</w:t>
+      </w:r>
+      <w:r>
+        <w:rPr>
+          <w:rFonts w:ascii="Verdana" w:hAnsi="Verdana"/>
+          <w:sz w:val="32"/>
+          <w:szCs w:val="32"/>
+        </w:rPr>
+        <w:t>n graphic cards since March 2010</w:t>
+      </w:r>
+      <w:r>
+        <w:rPr>
+          <w:rFonts w:ascii="Verdana" w:hAnsi="Verdana"/>
+          <w:sz w:val="32"/>
+          <w:szCs w:val="32"/>
+        </w:rPr>
+        <w:t>)</w:t>
+      </w:r>
+      <w:r>
+        <w:rPr>
+          <w:rFonts w:ascii="Verdana" w:hAnsi="Verdana"/>
+          <w:sz w:val="32"/>
+          <w:szCs w:val="32"/>
+        </w:rPr>
+        <w:t xml:space="preserve"> or later.</w:t>
       </w:r>
     </w:p>
     <w:p>
@@ -1173,202 +1812,52 @@
           <w:szCs w:val="32"/>
         </w:rPr>
       </w:pPr>
-      <w:proofErr w:type="spellStart"/>
-      <w:r>
-        <w:rPr>
-          <w:rFonts w:ascii="Verdana" w:hAnsi="Verdana"/>
-          <w:sz w:val="32"/>
-          <w:szCs w:val="32"/>
-        </w:rPr>
-        <w:t>water_efects</w:t>
-      </w:r>
-      <w:proofErr w:type="spellEnd"/>
-      <w:r>
-        <w:rPr>
-          <w:rFonts w:ascii="Verdana" w:hAnsi="Verdana"/>
-          <w:sz w:val="32"/>
-          <w:szCs w:val="32"/>
-        </w:rPr>
-        <w:t xml:space="preserve"> &lt;bool&gt;: enables (true) or disables (false) water effects (such as reflection).</w:t>
+      <w:r>
+        <w:rPr>
+          <w:rFonts w:ascii="Verdana" w:hAnsi="Verdana"/>
+          <w:sz w:val="32"/>
+          <w:szCs w:val="32"/>
+        </w:rPr>
+        <w:t>Game is implemented using Java version 1.8. (</w:t>
+      </w:r>
+      <w:proofErr w:type="gramStart"/>
+      <w:r>
+        <w:rPr>
+          <w:rFonts w:ascii="Verdana" w:hAnsi="Verdana"/>
+          <w:sz w:val="32"/>
+          <w:szCs w:val="32"/>
+        </w:rPr>
+        <w:t>requires</w:t>
+      </w:r>
+      <w:proofErr w:type="gramEnd"/>
+      <w:r>
+        <w:rPr>
+          <w:rFonts w:ascii="Verdana" w:hAnsi="Verdana"/>
+          <w:sz w:val="32"/>
+          <w:szCs w:val="32"/>
+        </w:rPr>
+        <w:t xml:space="preserve"> 1.8 or higher).</w:t>
       </w:r>
     </w:p>
     <w:p>
       <w:pPr>
         <w:pStyle w:val="NoSpacing"/>
-        <w:numPr>
-          <w:ilvl w:val="0"/>
-          <w:numId w:val="19"/>
-        </w:numPr>
-        <w:rPr>
-          <w:rFonts w:ascii="Verdana" w:hAnsi="Verdana"/>
-          <w:sz w:val="32"/>
-          <w:szCs w:val="32"/>
-        </w:rPr>
-      </w:pPr>
-      <w:proofErr w:type="spellStart"/>
-      <w:r>
-        <w:rPr>
-          <w:rFonts w:ascii="Verdana" w:hAnsi="Verdana"/>
-          <w:sz w:val="32"/>
-          <w:szCs w:val="32"/>
-        </w:rPr>
-        <w:t>mouse_sensitivity</w:t>
-      </w:r>
-      <w:proofErr w:type="spellEnd"/>
-      <w:r>
-        <w:rPr>
-          <w:rFonts w:ascii="Verdana" w:hAnsi="Verdana"/>
-          <w:sz w:val="32"/>
-          <w:szCs w:val="32"/>
-        </w:rPr>
-        <w:t>&lt;</w:t>
-      </w:r>
-      <w:proofErr w:type="spellStart"/>
-      <w:r>
-        <w:rPr>
-          <w:rFonts w:ascii="Verdana" w:hAnsi="Verdana"/>
-          <w:sz w:val="32"/>
-          <w:szCs w:val="32"/>
-        </w:rPr>
-        <w:t>num</w:t>
-      </w:r>
-      <w:proofErr w:type="spellEnd"/>
-      <w:r>
-        <w:rPr>
-          <w:rFonts w:ascii="Verdana" w:hAnsi="Verdana"/>
-          <w:sz w:val="32"/>
-          <w:szCs w:val="32"/>
-        </w:rPr>
-        <w:t xml:space="preserve">&gt;, </w:t>
-      </w:r>
-      <w:proofErr w:type="spellStart"/>
-      <w:r>
-        <w:rPr>
-          <w:rFonts w:ascii="Verdana" w:hAnsi="Verdana"/>
-          <w:sz w:val="32"/>
-          <w:szCs w:val="32"/>
-        </w:rPr>
-        <w:t>msens</w:t>
-      </w:r>
-      <w:proofErr w:type="spellEnd"/>
-      <w:r>
-        <w:rPr>
-          <w:rFonts w:ascii="Verdana" w:hAnsi="Verdana"/>
-          <w:sz w:val="32"/>
-          <w:szCs w:val="32"/>
-        </w:rPr>
-        <w:t xml:space="preserve"> &lt;</w:t>
-      </w:r>
-      <w:proofErr w:type="spellStart"/>
-      <w:r>
-        <w:rPr>
-          <w:rFonts w:ascii="Verdana" w:hAnsi="Verdana"/>
-          <w:sz w:val="32"/>
-          <w:szCs w:val="32"/>
-        </w:rPr>
-        <w:t>num</w:t>
-      </w:r>
-      <w:proofErr w:type="spellEnd"/>
-      <w:r>
-        <w:rPr>
-          <w:rFonts w:ascii="Verdana" w:hAnsi="Verdana"/>
-          <w:sz w:val="32"/>
-          <w:szCs w:val="32"/>
-        </w:rPr>
-        <w:t>&gt;: sets mouse sensitivity to this value.</w:t>
-      </w:r>
+        <w:rPr>
+          <w:rFonts w:ascii="Verdana" w:hAnsi="Verdana"/>
+          <w:sz w:val="32"/>
+          <w:szCs w:val="32"/>
+        </w:rPr>
+      </w:pPr>
     </w:p>
     <w:p>
       <w:pPr>
         <w:pStyle w:val="NoSpacing"/>
-        <w:numPr>
-          <w:ilvl w:val="0"/>
-          <w:numId w:val="19"/>
-        </w:numPr>
-        <w:rPr>
-          <w:rFonts w:ascii="Verdana" w:hAnsi="Verdana"/>
-          <w:sz w:val="32"/>
-          <w:szCs w:val="32"/>
-        </w:rPr>
-      </w:pPr>
-      <w:proofErr w:type="gramStart"/>
-      <w:r>
-        <w:rPr>
-          <w:rFonts w:ascii="Verdana" w:hAnsi="Verdana"/>
-          <w:sz w:val="32"/>
-          <w:szCs w:val="32"/>
-        </w:rPr>
-        <w:t>music</w:t>
-      </w:r>
-      <w:proofErr w:type="gramEnd"/>
-      <w:r>
-        <w:rPr>
-          <w:rFonts w:ascii="Verdana" w:hAnsi="Verdana"/>
-          <w:sz w:val="32"/>
-          <w:szCs w:val="32"/>
-        </w:rPr>
-        <w:t xml:space="preserve"> &lt;</w:t>
-      </w:r>
-      <w:proofErr w:type="spellStart"/>
-      <w:r>
-        <w:rPr>
-          <w:rFonts w:ascii="Verdana" w:hAnsi="Verdana"/>
-          <w:sz w:val="32"/>
-          <w:szCs w:val="32"/>
-        </w:rPr>
-        <w:t>num</w:t>
-      </w:r>
-      <w:proofErr w:type="spellEnd"/>
-      <w:r>
-        <w:rPr>
-          <w:rFonts w:ascii="Verdana" w:hAnsi="Verdana"/>
-          <w:sz w:val="32"/>
-          <w:szCs w:val="32"/>
-        </w:rPr>
-        <w:t>&gt;, sound &lt;</w:t>
-      </w:r>
-      <w:proofErr w:type="spellStart"/>
-      <w:r>
-        <w:rPr>
-          <w:rFonts w:ascii="Verdana" w:hAnsi="Verdana"/>
-          <w:sz w:val="32"/>
-          <w:szCs w:val="32"/>
-        </w:rPr>
-        <w:t>num</w:t>
-      </w:r>
-      <w:proofErr w:type="spellEnd"/>
-      <w:r>
-        <w:rPr>
-          <w:rFonts w:ascii="Verdana" w:hAnsi="Verdana"/>
-          <w:sz w:val="32"/>
-          <w:szCs w:val="32"/>
-        </w:rPr>
-        <w:t>&gt; : sets respectively music and sound</w:t>
-      </w:r>
-      <w:r>
-        <w:rPr>
-          <w:rFonts w:ascii="Verdana" w:hAnsi="Verdana"/>
-          <w:sz w:val="32"/>
-          <w:szCs w:val="32"/>
-        </w:rPr>
-        <w:t xml:space="preserve"> volume</w:t>
-      </w:r>
-      <w:r>
-        <w:rPr>
-          <w:rFonts w:ascii="Verdana" w:hAnsi="Verdana"/>
-          <w:sz w:val="32"/>
-          <w:szCs w:val="32"/>
-        </w:rPr>
-        <w:t xml:space="preserve"> </w:t>
-      </w:r>
-      <w:r>
-        <w:rPr>
-          <w:rFonts w:ascii="Verdana" w:hAnsi="Verdana"/>
-          <w:sz w:val="32"/>
-          <w:szCs w:val="32"/>
-        </w:rPr>
-        <w:t>to this value.</w:t>
-      </w:r>
+        <w:rPr>
+          <w:rFonts w:ascii="Verdana" w:hAnsi="Verdana"/>
+          <w:sz w:val="32"/>
+          <w:szCs w:val="32"/>
+        </w:rPr>
+      </w:pPr>
     </w:p>
     <w:p>
       <w:pPr>
@@ -1379,267 +1868,393 @@
           <w:szCs w:val="32"/>
         </w:rPr>
       </w:pPr>
+      <w:r>
+        <w:rPr>
+          <w:rFonts w:ascii="Verdana" w:hAnsi="Verdana"/>
+          <w:sz w:val="32"/>
+          <w:szCs w:val="32"/>
+        </w:rPr>
+        <w:t>Author: Alexander “</w:t>
+      </w:r>
+      <w:proofErr w:type="spellStart"/>
+      <w:r>
+        <w:rPr>
+          <w:rFonts w:ascii="Verdana" w:hAnsi="Verdana"/>
+          <w:sz w:val="32"/>
+          <w:szCs w:val="32"/>
+        </w:rPr>
+        <w:t>Ermac</w:t>
+      </w:r>
+      <w:proofErr w:type="spellEnd"/>
+      <w:r>
+        <w:rPr>
+          <w:rFonts w:ascii="Verdana" w:hAnsi="Verdana"/>
+          <w:sz w:val="32"/>
+          <w:szCs w:val="32"/>
+        </w:rPr>
+        <w:t xml:space="preserve">” </w:t>
+      </w:r>
+      <w:proofErr w:type="spellStart"/>
+      <w:r>
+        <w:rPr>
+          <w:rFonts w:ascii="Verdana" w:hAnsi="Verdana"/>
+          <w:sz w:val="32"/>
+          <w:szCs w:val="32"/>
+        </w:rPr>
+        <w:t>Stojanovich</w:t>
+      </w:r>
+      <w:proofErr w:type="spellEnd"/>
     </w:p>
     <w:p>
       <w:pPr>
         <w:pStyle w:val="NoSpacing"/>
         <w:rPr>
           <w:rFonts w:ascii="Verdana" w:hAnsi="Verdana"/>
-          <w:b/>
-          <w:sz w:val="48"/>
-          <w:szCs w:val="32"/>
-        </w:rPr>
-      </w:pPr>
-      <w:r>
-        <w:rPr>
-          <w:rFonts w:ascii="Verdana" w:hAnsi="Verdana"/>
-          <w:b/>
-          <w:sz w:val="48"/>
-          <w:szCs w:val="32"/>
-        </w:rPr>
-        <w:t>Notes:</w:t>
-      </w:r>
-    </w:p>
-    <w:p>
-      <w:pPr>
-        <w:pStyle w:val="NoSpacing"/>
-        <w:numPr>
-          <w:ilvl w:val="0"/>
-          <w:numId w:val="19"/>
-        </w:numPr>
-        <w:rPr>
-          <w:rFonts w:ascii="Verdana" w:hAnsi="Verdana"/>
-          <w:sz w:val="32"/>
-          <w:szCs w:val="32"/>
-        </w:rPr>
-      </w:pPr>
-      <w:r>
-        <w:rPr>
-          <w:rFonts w:ascii="Verdana" w:hAnsi="Verdana"/>
-          <w:sz w:val="32"/>
-          <w:szCs w:val="32"/>
-        </w:rPr>
-        <w:t>Game uses LWJGL 3.2.3 since v 02 (BELARUS).</w:t>
-      </w:r>
-    </w:p>
-    <w:p>
-      <w:pPr>
-        <w:pStyle w:val="NoSpacing"/>
-        <w:numPr>
-          <w:ilvl w:val="0"/>
-          <w:numId w:val="19"/>
-        </w:numPr>
-        <w:rPr>
-          <w:rFonts w:ascii="Verdana" w:hAnsi="Verdana"/>
-          <w:sz w:val="32"/>
-          <w:szCs w:val="32"/>
-        </w:rPr>
-      </w:pPr>
-      <w:r>
-        <w:rPr>
-          <w:rFonts w:ascii="Verdana" w:hAnsi="Verdana"/>
-          <w:sz w:val="32"/>
-          <w:szCs w:val="32"/>
-        </w:rPr>
-        <w:t xml:space="preserve">Game requires Quad Core processor with support for at least 4 threads. </w:t>
-      </w:r>
-      <w:r>
-        <w:rPr>
-          <w:rFonts w:ascii="Verdana" w:hAnsi="Verdana"/>
-          <w:sz w:val="32"/>
-          <w:szCs w:val="32"/>
-        </w:rPr>
-        <w:t>Game implementation is multithread</w:t>
-      </w:r>
-      <w:r>
-        <w:rPr>
-          <w:rFonts w:ascii="Verdana" w:hAnsi="Verdana"/>
-          <w:sz w:val="32"/>
-          <w:szCs w:val="32"/>
-        </w:rPr>
-        <w:t>ed</w:t>
-      </w:r>
-      <w:r>
-        <w:rPr>
-          <w:rFonts w:ascii="Verdana" w:hAnsi="Verdana"/>
-          <w:sz w:val="32"/>
-          <w:szCs w:val="32"/>
-        </w:rPr>
-        <w:t xml:space="preserve"> (</w:t>
-      </w:r>
-      <w:r>
-        <w:rPr>
-          <w:rFonts w:ascii="Verdana" w:hAnsi="Verdana"/>
-          <w:sz w:val="32"/>
-          <w:szCs w:val="32"/>
-        </w:rPr>
-        <w:t xml:space="preserve">at most time </w:t>
-      </w:r>
-      <w:r>
-        <w:rPr>
-          <w:rFonts w:ascii="Verdana" w:hAnsi="Verdana"/>
-          <w:sz w:val="32"/>
-          <w:szCs w:val="32"/>
-        </w:rPr>
-        <w:t>2</w:t>
-      </w:r>
-      <w:r>
-        <w:rPr>
-          <w:rFonts w:ascii="Verdana" w:hAnsi="Verdana"/>
-          <w:sz w:val="32"/>
-          <w:szCs w:val="32"/>
-        </w:rPr>
-        <w:t xml:space="preserve"> </w:t>
-      </w:r>
-      <w:r>
-        <w:rPr>
-          <w:rFonts w:ascii="Verdana" w:hAnsi="Verdana"/>
-          <w:sz w:val="32"/>
-          <w:szCs w:val="32"/>
-        </w:rPr>
-        <w:t>threads will</w:t>
-      </w:r>
-      <w:r>
-        <w:rPr>
-          <w:rFonts w:ascii="Verdana" w:hAnsi="Verdana"/>
-          <w:sz w:val="32"/>
-          <w:szCs w:val="32"/>
-        </w:rPr>
-        <w:t xml:space="preserve"> be active</w:t>
-      </w:r>
-      <w:r>
-        <w:rPr>
-          <w:rFonts w:ascii="Verdana" w:hAnsi="Verdana"/>
-          <w:sz w:val="32"/>
-          <w:szCs w:val="32"/>
-        </w:rPr>
-        <w:t xml:space="preserve"> + 1 additional thread if random level generator is being used</w:t>
-      </w:r>
-      <w:r>
-        <w:rPr>
-          <w:rFonts w:ascii="Verdana" w:hAnsi="Verdana"/>
-          <w:sz w:val="32"/>
-          <w:szCs w:val="32"/>
-        </w:rPr>
-        <w:t xml:space="preserve"> or when loading or saving level is in progress</w:t>
-      </w:r>
-      <w:r>
-        <w:rPr>
-          <w:rFonts w:ascii="Verdana" w:hAnsi="Verdana"/>
-          <w:sz w:val="32"/>
-          <w:szCs w:val="32"/>
-        </w:rPr>
-        <w:t>)</w:t>
-      </w:r>
-      <w:r>
-        <w:rPr>
-          <w:rFonts w:ascii="Verdana" w:hAnsi="Verdana"/>
-          <w:sz w:val="32"/>
-          <w:szCs w:val="32"/>
-        </w:rPr>
-        <w:t>.</w:t>
-      </w:r>
-    </w:p>
-    <w:p>
-      <w:pPr>
-        <w:pStyle w:val="NoSpacing"/>
-        <w:numPr>
-          <w:ilvl w:val="0"/>
-          <w:numId w:val="19"/>
-        </w:numPr>
-        <w:rPr>
-          <w:rFonts w:ascii="Verdana" w:hAnsi="Verdana"/>
-          <w:sz w:val="32"/>
-          <w:szCs w:val="32"/>
-        </w:rPr>
-      </w:pPr>
-      <w:r>
-        <w:rPr>
-          <w:rFonts w:ascii="Verdana" w:hAnsi="Verdana"/>
-          <w:sz w:val="32"/>
-          <w:szCs w:val="32"/>
-        </w:rPr>
-        <w:t>Running the game requires</w:t>
-      </w:r>
-      <w:r>
-        <w:rPr>
-          <w:rFonts w:ascii="Verdana" w:hAnsi="Verdana"/>
-          <w:sz w:val="32"/>
-          <w:szCs w:val="32"/>
-        </w:rPr>
-        <w:t xml:space="preserve"> Open</w:t>
-      </w:r>
-      <w:r>
-        <w:rPr>
-          <w:rFonts w:ascii="Verdana" w:hAnsi="Verdana"/>
-          <w:sz w:val="32"/>
-          <w:szCs w:val="32"/>
-        </w:rPr>
-        <w:t>GL 3.3</w:t>
-      </w:r>
-      <w:r>
-        <w:rPr>
-          <w:rFonts w:ascii="Verdana" w:hAnsi="Verdana"/>
-          <w:sz w:val="32"/>
-          <w:szCs w:val="32"/>
-        </w:rPr>
-        <w:t xml:space="preserve"> (o</w:t>
-      </w:r>
-      <w:r>
-        <w:rPr>
-          <w:rFonts w:ascii="Verdana" w:hAnsi="Verdana"/>
-          <w:sz w:val="32"/>
-          <w:szCs w:val="32"/>
-        </w:rPr>
-        <w:t>n graphic cards since March 2010</w:t>
-      </w:r>
-      <w:r>
-        <w:rPr>
-          <w:rFonts w:ascii="Verdana" w:hAnsi="Verdana"/>
-          <w:sz w:val="32"/>
-          <w:szCs w:val="32"/>
-        </w:rPr>
-        <w:t>)</w:t>
-      </w:r>
-      <w:r>
-        <w:rPr>
-          <w:rFonts w:ascii="Verdana" w:hAnsi="Verdana"/>
-          <w:sz w:val="32"/>
-          <w:szCs w:val="32"/>
-        </w:rPr>
-        <w:t xml:space="preserve"> or later.</w:t>
-      </w:r>
-    </w:p>
-    <w:p>
-      <w:pPr>
-        <w:pStyle w:val="NoSpacing"/>
-        <w:numPr>
-          <w:ilvl w:val="0"/>
-          <w:numId w:val="19"/>
-        </w:numPr>
-        <w:rPr>
-          <w:rFonts w:ascii="Verdana" w:hAnsi="Verdana"/>
-          <w:sz w:val="32"/>
-          <w:szCs w:val="32"/>
-        </w:rPr>
-      </w:pPr>
-      <w:r>
-        <w:rPr>
-          <w:rFonts w:ascii="Verdana" w:hAnsi="Verdana"/>
-          <w:sz w:val="32"/>
-          <w:szCs w:val="32"/>
-        </w:rPr>
-        <w:t>Game is implemented using Java version 1.8. (requires 1.8 or higher).</w:t>
+          <w:sz w:val="32"/>
+          <w:szCs w:val="32"/>
+        </w:rPr>
+      </w:pPr>
+      <w:r>
+        <w:rPr>
+          <w:rFonts w:ascii="Verdana" w:hAnsi="Verdana"/>
+          <w:sz w:val="32"/>
+          <w:szCs w:val="32"/>
+        </w:rPr>
+        <w:t xml:space="preserve">Testers: </w:t>
+      </w:r>
+      <w:proofErr w:type="spellStart"/>
+      <w:r>
+        <w:rPr>
+          <w:rFonts w:ascii="Verdana" w:hAnsi="Verdana"/>
+          <w:sz w:val="32"/>
+          <w:szCs w:val="32"/>
+        </w:rPr>
+        <w:t>JSomnia</w:t>
+      </w:r>
+      <w:proofErr w:type="spellEnd"/>
+      <w:r>
+        <w:rPr>
+          <w:rFonts w:ascii="Verdana" w:hAnsi="Verdana"/>
+          <w:sz w:val="32"/>
+          <w:szCs w:val="32"/>
+        </w:rPr>
+        <w:t>, Hellblade64</w:t>
       </w:r>
     </w:p>
     <w:sectPr>
+      <w:headerReference w:type="default" r:id="rId10"/>
+      <w:footerReference w:type="default" r:id="rId11"/>
       <w:pgSz w:w="12240" w:h="15840"/>
-      <w:pgMar w:top="720" w:right="720" w:bottom="720" w:left="720" w:header="720" w:footer="720" w:gutter="0"/>
+      <w:pgMar w:top="720" w:right="720" w:bottom="720" w:left="720" w:header="144" w:footer="144" w:gutter="0"/>
       <w:cols w:space="720"/>
       <w:docGrid w:linePitch="360"/>
     </w:sectPr>
   </w:body>
 </w:document>
+</file>
+
+<file path=word/endnotes.xml><?xml version="1.0" encoding="utf-8"?>
+<w:endnotes xmlns:wpc="http://schemas.microsoft.com/office/word/2010/wordprocessingCanvas" xmlns:mc="http://schemas.openxmlformats.org/markup-compatibility/2006" xmlns:o="urn:schemas-microsoft-com:office:office" xmlns:r="http://schemas.openxmlformats.org/officeDocument/2006/relationships" xmlns:m="http://schemas.openxmlformats.org/officeDocument/2006/math" xmlns:v="urn:schemas-microsoft-com:vml" xmlns:wp14="http://schemas.microsoft.com/office/word/2010/wordprocessingDrawing" xmlns:wp="http://schemas.openxmlformats.org/drawingml/2006/wordprocessingDrawing" xmlns:w10="urn:schemas-microsoft-com:office:word" xmlns:w="http://schemas.openxmlformats.org/wordprocessingml/2006/main" xmlns:w14="http://schemas.microsoft.com/office/word/2010/wordml" xmlns:wpg="http://schemas.microsoft.com/office/word/2010/wordprocessingGroup" xmlns:wpi="http://schemas.microsoft.com/office/word/2010/wordprocessingInk" xmlns:wne="http://schemas.microsoft.com/office/word/2006/wordml" xmlns:wps="http://schemas.microsoft.com/office/word/2010/wordprocessingShape" mc:Ignorable="w14 wp14">
+  <w:endnote w:type="separator" w:id="-1">
+    <w:p>
+      <w:pPr>
+        <w:spacing w:after="0" w:line="240" w:lineRule="auto"/>
+      </w:pPr>
+      <w:r>
+        <w:separator/>
+      </w:r>
+    </w:p>
+  </w:endnote>
+  <w:endnote w:type="continuationSeparator" w:id="0">
+    <w:p>
+      <w:pPr>
+        <w:spacing w:after="0" w:line="240" w:lineRule="auto"/>
+      </w:pPr>
+      <w:r>
+        <w:continuationSeparator/>
+      </w:r>
+    </w:p>
+  </w:endnote>
+</w:endnotes>
+</file>
+
+<file path=word/footer1.xml><?xml version="1.0" encoding="utf-8"?>
+<w:ftr xmlns:wpc="http://schemas.microsoft.com/office/word/2010/wordprocessingCanvas" xmlns:mc="http://schemas.openxmlformats.org/markup-compatibility/2006" xmlns:o="urn:schemas-microsoft-com:office:office" xmlns:r="http://schemas.openxmlformats.org/officeDocument/2006/relationships" xmlns:m="http://schemas.openxmlformats.org/officeDocument/2006/math" xmlns:v="urn:schemas-microsoft-com:vml" xmlns:wp14="http://schemas.microsoft.com/office/word/2010/wordprocessingDrawing" xmlns:wp="http://schemas.openxmlformats.org/drawingml/2006/wordprocessingDrawing" xmlns:w10="urn:schemas-microsoft-com:office:word" xmlns:w="http://schemas.openxmlformats.org/wordprocessingml/2006/main" xmlns:w14="http://schemas.microsoft.com/office/word/2010/wordml" xmlns:wpg="http://schemas.microsoft.com/office/word/2010/wordprocessingGroup" xmlns:wpi="http://schemas.microsoft.com/office/word/2010/wordprocessingInk" xmlns:wne="http://schemas.microsoft.com/office/word/2006/wordml" xmlns:wps="http://schemas.microsoft.com/office/word/2010/wordprocessingShape" mc:Ignorable="w14 wp14">
+  <w:sdt>
+    <w:sdtPr>
+      <w:rPr>
+        <w:rFonts w:asciiTheme="majorHAnsi" w:eastAsiaTheme="majorEastAsia" w:hAnsiTheme="majorHAnsi" w:cstheme="majorBidi"/>
+      </w:rPr>
+      <w:id w:val="-1150436321"/>
+      <w:docPartObj>
+        <w:docPartGallery w:val="Page Numbers (Bottom of Page)"/>
+        <w:docPartUnique/>
+      </w:docPartObj>
+    </w:sdtPr>
+    <w:sdtEndPr/>
+    <w:sdtContent>
+      <w:sdt>
+        <w:sdtPr>
+          <w:rPr>
+            <w:rFonts w:asciiTheme="majorHAnsi" w:eastAsiaTheme="majorEastAsia" w:hAnsiTheme="majorHAnsi" w:cstheme="majorBidi"/>
+          </w:rPr>
+          <w:id w:val="-1395503223"/>
+          <w:docPartObj>
+            <w:docPartGallery w:val="Page Numbers (Margins)"/>
+            <w:docPartUnique/>
+          </w:docPartObj>
+        </w:sdtPr>
+        <w:sdtEndPr/>
+        <w:sdtContent>
+          <w:p>
+            <w:pPr>
+              <w:rPr>
+                <w:rFonts w:asciiTheme="majorHAnsi" w:eastAsiaTheme="majorEastAsia" w:hAnsiTheme="majorHAnsi" w:cstheme="majorBidi"/>
+              </w:rPr>
+            </w:pPr>
+            <w:r>
+              <w:rPr>
+                <w:rFonts w:asciiTheme="majorHAnsi" w:eastAsiaTheme="majorEastAsia" w:hAnsiTheme="majorHAnsi" w:cstheme="majorBidi"/>
+                <w:noProof/>
+              </w:rPr>
+              <mc:AlternateContent>
+                <mc:Choice Requires="wps">
+                  <w:drawing>
+                    <wp:anchor distT="0" distB="0" distL="114300" distR="114300" simplePos="0" relativeHeight="251659264" behindDoc="0" locked="0" layoutInCell="1" allowOverlap="1" wp14:anchorId="28B23A58" wp14:editId="58750E18">
+                      <wp:simplePos x="0" y="0"/>
+                      <wp:positionH relativeFrom="margin">
+                        <wp:align>center</wp:align>
+                      </wp:positionH>
+                      <wp:positionV relativeFrom="bottomMargin">
+                        <wp:align>center</wp:align>
+                      </wp:positionV>
+                      <wp:extent cx="626745" cy="626745"/>
+                      <wp:effectExtent l="0" t="0" r="1905" b="1905"/>
+                      <wp:wrapNone/>
+                      <wp:docPr id="560" name="Oval 10"/>
+                      <wp:cNvGraphicFramePr>
+                        <a:graphicFrameLocks xmlns:a="http://schemas.openxmlformats.org/drawingml/2006/main"/>
+                      </wp:cNvGraphicFramePr>
+                      <a:graphic xmlns:a="http://schemas.openxmlformats.org/drawingml/2006/main">
+                        <a:graphicData uri="http://schemas.microsoft.com/office/word/2010/wordprocessingShape">
+                          <wps:wsp>
+                            <wps:cNvSpPr>
+                              <a:spLocks noChangeArrowheads="1"/>
+                            </wps:cNvSpPr>
+                            <wps:spPr bwMode="auto">
+                              <a:xfrm>
+                                <a:off x="0" y="0"/>
+                                <a:ext cx="626745" cy="626745"/>
+                              </a:xfrm>
+                              <a:prstGeom prst="ellipse">
+                                <a:avLst/>
+                              </a:prstGeom>
+                              <a:solidFill>
+                                <a:srgbClr val="40618B"/>
+                              </a:solidFill>
+                              <a:extLst>
+                                <a:ext uri="{91240B29-F687-4F45-9708-019B960494DF}">
+                                  <a14:hiddenLine xmlns:a14="http://schemas.microsoft.com/office/drawing/2010/main" w="9525">
+                                    <a:solidFill>
+                                      <a:srgbClr val="000000"/>
+                                    </a:solidFill>
+                                    <a:round/>
+                                    <a:headEnd/>
+                                    <a:tailEnd/>
+                                  </a14:hiddenLine>
+                                </a:ext>
+                              </a:extLst>
+                            </wps:spPr>
+                            <wps:txbx>
+                              <w:txbxContent>
+                                <w:p>
+                                  <w:pPr>
+                                    <w:pStyle w:val="Footer"/>
+                                    <w:jc w:val="center"/>
+                                    <w:rPr>
+                                      <w:b/>
+                                      <w:bCs/>
+                                      <w:color w:val="FFFFFF" w:themeColor="background1"/>
+                                      <w:sz w:val="32"/>
+                                      <w:szCs w:val="32"/>
+                                    </w:rPr>
+                                  </w:pPr>
+                                  <w:r>
+                                    <w:fldChar w:fldCharType="begin"/>
+                                  </w:r>
+                                  <w:r>
+                                    <w:instrText xml:space="preserve"> PAGE    \* MERGEFORMAT </w:instrText>
+                                  </w:r>
+                                  <w:r>
+                                    <w:fldChar w:fldCharType="separate"/>
+                                  </w:r>
+                                  <w:r>
+                                    <w:rPr>
+                                      <w:b/>
+                                      <w:bCs/>
+                                      <w:noProof/>
+                                      <w:color w:val="FFFFFF" w:themeColor="background1"/>
+                                      <w:sz w:val="32"/>
+                                      <w:szCs w:val="32"/>
+                                    </w:rPr>
+                                    <w:t>1</w:t>
+                                  </w:r>
+                                  <w:r>
+                                    <w:rPr>
+                                      <w:b/>
+                                      <w:bCs/>
+                                      <w:noProof/>
+                                      <w:color w:val="FFFFFF" w:themeColor="background1"/>
+                                      <w:sz w:val="32"/>
+                                      <w:szCs w:val="32"/>
+                                    </w:rPr>
+                                    <w:fldChar w:fldCharType="end"/>
+                                  </w:r>
+                                </w:p>
+                              </w:txbxContent>
+                            </wps:txbx>
+                            <wps:bodyPr rot="0" vert="horz" wrap="square" lIns="0" tIns="45720" rIns="0" bIns="45720" anchor="ctr" anchorCtr="0" upright="1">
+                              <a:noAutofit/>
+                            </wps:bodyPr>
+                          </wps:wsp>
+                        </a:graphicData>
+                      </a:graphic>
+                      <wp14:sizeRelH relativeFrom="page">
+                        <wp14:pctWidth>0</wp14:pctWidth>
+                      </wp14:sizeRelH>
+                      <wp14:sizeRelV relativeFrom="page">
+                        <wp14:pctHeight>0</wp14:pctHeight>
+                      </wp14:sizeRelV>
+                    </wp:anchor>
+                  </w:drawing>
+                </mc:Choice>
+                <mc:Fallback>
+                  <w:pict>
+                    <v:oval id="Oval 10" o:spid="_x0000_s1026" style="position:absolute;margin-left:0;margin-top:0;width:49.35pt;height:49.35pt;z-index:251659264;visibility:visible;mso-wrap-style:square;mso-width-percent:0;mso-height-percent:0;mso-wrap-distance-left:9pt;mso-wrap-distance-top:0;mso-wrap-distance-right:9pt;mso-wrap-distance-bottom:0;mso-position-horizontal:center;mso-position-horizontal-relative:margin;mso-position-vertical:center;mso-position-vertical-relative:bottom-margin-area;mso-width-percent:0;mso-height-percent:0;mso-width-relative:page;mso-height-relative:page;v-text-anchor:middle" o:gfxdata="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" fillcolor="#40618b" stroked="f">
+                      <v:textbox inset="0,,0">
+                        <w:txbxContent>
+                          <w:p>
+                            <w:pPr>
+                              <w:pStyle w:val="Footer"/>
+                              <w:jc w:val="center"/>
+                              <w:rPr>
+                                <w:b/>
+                                <w:bCs/>
+                                <w:color w:val="FFFFFF" w:themeColor="background1"/>
+                                <w:sz w:val="32"/>
+                                <w:szCs w:val="32"/>
+                              </w:rPr>
+                            </w:pPr>
+                            <w:r>
+                              <w:fldChar w:fldCharType="begin"/>
+                            </w:r>
+                            <w:r>
+                              <w:instrText xml:space="preserve"> PAGE    \* MERGEFORMAT </w:instrText>
+                            </w:r>
+                            <w:r>
+                              <w:fldChar w:fldCharType="separate"/>
+                            </w:r>
+                            <w:r>
+                              <w:rPr>
+                                <w:b/>
+                                <w:bCs/>
+                                <w:noProof/>
+                                <w:color w:val="FFFFFF" w:themeColor="background1"/>
+                                <w:sz w:val="32"/>
+                                <w:szCs w:val="32"/>
+                              </w:rPr>
+                              <w:t>1</w:t>
+                            </w:r>
+                            <w:r>
+                              <w:rPr>
+                                <w:b/>
+                                <w:bCs/>
+                                <w:noProof/>
+                                <w:color w:val="FFFFFF" w:themeColor="background1"/>
+                                <w:sz w:val="32"/>
+                                <w:szCs w:val="32"/>
+                              </w:rPr>
+                              <w:fldChar w:fldCharType="end"/>
+                            </w:r>
+                          </w:p>
+                        </w:txbxContent>
+                      </v:textbox>
+                      <w10:wrap anchorx="margin" anchory="margin"/>
+                    </v:oval>
+                  </w:pict>
+                </mc:Fallback>
+              </mc:AlternateContent>
+            </w:r>
+          </w:p>
+        </w:sdtContent>
+      </w:sdt>
+    </w:sdtContent>
+  </w:sdt>
+  <w:p>
+    <w:pPr>
+      <w:pStyle w:val="Footer"/>
+    </w:pPr>
+  </w:p>
+</w:ftr>
+</file>
+
+<file path=word/footnotes.xml><?xml version="1.0" encoding="utf-8"?>
+<w:footnotes xmlns:wpc="http://schemas.microsoft.com/office/word/2010/wordprocessingCanvas" xmlns:mc="http://schemas.openxmlformats.org/markup-compatibility/2006" xmlns:o="urn:schemas-microsoft-com:office:office" xmlns:r="http://schemas.openxmlformats.org/officeDocument/2006/relationships" xmlns:m="http://schemas.openxmlformats.org/officeDocument/2006/math" xmlns:v="urn:schemas-microsoft-com:vml" xmlns:wp14="http://schemas.microsoft.com/office/word/2010/wordprocessingDrawing" xmlns:wp="http://schemas.openxmlformats.org/drawingml/2006/wordprocessingDrawing" xmlns:w10="urn:schemas-microsoft-com:office:word" xmlns:w="http://schemas.openxmlformats.org/wordprocessingml/2006/main" xmlns:w14="http://schemas.microsoft.com/office/word/2010/wordml" xmlns:wpg="http://schemas.microsoft.com/office/word/2010/wordprocessingGroup" xmlns:wpi="http://schemas.microsoft.com/office/word/2010/wordprocessingInk" xmlns:wne="http://schemas.microsoft.com/office/word/2006/wordml" xmlns:wps="http://schemas.microsoft.com/office/word/2010/wordprocessingShape" mc:Ignorable="w14 wp14">
+  <w:footnote w:type="separator" w:id="-1">
+    <w:p>
+      <w:pPr>
+        <w:spacing w:after="0" w:line="240" w:lineRule="auto"/>
+      </w:pPr>
+      <w:r>
+        <w:separator/>
+      </w:r>
+    </w:p>
+  </w:footnote>
+  <w:footnote w:type="continuationSeparator" w:id="0">
+    <w:p>
+      <w:pPr>
+        <w:spacing w:after="0" w:line="240" w:lineRule="auto"/>
+      </w:pPr>
+      <w:r>
+        <w:continuationSeparator/>
+      </w:r>
+    </w:p>
+  </w:footnote>
+</w:footnotes>
+</file>
+
+<file path=word/header1.xml><?xml version="1.0" encoding="utf-8"?>
+<w:hdr xmlns:wpc="http://schemas.microsoft.com/office/word/2010/wordprocessingCanvas" xmlns:mc="http://schemas.openxmlformats.org/markup-compatibility/2006" xmlns:o="urn:schemas-microsoft-com:office:office" xmlns:r="http://schemas.openxmlformats.org/officeDocument/2006/relationships" xmlns:m="http://schemas.openxmlformats.org/officeDocument/2006/math" xmlns:v="urn:schemas-microsoft-com:vml" xmlns:wp14="http://schemas.microsoft.com/office/word/2010/wordprocessingDrawing" xmlns:wp="http://schemas.openxmlformats.org/drawingml/2006/wordprocessingDrawing" xmlns:w10="urn:schemas-microsoft-com:office:word" xmlns:w="http://schemas.openxmlformats.org/wordprocessingml/2006/main" xmlns:w14="http://schemas.microsoft.com/office/word/2010/wordml" xmlns:wpg="http://schemas.microsoft.com/office/word/2010/wordprocessingGroup" xmlns:wpi="http://schemas.microsoft.com/office/word/2010/wordprocessingInk" xmlns:wne="http://schemas.microsoft.com/office/word/2006/wordml" xmlns:wps="http://schemas.microsoft.com/office/word/2010/wordprocessingShape" mc:Ignorable="w14 wp14">
+  <w:p>
+    <w:pPr>
+      <w:pStyle w:val="Header"/>
+      <w:jc w:val="center"/>
+      <w:rPr>
+        <w:b/>
+        <w:sz w:val="32"/>
+        <w:szCs w:val="32"/>
+      </w:rPr>
+    </w:pPr>
+    <w:proofErr w:type="spellStart"/>
+    <w:r>
+      <w:rPr>
+        <w:b/>
+        <w:sz w:val="32"/>
+        <w:szCs w:val="32"/>
+      </w:rPr>
+      <w:t>Ermac</w:t>
+    </w:r>
+    <w:proofErr w:type="spellEnd"/>
+    <w:r>
+      <w:rPr>
+        <w:b/>
+        <w:sz w:val="32"/>
+        <w:szCs w:val="32"/>
+      </w:rPr>
+      <w:t xml:space="preserve"> Voxel Game</w:t>
+    </w:r>
+  </w:p>
+</w:hdr>
 </file>
 
 <file path=word/numbering.xml><?xml version="1.0" encoding="utf-8"?>
@@ -1758,6 +2373,119 @@
     </w:lvl>
   </w:abstractNum>
   <w:abstractNum w:abstractNumId="1">
+    <w:nsid w:val="05D154AE"/>
+    <w:multiLevelType w:val="hybridMultilevel"/>
+    <w:tmpl w:val="D80AACA6"/>
+    <w:lvl w:ilvl="0" w:tplc="04090001">
+      <w:start w:val="1"/>
+      <w:numFmt w:val="bullet"/>
+      <w:lvlText w:val=""/>
+      <w:lvlJc w:val="left"/>
+      <w:pPr>
+        <w:ind w:left="1080" w:hanging="360"/>
+      </w:pPr>
+      <w:rPr>
+        <w:rFonts w:ascii="Symbol" w:hAnsi="Symbol" w:hint="default"/>
+      </w:rPr>
+    </w:lvl>
+    <w:lvl w:ilvl="1" w:tplc="04090003" w:tentative="1">
+      <w:start w:val="1"/>
+      <w:numFmt w:val="bullet"/>
+      <w:lvlText w:val="o"/>
+      <w:lvlJc w:val="left"/>
+      <w:pPr>
+        <w:ind w:left="1800" w:hanging="360"/>
+      </w:pPr>
+      <w:rPr>
+        <w:rFonts w:ascii="Courier New" w:hAnsi="Courier New" w:cs="Courier New" w:hint="default"/>
+      </w:rPr>
+    </w:lvl>
+    <w:lvl w:ilvl="2" w:tplc="04090005" w:tentative="1">
+      <w:start w:val="1"/>
+      <w:numFmt w:val="bullet"/>
+      <w:lvlText w:val=""/>
+      <w:lvlJc w:val="left"/>
+      <w:pPr>
+        <w:ind w:left="2520" w:hanging="360"/>
+      </w:pPr>
+      <w:rPr>
+        <w:rFonts w:ascii="Wingdings" w:hAnsi="Wingdings" w:hint="default"/>
+      </w:rPr>
+    </w:lvl>
+    <w:lvl w:ilvl="3" w:tplc="04090001" w:tentative="1">
+      <w:start w:val="1"/>
+      <w:numFmt w:val="bullet"/>
+      <w:lvlText w:val=""/>
+      <w:lvlJc w:val="left"/>
+      <w:pPr>
+        <w:ind w:left="3240" w:hanging="360"/>
+      </w:pPr>
+      <w:rPr>
+        <w:rFonts w:ascii="Symbol" w:hAnsi="Symbol" w:hint="default"/>
+      </w:rPr>
+    </w:lvl>
+    <w:lvl w:ilvl="4" w:tplc="04090003" w:tentative="1">
+      <w:start w:val="1"/>
+      <w:numFmt w:val="bullet"/>
+      <w:lvlText w:val="o"/>
+      <w:lvlJc w:val="left"/>
+      <w:pPr>
+        <w:ind w:left="3960" w:hanging="360"/>
+      </w:pPr>
+      <w:rPr>
+        <w:rFonts w:ascii="Courier New" w:hAnsi="Courier New" w:cs="Courier New" w:hint="default"/>
+      </w:rPr>
+    </w:lvl>
+    <w:lvl w:ilvl="5" w:tplc="04090005" w:tentative="1">
+      <w:start w:val="1"/>
+      <w:numFmt w:val="bullet"/>
+      <w:lvlText w:val=""/>
+      <w:lvlJc w:val="left"/>
+      <w:pPr>
+        <w:ind w:left="4680" w:hanging="360"/>
+      </w:pPr>
+      <w:rPr>
+        <w:rFonts w:ascii="Wingdings" w:hAnsi="Wingdings" w:hint="default"/>
+      </w:rPr>
+    </w:lvl>
+    <w:lvl w:ilvl="6" w:tplc="04090001" w:tentative="1">
+      <w:start w:val="1"/>
+      <w:numFmt w:val="bullet"/>
+      <w:lvlText w:val=""/>
+      <w:lvlJc w:val="left"/>
+      <w:pPr>
+        <w:ind w:left="5400" w:hanging="360"/>
+      </w:pPr>
+      <w:rPr>
+        <w:rFonts w:ascii="Symbol" w:hAnsi="Symbol" w:hint="default"/>
+      </w:rPr>
+    </w:lvl>
+    <w:lvl w:ilvl="7" w:tplc="04090003" w:tentative="1">
+      <w:start w:val="1"/>
+      <w:numFmt w:val="bullet"/>
+      <w:lvlText w:val="o"/>
+      <w:lvlJc w:val="left"/>
+      <w:pPr>
+        <w:ind w:left="6120" w:hanging="360"/>
+      </w:pPr>
+      <w:rPr>
+        <w:rFonts w:ascii="Courier New" w:hAnsi="Courier New" w:cs="Courier New" w:hint="default"/>
+      </w:rPr>
+    </w:lvl>
+    <w:lvl w:ilvl="8" w:tplc="04090005" w:tentative="1">
+      <w:start w:val="1"/>
+      <w:numFmt w:val="bullet"/>
+      <w:lvlText w:val=""/>
+      <w:lvlJc w:val="left"/>
+      <w:pPr>
+        <w:ind w:left="6840" w:hanging="360"/>
+      </w:pPr>
+      <w:rPr>
+        <w:rFonts w:ascii="Wingdings" w:hAnsi="Wingdings" w:hint="default"/>
+      </w:rPr>
+    </w:lvl>
+  </w:abstractNum>
+  <w:abstractNum w:abstractNumId="2">
     <w:nsid w:val="08125522"/>
     <w:multiLevelType w:val="hybridMultilevel"/>
     <w:tmpl w:val="6B8412C0"/>
@@ -1870,7 +2598,7 @@
       </w:rPr>
     </w:lvl>
   </w:abstractNum>
-  <w:abstractNum w:abstractNumId="2">
+  <w:abstractNum w:abstractNumId="3">
     <w:nsid w:val="104F63B2"/>
     <w:multiLevelType w:val="hybridMultilevel"/>
     <w:tmpl w:val="B9768288"/>
@@ -1983,7 +2711,7 @@
       </w:rPr>
     </w:lvl>
   </w:abstractNum>
-  <w:abstractNum w:abstractNumId="3">
+  <w:abstractNum w:abstractNumId="4">
     <w:nsid w:val="12230F50"/>
     <w:multiLevelType w:val="hybridMultilevel"/>
     <w:tmpl w:val="48B49748"/>
@@ -2097,7 +2825,120 @@
       </w:rPr>
     </w:lvl>
   </w:abstractNum>
-  <w:abstractNum w:abstractNumId="4">
+  <w:abstractNum w:abstractNumId="5">
+    <w:nsid w:val="165453AA"/>
+    <w:multiLevelType w:val="hybridMultilevel"/>
+    <w:tmpl w:val="98020FF0"/>
+    <w:lvl w:ilvl="0" w:tplc="04090001">
+      <w:start w:val="1"/>
+      <w:numFmt w:val="bullet"/>
+      <w:lvlText w:val=""/>
+      <w:lvlJc w:val="left"/>
+      <w:pPr>
+        <w:ind w:left="360" w:hanging="360"/>
+      </w:pPr>
+      <w:rPr>
+        <w:rFonts w:ascii="Symbol" w:hAnsi="Symbol" w:hint="default"/>
+      </w:rPr>
+    </w:lvl>
+    <w:lvl w:ilvl="1" w:tplc="04090003" w:tentative="1">
+      <w:start w:val="1"/>
+      <w:numFmt w:val="bullet"/>
+      <w:lvlText w:val="o"/>
+      <w:lvlJc w:val="left"/>
+      <w:pPr>
+        <w:ind w:left="1080" w:hanging="360"/>
+      </w:pPr>
+      <w:rPr>
+        <w:rFonts w:ascii="Courier New" w:hAnsi="Courier New" w:cs="Courier New" w:hint="default"/>
+      </w:rPr>
+    </w:lvl>
+    <w:lvl w:ilvl="2" w:tplc="04090005" w:tentative="1">
+      <w:start w:val="1"/>
+      <w:numFmt w:val="bullet"/>
+      <w:lvlText w:val=""/>
+      <w:lvlJc w:val="left"/>
+      <w:pPr>
+        <w:ind w:left="1800" w:hanging="360"/>
+      </w:pPr>
+      <w:rPr>
+        <w:rFonts w:ascii="Wingdings" w:hAnsi="Wingdings" w:hint="default"/>
+      </w:rPr>
+    </w:lvl>
+    <w:lvl w:ilvl="3" w:tplc="04090001" w:tentative="1">
+      <w:start w:val="1"/>
+      <w:numFmt w:val="bullet"/>
+      <w:lvlText w:val=""/>
+      <w:lvlJc w:val="left"/>
+      <w:pPr>
+        <w:ind w:left="2520" w:hanging="360"/>
+      </w:pPr>
+      <w:rPr>
+        <w:rFonts w:ascii="Symbol" w:hAnsi="Symbol" w:hint="default"/>
+      </w:rPr>
+    </w:lvl>
+    <w:lvl w:ilvl="4" w:tplc="04090003" w:tentative="1">
+      <w:start w:val="1"/>
+      <w:numFmt w:val="bullet"/>
+      <w:lvlText w:val="o"/>
+      <w:lvlJc w:val="left"/>
+      <w:pPr>
+        <w:ind w:left="3240" w:hanging="360"/>
+      </w:pPr>
+      <w:rPr>
+        <w:rFonts w:ascii="Courier New" w:hAnsi="Courier New" w:cs="Courier New" w:hint="default"/>
+      </w:rPr>
+    </w:lvl>
+    <w:lvl w:ilvl="5" w:tplc="04090005" w:tentative="1">
+      <w:start w:val="1"/>
+      <w:numFmt w:val="bullet"/>
+      <w:lvlText w:val=""/>
+      <w:lvlJc w:val="left"/>
+      <w:pPr>
+        <w:ind w:left="3960" w:hanging="360"/>
+      </w:pPr>
+      <w:rPr>
+        <w:rFonts w:ascii="Wingdings" w:hAnsi="Wingdings" w:hint="default"/>
+      </w:rPr>
+    </w:lvl>
+    <w:lvl w:ilvl="6" w:tplc="04090001" w:tentative="1">
+      <w:start w:val="1"/>
+      <w:numFmt w:val="bullet"/>
+      <w:lvlText w:val=""/>
+      <w:lvlJc w:val="left"/>
+      <w:pPr>
+        <w:ind w:left="4680" w:hanging="360"/>
+      </w:pPr>
+      <w:rPr>
+        <w:rFonts w:ascii="Symbol" w:hAnsi="Symbol" w:hint="default"/>
+      </w:rPr>
+    </w:lvl>
+    <w:lvl w:ilvl="7" w:tplc="04090003" w:tentative="1">
+      <w:start w:val="1"/>
+      <w:numFmt w:val="bullet"/>
+      <w:lvlText w:val="o"/>
+      <w:lvlJc w:val="left"/>
+      <w:pPr>
+        <w:ind w:left="5400" w:hanging="360"/>
+      </w:pPr>
+      <w:rPr>
+        <w:rFonts w:ascii="Courier New" w:hAnsi="Courier New" w:cs="Courier New" w:hint="default"/>
+      </w:rPr>
+    </w:lvl>
+    <w:lvl w:ilvl="8" w:tplc="04090005" w:tentative="1">
+      <w:start w:val="1"/>
+      <w:numFmt w:val="bullet"/>
+      <w:lvlText w:val=""/>
+      <w:lvlJc w:val="left"/>
+      <w:pPr>
+        <w:ind w:left="6120" w:hanging="360"/>
+      </w:pPr>
+      <w:rPr>
+        <w:rFonts w:ascii="Wingdings" w:hAnsi="Wingdings" w:hint="default"/>
+      </w:rPr>
+    </w:lvl>
+  </w:abstractNum>
+  <w:abstractNum w:abstractNumId="6">
     <w:nsid w:val="1BE12BBC"/>
     <w:multiLevelType w:val="hybridMultilevel"/>
     <w:tmpl w:val="F04E8ADA"/>
@@ -2210,7 +3051,7 @@
       </w:rPr>
     </w:lvl>
   </w:abstractNum>
-  <w:abstractNum w:abstractNumId="5">
+  <w:abstractNum w:abstractNumId="7">
     <w:nsid w:val="2E77476A"/>
     <w:multiLevelType w:val="hybridMultilevel"/>
     <w:tmpl w:val="694C00BE"/>
@@ -2325,7 +3166,7 @@
       </w:rPr>
     </w:lvl>
   </w:abstractNum>
-  <w:abstractNum w:abstractNumId="6">
+  <w:abstractNum w:abstractNumId="8">
     <w:nsid w:val="2F63198A"/>
     <w:multiLevelType w:val="hybridMultilevel"/>
     <w:tmpl w:val="8CBEE520"/>
@@ -2438,7 +3279,7 @@
       </w:rPr>
     </w:lvl>
   </w:abstractNum>
-  <w:abstractNum w:abstractNumId="7">
+  <w:abstractNum w:abstractNumId="9">
     <w:nsid w:val="31C4647D"/>
     <w:multiLevelType w:val="hybridMultilevel"/>
     <w:tmpl w:val="C250244E"/>
@@ -2551,7 +3392,7 @@
       </w:rPr>
     </w:lvl>
   </w:abstractNum>
-  <w:abstractNum w:abstractNumId="8">
+  <w:abstractNum w:abstractNumId="10">
     <w:nsid w:val="47BB246C"/>
     <w:multiLevelType w:val="hybridMultilevel"/>
     <w:tmpl w:val="46048FB8"/>
@@ -2665,7 +3506,7 @@
       </w:rPr>
     </w:lvl>
   </w:abstractNum>
-  <w:abstractNum w:abstractNumId="9">
+  <w:abstractNum w:abstractNumId="11">
     <w:nsid w:val="49BD1D98"/>
     <w:multiLevelType w:val="hybridMultilevel"/>
     <w:tmpl w:val="3332526C"/>
@@ -2778,7 +3619,7 @@
       </w:rPr>
     </w:lvl>
   </w:abstractNum>
-  <w:abstractNum w:abstractNumId="10">
+  <w:abstractNum w:abstractNumId="12">
     <w:nsid w:val="4CBE58AB"/>
     <w:multiLevelType w:val="hybridMultilevel"/>
     <w:tmpl w:val="F7484EBC"/>
@@ -2892,7 +3733,7 @@
       </w:rPr>
     </w:lvl>
   </w:abstractNum>
-  <w:abstractNum w:abstractNumId="11">
+  <w:abstractNum w:abstractNumId="13">
     <w:nsid w:val="4DFC1534"/>
     <w:multiLevelType w:val="hybridMultilevel"/>
     <w:tmpl w:val="2EF85536"/>
@@ -3005,7 +3846,7 @@
       </w:rPr>
     </w:lvl>
   </w:abstractNum>
-  <w:abstractNum w:abstractNumId="12">
+  <w:abstractNum w:abstractNumId="14">
     <w:nsid w:val="511F51B9"/>
     <w:multiLevelType w:val="hybridMultilevel"/>
     <w:tmpl w:val="F650FDA2"/>
@@ -3118,7 +3959,121 @@
       </w:rPr>
     </w:lvl>
   </w:abstractNum>
-  <w:abstractNum w:abstractNumId="13">
+  <w:abstractNum w:abstractNumId="15">
+    <w:nsid w:val="567B01C4"/>
+    <w:multiLevelType w:val="hybridMultilevel"/>
+    <w:tmpl w:val="01E64DBC"/>
+    <w:lvl w:ilvl="0" w:tplc="86667042">
+      <w:start w:val="1"/>
+      <w:numFmt w:val="bullet"/>
+      <w:lvlText w:val=""/>
+      <w:lvlJc w:val="left"/>
+      <w:pPr>
+        <w:ind w:left="360" w:hanging="360"/>
+      </w:pPr>
+      <w:rPr>
+        <w:rFonts w:ascii="Symbol" w:hAnsi="Symbol" w:hint="default"/>
+        <w:sz w:val="32"/>
+      </w:rPr>
+    </w:lvl>
+    <w:lvl w:ilvl="1" w:tplc="04090003" w:tentative="1">
+      <w:start w:val="1"/>
+      <w:numFmt w:val="bullet"/>
+      <w:lvlText w:val="o"/>
+      <w:lvlJc w:val="left"/>
+      <w:pPr>
+        <w:ind w:left="1080" w:hanging="360"/>
+      </w:pPr>
+      <w:rPr>
+        <w:rFonts w:ascii="Courier New" w:hAnsi="Courier New" w:cs="Courier New" w:hint="default"/>
+      </w:rPr>
+    </w:lvl>
+    <w:lvl w:ilvl="2" w:tplc="04090005" w:tentative="1">
+      <w:start w:val="1"/>
+      <w:numFmt w:val="bullet"/>
+      <w:lvlText w:val=""/>
+      <w:lvlJc w:val="left"/>
+      <w:pPr>
+        <w:ind w:left="1800" w:hanging="360"/>
+      </w:pPr>
+      <w:rPr>
+        <w:rFonts w:ascii="Wingdings" w:hAnsi="Wingdings" w:hint="default"/>
+      </w:rPr>
+    </w:lvl>
+    <w:lvl w:ilvl="3" w:tplc="04090001" w:tentative="1">
+      <w:start w:val="1"/>
+      <w:numFmt w:val="bullet"/>
+      <w:lvlText w:val=""/>
+      <w:lvlJc w:val="left"/>
+      <w:pPr>
+        <w:ind w:left="2520" w:hanging="360"/>
+      </w:pPr>
+      <w:rPr>
+        <w:rFonts w:ascii="Symbol" w:hAnsi="Symbol" w:hint="default"/>
+      </w:rPr>
+    </w:lvl>
+    <w:lvl w:ilvl="4" w:tplc="04090003" w:tentative="1">
+      <w:start w:val="1"/>
+      <w:numFmt w:val="bullet"/>
+      <w:lvlText w:val="o"/>
+      <w:lvlJc w:val="left"/>
+      <w:pPr>
+        <w:ind w:left="3240" w:hanging="360"/>
+      </w:pPr>
+      <w:rPr>
+        <w:rFonts w:ascii="Courier New" w:hAnsi="Courier New" w:cs="Courier New" w:hint="default"/>
+      </w:rPr>
+    </w:lvl>
+    <w:lvl w:ilvl="5" w:tplc="04090005" w:tentative="1">
+      <w:start w:val="1"/>
+      <w:numFmt w:val="bullet"/>
+      <w:lvlText w:val=""/>
+      <w:lvlJc w:val="left"/>
+      <w:pPr>
+        <w:ind w:left="3960" w:hanging="360"/>
+      </w:pPr>
+      <w:rPr>
+        <w:rFonts w:ascii="Wingdings" w:hAnsi="Wingdings" w:hint="default"/>
+      </w:rPr>
+    </w:lvl>
+    <w:lvl w:ilvl="6" w:tplc="04090001" w:tentative="1">
+      <w:start w:val="1"/>
+      <w:numFmt w:val="bullet"/>
+      <w:lvlText w:val=""/>
+      <w:lvlJc w:val="left"/>
+      <w:pPr>
+        <w:ind w:left="4680" w:hanging="360"/>
+      </w:pPr>
+      <w:rPr>
+        <w:rFonts w:ascii="Symbol" w:hAnsi="Symbol" w:hint="default"/>
+      </w:rPr>
+    </w:lvl>
+    <w:lvl w:ilvl="7" w:tplc="04090003" w:tentative="1">
+      <w:start w:val="1"/>
+      <w:numFmt w:val="bullet"/>
+      <w:lvlText w:val="o"/>
+      <w:lvlJc w:val="left"/>
+      <w:pPr>
+        <w:ind w:left="5400" w:hanging="360"/>
+      </w:pPr>
+      <w:rPr>
+        <w:rFonts w:ascii="Courier New" w:hAnsi="Courier New" w:cs="Courier New" w:hint="default"/>
+      </w:rPr>
+    </w:lvl>
+    <w:lvl w:ilvl="8" w:tplc="04090005" w:tentative="1">
+      <w:start w:val="1"/>
+      <w:numFmt w:val="bullet"/>
+      <w:lvlText w:val=""/>
+      <w:lvlJc w:val="left"/>
+      <w:pPr>
+        <w:ind w:left="6120" w:hanging="360"/>
+      </w:pPr>
+      <w:rPr>
+        <w:rFonts w:ascii="Wingdings" w:hAnsi="Wingdings" w:hint="default"/>
+      </w:rPr>
+    </w:lvl>
+  </w:abstractNum>
+  <w:abstractNum w:abstractNumId="16">
     <w:nsid w:val="57FA5BDC"/>
     <w:multiLevelType w:val="hybridMultilevel"/>
     <w:tmpl w:val="C1069388"/>
@@ -3231,7 +4186,7 @@
       </w:rPr>
     </w:lvl>
   </w:abstractNum>
-  <w:abstractNum w:abstractNumId="14">
+  <w:abstractNum w:abstractNumId="17">
     <w:nsid w:val="6A465EA9"/>
     <w:multiLevelType w:val="hybridMultilevel"/>
     <w:tmpl w:val="83527182"/>
@@ -3344,7 +4299,7 @@
       </w:rPr>
     </w:lvl>
   </w:abstractNum>
-  <w:abstractNum w:abstractNumId="15">
+  <w:abstractNum w:abstractNumId="18">
     <w:nsid w:val="6E0F0971"/>
     <w:multiLevelType w:val="hybridMultilevel"/>
     <w:tmpl w:val="EF481D2C"/>
@@ -3458,7 +4413,7 @@
       </w:rPr>
     </w:lvl>
   </w:abstractNum>
-  <w:abstractNum w:abstractNumId="16">
+  <w:abstractNum w:abstractNumId="19">
     <w:nsid w:val="74E724D3"/>
     <w:multiLevelType w:val="hybridMultilevel"/>
     <w:tmpl w:val="EDCC46EC"/>
@@ -3571,7 +4526,7 @@
       </w:rPr>
     </w:lvl>
   </w:abstractNum>
-  <w:abstractNum w:abstractNumId="17">
+  <w:abstractNum w:abstractNumId="20">
     <w:nsid w:val="774E37A9"/>
     <w:multiLevelType w:val="hybridMultilevel"/>
     <w:tmpl w:val="1E341DC4"/>
@@ -3684,7 +4639,7 @@
       </w:rPr>
     </w:lvl>
   </w:abstractNum>
-  <w:abstractNum w:abstractNumId="18">
+  <w:abstractNum w:abstractNumId="21">
     <w:nsid w:val="7C7B411A"/>
     <w:multiLevelType w:val="hybridMultilevel"/>
     <w:tmpl w:val="DD327E98"/>
@@ -3798,64 +4753,73 @@
     </w:lvl>
   </w:abstractNum>
   <w:num w:numId="1">
+    <w:abstractNumId w:val="19"/>
+  </w:num>
+  <w:num w:numId="2">
     <w:abstractNumId w:val="16"/>
   </w:num>
-  <w:num w:numId="2">
+  <w:num w:numId="3">
     <w:abstractNumId w:val="13"/>
   </w:num>
-  <w:num w:numId="3">
-    <w:abstractNumId w:val="11"/>
+  <w:num w:numId="4">
+    <w:abstractNumId w:val="8"/>
   </w:num>
-  <w:num w:numId="4">
+  <w:num w:numId="5">
     <w:abstractNumId w:val="6"/>
   </w:num>
-  <w:num w:numId="5">
-    <w:abstractNumId w:val="4"/>
-  </w:num>
   <w:num w:numId="6">
-    <w:abstractNumId w:val="1"/>
+    <w:abstractNumId w:val="2"/>
   </w:num>
   <w:num w:numId="7">
+    <w:abstractNumId w:val="17"/>
+  </w:num>
+  <w:num w:numId="8">
+    <w:abstractNumId w:val="9"/>
+  </w:num>
+  <w:num w:numId="9">
     <w:abstractNumId w:val="14"/>
   </w:num>
-  <w:num w:numId="8">
-    <w:abstractNumId w:val="7"/>
-  </w:num>
-  <w:num w:numId="9">
-    <w:abstractNumId w:val="12"/>
-  </w:num>
   <w:num w:numId="10">
-    <w:abstractNumId w:val="9"/>
+    <w:abstractNumId w:val="11"/>
   </w:num>
   <w:num w:numId="11">
     <w:abstractNumId w:val="0"/>
   </w:num>
   <w:num w:numId="12">
+    <w:abstractNumId w:val="21"/>
+  </w:num>
+  <w:num w:numId="13">
+    <w:abstractNumId w:val="9"/>
+  </w:num>
+  <w:num w:numId="14">
     <w:abstractNumId w:val="18"/>
   </w:num>
-  <w:num w:numId="13">
+  <w:num w:numId="15">
     <w:abstractNumId w:val="7"/>
   </w:num>
-  <w:num w:numId="14">
-    <w:abstractNumId w:val="15"/>
+  <w:num w:numId="16">
+    <w:abstractNumId w:val="4"/>
   </w:num>
-  <w:num w:numId="15">
+  <w:num w:numId="17">
+    <w:abstractNumId w:val="12"/>
+  </w:num>
+  <w:num w:numId="18">
+    <w:abstractNumId w:val="3"/>
+  </w:num>
+  <w:num w:numId="19">
+    <w:abstractNumId w:val="10"/>
+  </w:num>
+  <w:num w:numId="20">
+    <w:abstractNumId w:val="20"/>
+  </w:num>
+  <w:num w:numId="21">
+    <w:abstractNumId w:val="1"/>
+  </w:num>
+  <w:num w:numId="22">
     <w:abstractNumId w:val="5"/>
   </w:num>
-  <w:num w:numId="16">
-    <w:abstractNumId w:val="3"/>
-  </w:num>
-  <w:num w:numId="17">
-    <w:abstractNumId w:val="10"/>
-  </w:num>
-  <w:num w:numId="18">
-    <w:abstractNumId w:val="2"/>
-  </w:num>
-  <w:num w:numId="19">
-    <w:abstractNumId w:val="8"/>
-  </w:num>
-  <w:num w:numId="20">
-    <w:abstractNumId w:val="17"/>
+  <w:num w:numId="23">
+    <w:abstractNumId w:val="15"/>
   </w:num>
 </w:numbering>
 </file>
@@ -4097,6 +5061,50 @@
       <w:spacing w:after="0" w:line="240" w:lineRule="auto"/>
     </w:pPr>
   </w:style>
+  <w:style w:type="paragraph" w:styleId="Header">
+    <w:name w:val="header"/>
+    <w:basedOn w:val="Normal"/>
+    <w:link w:val="HeaderChar"/>
+    <w:uiPriority w:val="99"/>
+    <w:unhideWhenUsed/>
+    <w:rsid w:val="00302219"/>
+    <w:pPr>
+      <w:tabs>
+        <w:tab w:val="center" w:pos="4680"/>
+        <w:tab w:val="right" w:pos="9360"/>
+      </w:tabs>
+      <w:spacing w:after="0" w:line="240" w:lineRule="auto"/>
+    </w:pPr>
+  </w:style>
+  <w:style w:type="character" w:customStyle="1" w:styleId="HeaderChar">
+    <w:name w:val="Header Char"/>
+    <w:basedOn w:val="DefaultParagraphFont"/>
+    <w:link w:val="Header"/>
+    <w:uiPriority w:val="99"/>
+    <w:rsid w:val="00302219"/>
+  </w:style>
+  <w:style w:type="paragraph" w:styleId="Footer">
+    <w:name w:val="footer"/>
+    <w:basedOn w:val="Normal"/>
+    <w:link w:val="FooterChar"/>
+    <w:uiPriority w:val="99"/>
+    <w:unhideWhenUsed/>
+    <w:rsid w:val="00302219"/>
+    <w:pPr>
+      <w:tabs>
+        <w:tab w:val="center" w:pos="4680"/>
+        <w:tab w:val="right" w:pos="9360"/>
+      </w:tabs>
+      <w:spacing w:after="0" w:line="240" w:lineRule="auto"/>
+    </w:pPr>
+  </w:style>
+  <w:style w:type="character" w:customStyle="1" w:styleId="FooterChar">
+    <w:name w:val="Footer Char"/>
+    <w:basedOn w:val="DefaultParagraphFont"/>
+    <w:link w:val="Footer"/>
+    <w:uiPriority w:val="99"/>
+    <w:rsid w:val="00302219"/>
+  </w:style>
 </w:styles>
 </file>
 
@@ -4336,6 +5344,50 @@
     <w:pPr>
       <w:spacing w:after="0" w:line="240" w:lineRule="auto"/>
     </w:pPr>
+  </w:style>
+  <w:style w:type="paragraph" w:styleId="Header">
+    <w:name w:val="header"/>
+    <w:basedOn w:val="Normal"/>
+    <w:link w:val="HeaderChar"/>
+    <w:uiPriority w:val="99"/>
+    <w:unhideWhenUsed/>
+    <w:rsid w:val="00302219"/>
+    <w:pPr>
+      <w:tabs>
+        <w:tab w:val="center" w:pos="4680"/>
+        <w:tab w:val="right" w:pos="9360"/>
+      </w:tabs>
+      <w:spacing w:after="0" w:line="240" w:lineRule="auto"/>
+    </w:pPr>
+  </w:style>
+  <w:style w:type="character" w:customStyle="1" w:styleId="HeaderChar">
+    <w:name w:val="Header Char"/>
+    <w:basedOn w:val="DefaultParagraphFont"/>
+    <w:link w:val="Header"/>
+    <w:uiPriority w:val="99"/>
+    <w:rsid w:val="00302219"/>
+  </w:style>
+  <w:style w:type="paragraph" w:styleId="Footer">
+    <w:name w:val="footer"/>
+    <w:basedOn w:val="Normal"/>
+    <w:link w:val="FooterChar"/>
+    <w:uiPriority w:val="99"/>
+    <w:unhideWhenUsed/>
+    <w:rsid w:val="00302219"/>
+    <w:pPr>
+      <w:tabs>
+        <w:tab w:val="center" w:pos="4680"/>
+        <w:tab w:val="right" w:pos="9360"/>
+      </w:tabs>
+      <w:spacing w:after="0" w:line="240" w:lineRule="auto"/>
+    </w:pPr>
+  </w:style>
+  <w:style w:type="character" w:customStyle="1" w:styleId="FooterChar">
+    <w:name w:val="Footer Char"/>
+    <w:basedOn w:val="DefaultParagraphFont"/>
+    <w:link w:val="Footer"/>
+    <w:uiPriority w:val="99"/>
+    <w:rsid w:val="00302219"/>
   </w:style>
 </w:styles>
 </file>
@@ -4630,7 +5682,7 @@
 </file>
 
 <file path=customXml/itemProps1.xml><?xml version="1.0" encoding="utf-8"?>
-<ds:datastoreItem xmlns:ds="http://schemas.openxmlformats.org/officeDocument/2006/customXml" ds:itemID="{EE8A95BD-3968-4B06-B0B5-30E7D3CBF6B7}">
+<ds:datastoreItem xmlns:ds="http://schemas.openxmlformats.org/officeDocument/2006/customXml" ds:itemID="{469A111B-1D90-41BB-B752-A142E42D4418}">
   <ds:schemaRefs>
     <ds:schemaRef ds:uri="http://schemas.openxmlformats.org/officeDocument/2006/bibliography"/>
   </ds:schemaRefs>

</xml_diff>

<commit_message>
Menu mouse interaction. Block optimizations! For V16 PHOSPHORUS U01!
</commit_message>
<xml_diff>
--- a/changelog.docx
+++ b/changelog.docx
@@ -44,7 +44,7 @@
           <w:b/>
           <w:sz w:val="48"/>
         </w:rPr>
-        <w:t>5</w:t>
+        <w:t>6</w:t>
       </w:r>
       <w:r>
         <w:rPr>
@@ -60,7 +60,7 @@
           <w:b/>
           <w:sz w:val="48"/>
         </w:rPr>
-        <w:t>OXYGEN</w:t>
+        <w:t>PHOSPHORUS</w:t>
       </w:r>
       <w:r>
         <w:rPr>
@@ -188,6 +188,46 @@
     <w:p>
       <w:pPr>
         <w:pStyle w:val="NoSpacing"/>
+        <w:jc w:val="center"/>
+        <w:rPr>
+          <w:rFonts w:ascii="Verdana" w:hAnsi="Verdana"/>
+          <w:b/>
+          <w:sz w:val="48"/>
+        </w:rPr>
+      </w:pPr>
+      <w:r>
+        <w:rPr>
+          <w:rFonts w:ascii="Verdana" w:hAnsi="Verdana"/>
+          <w:b/>
+          <w:sz w:val="48"/>
+        </w:rPr>
+        <w:t>[</w:t>
+      </w:r>
+      <w:r>
+        <w:rPr>
+          <w:rFonts w:ascii="Verdana" w:hAnsi="Verdana"/>
+          <w:b/>
+          <w:sz w:val="48"/>
+        </w:rPr>
+        <w:t>PHOSPHORUS</w:t>
+      </w:r>
+      <w:r>
+        <w:rPr>
+          <w:rFonts w:ascii="Verdana" w:hAnsi="Verdana"/>
+          <w:b/>
+          <w:sz w:val="48"/>
+        </w:rPr>
+        <w:t>]</w:t>
+      </w:r>
+    </w:p>
+    <w:p>
+      <w:pPr>
+        <w:pStyle w:val="NoSpacing"/>
+      </w:pPr>
+    </w:p>
+    <w:p>
+      <w:pPr>
+        <w:pStyle w:val="NoSpacing"/>
         <w:rPr>
           <w:rFonts w:ascii="Verdana" w:hAnsi="Verdana"/>
           <w:b/>
@@ -212,73 +252,41 @@
           <w:ilvl w:val="0"/>
           <w:numId w:val="22"/>
         </w:numPr>
-        <w:rPr>
-          <w:rFonts w:ascii="Verdana" w:hAnsi="Verdana"/>
-          <w:sz w:val="32"/>
-          <w:szCs w:val="32"/>
-        </w:rPr>
-      </w:pPr>
-      <w:r>
-        <w:rPr>
-          <w:rFonts w:ascii="Verdana" w:hAnsi="Verdana"/>
-          <w:sz w:val="32"/>
-          <w:szCs w:val="32"/>
-        </w:rPr>
-        <w:t xml:space="preserve">Single player has been unlocked. Player is able to wield one of the six guns (Beretta pistol, </w:t>
-      </w:r>
-      <w:r>
-        <w:rPr>
-          <w:rFonts w:ascii="Verdana" w:hAnsi="Verdana"/>
-          <w:sz w:val="32"/>
-          <w:szCs w:val="32"/>
-        </w:rPr>
-        <w:t>SMG P90</w:t>
-      </w:r>
-      <w:r>
-        <w:rPr>
-          <w:rFonts w:ascii="Verdana" w:hAnsi="Verdana"/>
-          <w:sz w:val="32"/>
-          <w:szCs w:val="32"/>
-        </w:rPr>
-        <w:t xml:space="preserve">, Shotgun, </w:t>
-      </w:r>
-      <w:bookmarkStart w:id="0" w:name="_GoBack"/>
-      <w:bookmarkEnd w:id="0"/>
-      <w:r>
-        <w:rPr>
-          <w:rFonts w:ascii="Verdana" w:hAnsi="Verdana"/>
-          <w:sz w:val="32"/>
-          <w:szCs w:val="32"/>
-        </w:rPr>
-        <w:t>Assault rifle AK-47</w:t>
-      </w:r>
-      <w:r>
-        <w:rPr>
-          <w:rFonts w:ascii="Verdana" w:hAnsi="Verdana"/>
-          <w:sz w:val="32"/>
-          <w:szCs w:val="32"/>
-        </w:rPr>
-        <w:t>, M60, Sniper Rifle). However there’re no animations for these guns.</w:t>
-      </w:r>
-      <w:r>
-        <w:rPr>
-          <w:rFonts w:ascii="Verdana" w:hAnsi="Verdana"/>
-          <w:sz w:val="32"/>
-          <w:szCs w:val="32"/>
-        </w:rPr>
-        <w:t xml:space="preserve"> Neither fire or alt-fire have been implemented yet.</w:t>
-      </w:r>
-    </w:p>
-    <w:p>
-      <w:pPr>
-        <w:pStyle w:val="NoSpacing"/>
-        <w:ind w:left="360"/>
-        <w:rPr>
-          <w:rFonts w:ascii="Verdana" w:hAnsi="Verdana"/>
-          <w:sz w:val="32"/>
-          <w:szCs w:val="32"/>
-        </w:rPr>
-      </w:pPr>
+      </w:pPr>
+      <w:r>
+        <w:rPr>
+          <w:rFonts w:ascii="Verdana" w:hAnsi="Verdana"/>
+          <w:sz w:val="32"/>
+          <w:szCs w:val="32"/>
+        </w:rPr>
+        <w:t>Menu interaction using mouse besides keyboard. Cursor implemented.</w:t>
+      </w:r>
+    </w:p>
+    <w:p>
+      <w:pPr>
+        <w:pStyle w:val="NoSpacing"/>
+        <w:jc w:val="center"/>
+      </w:pPr>
+    </w:p>
+    <w:p>
+      <w:pPr>
+        <w:pStyle w:val="NoSpacing"/>
+        <w:rPr>
+          <w:rFonts w:ascii="Verdana" w:hAnsi="Verdana"/>
+          <w:b/>
+          <w:color w:val="FFC000"/>
+          <w:sz w:val="48"/>
+        </w:rPr>
+      </w:pPr>
+      <w:r>
+        <w:rPr>
+          <w:rFonts w:ascii="Verdana" w:hAnsi="Verdana"/>
+          <w:b/>
+          <w:color w:val="FFC000"/>
+          <w:sz w:val="48"/>
+        </w:rPr>
+        <w:t>CHANGES:</w:t>
+      </w:r>
     </w:p>
     <w:p>
       <w:pPr>
@@ -299,77 +307,224 @@
           <w:sz w:val="32"/>
           <w:szCs w:val="32"/>
         </w:rPr>
-        <w:t xml:space="preserve">Entering single player will cancel editor mode and prevent modifying the level unless player choose to go into editor and load level again. </w:t>
-      </w:r>
-      <w:r>
-        <w:rPr>
-          <w:rFonts w:ascii="Verdana" w:hAnsi="Verdana"/>
-          <w:sz w:val="32"/>
-          <w:szCs w:val="32"/>
-        </w:rPr>
-        <w:t>Player</w:t>
-      </w:r>
-      <w:r>
-        <w:rPr>
-          <w:rFonts w:ascii="Verdana" w:hAnsi="Verdana"/>
-          <w:sz w:val="32"/>
-          <w:szCs w:val="32"/>
-        </w:rPr>
-        <w:t xml:space="preserve"> will be prompted “</w:t>
-      </w:r>
-      <w:r>
-        <w:rPr>
-          <w:rFonts w:ascii="Verdana" w:hAnsi="Verdana"/>
-          <w:sz w:val="32"/>
-          <w:szCs w:val="32"/>
-        </w:rPr>
-        <w:t>Start New G</w:t>
-      </w:r>
-      <w:r>
-        <w:rPr>
-          <w:rFonts w:ascii="Verdana" w:hAnsi="Verdana"/>
-          <w:sz w:val="32"/>
-          <w:szCs w:val="32"/>
-        </w:rPr>
-        <w:t>ame?”</w:t>
-      </w:r>
-      <w:r>
-        <w:rPr>
-          <w:rFonts w:ascii="Verdana" w:hAnsi="Verdana"/>
-          <w:sz w:val="32"/>
-          <w:szCs w:val="32"/>
-        </w:rPr>
-        <w:t xml:space="preserve"> and if answer is yes or y game will switch to Single Player mode.</w:t>
-      </w:r>
-    </w:p>
-    <w:p>
-      <w:pPr>
-        <w:pStyle w:val="NoSpacing"/>
-        <w:rPr>
-          <w:rFonts w:ascii="Verdana" w:hAnsi="Verdana"/>
-          <w:sz w:val="32"/>
-          <w:szCs w:val="32"/>
-        </w:rPr>
-      </w:pPr>
-    </w:p>
-    <w:p>
-      <w:pPr>
-        <w:pStyle w:val="NoSpacing"/>
-        <w:rPr>
-          <w:rFonts w:ascii="Verdana" w:hAnsi="Verdana"/>
-          <w:b/>
-          <w:color w:val="FFC000"/>
-          <w:sz w:val="48"/>
-        </w:rPr>
-      </w:pPr>
-      <w:r>
-        <w:rPr>
-          <w:rFonts w:ascii="Verdana" w:hAnsi="Verdana"/>
-          <w:b/>
-          <w:color w:val="FFC000"/>
-          <w:sz w:val="48"/>
-        </w:rPr>
-        <w:t>CHANGES:</w:t>
+        <w:t>Changes in block add/</w:t>
+      </w:r>
+      <w:proofErr w:type="gramStart"/>
+      <w:r>
+        <w:rPr>
+          <w:rFonts w:ascii="Verdana" w:hAnsi="Verdana"/>
+          <w:sz w:val="32"/>
+          <w:szCs w:val="32"/>
+        </w:rPr>
+        <w:t>removal resulting in faster block</w:t>
+      </w:r>
+      <w:proofErr w:type="gramEnd"/>
+      <w:r>
+        <w:rPr>
+          <w:rFonts w:ascii="Verdana" w:hAnsi="Verdana"/>
+          <w:sz w:val="32"/>
+          <w:szCs w:val="32"/>
+        </w:rPr>
+        <w:t xml:space="preserve"> operations, faster level generation, level saving and loading.</w:t>
+      </w:r>
+    </w:p>
+    <w:p>
+      <w:pPr>
+        <w:pStyle w:val="NoSpacing"/>
+        <w:jc w:val="center"/>
+      </w:pPr>
+    </w:p>
+    <w:p>
+      <w:pPr>
+        <w:pStyle w:val="NoSpacing"/>
+        <w:jc w:val="center"/>
+      </w:pPr>
+    </w:p>
+    <w:p>
+      <w:pPr>
+        <w:pStyle w:val="NoSpacing"/>
+        <w:jc w:val="center"/>
+      </w:pPr>
+    </w:p>
+    <w:p>
+      <w:pPr>
+        <w:pStyle w:val="NoSpacing"/>
+        <w:jc w:val="center"/>
+      </w:pPr>
+    </w:p>
+    <w:p>
+      <w:pPr>
+        <w:pStyle w:val="NoSpacing"/>
+        <w:jc w:val="center"/>
+      </w:pPr>
+    </w:p>
+    <w:p>
+      <w:pPr>
+        <w:pStyle w:val="NoSpacing"/>
+        <w:jc w:val="center"/>
+      </w:pPr>
+    </w:p>
+    <w:p>
+      <w:pPr>
+        <w:pStyle w:val="NoSpacing"/>
+        <w:jc w:val="center"/>
+      </w:pPr>
+    </w:p>
+    <w:p>
+      <w:pPr>
+        <w:pStyle w:val="NoSpacing"/>
+        <w:jc w:val="center"/>
+      </w:pPr>
+    </w:p>
+    <w:p>
+      <w:pPr>
+        <w:pStyle w:val="NoSpacing"/>
+        <w:jc w:val="center"/>
+      </w:pPr>
+    </w:p>
+    <w:p>
+      <w:pPr>
+        <w:pStyle w:val="NoSpacing"/>
+        <w:jc w:val="center"/>
+      </w:pPr>
+    </w:p>
+    <w:p>
+      <w:pPr>
+        <w:pStyle w:val="NoSpacing"/>
+        <w:jc w:val="center"/>
+      </w:pPr>
+    </w:p>
+    <w:p>
+      <w:pPr>
+        <w:pStyle w:val="NoSpacing"/>
+        <w:jc w:val="center"/>
+      </w:pPr>
+    </w:p>
+    <w:p>
+      <w:pPr>
+        <w:pStyle w:val="NoSpacing"/>
+        <w:jc w:val="center"/>
+      </w:pPr>
+    </w:p>
+    <w:p>
+      <w:pPr>
+        <w:pStyle w:val="NoSpacing"/>
+        <w:jc w:val="center"/>
+      </w:pPr>
+    </w:p>
+    <w:p>
+      <w:pPr>
+        <w:pStyle w:val="NoSpacing"/>
+        <w:jc w:val="center"/>
+      </w:pPr>
+    </w:p>
+    <w:p>
+      <w:pPr>
+        <w:pStyle w:val="NoSpacing"/>
+        <w:jc w:val="center"/>
+      </w:pPr>
+    </w:p>
+    <w:p>
+      <w:pPr>
+        <w:pStyle w:val="NoSpacing"/>
+        <w:jc w:val="center"/>
+      </w:pPr>
+    </w:p>
+    <w:p>
+      <w:pPr>
+        <w:pStyle w:val="NoSpacing"/>
+        <w:jc w:val="center"/>
+      </w:pPr>
+    </w:p>
+    <w:p>
+      <w:pPr>
+        <w:pStyle w:val="NoSpacing"/>
+        <w:jc w:val="center"/>
+      </w:pPr>
+    </w:p>
+    <w:p>
+      <w:pPr>
+        <w:pStyle w:val="NoSpacing"/>
+        <w:jc w:val="center"/>
+      </w:pPr>
+    </w:p>
+    <w:p>
+      <w:pPr>
+        <w:pStyle w:val="NoSpacing"/>
+        <w:jc w:val="center"/>
+      </w:pPr>
+    </w:p>
+    <w:p>
+      <w:pPr>
+        <w:pStyle w:val="NoSpacing"/>
+        <w:jc w:val="center"/>
+      </w:pPr>
+    </w:p>
+    <w:p>
+      <w:pPr>
+        <w:pStyle w:val="NoSpacing"/>
+        <w:jc w:val="center"/>
+        <w:rPr>
+          <w:rFonts w:ascii="Verdana" w:hAnsi="Verdana"/>
+          <w:b/>
+          <w:sz w:val="48"/>
+        </w:rPr>
+      </w:pPr>
+      <w:r>
+        <w:rPr>
+          <w:rFonts w:ascii="Verdana" w:hAnsi="Verdana"/>
+          <w:b/>
+          <w:sz w:val="48"/>
+        </w:rPr>
+        <w:lastRenderedPageBreak/>
+        <w:t>[</w:t>
+      </w:r>
+      <w:r>
+        <w:rPr>
+          <w:rFonts w:ascii="Verdana" w:hAnsi="Verdana"/>
+          <w:b/>
+          <w:sz w:val="48"/>
+        </w:rPr>
+        <w:t>OXYGEN</w:t>
+      </w:r>
+      <w:r>
+        <w:rPr>
+          <w:rFonts w:ascii="Verdana" w:hAnsi="Verdana"/>
+          <w:b/>
+          <w:sz w:val="48"/>
+        </w:rPr>
+        <w:t>]</w:t>
+      </w:r>
+    </w:p>
+    <w:p>
+      <w:pPr>
+        <w:pStyle w:val="NoSpacing"/>
+        <w:jc w:val="center"/>
+        <w:rPr>
+          <w:rFonts w:ascii="Verdana" w:hAnsi="Verdana"/>
+          <w:b/>
+          <w:sz w:val="48"/>
+        </w:rPr>
+      </w:pPr>
+    </w:p>
+    <w:p>
+      <w:pPr>
+        <w:pStyle w:val="NoSpacing"/>
+        <w:rPr>
+          <w:rFonts w:ascii="Verdana" w:hAnsi="Verdana"/>
+          <w:b/>
+          <w:color w:val="00B050"/>
+          <w:sz w:val="48"/>
+        </w:rPr>
+      </w:pPr>
+      <w:r>
+        <w:rPr>
+          <w:rFonts w:ascii="Verdana" w:hAnsi="Verdana"/>
+          <w:b/>
+          <w:color w:val="00B050"/>
+          <w:sz w:val="48"/>
+        </w:rPr>
+        <w:t>FEATURES:</w:t>
       </w:r>
     </w:p>
     <w:p>
@@ -391,6 +546,171 @@
           <w:sz w:val="32"/>
           <w:szCs w:val="32"/>
         </w:rPr>
+        <w:t xml:space="preserve">Single player has been unlocked. Player is able to wield one of the six guns (Beretta pistol, </w:t>
+      </w:r>
+      <w:r>
+        <w:rPr>
+          <w:rFonts w:ascii="Verdana" w:hAnsi="Verdana"/>
+          <w:sz w:val="32"/>
+          <w:szCs w:val="32"/>
+        </w:rPr>
+        <w:t>SMG P90</w:t>
+      </w:r>
+      <w:r>
+        <w:rPr>
+          <w:rFonts w:ascii="Verdana" w:hAnsi="Verdana"/>
+          <w:sz w:val="32"/>
+          <w:szCs w:val="32"/>
+        </w:rPr>
+        <w:t xml:space="preserve">, Shotgun, </w:t>
+      </w:r>
+      <w:r>
+        <w:rPr>
+          <w:rFonts w:ascii="Verdana" w:hAnsi="Verdana"/>
+          <w:sz w:val="32"/>
+          <w:szCs w:val="32"/>
+        </w:rPr>
+        <w:t>Assault rifle AK-47</w:t>
+      </w:r>
+      <w:r>
+        <w:rPr>
+          <w:rFonts w:ascii="Verdana" w:hAnsi="Verdana"/>
+          <w:sz w:val="32"/>
+          <w:szCs w:val="32"/>
+        </w:rPr>
+        <w:t>, M60, Sniper Rifle). However there’re no animations for these guns.</w:t>
+      </w:r>
+      <w:r>
+        <w:rPr>
+          <w:rFonts w:ascii="Verdana" w:hAnsi="Verdana"/>
+          <w:sz w:val="32"/>
+          <w:szCs w:val="32"/>
+        </w:rPr>
+        <w:t xml:space="preserve"> Neither fire or alt-fire have been implemented yet.</w:t>
+      </w:r>
+    </w:p>
+    <w:p>
+      <w:pPr>
+        <w:pStyle w:val="NoSpacing"/>
+        <w:ind w:left="360"/>
+        <w:rPr>
+          <w:rFonts w:ascii="Verdana" w:hAnsi="Verdana"/>
+          <w:sz w:val="32"/>
+          <w:szCs w:val="32"/>
+        </w:rPr>
+      </w:pPr>
+    </w:p>
+    <w:p>
+      <w:pPr>
+        <w:pStyle w:val="NoSpacing"/>
+        <w:numPr>
+          <w:ilvl w:val="0"/>
+          <w:numId w:val="22"/>
+        </w:numPr>
+        <w:rPr>
+          <w:rFonts w:ascii="Verdana" w:hAnsi="Verdana"/>
+          <w:sz w:val="32"/>
+          <w:szCs w:val="32"/>
+        </w:rPr>
+      </w:pPr>
+      <w:r>
+        <w:rPr>
+          <w:rFonts w:ascii="Verdana" w:hAnsi="Verdana"/>
+          <w:sz w:val="32"/>
+          <w:szCs w:val="32"/>
+        </w:rPr>
+        <w:t xml:space="preserve">Entering single player will cancel editor mode and prevent modifying the level unless player choose to go into editor and load level again. </w:t>
+      </w:r>
+      <w:r>
+        <w:rPr>
+          <w:rFonts w:ascii="Verdana" w:hAnsi="Verdana"/>
+          <w:sz w:val="32"/>
+          <w:szCs w:val="32"/>
+        </w:rPr>
+        <w:t>Player</w:t>
+      </w:r>
+      <w:r>
+        <w:rPr>
+          <w:rFonts w:ascii="Verdana" w:hAnsi="Verdana"/>
+          <w:sz w:val="32"/>
+          <w:szCs w:val="32"/>
+        </w:rPr>
+        <w:t xml:space="preserve"> will be prompted “</w:t>
+      </w:r>
+      <w:r>
+        <w:rPr>
+          <w:rFonts w:ascii="Verdana" w:hAnsi="Verdana"/>
+          <w:sz w:val="32"/>
+          <w:szCs w:val="32"/>
+        </w:rPr>
+        <w:t>Start New G</w:t>
+      </w:r>
+      <w:r>
+        <w:rPr>
+          <w:rFonts w:ascii="Verdana" w:hAnsi="Verdana"/>
+          <w:sz w:val="32"/>
+          <w:szCs w:val="32"/>
+        </w:rPr>
+        <w:t>ame?”</w:t>
+      </w:r>
+      <w:r>
+        <w:rPr>
+          <w:rFonts w:ascii="Verdana" w:hAnsi="Verdana"/>
+          <w:sz w:val="32"/>
+          <w:szCs w:val="32"/>
+        </w:rPr>
+        <w:t xml:space="preserve"> and if answer is yes or y game will switch to Single Player mode.</w:t>
+      </w:r>
+    </w:p>
+    <w:p>
+      <w:pPr>
+        <w:pStyle w:val="NoSpacing"/>
+        <w:rPr>
+          <w:rFonts w:ascii="Verdana" w:hAnsi="Verdana"/>
+          <w:sz w:val="32"/>
+          <w:szCs w:val="32"/>
+        </w:rPr>
+      </w:pPr>
+    </w:p>
+    <w:p>
+      <w:pPr>
+        <w:pStyle w:val="NoSpacing"/>
+        <w:rPr>
+          <w:rFonts w:ascii="Verdana" w:hAnsi="Verdana"/>
+          <w:b/>
+          <w:color w:val="FFC000"/>
+          <w:sz w:val="48"/>
+        </w:rPr>
+      </w:pPr>
+      <w:r>
+        <w:rPr>
+          <w:rFonts w:ascii="Verdana" w:hAnsi="Verdana"/>
+          <w:b/>
+          <w:color w:val="FFC000"/>
+          <w:sz w:val="48"/>
+        </w:rPr>
+        <w:t>CHANGES:</w:t>
+      </w:r>
+    </w:p>
+    <w:p>
+      <w:pPr>
+        <w:pStyle w:val="NoSpacing"/>
+        <w:numPr>
+          <w:ilvl w:val="0"/>
+          <w:numId w:val="22"/>
+        </w:numPr>
+        <w:rPr>
+          <w:rFonts w:ascii="Verdana" w:hAnsi="Verdana"/>
+          <w:sz w:val="32"/>
+          <w:szCs w:val="32"/>
+        </w:rPr>
+      </w:pPr>
+      <w:r>
+        <w:rPr>
+          <w:rFonts w:ascii="Verdana" w:hAnsi="Verdana"/>
+          <w:sz w:val="32"/>
+          <w:szCs w:val="32"/>
+        </w:rPr>
         <w:t xml:space="preserve">Game support modifications. Make your own dsynergy.zip archive or make folders </w:t>
       </w:r>
       <w:r>
@@ -412,16 +732,6 @@
     </w:p>
     <w:p>
       <w:pPr>
-        <w:pStyle w:val="ListParagraph"/>
-        <w:rPr>
-          <w:rFonts w:ascii="Verdana" w:hAnsi="Verdana"/>
-          <w:sz w:val="32"/>
-          <w:szCs w:val="32"/>
-        </w:rPr>
-      </w:pPr>
-    </w:p>
-    <w:p>
-      <w:pPr>
         <w:pStyle w:val="NoSpacing"/>
         <w:rPr>
           <w:rFonts w:ascii="Verdana" w:hAnsi="Verdana"/>
@@ -430,14 +740,34 @@
           <w:sz w:val="48"/>
         </w:rPr>
       </w:pPr>
-      <w:r>
+    </w:p>
+    <w:p>
+      <w:pPr>
+        <w:pStyle w:val="NoSpacing"/>
         <w:rPr>
           <w:rFonts w:ascii="Verdana" w:hAnsi="Verdana"/>
           <w:b/>
           <w:color w:val="A6A6A6" w:themeColor="background1" w:themeShade="A6"/>
           <w:sz w:val="48"/>
         </w:rPr>
-        <w:t>KNOWN ISSUESS:</w:t>
+      </w:pPr>
+      <w:r>
+        <w:rPr>
+          <w:rFonts w:ascii="Verdana" w:hAnsi="Verdana"/>
+          <w:b/>
+          <w:color w:val="A6A6A6" w:themeColor="background1" w:themeShade="A6"/>
+          <w:sz w:val="48"/>
+        </w:rPr>
+        <w:t>K</w:t>
+      </w:r>
+      <w:r>
+        <w:rPr>
+          <w:rFonts w:ascii="Verdana" w:hAnsi="Verdana"/>
+          <w:b/>
+          <w:color w:val="A6A6A6" w:themeColor="background1" w:themeShade="A6"/>
+          <w:sz w:val="48"/>
+        </w:rPr>
+        <w:t>NOWN ISSUESS:</w:t>
       </w:r>
     </w:p>
     <w:p>
@@ -511,402 +841,49 @@
         <w:pStyle w:val="NoSpacing"/>
         <w:rPr>
           <w:rFonts w:ascii="Verdana" w:hAnsi="Verdana"/>
-          <w:b/>
-          <w:sz w:val="48"/>
-        </w:rPr>
-      </w:pPr>
-      <w:r>
-        <w:rPr>
-          <w:rFonts w:ascii="Verdana" w:hAnsi="Verdana"/>
-          <w:b/>
-          <w:sz w:val="48"/>
-        </w:rPr>
-        <w:t>Game assets structure (by entries)</w:t>
-      </w:r>
-      <w:r>
-        <w:rPr>
-          <w:rFonts w:ascii="Verdana" w:hAnsi="Verdana"/>
-          <w:b/>
-          <w:sz w:val="48"/>
-        </w:rPr>
-        <w:t>:</w:t>
-      </w:r>
-    </w:p>
-    <w:p>
-      <w:pPr>
-        <w:pStyle w:val="NoSpacing"/>
-        <w:numPr>
-          <w:ilvl w:val="0"/>
-          <w:numId w:val="22"/>
-        </w:numPr>
-        <w:rPr>
-          <w:rFonts w:ascii="Verdana" w:hAnsi="Verdana"/>
-          <w:b/>
-          <w:sz w:val="48"/>
-        </w:rPr>
-      </w:pPr>
-      <w:r>
-        <w:rPr>
-          <w:rFonts w:ascii="Verdana" w:hAnsi="Verdana"/>
-          <w:b/>
-          <w:sz w:val="48"/>
-        </w:rPr>
-        <w:t xml:space="preserve">effects </w:t>
-      </w:r>
-      <w:r>
-        <w:rPr>
-          <w:rFonts w:ascii="Verdana" w:hAnsi="Verdana"/>
-          <w:sz w:val="48"/>
-        </w:rPr>
-        <w:t xml:space="preserve">– contains </w:t>
-      </w:r>
-      <w:proofErr w:type="spellStart"/>
-      <w:r>
-        <w:rPr>
-          <w:rFonts w:ascii="Verdana" w:hAnsi="Verdana"/>
-          <w:sz w:val="48"/>
-        </w:rPr>
-        <w:t>shaders</w:t>
-      </w:r>
-      <w:proofErr w:type="spellEnd"/>
-      <w:r>
-        <w:rPr>
-          <w:rFonts w:ascii="Verdana" w:hAnsi="Verdana"/>
-          <w:sz w:val="48"/>
-        </w:rPr>
-        <w:t xml:space="preserve"> (according to the OpenGL 3.3 and GLSL 3.3)</w:t>
-      </w:r>
-      <w:r>
-        <w:rPr>
-          <w:rFonts w:ascii="Verdana" w:hAnsi="Verdana"/>
-          <w:sz w:val="48"/>
-        </w:rPr>
-        <w:t>;</w:t>
-      </w:r>
-    </w:p>
-    <w:p>
-      <w:pPr>
-        <w:pStyle w:val="NoSpacing"/>
-        <w:numPr>
-          <w:ilvl w:val="0"/>
-          <w:numId w:val="22"/>
-        </w:numPr>
-        <w:rPr>
-          <w:rFonts w:ascii="Verdana" w:hAnsi="Verdana"/>
-          <w:b/>
-          <w:sz w:val="48"/>
-        </w:rPr>
-      </w:pPr>
-      <w:proofErr w:type="spellStart"/>
-      <w:r>
-        <w:rPr>
-          <w:rFonts w:ascii="Verdana" w:hAnsi="Verdana"/>
-          <w:b/>
-          <w:sz w:val="48"/>
-        </w:rPr>
-        <w:t>intrface</w:t>
-      </w:r>
-      <w:proofErr w:type="spellEnd"/>
-      <w:r>
-        <w:rPr>
-          <w:rFonts w:ascii="Verdana" w:hAnsi="Verdana"/>
-          <w:b/>
-          <w:sz w:val="48"/>
-        </w:rPr>
-        <w:t xml:space="preserve"> </w:t>
-      </w:r>
-      <w:r>
-        <w:rPr>
-          <w:rFonts w:ascii="Verdana" w:hAnsi="Verdana"/>
-          <w:sz w:val="48"/>
-        </w:rPr>
-        <w:t>– loading images for interface such as crosshairs, fonts (F2IBuilder) and stuff for menus;</w:t>
-      </w:r>
-    </w:p>
-    <w:p>
-      <w:pPr>
-        <w:pStyle w:val="NoSpacing"/>
-        <w:numPr>
-          <w:ilvl w:val="0"/>
-          <w:numId w:val="22"/>
-        </w:numPr>
-        <w:rPr>
-          <w:rFonts w:ascii="Verdana" w:hAnsi="Verdana"/>
-          <w:b/>
-          <w:sz w:val="48"/>
-        </w:rPr>
-      </w:pPr>
-      <w:r>
-        <w:rPr>
-          <w:rFonts w:ascii="Verdana" w:hAnsi="Verdana"/>
-          <w:b/>
-          <w:sz w:val="48"/>
-        </w:rPr>
-        <w:t xml:space="preserve">player </w:t>
-      </w:r>
-      <w:r>
-        <w:rPr>
-          <w:rFonts w:ascii="Verdana" w:hAnsi="Verdana"/>
-          <w:sz w:val="48"/>
-        </w:rPr>
-        <w:t>– models (.</w:t>
-      </w:r>
-      <w:proofErr w:type="spellStart"/>
-      <w:r>
-        <w:rPr>
-          <w:rFonts w:ascii="Verdana" w:hAnsi="Verdana"/>
-          <w:sz w:val="48"/>
-        </w:rPr>
-        <w:t>obj</w:t>
-      </w:r>
-      <w:proofErr w:type="spellEnd"/>
-      <w:r>
-        <w:rPr>
-          <w:rFonts w:ascii="Verdana" w:hAnsi="Verdana"/>
-          <w:sz w:val="48"/>
-        </w:rPr>
-        <w:t xml:space="preserve"> format) and textures (.</w:t>
-      </w:r>
-      <w:proofErr w:type="spellStart"/>
-      <w:r>
-        <w:rPr>
-          <w:rFonts w:ascii="Verdana" w:hAnsi="Verdana"/>
-          <w:sz w:val="48"/>
-        </w:rPr>
-        <w:t>png</w:t>
-      </w:r>
-      <w:proofErr w:type="spellEnd"/>
-      <w:r>
-        <w:rPr>
-          <w:rFonts w:ascii="Verdana" w:hAnsi="Verdana"/>
-          <w:sz w:val="48"/>
-        </w:rPr>
-        <w:t xml:space="preserve"> format) for the player assets;</w:t>
-      </w:r>
-    </w:p>
-    <w:p>
-      <w:pPr>
-        <w:pStyle w:val="NoSpacing"/>
-        <w:numPr>
-          <w:ilvl w:val="0"/>
-          <w:numId w:val="22"/>
-        </w:numPr>
-        <w:rPr>
-          <w:rFonts w:ascii="Verdana" w:hAnsi="Verdana"/>
-          <w:b/>
-          <w:sz w:val="48"/>
-        </w:rPr>
-      </w:pPr>
-      <w:r>
-        <w:rPr>
-          <w:rFonts w:ascii="Verdana" w:hAnsi="Verdana"/>
-          <w:b/>
-          <w:sz w:val="48"/>
-        </w:rPr>
-        <w:t xml:space="preserve">sound </w:t>
-      </w:r>
-      <w:r>
-        <w:rPr>
-          <w:rFonts w:ascii="Verdana" w:hAnsi="Verdana"/>
-          <w:sz w:val="48"/>
-        </w:rPr>
-        <w:t xml:space="preserve">– contains music and sound </w:t>
-      </w:r>
-      <w:proofErr w:type="spellStart"/>
-      <w:r>
-        <w:rPr>
-          <w:rFonts w:ascii="Verdana" w:hAnsi="Verdana"/>
-          <w:sz w:val="48"/>
-        </w:rPr>
-        <w:t>fx</w:t>
-      </w:r>
-      <w:proofErr w:type="spellEnd"/>
-      <w:r>
-        <w:rPr>
-          <w:rFonts w:ascii="Verdana" w:hAnsi="Verdana"/>
-          <w:sz w:val="48"/>
-        </w:rPr>
-        <w:t xml:space="preserve"> audio files (.</w:t>
-      </w:r>
-      <w:proofErr w:type="spellStart"/>
-      <w:r>
-        <w:rPr>
-          <w:rFonts w:ascii="Verdana" w:hAnsi="Verdana"/>
-          <w:sz w:val="48"/>
-        </w:rPr>
-        <w:t>ogg</w:t>
-      </w:r>
-      <w:proofErr w:type="spellEnd"/>
-      <w:r>
-        <w:rPr>
-          <w:rFonts w:ascii="Verdana" w:hAnsi="Verdana"/>
-          <w:sz w:val="48"/>
-        </w:rPr>
-        <w:t xml:space="preserve"> format);</w:t>
-      </w:r>
-    </w:p>
-    <w:p>
-      <w:pPr>
-        <w:pStyle w:val="NoSpacing"/>
-        <w:numPr>
-          <w:ilvl w:val="0"/>
-          <w:numId w:val="22"/>
-        </w:numPr>
-        <w:rPr>
-          <w:rFonts w:ascii="Verdana" w:hAnsi="Verdana"/>
-          <w:b/>
-          <w:sz w:val="48"/>
-        </w:rPr>
-      </w:pPr>
-      <w:proofErr w:type="gramStart"/>
-      <w:r>
-        <w:rPr>
-          <w:rFonts w:ascii="Verdana" w:hAnsi="Verdana"/>
-          <w:b/>
-          <w:sz w:val="48"/>
-        </w:rPr>
-        <w:t>world</w:t>
-      </w:r>
-      <w:proofErr w:type="gramEnd"/>
-      <w:r>
-        <w:rPr>
-          <w:rFonts w:ascii="Verdana" w:hAnsi="Verdana"/>
-          <w:b/>
-          <w:sz w:val="48"/>
-        </w:rPr>
-        <w:t xml:space="preserve"> </w:t>
-      </w:r>
-      <w:r>
-        <w:rPr>
-          <w:rFonts w:ascii="Verdana" w:hAnsi="Verdana"/>
-          <w:sz w:val="48"/>
-        </w:rPr>
-        <w:t>– contains models (.</w:t>
-      </w:r>
-      <w:proofErr w:type="spellStart"/>
-      <w:r>
-        <w:rPr>
-          <w:rFonts w:ascii="Verdana" w:hAnsi="Verdana"/>
-          <w:sz w:val="48"/>
-        </w:rPr>
-        <w:t>obj</w:t>
-      </w:r>
-      <w:proofErr w:type="spellEnd"/>
-      <w:r>
-        <w:rPr>
-          <w:rFonts w:ascii="Verdana" w:hAnsi="Verdana"/>
-          <w:sz w:val="48"/>
-        </w:rPr>
-        <w:t xml:space="preserve"> format) and textures (.</w:t>
-      </w:r>
-      <w:proofErr w:type="spellStart"/>
-      <w:r>
-        <w:rPr>
-          <w:rFonts w:ascii="Verdana" w:hAnsi="Verdana"/>
-          <w:sz w:val="48"/>
-        </w:rPr>
-        <w:t>png</w:t>
-      </w:r>
-      <w:proofErr w:type="spellEnd"/>
-      <w:r>
-        <w:rPr>
-          <w:rFonts w:ascii="Verdana" w:hAnsi="Verdana"/>
-          <w:sz w:val="48"/>
-        </w:rPr>
-        <w:t xml:space="preserve"> format) for blocks which make environment as it is.</w:t>
-      </w:r>
-    </w:p>
-    <w:p>
-      <w:pPr>
-        <w:pStyle w:val="NoSpacing"/>
-        <w:rPr>
-          <w:rFonts w:ascii="Verdana" w:hAnsi="Verdana"/>
-          <w:b/>
-          <w:sz w:val="48"/>
-        </w:rPr>
-      </w:pPr>
-      <w:r>
-        <w:rPr>
-          <w:rFonts w:ascii="Verdana" w:hAnsi="Verdana"/>
-          <w:b/>
-          <w:sz w:val="48"/>
-        </w:rPr>
-        <w:t>All five entries constitute together one archive which is dsynergy.zip.</w:t>
-      </w:r>
-    </w:p>
-    <w:p>
-      <w:pPr>
-        <w:pStyle w:val="NoSpacing"/>
-        <w:rPr>
-          <w:rFonts w:ascii="Verdana" w:hAnsi="Verdana"/>
-          <w:b/>
-          <w:sz w:val="48"/>
-        </w:rPr>
-      </w:pPr>
-    </w:p>
-    <w:p>
-      <w:pPr>
-        <w:pStyle w:val="NoSpacing"/>
-        <w:rPr>
-          <w:rFonts w:ascii="Verdana" w:hAnsi="Verdana"/>
-          <w:b/>
-          <w:sz w:val="48"/>
-        </w:rPr>
-      </w:pPr>
-    </w:p>
-    <w:p>
-      <w:pPr>
-        <w:pStyle w:val="NoSpacing"/>
-        <w:rPr>
-          <w:rFonts w:ascii="Verdana" w:hAnsi="Verdana"/>
-          <w:b/>
-          <w:sz w:val="48"/>
-        </w:rPr>
-      </w:pPr>
-    </w:p>
-    <w:p>
-      <w:pPr>
-        <w:pStyle w:val="NoSpacing"/>
-        <w:rPr>
-          <w:rFonts w:ascii="Verdana" w:hAnsi="Verdana"/>
-          <w:b/>
-          <w:sz w:val="48"/>
-        </w:rPr>
-      </w:pPr>
-    </w:p>
-    <w:p>
-      <w:pPr>
-        <w:pStyle w:val="NoSpacing"/>
-        <w:rPr>
-          <w:rFonts w:ascii="Verdana" w:hAnsi="Verdana"/>
-          <w:b/>
-          <w:sz w:val="48"/>
-        </w:rPr>
-      </w:pPr>
-    </w:p>
-    <w:p>
-      <w:pPr>
-        <w:pStyle w:val="NoSpacing"/>
-        <w:rPr>
-          <w:rFonts w:ascii="Verdana" w:hAnsi="Verdana"/>
-          <w:b/>
-          <w:sz w:val="48"/>
-        </w:rPr>
-      </w:pPr>
-    </w:p>
-    <w:p>
-      <w:pPr>
-        <w:pStyle w:val="NoSpacing"/>
-        <w:rPr>
-          <w:rFonts w:ascii="Verdana" w:hAnsi="Verdana"/>
-          <w:b/>
-          <w:sz w:val="48"/>
-        </w:rPr>
-      </w:pPr>
-    </w:p>
-    <w:p>
-      <w:pPr>
-        <w:pStyle w:val="NoSpacing"/>
+          <w:color w:val="00B050"/>
+          <w:sz w:val="32"/>
+          <w:szCs w:val="32"/>
+        </w:rPr>
+      </w:pPr>
+    </w:p>
+    <w:p>
+      <w:pPr>
+        <w:pStyle w:val="NoSpacing"/>
+        <w:rPr>
+          <w:rFonts w:ascii="Verdana" w:hAnsi="Verdana"/>
+          <w:color w:val="00B050"/>
+          <w:sz w:val="32"/>
+          <w:szCs w:val="32"/>
+        </w:rPr>
+      </w:pPr>
+    </w:p>
+    <w:p>
+      <w:pPr>
+        <w:pStyle w:val="NoSpacing"/>
+        <w:rPr>
+          <w:rFonts w:ascii="Verdana" w:hAnsi="Verdana"/>
+          <w:color w:val="00B050"/>
+          <w:sz w:val="32"/>
+          <w:szCs w:val="32"/>
+        </w:rPr>
+      </w:pPr>
+    </w:p>
+    <w:p>
+      <w:pPr>
+        <w:pStyle w:val="NoSpacing"/>
+        <w:rPr>
+          <w:rFonts w:ascii="Verdana" w:hAnsi="Verdana"/>
+          <w:color w:val="00B050"/>
+          <w:sz w:val="32"/>
+          <w:szCs w:val="32"/>
+        </w:rPr>
+      </w:pPr>
+    </w:p>
+    <w:p>
+      <w:pPr>
+        <w:pStyle w:val="NoSpacing"/>
+        <w:jc w:val="center"/>
         <w:rPr>
           <w:rFonts w:ascii="Verdana" w:hAnsi="Verdana"/>
           <w:b/>
@@ -920,40 +897,63 @@
           <w:sz w:val="48"/>
         </w:rPr>
         <w:lastRenderedPageBreak/>
-        <w:t>Available commands:</w:t>
-      </w:r>
-    </w:p>
-    <w:p>
-      <w:pPr>
-        <w:pStyle w:val="NoSpacing"/>
-        <w:rPr>
-          <w:rFonts w:ascii="Verdana" w:hAnsi="Verdana"/>
-          <w:sz w:val="40"/>
-        </w:rPr>
-      </w:pPr>
-      <w:r>
-        <w:rPr>
-          <w:rFonts w:ascii="Verdana" w:hAnsi="Verdana"/>
-          <w:sz w:val="40"/>
-        </w:rPr>
-        <w:t xml:space="preserve">In order to type command </w:t>
-      </w:r>
-      <w:proofErr w:type="gramStart"/>
-      <w:r>
-        <w:rPr>
-          <w:rFonts w:ascii="Verdana" w:hAnsi="Verdana"/>
-          <w:sz w:val="40"/>
-        </w:rPr>
-        <w:t>which is equivalent to options setup press key “~”</w:t>
-      </w:r>
-      <w:r>
-        <w:rPr>
-          <w:rFonts w:ascii="Verdana" w:hAnsi="Verdana"/>
-          <w:sz w:val="40"/>
-        </w:rPr>
-        <w:t>.</w:t>
-      </w:r>
-      <w:proofErr w:type="gramEnd"/>
+        <w:t>[</w:t>
+      </w:r>
+      <w:r>
+        <w:rPr>
+          <w:rFonts w:ascii="Verdana" w:hAnsi="Verdana"/>
+          <w:b/>
+          <w:sz w:val="48"/>
+        </w:rPr>
+        <w:t>NITROGEN</w:t>
+      </w:r>
+      <w:r>
+        <w:rPr>
+          <w:rFonts w:ascii="Verdana" w:hAnsi="Verdana"/>
+          <w:b/>
+          <w:sz w:val="48"/>
+        </w:rPr>
+        <w:t>, MONGOLS</w:t>
+      </w:r>
+      <w:r>
+        <w:rPr>
+          <w:rFonts w:ascii="Verdana" w:hAnsi="Verdana"/>
+          <w:b/>
+          <w:sz w:val="48"/>
+        </w:rPr>
+        <w:t>]</w:t>
+      </w:r>
+    </w:p>
+    <w:p>
+      <w:pPr>
+        <w:pStyle w:val="NoSpacing"/>
+        <w:jc w:val="center"/>
+        <w:rPr>
+          <w:rFonts w:ascii="Verdana" w:hAnsi="Verdana"/>
+          <w:b/>
+          <w:sz w:val="48"/>
+        </w:rPr>
+      </w:pPr>
+    </w:p>
+    <w:p>
+      <w:pPr>
+        <w:pStyle w:val="NoSpacing"/>
+        <w:rPr>
+          <w:rFonts w:ascii="Verdana" w:hAnsi="Verdana"/>
+          <w:b/>
+          <w:color w:val="00B050"/>
+          <w:sz w:val="48"/>
+        </w:rPr>
+      </w:pPr>
+      <w:r>
+        <w:rPr>
+          <w:rFonts w:ascii="Verdana" w:hAnsi="Verdana"/>
+          <w:b/>
+          <w:color w:val="00B050"/>
+          <w:sz w:val="48"/>
+        </w:rPr>
+        <w:t>FEATURES:</w:t>
+      </w:r>
     </w:p>
     <w:p>
       <w:pPr>
@@ -964,115 +964,18 @@
         </w:numPr>
         <w:rPr>
           <w:rFonts w:ascii="Verdana" w:hAnsi="Verdana"/>
-          <w:sz w:val="32"/>
-          <w:szCs w:val="32"/>
-        </w:rPr>
-      </w:pPr>
-      <w:proofErr w:type="spellStart"/>
-      <w:r>
-        <w:rPr>
-          <w:rFonts w:ascii="Verdana" w:hAnsi="Verdana"/>
-          <w:sz w:val="32"/>
-          <w:szCs w:val="32"/>
-        </w:rPr>
-        <w:t>fps_max</w:t>
-      </w:r>
-      <w:proofErr w:type="spellEnd"/>
-      <w:r>
-        <w:rPr>
-          <w:rFonts w:ascii="Verdana" w:hAnsi="Verdana"/>
-          <w:sz w:val="32"/>
-          <w:szCs w:val="32"/>
-        </w:rPr>
-        <w:t>&lt;</w:t>
-      </w:r>
-      <w:proofErr w:type="spellStart"/>
-      <w:r>
-        <w:rPr>
-          <w:rFonts w:ascii="Verdana" w:hAnsi="Verdana"/>
-          <w:sz w:val="32"/>
-          <w:szCs w:val="32"/>
-        </w:rPr>
-        <w:t>num</w:t>
-      </w:r>
-      <w:proofErr w:type="spellEnd"/>
-      <w:r>
-        <w:rPr>
-          <w:rFonts w:ascii="Verdana" w:hAnsi="Verdana"/>
-          <w:sz w:val="32"/>
-          <w:szCs w:val="32"/>
-        </w:rPr>
-        <w:t xml:space="preserve">&gt;, </w:t>
-      </w:r>
-      <w:proofErr w:type="spellStart"/>
-      <w:r>
-        <w:rPr>
-          <w:rFonts w:ascii="Verdana" w:hAnsi="Verdana"/>
-          <w:sz w:val="32"/>
-          <w:szCs w:val="32"/>
-        </w:rPr>
-        <w:t>fpsMax</w:t>
-      </w:r>
-      <w:proofErr w:type="spellEnd"/>
-      <w:r>
-        <w:rPr>
-          <w:rFonts w:ascii="Verdana" w:hAnsi="Verdana"/>
-          <w:sz w:val="32"/>
-          <w:szCs w:val="32"/>
-        </w:rPr>
-        <w:t>&lt;</w:t>
-      </w:r>
-      <w:proofErr w:type="spellStart"/>
-      <w:r>
-        <w:rPr>
-          <w:rFonts w:ascii="Verdana" w:hAnsi="Verdana"/>
-          <w:sz w:val="32"/>
-          <w:szCs w:val="32"/>
-        </w:rPr>
-        <w:t>num</w:t>
-      </w:r>
-      <w:proofErr w:type="spellEnd"/>
-      <w:r>
-        <w:rPr>
-          <w:rFonts w:ascii="Verdana" w:hAnsi="Verdana"/>
-          <w:sz w:val="32"/>
-          <w:szCs w:val="32"/>
-        </w:rPr>
-        <w:t xml:space="preserve">&gt;: allowing </w:t>
-      </w:r>
-      <w:proofErr w:type="gramStart"/>
-      <w:r>
-        <w:rPr>
-          <w:rFonts w:ascii="Verdana" w:hAnsi="Verdana"/>
-          <w:sz w:val="32"/>
-          <w:szCs w:val="32"/>
-        </w:rPr>
-        <w:t>to change</w:t>
-      </w:r>
-      <w:proofErr w:type="gramEnd"/>
-      <w:r>
-        <w:rPr>
-          <w:rFonts w:ascii="Verdana" w:hAnsi="Verdana"/>
-          <w:sz w:val="32"/>
-          <w:szCs w:val="32"/>
-        </w:rPr>
-        <w:t xml:space="preserve"> max fps</w:t>
-      </w:r>
-      <w:r>
-        <w:rPr>
-          <w:rFonts w:ascii="Verdana" w:hAnsi="Verdana"/>
-          <w:sz w:val="32"/>
-          <w:szCs w:val="32"/>
-        </w:rPr>
-        <w:t xml:space="preserve"> (it must be positive number)</w:t>
-      </w:r>
-      <w:r>
-        <w:rPr>
-          <w:rFonts w:ascii="Verdana" w:hAnsi="Verdana"/>
-          <w:sz w:val="32"/>
-          <w:szCs w:val="32"/>
-        </w:rPr>
-        <w:t>.</w:t>
+          <w:color w:val="00B050"/>
+          <w:sz w:val="32"/>
+          <w:szCs w:val="32"/>
+        </w:rPr>
+      </w:pPr>
+      <w:r>
+        <w:rPr>
+          <w:rFonts w:ascii="Verdana" w:hAnsi="Verdana"/>
+          <w:sz w:val="32"/>
+          <w:szCs w:val="32"/>
+        </w:rPr>
+        <w:t>Both music and sounds can be played from the game.</w:t>
       </w:r>
     </w:p>
     <w:p>
@@ -1084,35 +987,106 @@
         </w:numPr>
         <w:rPr>
           <w:rFonts w:ascii="Verdana" w:hAnsi="Verdana"/>
-          <w:sz w:val="32"/>
-          <w:szCs w:val="32"/>
-        </w:rPr>
-      </w:pPr>
-      <w:proofErr w:type="gramStart"/>
-      <w:r>
-        <w:rPr>
-          <w:rFonts w:ascii="Verdana" w:hAnsi="Verdana"/>
-          <w:sz w:val="32"/>
-          <w:szCs w:val="32"/>
-        </w:rPr>
-        <w:t>resolution&lt;</w:t>
-      </w:r>
-      <w:proofErr w:type="gramEnd"/>
-      <w:r>
-        <w:rPr>
-          <w:rFonts w:ascii="Verdana" w:hAnsi="Verdana"/>
-          <w:sz w:val="32"/>
-          <w:szCs w:val="32"/>
-        </w:rPr>
-        <w:t>width&gt;&lt;height&gt;, res&lt;width&gt;&lt;height&gt;: allowing to change resolution (min resolution is 640x480 whilst</w:t>
-      </w:r>
-      <w:r>
-        <w:rPr>
-          <w:rFonts w:ascii="Verdana" w:hAnsi="Verdana"/>
-          <w:sz w:val="32"/>
-          <w:szCs w:val="32"/>
-        </w:rPr>
-        <w:t xml:space="preserve"> max is your native resolution).</w:t>
+          <w:color w:val="00B050"/>
+          <w:sz w:val="32"/>
+          <w:szCs w:val="32"/>
+        </w:rPr>
+      </w:pPr>
+      <w:r>
+        <w:rPr>
+          <w:rFonts w:ascii="Verdana" w:hAnsi="Verdana"/>
+          <w:sz w:val="32"/>
+          <w:szCs w:val="32"/>
+        </w:rPr>
+        <w:t>Game can be run in debug mode (requires setting it to true in .</w:t>
+      </w:r>
+      <w:proofErr w:type="spellStart"/>
+      <w:r>
+        <w:rPr>
+          <w:rFonts w:ascii="Verdana" w:hAnsi="Verdana"/>
+          <w:sz w:val="32"/>
+          <w:szCs w:val="32"/>
+        </w:rPr>
+        <w:t>ini</w:t>
+      </w:r>
+      <w:proofErr w:type="spellEnd"/>
+      <w:r>
+        <w:rPr>
+          <w:rFonts w:ascii="Verdana" w:hAnsi="Verdana"/>
+          <w:sz w:val="32"/>
+          <w:szCs w:val="32"/>
+        </w:rPr>
+        <w:t xml:space="preserve"> file). It includes writing log into the file. [</w:t>
+      </w:r>
+      <w:proofErr w:type="spellStart"/>
+      <w:r>
+        <w:rPr>
+          <w:rFonts w:ascii="Verdana" w:hAnsi="Verdana"/>
+          <w:sz w:val="32"/>
+          <w:szCs w:val="32"/>
+        </w:rPr>
+        <w:t>JSomnia</w:t>
+      </w:r>
+      <w:proofErr w:type="spellEnd"/>
+      <w:r>
+        <w:rPr>
+          <w:rFonts w:ascii="Verdana" w:hAnsi="Verdana"/>
+          <w:sz w:val="32"/>
+          <w:szCs w:val="32"/>
+        </w:rPr>
+        <w:t>]</w:t>
+      </w:r>
+    </w:p>
+    <w:p>
+      <w:pPr>
+        <w:pStyle w:val="NoSpacing"/>
+        <w:ind w:left="360"/>
+        <w:rPr>
+          <w:rFonts w:ascii="Verdana" w:hAnsi="Verdana"/>
+          <w:color w:val="00B050"/>
+          <w:sz w:val="32"/>
+          <w:szCs w:val="32"/>
+        </w:rPr>
+      </w:pPr>
+      <w:r>
+        <w:rPr>
+          <w:rFonts w:ascii="Verdana" w:hAnsi="Verdana"/>
+          <w:sz w:val="32"/>
+          <w:szCs w:val="32"/>
+        </w:rPr>
+        <w:t>File is named according to the current date and time.</w:t>
+      </w:r>
+    </w:p>
+    <w:p>
+      <w:pPr>
+        <w:pStyle w:val="NoSpacing"/>
+        <w:ind w:left="360"/>
+        <w:rPr>
+          <w:rFonts w:ascii="Verdana" w:hAnsi="Verdana"/>
+          <w:color w:val="00B050"/>
+          <w:sz w:val="32"/>
+          <w:szCs w:val="32"/>
+        </w:rPr>
+      </w:pPr>
+    </w:p>
+    <w:p>
+      <w:pPr>
+        <w:pStyle w:val="NoSpacing"/>
+        <w:rPr>
+          <w:rFonts w:ascii="Verdana" w:hAnsi="Verdana"/>
+          <w:b/>
+          <w:color w:val="FF0000"/>
+          <w:sz w:val="48"/>
+        </w:rPr>
+      </w:pPr>
+      <w:r>
+        <w:rPr>
+          <w:rFonts w:ascii="Verdana" w:hAnsi="Verdana"/>
+          <w:b/>
+          <w:color w:val="FF0000"/>
+          <w:sz w:val="48"/>
+        </w:rPr>
+        <w:t>FIXES:</w:t>
       </w:r>
     </w:p>
     <w:p>
@@ -1124,46 +1098,27 @@
         </w:numPr>
         <w:rPr>
           <w:rFonts w:ascii="Verdana" w:hAnsi="Verdana"/>
-          <w:sz w:val="32"/>
-          <w:szCs w:val="32"/>
-        </w:rPr>
-      </w:pPr>
+          <w:color w:val="00B050"/>
+          <w:sz w:val="32"/>
+          <w:szCs w:val="32"/>
+        </w:rPr>
+      </w:pPr>
+      <w:r>
+        <w:rPr>
+          <w:rFonts w:ascii="Verdana" w:hAnsi="Verdana"/>
+          <w:sz w:val="32"/>
+          <w:szCs w:val="32"/>
+        </w:rPr>
+        <w:t xml:space="preserve">Reading water effects from the </w:t>
+      </w:r>
       <w:proofErr w:type="spellStart"/>
-      <w:proofErr w:type="gramStart"/>
-      <w:r>
-        <w:rPr>
-          <w:rFonts w:ascii="Verdana" w:hAnsi="Verdana"/>
-          <w:sz w:val="32"/>
-          <w:szCs w:val="32"/>
-        </w:rPr>
-        <w:t>fullscreen</w:t>
-      </w:r>
-      <w:proofErr w:type="spellEnd"/>
-      <w:proofErr w:type="gramEnd"/>
-      <w:r>
-        <w:rPr>
-          <w:rFonts w:ascii="Verdana" w:hAnsi="Verdana"/>
-          <w:sz w:val="32"/>
-          <w:szCs w:val="32"/>
-        </w:rPr>
-        <w:t>:</w:t>
-      </w:r>
-      <w:r>
-        <w:rPr>
-          <w:rFonts w:ascii="Verdana" w:hAnsi="Verdana"/>
-          <w:sz w:val="32"/>
-          <w:szCs w:val="32"/>
-        </w:rPr>
-        <w:t xml:space="preserve"> makes your game run </w:t>
-      </w:r>
-      <w:proofErr w:type="spellStart"/>
-      <w:r>
-        <w:rPr>
-          <w:rFonts w:ascii="Verdana" w:hAnsi="Verdana"/>
-          <w:sz w:val="32"/>
-          <w:szCs w:val="32"/>
-        </w:rPr>
-        <w:t>fullscreen</w:t>
+      <w:r>
+        <w:rPr>
+          <w:rFonts w:ascii="Verdana" w:hAnsi="Verdana"/>
+          <w:sz w:val="32"/>
+          <w:szCs w:val="32"/>
+        </w:rPr>
+        <w:t>ini</w:t>
       </w:r>
       <w:proofErr w:type="spellEnd"/>
       <w:r>
@@ -1184,35 +1139,18 @@
         </w:numPr>
         <w:rPr>
           <w:rFonts w:ascii="Verdana" w:hAnsi="Verdana"/>
-          <w:sz w:val="32"/>
-          <w:szCs w:val="32"/>
-        </w:rPr>
-      </w:pPr>
-      <w:proofErr w:type="gramStart"/>
-      <w:r>
-        <w:rPr>
-          <w:rFonts w:ascii="Verdana" w:hAnsi="Verdana"/>
-          <w:sz w:val="32"/>
-          <w:szCs w:val="32"/>
-        </w:rPr>
-        <w:t>windowed</w:t>
-      </w:r>
-      <w:proofErr w:type="gramEnd"/>
-      <w:r>
-        <w:rPr>
-          <w:rFonts w:ascii="Verdana" w:hAnsi="Verdana"/>
-          <w:sz w:val="32"/>
-          <w:szCs w:val="32"/>
-        </w:rPr>
-        <w:t xml:space="preserve">: makes your game run </w:t>
-      </w:r>
-      <w:r>
-        <w:rPr>
-          <w:rFonts w:ascii="Verdana" w:hAnsi="Verdana"/>
-          <w:sz w:val="32"/>
-          <w:szCs w:val="32"/>
-        </w:rPr>
-        <w:t>windowed mode.</w:t>
+          <w:color w:val="00B050"/>
+          <w:sz w:val="32"/>
+          <w:szCs w:val="32"/>
+        </w:rPr>
+      </w:pPr>
+      <w:r>
+        <w:rPr>
+          <w:rFonts w:ascii="Verdana" w:hAnsi="Verdana"/>
+          <w:sz w:val="32"/>
+          <w:szCs w:val="32"/>
+        </w:rPr>
+        <w:t>Random level generator generates blocks correctly (same number that was requested).</w:t>
       </w:r>
     </w:p>
     <w:p>
@@ -1224,130 +1162,29 @@
         </w:numPr>
         <w:rPr>
           <w:rFonts w:ascii="Verdana" w:hAnsi="Verdana"/>
-          <w:sz w:val="32"/>
-          <w:szCs w:val="32"/>
-        </w:rPr>
-      </w:pPr>
-      <w:proofErr w:type="spellStart"/>
-      <w:r>
-        <w:rPr>
-          <w:rFonts w:ascii="Verdana" w:hAnsi="Verdana"/>
-          <w:sz w:val="32"/>
-          <w:szCs w:val="32"/>
-        </w:rPr>
-        <w:t>v_sync</w:t>
-      </w:r>
-      <w:proofErr w:type="spellEnd"/>
-      <w:r>
-        <w:rPr>
-          <w:rFonts w:ascii="Verdana" w:hAnsi="Verdana"/>
-          <w:sz w:val="32"/>
-          <w:szCs w:val="32"/>
-        </w:rPr>
-        <w:t xml:space="preserve"> &lt;bool&gt;</w:t>
-      </w:r>
-      <w:r>
-        <w:rPr>
-          <w:rFonts w:ascii="Verdana" w:hAnsi="Verdana"/>
-          <w:sz w:val="32"/>
-          <w:szCs w:val="32"/>
-        </w:rPr>
-        <w:t xml:space="preserve">, </w:t>
-      </w:r>
-      <w:proofErr w:type="spellStart"/>
-      <w:r>
-        <w:rPr>
-          <w:rFonts w:ascii="Verdana" w:hAnsi="Verdana"/>
-          <w:sz w:val="32"/>
-          <w:szCs w:val="32"/>
-        </w:rPr>
-        <w:t>vsync</w:t>
-      </w:r>
-      <w:proofErr w:type="spellEnd"/>
-      <w:r>
-        <w:rPr>
-          <w:rFonts w:ascii="Verdana" w:hAnsi="Verdana"/>
-          <w:sz w:val="32"/>
-          <w:szCs w:val="32"/>
-        </w:rPr>
-        <w:t>&lt;bool&gt;</w:t>
-      </w:r>
-      <w:r>
-        <w:rPr>
-          <w:rFonts w:ascii="Verdana" w:hAnsi="Verdana"/>
-          <w:sz w:val="32"/>
-          <w:szCs w:val="32"/>
-        </w:rPr>
-        <w:t>: whether</w:t>
-      </w:r>
-      <w:r>
-        <w:rPr>
-          <w:rFonts w:ascii="Verdana" w:hAnsi="Verdana"/>
-          <w:sz w:val="32"/>
-          <w:szCs w:val="32"/>
-        </w:rPr>
-        <w:t xml:space="preserve"> or not you</w:t>
-      </w:r>
-      <w:r>
-        <w:rPr>
-          <w:rFonts w:ascii="Verdana" w:hAnsi="Verdana"/>
-          <w:sz w:val="32"/>
-          <w:szCs w:val="32"/>
-        </w:rPr>
-        <w:t xml:space="preserve"> </w:t>
-      </w:r>
-      <w:proofErr w:type="spellStart"/>
-      <w:r>
-        <w:rPr>
-          <w:rFonts w:ascii="Verdana" w:hAnsi="Verdana"/>
-          <w:sz w:val="32"/>
-          <w:szCs w:val="32"/>
-        </w:rPr>
-        <w:t>wanna</w:t>
-      </w:r>
-      <w:proofErr w:type="spellEnd"/>
-      <w:r>
-        <w:rPr>
-          <w:rFonts w:ascii="Verdana" w:hAnsi="Verdana"/>
-          <w:sz w:val="32"/>
-          <w:szCs w:val="32"/>
-        </w:rPr>
-        <w:t xml:space="preserve"> </w:t>
-      </w:r>
-      <w:proofErr w:type="spellStart"/>
-      <w:r>
-        <w:rPr>
-          <w:rFonts w:ascii="Verdana" w:hAnsi="Verdana"/>
-          <w:sz w:val="32"/>
-          <w:szCs w:val="32"/>
-        </w:rPr>
-        <w:t>vsync</w:t>
-      </w:r>
-      <w:proofErr w:type="spellEnd"/>
-      <w:r>
-        <w:rPr>
-          <w:rFonts w:ascii="Verdana" w:hAnsi="Verdana"/>
-          <w:sz w:val="32"/>
-          <w:szCs w:val="32"/>
-        </w:rPr>
-        <w:t xml:space="preserve"> on or off</w:t>
-      </w:r>
-      <w:r>
-        <w:rPr>
-          <w:rFonts w:ascii="Verdana" w:hAnsi="Verdana"/>
-          <w:sz w:val="32"/>
-          <w:szCs w:val="32"/>
-        </w:rPr>
-        <w:t>.</w:t>
-      </w:r>
-      <w:r>
-        <w:rPr>
-          <w:rFonts w:ascii="Verdana" w:hAnsi="Verdana"/>
-          <w:sz w:val="32"/>
-          <w:szCs w:val="32"/>
-        </w:rPr>
-        <w:t xml:space="preserve"> If it’s on (you’ve set it to true) your fps is capped to your monitor refresh rate.</w:t>
-      </w:r>
+          <w:color w:val="00B050"/>
+          <w:sz w:val="32"/>
+          <w:szCs w:val="32"/>
+        </w:rPr>
+      </w:pPr>
+      <w:r>
+        <w:rPr>
+          <w:rFonts w:ascii="Verdana" w:hAnsi="Verdana"/>
+          <w:sz w:val="32"/>
+          <w:szCs w:val="32"/>
+        </w:rPr>
+        <w:t>Loading randmax.dat doesn’t result in “loading level failed!</w:t>
+      </w:r>
+      <w:proofErr w:type="gramStart"/>
+      <w:r>
+        <w:rPr>
+          <w:rFonts w:ascii="Verdana" w:hAnsi="Verdana"/>
+          <w:sz w:val="32"/>
+          <w:szCs w:val="32"/>
+        </w:rPr>
+        <w:t>”.</w:t>
+      </w:r>
+      <w:proofErr w:type="gramEnd"/>
     </w:p>
     <w:p>
       <w:pPr>
@@ -1358,27 +1195,18 @@
         </w:numPr>
         <w:rPr>
           <w:rFonts w:ascii="Verdana" w:hAnsi="Verdana"/>
-          <w:sz w:val="32"/>
-          <w:szCs w:val="32"/>
-        </w:rPr>
-      </w:pPr>
-      <w:proofErr w:type="spellStart"/>
-      <w:r>
-        <w:rPr>
-          <w:rFonts w:ascii="Verdana" w:hAnsi="Verdana"/>
-          <w:sz w:val="32"/>
-          <w:szCs w:val="32"/>
-        </w:rPr>
-        <w:t>water_efects</w:t>
-      </w:r>
-      <w:proofErr w:type="spellEnd"/>
-      <w:r>
-        <w:rPr>
-          <w:rFonts w:ascii="Verdana" w:hAnsi="Verdana"/>
-          <w:sz w:val="32"/>
-          <w:szCs w:val="32"/>
-        </w:rPr>
-        <w:t xml:space="preserve"> &lt;bool&gt;: enables (true) or disables (false) water effects (such as reflection).</w:t>
+          <w:color w:val="00B050"/>
+          <w:sz w:val="32"/>
+          <w:szCs w:val="32"/>
+        </w:rPr>
+      </w:pPr>
+      <w:r>
+        <w:rPr>
+          <w:rFonts w:ascii="Verdana" w:hAnsi="Verdana"/>
+          <w:sz w:val="32"/>
+          <w:szCs w:val="32"/>
+        </w:rPr>
+        <w:t>Removing fluid blocks doesn’t result in crash when level is loaded. [TODO updating camera and fluids].</w:t>
       </w:r>
     </w:p>
     <w:p>
@@ -1390,81 +1218,246 @@
         </w:numPr>
         <w:rPr>
           <w:rFonts w:ascii="Verdana" w:hAnsi="Verdana"/>
-          <w:sz w:val="32"/>
-          <w:szCs w:val="32"/>
-        </w:rPr>
-      </w:pPr>
-      <w:proofErr w:type="spellStart"/>
-      <w:r>
-        <w:rPr>
-          <w:rFonts w:ascii="Verdana" w:hAnsi="Verdana"/>
-          <w:sz w:val="32"/>
-          <w:szCs w:val="32"/>
-        </w:rPr>
-        <w:t>mouse_sensitivity</w:t>
-      </w:r>
-      <w:proofErr w:type="spellEnd"/>
-      <w:r>
-        <w:rPr>
-          <w:rFonts w:ascii="Verdana" w:hAnsi="Verdana"/>
-          <w:sz w:val="32"/>
-          <w:szCs w:val="32"/>
-        </w:rPr>
-        <w:t>&lt;</w:t>
-      </w:r>
-      <w:proofErr w:type="spellStart"/>
-      <w:r>
-        <w:rPr>
-          <w:rFonts w:ascii="Verdana" w:hAnsi="Verdana"/>
-          <w:sz w:val="32"/>
-          <w:szCs w:val="32"/>
-        </w:rPr>
-        <w:t>num</w:t>
-      </w:r>
-      <w:proofErr w:type="spellEnd"/>
-      <w:r>
-        <w:rPr>
-          <w:rFonts w:ascii="Verdana" w:hAnsi="Verdana"/>
-          <w:sz w:val="32"/>
-          <w:szCs w:val="32"/>
-        </w:rPr>
-        <w:t xml:space="preserve">&gt;, </w:t>
-      </w:r>
-      <w:proofErr w:type="spellStart"/>
-      <w:r>
-        <w:rPr>
-          <w:rFonts w:ascii="Verdana" w:hAnsi="Verdana"/>
-          <w:sz w:val="32"/>
-          <w:szCs w:val="32"/>
-        </w:rPr>
-        <w:t>msens</w:t>
-      </w:r>
-      <w:proofErr w:type="spellEnd"/>
-      <w:r>
-        <w:rPr>
-          <w:rFonts w:ascii="Verdana" w:hAnsi="Verdana"/>
-          <w:sz w:val="32"/>
-          <w:szCs w:val="32"/>
-        </w:rPr>
-        <w:t xml:space="preserve"> &lt;</w:t>
-      </w:r>
-      <w:proofErr w:type="spellStart"/>
-      <w:r>
-        <w:rPr>
-          <w:rFonts w:ascii="Verdana" w:hAnsi="Verdana"/>
-          <w:sz w:val="32"/>
-          <w:szCs w:val="32"/>
-        </w:rPr>
-        <w:t>num</w:t>
-      </w:r>
-      <w:proofErr w:type="spellEnd"/>
-      <w:r>
-        <w:rPr>
-          <w:rFonts w:ascii="Verdana" w:hAnsi="Verdana"/>
-          <w:sz w:val="32"/>
-          <w:szCs w:val="32"/>
-        </w:rPr>
-        <w:t>&gt;: sets mouse sensitivity to this value.</w:t>
+          <w:color w:val="00B050"/>
+          <w:sz w:val="32"/>
+          <w:szCs w:val="32"/>
+        </w:rPr>
+      </w:pPr>
+      <w:r>
+        <w:rPr>
+          <w:rFonts w:ascii="Verdana" w:hAnsi="Verdana"/>
+          <w:sz w:val="32"/>
+          <w:szCs w:val="32"/>
+        </w:rPr>
+        <w:t>Chunk function which check in which chunk is certain block is now fixed.</w:t>
+      </w:r>
+    </w:p>
+    <w:p>
+      <w:pPr>
+        <w:pStyle w:val="NoSpacing"/>
+        <w:rPr>
+          <w:rFonts w:ascii="Verdana" w:hAnsi="Verdana"/>
+          <w:color w:val="00B050"/>
+          <w:sz w:val="32"/>
+          <w:szCs w:val="32"/>
+        </w:rPr>
+      </w:pPr>
+    </w:p>
+    <w:p>
+      <w:pPr>
+        <w:pStyle w:val="NoSpacing"/>
+        <w:rPr>
+          <w:rFonts w:ascii="Verdana" w:hAnsi="Verdana"/>
+          <w:color w:val="00B050"/>
+          <w:sz w:val="32"/>
+          <w:szCs w:val="32"/>
+        </w:rPr>
+      </w:pPr>
+    </w:p>
+    <w:p>
+      <w:pPr>
+        <w:pStyle w:val="NoSpacing"/>
+        <w:rPr>
+          <w:rFonts w:ascii="Verdana" w:hAnsi="Verdana"/>
+          <w:color w:val="00B050"/>
+          <w:sz w:val="32"/>
+          <w:szCs w:val="32"/>
+        </w:rPr>
+      </w:pPr>
+    </w:p>
+    <w:p>
+      <w:pPr>
+        <w:pStyle w:val="NoSpacing"/>
+        <w:rPr>
+          <w:rFonts w:ascii="Verdana" w:hAnsi="Verdana"/>
+          <w:color w:val="00B050"/>
+          <w:sz w:val="32"/>
+          <w:szCs w:val="32"/>
+        </w:rPr>
+      </w:pPr>
+    </w:p>
+    <w:p>
+      <w:pPr>
+        <w:pStyle w:val="NoSpacing"/>
+        <w:rPr>
+          <w:rFonts w:ascii="Verdana" w:hAnsi="Verdana"/>
+          <w:color w:val="00B050"/>
+          <w:sz w:val="32"/>
+          <w:szCs w:val="32"/>
+        </w:rPr>
+      </w:pPr>
+    </w:p>
+    <w:p>
+      <w:pPr>
+        <w:pStyle w:val="NoSpacing"/>
+        <w:rPr>
+          <w:rFonts w:ascii="Verdana" w:hAnsi="Verdana"/>
+          <w:color w:val="00B050"/>
+          <w:sz w:val="32"/>
+          <w:szCs w:val="32"/>
+        </w:rPr>
+      </w:pPr>
+    </w:p>
+    <w:p>
+      <w:pPr>
+        <w:pStyle w:val="NoSpacing"/>
+        <w:rPr>
+          <w:rFonts w:ascii="Verdana" w:hAnsi="Verdana"/>
+          <w:color w:val="00B050"/>
+          <w:sz w:val="32"/>
+          <w:szCs w:val="32"/>
+        </w:rPr>
+      </w:pPr>
+    </w:p>
+    <w:p>
+      <w:pPr>
+        <w:pStyle w:val="NoSpacing"/>
+        <w:rPr>
+          <w:rFonts w:ascii="Verdana" w:hAnsi="Verdana"/>
+          <w:color w:val="00B050"/>
+          <w:sz w:val="32"/>
+          <w:szCs w:val="32"/>
+        </w:rPr>
+      </w:pPr>
+    </w:p>
+    <w:p>
+      <w:pPr>
+        <w:pStyle w:val="NoSpacing"/>
+        <w:rPr>
+          <w:rFonts w:ascii="Verdana" w:hAnsi="Verdana"/>
+          <w:color w:val="00B050"/>
+          <w:sz w:val="32"/>
+          <w:szCs w:val="32"/>
+        </w:rPr>
+      </w:pPr>
+    </w:p>
+    <w:p>
+      <w:pPr>
+        <w:pStyle w:val="NoSpacing"/>
+        <w:rPr>
+          <w:rFonts w:ascii="Verdana" w:hAnsi="Verdana"/>
+          <w:color w:val="00B050"/>
+          <w:sz w:val="32"/>
+          <w:szCs w:val="32"/>
+        </w:rPr>
+      </w:pPr>
+    </w:p>
+    <w:p>
+      <w:pPr>
+        <w:pStyle w:val="NoSpacing"/>
+        <w:rPr>
+          <w:rFonts w:ascii="Verdana" w:hAnsi="Verdana"/>
+          <w:color w:val="00B050"/>
+          <w:sz w:val="32"/>
+          <w:szCs w:val="32"/>
+        </w:rPr>
+      </w:pPr>
+    </w:p>
+    <w:p>
+      <w:pPr>
+        <w:pStyle w:val="NoSpacing"/>
+        <w:rPr>
+          <w:rFonts w:ascii="Verdana" w:hAnsi="Verdana"/>
+          <w:color w:val="00B050"/>
+          <w:sz w:val="32"/>
+          <w:szCs w:val="32"/>
+        </w:rPr>
+      </w:pPr>
+    </w:p>
+    <w:p>
+      <w:pPr>
+        <w:pStyle w:val="NoSpacing"/>
+        <w:rPr>
+          <w:rFonts w:ascii="Verdana" w:hAnsi="Verdana"/>
+          <w:color w:val="00B050"/>
+          <w:sz w:val="32"/>
+          <w:szCs w:val="32"/>
+        </w:rPr>
+      </w:pPr>
+    </w:p>
+    <w:p>
+      <w:pPr>
+        <w:pStyle w:val="NoSpacing"/>
+        <w:rPr>
+          <w:rFonts w:ascii="Verdana" w:hAnsi="Verdana"/>
+          <w:color w:val="00B050"/>
+          <w:sz w:val="32"/>
+          <w:szCs w:val="32"/>
+        </w:rPr>
+      </w:pPr>
+    </w:p>
+    <w:p>
+      <w:pPr>
+        <w:pStyle w:val="NoSpacing"/>
+        <w:rPr>
+          <w:rFonts w:ascii="Verdana" w:hAnsi="Verdana"/>
+          <w:color w:val="00B050"/>
+          <w:sz w:val="32"/>
+          <w:szCs w:val="32"/>
+        </w:rPr>
+      </w:pPr>
+    </w:p>
+    <w:p>
+      <w:pPr>
+        <w:pStyle w:val="NoSpacing"/>
+        <w:rPr>
+          <w:rFonts w:ascii="Verdana" w:hAnsi="Verdana"/>
+          <w:color w:val="00B050"/>
+          <w:sz w:val="32"/>
+          <w:szCs w:val="32"/>
+        </w:rPr>
+      </w:pPr>
+    </w:p>
+    <w:p>
+      <w:pPr>
+        <w:pStyle w:val="NoSpacing"/>
+        <w:jc w:val="center"/>
+        <w:rPr>
+          <w:rFonts w:ascii="Verdana" w:hAnsi="Verdana"/>
+          <w:color w:val="00B050"/>
+          <w:sz w:val="32"/>
+          <w:szCs w:val="32"/>
+        </w:rPr>
+      </w:pPr>
+      <w:r>
+        <w:rPr>
+          <w:rFonts w:ascii="Verdana" w:hAnsi="Verdana"/>
+          <w:b/>
+          <w:sz w:val="48"/>
+        </w:rPr>
+        <w:lastRenderedPageBreak/>
+        <w:t>[LATVIA]</w:t>
+      </w:r>
+    </w:p>
+    <w:p>
+      <w:pPr>
+        <w:pStyle w:val="NoSpacing"/>
+        <w:rPr>
+          <w:rFonts w:ascii="Verdana" w:hAnsi="Verdana"/>
+          <w:color w:val="00B050"/>
+          <w:sz w:val="32"/>
+          <w:szCs w:val="32"/>
+        </w:rPr>
+      </w:pPr>
+    </w:p>
+    <w:p>
+      <w:pPr>
+        <w:pStyle w:val="NoSpacing"/>
+        <w:rPr>
+          <w:rFonts w:ascii="Verdana" w:hAnsi="Verdana"/>
+          <w:b/>
+          <w:color w:val="00B050"/>
+          <w:sz w:val="48"/>
+        </w:rPr>
+      </w:pPr>
+      <w:r>
+        <w:rPr>
+          <w:rFonts w:ascii="Verdana" w:hAnsi="Verdana"/>
+          <w:b/>
+          <w:color w:val="00B050"/>
+          <w:sz w:val="48"/>
+        </w:rPr>
+        <w:t>FEATURES:</w:t>
       </w:r>
     </w:p>
     <w:p>
@@ -1476,117 +1469,50 @@
         </w:numPr>
         <w:rPr>
           <w:rFonts w:ascii="Verdana" w:hAnsi="Verdana"/>
-          <w:sz w:val="32"/>
-          <w:szCs w:val="32"/>
-        </w:rPr>
-      </w:pPr>
-      <w:proofErr w:type="gramStart"/>
-      <w:r>
-        <w:rPr>
-          <w:rFonts w:ascii="Verdana" w:hAnsi="Verdana"/>
-          <w:sz w:val="32"/>
-          <w:szCs w:val="32"/>
-        </w:rPr>
-        <w:t>music</w:t>
-      </w:r>
-      <w:proofErr w:type="gramEnd"/>
-      <w:r>
-        <w:rPr>
-          <w:rFonts w:ascii="Verdana" w:hAnsi="Verdana"/>
-          <w:sz w:val="32"/>
-          <w:szCs w:val="32"/>
-        </w:rPr>
-        <w:t xml:space="preserve"> &lt;</w:t>
-      </w:r>
-      <w:proofErr w:type="spellStart"/>
-      <w:r>
-        <w:rPr>
-          <w:rFonts w:ascii="Verdana" w:hAnsi="Verdana"/>
-          <w:sz w:val="32"/>
-          <w:szCs w:val="32"/>
-        </w:rPr>
-        <w:t>num</w:t>
-      </w:r>
-      <w:proofErr w:type="spellEnd"/>
-      <w:r>
-        <w:rPr>
-          <w:rFonts w:ascii="Verdana" w:hAnsi="Verdana"/>
-          <w:sz w:val="32"/>
-          <w:szCs w:val="32"/>
-        </w:rPr>
-        <w:t>&gt;, sound &lt;</w:t>
-      </w:r>
-      <w:proofErr w:type="spellStart"/>
-      <w:r>
-        <w:rPr>
-          <w:rFonts w:ascii="Verdana" w:hAnsi="Verdana"/>
-          <w:sz w:val="32"/>
-          <w:szCs w:val="32"/>
-        </w:rPr>
-        <w:t>num</w:t>
-      </w:r>
-      <w:proofErr w:type="spellEnd"/>
-      <w:r>
-        <w:rPr>
-          <w:rFonts w:ascii="Verdana" w:hAnsi="Verdana"/>
-          <w:sz w:val="32"/>
-          <w:szCs w:val="32"/>
-        </w:rPr>
-        <w:t>&gt; : sets respectively music and sound</w:t>
-      </w:r>
-      <w:r>
-        <w:rPr>
-          <w:rFonts w:ascii="Verdana" w:hAnsi="Verdana"/>
-          <w:sz w:val="32"/>
-          <w:szCs w:val="32"/>
-        </w:rPr>
-        <w:t xml:space="preserve"> volume</w:t>
-      </w:r>
-      <w:r>
-        <w:rPr>
-          <w:rFonts w:ascii="Verdana" w:hAnsi="Verdana"/>
-          <w:sz w:val="32"/>
-          <w:szCs w:val="32"/>
-        </w:rPr>
-        <w:t xml:space="preserve"> </w:t>
-      </w:r>
-      <w:r>
-        <w:rPr>
-          <w:rFonts w:ascii="Verdana" w:hAnsi="Verdana"/>
-          <w:sz w:val="32"/>
-          <w:szCs w:val="32"/>
-        </w:rPr>
-        <w:t>to this value.</w:t>
-      </w:r>
-    </w:p>
-    <w:p>
-      <w:pPr>
-        <w:pStyle w:val="NoSpacing"/>
-        <w:rPr>
-          <w:rFonts w:ascii="Verdana" w:hAnsi="Verdana"/>
-          <w:sz w:val="32"/>
-          <w:szCs w:val="32"/>
-        </w:rPr>
-      </w:pPr>
-    </w:p>
-    <w:p>
-      <w:pPr>
-        <w:pStyle w:val="NoSpacing"/>
-        <w:rPr>
-          <w:rFonts w:ascii="Verdana" w:hAnsi="Verdana"/>
-          <w:b/>
-          <w:sz w:val="48"/>
-          <w:szCs w:val="32"/>
-        </w:rPr>
-      </w:pPr>
-      <w:r>
-        <w:rPr>
-          <w:rFonts w:ascii="Verdana" w:hAnsi="Verdana"/>
-          <w:b/>
-          <w:sz w:val="48"/>
-          <w:szCs w:val="32"/>
-        </w:rPr>
-        <w:t>Notes:</w:t>
+          <w:color w:val="00B050"/>
+          <w:sz w:val="32"/>
+          <w:szCs w:val="32"/>
+        </w:rPr>
+      </w:pPr>
+      <w:r>
+        <w:rPr>
+          <w:rFonts w:ascii="Verdana" w:hAnsi="Verdana"/>
+          <w:sz w:val="32"/>
+          <w:szCs w:val="32"/>
+        </w:rPr>
+        <w:t>Block world is now split into chunks which are carefully chosen when to render.</w:t>
+      </w:r>
+    </w:p>
+    <w:p>
+      <w:pPr>
+        <w:pStyle w:val="NoSpacing"/>
+        <w:ind w:left="360"/>
+        <w:rPr>
+          <w:rFonts w:ascii="Verdana" w:hAnsi="Verdana"/>
+          <w:color w:val="00B050"/>
+          <w:sz w:val="32"/>
+          <w:szCs w:val="32"/>
+        </w:rPr>
+      </w:pPr>
+    </w:p>
+    <w:p>
+      <w:pPr>
+        <w:pStyle w:val="NoSpacing"/>
+        <w:rPr>
+          <w:rFonts w:ascii="Verdana" w:hAnsi="Verdana"/>
+          <w:b/>
+          <w:color w:val="FFC000"/>
+          <w:sz w:val="48"/>
+        </w:rPr>
+      </w:pPr>
+      <w:r>
+        <w:rPr>
+          <w:rFonts w:ascii="Verdana" w:hAnsi="Verdana"/>
+          <w:b/>
+          <w:color w:val="FFC000"/>
+          <w:sz w:val="48"/>
+        </w:rPr>
+        <w:t>CHANGES:</w:t>
       </w:r>
     </w:p>
     <w:p>
@@ -1598,17 +1524,26 @@
         </w:numPr>
         <w:rPr>
           <w:rFonts w:ascii="Verdana" w:hAnsi="Verdana"/>
-          <w:sz w:val="32"/>
-          <w:szCs w:val="32"/>
-        </w:rPr>
-      </w:pPr>
-      <w:r>
-        <w:rPr>
-          <w:rFonts w:ascii="Verdana" w:hAnsi="Verdana"/>
-          <w:sz w:val="32"/>
-          <w:szCs w:val="32"/>
-        </w:rPr>
-        <w:t>Game uses LWJGL 3.2.3 since v 02 (BELARUS).</w:t>
+          <w:color w:val="00B050"/>
+          <w:sz w:val="32"/>
+          <w:szCs w:val="32"/>
+        </w:rPr>
+      </w:pPr>
+      <w:r>
+        <w:rPr>
+          <w:rFonts w:ascii="Verdana" w:hAnsi="Verdana"/>
+          <w:sz w:val="32"/>
+          <w:szCs w:val="32"/>
+        </w:rPr>
+        <w:t>I</w:t>
+      </w:r>
+      <w:r>
+        <w:rPr>
+          <w:rFonts w:ascii="Verdana" w:hAnsi="Verdana"/>
+          <w:sz w:val="32"/>
+          <w:szCs w:val="32"/>
+        </w:rPr>
+        <w:t>mproved engine can render now maximum amount of blocks, namely 131070.</w:t>
       </w:r>
     </w:p>
     <w:p>
@@ -1620,113 +1555,18 @@
         </w:numPr>
         <w:rPr>
           <w:rFonts w:ascii="Verdana" w:hAnsi="Verdana"/>
-          <w:sz w:val="32"/>
-          <w:szCs w:val="32"/>
-        </w:rPr>
-      </w:pPr>
-      <w:r>
-        <w:rPr>
-          <w:rFonts w:ascii="Verdana" w:hAnsi="Verdana"/>
-          <w:sz w:val="32"/>
-          <w:szCs w:val="32"/>
-        </w:rPr>
-        <w:t xml:space="preserve">Game requires Quad Core processor with support for at least 4 threads. </w:t>
-      </w:r>
-      <w:r>
-        <w:rPr>
-          <w:rFonts w:ascii="Verdana" w:hAnsi="Verdana"/>
-          <w:sz w:val="32"/>
-          <w:szCs w:val="32"/>
-        </w:rPr>
-        <w:t>Game implementation is multithread</w:t>
-      </w:r>
-      <w:r>
-        <w:rPr>
-          <w:rFonts w:ascii="Verdana" w:hAnsi="Verdana"/>
-          <w:sz w:val="32"/>
-          <w:szCs w:val="32"/>
-        </w:rPr>
-        <w:t>ed</w:t>
-      </w:r>
-      <w:r>
-        <w:rPr>
-          <w:rFonts w:ascii="Verdana" w:hAnsi="Verdana"/>
-          <w:sz w:val="32"/>
-          <w:szCs w:val="32"/>
-        </w:rPr>
-        <w:t xml:space="preserve"> (</w:t>
-      </w:r>
-      <w:r>
-        <w:rPr>
-          <w:rFonts w:ascii="Verdana" w:hAnsi="Verdana"/>
-          <w:sz w:val="32"/>
-          <w:szCs w:val="32"/>
-        </w:rPr>
-        <w:t xml:space="preserve">at most time </w:t>
-      </w:r>
-      <w:r>
-        <w:rPr>
-          <w:rFonts w:ascii="Verdana" w:hAnsi="Verdana"/>
-          <w:sz w:val="32"/>
-          <w:szCs w:val="32"/>
-        </w:rPr>
-        <w:t>2</w:t>
-      </w:r>
-      <w:r>
-        <w:rPr>
-          <w:rFonts w:ascii="Verdana" w:hAnsi="Verdana"/>
-          <w:sz w:val="32"/>
-          <w:szCs w:val="32"/>
-        </w:rPr>
-        <w:t xml:space="preserve"> </w:t>
-      </w:r>
-      <w:r>
-        <w:rPr>
-          <w:rFonts w:ascii="Verdana" w:hAnsi="Verdana"/>
-          <w:sz w:val="32"/>
-          <w:szCs w:val="32"/>
-        </w:rPr>
-        <w:t>threads will</w:t>
-      </w:r>
-      <w:r>
-        <w:rPr>
-          <w:rFonts w:ascii="Verdana" w:hAnsi="Verdana"/>
-          <w:sz w:val="32"/>
-          <w:szCs w:val="32"/>
-        </w:rPr>
-        <w:t xml:space="preserve"> be active</w:t>
-      </w:r>
-      <w:r>
-        <w:rPr>
-          <w:rFonts w:ascii="Verdana" w:hAnsi="Verdana"/>
-          <w:sz w:val="32"/>
-          <w:szCs w:val="32"/>
-        </w:rPr>
-        <w:t xml:space="preserve"> + 1 additional thread if random level generator is being used</w:t>
-      </w:r>
-      <w:r>
-        <w:rPr>
-          <w:rFonts w:ascii="Verdana" w:hAnsi="Verdana"/>
-          <w:sz w:val="32"/>
-          <w:szCs w:val="32"/>
-        </w:rPr>
-        <w:t xml:space="preserve"> or when loading or saving level is in progress</w:t>
-      </w:r>
-      <w:r>
-        <w:rPr>
-          <w:rFonts w:ascii="Verdana" w:hAnsi="Verdana"/>
-          <w:sz w:val="32"/>
-          <w:szCs w:val="32"/>
-        </w:rPr>
-        <w:t>)</w:t>
-      </w:r>
-      <w:r>
-        <w:rPr>
-          <w:rFonts w:ascii="Verdana" w:hAnsi="Verdana"/>
-          <w:sz w:val="32"/>
-          <w:szCs w:val="32"/>
-        </w:rPr>
-        <w:t>.</w:t>
+          <w:color w:val="00B050"/>
+          <w:sz w:val="32"/>
+          <w:szCs w:val="32"/>
+        </w:rPr>
+      </w:pPr>
+      <w:r>
+        <w:rPr>
+          <w:rFonts w:ascii="Verdana" w:hAnsi="Verdana"/>
+          <w:sz w:val="32"/>
+          <w:szCs w:val="32"/>
+        </w:rPr>
+        <w:t>Program consumes lesser memory due to removed redundant lists.</w:t>
       </w:r>
     </w:p>
     <w:p>
@@ -1738,65 +1578,18 @@
         </w:numPr>
         <w:rPr>
           <w:rFonts w:ascii="Verdana" w:hAnsi="Verdana"/>
-          <w:sz w:val="32"/>
-          <w:szCs w:val="32"/>
-        </w:rPr>
-      </w:pPr>
-      <w:r>
-        <w:rPr>
-          <w:rFonts w:ascii="Verdana" w:hAnsi="Verdana"/>
-          <w:sz w:val="32"/>
-          <w:szCs w:val="32"/>
-        </w:rPr>
-        <w:t>Running the game requires</w:t>
-      </w:r>
-      <w:r>
-        <w:rPr>
-          <w:rFonts w:ascii="Verdana" w:hAnsi="Verdana"/>
-          <w:sz w:val="32"/>
-          <w:szCs w:val="32"/>
-        </w:rPr>
-        <w:t xml:space="preserve"> Open</w:t>
-      </w:r>
-      <w:r>
-        <w:rPr>
-          <w:rFonts w:ascii="Verdana" w:hAnsi="Verdana"/>
-          <w:sz w:val="32"/>
-          <w:szCs w:val="32"/>
-        </w:rPr>
-        <w:t>GL 3.3</w:t>
-      </w:r>
-      <w:r>
-        <w:rPr>
-          <w:rFonts w:ascii="Verdana" w:hAnsi="Verdana"/>
-          <w:sz w:val="32"/>
-          <w:szCs w:val="32"/>
-        </w:rPr>
-        <w:t xml:space="preserve"> (o</w:t>
-      </w:r>
-      <w:r>
-        <w:rPr>
-          <w:rFonts w:ascii="Verdana" w:hAnsi="Verdana"/>
-          <w:sz w:val="32"/>
-          <w:szCs w:val="32"/>
-        </w:rPr>
-        <w:t>n graphic cards since March 2010</w:t>
-      </w:r>
-      <w:r>
-        <w:rPr>
-          <w:rFonts w:ascii="Verdana" w:hAnsi="Verdana"/>
-          <w:sz w:val="32"/>
-          <w:szCs w:val="32"/>
-        </w:rPr>
-        <w:t>)</w:t>
-      </w:r>
-      <w:r>
-        <w:rPr>
-          <w:rFonts w:ascii="Verdana" w:hAnsi="Verdana"/>
-          <w:sz w:val="32"/>
-          <w:szCs w:val="32"/>
-        </w:rPr>
-        <w:t xml:space="preserve"> or later.</w:t>
+          <w:color w:val="00B050"/>
+          <w:sz w:val="32"/>
+          <w:szCs w:val="32"/>
+        </w:rPr>
+      </w:pPr>
+      <w:r>
+        <w:rPr>
+          <w:rFonts w:ascii="Verdana" w:hAnsi="Verdana"/>
+          <w:sz w:val="32"/>
+          <w:szCs w:val="32"/>
+        </w:rPr>
+        <w:t>World size increased (skybox is larger).</w:t>
       </w:r>
     </w:p>
     <w:p>
@@ -1808,73 +1601,323 @@
         </w:numPr>
         <w:rPr>
           <w:rFonts w:ascii="Verdana" w:hAnsi="Verdana"/>
-          <w:sz w:val="32"/>
-          <w:szCs w:val="32"/>
-        </w:rPr>
-      </w:pPr>
-      <w:r>
-        <w:rPr>
-          <w:rFonts w:ascii="Verdana" w:hAnsi="Verdana"/>
-          <w:sz w:val="32"/>
-          <w:szCs w:val="32"/>
-        </w:rPr>
-        <w:t>Game is implemented using Java version 1.8. (</w:t>
-      </w:r>
-      <w:proofErr w:type="gramStart"/>
-      <w:r>
-        <w:rPr>
-          <w:rFonts w:ascii="Verdana" w:hAnsi="Verdana"/>
-          <w:sz w:val="32"/>
-          <w:szCs w:val="32"/>
-        </w:rPr>
-        <w:t>requires</w:t>
-      </w:r>
-      <w:proofErr w:type="gramEnd"/>
-      <w:r>
-        <w:rPr>
-          <w:rFonts w:ascii="Verdana" w:hAnsi="Verdana"/>
-          <w:sz w:val="32"/>
-          <w:szCs w:val="32"/>
-        </w:rPr>
-        <w:t xml:space="preserve"> 1.8 or higher).</w:t>
-      </w:r>
-    </w:p>
-    <w:p>
-      <w:pPr>
-        <w:pStyle w:val="NoSpacing"/>
-        <w:rPr>
-          <w:rFonts w:ascii="Verdana" w:hAnsi="Verdana"/>
-          <w:sz w:val="32"/>
-          <w:szCs w:val="32"/>
-        </w:rPr>
-      </w:pPr>
-    </w:p>
-    <w:p>
-      <w:pPr>
-        <w:pStyle w:val="NoSpacing"/>
-        <w:rPr>
-          <w:rFonts w:ascii="Verdana" w:hAnsi="Verdana"/>
-          <w:sz w:val="32"/>
-          <w:szCs w:val="32"/>
-        </w:rPr>
-      </w:pPr>
-    </w:p>
-    <w:p>
-      <w:pPr>
-        <w:pStyle w:val="NoSpacing"/>
-        <w:rPr>
-          <w:rFonts w:ascii="Verdana" w:hAnsi="Verdana"/>
-          <w:sz w:val="32"/>
-          <w:szCs w:val="32"/>
-        </w:rPr>
-      </w:pPr>
-      <w:r>
-        <w:rPr>
-          <w:rFonts w:ascii="Verdana" w:hAnsi="Verdana"/>
-          <w:sz w:val="32"/>
-          <w:szCs w:val="32"/>
-        </w:rPr>
-        <w:t>Author: Alexander “</w:t>
+          <w:color w:val="00B050"/>
+          <w:sz w:val="32"/>
+          <w:szCs w:val="32"/>
+        </w:rPr>
+      </w:pPr>
+      <w:r>
+        <w:rPr>
+          <w:rFonts w:ascii="Verdana" w:hAnsi="Verdana"/>
+          <w:sz w:val="32"/>
+          <w:szCs w:val="32"/>
+        </w:rPr>
+        <w:t>Progr</w:t>
+      </w:r>
+      <w:r>
+        <w:rPr>
+          <w:rFonts w:ascii="Verdana" w:hAnsi="Verdana"/>
+          <w:sz w:val="32"/>
+          <w:szCs w:val="32"/>
+        </w:rPr>
+        <w:t>ess when loading bar is more precise.</w:t>
+      </w:r>
+    </w:p>
+    <w:p>
+      <w:pPr>
+        <w:pStyle w:val="NoSpacing"/>
+        <w:numPr>
+          <w:ilvl w:val="0"/>
+          <w:numId w:val="19"/>
+        </w:numPr>
+        <w:rPr>
+          <w:rFonts w:ascii="Verdana" w:hAnsi="Verdana"/>
+          <w:color w:val="00B050"/>
+          <w:sz w:val="32"/>
+          <w:szCs w:val="32"/>
+        </w:rPr>
+      </w:pPr>
+      <w:r>
+        <w:rPr>
+          <w:rFonts w:ascii="Verdana" w:hAnsi="Verdana"/>
+          <w:sz w:val="32"/>
+          <w:szCs w:val="32"/>
+        </w:rPr>
+        <w:t>Saving level and loading level can be more easily terminated when exiting application.</w:t>
+      </w:r>
+    </w:p>
+    <w:p>
+      <w:pPr>
+        <w:pStyle w:val="NoSpacing"/>
+        <w:ind w:left="360"/>
+        <w:rPr>
+          <w:rFonts w:ascii="Verdana" w:hAnsi="Verdana"/>
+          <w:color w:val="00B050"/>
+          <w:sz w:val="32"/>
+          <w:szCs w:val="32"/>
+        </w:rPr>
+      </w:pPr>
+    </w:p>
+    <w:p>
+      <w:pPr>
+        <w:pStyle w:val="NoSpacing"/>
+        <w:rPr>
+          <w:rFonts w:ascii="Verdana" w:hAnsi="Verdana"/>
+          <w:b/>
+          <w:color w:val="FF0000"/>
+          <w:sz w:val="48"/>
+        </w:rPr>
+      </w:pPr>
+      <w:r>
+        <w:rPr>
+          <w:rFonts w:ascii="Verdana" w:hAnsi="Verdana"/>
+          <w:b/>
+          <w:color w:val="FF0000"/>
+          <w:sz w:val="48"/>
+        </w:rPr>
+        <w:t>FIXES:</w:t>
+      </w:r>
+    </w:p>
+    <w:p>
+      <w:pPr>
+        <w:pStyle w:val="NoSpacing"/>
+        <w:numPr>
+          <w:ilvl w:val="0"/>
+          <w:numId w:val="24"/>
+        </w:numPr>
+        <w:rPr>
+          <w:rFonts w:ascii="Verdana" w:hAnsi="Verdana"/>
+          <w:sz w:val="32"/>
+          <w:szCs w:val="32"/>
+        </w:rPr>
+      </w:pPr>
+      <w:r>
+        <w:rPr>
+          <w:rFonts w:ascii="Verdana" w:hAnsi="Verdana"/>
+          <w:sz w:val="32"/>
+          <w:szCs w:val="32"/>
+        </w:rPr>
+        <w:t>Level renderer does not animate (fix) when level is loading.</w:t>
+      </w:r>
+    </w:p>
+    <w:p>
+      <w:pPr>
+        <w:pStyle w:val="NoSpacing"/>
+        <w:jc w:val="center"/>
+        <w:rPr>
+          <w:rFonts w:ascii="Verdana" w:hAnsi="Verdana"/>
+          <w:b/>
+          <w:sz w:val="48"/>
+        </w:rPr>
+      </w:pPr>
+      <w:r>
+        <w:rPr>
+          <w:rFonts w:ascii="Verdana" w:hAnsi="Verdana"/>
+          <w:b/>
+          <w:sz w:val="48"/>
+        </w:rPr>
+        <w:t xml:space="preserve"> </w:t>
+      </w:r>
+    </w:p>
+    <w:p>
+      <w:pPr>
+        <w:pStyle w:val="NoSpacing"/>
+        <w:jc w:val="center"/>
+        <w:rPr>
+          <w:rFonts w:ascii="Verdana" w:hAnsi="Verdana"/>
+          <w:b/>
+          <w:sz w:val="48"/>
+        </w:rPr>
+      </w:pPr>
+    </w:p>
+    <w:p>
+      <w:pPr>
+        <w:pStyle w:val="NoSpacing"/>
+        <w:jc w:val="center"/>
+        <w:rPr>
+          <w:rFonts w:ascii="Verdana" w:hAnsi="Verdana"/>
+          <w:b/>
+          <w:sz w:val="48"/>
+        </w:rPr>
+      </w:pPr>
+    </w:p>
+    <w:p>
+      <w:pPr>
+        <w:pStyle w:val="NoSpacing"/>
+        <w:jc w:val="center"/>
+        <w:rPr>
+          <w:rFonts w:ascii="Verdana" w:hAnsi="Verdana"/>
+          <w:b/>
+          <w:sz w:val="48"/>
+        </w:rPr>
+      </w:pPr>
+    </w:p>
+    <w:p>
+      <w:pPr>
+        <w:pStyle w:val="NoSpacing"/>
+        <w:jc w:val="center"/>
+        <w:rPr>
+          <w:rFonts w:ascii="Verdana" w:hAnsi="Verdana"/>
+          <w:b/>
+          <w:sz w:val="48"/>
+        </w:rPr>
+      </w:pPr>
+    </w:p>
+    <w:p>
+      <w:pPr>
+        <w:pStyle w:val="NoSpacing"/>
+        <w:jc w:val="center"/>
+        <w:rPr>
+          <w:rFonts w:ascii="Verdana" w:hAnsi="Verdana"/>
+          <w:b/>
+          <w:sz w:val="48"/>
+        </w:rPr>
+      </w:pPr>
+    </w:p>
+    <w:p>
+      <w:pPr>
+        <w:pStyle w:val="NoSpacing"/>
+        <w:jc w:val="center"/>
+        <w:rPr>
+          <w:rFonts w:ascii="Verdana" w:hAnsi="Verdana"/>
+          <w:b/>
+          <w:sz w:val="48"/>
+        </w:rPr>
+      </w:pPr>
+    </w:p>
+    <w:p>
+      <w:pPr>
+        <w:pStyle w:val="NoSpacing"/>
+        <w:jc w:val="center"/>
+        <w:rPr>
+          <w:rFonts w:ascii="Verdana" w:hAnsi="Verdana"/>
+          <w:b/>
+          <w:sz w:val="48"/>
+        </w:rPr>
+      </w:pPr>
+    </w:p>
+    <w:p>
+      <w:pPr>
+        <w:pStyle w:val="NoSpacing"/>
+        <w:jc w:val="center"/>
+        <w:rPr>
+          <w:rFonts w:ascii="Verdana" w:hAnsi="Verdana"/>
+          <w:b/>
+          <w:sz w:val="48"/>
+        </w:rPr>
+      </w:pPr>
+    </w:p>
+    <w:p>
+      <w:pPr>
+        <w:pStyle w:val="NoSpacing"/>
+        <w:jc w:val="center"/>
+        <w:rPr>
+          <w:rFonts w:ascii="Verdana" w:hAnsi="Verdana"/>
+          <w:b/>
+          <w:sz w:val="48"/>
+        </w:rPr>
+      </w:pPr>
+    </w:p>
+    <w:p>
+      <w:pPr>
+        <w:pStyle w:val="NoSpacing"/>
+        <w:jc w:val="center"/>
+        <w:rPr>
+          <w:rFonts w:ascii="Verdana" w:hAnsi="Verdana"/>
+          <w:b/>
+          <w:sz w:val="48"/>
+        </w:rPr>
+      </w:pPr>
+      <w:r>
+        <w:rPr>
+          <w:rFonts w:ascii="Verdana" w:hAnsi="Verdana"/>
+          <w:b/>
+          <w:sz w:val="48"/>
+        </w:rPr>
+        <w:lastRenderedPageBreak/>
+        <w:t>[</w:t>
+      </w:r>
+      <w:r>
+        <w:rPr>
+          <w:rFonts w:ascii="Verdana" w:hAnsi="Verdana"/>
+          <w:b/>
+          <w:sz w:val="48"/>
+        </w:rPr>
+        <w:t>KOREANS</w:t>
+      </w:r>
+      <w:r>
+        <w:rPr>
+          <w:rFonts w:ascii="Verdana" w:hAnsi="Verdana"/>
+          <w:b/>
+          <w:sz w:val="48"/>
+        </w:rPr>
+        <w:t>]</w:t>
+      </w:r>
+    </w:p>
+    <w:p>
+      <w:pPr>
+        <w:pStyle w:val="NoSpacing"/>
+        <w:rPr>
+          <w:rFonts w:ascii="Verdana" w:hAnsi="Verdana"/>
+          <w:b/>
+          <w:color w:val="00B050"/>
+          <w:sz w:val="48"/>
+        </w:rPr>
+      </w:pPr>
+      <w:r>
+        <w:rPr>
+          <w:rFonts w:ascii="Verdana" w:hAnsi="Verdana"/>
+          <w:b/>
+          <w:color w:val="00B050"/>
+          <w:sz w:val="48"/>
+        </w:rPr>
+        <w:t>FEATURES:</w:t>
+      </w:r>
+    </w:p>
+    <w:p>
+      <w:pPr>
+        <w:pStyle w:val="NoSpacing"/>
+        <w:numPr>
+          <w:ilvl w:val="0"/>
+          <w:numId w:val="19"/>
+        </w:numPr>
+        <w:rPr>
+          <w:rFonts w:ascii="Verdana" w:hAnsi="Verdana"/>
+          <w:color w:val="00B050"/>
+          <w:sz w:val="32"/>
+          <w:szCs w:val="32"/>
+        </w:rPr>
+      </w:pPr>
+      <w:r>
+        <w:rPr>
+          <w:rFonts w:ascii="Verdana" w:hAnsi="Verdana"/>
+          <w:sz w:val="32"/>
+          <w:szCs w:val="32"/>
+        </w:rPr>
+        <w:t>First fog implementation.</w:t>
+      </w:r>
+    </w:p>
+    <w:p>
+      <w:pPr>
+        <w:pStyle w:val="NoSpacing"/>
+        <w:numPr>
+          <w:ilvl w:val="0"/>
+          <w:numId w:val="19"/>
+        </w:numPr>
+        <w:rPr>
+          <w:rFonts w:ascii="Verdana" w:hAnsi="Verdana"/>
+          <w:color w:val="00B050"/>
+          <w:sz w:val="32"/>
+          <w:szCs w:val="32"/>
+        </w:rPr>
+      </w:pPr>
+      <w:r>
+        <w:rPr>
+          <w:rFonts w:ascii="Verdana" w:hAnsi="Verdana"/>
+          <w:sz w:val="32"/>
+          <w:szCs w:val="32"/>
+        </w:rPr>
+        <w:t>Introduced configuration file (with .</w:t>
       </w:r>
       <w:proofErr w:type="spellStart"/>
       <w:r>
@@ -1883,7 +1926,7 @@
           <w:sz w:val="32"/>
           <w:szCs w:val="32"/>
         </w:rPr>
-        <w:t>Ermac</w:t>
+        <w:t>ini</w:t>
       </w:r>
       <w:proofErr w:type="spellEnd"/>
       <w:r>
@@ -1892,8 +1935,86 @@
           <w:sz w:val="32"/>
           <w:szCs w:val="32"/>
         </w:rPr>
-        <w:t xml:space="preserve">” </w:t>
-      </w:r>
+        <w:t xml:space="preserve"> extension).</w:t>
+      </w:r>
+    </w:p>
+    <w:p>
+      <w:pPr>
+        <w:pStyle w:val="NoSpacing"/>
+        <w:ind w:left="360"/>
+        <w:rPr>
+          <w:rFonts w:ascii="Verdana" w:hAnsi="Verdana"/>
+          <w:color w:val="00B050"/>
+          <w:sz w:val="32"/>
+          <w:szCs w:val="32"/>
+        </w:rPr>
+      </w:pPr>
+    </w:p>
+    <w:p>
+      <w:pPr>
+        <w:pStyle w:val="NoSpacing"/>
+        <w:rPr>
+          <w:rFonts w:ascii="Verdana" w:hAnsi="Verdana"/>
+          <w:b/>
+          <w:color w:val="FFC000"/>
+          <w:sz w:val="48"/>
+        </w:rPr>
+      </w:pPr>
+      <w:r>
+        <w:rPr>
+          <w:rFonts w:ascii="Verdana" w:hAnsi="Verdana"/>
+          <w:b/>
+          <w:color w:val="FFC000"/>
+          <w:sz w:val="48"/>
+        </w:rPr>
+        <w:t>CHANGES:</w:t>
+      </w:r>
+    </w:p>
+    <w:p>
+      <w:pPr>
+        <w:pStyle w:val="NoSpacing"/>
+        <w:numPr>
+          <w:ilvl w:val="0"/>
+          <w:numId w:val="19"/>
+        </w:numPr>
+        <w:rPr>
+          <w:rFonts w:ascii="Verdana" w:hAnsi="Verdana"/>
+          <w:color w:val="00B050"/>
+          <w:sz w:val="32"/>
+          <w:szCs w:val="32"/>
+        </w:rPr>
+      </w:pPr>
+      <w:r>
+        <w:rPr>
+          <w:rFonts w:ascii="Verdana" w:hAnsi="Verdana"/>
+          <w:sz w:val="32"/>
+          <w:szCs w:val="32"/>
+        </w:rPr>
+        <w:t xml:space="preserve">Improved framerate </w:t>
+      </w:r>
+      <w:r>
+        <w:rPr>
+          <w:rFonts w:ascii="Verdana" w:hAnsi="Verdana"/>
+          <w:sz w:val="32"/>
+          <w:szCs w:val="32"/>
+        </w:rPr>
+        <w:t>with more optimizations.</w:t>
+      </w:r>
+    </w:p>
+    <w:p>
+      <w:pPr>
+        <w:pStyle w:val="NoSpacing"/>
+        <w:numPr>
+          <w:ilvl w:val="0"/>
+          <w:numId w:val="19"/>
+        </w:numPr>
+        <w:rPr>
+          <w:rFonts w:ascii="Verdana" w:hAnsi="Verdana"/>
+          <w:color w:val="00B050"/>
+          <w:sz w:val="32"/>
+          <w:szCs w:val="32"/>
+        </w:rPr>
+      </w:pPr>
       <w:proofErr w:type="spellStart"/>
       <w:r>
         <w:rPr>
@@ -1901,26 +2022,16 @@
           <w:sz w:val="32"/>
           <w:szCs w:val="32"/>
         </w:rPr>
-        <w:t>Stojanovich</w:t>
+        <w:t>Minigun</w:t>
       </w:r>
       <w:proofErr w:type="spellEnd"/>
-    </w:p>
-    <w:p>
-      <w:pPr>
-        <w:pStyle w:val="NoSpacing"/>
-        <w:rPr>
-          <w:rFonts w:ascii="Verdana" w:hAnsi="Verdana"/>
-          <w:sz w:val="32"/>
-          <w:szCs w:val="32"/>
-        </w:rPr>
-      </w:pPr>
-      <w:r>
-        <w:rPr>
-          <w:rFonts w:ascii="Verdana" w:hAnsi="Verdana"/>
-          <w:sz w:val="32"/>
-          <w:szCs w:val="32"/>
-        </w:rPr>
-        <w:t xml:space="preserve">Testers: </w:t>
+      <w:r>
+        <w:rPr>
+          <w:rFonts w:ascii="Verdana" w:hAnsi="Verdana"/>
+          <w:sz w:val="32"/>
+          <w:szCs w:val="32"/>
+        </w:rPr>
+        <w:t xml:space="preserve"> texture is rotated 45 degrees to point right instead diagonal. [</w:t>
       </w:r>
       <w:proofErr w:type="spellStart"/>
       <w:r>
@@ -1938,8 +2049,644 @@
           <w:sz w:val="32"/>
           <w:szCs w:val="32"/>
         </w:rPr>
-        <w:t>, Hellblade64</w:t>
-      </w:r>
+        <w:t>]</w:t>
+      </w:r>
+    </w:p>
+    <w:p>
+      <w:pPr>
+        <w:pStyle w:val="NoSpacing"/>
+        <w:numPr>
+          <w:ilvl w:val="0"/>
+          <w:numId w:val="19"/>
+        </w:numPr>
+        <w:rPr>
+          <w:rFonts w:ascii="Verdana" w:hAnsi="Verdana"/>
+          <w:color w:val="00B050"/>
+          <w:sz w:val="32"/>
+          <w:szCs w:val="32"/>
+        </w:rPr>
+      </w:pPr>
+      <w:r>
+        <w:rPr>
+          <w:rFonts w:ascii="Verdana" w:hAnsi="Verdana"/>
+          <w:sz w:val="32"/>
+          <w:szCs w:val="32"/>
+        </w:rPr>
+        <w:t>Skybox rotates slowly instead of being motionless.</w:t>
+      </w:r>
+    </w:p>
+    <w:p>
+      <w:pPr>
+        <w:pStyle w:val="NoSpacing"/>
+        <w:ind w:left="360"/>
+        <w:rPr>
+          <w:rFonts w:ascii="Verdana" w:hAnsi="Verdana"/>
+          <w:b/>
+          <w:sz w:val="48"/>
+        </w:rPr>
+      </w:pPr>
+    </w:p>
+    <w:p>
+      <w:pPr>
+        <w:pStyle w:val="NoSpacing"/>
+        <w:rPr>
+          <w:rFonts w:ascii="Verdana" w:hAnsi="Verdana"/>
+          <w:b/>
+          <w:color w:val="FF0000"/>
+          <w:sz w:val="48"/>
+        </w:rPr>
+      </w:pPr>
+      <w:r>
+        <w:rPr>
+          <w:rFonts w:ascii="Verdana" w:hAnsi="Verdana"/>
+          <w:b/>
+          <w:color w:val="FF0000"/>
+          <w:sz w:val="48"/>
+        </w:rPr>
+        <w:t>F</w:t>
+      </w:r>
+      <w:r>
+        <w:rPr>
+          <w:rFonts w:ascii="Verdana" w:hAnsi="Verdana"/>
+          <w:b/>
+          <w:color w:val="FF0000"/>
+          <w:sz w:val="48"/>
+        </w:rPr>
+        <w:t>IXES:</w:t>
+      </w:r>
+    </w:p>
+    <w:p>
+      <w:pPr>
+        <w:pStyle w:val="NoSpacing"/>
+        <w:numPr>
+          <w:ilvl w:val="0"/>
+          <w:numId w:val="19"/>
+        </w:numPr>
+        <w:rPr>
+          <w:rFonts w:ascii="Verdana" w:hAnsi="Verdana"/>
+          <w:color w:val="00B050"/>
+          <w:sz w:val="32"/>
+          <w:szCs w:val="32"/>
+        </w:rPr>
+      </w:pPr>
+      <w:r>
+        <w:rPr>
+          <w:rFonts w:ascii="Verdana" w:hAnsi="Verdana"/>
+          <w:sz w:val="32"/>
+          <w:szCs w:val="32"/>
+        </w:rPr>
+        <w:t>Critical null pointer exception at program startup fix (white screen application, not responding) [</w:t>
+      </w:r>
+      <w:proofErr w:type="spellStart"/>
+      <w:r>
+        <w:rPr>
+          <w:rFonts w:ascii="Verdana" w:hAnsi="Verdana"/>
+          <w:sz w:val="32"/>
+          <w:szCs w:val="32"/>
+        </w:rPr>
+        <w:t>JSomnia</w:t>
+      </w:r>
+      <w:proofErr w:type="spellEnd"/>
+      <w:r>
+        <w:rPr>
+          <w:rFonts w:ascii="Verdana" w:hAnsi="Verdana"/>
+          <w:sz w:val="32"/>
+          <w:szCs w:val="32"/>
+        </w:rPr>
+        <w:t>]</w:t>
+      </w:r>
+    </w:p>
+    <w:p>
+      <w:pPr>
+        <w:pStyle w:val="NoSpacing"/>
+        <w:jc w:val="center"/>
+        <w:rPr>
+          <w:rFonts w:ascii="Verdana" w:hAnsi="Verdana"/>
+          <w:b/>
+          <w:sz w:val="48"/>
+        </w:rPr>
+      </w:pPr>
+    </w:p>
+    <w:p>
+      <w:pPr>
+        <w:pStyle w:val="NoSpacing"/>
+        <w:jc w:val="center"/>
+        <w:rPr>
+          <w:rFonts w:ascii="Verdana" w:hAnsi="Verdana"/>
+          <w:b/>
+          <w:sz w:val="48"/>
+        </w:rPr>
+      </w:pPr>
+    </w:p>
+    <w:p>
+      <w:pPr>
+        <w:pStyle w:val="NoSpacing"/>
+        <w:jc w:val="center"/>
+        <w:rPr>
+          <w:rFonts w:ascii="Verdana" w:hAnsi="Verdana"/>
+          <w:b/>
+          <w:sz w:val="48"/>
+        </w:rPr>
+      </w:pPr>
+    </w:p>
+    <w:p>
+      <w:pPr>
+        <w:pStyle w:val="NoSpacing"/>
+        <w:jc w:val="center"/>
+        <w:rPr>
+          <w:rFonts w:ascii="Verdana" w:hAnsi="Verdana"/>
+          <w:b/>
+          <w:sz w:val="48"/>
+        </w:rPr>
+      </w:pPr>
+    </w:p>
+    <w:p>
+      <w:pPr>
+        <w:pStyle w:val="NoSpacing"/>
+        <w:jc w:val="center"/>
+        <w:rPr>
+          <w:rFonts w:ascii="Verdana" w:hAnsi="Verdana"/>
+          <w:b/>
+          <w:sz w:val="48"/>
+        </w:rPr>
+      </w:pPr>
+    </w:p>
+    <w:p>
+      <w:pPr>
+        <w:pStyle w:val="NoSpacing"/>
+        <w:jc w:val="center"/>
+        <w:rPr>
+          <w:rFonts w:ascii="Verdana" w:hAnsi="Verdana"/>
+          <w:b/>
+          <w:sz w:val="48"/>
+        </w:rPr>
+      </w:pPr>
+    </w:p>
+    <w:p>
+      <w:pPr>
+        <w:pStyle w:val="NoSpacing"/>
+        <w:jc w:val="center"/>
+        <w:rPr>
+          <w:rFonts w:ascii="Verdana" w:hAnsi="Verdana"/>
+          <w:b/>
+          <w:sz w:val="48"/>
+        </w:rPr>
+      </w:pPr>
+    </w:p>
+    <w:p>
+      <w:pPr>
+        <w:pStyle w:val="NoSpacing"/>
+        <w:jc w:val="center"/>
+        <w:rPr>
+          <w:rFonts w:ascii="Verdana" w:hAnsi="Verdana"/>
+          <w:b/>
+          <w:sz w:val="48"/>
+        </w:rPr>
+      </w:pPr>
+    </w:p>
+    <w:p>
+      <w:pPr>
+        <w:pStyle w:val="NoSpacing"/>
+        <w:jc w:val="center"/>
+        <w:rPr>
+          <w:rFonts w:ascii="Verdana" w:hAnsi="Verdana"/>
+          <w:b/>
+          <w:sz w:val="48"/>
+        </w:rPr>
+      </w:pPr>
+    </w:p>
+    <w:p>
+      <w:pPr>
+        <w:pStyle w:val="NoSpacing"/>
+        <w:jc w:val="center"/>
+        <w:rPr>
+          <w:rFonts w:ascii="Verdana" w:hAnsi="Verdana"/>
+          <w:b/>
+          <w:sz w:val="48"/>
+        </w:rPr>
+      </w:pPr>
+    </w:p>
+    <w:p>
+      <w:pPr>
+        <w:pStyle w:val="NoSpacing"/>
+        <w:jc w:val="center"/>
+        <w:rPr>
+          <w:rFonts w:ascii="Verdana" w:hAnsi="Verdana"/>
+          <w:b/>
+          <w:sz w:val="48"/>
+        </w:rPr>
+      </w:pPr>
+    </w:p>
+    <w:p>
+      <w:pPr>
+        <w:pStyle w:val="NoSpacing"/>
+        <w:jc w:val="center"/>
+        <w:rPr>
+          <w:rFonts w:ascii="Verdana" w:hAnsi="Verdana"/>
+          <w:b/>
+          <w:sz w:val="48"/>
+        </w:rPr>
+      </w:pPr>
+    </w:p>
+    <w:p>
+      <w:pPr>
+        <w:pStyle w:val="NoSpacing"/>
+        <w:jc w:val="center"/>
+        <w:rPr>
+          <w:rFonts w:ascii="Verdana" w:hAnsi="Verdana"/>
+          <w:b/>
+          <w:sz w:val="48"/>
+        </w:rPr>
+      </w:pPr>
+      <w:r>
+        <w:rPr>
+          <w:rFonts w:ascii="Verdana" w:hAnsi="Verdana"/>
+          <w:b/>
+          <w:sz w:val="48"/>
+        </w:rPr>
+        <w:lastRenderedPageBreak/>
+        <w:t>[</w:t>
+      </w:r>
+      <w:r>
+        <w:rPr>
+          <w:rFonts w:ascii="Verdana" w:hAnsi="Verdana"/>
+          <w:b/>
+          <w:sz w:val="48"/>
+        </w:rPr>
+        <w:t>JAPANESE</w:t>
+      </w:r>
+      <w:bookmarkStart w:id="0" w:name="_GoBack"/>
+      <w:bookmarkEnd w:id="0"/>
+      <w:r>
+        <w:rPr>
+          <w:rFonts w:ascii="Verdana" w:hAnsi="Verdana"/>
+          <w:b/>
+          <w:sz w:val="48"/>
+        </w:rPr>
+        <w:t>]</w:t>
+      </w:r>
+    </w:p>
+    <w:p>
+      <w:pPr>
+        <w:pStyle w:val="NoSpacing"/>
+        <w:rPr>
+          <w:rFonts w:ascii="Verdana" w:hAnsi="Verdana"/>
+          <w:b/>
+          <w:color w:val="FFC000"/>
+          <w:sz w:val="48"/>
+        </w:rPr>
+      </w:pPr>
+      <w:r>
+        <w:rPr>
+          <w:rFonts w:ascii="Verdana" w:hAnsi="Verdana"/>
+          <w:b/>
+          <w:color w:val="FFC000"/>
+          <w:sz w:val="48"/>
+        </w:rPr>
+        <w:t>CHANGES:</w:t>
+      </w:r>
+    </w:p>
+    <w:p>
+      <w:pPr>
+        <w:pStyle w:val="NoSpacing"/>
+        <w:numPr>
+          <w:ilvl w:val="0"/>
+          <w:numId w:val="19"/>
+        </w:numPr>
+        <w:rPr>
+          <w:rFonts w:ascii="Verdana" w:hAnsi="Verdana"/>
+          <w:color w:val="00B050"/>
+          <w:sz w:val="32"/>
+          <w:szCs w:val="32"/>
+        </w:rPr>
+      </w:pPr>
+      <w:r>
+        <w:rPr>
+          <w:rFonts w:ascii="Verdana" w:hAnsi="Verdana"/>
+          <w:sz w:val="32"/>
+          <w:szCs w:val="32"/>
+        </w:rPr>
+        <w:t>Improved framerate as instance rendering is being used.</w:t>
+      </w:r>
+    </w:p>
+    <w:p>
+      <w:pPr>
+        <w:pStyle w:val="NoSpacing"/>
+        <w:numPr>
+          <w:ilvl w:val="0"/>
+          <w:numId w:val="19"/>
+        </w:numPr>
+        <w:rPr>
+          <w:rFonts w:ascii="Verdana" w:hAnsi="Verdana"/>
+          <w:color w:val="00B050"/>
+          <w:sz w:val="32"/>
+          <w:szCs w:val="32"/>
+        </w:rPr>
+      </w:pPr>
+      <w:r>
+        <w:rPr>
+          <w:rFonts w:ascii="Verdana" w:hAnsi="Verdana"/>
+          <w:sz w:val="32"/>
+          <w:szCs w:val="32"/>
+        </w:rPr>
+        <w:t>Improved synchronization of threads. One thread removed.</w:t>
+      </w:r>
+      <w:r>
+        <w:rPr>
+          <w:rFonts w:ascii="Verdana" w:hAnsi="Verdana"/>
+          <w:color w:val="00B050"/>
+          <w:sz w:val="32"/>
+          <w:szCs w:val="32"/>
+        </w:rPr>
+        <w:t xml:space="preserve"> </w:t>
+      </w:r>
+    </w:p>
+    <w:p>
+      <w:pPr>
+        <w:pStyle w:val="NoSpacing"/>
+        <w:numPr>
+          <w:ilvl w:val="0"/>
+          <w:numId w:val="19"/>
+        </w:numPr>
+        <w:rPr>
+          <w:rFonts w:ascii="Verdana" w:hAnsi="Verdana"/>
+          <w:color w:val="00B050"/>
+          <w:sz w:val="32"/>
+          <w:szCs w:val="32"/>
+        </w:rPr>
+      </w:pPr>
+      <w:r>
+        <w:rPr>
+          <w:rFonts w:ascii="Verdana" w:hAnsi="Verdana"/>
+          <w:sz w:val="32"/>
+          <w:szCs w:val="32"/>
+        </w:rPr>
+        <w:t>Changes to free block placement. Looks better now.</w:t>
+      </w:r>
+      <w:r>
+        <w:rPr>
+          <w:rFonts w:ascii="Verdana" w:hAnsi="Verdana"/>
+          <w:color w:val="00B050"/>
+          <w:sz w:val="32"/>
+          <w:szCs w:val="32"/>
+        </w:rPr>
+        <w:t xml:space="preserve"> </w:t>
+      </w:r>
+    </w:p>
+    <w:p>
+      <w:pPr>
+        <w:pStyle w:val="NoSpacing"/>
+        <w:numPr>
+          <w:ilvl w:val="0"/>
+          <w:numId w:val="19"/>
+        </w:numPr>
+        <w:rPr>
+          <w:rFonts w:ascii="Verdana" w:hAnsi="Verdana"/>
+          <w:color w:val="00B050"/>
+          <w:sz w:val="32"/>
+          <w:szCs w:val="32"/>
+        </w:rPr>
+      </w:pPr>
+      <w:r>
+        <w:rPr>
+          <w:rFonts w:ascii="Verdana" w:hAnsi="Verdana"/>
+          <w:sz w:val="32"/>
+          <w:szCs w:val="32"/>
+        </w:rPr>
+        <w:t>Progress information is now more independent and it’s updated periodically.</w:t>
+      </w:r>
+    </w:p>
+    <w:p>
+      <w:pPr>
+        <w:pStyle w:val="NoSpacing"/>
+        <w:numPr>
+          <w:ilvl w:val="0"/>
+          <w:numId w:val="19"/>
+        </w:numPr>
+        <w:rPr>
+          <w:rFonts w:ascii="Verdana" w:hAnsi="Verdana"/>
+          <w:color w:val="00B050"/>
+          <w:sz w:val="32"/>
+          <w:szCs w:val="32"/>
+        </w:rPr>
+      </w:pPr>
+      <w:r>
+        <w:rPr>
+          <w:rFonts w:ascii="Verdana" w:hAnsi="Verdana"/>
+          <w:sz w:val="32"/>
+          <w:szCs w:val="32"/>
+        </w:rPr>
+        <w:t>Random Level Generator takes exact number of blocks instead of maximum random number of blocks.</w:t>
+      </w:r>
+    </w:p>
+    <w:p>
+      <w:pPr>
+        <w:pStyle w:val="NoSpacing"/>
+        <w:numPr>
+          <w:ilvl w:val="0"/>
+          <w:numId w:val="19"/>
+        </w:numPr>
+        <w:rPr>
+          <w:rFonts w:ascii="Verdana" w:hAnsi="Verdana"/>
+          <w:color w:val="00B050"/>
+          <w:sz w:val="32"/>
+          <w:szCs w:val="32"/>
+        </w:rPr>
+      </w:pPr>
+      <w:r>
+        <w:rPr>
+          <w:rFonts w:ascii="Verdana" w:hAnsi="Verdana"/>
+          <w:sz w:val="32"/>
+          <w:szCs w:val="32"/>
+        </w:rPr>
+        <w:t>Random level generation can be terminated at any time by exiting application.</w:t>
+      </w:r>
+    </w:p>
+    <w:p>
+      <w:pPr>
+        <w:pStyle w:val="NoSpacing"/>
+        <w:numPr>
+          <w:ilvl w:val="0"/>
+          <w:numId w:val="19"/>
+        </w:numPr>
+        <w:rPr>
+          <w:rFonts w:ascii="Verdana" w:hAnsi="Verdana"/>
+          <w:color w:val="00B050"/>
+          <w:sz w:val="32"/>
+          <w:szCs w:val="32"/>
+        </w:rPr>
+      </w:pPr>
+      <w:r>
+        <w:rPr>
+          <w:rFonts w:ascii="Verdana" w:hAnsi="Verdana"/>
+          <w:sz w:val="32"/>
+          <w:szCs w:val="32"/>
+        </w:rPr>
+        <w:t>Random Level Generator generates level faster.</w:t>
+      </w:r>
+    </w:p>
+    <w:p>
+      <w:pPr>
+        <w:pStyle w:val="NoSpacing"/>
+        <w:ind w:left="360"/>
+        <w:rPr>
+          <w:rFonts w:ascii="Verdana" w:hAnsi="Verdana"/>
+          <w:color w:val="00B050"/>
+          <w:sz w:val="32"/>
+          <w:szCs w:val="32"/>
+        </w:rPr>
+      </w:pPr>
+    </w:p>
+    <w:p>
+      <w:pPr>
+        <w:pStyle w:val="NoSpacing"/>
+        <w:rPr>
+          <w:rFonts w:ascii="Verdana" w:hAnsi="Verdana"/>
+          <w:b/>
+          <w:color w:val="FF0000"/>
+          <w:sz w:val="48"/>
+        </w:rPr>
+      </w:pPr>
+      <w:r>
+        <w:rPr>
+          <w:rFonts w:ascii="Verdana" w:hAnsi="Verdana"/>
+          <w:b/>
+          <w:color w:val="FF0000"/>
+          <w:sz w:val="48"/>
+        </w:rPr>
+        <w:t>FIXES:</w:t>
+      </w:r>
+    </w:p>
+    <w:p>
+      <w:pPr>
+        <w:pStyle w:val="NoSpacing"/>
+        <w:numPr>
+          <w:ilvl w:val="0"/>
+          <w:numId w:val="18"/>
+        </w:numPr>
+        <w:rPr>
+          <w:rFonts w:ascii="Verdana" w:hAnsi="Verdana"/>
+          <w:sz w:val="32"/>
+          <w:szCs w:val="32"/>
+        </w:rPr>
+      </w:pPr>
+      <w:r>
+        <w:rPr>
+          <w:rFonts w:ascii="Verdana" w:hAnsi="Verdana"/>
+          <w:sz w:val="32"/>
+          <w:szCs w:val="32"/>
+        </w:rPr>
+        <w:t>Random Level Generator doesn’t spawn anymore blocks which intersect each other.</w:t>
+      </w:r>
+    </w:p>
+    <w:p>
+      <w:pPr>
+        <w:pStyle w:val="NoSpacing"/>
+        <w:numPr>
+          <w:ilvl w:val="0"/>
+          <w:numId w:val="18"/>
+        </w:numPr>
+        <w:rPr>
+          <w:rFonts w:ascii="Verdana" w:hAnsi="Verdana"/>
+          <w:sz w:val="32"/>
+          <w:szCs w:val="32"/>
+        </w:rPr>
+      </w:pPr>
+      <w:r>
+        <w:rPr>
+          <w:rFonts w:ascii="Verdana" w:hAnsi="Verdana"/>
+          <w:sz w:val="32"/>
+          <w:szCs w:val="32"/>
+        </w:rPr>
+        <w:t>Fixed wrong message about collision.</w:t>
+      </w:r>
+    </w:p>
+    <w:p>
+      <w:pPr>
+        <w:pStyle w:val="NoSpacing"/>
+        <w:jc w:val="center"/>
+        <w:rPr>
+          <w:rFonts w:ascii="Verdana" w:hAnsi="Verdana"/>
+          <w:b/>
+          <w:sz w:val="48"/>
+        </w:rPr>
+      </w:pPr>
+    </w:p>
+    <w:p>
+      <w:pPr>
+        <w:pStyle w:val="NoSpacing"/>
+        <w:jc w:val="center"/>
+        <w:rPr>
+          <w:rFonts w:ascii="Verdana" w:hAnsi="Verdana"/>
+          <w:b/>
+          <w:sz w:val="48"/>
+        </w:rPr>
+      </w:pPr>
+    </w:p>
+    <w:p>
+      <w:pPr>
+        <w:pStyle w:val="NoSpacing"/>
+        <w:jc w:val="center"/>
+        <w:rPr>
+          <w:rFonts w:ascii="Verdana" w:hAnsi="Verdana"/>
+          <w:b/>
+          <w:sz w:val="48"/>
+        </w:rPr>
+      </w:pPr>
+    </w:p>
+    <w:p>
+      <w:pPr>
+        <w:pStyle w:val="NoSpacing"/>
+        <w:jc w:val="center"/>
+        <w:rPr>
+          <w:rFonts w:ascii="Verdana" w:hAnsi="Verdana"/>
+          <w:b/>
+          <w:sz w:val="48"/>
+        </w:rPr>
+      </w:pPr>
+    </w:p>
+    <w:p>
+      <w:pPr>
+        <w:pStyle w:val="NoSpacing"/>
+        <w:jc w:val="center"/>
+        <w:rPr>
+          <w:rFonts w:ascii="Verdana" w:hAnsi="Verdana"/>
+          <w:b/>
+          <w:sz w:val="48"/>
+        </w:rPr>
+      </w:pPr>
+    </w:p>
+    <w:p>
+      <w:pPr>
+        <w:pStyle w:val="NoSpacing"/>
+        <w:jc w:val="center"/>
+        <w:rPr>
+          <w:rFonts w:ascii="Verdana" w:hAnsi="Verdana"/>
+          <w:b/>
+          <w:sz w:val="48"/>
+        </w:rPr>
+      </w:pPr>
+    </w:p>
+    <w:p>
+      <w:pPr>
+        <w:pStyle w:val="NoSpacing"/>
+        <w:jc w:val="center"/>
+        <w:rPr>
+          <w:rFonts w:ascii="Verdana" w:hAnsi="Verdana"/>
+          <w:b/>
+          <w:sz w:val="48"/>
+        </w:rPr>
+      </w:pPr>
+    </w:p>
+    <w:p>
+      <w:pPr>
+        <w:pStyle w:val="NoSpacing"/>
+        <w:rPr>
+          <w:rFonts w:ascii="Verdana" w:hAnsi="Verdana"/>
+          <w:sz w:val="32"/>
+          <w:szCs w:val="32"/>
+        </w:rPr>
+      </w:pPr>
     </w:p>
     <w:sectPr>
       <w:headerReference w:type="default" r:id="rId10"/>
@@ -2020,7 +2767,7 @@
               <mc:AlternateContent>
                 <mc:Choice Requires="wps">
                   <w:drawing>
-                    <wp:anchor distT="0" distB="0" distL="114300" distR="114300" simplePos="0" relativeHeight="251659264" behindDoc="0" locked="0" layoutInCell="1" allowOverlap="1" wp14:anchorId="28B23A58" wp14:editId="58750E18">
+                    <wp:anchor distT="0" distB="0" distL="114300" distR="114300" simplePos="0" relativeHeight="251659264" behindDoc="0" locked="0" layoutInCell="1" allowOverlap="1" wp14:anchorId="2DD5D783" wp14:editId="7FB99633">
                       <wp:simplePos x="0" y="0"/>
                       <wp:positionH relativeFrom="margin">
                         <wp:align>center</wp:align>
@@ -2097,7 +2844,7 @@
                                       <w:sz w:val="32"/>
                                       <w:szCs w:val="32"/>
                                     </w:rPr>
-                                    <w:t>1</w:t>
+                                    <w:t>5</w:t>
                                   </w:r>
                                   <w:r>
                                     <w:rPr>
@@ -2163,7 +2910,7 @@
                                 <w:sz w:val="32"/>
                                 <w:szCs w:val="32"/>
                               </w:rPr>
-                              <w:t>1</w:t>
+                              <w:t>5</w:t>
                             </w:r>
                             <w:r>
                               <w:rPr>
@@ -2225,6 +2972,110 @@
 
 <file path=word/header1.xml><?xml version="1.0" encoding="utf-8"?>
 <w:hdr xmlns:wpc="http://schemas.microsoft.com/office/word/2010/wordprocessingCanvas" xmlns:mc="http://schemas.openxmlformats.org/markup-compatibility/2006" xmlns:o="urn:schemas-microsoft-com:office:office" xmlns:r="http://schemas.openxmlformats.org/officeDocument/2006/relationships" xmlns:m="http://schemas.openxmlformats.org/officeDocument/2006/math" xmlns:v="urn:schemas-microsoft-com:vml" xmlns:wp14="http://schemas.microsoft.com/office/word/2010/wordprocessingDrawing" xmlns:wp="http://schemas.openxmlformats.org/drawingml/2006/wordprocessingDrawing" xmlns:w10="urn:schemas-microsoft-com:office:word" xmlns:w="http://schemas.openxmlformats.org/wordprocessingml/2006/main" xmlns:w14="http://schemas.microsoft.com/office/word/2010/wordml" xmlns:wpg="http://schemas.microsoft.com/office/word/2010/wordprocessingGroup" xmlns:wpi="http://schemas.microsoft.com/office/word/2010/wordprocessingInk" xmlns:wne="http://schemas.microsoft.com/office/word/2006/wordml" xmlns:wps="http://schemas.microsoft.com/office/word/2010/wordprocessingShape" mc:Ignorable="w14 wp14">
+  <w:sdt>
+    <w:sdtPr>
+      <w:rPr>
+        <w:rFonts w:ascii="Verdana" w:hAnsi="Verdana"/>
+        <w:sz w:val="24"/>
+        <w:szCs w:val="32"/>
+      </w:rPr>
+      <w:alias w:val="Title"/>
+      <w:id w:val="77738743"/>
+      <w:placeholder>
+        <w:docPart w:val="065141616EC9499AADE007ADABCB4788"/>
+      </w:placeholder>
+      <w:dataBinding w:prefixMappings="xmlns:ns0='http://schemas.openxmlformats.org/package/2006/metadata/core-properties' xmlns:ns1='http://purl.org/dc/elements/1.1/'" w:xpath="/ns0:coreProperties[1]/ns1:title[1]" w:storeItemID="{6C3C8BC8-F283-45AE-878A-BAB7291924A1}"/>
+      <w:text/>
+    </w:sdtPr>
+    <w:sdtContent>
+      <w:p>
+        <w:pPr>
+          <w:pStyle w:val="Header"/>
+          <w:pBdr>
+            <w:bottom w:val="thickThinSmallGap" w:sz="24" w:space="1" w:color="622423" w:themeColor="accent2" w:themeShade="7F"/>
+          </w:pBdr>
+          <w:jc w:val="center"/>
+          <w:rPr>
+            <w:rFonts w:asciiTheme="majorHAnsi" w:eastAsiaTheme="majorEastAsia" w:hAnsiTheme="majorHAnsi" w:cstheme="majorBidi"/>
+            <w:sz w:val="32"/>
+            <w:szCs w:val="32"/>
+          </w:rPr>
+        </w:pPr>
+        <w:proofErr w:type="spellStart"/>
+        <w:r>
+          <w:rPr>
+            <w:rFonts w:ascii="Verdana" w:hAnsi="Verdana"/>
+            <w:sz w:val="24"/>
+            <w:szCs w:val="32"/>
+          </w:rPr>
+          <w:t>Ermac</w:t>
+        </w:r>
+        <w:proofErr w:type="spellEnd"/>
+        <w:r>
+          <w:rPr>
+            <w:rFonts w:ascii="Verdana" w:hAnsi="Verdana"/>
+            <w:sz w:val="24"/>
+            <w:szCs w:val="32"/>
+          </w:rPr>
+          <w:t xml:space="preserve"> Voxel Game - Alexander “</w:t>
+        </w:r>
+        <w:proofErr w:type="spellStart"/>
+        <w:r>
+          <w:rPr>
+            <w:rFonts w:ascii="Verdana" w:hAnsi="Verdana"/>
+            <w:sz w:val="24"/>
+            <w:szCs w:val="32"/>
+          </w:rPr>
+          <w:t>Ermac</w:t>
+        </w:r>
+        <w:proofErr w:type="spellEnd"/>
+        <w:r>
+          <w:rPr>
+            <w:rFonts w:ascii="Verdana" w:hAnsi="Verdana"/>
+            <w:sz w:val="24"/>
+            <w:szCs w:val="32"/>
+          </w:rPr>
+          <w:t xml:space="preserve">” </w:t>
+        </w:r>
+        <w:proofErr w:type="spellStart"/>
+        <w:r>
+          <w:rPr>
+            <w:rFonts w:ascii="Verdana" w:hAnsi="Verdana"/>
+            <w:sz w:val="24"/>
+            <w:szCs w:val="32"/>
+          </w:rPr>
+          <w:t>Stojanovich</w:t>
+        </w:r>
+        <w:proofErr w:type="spellEnd"/>
+        <w:r>
+          <w:rPr>
+            <w:rFonts w:ascii="Verdana" w:hAnsi="Verdana"/>
+            <w:sz w:val="24"/>
+            <w:szCs w:val="32"/>
+          </w:rPr>
+          <w:t xml:space="preserve">, </w:t>
+        </w:r>
+        <w:proofErr w:type="spellStart"/>
+        <w:r>
+          <w:rPr>
+            <w:rFonts w:ascii="Verdana" w:hAnsi="Verdana"/>
+            <w:sz w:val="24"/>
+            <w:szCs w:val="32"/>
+          </w:rPr>
+          <w:t>JSomnia</w:t>
+        </w:r>
+        <w:proofErr w:type="spellEnd"/>
+        <w:r>
+          <w:rPr>
+            <w:rFonts w:ascii="Verdana" w:hAnsi="Verdana"/>
+            <w:sz w:val="24"/>
+            <w:szCs w:val="32"/>
+          </w:rPr>
+          <w:t>, Hellblade64</w:t>
+        </w:r>
+      </w:p>
+    </w:sdtContent>
+  </w:sdt>
   <w:p>
     <w:pPr>
       <w:pStyle w:val="Header"/>
@@ -2235,24 +3086,6 @@
         <w:szCs w:val="32"/>
       </w:rPr>
     </w:pPr>
-    <w:proofErr w:type="spellStart"/>
-    <w:r>
-      <w:rPr>
-        <w:b/>
-        <w:sz w:val="32"/>
-        <w:szCs w:val="32"/>
-      </w:rPr>
-      <w:t>Ermac</w:t>
-    </w:r>
-    <w:proofErr w:type="spellEnd"/>
-    <w:r>
-      <w:rPr>
-        <w:b/>
-        <w:sz w:val="32"/>
-        <w:szCs w:val="32"/>
-      </w:rPr>
-      <w:t xml:space="preserve"> Voxel Game</w:t>
-    </w:r>
   </w:p>
 </w:hdr>
 </file>
@@ -2828,8 +3661,8 @@
   <w:abstractNum w:abstractNumId="5">
     <w:nsid w:val="165453AA"/>
     <w:multiLevelType w:val="hybridMultilevel"/>
-    <w:tmpl w:val="98020FF0"/>
-    <w:lvl w:ilvl="0" w:tplc="04090001">
+    <w:tmpl w:val="A8B80E06"/>
+    <w:lvl w:ilvl="0" w:tplc="8272ED50">
       <w:start w:val="1"/>
       <w:numFmt w:val="bullet"/>
       <w:lvlText w:val=""/>
@@ -2839,6 +3672,7 @@
       </w:pPr>
       <w:rPr>
         <w:rFonts w:ascii="Symbol" w:hAnsi="Symbol" w:hint="default"/>
+        <w:sz w:val="32"/>
       </w:rPr>
     </w:lvl>
     <w:lvl w:ilvl="1" w:tplc="04090003" w:tentative="1">
@@ -3393,6 +4227,119 @@
     </w:lvl>
   </w:abstractNum>
   <w:abstractNum w:abstractNumId="10">
+    <w:nsid w:val="3A8E1F14"/>
+    <w:multiLevelType w:val="hybridMultilevel"/>
+    <w:tmpl w:val="DF8A4E4C"/>
+    <w:lvl w:ilvl="0" w:tplc="04090001">
+      <w:start w:val="1"/>
+      <w:numFmt w:val="bullet"/>
+      <w:lvlText w:val=""/>
+      <w:lvlJc w:val="left"/>
+      <w:pPr>
+        <w:ind w:left="360" w:hanging="360"/>
+      </w:pPr>
+      <w:rPr>
+        <w:rFonts w:ascii="Symbol" w:hAnsi="Symbol" w:hint="default"/>
+      </w:rPr>
+    </w:lvl>
+    <w:lvl w:ilvl="1" w:tplc="04090003" w:tentative="1">
+      <w:start w:val="1"/>
+      <w:numFmt w:val="bullet"/>
+      <w:lvlText w:val="o"/>
+      <w:lvlJc w:val="left"/>
+      <w:pPr>
+        <w:ind w:left="1080" w:hanging="360"/>
+      </w:pPr>
+      <w:rPr>
+        <w:rFonts w:ascii="Courier New" w:hAnsi="Courier New" w:cs="Courier New" w:hint="default"/>
+      </w:rPr>
+    </w:lvl>
+    <w:lvl w:ilvl="2" w:tplc="04090005" w:tentative="1">
+      <w:start w:val="1"/>
+      <w:numFmt w:val="bullet"/>
+      <w:lvlText w:val=""/>
+      <w:lvlJc w:val="left"/>
+      <w:pPr>
+        <w:ind w:left="1800" w:hanging="360"/>
+      </w:pPr>
+      <w:rPr>
+        <w:rFonts w:ascii="Wingdings" w:hAnsi="Wingdings" w:hint="default"/>
+      </w:rPr>
+    </w:lvl>
+    <w:lvl w:ilvl="3" w:tplc="04090001" w:tentative="1">
+      <w:start w:val="1"/>
+      <w:numFmt w:val="bullet"/>
+      <w:lvlText w:val=""/>
+      <w:lvlJc w:val="left"/>
+      <w:pPr>
+        <w:ind w:left="2520" w:hanging="360"/>
+      </w:pPr>
+      <w:rPr>
+        <w:rFonts w:ascii="Symbol" w:hAnsi="Symbol" w:hint="default"/>
+      </w:rPr>
+    </w:lvl>
+    <w:lvl w:ilvl="4" w:tplc="04090003" w:tentative="1">
+      <w:start w:val="1"/>
+      <w:numFmt w:val="bullet"/>
+      <w:lvlText w:val="o"/>
+      <w:lvlJc w:val="left"/>
+      <w:pPr>
+        <w:ind w:left="3240" w:hanging="360"/>
+      </w:pPr>
+      <w:rPr>
+        <w:rFonts w:ascii="Courier New" w:hAnsi="Courier New" w:cs="Courier New" w:hint="default"/>
+      </w:rPr>
+    </w:lvl>
+    <w:lvl w:ilvl="5" w:tplc="04090005" w:tentative="1">
+      <w:start w:val="1"/>
+      <w:numFmt w:val="bullet"/>
+      <w:lvlText w:val=""/>
+      <w:lvlJc w:val="left"/>
+      <w:pPr>
+        <w:ind w:left="3960" w:hanging="360"/>
+      </w:pPr>
+      <w:rPr>
+        <w:rFonts w:ascii="Wingdings" w:hAnsi="Wingdings" w:hint="default"/>
+      </w:rPr>
+    </w:lvl>
+    <w:lvl w:ilvl="6" w:tplc="04090001" w:tentative="1">
+      <w:start w:val="1"/>
+      <w:numFmt w:val="bullet"/>
+      <w:lvlText w:val=""/>
+      <w:lvlJc w:val="left"/>
+      <w:pPr>
+        <w:ind w:left="4680" w:hanging="360"/>
+      </w:pPr>
+      <w:rPr>
+        <w:rFonts w:ascii="Symbol" w:hAnsi="Symbol" w:hint="default"/>
+      </w:rPr>
+    </w:lvl>
+    <w:lvl w:ilvl="7" w:tplc="04090003" w:tentative="1">
+      <w:start w:val="1"/>
+      <w:numFmt w:val="bullet"/>
+      <w:lvlText w:val="o"/>
+      <w:lvlJc w:val="left"/>
+      <w:pPr>
+        <w:ind w:left="5400" w:hanging="360"/>
+      </w:pPr>
+      <w:rPr>
+        <w:rFonts w:ascii="Courier New" w:hAnsi="Courier New" w:cs="Courier New" w:hint="default"/>
+      </w:rPr>
+    </w:lvl>
+    <w:lvl w:ilvl="8" w:tplc="04090005" w:tentative="1">
+      <w:start w:val="1"/>
+      <w:numFmt w:val="bullet"/>
+      <w:lvlText w:val=""/>
+      <w:lvlJc w:val="left"/>
+      <w:pPr>
+        <w:ind w:left="6120" w:hanging="360"/>
+      </w:pPr>
+      <w:rPr>
+        <w:rFonts w:ascii="Wingdings" w:hAnsi="Wingdings" w:hint="default"/>
+      </w:rPr>
+    </w:lvl>
+  </w:abstractNum>
+  <w:abstractNum w:abstractNumId="11">
     <w:nsid w:val="47BB246C"/>
     <w:multiLevelType w:val="hybridMultilevel"/>
     <w:tmpl w:val="46048FB8"/>
@@ -3506,7 +4453,7 @@
       </w:rPr>
     </w:lvl>
   </w:abstractNum>
-  <w:abstractNum w:abstractNumId="11">
+  <w:abstractNum w:abstractNumId="12">
     <w:nsid w:val="49BD1D98"/>
     <w:multiLevelType w:val="hybridMultilevel"/>
     <w:tmpl w:val="3332526C"/>
@@ -3619,7 +4566,7 @@
       </w:rPr>
     </w:lvl>
   </w:abstractNum>
-  <w:abstractNum w:abstractNumId="12">
+  <w:abstractNum w:abstractNumId="13">
     <w:nsid w:val="4CBE58AB"/>
     <w:multiLevelType w:val="hybridMultilevel"/>
     <w:tmpl w:val="F7484EBC"/>
@@ -3733,7 +4680,7 @@
       </w:rPr>
     </w:lvl>
   </w:abstractNum>
-  <w:abstractNum w:abstractNumId="13">
+  <w:abstractNum w:abstractNumId="14">
     <w:nsid w:val="4DFC1534"/>
     <w:multiLevelType w:val="hybridMultilevel"/>
     <w:tmpl w:val="2EF85536"/>
@@ -3846,7 +4793,7 @@
       </w:rPr>
     </w:lvl>
   </w:abstractNum>
-  <w:abstractNum w:abstractNumId="14">
+  <w:abstractNum w:abstractNumId="15">
     <w:nsid w:val="511F51B9"/>
     <w:multiLevelType w:val="hybridMultilevel"/>
     <w:tmpl w:val="F650FDA2"/>
@@ -3959,7 +4906,7 @@
       </w:rPr>
     </w:lvl>
   </w:abstractNum>
-  <w:abstractNum w:abstractNumId="15">
+  <w:abstractNum w:abstractNumId="16">
     <w:nsid w:val="567B01C4"/>
     <w:multiLevelType w:val="hybridMultilevel"/>
     <w:tmpl w:val="01E64DBC"/>
@@ -4073,7 +5020,7 @@
       </w:rPr>
     </w:lvl>
   </w:abstractNum>
-  <w:abstractNum w:abstractNumId="16">
+  <w:abstractNum w:abstractNumId="17">
     <w:nsid w:val="57FA5BDC"/>
     <w:multiLevelType w:val="hybridMultilevel"/>
     <w:tmpl w:val="C1069388"/>
@@ -4186,7 +5133,7 @@
       </w:rPr>
     </w:lvl>
   </w:abstractNum>
-  <w:abstractNum w:abstractNumId="17">
+  <w:abstractNum w:abstractNumId="18">
     <w:nsid w:val="6A465EA9"/>
     <w:multiLevelType w:val="hybridMultilevel"/>
     <w:tmpl w:val="83527182"/>
@@ -4299,7 +5246,7 @@
       </w:rPr>
     </w:lvl>
   </w:abstractNum>
-  <w:abstractNum w:abstractNumId="18">
+  <w:abstractNum w:abstractNumId="19">
     <w:nsid w:val="6E0F0971"/>
     <w:multiLevelType w:val="hybridMultilevel"/>
     <w:tmpl w:val="EF481D2C"/>
@@ -4413,7 +5360,7 @@
       </w:rPr>
     </w:lvl>
   </w:abstractNum>
-  <w:abstractNum w:abstractNumId="19">
+  <w:abstractNum w:abstractNumId="20">
     <w:nsid w:val="74E724D3"/>
     <w:multiLevelType w:val="hybridMultilevel"/>
     <w:tmpl w:val="EDCC46EC"/>
@@ -4526,7 +5473,7 @@
       </w:rPr>
     </w:lvl>
   </w:abstractNum>
-  <w:abstractNum w:abstractNumId="20">
+  <w:abstractNum w:abstractNumId="21">
     <w:nsid w:val="774E37A9"/>
     <w:multiLevelType w:val="hybridMultilevel"/>
     <w:tmpl w:val="1E341DC4"/>
@@ -4639,7 +5586,7 @@
       </w:rPr>
     </w:lvl>
   </w:abstractNum>
-  <w:abstractNum w:abstractNumId="21">
+  <w:abstractNum w:abstractNumId="22">
     <w:nsid w:val="7C7B411A"/>
     <w:multiLevelType w:val="hybridMultilevel"/>
     <w:tmpl w:val="DD327E98"/>
@@ -4753,13 +5700,13 @@
     </w:lvl>
   </w:abstractNum>
   <w:num w:numId="1">
-    <w:abstractNumId w:val="19"/>
+    <w:abstractNumId w:val="20"/>
   </w:num>
   <w:num w:numId="2">
-    <w:abstractNumId w:val="16"/>
+    <w:abstractNumId w:val="17"/>
   </w:num>
   <w:num w:numId="3">
-    <w:abstractNumId w:val="13"/>
+    <w:abstractNumId w:val="14"/>
   </w:num>
   <w:num w:numId="4">
     <w:abstractNumId w:val="8"/>
@@ -4771,28 +5718,28 @@
     <w:abstractNumId w:val="2"/>
   </w:num>
   <w:num w:numId="7">
-    <w:abstractNumId w:val="17"/>
+    <w:abstractNumId w:val="18"/>
   </w:num>
   <w:num w:numId="8">
     <w:abstractNumId w:val="9"/>
   </w:num>
   <w:num w:numId="9">
-    <w:abstractNumId w:val="14"/>
+    <w:abstractNumId w:val="15"/>
   </w:num>
   <w:num w:numId="10">
-    <w:abstractNumId w:val="11"/>
+    <w:abstractNumId w:val="12"/>
   </w:num>
   <w:num w:numId="11">
     <w:abstractNumId w:val="0"/>
   </w:num>
   <w:num w:numId="12">
-    <w:abstractNumId w:val="21"/>
+    <w:abstractNumId w:val="22"/>
   </w:num>
   <w:num w:numId="13">
     <w:abstractNumId w:val="9"/>
   </w:num>
   <w:num w:numId="14">
-    <w:abstractNumId w:val="18"/>
+    <w:abstractNumId w:val="19"/>
   </w:num>
   <w:num w:numId="15">
     <w:abstractNumId w:val="7"/>
@@ -4801,16 +5748,16 @@
     <w:abstractNumId w:val="4"/>
   </w:num>
   <w:num w:numId="17">
-    <w:abstractNumId w:val="12"/>
+    <w:abstractNumId w:val="13"/>
   </w:num>
   <w:num w:numId="18">
     <w:abstractNumId w:val="3"/>
   </w:num>
   <w:num w:numId="19">
-    <w:abstractNumId w:val="10"/>
+    <w:abstractNumId w:val="11"/>
   </w:num>
   <w:num w:numId="20">
-    <w:abstractNumId w:val="20"/>
+    <w:abstractNumId w:val="21"/>
   </w:num>
   <w:num w:numId="21">
     <w:abstractNumId w:val="1"/>
@@ -4819,7 +5766,10 @@
     <w:abstractNumId w:val="5"/>
   </w:num>
   <w:num w:numId="23">
-    <w:abstractNumId w:val="15"/>
+    <w:abstractNumId w:val="16"/>
+  </w:num>
+  <w:num w:numId="24">
+    <w:abstractNumId w:val="10"/>
   </w:num>
 </w:numbering>
 </file>
@@ -5390,6 +6340,537 @@
     <w:rsid w:val="00302219"/>
   </w:style>
 </w:styles>
+</file>
+
+<file path=word/glossary/document.xml><?xml version="1.0" encoding="utf-8"?>
+<w:glossaryDocument xmlns:wpc="http://schemas.microsoft.com/office/word/2010/wordprocessingCanvas" xmlns:mc="http://schemas.openxmlformats.org/markup-compatibility/2006" xmlns:o="urn:schemas-microsoft-com:office:office" xmlns:r="http://schemas.openxmlformats.org/officeDocument/2006/relationships" xmlns:m="http://schemas.openxmlformats.org/officeDocument/2006/math" xmlns:v="urn:schemas-microsoft-com:vml" xmlns:wp14="http://schemas.microsoft.com/office/word/2010/wordprocessingDrawing" xmlns:wp="http://schemas.openxmlformats.org/drawingml/2006/wordprocessingDrawing" xmlns:w10="urn:schemas-microsoft-com:office:word" xmlns:w="http://schemas.openxmlformats.org/wordprocessingml/2006/main" xmlns:w14="http://schemas.microsoft.com/office/word/2010/wordml" xmlns:wpg="http://schemas.microsoft.com/office/word/2010/wordprocessingGroup" xmlns:wpi="http://schemas.microsoft.com/office/word/2010/wordprocessingInk" xmlns:wne="http://schemas.microsoft.com/office/word/2006/wordml" xmlns:wps="http://schemas.microsoft.com/office/word/2010/wordprocessingShape" mc:Ignorable="w14 wp14">
+  <w:docParts>
+    <w:docPart>
+      <w:docPartPr>
+        <w:name w:val="065141616EC9499AADE007ADABCB4788"/>
+        <w:category>
+          <w:name w:val="General"/>
+          <w:gallery w:val="placeholder"/>
+        </w:category>
+        <w:types>
+          <w:type w:val="bbPlcHdr"/>
+        </w:types>
+        <w:behaviors>
+          <w:behavior w:val="content"/>
+        </w:behaviors>
+        <w:guid w:val="{1D21BE2A-0113-4F6B-BAE2-F9199D91B08A}"/>
+      </w:docPartPr>
+      <w:docPartBody>
+        <w:p>
+          <w:pPr>
+            <w:pStyle w:val="065141616EC9499AADE007ADABCB4788"/>
+          </w:pPr>
+          <w:r>
+            <w:rPr>
+              <w:rFonts w:asciiTheme="majorHAnsi" w:eastAsiaTheme="majorEastAsia" w:hAnsiTheme="majorHAnsi" w:cstheme="majorBidi"/>
+              <w:sz w:val="32"/>
+              <w:szCs w:val="32"/>
+            </w:rPr>
+            <w:t>[Type the document title]</w:t>
+          </w:r>
+        </w:p>
+      </w:docPartBody>
+    </w:docPart>
+  </w:docParts>
+</w:glossaryDocument>
+</file>
+
+<file path=word/glossary/fontTable.xml><?xml version="1.0" encoding="utf-8"?>
+<w:fonts xmlns:mc="http://schemas.openxmlformats.org/markup-compatibility/2006" xmlns:r="http://schemas.openxmlformats.org/officeDocument/2006/relationships" xmlns:w="http://schemas.openxmlformats.org/wordprocessingml/2006/main" xmlns:w14="http://schemas.microsoft.com/office/word/2010/wordml" mc:Ignorable="w14">
+  <w:font w:name="Symbol">
+    <w:panose1 w:val="05050102010706020507"/>
+    <w:charset w:val="02"/>
+    <w:family w:val="roman"/>
+    <w:pitch w:val="variable"/>
+    <w:sig w:usb0="00000000" w:usb1="10000000" w:usb2="00000000" w:usb3="00000000" w:csb0="80000000" w:csb1="00000000"/>
+  </w:font>
+  <w:font w:name="Times New Roman">
+    <w:panose1 w:val="02020603050405020304"/>
+    <w:charset w:val="00"/>
+    <w:family w:val="roman"/>
+    <w:pitch w:val="variable"/>
+    <w:sig w:usb0="E0002EFF" w:usb1="C000785B" w:usb2="00000009" w:usb3="00000000" w:csb0="000001FF" w:csb1="00000000"/>
+  </w:font>
+  <w:font w:name="Courier New">
+    <w:panose1 w:val="02070309020205020404"/>
+    <w:charset w:val="00"/>
+    <w:family w:val="modern"/>
+    <w:pitch w:val="fixed"/>
+    <w:sig w:usb0="20002A87" w:usb1="00000000" w:usb2="00000000" w:usb3="00000000" w:csb0="000001FF" w:csb1="00000000"/>
+  </w:font>
+  <w:font w:name="Wingdings">
+    <w:panose1 w:val="05000000000000000000"/>
+    <w:charset w:val="02"/>
+    <w:family w:val="auto"/>
+    <w:pitch w:val="variable"/>
+    <w:sig w:usb0="00000000" w:usb1="10000000" w:usb2="00000000" w:usb3="00000000" w:csb0="80000000" w:csb1="00000000"/>
+  </w:font>
+  <w:font w:name="Calibri">
+    <w:panose1 w:val="020F0502020204030204"/>
+    <w:charset w:val="00"/>
+    <w:family w:val="swiss"/>
+    <w:pitch w:val="variable"/>
+    <w:sig w:usb0="E4002EFF" w:usb1="C000247B" w:usb2="00000009" w:usb3="00000000" w:csb0="000001FF" w:csb1="00000000"/>
+  </w:font>
+  <w:font w:name="Tahoma">
+    <w:panose1 w:val="020B0604030504040204"/>
+    <w:charset w:val="00"/>
+    <w:family w:val="swiss"/>
+    <w:pitch w:val="variable"/>
+    <w:sig w:usb0="E1002EFF" w:usb1="C000605B" w:usb2="00000029" w:usb3="00000000" w:csb0="000101FF" w:csb1="00000000"/>
+  </w:font>
+  <w:font w:name="Verdana">
+    <w:panose1 w:val="020B0604030504040204"/>
+    <w:charset w:val="00"/>
+    <w:family w:val="swiss"/>
+    <w:pitch w:val="variable"/>
+    <w:sig w:usb0="A00006FF" w:usb1="4000205B" w:usb2="00000010" w:usb3="00000000" w:csb0="0000019F" w:csb1="00000000"/>
+  </w:font>
+  <w:font w:name="Cambria">
+    <w:panose1 w:val="02040503050406030204"/>
+    <w:charset w:val="00"/>
+    <w:family w:val="roman"/>
+    <w:pitch w:val="variable"/>
+    <w:sig w:usb0="E00006FF" w:usb1="420024FF" w:usb2="02000000" w:usb3="00000000" w:csb0="0000019F" w:csb1="00000000"/>
+  </w:font>
+</w:fonts>
+</file>
+
+<file path=word/glossary/settings.xml><?xml version="1.0" encoding="utf-8"?>
+<w:settings xmlns:mc="http://schemas.openxmlformats.org/markup-compatibility/2006" xmlns:o="urn:schemas-microsoft-com:office:office" xmlns:r="http://schemas.openxmlformats.org/officeDocument/2006/relationships" xmlns:m="http://schemas.openxmlformats.org/officeDocument/2006/math" xmlns:v="urn:schemas-microsoft-com:vml" xmlns:w10="urn:schemas-microsoft-com:office:word" xmlns:w="http://schemas.openxmlformats.org/wordprocessingml/2006/main" xmlns:w14="http://schemas.microsoft.com/office/word/2010/wordml" xmlns:sl="http://schemas.openxmlformats.org/schemaLibrary/2006/main" mc:Ignorable="w14">
+  <w:view w:val="normal"/>
+  <w:defaultTabStop w:val="720"/>
+  <w:characterSpacingControl w:val="doNotCompress"/>
+  <w:compat>
+    <w:useFELayout/>
+    <w:compatSetting w:name="compatibilityMode" w:uri="http://schemas.microsoft.com/office/word" w:val="14"/>
+    <w:compatSetting w:name="overrideTableStyleFontSizeAndJustification" w:uri="http://schemas.microsoft.com/office/word" w:val="1"/>
+    <w:compatSetting w:name="enableOpenTypeFeatures" w:uri="http://schemas.microsoft.com/office/word" w:val="1"/>
+    <w:compatSetting w:name="doNotFlipMirrorIndents" w:uri="http://schemas.microsoft.com/office/word" w:val="1"/>
+  </w:compat>
+  <w:rsids>
+    <w:rsidRoot w:val="00F072F0"/>
+    <w:rsid w:val="00746BEB"/>
+    <w:rsid w:val="00F072F0"/>
+  </w:rsids>
+  <m:mathPr>
+    <m:mathFont m:val="Cambria Math"/>
+    <m:brkBin m:val="before"/>
+    <m:brkBinSub m:val="--"/>
+    <m:smallFrac m:val="0"/>
+    <m:dispDef/>
+    <m:lMargin m:val="0"/>
+    <m:rMargin m:val="0"/>
+    <m:defJc m:val="centerGroup"/>
+    <m:wrapIndent m:val="1440"/>
+    <m:intLim m:val="subSup"/>
+    <m:naryLim m:val="undOvr"/>
+  </m:mathPr>
+  <w:themeFontLang w:val="en-US"/>
+  <w:clrSchemeMapping w:bg1="light1" w:t1="dark1" w:bg2="light2" w:t2="dark2" w:accent1="accent1" w:accent2="accent2" w:accent3="accent3" w:accent4="accent4" w:accent5="accent5" w:accent6="accent6" w:hyperlink="hyperlink" w:followedHyperlink="followedHyperlink"/>
+  <w:decimalSymbol w:val="."/>
+  <w:listSeparator w:val=","/>
+</w:settings>
+</file>
+
+<file path=word/glossary/styles.xml><?xml version="1.0" encoding="utf-8"?>
+<w:styles xmlns:mc="http://schemas.openxmlformats.org/markup-compatibility/2006" xmlns:r="http://schemas.openxmlformats.org/officeDocument/2006/relationships" xmlns:w="http://schemas.openxmlformats.org/wordprocessingml/2006/main" xmlns:w14="http://schemas.microsoft.com/office/word/2010/wordml" mc:Ignorable="w14">
+  <w:docDefaults>
+    <w:rPrDefault>
+      <w:rPr>
+        <w:rFonts w:asciiTheme="minorHAnsi" w:eastAsiaTheme="minorEastAsia" w:hAnsiTheme="minorHAnsi" w:cstheme="minorBidi"/>
+        <w:sz w:val="22"/>
+        <w:szCs w:val="22"/>
+        <w:lang w:val="en-US" w:eastAsia="en-US" w:bidi="ar-SA"/>
+      </w:rPr>
+    </w:rPrDefault>
+    <w:pPrDefault>
+      <w:pPr>
+        <w:spacing w:after="200" w:line="276" w:lineRule="auto"/>
+      </w:pPr>
+    </w:pPrDefault>
+  </w:docDefaults>
+  <w:latentStyles w:defLockedState="0" w:defUIPriority="99" w:defSemiHidden="1" w:defUnhideWhenUsed="1" w:defQFormat="0" w:count="267">
+    <w:lsdException w:name="Normal" w:semiHidden="0" w:uiPriority="0" w:unhideWhenUsed="0" w:qFormat="1"/>
+    <w:lsdException w:name="heading 1" w:semiHidden="0" w:uiPriority="9" w:unhideWhenUsed="0" w:qFormat="1"/>
+    <w:lsdException w:name="heading 2" w:uiPriority="9" w:qFormat="1"/>
+    <w:lsdException w:name="heading 3" w:uiPriority="9" w:qFormat="1"/>
+    <w:lsdException w:name="heading 4" w:uiPriority="9" w:qFormat="1"/>
+    <w:lsdException w:name="heading 5" w:uiPriority="9" w:qFormat="1"/>
+    <w:lsdException w:name="heading 6" w:uiPriority="9" w:qFormat="1"/>
+    <w:lsdException w:name="heading 7" w:uiPriority="9" w:qFormat="1"/>
+    <w:lsdException w:name="heading 8" w:uiPriority="9" w:qFormat="1"/>
+    <w:lsdException w:name="heading 9" w:uiPriority="9" w:qFormat="1"/>
+    <w:lsdException w:name="toc 1" w:uiPriority="39"/>
+    <w:lsdException w:name="toc 2" w:uiPriority="39"/>
+    <w:lsdException w:name="toc 3" w:uiPriority="39"/>
+    <w:lsdException w:name="toc 4" w:uiPriority="39"/>
+    <w:lsdException w:name="toc 5" w:uiPriority="39"/>
+    <w:lsdException w:name="toc 6" w:uiPriority="39"/>
+    <w:lsdException w:name="toc 7" w:uiPriority="39"/>
+    <w:lsdException w:name="toc 8" w:uiPriority="39"/>
+    <w:lsdException w:name="toc 9" w:uiPriority="39"/>
+    <w:lsdException w:name="caption" w:uiPriority="35" w:qFormat="1"/>
+    <w:lsdException w:name="Title" w:semiHidden="0" w:uiPriority="10" w:unhideWhenUsed="0" w:qFormat="1"/>
+    <w:lsdException w:name="Default Paragraph Font" w:uiPriority="1"/>
+    <w:lsdException w:name="Subtitle" w:semiHidden="0" w:uiPriority="11" w:unhideWhenUsed="0" w:qFormat="1"/>
+    <w:lsdException w:name="Strong" w:semiHidden="0" w:uiPriority="22" w:unhideWhenUsed="0" w:qFormat="1"/>
+    <w:lsdException w:name="Emphasis" w:semiHidden="0" w:uiPriority="20" w:unhideWhenUsed="0" w:qFormat="1"/>
+    <w:lsdException w:name="Table Grid" w:semiHidden="0" w:uiPriority="59" w:unhideWhenUsed="0"/>
+    <w:lsdException w:name="Placeholder Text" w:unhideWhenUsed="0"/>
+    <w:lsdException w:name="No Spacing" w:semiHidden="0" w:uiPriority="1" w:unhideWhenUsed="0" w:qFormat="1"/>
+    <w:lsdException w:name="Light Shading" w:semiHidden="0" w:uiPriority="60" w:unhideWhenUsed="0"/>
+    <w:lsdException w:name="Light List" w:semiHidden="0" w:uiPriority="61" w:unhideWhenUsed="0"/>
+    <w:lsdException w:name="Light Grid" w:semiHidden="0" w:uiPriority="62" w:unhideWhenUsed="0"/>
+    <w:lsdException w:name="Medium Shading 1" w:semiHidden="0" w:uiPriority="63" w:unhideWhenUsed="0"/>
+    <w:lsdException w:name="Medium Shading 2" w:semiHidden="0" w:uiPriority="64" w:unhideWhenUsed="0"/>
+    <w:lsdException w:name="Medium List 1" w:semiHidden="0" w:uiPriority="65" w:unhideWhenUsed="0"/>
+    <w:lsdException w:name="Medium List 2" w:semiHidden="0" w:uiPriority="66" w:unhideWhenUsed="0"/>
+    <w:lsdException w:name="Medium Grid 1" w:semiHidden="0" w:uiPriority="67" w:unhideWhenUsed="0"/>
+    <w:lsdException w:name="Medium Grid 2" w:semiHidden="0" w:uiPriority="68" w:unhideWhenUsed="0"/>
+    <w:lsdException w:name="Medium Grid 3" w:semiHidden="0" w:uiPriority="69" w:unhideWhenUsed="0"/>
+    <w:lsdException w:name="Dark List" w:semiHidden="0" w:uiPriority="70" w:unhideWhenUsed="0"/>
+    <w:lsdException w:name="Colorful Shading" w:semiHidden="0" w:uiPriority="71" w:unhideWhenUsed="0"/>
+    <w:lsdException w:name="Colorful List" w:semiHidden="0" w:uiPriority="72" w:unhideWhenUsed="0"/>
+    <w:lsdException w:name="Colorful Grid" w:semiHidden="0" w:uiPriority="73" w:unhideWhenUsed="0"/>
+    <w:lsdException w:name="Light Shading Accent 1" w:semiHidden="0" w:uiPriority="60" w:unhideWhenUsed="0"/>
+    <w:lsdException w:name="Light List Accent 1" w:semiHidden="0" w:uiPriority="61" w:unhideWhenUsed="0"/>
+    <w:lsdException w:name="Light Grid Accent 1" w:semiHidden="0" w:uiPriority="62" w:unhideWhenUsed="0"/>
+    <w:lsdException w:name="Medium Shading 1 Accent 1" w:semiHidden="0" w:uiPriority="63" w:unhideWhenUsed="0"/>
+    <w:lsdException w:name="Medium Shading 2 Accent 1" w:semiHidden="0" w:uiPriority="64" w:unhideWhenUsed="0"/>
+    <w:lsdException w:name="Medium List 1 Accent 1" w:semiHidden="0" w:uiPriority="65" w:unhideWhenUsed="0"/>
+    <w:lsdException w:name="Revision" w:unhideWhenUsed="0"/>
+    <w:lsdException w:name="List Paragraph" w:semiHidden="0" w:uiPriority="34" w:unhideWhenUsed="0" w:qFormat="1"/>
+    <w:lsdException w:name="Quote" w:semiHidden="0" w:uiPriority="29" w:unhideWhenUsed="0" w:qFormat="1"/>
+    <w:lsdException w:name="Intense Quote" w:semiHidden="0" w:uiPriority="30" w:unhideWhenUsed="0" w:qFormat="1"/>
+    <w:lsdException w:name="Medium List 2 Accent 1" w:semiHidden="0" w:uiPriority="66" w:unhideWhenUsed="0"/>
+    <w:lsdException w:name="Medium Grid 1 Accent 1" w:semiHidden="0" w:uiPriority="67" w:unhideWhenUsed="0"/>
+    <w:lsdException w:name="Medium Grid 2 Accent 1" w:semiHidden="0" w:uiPriority="68" w:unhideWhenUsed="0"/>
+    <w:lsdException w:name="Medium Grid 3 Accent 1" w:semiHidden="0" w:uiPriority="69" w:unhideWhenUsed="0"/>
+    <w:lsdException w:name="Dark List Accent 1" w:semiHidden="0" w:uiPriority="70" w:unhideWhenUsed="0"/>
+    <w:lsdException w:name="Colorful Shading Accent 1" w:semiHidden="0" w:uiPriority="71" w:unhideWhenUsed="0"/>
+    <w:lsdException w:name="Colorful List Accent 1" w:semiHidden="0" w:uiPriority="72" w:unhideWhenUsed="0"/>
+    <w:lsdException w:name="Colorful Grid Accent 1" w:semiHidden="0" w:uiPriority="73" w:unhideWhenUsed="0"/>
+    <w:lsdException w:name="Light Shading Accent 2" w:semiHidden="0" w:uiPriority="60" w:unhideWhenUsed="0"/>
+    <w:lsdException w:name="Light List Accent 2" w:semiHidden="0" w:uiPriority="61" w:unhideWhenUsed="0"/>
+    <w:lsdException w:name="Light Grid Accent 2" w:semiHidden="0" w:uiPriority="62" w:unhideWhenUsed="0"/>
+    <w:lsdException w:name="Medium Shading 1 Accent 2" w:semiHidden="0" w:uiPriority="63" w:unhideWhenUsed="0"/>
+    <w:lsdException w:name="Medium Shading 2 Accent 2" w:semiHidden="0" w:uiPriority="64" w:unhideWhenUsed="0"/>
+    <w:lsdException w:name="Medium List 1 Accent 2" w:semiHidden="0" w:uiPriority="65" w:unhideWhenUsed="0"/>
+    <w:lsdException w:name="Medium List 2 Accent 2" w:semiHidden="0" w:uiPriority="66" w:unhideWhenUsed="0"/>
+    <w:lsdException w:name="Medium Grid 1 Accent 2" w:semiHidden="0" w:uiPriority="67" w:unhideWhenUsed="0"/>
+    <w:lsdException w:name="Medium Grid 2 Accent 2" w:semiHidden="0" w:uiPriority="68" w:unhideWhenUsed="0"/>
+    <w:lsdException w:name="Medium Grid 3 Accent 2" w:semiHidden="0" w:uiPriority="69" w:unhideWhenUsed="0"/>
+    <w:lsdException w:name="Dark List Accent 2" w:semiHidden="0" w:uiPriority="70" w:unhideWhenUsed="0"/>
+    <w:lsdException w:name="Colorful Shading Accent 2" w:semiHidden="0" w:uiPriority="71" w:unhideWhenUsed="0"/>
+    <w:lsdException w:name="Colorful List Accent 2" w:semiHidden="0" w:uiPriority="72" w:unhideWhenUsed="0"/>
+    <w:lsdException w:name="Colorful Grid Accent 2" w:semiHidden="0" w:uiPriority="73" w:unhideWhenUsed="0"/>
+    <w:lsdException w:name="Light Shading Accent 3" w:semiHidden="0" w:uiPriority="60" w:unhideWhenUsed="0"/>
+    <w:lsdException w:name="Light List Accent 3" w:semiHidden="0" w:uiPriority="61" w:unhideWhenUsed="0"/>
+    <w:lsdException w:name="Light Grid Accent 3" w:semiHidden="0" w:uiPriority="62" w:unhideWhenUsed="0"/>
+    <w:lsdException w:name="Medium Shading 1 Accent 3" w:semiHidden="0" w:uiPriority="63" w:unhideWhenUsed="0"/>
+    <w:lsdException w:name="Medium Shading 2 Accent 3" w:semiHidden="0" w:uiPriority="64" w:unhideWhenUsed="0"/>
+    <w:lsdException w:name="Medium List 1 Accent 3" w:semiHidden="0" w:uiPriority="65" w:unhideWhenUsed="0"/>
+    <w:lsdException w:name="Medium List 2 Accent 3" w:semiHidden="0" w:uiPriority="66" w:unhideWhenUsed="0"/>
+    <w:lsdException w:name="Medium Grid 1 Accent 3" w:semiHidden="0" w:uiPriority="67" w:unhideWhenUsed="0"/>
+    <w:lsdException w:name="Medium Grid 2 Accent 3" w:semiHidden="0" w:uiPriority="68" w:unhideWhenUsed="0"/>
+    <w:lsdException w:name="Medium Grid 3 Accent 3" w:semiHidden="0" w:uiPriority="69" w:unhideWhenUsed="0"/>
+    <w:lsdException w:name="Dark List Accent 3" w:semiHidden="0" w:uiPriority="70" w:unhideWhenUsed="0"/>
+    <w:lsdException w:name="Colorful Shading Accent 3" w:semiHidden="0" w:uiPriority="71" w:unhideWhenUsed="0"/>
+    <w:lsdException w:name="Colorful List Accent 3" w:semiHidden="0" w:uiPriority="72" w:unhideWhenUsed="0"/>
+    <w:lsdException w:name="Colorful Grid Accent 3" w:semiHidden="0" w:uiPriority="73" w:unhideWhenUsed="0"/>
+    <w:lsdException w:name="Light Shading Accent 4" w:semiHidden="0" w:uiPriority="60" w:unhideWhenUsed="0"/>
+    <w:lsdException w:name="Light List Accent 4" w:semiHidden="0" w:uiPriority="61" w:unhideWhenUsed="0"/>
+    <w:lsdException w:name="Light Grid Accent 4" w:semiHidden="0" w:uiPriority="62" w:unhideWhenUsed="0"/>
+    <w:lsdException w:name="Medium Shading 1 Accent 4" w:semiHidden="0" w:uiPriority="63" w:unhideWhenUsed="0"/>
+    <w:lsdException w:name="Medium Shading 2 Accent 4" w:semiHidden="0" w:uiPriority="64" w:unhideWhenUsed="0"/>
+    <w:lsdException w:name="Medium List 1 Accent 4" w:semiHidden="0" w:uiPriority="65" w:unhideWhenUsed="0"/>
+    <w:lsdException w:name="Medium List 2 Accent 4" w:semiHidden="0" w:uiPriority="66" w:unhideWhenUsed="0"/>
+    <w:lsdException w:name="Medium Grid 1 Accent 4" w:semiHidden="0" w:uiPriority="67" w:unhideWhenUsed="0"/>
+    <w:lsdException w:name="Medium Grid 2 Accent 4" w:semiHidden="0" w:uiPriority="68" w:unhideWhenUsed="0"/>
+    <w:lsdException w:name="Medium Grid 3 Accent 4" w:semiHidden="0" w:uiPriority="69" w:unhideWhenUsed="0"/>
+    <w:lsdException w:name="Dark List Accent 4" w:semiHidden="0" w:uiPriority="70" w:unhideWhenUsed="0"/>
+    <w:lsdException w:name="Colorful Shading Accent 4" w:semiHidden="0" w:uiPriority="71" w:unhideWhenUsed="0"/>
+    <w:lsdException w:name="Colorful List Accent 4" w:semiHidden="0" w:uiPriority="72" w:unhideWhenUsed="0"/>
+    <w:lsdException w:name="Colorful Grid Accent 4" w:semiHidden="0" w:uiPriority="73" w:unhideWhenUsed="0"/>
+    <w:lsdException w:name="Light Shading Accent 5" w:semiHidden="0" w:uiPriority="60" w:unhideWhenUsed="0"/>
+    <w:lsdException w:name="Light List Accent 5" w:semiHidden="0" w:uiPriority="61" w:unhideWhenUsed="0"/>
+    <w:lsdException w:name="Light Grid Accent 5" w:semiHidden="0" w:uiPriority="62" w:unhideWhenUsed="0"/>
+    <w:lsdException w:name="Medium Shading 1 Accent 5" w:semiHidden="0" w:uiPriority="63" w:unhideWhenUsed="0"/>
+    <w:lsdException w:name="Medium Shading 2 Accent 5" w:semiHidden="0" w:uiPriority="64" w:unhideWhenUsed="0"/>
+    <w:lsdException w:name="Medium List 1 Accent 5" w:semiHidden="0" w:uiPriority="65" w:unhideWhenUsed="0"/>
+    <w:lsdException w:name="Medium List 2 Accent 5" w:semiHidden="0" w:uiPriority="66" w:unhideWhenUsed="0"/>
+    <w:lsdException w:name="Medium Grid 1 Accent 5" w:semiHidden="0" w:uiPriority="67" w:unhideWhenUsed="0"/>
+    <w:lsdException w:name="Medium Grid 2 Accent 5" w:semiHidden="0" w:uiPriority="68" w:unhideWhenUsed="0"/>
+    <w:lsdException w:name="Medium Grid 3 Accent 5" w:semiHidden="0" w:uiPriority="69" w:unhideWhenUsed="0"/>
+    <w:lsdException w:name="Dark List Accent 5" w:semiHidden="0" w:uiPriority="70" w:unhideWhenUsed="0"/>
+    <w:lsdException w:name="Colorful Shading Accent 5" w:semiHidden="0" w:uiPriority="71" w:unhideWhenUsed="0"/>
+    <w:lsdException w:name="Colorful List Accent 5" w:semiHidden="0" w:uiPriority="72" w:unhideWhenUsed="0"/>
+    <w:lsdException w:name="Colorful Grid Accent 5" w:semiHidden="0" w:uiPriority="73" w:unhideWhenUsed="0"/>
+    <w:lsdException w:name="Light Shading Accent 6" w:semiHidden="0" w:uiPriority="60" w:unhideWhenUsed="0"/>
+    <w:lsdException w:name="Light List Accent 6" w:semiHidden="0" w:uiPriority="61" w:unhideWhenUsed="0"/>
+    <w:lsdException w:name="Light Grid Accent 6" w:semiHidden="0" w:uiPriority="62" w:unhideWhenUsed="0"/>
+    <w:lsdException w:name="Medium Shading 1 Accent 6" w:semiHidden="0" w:uiPriority="63" w:unhideWhenUsed="0"/>
+    <w:lsdException w:name="Medium Shading 2 Accent 6" w:semiHidden="0" w:uiPriority="64" w:unhideWhenUsed="0"/>
+    <w:lsdException w:name="Medium List 1 Accent 6" w:semiHidden="0" w:uiPriority="65" w:unhideWhenUsed="0"/>
+    <w:lsdException w:name="Medium List 2 Accent 6" w:semiHidden="0" w:uiPriority="66" w:unhideWhenUsed="0"/>
+    <w:lsdException w:name="Medium Grid 1 Accent 6" w:semiHidden="0" w:uiPriority="67" w:unhideWhenUsed="0"/>
+    <w:lsdException w:name="Medium Grid 2 Accent 6" w:semiHidden="0" w:uiPriority="68" w:unhideWhenUsed="0"/>
+    <w:lsdException w:name="Medium Grid 3 Accent 6" w:semiHidden="0" w:uiPriority="69" w:unhideWhenUsed="0"/>
+    <w:lsdException w:name="Dark List Accent 6" w:semiHidden="0" w:uiPriority="70" w:unhideWhenUsed="0"/>
+    <w:lsdException w:name="Colorful Shading Accent 6" w:semiHidden="0" w:uiPriority="71" w:unhideWhenUsed="0"/>
+    <w:lsdException w:name="Colorful List Accent 6" w:semiHidden="0" w:uiPriority="72" w:unhideWhenUsed="0"/>
+    <w:lsdException w:name="Colorful Grid Accent 6" w:semiHidden="0" w:uiPriority="73" w:unhideWhenUsed="0"/>
+    <w:lsdException w:name="Subtle Emphasis" w:semiHidden="0" w:uiPriority="19" w:unhideWhenUsed="0" w:qFormat="1"/>
+    <w:lsdException w:name="Intense Emphasis" w:semiHidden="0" w:uiPriority="21" w:unhideWhenUsed="0" w:qFormat="1"/>
+    <w:lsdException w:name="Subtle Reference" w:semiHidden="0" w:uiPriority="31" w:unhideWhenUsed="0" w:qFormat="1"/>
+    <w:lsdException w:name="Intense Reference" w:semiHidden="0" w:uiPriority="32" w:unhideWhenUsed="0" w:qFormat="1"/>
+    <w:lsdException w:name="Book Title" w:semiHidden="0" w:uiPriority="33" w:unhideWhenUsed="0" w:qFormat="1"/>
+    <w:lsdException w:name="Bibliography" w:uiPriority="37"/>
+    <w:lsdException w:name="TOC Heading" w:uiPriority="39" w:qFormat="1"/>
+  </w:latentStyles>
+  <w:style w:type="paragraph" w:default="1" w:styleId="Normal">
+    <w:name w:val="Normal"/>
+    <w:qFormat/>
+  </w:style>
+  <w:style w:type="character" w:default="1" w:styleId="DefaultParagraphFont">
+    <w:name w:val="Default Paragraph Font"/>
+    <w:uiPriority w:val="1"/>
+    <w:semiHidden/>
+    <w:unhideWhenUsed/>
+  </w:style>
+  <w:style w:type="table" w:default="1" w:styleId="TableNormal">
+    <w:name w:val="Normal Table"/>
+    <w:uiPriority w:val="99"/>
+    <w:semiHidden/>
+    <w:unhideWhenUsed/>
+    <w:tblPr>
+      <w:tblInd w:w="0" w:type="dxa"/>
+      <w:tblCellMar>
+        <w:top w:w="0" w:type="dxa"/>
+        <w:left w:w="108" w:type="dxa"/>
+        <w:bottom w:w="0" w:type="dxa"/>
+        <w:right w:w="108" w:type="dxa"/>
+      </w:tblCellMar>
+    </w:tblPr>
+  </w:style>
+  <w:style w:type="numbering" w:default="1" w:styleId="NoList">
+    <w:name w:val="No List"/>
+    <w:uiPriority w:val="99"/>
+    <w:semiHidden/>
+    <w:unhideWhenUsed/>
+  </w:style>
+  <w:style w:type="paragraph" w:customStyle="1" w:styleId="065141616EC9499AADE007ADABCB4788">
+    <w:name w:val="065141616EC9499AADE007ADABCB4788"/>
+    <w:rsid w:val="00F072F0"/>
+  </w:style>
+</w:styles>
+</file>
+
+<file path=word/glossary/stylesWithEffects.xml><?xml version="1.0" encoding="utf-8"?>
+<w:styles xmlns:wpc="http://schemas.microsoft.com/office/word/2010/wordprocessingCanvas" xmlns:mc="http://schemas.openxmlformats.org/markup-compatibility/2006" xmlns:o="urn:schemas-microsoft-com:office:office" xmlns:r="http://schemas.openxmlformats.org/officeDocument/2006/relationships" xmlns:m="http://schemas.openxmlformats.org/officeDocument/2006/math" xmlns:v="urn:schemas-microsoft-com:vml" xmlns:wp14="http://schemas.microsoft.com/office/word/2010/wordprocessingDrawing" xmlns:wp="http://schemas.openxmlformats.org/drawingml/2006/wordprocessingDrawing" xmlns:w10="urn:schemas-microsoft-com:office:word" xmlns:w="http://schemas.openxmlformats.org/wordprocessingml/2006/main" xmlns:w14="http://schemas.microsoft.com/office/word/2010/wordml" xmlns:wpg="http://schemas.microsoft.com/office/word/2010/wordprocessingGroup" xmlns:wpi="http://schemas.microsoft.com/office/word/2010/wordprocessingInk" xmlns:wne="http://schemas.microsoft.com/office/word/2006/wordml" xmlns:wps="http://schemas.microsoft.com/office/word/2010/wordprocessingShape" mc:Ignorable="w14 wp14">
+  <w:docDefaults>
+    <w:rPrDefault>
+      <w:rPr>
+        <w:rFonts w:asciiTheme="minorHAnsi" w:eastAsiaTheme="minorEastAsia" w:hAnsiTheme="minorHAnsi" w:cstheme="minorBidi"/>
+        <w:sz w:val="22"/>
+        <w:szCs w:val="22"/>
+        <w:lang w:val="en-US" w:eastAsia="en-US" w:bidi="ar-SA"/>
+      </w:rPr>
+    </w:rPrDefault>
+    <w:pPrDefault>
+      <w:pPr>
+        <w:spacing w:after="200" w:line="276" w:lineRule="auto"/>
+      </w:pPr>
+    </w:pPrDefault>
+  </w:docDefaults>
+  <w:latentStyles w:defLockedState="0" w:defUIPriority="99" w:defSemiHidden="1" w:defUnhideWhenUsed="1" w:defQFormat="0" w:count="267">
+    <w:lsdException w:name="Normal" w:semiHidden="0" w:uiPriority="0" w:unhideWhenUsed="0" w:qFormat="1"/>
+    <w:lsdException w:name="heading 1" w:semiHidden="0" w:uiPriority="9" w:unhideWhenUsed="0" w:qFormat="1"/>
+    <w:lsdException w:name="heading 2" w:uiPriority="9" w:qFormat="1"/>
+    <w:lsdException w:name="heading 3" w:uiPriority="9" w:qFormat="1"/>
+    <w:lsdException w:name="heading 4" w:uiPriority="9" w:qFormat="1"/>
+    <w:lsdException w:name="heading 5" w:uiPriority="9" w:qFormat="1"/>
+    <w:lsdException w:name="heading 6" w:uiPriority="9" w:qFormat="1"/>
+    <w:lsdException w:name="heading 7" w:uiPriority="9" w:qFormat="1"/>
+    <w:lsdException w:name="heading 8" w:uiPriority="9" w:qFormat="1"/>
+    <w:lsdException w:name="heading 9" w:uiPriority="9" w:qFormat="1"/>
+    <w:lsdException w:name="toc 1" w:uiPriority="39"/>
+    <w:lsdException w:name="toc 2" w:uiPriority="39"/>
+    <w:lsdException w:name="toc 3" w:uiPriority="39"/>
+    <w:lsdException w:name="toc 4" w:uiPriority="39"/>
+    <w:lsdException w:name="toc 5" w:uiPriority="39"/>
+    <w:lsdException w:name="toc 6" w:uiPriority="39"/>
+    <w:lsdException w:name="toc 7" w:uiPriority="39"/>
+    <w:lsdException w:name="toc 8" w:uiPriority="39"/>
+    <w:lsdException w:name="toc 9" w:uiPriority="39"/>
+    <w:lsdException w:name="caption" w:uiPriority="35" w:qFormat="1"/>
+    <w:lsdException w:name="Title" w:semiHidden="0" w:uiPriority="10" w:unhideWhenUsed="0" w:qFormat="1"/>
+    <w:lsdException w:name="Default Paragraph Font" w:uiPriority="1"/>
+    <w:lsdException w:name="Subtitle" w:semiHidden="0" w:uiPriority="11" w:unhideWhenUsed="0" w:qFormat="1"/>
+    <w:lsdException w:name="Strong" w:semiHidden="0" w:uiPriority="22" w:unhideWhenUsed="0" w:qFormat="1"/>
+    <w:lsdException w:name="Emphasis" w:semiHidden="0" w:uiPriority="20" w:unhideWhenUsed="0" w:qFormat="1"/>
+    <w:lsdException w:name="Table Grid" w:semiHidden="0" w:uiPriority="59" w:unhideWhenUsed="0"/>
+    <w:lsdException w:name="Placeholder Text" w:unhideWhenUsed="0"/>
+    <w:lsdException w:name="No Spacing" w:semiHidden="0" w:uiPriority="1" w:unhideWhenUsed="0" w:qFormat="1"/>
+    <w:lsdException w:name="Light Shading" w:semiHidden="0" w:uiPriority="60" w:unhideWhenUsed="0"/>
+    <w:lsdException w:name="Light List" w:semiHidden="0" w:uiPriority="61" w:unhideWhenUsed="0"/>
+    <w:lsdException w:name="Light Grid" w:semiHidden="0" w:uiPriority="62" w:unhideWhenUsed="0"/>
+    <w:lsdException w:name="Medium Shading 1" w:semiHidden="0" w:uiPriority="63" w:unhideWhenUsed="0"/>
+    <w:lsdException w:name="Medium Shading 2" w:semiHidden="0" w:uiPriority="64" w:unhideWhenUsed="0"/>
+    <w:lsdException w:name="Medium List 1" w:semiHidden="0" w:uiPriority="65" w:unhideWhenUsed="0"/>
+    <w:lsdException w:name="Medium List 2" w:semiHidden="0" w:uiPriority="66" w:unhideWhenUsed="0"/>
+    <w:lsdException w:name="Medium Grid 1" w:semiHidden="0" w:uiPriority="67" w:unhideWhenUsed="0"/>
+    <w:lsdException w:name="Medium Grid 2" w:semiHidden="0" w:uiPriority="68" w:unhideWhenUsed="0"/>
+    <w:lsdException w:name="Medium Grid 3" w:semiHidden="0" w:uiPriority="69" w:unhideWhenUsed="0"/>
+    <w:lsdException w:name="Dark List" w:semiHidden="0" w:uiPriority="70" w:unhideWhenUsed="0"/>
+    <w:lsdException w:name="Colorful Shading" w:semiHidden="0" w:uiPriority="71" w:unhideWhenUsed="0"/>
+    <w:lsdException w:name="Colorful List" w:semiHidden="0" w:uiPriority="72" w:unhideWhenUsed="0"/>
+    <w:lsdException w:name="Colorful Grid" w:semiHidden="0" w:uiPriority="73" w:unhideWhenUsed="0"/>
+    <w:lsdException w:name="Light Shading Accent 1" w:semiHidden="0" w:uiPriority="60" w:unhideWhenUsed="0"/>
+    <w:lsdException w:name="Light List Accent 1" w:semiHidden="0" w:uiPriority="61" w:unhideWhenUsed="0"/>
+    <w:lsdException w:name="Light Grid Accent 1" w:semiHidden="0" w:uiPriority="62" w:unhideWhenUsed="0"/>
+    <w:lsdException w:name="Medium Shading 1 Accent 1" w:semiHidden="0" w:uiPriority="63" w:unhideWhenUsed="0"/>
+    <w:lsdException w:name="Medium Shading 2 Accent 1" w:semiHidden="0" w:uiPriority="64" w:unhideWhenUsed="0"/>
+    <w:lsdException w:name="Medium List 1 Accent 1" w:semiHidden="0" w:uiPriority="65" w:unhideWhenUsed="0"/>
+    <w:lsdException w:name="Revision" w:unhideWhenUsed="0"/>
+    <w:lsdException w:name="List Paragraph" w:semiHidden="0" w:uiPriority="34" w:unhideWhenUsed="0" w:qFormat="1"/>
+    <w:lsdException w:name="Quote" w:semiHidden="0" w:uiPriority="29" w:unhideWhenUsed="0" w:qFormat="1"/>
+    <w:lsdException w:name="Intense Quote" w:semiHidden="0" w:uiPriority="30" w:unhideWhenUsed="0" w:qFormat="1"/>
+    <w:lsdException w:name="Medium List 2 Accent 1" w:semiHidden="0" w:uiPriority="66" w:unhideWhenUsed="0"/>
+    <w:lsdException w:name="Medium Grid 1 Accent 1" w:semiHidden="0" w:uiPriority="67" w:unhideWhenUsed="0"/>
+    <w:lsdException w:name="Medium Grid 2 Accent 1" w:semiHidden="0" w:uiPriority="68" w:unhideWhenUsed="0"/>
+    <w:lsdException w:name="Medium Grid 3 Accent 1" w:semiHidden="0" w:uiPriority="69" w:unhideWhenUsed="0"/>
+    <w:lsdException w:name="Dark List Accent 1" w:semiHidden="0" w:uiPriority="70" w:unhideWhenUsed="0"/>
+    <w:lsdException w:name="Colorful Shading Accent 1" w:semiHidden="0" w:uiPriority="71" w:unhideWhenUsed="0"/>
+    <w:lsdException w:name="Colorful List Accent 1" w:semiHidden="0" w:uiPriority="72" w:unhideWhenUsed="0"/>
+    <w:lsdException w:name="Colorful Grid Accent 1" w:semiHidden="0" w:uiPriority="73" w:unhideWhenUsed="0"/>
+    <w:lsdException w:name="Light Shading Accent 2" w:semiHidden="0" w:uiPriority="60" w:unhideWhenUsed="0"/>
+    <w:lsdException w:name="Light List Accent 2" w:semiHidden="0" w:uiPriority="61" w:unhideWhenUsed="0"/>
+    <w:lsdException w:name="Light Grid Accent 2" w:semiHidden="0" w:uiPriority="62" w:unhideWhenUsed="0"/>
+    <w:lsdException w:name="Medium Shading 1 Accent 2" w:semiHidden="0" w:uiPriority="63" w:unhideWhenUsed="0"/>
+    <w:lsdException w:name="Medium Shading 2 Accent 2" w:semiHidden="0" w:uiPriority="64" w:unhideWhenUsed="0"/>
+    <w:lsdException w:name="Medium List 1 Accent 2" w:semiHidden="0" w:uiPriority="65" w:unhideWhenUsed="0"/>
+    <w:lsdException w:name="Medium List 2 Accent 2" w:semiHidden="0" w:uiPriority="66" w:unhideWhenUsed="0"/>
+    <w:lsdException w:name="Medium Grid 1 Accent 2" w:semiHidden="0" w:uiPriority="67" w:unhideWhenUsed="0"/>
+    <w:lsdException w:name="Medium Grid 2 Accent 2" w:semiHidden="0" w:uiPriority="68" w:unhideWhenUsed="0"/>
+    <w:lsdException w:name="Medium Grid 3 Accent 2" w:semiHidden="0" w:uiPriority="69" w:unhideWhenUsed="0"/>
+    <w:lsdException w:name="Dark List Accent 2" w:semiHidden="0" w:uiPriority="70" w:unhideWhenUsed="0"/>
+    <w:lsdException w:name="Colorful Shading Accent 2" w:semiHidden="0" w:uiPriority="71" w:unhideWhenUsed="0"/>
+    <w:lsdException w:name="Colorful List Accent 2" w:semiHidden="0" w:uiPriority="72" w:unhideWhenUsed="0"/>
+    <w:lsdException w:name="Colorful Grid Accent 2" w:semiHidden="0" w:uiPriority="73" w:unhideWhenUsed="0"/>
+    <w:lsdException w:name="Light Shading Accent 3" w:semiHidden="0" w:uiPriority="60" w:unhideWhenUsed="0"/>
+    <w:lsdException w:name="Light List Accent 3" w:semiHidden="0" w:uiPriority="61" w:unhideWhenUsed="0"/>
+    <w:lsdException w:name="Light Grid Accent 3" w:semiHidden="0" w:uiPriority="62" w:unhideWhenUsed="0"/>
+    <w:lsdException w:name="Medium Shading 1 Accent 3" w:semiHidden="0" w:uiPriority="63" w:unhideWhenUsed="0"/>
+    <w:lsdException w:name="Medium Shading 2 Accent 3" w:semiHidden="0" w:uiPriority="64" w:unhideWhenUsed="0"/>
+    <w:lsdException w:name="Medium List 1 Accent 3" w:semiHidden="0" w:uiPriority="65" w:unhideWhenUsed="0"/>
+    <w:lsdException w:name="Medium List 2 Accent 3" w:semiHidden="0" w:uiPriority="66" w:unhideWhenUsed="0"/>
+    <w:lsdException w:name="Medium Grid 1 Accent 3" w:semiHidden="0" w:uiPriority="67" w:unhideWhenUsed="0"/>
+    <w:lsdException w:name="Medium Grid 2 Accent 3" w:semiHidden="0" w:uiPriority="68" w:unhideWhenUsed="0"/>
+    <w:lsdException w:name="Medium Grid 3 Accent 3" w:semiHidden="0" w:uiPriority="69" w:unhideWhenUsed="0"/>
+    <w:lsdException w:name="Dark List Accent 3" w:semiHidden="0" w:uiPriority="70" w:unhideWhenUsed="0"/>
+    <w:lsdException w:name="Colorful Shading Accent 3" w:semiHidden="0" w:uiPriority="71" w:unhideWhenUsed="0"/>
+    <w:lsdException w:name="Colorful List Accent 3" w:semiHidden="0" w:uiPriority="72" w:unhideWhenUsed="0"/>
+    <w:lsdException w:name="Colorful Grid Accent 3" w:semiHidden="0" w:uiPriority="73" w:unhideWhenUsed="0"/>
+    <w:lsdException w:name="Light Shading Accent 4" w:semiHidden="0" w:uiPriority="60" w:unhideWhenUsed="0"/>
+    <w:lsdException w:name="Light List Accent 4" w:semiHidden="0" w:uiPriority="61" w:unhideWhenUsed="0"/>
+    <w:lsdException w:name="Light Grid Accent 4" w:semiHidden="0" w:uiPriority="62" w:unhideWhenUsed="0"/>
+    <w:lsdException w:name="Medium Shading 1 Accent 4" w:semiHidden="0" w:uiPriority="63" w:unhideWhenUsed="0"/>
+    <w:lsdException w:name="Medium Shading 2 Accent 4" w:semiHidden="0" w:uiPriority="64" w:unhideWhenUsed="0"/>
+    <w:lsdException w:name="Medium List 1 Accent 4" w:semiHidden="0" w:uiPriority="65" w:unhideWhenUsed="0"/>
+    <w:lsdException w:name="Medium List 2 Accent 4" w:semiHidden="0" w:uiPriority="66" w:unhideWhenUsed="0"/>
+    <w:lsdException w:name="Medium Grid 1 Accent 4" w:semiHidden="0" w:uiPriority="67" w:unhideWhenUsed="0"/>
+    <w:lsdException w:name="Medium Grid 2 Accent 4" w:semiHidden="0" w:uiPriority="68" w:unhideWhenUsed="0"/>
+    <w:lsdException w:name="Medium Grid 3 Accent 4" w:semiHidden="0" w:uiPriority="69" w:unhideWhenUsed="0"/>
+    <w:lsdException w:name="Dark List Accent 4" w:semiHidden="0" w:uiPriority="70" w:unhideWhenUsed="0"/>
+    <w:lsdException w:name="Colorful Shading Accent 4" w:semiHidden="0" w:uiPriority="71" w:unhideWhenUsed="0"/>
+    <w:lsdException w:name="Colorful List Accent 4" w:semiHidden="0" w:uiPriority="72" w:unhideWhenUsed="0"/>
+    <w:lsdException w:name="Colorful Grid Accent 4" w:semiHidden="0" w:uiPriority="73" w:unhideWhenUsed="0"/>
+    <w:lsdException w:name="Light Shading Accent 5" w:semiHidden="0" w:uiPriority="60" w:unhideWhenUsed="0"/>
+    <w:lsdException w:name="Light List Accent 5" w:semiHidden="0" w:uiPriority="61" w:unhideWhenUsed="0"/>
+    <w:lsdException w:name="Light Grid Accent 5" w:semiHidden="0" w:uiPriority="62" w:unhideWhenUsed="0"/>
+    <w:lsdException w:name="Medium Shading 1 Accent 5" w:semiHidden="0" w:uiPriority="63" w:unhideWhenUsed="0"/>
+    <w:lsdException w:name="Medium Shading 2 Accent 5" w:semiHidden="0" w:uiPriority="64" w:unhideWhenUsed="0"/>
+    <w:lsdException w:name="Medium List 1 Accent 5" w:semiHidden="0" w:uiPriority="65" w:unhideWhenUsed="0"/>
+    <w:lsdException w:name="Medium List 2 Accent 5" w:semiHidden="0" w:uiPriority="66" w:unhideWhenUsed="0"/>
+    <w:lsdException w:name="Medium Grid 1 Accent 5" w:semiHidden="0" w:uiPriority="67" w:unhideWhenUsed="0"/>
+    <w:lsdException w:name="Medium Grid 2 Accent 5" w:semiHidden="0" w:uiPriority="68" w:unhideWhenUsed="0"/>
+    <w:lsdException w:name="Medium Grid 3 Accent 5" w:semiHidden="0" w:uiPriority="69" w:unhideWhenUsed="0"/>
+    <w:lsdException w:name="Dark List Accent 5" w:semiHidden="0" w:uiPriority="70" w:unhideWhenUsed="0"/>
+    <w:lsdException w:name="Colorful Shading Accent 5" w:semiHidden="0" w:uiPriority="71" w:unhideWhenUsed="0"/>
+    <w:lsdException w:name="Colorful List Accent 5" w:semiHidden="0" w:uiPriority="72" w:unhideWhenUsed="0"/>
+    <w:lsdException w:name="Colorful Grid Accent 5" w:semiHidden="0" w:uiPriority="73" w:unhideWhenUsed="0"/>
+    <w:lsdException w:name="Light Shading Accent 6" w:semiHidden="0" w:uiPriority="60" w:unhideWhenUsed="0"/>
+    <w:lsdException w:name="Light List Accent 6" w:semiHidden="0" w:uiPriority="61" w:unhideWhenUsed="0"/>
+    <w:lsdException w:name="Light Grid Accent 6" w:semiHidden="0" w:uiPriority="62" w:unhideWhenUsed="0"/>
+    <w:lsdException w:name="Medium Shading 1 Accent 6" w:semiHidden="0" w:uiPriority="63" w:unhideWhenUsed="0"/>
+    <w:lsdException w:name="Medium Shading 2 Accent 6" w:semiHidden="0" w:uiPriority="64" w:unhideWhenUsed="0"/>
+    <w:lsdException w:name="Medium List 1 Accent 6" w:semiHidden="0" w:uiPriority="65" w:unhideWhenUsed="0"/>
+    <w:lsdException w:name="Medium List 2 Accent 6" w:semiHidden="0" w:uiPriority="66" w:unhideWhenUsed="0"/>
+    <w:lsdException w:name="Medium Grid 1 Accent 6" w:semiHidden="0" w:uiPriority="67" w:unhideWhenUsed="0"/>
+    <w:lsdException w:name="Medium Grid 2 Accent 6" w:semiHidden="0" w:uiPriority="68" w:unhideWhenUsed="0"/>
+    <w:lsdException w:name="Medium Grid 3 Accent 6" w:semiHidden="0" w:uiPriority="69" w:unhideWhenUsed="0"/>
+    <w:lsdException w:name="Dark List Accent 6" w:semiHidden="0" w:uiPriority="70" w:unhideWhenUsed="0"/>
+    <w:lsdException w:name="Colorful Shading Accent 6" w:semiHidden="0" w:uiPriority="71" w:unhideWhenUsed="0"/>
+    <w:lsdException w:name="Colorful List Accent 6" w:semiHidden="0" w:uiPriority="72" w:unhideWhenUsed="0"/>
+    <w:lsdException w:name="Colorful Grid Accent 6" w:semiHidden="0" w:uiPriority="73" w:unhideWhenUsed="0"/>
+    <w:lsdException w:name="Subtle Emphasis" w:semiHidden="0" w:uiPriority="19" w:unhideWhenUsed="0" w:qFormat="1"/>
+    <w:lsdException w:name="Intense Emphasis" w:semiHidden="0" w:uiPriority="21" w:unhideWhenUsed="0" w:qFormat="1"/>
+    <w:lsdException w:name="Subtle Reference" w:semiHidden="0" w:uiPriority="31" w:unhideWhenUsed="0" w:qFormat="1"/>
+    <w:lsdException w:name="Intense Reference" w:semiHidden="0" w:uiPriority="32" w:unhideWhenUsed="0" w:qFormat="1"/>
+    <w:lsdException w:name="Book Title" w:semiHidden="0" w:uiPriority="33" w:unhideWhenUsed="0" w:qFormat="1"/>
+    <w:lsdException w:name="Bibliography" w:uiPriority="37"/>
+    <w:lsdException w:name="TOC Heading" w:uiPriority="39" w:qFormat="1"/>
+  </w:latentStyles>
+  <w:style w:type="paragraph" w:default="1" w:styleId="Normal">
+    <w:name w:val="Normal"/>
+    <w:qFormat/>
+  </w:style>
+  <w:style w:type="character" w:default="1" w:styleId="DefaultParagraphFont">
+    <w:name w:val="Default Paragraph Font"/>
+    <w:uiPriority w:val="1"/>
+    <w:semiHidden/>
+    <w:unhideWhenUsed/>
+  </w:style>
+  <w:style w:type="table" w:default="1" w:styleId="TableNormal">
+    <w:name w:val="Normal Table"/>
+    <w:uiPriority w:val="99"/>
+    <w:semiHidden/>
+    <w:unhideWhenUsed/>
+    <w:tblPr>
+      <w:tblInd w:w="0" w:type="dxa"/>
+      <w:tblCellMar>
+        <w:top w:w="0" w:type="dxa"/>
+        <w:left w:w="108" w:type="dxa"/>
+        <w:bottom w:w="0" w:type="dxa"/>
+        <w:right w:w="108" w:type="dxa"/>
+      </w:tblCellMar>
+    </w:tblPr>
+  </w:style>
+  <w:style w:type="numbering" w:default="1" w:styleId="NoList">
+    <w:name w:val="No List"/>
+    <w:uiPriority w:val="99"/>
+    <w:semiHidden/>
+    <w:unhideWhenUsed/>
+  </w:style>
+  <w:style w:type="paragraph" w:customStyle="1" w:styleId="065141616EC9499AADE007ADABCB4788">
+    <w:name w:val="065141616EC9499AADE007ADABCB4788"/>
+    <w:rsid w:val="00F072F0"/>
+  </w:style>
+</w:styles>
+</file>
+
+<file path=word/glossary/webSettings.xml><?xml version="1.0" encoding="utf-8"?>
+<w:webSettings xmlns:mc="http://schemas.openxmlformats.org/markup-compatibility/2006" xmlns:r="http://schemas.openxmlformats.org/officeDocument/2006/relationships" xmlns:w="http://schemas.openxmlformats.org/wordprocessingml/2006/main" xmlns:w14="http://schemas.microsoft.com/office/word/2010/wordml" mc:Ignorable="w14">
+  <w:optimizeForBrowser/>
+  <w:allowPNG/>
+</w:webSettings>
 </file>
 
 <file path=word/theme/theme1.xml><?xml version="1.0" encoding="utf-8"?>
@@ -5682,7 +7163,7 @@
 </file>
 
 <file path=customXml/itemProps1.xml><?xml version="1.0" encoding="utf-8"?>
-<ds:datastoreItem xmlns:ds="http://schemas.openxmlformats.org/officeDocument/2006/customXml" ds:itemID="{469A111B-1D90-41BB-B752-A142E42D4418}">
+<ds:datastoreItem xmlns:ds="http://schemas.openxmlformats.org/officeDocument/2006/customXml" ds:itemID="{3653B01C-ACF9-4FFA-A0D4-FA5298AA95BD}">
   <ds:schemaRefs>
     <ds:schemaRef ds:uri="http://schemas.openxmlformats.org/officeDocument/2006/bibliography"/>
   </ds:schemaRefs>

</xml_diff>

<commit_message>
Updated changelog and support! For V17 RELIC U03!
</commit_message>
<xml_diff>
--- a/changelog.docx
+++ b/changelog.docx
@@ -44,7 +44,7 @@
           <w:b/>
           <w:sz w:val="48"/>
         </w:rPr>
-        <w:t>6</w:t>
+        <w:t>7</w:t>
       </w:r>
       <w:r>
         <w:rPr>
@@ -60,7 +60,7 @@
           <w:b/>
           <w:sz w:val="48"/>
         </w:rPr>
-        <w:t>PHOSPHORUS</w:t>
+        <w:t>RELIC</w:t>
       </w:r>
       <w:r>
         <w:rPr>
@@ -189,6 +189,12 @@
       <w:pPr>
         <w:pStyle w:val="NoSpacing"/>
         <w:jc w:val="center"/>
+      </w:pPr>
+    </w:p>
+    <w:p>
+      <w:pPr>
+        <w:pStyle w:val="NoSpacing"/>
+        <w:jc w:val="center"/>
         <w:rPr>
           <w:rFonts w:ascii="Verdana" w:hAnsi="Verdana"/>
           <w:b/>
@@ -209,7 +215,7 @@
           <w:b/>
           <w:sz w:val="48"/>
         </w:rPr>
-        <w:t>PHOSPHORUS</w:t>
+        <w:t>RELIC</w:t>
       </w:r>
       <w:r>
         <w:rPr>
@@ -259,7 +265,7 @@
           <w:sz w:val="32"/>
           <w:szCs w:val="32"/>
         </w:rPr>
-        <w:t>Menu interaction using mouse besides keyboard. Cursor implemented.</w:t>
+        <w:t>Use F12 to save screenshots.</w:t>
       </w:r>
     </w:p>
     <w:p>
@@ -295,236 +301,77 @@
           <w:ilvl w:val="0"/>
           <w:numId w:val="22"/>
         </w:numPr>
-        <w:rPr>
-          <w:rFonts w:ascii="Verdana" w:hAnsi="Verdana"/>
-          <w:sz w:val="32"/>
-          <w:szCs w:val="32"/>
-        </w:rPr>
-      </w:pPr>
-      <w:r>
-        <w:rPr>
-          <w:rFonts w:ascii="Verdana" w:hAnsi="Verdana"/>
-          <w:sz w:val="32"/>
-          <w:szCs w:val="32"/>
-        </w:rPr>
-        <w:t>Changes in block add/</w:t>
-      </w:r>
-      <w:proofErr w:type="gramStart"/>
-      <w:r>
-        <w:rPr>
-          <w:rFonts w:ascii="Verdana" w:hAnsi="Verdana"/>
-          <w:sz w:val="32"/>
-          <w:szCs w:val="32"/>
-        </w:rPr>
-        <w:t>removal resulting in faster block</w:t>
-      </w:r>
-      <w:proofErr w:type="gramEnd"/>
-      <w:r>
-        <w:rPr>
-          <w:rFonts w:ascii="Verdana" w:hAnsi="Verdana"/>
-          <w:sz w:val="32"/>
-          <w:szCs w:val="32"/>
-        </w:rPr>
-        <w:t xml:space="preserve"> operations, faster level generation, level saving and loading.</w:t>
-      </w:r>
-    </w:p>
-    <w:p>
-      <w:pPr>
-        <w:pStyle w:val="NoSpacing"/>
-        <w:jc w:val="center"/>
-      </w:pPr>
-    </w:p>
-    <w:p>
-      <w:pPr>
-        <w:pStyle w:val="NoSpacing"/>
-        <w:jc w:val="center"/>
-      </w:pPr>
-    </w:p>
-    <w:p>
-      <w:pPr>
-        <w:pStyle w:val="NoSpacing"/>
-        <w:jc w:val="center"/>
-      </w:pPr>
-    </w:p>
-    <w:p>
-      <w:pPr>
-        <w:pStyle w:val="NoSpacing"/>
-        <w:jc w:val="center"/>
-      </w:pPr>
-    </w:p>
-    <w:p>
-      <w:pPr>
-        <w:pStyle w:val="NoSpacing"/>
-        <w:jc w:val="center"/>
-      </w:pPr>
-    </w:p>
-    <w:p>
-      <w:pPr>
-        <w:pStyle w:val="NoSpacing"/>
-        <w:jc w:val="center"/>
-      </w:pPr>
-    </w:p>
-    <w:p>
-      <w:pPr>
-        <w:pStyle w:val="NoSpacing"/>
-        <w:jc w:val="center"/>
-      </w:pPr>
-    </w:p>
-    <w:p>
-      <w:pPr>
-        <w:pStyle w:val="NoSpacing"/>
-        <w:jc w:val="center"/>
-      </w:pPr>
-    </w:p>
-    <w:p>
-      <w:pPr>
-        <w:pStyle w:val="NoSpacing"/>
-        <w:jc w:val="center"/>
-      </w:pPr>
-    </w:p>
-    <w:p>
-      <w:pPr>
-        <w:pStyle w:val="NoSpacing"/>
-        <w:jc w:val="center"/>
-      </w:pPr>
-    </w:p>
-    <w:p>
-      <w:pPr>
-        <w:pStyle w:val="NoSpacing"/>
-        <w:jc w:val="center"/>
-      </w:pPr>
-    </w:p>
-    <w:p>
-      <w:pPr>
-        <w:pStyle w:val="NoSpacing"/>
-        <w:jc w:val="center"/>
-      </w:pPr>
-    </w:p>
-    <w:p>
-      <w:pPr>
-        <w:pStyle w:val="NoSpacing"/>
-        <w:jc w:val="center"/>
-      </w:pPr>
-    </w:p>
-    <w:p>
-      <w:pPr>
-        <w:pStyle w:val="NoSpacing"/>
-        <w:jc w:val="center"/>
-      </w:pPr>
-    </w:p>
-    <w:p>
-      <w:pPr>
-        <w:pStyle w:val="NoSpacing"/>
-        <w:jc w:val="center"/>
-      </w:pPr>
-    </w:p>
-    <w:p>
-      <w:pPr>
-        <w:pStyle w:val="NoSpacing"/>
-        <w:jc w:val="center"/>
-      </w:pPr>
-    </w:p>
-    <w:p>
-      <w:pPr>
-        <w:pStyle w:val="NoSpacing"/>
-        <w:jc w:val="center"/>
-      </w:pPr>
-    </w:p>
-    <w:p>
-      <w:pPr>
-        <w:pStyle w:val="NoSpacing"/>
-        <w:jc w:val="center"/>
-      </w:pPr>
-    </w:p>
-    <w:p>
-      <w:pPr>
-        <w:pStyle w:val="NoSpacing"/>
-        <w:jc w:val="center"/>
-      </w:pPr>
-    </w:p>
-    <w:p>
-      <w:pPr>
-        <w:pStyle w:val="NoSpacing"/>
-        <w:jc w:val="center"/>
-      </w:pPr>
-    </w:p>
-    <w:p>
-      <w:pPr>
-        <w:pStyle w:val="NoSpacing"/>
-        <w:jc w:val="center"/>
-      </w:pPr>
-    </w:p>
-    <w:p>
-      <w:pPr>
-        <w:pStyle w:val="NoSpacing"/>
-        <w:jc w:val="center"/>
-      </w:pPr>
-    </w:p>
-    <w:p>
-      <w:pPr>
-        <w:pStyle w:val="NoSpacing"/>
-        <w:jc w:val="center"/>
-        <w:rPr>
-          <w:rFonts w:ascii="Verdana" w:hAnsi="Verdana"/>
-          <w:b/>
-          <w:sz w:val="48"/>
-        </w:rPr>
-      </w:pPr>
-      <w:r>
-        <w:rPr>
-          <w:rFonts w:ascii="Verdana" w:hAnsi="Verdana"/>
-          <w:b/>
-          <w:sz w:val="48"/>
-        </w:rPr>
-        <w:lastRenderedPageBreak/>
-        <w:t>[</w:t>
-      </w:r>
-      <w:r>
-        <w:rPr>
-          <w:rFonts w:ascii="Verdana" w:hAnsi="Verdana"/>
-          <w:b/>
-          <w:sz w:val="48"/>
-        </w:rPr>
-        <w:t>OXYGEN</w:t>
-      </w:r>
-      <w:r>
-        <w:rPr>
-          <w:rFonts w:ascii="Verdana" w:hAnsi="Verdana"/>
-          <w:b/>
-          <w:sz w:val="48"/>
-        </w:rPr>
-        <w:t>]</w:t>
-      </w:r>
-    </w:p>
-    <w:p>
-      <w:pPr>
-        <w:pStyle w:val="NoSpacing"/>
-        <w:jc w:val="center"/>
-        <w:rPr>
-          <w:rFonts w:ascii="Verdana" w:hAnsi="Verdana"/>
-          <w:b/>
-          <w:sz w:val="48"/>
-        </w:rPr>
-      </w:pPr>
-    </w:p>
-    <w:p>
-      <w:pPr>
-        <w:pStyle w:val="NoSpacing"/>
-        <w:rPr>
-          <w:rFonts w:ascii="Verdana" w:hAnsi="Verdana"/>
-          <w:b/>
-          <w:color w:val="00B050"/>
-          <w:sz w:val="48"/>
-        </w:rPr>
-      </w:pPr>
-      <w:r>
-        <w:rPr>
-          <w:rFonts w:ascii="Verdana" w:hAnsi="Verdana"/>
-          <w:b/>
-          <w:color w:val="00B050"/>
-          <w:sz w:val="48"/>
-        </w:rPr>
-        <w:t>FEATURES:</w:t>
+      </w:pPr>
+      <w:r>
+        <w:rPr>
+          <w:rFonts w:ascii="Verdana" w:hAnsi="Verdana"/>
+          <w:sz w:val="32"/>
+          <w:szCs w:val="32"/>
+        </w:rPr>
+        <w:t>Changes</w:t>
+      </w:r>
+      <w:r>
+        <w:rPr>
+          <w:rFonts w:ascii="Verdana" w:hAnsi="Verdana"/>
+          <w:sz w:val="32"/>
+          <w:szCs w:val="32"/>
+        </w:rPr>
+        <w:t xml:space="preserve"> to</w:t>
+      </w:r>
+      <w:r>
+        <w:rPr>
+          <w:rFonts w:ascii="Verdana" w:hAnsi="Verdana"/>
+          <w:sz w:val="32"/>
+          <w:szCs w:val="32"/>
+        </w:rPr>
+        <w:t xml:space="preserve"> </w:t>
+      </w:r>
+      <w:r>
+        <w:rPr>
+          <w:rFonts w:ascii="Verdana" w:hAnsi="Verdana"/>
+          <w:sz w:val="32"/>
+          <w:szCs w:val="32"/>
+        </w:rPr>
+        <w:t>game loops affecting fps.</w:t>
+      </w:r>
+    </w:p>
+    <w:p>
+      <w:pPr>
+        <w:pStyle w:val="NoSpacing"/>
+        <w:rPr>
+          <w:rFonts w:ascii="Verdana" w:hAnsi="Verdana"/>
+          <w:sz w:val="32"/>
+          <w:szCs w:val="32"/>
+        </w:rPr>
+      </w:pPr>
+    </w:p>
+    <w:p>
+      <w:pPr>
+        <w:pStyle w:val="NoSpacing"/>
+        <w:rPr>
+          <w:rFonts w:ascii="Verdana" w:hAnsi="Verdana"/>
+          <w:b/>
+          <w:color w:val="FF0000"/>
+          <w:sz w:val="48"/>
+        </w:rPr>
+      </w:pPr>
+      <w:r>
+        <w:rPr>
+          <w:rFonts w:ascii="Verdana" w:hAnsi="Verdana"/>
+          <w:b/>
+          <w:color w:val="FF0000"/>
+          <w:sz w:val="48"/>
+        </w:rPr>
+        <w:t>FIXE</w:t>
+      </w:r>
+      <w:r>
+        <w:rPr>
+          <w:rFonts w:ascii="Verdana" w:hAnsi="Verdana"/>
+          <w:b/>
+          <w:color w:val="FF0000"/>
+          <w:sz w:val="48"/>
+        </w:rPr>
+        <w:t>S:</w:t>
       </w:r>
     </w:p>
     <w:p>
@@ -534,71 +381,214 @@
           <w:ilvl w:val="0"/>
           <w:numId w:val="22"/>
         </w:numPr>
-        <w:rPr>
-          <w:rFonts w:ascii="Verdana" w:hAnsi="Verdana"/>
-          <w:sz w:val="32"/>
-          <w:szCs w:val="32"/>
-        </w:rPr>
-      </w:pPr>
-      <w:r>
-        <w:rPr>
-          <w:rFonts w:ascii="Verdana" w:hAnsi="Verdana"/>
-          <w:sz w:val="32"/>
-          <w:szCs w:val="32"/>
-        </w:rPr>
-        <w:t xml:space="preserve">Single player has been unlocked. Player is able to wield one of the six guns (Beretta pistol, </w:t>
-      </w:r>
-      <w:r>
-        <w:rPr>
-          <w:rFonts w:ascii="Verdana" w:hAnsi="Verdana"/>
-          <w:sz w:val="32"/>
-          <w:szCs w:val="32"/>
-        </w:rPr>
-        <w:t>SMG P90</w:t>
-      </w:r>
-      <w:r>
-        <w:rPr>
-          <w:rFonts w:ascii="Verdana" w:hAnsi="Verdana"/>
-          <w:sz w:val="32"/>
-          <w:szCs w:val="32"/>
-        </w:rPr>
-        <w:t xml:space="preserve">, Shotgun, </w:t>
-      </w:r>
-      <w:r>
-        <w:rPr>
-          <w:rFonts w:ascii="Verdana" w:hAnsi="Verdana"/>
-          <w:sz w:val="32"/>
-          <w:szCs w:val="32"/>
-        </w:rPr>
-        <w:t>Assault rifle AK-47</w:t>
-      </w:r>
-      <w:r>
-        <w:rPr>
-          <w:rFonts w:ascii="Verdana" w:hAnsi="Verdana"/>
-          <w:sz w:val="32"/>
-          <w:szCs w:val="32"/>
-        </w:rPr>
-        <w:t>, M60, Sniper Rifle). However there’re no animations for these guns.</w:t>
-      </w:r>
-      <w:r>
-        <w:rPr>
-          <w:rFonts w:ascii="Verdana" w:hAnsi="Verdana"/>
-          <w:sz w:val="32"/>
-          <w:szCs w:val="32"/>
-        </w:rPr>
-        <w:t xml:space="preserve"> Neither fire or alt-fire have been implemented yet.</w:t>
-      </w:r>
-    </w:p>
-    <w:p>
-      <w:pPr>
-        <w:pStyle w:val="NoSpacing"/>
-        <w:ind w:left="360"/>
-        <w:rPr>
-          <w:rFonts w:ascii="Verdana" w:hAnsi="Verdana"/>
-          <w:sz w:val="32"/>
-          <w:szCs w:val="32"/>
-        </w:rPr>
-      </w:pPr>
+      </w:pPr>
+      <w:r>
+        <w:rPr>
+          <w:rFonts w:ascii="Verdana" w:hAnsi="Verdana"/>
+          <w:sz w:val="32"/>
+          <w:szCs w:val="32"/>
+        </w:rPr>
+        <w:t>Update per second is displayed correctly</w:t>
+      </w:r>
+      <w:r>
+        <w:rPr>
+          <w:rFonts w:ascii="Verdana" w:hAnsi="Verdana"/>
+          <w:sz w:val="32"/>
+          <w:szCs w:val="32"/>
+        </w:rPr>
+        <w:t>.</w:t>
+      </w:r>
+    </w:p>
+    <w:p>
+      <w:pPr>
+        <w:pStyle w:val="NoSpacing"/>
+      </w:pPr>
+    </w:p>
+    <w:p>
+      <w:pPr>
+        <w:pStyle w:val="NoSpacing"/>
+        <w:jc w:val="center"/>
+      </w:pPr>
+    </w:p>
+    <w:p>
+      <w:pPr>
+        <w:pStyle w:val="NoSpacing"/>
+        <w:jc w:val="center"/>
+      </w:pPr>
+    </w:p>
+    <w:p>
+      <w:pPr>
+        <w:pStyle w:val="NoSpacing"/>
+        <w:jc w:val="center"/>
+      </w:pPr>
+    </w:p>
+    <w:p>
+      <w:pPr>
+        <w:pStyle w:val="NoSpacing"/>
+        <w:jc w:val="center"/>
+      </w:pPr>
+    </w:p>
+    <w:p>
+      <w:pPr>
+        <w:pStyle w:val="NoSpacing"/>
+        <w:jc w:val="center"/>
+      </w:pPr>
+    </w:p>
+    <w:p>
+      <w:pPr>
+        <w:pStyle w:val="NoSpacing"/>
+        <w:jc w:val="center"/>
+      </w:pPr>
+    </w:p>
+    <w:p>
+      <w:pPr>
+        <w:pStyle w:val="NoSpacing"/>
+        <w:jc w:val="center"/>
+      </w:pPr>
+    </w:p>
+    <w:p>
+      <w:pPr>
+        <w:pStyle w:val="NoSpacing"/>
+        <w:jc w:val="center"/>
+      </w:pPr>
+    </w:p>
+    <w:p>
+      <w:pPr>
+        <w:pStyle w:val="NoSpacing"/>
+        <w:jc w:val="center"/>
+      </w:pPr>
+    </w:p>
+    <w:p>
+      <w:pPr>
+        <w:pStyle w:val="NoSpacing"/>
+        <w:jc w:val="center"/>
+      </w:pPr>
+    </w:p>
+    <w:p>
+      <w:pPr>
+        <w:pStyle w:val="NoSpacing"/>
+        <w:jc w:val="center"/>
+      </w:pPr>
+    </w:p>
+    <w:p>
+      <w:pPr>
+        <w:pStyle w:val="NoSpacing"/>
+        <w:jc w:val="center"/>
+      </w:pPr>
+    </w:p>
+    <w:p>
+      <w:pPr>
+        <w:pStyle w:val="NoSpacing"/>
+        <w:jc w:val="center"/>
+      </w:pPr>
+    </w:p>
+    <w:p>
+      <w:pPr>
+        <w:pStyle w:val="NoSpacing"/>
+        <w:jc w:val="center"/>
+      </w:pPr>
+    </w:p>
+    <w:p>
+      <w:pPr>
+        <w:pStyle w:val="NoSpacing"/>
+        <w:jc w:val="center"/>
+      </w:pPr>
+    </w:p>
+    <w:p>
+      <w:pPr>
+        <w:pStyle w:val="NoSpacing"/>
+        <w:jc w:val="center"/>
+      </w:pPr>
+    </w:p>
+    <w:p>
+      <w:pPr>
+        <w:pStyle w:val="NoSpacing"/>
+        <w:jc w:val="center"/>
+      </w:pPr>
+    </w:p>
+    <w:p>
+      <w:pPr>
+        <w:pStyle w:val="NoSpacing"/>
+        <w:jc w:val="center"/>
+      </w:pPr>
+    </w:p>
+    <w:p>
+      <w:pPr>
+        <w:pStyle w:val="NoSpacing"/>
+        <w:jc w:val="center"/>
+      </w:pPr>
+    </w:p>
+    <w:p>
+      <w:pPr>
+        <w:pStyle w:val="NoSpacing"/>
+        <w:jc w:val="center"/>
+      </w:pPr>
+    </w:p>
+    <w:p>
+      <w:pPr>
+        <w:pStyle w:val="NoSpacing"/>
+        <w:jc w:val="center"/>
+      </w:pPr>
+    </w:p>
+    <w:p>
+      <w:pPr>
+        <w:pStyle w:val="NoSpacing"/>
+        <w:jc w:val="center"/>
+        <w:rPr>
+          <w:rFonts w:ascii="Verdana" w:hAnsi="Verdana"/>
+          <w:b/>
+          <w:sz w:val="48"/>
+        </w:rPr>
+      </w:pPr>
+      <w:r>
+        <w:rPr>
+          <w:rFonts w:ascii="Verdana" w:hAnsi="Verdana"/>
+          <w:b/>
+          <w:sz w:val="48"/>
+        </w:rPr>
+        <w:t>[</w:t>
+      </w:r>
+      <w:r>
+        <w:rPr>
+          <w:rFonts w:ascii="Verdana" w:hAnsi="Verdana"/>
+          <w:b/>
+          <w:sz w:val="48"/>
+        </w:rPr>
+        <w:t>PHOSPHORUS</w:t>
+      </w:r>
+      <w:r>
+        <w:rPr>
+          <w:rFonts w:ascii="Verdana" w:hAnsi="Verdana"/>
+          <w:b/>
+          <w:sz w:val="48"/>
+        </w:rPr>
+        <w:t>]</w:t>
+      </w:r>
+    </w:p>
+    <w:p>
+      <w:pPr>
+        <w:pStyle w:val="NoSpacing"/>
+      </w:pPr>
+    </w:p>
+    <w:p>
+      <w:pPr>
+        <w:pStyle w:val="NoSpacing"/>
+        <w:rPr>
+          <w:rFonts w:ascii="Verdana" w:hAnsi="Verdana"/>
+          <w:b/>
+          <w:color w:val="00B050"/>
+          <w:sz w:val="48"/>
+        </w:rPr>
+      </w:pPr>
+      <w:r>
+        <w:rPr>
+          <w:rFonts w:ascii="Verdana" w:hAnsi="Verdana"/>
+          <w:b/>
+          <w:color w:val="00B050"/>
+          <w:sz w:val="48"/>
+        </w:rPr>
+        <w:t>FEATURES:</w:t>
+      </w:r>
     </w:p>
     <w:p>
       <w:pPr>
@@ -607,69 +597,20 @@
           <w:ilvl w:val="0"/>
           <w:numId w:val="22"/>
         </w:numPr>
-        <w:rPr>
-          <w:rFonts w:ascii="Verdana" w:hAnsi="Verdana"/>
-          <w:sz w:val="32"/>
-          <w:szCs w:val="32"/>
-        </w:rPr>
-      </w:pPr>
-      <w:r>
-        <w:rPr>
-          <w:rFonts w:ascii="Verdana" w:hAnsi="Verdana"/>
-          <w:sz w:val="32"/>
-          <w:szCs w:val="32"/>
-        </w:rPr>
-        <w:t xml:space="preserve">Entering single player will cancel editor mode and prevent modifying the level unless player choose to go into editor and load level again. </w:t>
-      </w:r>
-      <w:r>
-        <w:rPr>
-          <w:rFonts w:ascii="Verdana" w:hAnsi="Verdana"/>
-          <w:sz w:val="32"/>
-          <w:szCs w:val="32"/>
-        </w:rPr>
-        <w:t>Player</w:t>
-      </w:r>
-      <w:r>
-        <w:rPr>
-          <w:rFonts w:ascii="Verdana" w:hAnsi="Verdana"/>
-          <w:sz w:val="32"/>
-          <w:szCs w:val="32"/>
-        </w:rPr>
-        <w:t xml:space="preserve"> will be prompted “</w:t>
-      </w:r>
-      <w:r>
-        <w:rPr>
-          <w:rFonts w:ascii="Verdana" w:hAnsi="Verdana"/>
-          <w:sz w:val="32"/>
-          <w:szCs w:val="32"/>
-        </w:rPr>
-        <w:t>Start New G</w:t>
-      </w:r>
-      <w:r>
-        <w:rPr>
-          <w:rFonts w:ascii="Verdana" w:hAnsi="Verdana"/>
-          <w:sz w:val="32"/>
-          <w:szCs w:val="32"/>
-        </w:rPr>
-        <w:t>ame?”</w:t>
-      </w:r>
-      <w:r>
-        <w:rPr>
-          <w:rFonts w:ascii="Verdana" w:hAnsi="Verdana"/>
-          <w:sz w:val="32"/>
-          <w:szCs w:val="32"/>
-        </w:rPr>
-        <w:t xml:space="preserve"> and if answer is yes or y game will switch to Single Player mode.</w:t>
-      </w:r>
-    </w:p>
-    <w:p>
-      <w:pPr>
-        <w:pStyle w:val="NoSpacing"/>
-        <w:rPr>
-          <w:rFonts w:ascii="Verdana" w:hAnsi="Verdana"/>
-          <w:sz w:val="32"/>
-          <w:szCs w:val="32"/>
-        </w:rPr>
+      </w:pPr>
+      <w:r>
+        <w:rPr>
+          <w:rFonts w:ascii="Verdana" w:hAnsi="Verdana"/>
+          <w:sz w:val="32"/>
+          <w:szCs w:val="32"/>
+        </w:rPr>
+        <w:t>Menu interaction using mouse besides keyboard. Cursor implemented.</w:t>
+      </w:r>
+    </w:p>
+    <w:p>
+      <w:pPr>
+        <w:pStyle w:val="NoSpacing"/>
+        <w:jc w:val="center"/>
       </w:pPr>
     </w:p>
     <w:p>
@@ -711,6 +652,496 @@
           <w:sz w:val="32"/>
           <w:szCs w:val="32"/>
         </w:rPr>
+        <w:t>Changes in block add/</w:t>
+      </w:r>
+      <w:proofErr w:type="gramStart"/>
+      <w:r>
+        <w:rPr>
+          <w:rFonts w:ascii="Verdana" w:hAnsi="Verdana"/>
+          <w:sz w:val="32"/>
+          <w:szCs w:val="32"/>
+        </w:rPr>
+        <w:t>removal resulting in faster block</w:t>
+      </w:r>
+      <w:proofErr w:type="gramEnd"/>
+      <w:r>
+        <w:rPr>
+          <w:rFonts w:ascii="Verdana" w:hAnsi="Verdana"/>
+          <w:sz w:val="32"/>
+          <w:szCs w:val="32"/>
+        </w:rPr>
+        <w:t xml:space="preserve"> operations, faster level generation, level saving and loading.</w:t>
+      </w:r>
+    </w:p>
+    <w:p>
+      <w:pPr>
+        <w:pStyle w:val="NoSpacing"/>
+        <w:jc w:val="center"/>
+      </w:pPr>
+    </w:p>
+    <w:p>
+      <w:pPr>
+        <w:pStyle w:val="NoSpacing"/>
+        <w:jc w:val="center"/>
+      </w:pPr>
+    </w:p>
+    <w:p>
+      <w:pPr>
+        <w:pStyle w:val="NoSpacing"/>
+        <w:jc w:val="center"/>
+      </w:pPr>
+    </w:p>
+    <w:p>
+      <w:pPr>
+        <w:pStyle w:val="NoSpacing"/>
+        <w:jc w:val="center"/>
+      </w:pPr>
+    </w:p>
+    <w:p>
+      <w:pPr>
+        <w:pStyle w:val="NoSpacing"/>
+        <w:jc w:val="center"/>
+      </w:pPr>
+    </w:p>
+    <w:p>
+      <w:pPr>
+        <w:pStyle w:val="NoSpacing"/>
+        <w:jc w:val="center"/>
+      </w:pPr>
+    </w:p>
+    <w:p>
+      <w:pPr>
+        <w:pStyle w:val="NoSpacing"/>
+        <w:jc w:val="center"/>
+      </w:pPr>
+    </w:p>
+    <w:p>
+      <w:pPr>
+        <w:pStyle w:val="NoSpacing"/>
+        <w:jc w:val="center"/>
+      </w:pPr>
+    </w:p>
+    <w:p>
+      <w:pPr>
+        <w:pStyle w:val="NoSpacing"/>
+        <w:jc w:val="center"/>
+      </w:pPr>
+    </w:p>
+    <w:p>
+      <w:pPr>
+        <w:pStyle w:val="NoSpacing"/>
+        <w:jc w:val="center"/>
+      </w:pPr>
+    </w:p>
+    <w:p>
+      <w:pPr>
+        <w:pStyle w:val="NoSpacing"/>
+        <w:jc w:val="center"/>
+      </w:pPr>
+    </w:p>
+    <w:p>
+      <w:pPr>
+        <w:pStyle w:val="NoSpacing"/>
+        <w:jc w:val="center"/>
+      </w:pPr>
+    </w:p>
+    <w:p>
+      <w:pPr>
+        <w:pStyle w:val="NoSpacing"/>
+        <w:jc w:val="center"/>
+      </w:pPr>
+    </w:p>
+    <w:p>
+      <w:pPr>
+        <w:pStyle w:val="NoSpacing"/>
+        <w:jc w:val="center"/>
+      </w:pPr>
+    </w:p>
+    <w:p>
+      <w:pPr>
+        <w:pStyle w:val="NoSpacing"/>
+        <w:jc w:val="center"/>
+      </w:pPr>
+    </w:p>
+    <w:p>
+      <w:pPr>
+        <w:pStyle w:val="NoSpacing"/>
+        <w:jc w:val="center"/>
+      </w:pPr>
+    </w:p>
+    <w:p>
+      <w:pPr>
+        <w:pStyle w:val="NoSpacing"/>
+        <w:jc w:val="center"/>
+      </w:pPr>
+    </w:p>
+    <w:p>
+      <w:pPr>
+        <w:pStyle w:val="NoSpacing"/>
+        <w:jc w:val="center"/>
+      </w:pPr>
+    </w:p>
+    <w:p>
+      <w:pPr>
+        <w:pStyle w:val="NoSpacing"/>
+        <w:jc w:val="center"/>
+      </w:pPr>
+    </w:p>
+    <w:p>
+      <w:pPr>
+        <w:pStyle w:val="NoSpacing"/>
+        <w:jc w:val="center"/>
+      </w:pPr>
+    </w:p>
+    <w:p>
+      <w:pPr>
+        <w:pStyle w:val="NoSpacing"/>
+        <w:jc w:val="center"/>
+      </w:pPr>
+    </w:p>
+    <w:p>
+      <w:pPr>
+        <w:pStyle w:val="NoSpacing"/>
+        <w:jc w:val="center"/>
+      </w:pPr>
+    </w:p>
+    <w:p>
+      <w:pPr>
+        <w:pStyle w:val="NoSpacing"/>
+        <w:jc w:val="center"/>
+      </w:pPr>
+    </w:p>
+    <w:p>
+      <w:pPr>
+        <w:pStyle w:val="NoSpacing"/>
+        <w:jc w:val="center"/>
+      </w:pPr>
+    </w:p>
+    <w:p>
+      <w:pPr>
+        <w:pStyle w:val="NoSpacing"/>
+        <w:jc w:val="center"/>
+      </w:pPr>
+    </w:p>
+    <w:p>
+      <w:pPr>
+        <w:pStyle w:val="NoSpacing"/>
+        <w:jc w:val="center"/>
+      </w:pPr>
+    </w:p>
+    <w:p>
+      <w:pPr>
+        <w:pStyle w:val="NoSpacing"/>
+        <w:jc w:val="center"/>
+      </w:pPr>
+    </w:p>
+    <w:p>
+      <w:pPr>
+        <w:pStyle w:val="NoSpacing"/>
+        <w:jc w:val="center"/>
+      </w:pPr>
+    </w:p>
+    <w:p>
+      <w:pPr>
+        <w:pStyle w:val="NoSpacing"/>
+        <w:jc w:val="center"/>
+      </w:pPr>
+    </w:p>
+    <w:p>
+      <w:pPr>
+        <w:pStyle w:val="NoSpacing"/>
+        <w:jc w:val="center"/>
+      </w:pPr>
+    </w:p>
+    <w:p>
+      <w:pPr>
+        <w:pStyle w:val="NoSpacing"/>
+        <w:jc w:val="center"/>
+      </w:pPr>
+    </w:p>
+    <w:p>
+      <w:pPr>
+        <w:pStyle w:val="NoSpacing"/>
+        <w:jc w:val="center"/>
+      </w:pPr>
+    </w:p>
+    <w:p>
+      <w:pPr>
+        <w:pStyle w:val="NoSpacing"/>
+        <w:jc w:val="center"/>
+      </w:pPr>
+    </w:p>
+    <w:p>
+      <w:pPr>
+        <w:pStyle w:val="NoSpacing"/>
+        <w:jc w:val="center"/>
+      </w:pPr>
+    </w:p>
+    <w:p>
+      <w:pPr>
+        <w:pStyle w:val="NoSpacing"/>
+        <w:jc w:val="center"/>
+      </w:pPr>
+    </w:p>
+    <w:p>
+      <w:pPr>
+        <w:pStyle w:val="NoSpacing"/>
+        <w:jc w:val="center"/>
+      </w:pPr>
+    </w:p>
+    <w:p>
+      <w:pPr>
+        <w:pStyle w:val="NoSpacing"/>
+        <w:jc w:val="center"/>
+        <w:rPr>
+          <w:rFonts w:ascii="Verdana" w:hAnsi="Verdana"/>
+          <w:b/>
+          <w:sz w:val="48"/>
+        </w:rPr>
+      </w:pPr>
+      <w:bookmarkStart w:id="0" w:name="_GoBack"/>
+      <w:bookmarkEnd w:id="0"/>
+      <w:r>
+        <w:rPr>
+          <w:rFonts w:ascii="Verdana" w:hAnsi="Verdana"/>
+          <w:b/>
+          <w:sz w:val="48"/>
+        </w:rPr>
+        <w:lastRenderedPageBreak/>
+        <w:t>[</w:t>
+      </w:r>
+      <w:r>
+        <w:rPr>
+          <w:rFonts w:ascii="Verdana" w:hAnsi="Verdana"/>
+          <w:b/>
+          <w:sz w:val="48"/>
+        </w:rPr>
+        <w:t>OXYGEN</w:t>
+      </w:r>
+      <w:r>
+        <w:rPr>
+          <w:rFonts w:ascii="Verdana" w:hAnsi="Verdana"/>
+          <w:b/>
+          <w:sz w:val="48"/>
+        </w:rPr>
+        <w:t>]</w:t>
+      </w:r>
+    </w:p>
+    <w:p>
+      <w:pPr>
+        <w:pStyle w:val="NoSpacing"/>
+        <w:jc w:val="center"/>
+        <w:rPr>
+          <w:rFonts w:ascii="Verdana" w:hAnsi="Verdana"/>
+          <w:b/>
+          <w:sz w:val="48"/>
+        </w:rPr>
+      </w:pPr>
+    </w:p>
+    <w:p>
+      <w:pPr>
+        <w:pStyle w:val="NoSpacing"/>
+        <w:rPr>
+          <w:rFonts w:ascii="Verdana" w:hAnsi="Verdana"/>
+          <w:b/>
+          <w:color w:val="00B050"/>
+          <w:sz w:val="48"/>
+        </w:rPr>
+      </w:pPr>
+      <w:r>
+        <w:rPr>
+          <w:rFonts w:ascii="Verdana" w:hAnsi="Verdana"/>
+          <w:b/>
+          <w:color w:val="00B050"/>
+          <w:sz w:val="48"/>
+        </w:rPr>
+        <w:t>FEATURES:</w:t>
+      </w:r>
+    </w:p>
+    <w:p>
+      <w:pPr>
+        <w:pStyle w:val="NoSpacing"/>
+        <w:numPr>
+          <w:ilvl w:val="0"/>
+          <w:numId w:val="22"/>
+        </w:numPr>
+        <w:rPr>
+          <w:rFonts w:ascii="Verdana" w:hAnsi="Verdana"/>
+          <w:sz w:val="32"/>
+          <w:szCs w:val="32"/>
+        </w:rPr>
+      </w:pPr>
+      <w:r>
+        <w:rPr>
+          <w:rFonts w:ascii="Verdana" w:hAnsi="Verdana"/>
+          <w:sz w:val="32"/>
+          <w:szCs w:val="32"/>
+        </w:rPr>
+        <w:t xml:space="preserve">Single player has been unlocked. Player is able to wield one of the six guns (Beretta pistol, </w:t>
+      </w:r>
+      <w:r>
+        <w:rPr>
+          <w:rFonts w:ascii="Verdana" w:hAnsi="Verdana"/>
+          <w:sz w:val="32"/>
+          <w:szCs w:val="32"/>
+        </w:rPr>
+        <w:t>SMG P90</w:t>
+      </w:r>
+      <w:r>
+        <w:rPr>
+          <w:rFonts w:ascii="Verdana" w:hAnsi="Verdana"/>
+          <w:sz w:val="32"/>
+          <w:szCs w:val="32"/>
+        </w:rPr>
+        <w:t xml:space="preserve">, Shotgun, </w:t>
+      </w:r>
+      <w:r>
+        <w:rPr>
+          <w:rFonts w:ascii="Verdana" w:hAnsi="Verdana"/>
+          <w:sz w:val="32"/>
+          <w:szCs w:val="32"/>
+        </w:rPr>
+        <w:t>Assault rifle AK-47</w:t>
+      </w:r>
+      <w:r>
+        <w:rPr>
+          <w:rFonts w:ascii="Verdana" w:hAnsi="Verdana"/>
+          <w:sz w:val="32"/>
+          <w:szCs w:val="32"/>
+        </w:rPr>
+        <w:t>, M60, Sniper Rifle). However there’re no animations for these guns.</w:t>
+      </w:r>
+      <w:r>
+        <w:rPr>
+          <w:rFonts w:ascii="Verdana" w:hAnsi="Verdana"/>
+          <w:sz w:val="32"/>
+          <w:szCs w:val="32"/>
+        </w:rPr>
+        <w:t xml:space="preserve"> Neither fire or alt-fire have been implemented yet.</w:t>
+      </w:r>
+    </w:p>
+    <w:p>
+      <w:pPr>
+        <w:pStyle w:val="NoSpacing"/>
+        <w:ind w:left="360"/>
+        <w:rPr>
+          <w:rFonts w:ascii="Verdana" w:hAnsi="Verdana"/>
+          <w:sz w:val="32"/>
+          <w:szCs w:val="32"/>
+        </w:rPr>
+      </w:pPr>
+    </w:p>
+    <w:p>
+      <w:pPr>
+        <w:pStyle w:val="NoSpacing"/>
+        <w:numPr>
+          <w:ilvl w:val="0"/>
+          <w:numId w:val="22"/>
+        </w:numPr>
+        <w:rPr>
+          <w:rFonts w:ascii="Verdana" w:hAnsi="Verdana"/>
+          <w:sz w:val="32"/>
+          <w:szCs w:val="32"/>
+        </w:rPr>
+      </w:pPr>
+      <w:r>
+        <w:rPr>
+          <w:rFonts w:ascii="Verdana" w:hAnsi="Verdana"/>
+          <w:sz w:val="32"/>
+          <w:szCs w:val="32"/>
+        </w:rPr>
+        <w:t xml:space="preserve">Entering single player will cancel editor mode and prevent modifying the level unless player choose to go into editor and load level again. </w:t>
+      </w:r>
+      <w:r>
+        <w:rPr>
+          <w:rFonts w:ascii="Verdana" w:hAnsi="Verdana"/>
+          <w:sz w:val="32"/>
+          <w:szCs w:val="32"/>
+        </w:rPr>
+        <w:t>Player</w:t>
+      </w:r>
+      <w:r>
+        <w:rPr>
+          <w:rFonts w:ascii="Verdana" w:hAnsi="Verdana"/>
+          <w:sz w:val="32"/>
+          <w:szCs w:val="32"/>
+        </w:rPr>
+        <w:t xml:space="preserve"> will be prompted “</w:t>
+      </w:r>
+      <w:r>
+        <w:rPr>
+          <w:rFonts w:ascii="Verdana" w:hAnsi="Verdana"/>
+          <w:sz w:val="32"/>
+          <w:szCs w:val="32"/>
+        </w:rPr>
+        <w:t>Start New G</w:t>
+      </w:r>
+      <w:r>
+        <w:rPr>
+          <w:rFonts w:ascii="Verdana" w:hAnsi="Verdana"/>
+          <w:sz w:val="32"/>
+          <w:szCs w:val="32"/>
+        </w:rPr>
+        <w:t>ame?”</w:t>
+      </w:r>
+      <w:r>
+        <w:rPr>
+          <w:rFonts w:ascii="Verdana" w:hAnsi="Verdana"/>
+          <w:sz w:val="32"/>
+          <w:szCs w:val="32"/>
+        </w:rPr>
+        <w:t xml:space="preserve"> and if answer is yes or y game will switch to Single Player mode.</w:t>
+      </w:r>
+    </w:p>
+    <w:p>
+      <w:pPr>
+        <w:pStyle w:val="NoSpacing"/>
+        <w:rPr>
+          <w:rFonts w:ascii="Verdana" w:hAnsi="Verdana"/>
+          <w:sz w:val="32"/>
+          <w:szCs w:val="32"/>
+        </w:rPr>
+      </w:pPr>
+    </w:p>
+    <w:p>
+      <w:pPr>
+        <w:pStyle w:val="NoSpacing"/>
+        <w:rPr>
+          <w:rFonts w:ascii="Verdana" w:hAnsi="Verdana"/>
+          <w:b/>
+          <w:color w:val="FFC000"/>
+          <w:sz w:val="48"/>
+        </w:rPr>
+      </w:pPr>
+      <w:r>
+        <w:rPr>
+          <w:rFonts w:ascii="Verdana" w:hAnsi="Verdana"/>
+          <w:b/>
+          <w:color w:val="FFC000"/>
+          <w:sz w:val="48"/>
+        </w:rPr>
+        <w:t>CHANGES:</w:t>
+      </w:r>
+    </w:p>
+    <w:p>
+      <w:pPr>
+        <w:pStyle w:val="NoSpacing"/>
+        <w:numPr>
+          <w:ilvl w:val="0"/>
+          <w:numId w:val="22"/>
+        </w:numPr>
+        <w:rPr>
+          <w:rFonts w:ascii="Verdana" w:hAnsi="Verdana"/>
+          <w:sz w:val="32"/>
+          <w:szCs w:val="32"/>
+        </w:rPr>
+      </w:pPr>
+      <w:r>
+        <w:rPr>
+          <w:rFonts w:ascii="Verdana" w:hAnsi="Verdana"/>
+          <w:sz w:val="32"/>
+          <w:szCs w:val="32"/>
+        </w:rPr>
         <w:t xml:space="preserve">Game support modifications. Make your own dsynergy.zip archive or make folders </w:t>
       </w:r>
       <w:r>
@@ -2315,8 +2746,6 @@
         </w:rPr>
         <w:t>JAPANESE</w:t>
       </w:r>
-      <w:bookmarkStart w:id="0" w:name="_GoBack"/>
-      <w:bookmarkEnd w:id="0"/>
       <w:r>
         <w:rPr>
           <w:rFonts w:ascii="Verdana" w:hAnsi="Verdana"/>
@@ -2844,7 +3273,7 @@
                                       <w:sz w:val="32"/>
                                       <w:szCs w:val="32"/>
                                     </w:rPr>
-                                    <w:t>5</w:t>
+                                    <w:t>1</w:t>
                                   </w:r>
                                   <w:r>
                                     <w:rPr>
@@ -2910,7 +3339,7 @@
                                 <w:sz w:val="32"/>
                                 <w:szCs w:val="32"/>
                               </w:rPr>
-                              <w:t>5</w:t>
+                              <w:t>1</w:t>
                             </w:r>
                             <w:r>
                               <w:rPr>
@@ -2987,6 +3416,7 @@
       <w:dataBinding w:prefixMappings="xmlns:ns0='http://schemas.openxmlformats.org/package/2006/metadata/core-properties' xmlns:ns1='http://purl.org/dc/elements/1.1/'" w:xpath="/ns0:coreProperties[1]/ns1:title[1]" w:storeItemID="{6C3C8BC8-F283-45AE-878A-BAB7291924A1}"/>
       <w:text/>
     </w:sdtPr>
+    <w:sdtEndPr/>
     <w:sdtContent>
       <w:p>
         <w:pPr>
@@ -6456,7 +6886,9 @@
   <w:rsids>
     <w:rsidRoot w:val="00F072F0"/>
     <w:rsid w:val="00746BEB"/>
+    <w:rsid w:val="00AF7112"/>
     <w:rsid w:val="00F072F0"/>
+    <w:rsid w:val="00FD26D1"/>
   </w:rsids>
   <m:mathPr>
     <m:mathFont m:val="Cambria Math"/>
@@ -7163,7 +7595,7 @@
 </file>
 
 <file path=customXml/itemProps1.xml><?xml version="1.0" encoding="utf-8"?>
-<ds:datastoreItem xmlns:ds="http://schemas.openxmlformats.org/officeDocument/2006/customXml" ds:itemID="{3653B01C-ACF9-4FFA-A0D4-FA5298AA95BD}">
+<ds:datastoreItem xmlns:ds="http://schemas.openxmlformats.org/officeDocument/2006/customXml" ds:itemID="{44442B56-1E12-4A54-9F1A-E0CE7757EE8F}">
   <ds:schemaRefs>
     <ds:schemaRef ds:uri="http://schemas.openxmlformats.org/officeDocument/2006/bibliography"/>
   </ds:schemaRefs>

</xml_diff>

<commit_message>
Our first console - prototype! For V18 STONEWALL U02!
</commit_message>
<xml_diff>
--- a/changelog.docx
+++ b/changelog.docx
@@ -44,7 +44,7 @@
           <w:b/>
           <w:sz w:val="48"/>
         </w:rPr>
-        <w:t>7</w:t>
+        <w:t>8</w:t>
       </w:r>
       <w:r>
         <w:rPr>
@@ -60,7 +60,7 @@
           <w:b/>
           <w:sz w:val="48"/>
         </w:rPr>
-        <w:t>RELIC</w:t>
+        <w:t>STONEWALL</w:t>
       </w:r>
       <w:r>
         <w:rPr>
@@ -215,7 +215,7 @@
           <w:b/>
           <w:sz w:val="48"/>
         </w:rPr>
-        <w:t>RELIC</w:t>
+        <w:t>STONEWALL</w:t>
       </w:r>
       <w:r>
         <w:rPr>
@@ -265,33 +265,23 @@
           <w:sz w:val="32"/>
           <w:szCs w:val="32"/>
         </w:rPr>
-        <w:t>Use F12 to save screenshots.</w:t>
-      </w:r>
-    </w:p>
-    <w:p>
-      <w:pPr>
-        <w:pStyle w:val="NoSpacing"/>
-        <w:jc w:val="center"/>
-      </w:pPr>
-    </w:p>
-    <w:p>
-      <w:pPr>
-        <w:pStyle w:val="NoSpacing"/>
-        <w:rPr>
-          <w:rFonts w:ascii="Verdana" w:hAnsi="Verdana"/>
-          <w:b/>
-          <w:color w:val="FFC000"/>
-          <w:sz w:val="48"/>
-        </w:rPr>
-      </w:pPr>
-      <w:r>
-        <w:rPr>
-          <w:rFonts w:ascii="Verdana" w:hAnsi="Verdana"/>
-          <w:b/>
-          <w:color w:val="FFC000"/>
-          <w:sz w:val="48"/>
-        </w:rPr>
-        <w:t>CHANGES:</w:t>
+        <w:t>Gravity is implemented</w:t>
+      </w:r>
+      <w:r>
+        <w:rPr>
+          <w:rFonts w:ascii="Verdana" w:hAnsi="Verdana"/>
+          <w:sz w:val="32"/>
+          <w:szCs w:val="32"/>
+        </w:rPr>
+        <w:t>.</w:t>
+      </w:r>
+      <w:r>
+        <w:rPr>
+          <w:rFonts w:ascii="Verdana" w:hAnsi="Verdana"/>
+          <w:sz w:val="32"/>
+          <w:szCs w:val="32"/>
+        </w:rPr>
+        <w:t xml:space="preserve"> Affects player and all the objects.</w:t>
       </w:r>
     </w:p>
     <w:p>
@@ -308,70 +298,33 @@
           <w:sz w:val="32"/>
           <w:szCs w:val="32"/>
         </w:rPr>
-        <w:t>Changes</w:t>
-      </w:r>
-      <w:r>
-        <w:rPr>
-          <w:rFonts w:ascii="Verdana" w:hAnsi="Verdana"/>
-          <w:sz w:val="32"/>
-          <w:szCs w:val="32"/>
-        </w:rPr>
-        <w:t xml:space="preserve"> to</w:t>
-      </w:r>
-      <w:r>
-        <w:rPr>
-          <w:rFonts w:ascii="Verdana" w:hAnsi="Verdana"/>
-          <w:sz w:val="32"/>
-          <w:szCs w:val="32"/>
-        </w:rPr>
-        <w:t xml:space="preserve"> </w:t>
-      </w:r>
-      <w:r>
-        <w:rPr>
-          <w:rFonts w:ascii="Verdana" w:hAnsi="Verdana"/>
-          <w:sz w:val="32"/>
-          <w:szCs w:val="32"/>
-        </w:rPr>
-        <w:t>game loops affecting fps.</w:t>
-      </w:r>
-    </w:p>
-    <w:p>
-      <w:pPr>
-        <w:pStyle w:val="NoSpacing"/>
-        <w:rPr>
-          <w:rFonts w:ascii="Verdana" w:hAnsi="Verdana"/>
-          <w:sz w:val="32"/>
-          <w:szCs w:val="32"/>
-        </w:rPr>
-      </w:pPr>
-    </w:p>
-    <w:p>
-      <w:pPr>
-        <w:pStyle w:val="NoSpacing"/>
-        <w:rPr>
-          <w:rFonts w:ascii="Verdana" w:hAnsi="Verdana"/>
-          <w:b/>
-          <w:color w:val="FF0000"/>
-          <w:sz w:val="48"/>
-        </w:rPr>
-      </w:pPr>
-      <w:r>
-        <w:rPr>
-          <w:rFonts w:ascii="Verdana" w:hAnsi="Verdana"/>
-          <w:b/>
-          <w:color w:val="FF0000"/>
-          <w:sz w:val="48"/>
-        </w:rPr>
-        <w:t>FIXE</w:t>
-      </w:r>
-      <w:r>
-        <w:rPr>
-          <w:rFonts w:ascii="Verdana" w:hAnsi="Verdana"/>
-          <w:b/>
-          <w:color w:val="FF0000"/>
-          <w:sz w:val="48"/>
-        </w:rPr>
-        <w:t>S:</w:t>
+        <w:t>Console is implemented. Contains history of input commands.</w:t>
+      </w:r>
+    </w:p>
+    <w:p>
+      <w:pPr>
+        <w:pStyle w:val="NoSpacing"/>
+        <w:jc w:val="center"/>
+      </w:pPr>
+    </w:p>
+    <w:p>
+      <w:pPr>
+        <w:pStyle w:val="NoSpacing"/>
+        <w:rPr>
+          <w:rFonts w:ascii="Verdana" w:hAnsi="Verdana"/>
+          <w:b/>
+          <w:color w:val="FFC000"/>
+          <w:sz w:val="48"/>
+        </w:rPr>
+      </w:pPr>
+      <w:r>
+        <w:rPr>
+          <w:rFonts w:ascii="Verdana" w:hAnsi="Verdana"/>
+          <w:b/>
+          <w:color w:val="FFC000"/>
+          <w:sz w:val="48"/>
+        </w:rPr>
+        <w:t>CHANGES:</w:t>
       </w:r>
     </w:p>
     <w:p>
@@ -388,206 +341,7 @@
           <w:sz w:val="32"/>
           <w:szCs w:val="32"/>
         </w:rPr>
-        <w:t>Update per second is displayed correctly</w:t>
-      </w:r>
-      <w:r>
-        <w:rPr>
-          <w:rFonts w:ascii="Verdana" w:hAnsi="Verdana"/>
-          <w:sz w:val="32"/>
-          <w:szCs w:val="32"/>
-        </w:rPr>
-        <w:t>.</w:t>
-      </w:r>
-    </w:p>
-    <w:p>
-      <w:pPr>
-        <w:pStyle w:val="NoSpacing"/>
-      </w:pPr>
-    </w:p>
-    <w:p>
-      <w:pPr>
-        <w:pStyle w:val="NoSpacing"/>
-        <w:jc w:val="center"/>
-      </w:pPr>
-    </w:p>
-    <w:p>
-      <w:pPr>
-        <w:pStyle w:val="NoSpacing"/>
-        <w:jc w:val="center"/>
-      </w:pPr>
-    </w:p>
-    <w:p>
-      <w:pPr>
-        <w:pStyle w:val="NoSpacing"/>
-        <w:jc w:val="center"/>
-      </w:pPr>
-    </w:p>
-    <w:p>
-      <w:pPr>
-        <w:pStyle w:val="NoSpacing"/>
-        <w:jc w:val="center"/>
-      </w:pPr>
-    </w:p>
-    <w:p>
-      <w:pPr>
-        <w:pStyle w:val="NoSpacing"/>
-        <w:jc w:val="center"/>
-      </w:pPr>
-    </w:p>
-    <w:p>
-      <w:pPr>
-        <w:pStyle w:val="NoSpacing"/>
-        <w:jc w:val="center"/>
-      </w:pPr>
-    </w:p>
-    <w:p>
-      <w:pPr>
-        <w:pStyle w:val="NoSpacing"/>
-        <w:jc w:val="center"/>
-      </w:pPr>
-    </w:p>
-    <w:p>
-      <w:pPr>
-        <w:pStyle w:val="NoSpacing"/>
-        <w:jc w:val="center"/>
-      </w:pPr>
-    </w:p>
-    <w:p>
-      <w:pPr>
-        <w:pStyle w:val="NoSpacing"/>
-        <w:jc w:val="center"/>
-      </w:pPr>
-    </w:p>
-    <w:p>
-      <w:pPr>
-        <w:pStyle w:val="NoSpacing"/>
-        <w:jc w:val="center"/>
-      </w:pPr>
-    </w:p>
-    <w:p>
-      <w:pPr>
-        <w:pStyle w:val="NoSpacing"/>
-        <w:jc w:val="center"/>
-      </w:pPr>
-    </w:p>
-    <w:p>
-      <w:pPr>
-        <w:pStyle w:val="NoSpacing"/>
-        <w:jc w:val="center"/>
-      </w:pPr>
-    </w:p>
-    <w:p>
-      <w:pPr>
-        <w:pStyle w:val="NoSpacing"/>
-        <w:jc w:val="center"/>
-      </w:pPr>
-    </w:p>
-    <w:p>
-      <w:pPr>
-        <w:pStyle w:val="NoSpacing"/>
-        <w:jc w:val="center"/>
-      </w:pPr>
-    </w:p>
-    <w:p>
-      <w:pPr>
-        <w:pStyle w:val="NoSpacing"/>
-        <w:jc w:val="center"/>
-      </w:pPr>
-    </w:p>
-    <w:p>
-      <w:pPr>
-        <w:pStyle w:val="NoSpacing"/>
-        <w:jc w:val="center"/>
-      </w:pPr>
-    </w:p>
-    <w:p>
-      <w:pPr>
-        <w:pStyle w:val="NoSpacing"/>
-        <w:jc w:val="center"/>
-      </w:pPr>
-    </w:p>
-    <w:p>
-      <w:pPr>
-        <w:pStyle w:val="NoSpacing"/>
-        <w:jc w:val="center"/>
-      </w:pPr>
-    </w:p>
-    <w:p>
-      <w:pPr>
-        <w:pStyle w:val="NoSpacing"/>
-        <w:jc w:val="center"/>
-      </w:pPr>
-    </w:p>
-    <w:p>
-      <w:pPr>
-        <w:pStyle w:val="NoSpacing"/>
-        <w:jc w:val="center"/>
-      </w:pPr>
-    </w:p>
-    <w:p>
-      <w:pPr>
-        <w:pStyle w:val="NoSpacing"/>
-        <w:jc w:val="center"/>
-      </w:pPr>
-    </w:p>
-    <w:p>
-      <w:pPr>
-        <w:pStyle w:val="NoSpacing"/>
-        <w:jc w:val="center"/>
-        <w:rPr>
-          <w:rFonts w:ascii="Verdana" w:hAnsi="Verdana"/>
-          <w:b/>
-          <w:sz w:val="48"/>
-        </w:rPr>
-      </w:pPr>
-      <w:r>
-        <w:rPr>
-          <w:rFonts w:ascii="Verdana" w:hAnsi="Verdana"/>
-          <w:b/>
-          <w:sz w:val="48"/>
-        </w:rPr>
-        <w:t>[</w:t>
-      </w:r>
-      <w:r>
-        <w:rPr>
-          <w:rFonts w:ascii="Verdana" w:hAnsi="Verdana"/>
-          <w:b/>
-          <w:sz w:val="48"/>
-        </w:rPr>
-        <w:t>PHOSPHORUS</w:t>
-      </w:r>
-      <w:r>
-        <w:rPr>
-          <w:rFonts w:ascii="Verdana" w:hAnsi="Verdana"/>
-          <w:b/>
-          <w:sz w:val="48"/>
-        </w:rPr>
-        <w:t>]</w:t>
-      </w:r>
-    </w:p>
-    <w:p>
-      <w:pPr>
-        <w:pStyle w:val="NoSpacing"/>
-      </w:pPr>
-    </w:p>
-    <w:p>
-      <w:pPr>
-        <w:pStyle w:val="NoSpacing"/>
-        <w:rPr>
-          <w:rFonts w:ascii="Verdana" w:hAnsi="Verdana"/>
-          <w:b/>
-          <w:color w:val="00B050"/>
-          <w:sz w:val="48"/>
-        </w:rPr>
-      </w:pPr>
-      <w:r>
-        <w:rPr>
-          <w:rFonts w:ascii="Verdana" w:hAnsi="Verdana"/>
-          <w:b/>
-          <w:color w:val="00B050"/>
-          <w:sz w:val="48"/>
-        </w:rPr>
-        <w:t>FEATURES:</w:t>
+        <w:t>Shift key is used when fluids block are being selected or placed adjacently to selected fluid block.</w:t>
       </w:r>
     </w:p>
     <w:p>
@@ -604,33 +358,203 @@
           <w:sz w:val="32"/>
           <w:szCs w:val="32"/>
         </w:rPr>
-        <w:t>Menu interaction using mouse besides keyboard. Cursor implemented.</w:t>
-      </w:r>
-    </w:p>
-    <w:p>
-      <w:pPr>
-        <w:pStyle w:val="NoSpacing"/>
-        <w:jc w:val="center"/>
-      </w:pPr>
-    </w:p>
-    <w:p>
-      <w:pPr>
-        <w:pStyle w:val="NoSpacing"/>
-        <w:rPr>
-          <w:rFonts w:ascii="Verdana" w:hAnsi="Verdana"/>
-          <w:b/>
-          <w:color w:val="FFC000"/>
-          <w:sz w:val="48"/>
-        </w:rPr>
-      </w:pPr>
-      <w:r>
-        <w:rPr>
-          <w:rFonts w:ascii="Verdana" w:hAnsi="Verdana"/>
-          <w:b/>
-          <w:color w:val="FFC000"/>
-          <w:sz w:val="48"/>
-        </w:rPr>
-        <w:t>CHANGES:</w:t>
+        <w:t>Selected fluid block has enabled all faces on selection.</w:t>
+      </w:r>
+    </w:p>
+    <w:p>
+      <w:pPr>
+        <w:pStyle w:val="NoSpacing"/>
+        <w:rPr>
+          <w:rFonts w:ascii="Verdana" w:hAnsi="Verdana"/>
+          <w:sz w:val="32"/>
+          <w:szCs w:val="32"/>
+        </w:rPr>
+      </w:pPr>
+    </w:p>
+    <w:p>
+      <w:pPr>
+        <w:pStyle w:val="NoSpacing"/>
+        <w:rPr>
+          <w:rFonts w:ascii="Verdana" w:hAnsi="Verdana"/>
+          <w:b/>
+          <w:color w:val="FF0000"/>
+          <w:sz w:val="48"/>
+        </w:rPr>
+      </w:pPr>
+      <w:r>
+        <w:rPr>
+          <w:rFonts w:ascii="Verdana" w:hAnsi="Verdana"/>
+          <w:b/>
+          <w:color w:val="FF0000"/>
+          <w:sz w:val="48"/>
+        </w:rPr>
+        <w:t>FIXES:</w:t>
+      </w:r>
+    </w:p>
+    <w:p>
+      <w:pPr>
+        <w:pStyle w:val="NoSpacing"/>
+      </w:pPr>
+      <w:bookmarkStart w:id="0" w:name="_GoBack"/>
+      <w:bookmarkEnd w:id="0"/>
+    </w:p>
+    <w:p>
+      <w:pPr>
+        <w:pStyle w:val="NoSpacing"/>
+        <w:jc w:val="center"/>
+        <w:rPr>
+          <w:rFonts w:ascii="Verdana" w:hAnsi="Verdana"/>
+          <w:b/>
+          <w:sz w:val="48"/>
+        </w:rPr>
+      </w:pPr>
+    </w:p>
+    <w:p>
+      <w:pPr>
+        <w:pStyle w:val="NoSpacing"/>
+        <w:jc w:val="center"/>
+        <w:rPr>
+          <w:rFonts w:ascii="Verdana" w:hAnsi="Verdana"/>
+          <w:b/>
+          <w:sz w:val="48"/>
+        </w:rPr>
+      </w:pPr>
+    </w:p>
+    <w:p>
+      <w:pPr>
+        <w:pStyle w:val="NoSpacing"/>
+        <w:jc w:val="center"/>
+        <w:rPr>
+          <w:rFonts w:ascii="Verdana" w:hAnsi="Verdana"/>
+          <w:b/>
+          <w:sz w:val="48"/>
+        </w:rPr>
+      </w:pPr>
+    </w:p>
+    <w:p>
+      <w:pPr>
+        <w:pStyle w:val="NoSpacing"/>
+        <w:jc w:val="center"/>
+        <w:rPr>
+          <w:rFonts w:ascii="Verdana" w:hAnsi="Verdana"/>
+          <w:b/>
+          <w:sz w:val="48"/>
+        </w:rPr>
+      </w:pPr>
+    </w:p>
+    <w:p>
+      <w:pPr>
+        <w:pStyle w:val="NoSpacing"/>
+        <w:jc w:val="center"/>
+        <w:rPr>
+          <w:rFonts w:ascii="Verdana" w:hAnsi="Verdana"/>
+          <w:b/>
+          <w:sz w:val="48"/>
+        </w:rPr>
+      </w:pPr>
+    </w:p>
+    <w:p>
+      <w:pPr>
+        <w:pStyle w:val="NoSpacing"/>
+        <w:jc w:val="center"/>
+        <w:rPr>
+          <w:rFonts w:ascii="Verdana" w:hAnsi="Verdana"/>
+          <w:b/>
+          <w:sz w:val="48"/>
+        </w:rPr>
+      </w:pPr>
+    </w:p>
+    <w:p>
+      <w:pPr>
+        <w:pStyle w:val="NoSpacing"/>
+        <w:jc w:val="center"/>
+        <w:rPr>
+          <w:rFonts w:ascii="Verdana" w:hAnsi="Verdana"/>
+          <w:b/>
+          <w:sz w:val="48"/>
+        </w:rPr>
+      </w:pPr>
+    </w:p>
+    <w:p>
+      <w:pPr>
+        <w:pStyle w:val="NoSpacing"/>
+        <w:jc w:val="center"/>
+        <w:rPr>
+          <w:rFonts w:ascii="Verdana" w:hAnsi="Verdana"/>
+          <w:b/>
+          <w:sz w:val="48"/>
+        </w:rPr>
+      </w:pPr>
+    </w:p>
+    <w:p>
+      <w:pPr>
+        <w:pStyle w:val="NoSpacing"/>
+        <w:jc w:val="center"/>
+        <w:rPr>
+          <w:rFonts w:ascii="Verdana" w:hAnsi="Verdana"/>
+          <w:b/>
+          <w:sz w:val="48"/>
+        </w:rPr>
+      </w:pPr>
+    </w:p>
+    <w:p>
+      <w:pPr>
+        <w:pStyle w:val="NoSpacing"/>
+        <w:jc w:val="center"/>
+        <w:rPr>
+          <w:rFonts w:ascii="Verdana" w:hAnsi="Verdana"/>
+          <w:b/>
+          <w:sz w:val="48"/>
+        </w:rPr>
+      </w:pPr>
+      <w:r>
+        <w:rPr>
+          <w:rFonts w:ascii="Verdana" w:hAnsi="Verdana"/>
+          <w:b/>
+          <w:sz w:val="48"/>
+        </w:rPr>
+        <w:t>[</w:t>
+      </w:r>
+      <w:r>
+        <w:rPr>
+          <w:rFonts w:ascii="Verdana" w:hAnsi="Verdana"/>
+          <w:b/>
+          <w:sz w:val="48"/>
+        </w:rPr>
+        <w:t>RELIC</w:t>
+      </w:r>
+      <w:r>
+        <w:rPr>
+          <w:rFonts w:ascii="Verdana" w:hAnsi="Verdana"/>
+          <w:b/>
+          <w:sz w:val="48"/>
+        </w:rPr>
+        <w:t>]</w:t>
+      </w:r>
+    </w:p>
+    <w:p>
+      <w:pPr>
+        <w:pStyle w:val="NoSpacing"/>
+      </w:pPr>
+    </w:p>
+    <w:p>
+      <w:pPr>
+        <w:pStyle w:val="NoSpacing"/>
+        <w:rPr>
+          <w:rFonts w:ascii="Verdana" w:hAnsi="Verdana"/>
+          <w:b/>
+          <w:color w:val="00B050"/>
+          <w:sz w:val="48"/>
+        </w:rPr>
+      </w:pPr>
+      <w:r>
+        <w:rPr>
+          <w:rFonts w:ascii="Verdana" w:hAnsi="Verdana"/>
+          <w:b/>
+          <w:color w:val="00B050"/>
+          <w:sz w:val="48"/>
+        </w:rPr>
+        <w:t>FEATURES:</w:t>
       </w:r>
     </w:p>
     <w:p>
@@ -640,322 +564,40 @@
           <w:ilvl w:val="0"/>
           <w:numId w:val="22"/>
         </w:numPr>
-        <w:rPr>
-          <w:rFonts w:ascii="Verdana" w:hAnsi="Verdana"/>
-          <w:sz w:val="32"/>
-          <w:szCs w:val="32"/>
-        </w:rPr>
-      </w:pPr>
-      <w:r>
-        <w:rPr>
-          <w:rFonts w:ascii="Verdana" w:hAnsi="Verdana"/>
-          <w:sz w:val="32"/>
-          <w:szCs w:val="32"/>
-        </w:rPr>
-        <w:t>Changes in block add/</w:t>
-      </w:r>
-      <w:proofErr w:type="gramStart"/>
-      <w:r>
-        <w:rPr>
-          <w:rFonts w:ascii="Verdana" w:hAnsi="Verdana"/>
-          <w:sz w:val="32"/>
-          <w:szCs w:val="32"/>
-        </w:rPr>
-        <w:t>removal resulting in faster block</w:t>
-      </w:r>
-      <w:proofErr w:type="gramEnd"/>
-      <w:r>
-        <w:rPr>
-          <w:rFonts w:ascii="Verdana" w:hAnsi="Verdana"/>
-          <w:sz w:val="32"/>
-          <w:szCs w:val="32"/>
-        </w:rPr>
-        <w:t xml:space="preserve"> operations, faster level generation, level saving and loading.</w:t>
-      </w:r>
-    </w:p>
-    <w:p>
-      <w:pPr>
-        <w:pStyle w:val="NoSpacing"/>
-        <w:jc w:val="center"/>
-      </w:pPr>
-    </w:p>
-    <w:p>
-      <w:pPr>
-        <w:pStyle w:val="NoSpacing"/>
-        <w:jc w:val="center"/>
-      </w:pPr>
-    </w:p>
-    <w:p>
-      <w:pPr>
-        <w:pStyle w:val="NoSpacing"/>
-        <w:jc w:val="center"/>
-      </w:pPr>
-    </w:p>
-    <w:p>
-      <w:pPr>
-        <w:pStyle w:val="NoSpacing"/>
-        <w:jc w:val="center"/>
-      </w:pPr>
-    </w:p>
-    <w:p>
-      <w:pPr>
-        <w:pStyle w:val="NoSpacing"/>
-        <w:jc w:val="center"/>
-      </w:pPr>
-    </w:p>
-    <w:p>
-      <w:pPr>
-        <w:pStyle w:val="NoSpacing"/>
-        <w:jc w:val="center"/>
-      </w:pPr>
-    </w:p>
-    <w:p>
-      <w:pPr>
-        <w:pStyle w:val="NoSpacing"/>
-        <w:jc w:val="center"/>
-      </w:pPr>
-    </w:p>
-    <w:p>
-      <w:pPr>
-        <w:pStyle w:val="NoSpacing"/>
-        <w:jc w:val="center"/>
-      </w:pPr>
-    </w:p>
-    <w:p>
-      <w:pPr>
-        <w:pStyle w:val="NoSpacing"/>
-        <w:jc w:val="center"/>
-      </w:pPr>
-    </w:p>
-    <w:p>
-      <w:pPr>
-        <w:pStyle w:val="NoSpacing"/>
-        <w:jc w:val="center"/>
-      </w:pPr>
-    </w:p>
-    <w:p>
-      <w:pPr>
-        <w:pStyle w:val="NoSpacing"/>
-        <w:jc w:val="center"/>
-      </w:pPr>
-    </w:p>
-    <w:p>
-      <w:pPr>
-        <w:pStyle w:val="NoSpacing"/>
-        <w:jc w:val="center"/>
-      </w:pPr>
-    </w:p>
-    <w:p>
-      <w:pPr>
-        <w:pStyle w:val="NoSpacing"/>
-        <w:jc w:val="center"/>
-      </w:pPr>
-    </w:p>
-    <w:p>
-      <w:pPr>
-        <w:pStyle w:val="NoSpacing"/>
-        <w:jc w:val="center"/>
-      </w:pPr>
-    </w:p>
-    <w:p>
-      <w:pPr>
-        <w:pStyle w:val="NoSpacing"/>
-        <w:jc w:val="center"/>
-      </w:pPr>
-    </w:p>
-    <w:p>
-      <w:pPr>
-        <w:pStyle w:val="NoSpacing"/>
-        <w:jc w:val="center"/>
-      </w:pPr>
-    </w:p>
-    <w:p>
-      <w:pPr>
-        <w:pStyle w:val="NoSpacing"/>
-        <w:jc w:val="center"/>
-      </w:pPr>
-    </w:p>
-    <w:p>
-      <w:pPr>
-        <w:pStyle w:val="NoSpacing"/>
-        <w:jc w:val="center"/>
-      </w:pPr>
-    </w:p>
-    <w:p>
-      <w:pPr>
-        <w:pStyle w:val="NoSpacing"/>
-        <w:jc w:val="center"/>
-      </w:pPr>
-    </w:p>
-    <w:p>
-      <w:pPr>
-        <w:pStyle w:val="NoSpacing"/>
-        <w:jc w:val="center"/>
-      </w:pPr>
-    </w:p>
-    <w:p>
-      <w:pPr>
-        <w:pStyle w:val="NoSpacing"/>
-        <w:jc w:val="center"/>
-      </w:pPr>
-    </w:p>
-    <w:p>
-      <w:pPr>
-        <w:pStyle w:val="NoSpacing"/>
-        <w:jc w:val="center"/>
-      </w:pPr>
-    </w:p>
-    <w:p>
-      <w:pPr>
-        <w:pStyle w:val="NoSpacing"/>
-        <w:jc w:val="center"/>
-      </w:pPr>
-    </w:p>
-    <w:p>
-      <w:pPr>
-        <w:pStyle w:val="NoSpacing"/>
-        <w:jc w:val="center"/>
-      </w:pPr>
-    </w:p>
-    <w:p>
-      <w:pPr>
-        <w:pStyle w:val="NoSpacing"/>
-        <w:jc w:val="center"/>
-      </w:pPr>
-    </w:p>
-    <w:p>
-      <w:pPr>
-        <w:pStyle w:val="NoSpacing"/>
-        <w:jc w:val="center"/>
-      </w:pPr>
-    </w:p>
-    <w:p>
-      <w:pPr>
-        <w:pStyle w:val="NoSpacing"/>
-        <w:jc w:val="center"/>
-      </w:pPr>
-    </w:p>
-    <w:p>
-      <w:pPr>
-        <w:pStyle w:val="NoSpacing"/>
-        <w:jc w:val="center"/>
-      </w:pPr>
-    </w:p>
-    <w:p>
-      <w:pPr>
-        <w:pStyle w:val="NoSpacing"/>
-        <w:jc w:val="center"/>
-      </w:pPr>
-    </w:p>
-    <w:p>
-      <w:pPr>
-        <w:pStyle w:val="NoSpacing"/>
-        <w:jc w:val="center"/>
-      </w:pPr>
-    </w:p>
-    <w:p>
-      <w:pPr>
-        <w:pStyle w:val="NoSpacing"/>
-        <w:jc w:val="center"/>
-      </w:pPr>
-    </w:p>
-    <w:p>
-      <w:pPr>
-        <w:pStyle w:val="NoSpacing"/>
-        <w:jc w:val="center"/>
-      </w:pPr>
-    </w:p>
-    <w:p>
-      <w:pPr>
-        <w:pStyle w:val="NoSpacing"/>
-        <w:jc w:val="center"/>
-      </w:pPr>
-    </w:p>
-    <w:p>
-      <w:pPr>
-        <w:pStyle w:val="NoSpacing"/>
-        <w:jc w:val="center"/>
-      </w:pPr>
-    </w:p>
-    <w:p>
-      <w:pPr>
-        <w:pStyle w:val="NoSpacing"/>
-        <w:jc w:val="center"/>
-      </w:pPr>
-    </w:p>
-    <w:p>
-      <w:pPr>
-        <w:pStyle w:val="NoSpacing"/>
-        <w:jc w:val="center"/>
-      </w:pPr>
-    </w:p>
-    <w:p>
-      <w:pPr>
-        <w:pStyle w:val="NoSpacing"/>
-        <w:jc w:val="center"/>
-        <w:rPr>
-          <w:rFonts w:ascii="Verdana" w:hAnsi="Verdana"/>
-          <w:b/>
-          <w:sz w:val="48"/>
-        </w:rPr>
-      </w:pPr>
-      <w:bookmarkStart w:id="0" w:name="_GoBack"/>
-      <w:bookmarkEnd w:id="0"/>
-      <w:r>
-        <w:rPr>
-          <w:rFonts w:ascii="Verdana" w:hAnsi="Verdana"/>
-          <w:b/>
-          <w:sz w:val="48"/>
-        </w:rPr>
-        <w:lastRenderedPageBreak/>
-        <w:t>[</w:t>
-      </w:r>
-      <w:r>
-        <w:rPr>
-          <w:rFonts w:ascii="Verdana" w:hAnsi="Verdana"/>
-          <w:b/>
-          <w:sz w:val="48"/>
-        </w:rPr>
-        <w:t>OXYGEN</w:t>
-      </w:r>
-      <w:r>
-        <w:rPr>
-          <w:rFonts w:ascii="Verdana" w:hAnsi="Verdana"/>
-          <w:b/>
-          <w:sz w:val="48"/>
-        </w:rPr>
-        <w:t>]</w:t>
-      </w:r>
-    </w:p>
-    <w:p>
-      <w:pPr>
-        <w:pStyle w:val="NoSpacing"/>
-        <w:jc w:val="center"/>
-        <w:rPr>
-          <w:rFonts w:ascii="Verdana" w:hAnsi="Verdana"/>
-          <w:b/>
-          <w:sz w:val="48"/>
-        </w:rPr>
-      </w:pPr>
-    </w:p>
-    <w:p>
-      <w:pPr>
-        <w:pStyle w:val="NoSpacing"/>
-        <w:rPr>
-          <w:rFonts w:ascii="Verdana" w:hAnsi="Verdana"/>
-          <w:b/>
-          <w:color w:val="00B050"/>
-          <w:sz w:val="48"/>
-        </w:rPr>
-      </w:pPr>
-      <w:r>
-        <w:rPr>
-          <w:rFonts w:ascii="Verdana" w:hAnsi="Verdana"/>
-          <w:b/>
-          <w:color w:val="00B050"/>
-          <w:sz w:val="48"/>
-        </w:rPr>
-        <w:t>FEATURES:</w:t>
+      </w:pPr>
+      <w:r>
+        <w:rPr>
+          <w:rFonts w:ascii="Verdana" w:hAnsi="Verdana"/>
+          <w:sz w:val="32"/>
+          <w:szCs w:val="32"/>
+        </w:rPr>
+        <w:t>Use F12 to save screenshots.</w:t>
+      </w:r>
+    </w:p>
+    <w:p>
+      <w:pPr>
+        <w:pStyle w:val="NoSpacing"/>
+        <w:jc w:val="center"/>
+      </w:pPr>
+    </w:p>
+    <w:p>
+      <w:pPr>
+        <w:pStyle w:val="NoSpacing"/>
+        <w:rPr>
+          <w:rFonts w:ascii="Verdana" w:hAnsi="Verdana"/>
+          <w:b/>
+          <w:color w:val="FFC000"/>
+          <w:sz w:val="48"/>
+        </w:rPr>
+      </w:pPr>
+      <w:r>
+        <w:rPr>
+          <w:rFonts w:ascii="Verdana" w:hAnsi="Verdana"/>
+          <w:b/>
+          <w:color w:val="FFC000"/>
+          <w:sz w:val="48"/>
+        </w:rPr>
+        <w:t>CHANGES:</w:t>
       </w:r>
     </w:p>
     <w:p>
@@ -965,71 +607,69 @@
           <w:ilvl w:val="0"/>
           <w:numId w:val="22"/>
         </w:numPr>
-        <w:rPr>
-          <w:rFonts w:ascii="Verdana" w:hAnsi="Verdana"/>
-          <w:sz w:val="32"/>
-          <w:szCs w:val="32"/>
-        </w:rPr>
-      </w:pPr>
-      <w:r>
-        <w:rPr>
-          <w:rFonts w:ascii="Verdana" w:hAnsi="Verdana"/>
-          <w:sz w:val="32"/>
-          <w:szCs w:val="32"/>
-        </w:rPr>
-        <w:t xml:space="preserve">Single player has been unlocked. Player is able to wield one of the six guns (Beretta pistol, </w:t>
-      </w:r>
-      <w:r>
-        <w:rPr>
-          <w:rFonts w:ascii="Verdana" w:hAnsi="Verdana"/>
-          <w:sz w:val="32"/>
-          <w:szCs w:val="32"/>
-        </w:rPr>
-        <w:t>SMG P90</w:t>
-      </w:r>
-      <w:r>
-        <w:rPr>
-          <w:rFonts w:ascii="Verdana" w:hAnsi="Verdana"/>
-          <w:sz w:val="32"/>
-          <w:szCs w:val="32"/>
-        </w:rPr>
-        <w:t xml:space="preserve">, Shotgun, </w:t>
-      </w:r>
-      <w:r>
-        <w:rPr>
-          <w:rFonts w:ascii="Verdana" w:hAnsi="Verdana"/>
-          <w:sz w:val="32"/>
-          <w:szCs w:val="32"/>
-        </w:rPr>
-        <w:t>Assault rifle AK-47</w:t>
-      </w:r>
-      <w:r>
-        <w:rPr>
-          <w:rFonts w:ascii="Verdana" w:hAnsi="Verdana"/>
-          <w:sz w:val="32"/>
-          <w:szCs w:val="32"/>
-        </w:rPr>
-        <w:t>, M60, Sniper Rifle). However there’re no animations for these guns.</w:t>
-      </w:r>
-      <w:r>
-        <w:rPr>
-          <w:rFonts w:ascii="Verdana" w:hAnsi="Verdana"/>
-          <w:sz w:val="32"/>
-          <w:szCs w:val="32"/>
-        </w:rPr>
-        <w:t xml:space="preserve"> Neither fire or alt-fire have been implemented yet.</w:t>
-      </w:r>
-    </w:p>
-    <w:p>
-      <w:pPr>
-        <w:pStyle w:val="NoSpacing"/>
-        <w:ind w:left="360"/>
-        <w:rPr>
-          <w:rFonts w:ascii="Verdana" w:hAnsi="Verdana"/>
-          <w:sz w:val="32"/>
-          <w:szCs w:val="32"/>
-        </w:rPr>
-      </w:pPr>
+      </w:pPr>
+      <w:r>
+        <w:rPr>
+          <w:rFonts w:ascii="Verdana" w:hAnsi="Verdana"/>
+          <w:sz w:val="32"/>
+          <w:szCs w:val="32"/>
+        </w:rPr>
+        <w:t>Changes</w:t>
+      </w:r>
+      <w:r>
+        <w:rPr>
+          <w:rFonts w:ascii="Verdana" w:hAnsi="Verdana"/>
+          <w:sz w:val="32"/>
+          <w:szCs w:val="32"/>
+        </w:rPr>
+        <w:t xml:space="preserve"> to</w:t>
+      </w:r>
+      <w:r>
+        <w:rPr>
+          <w:rFonts w:ascii="Verdana" w:hAnsi="Verdana"/>
+          <w:sz w:val="32"/>
+          <w:szCs w:val="32"/>
+        </w:rPr>
+        <w:t xml:space="preserve"> </w:t>
+      </w:r>
+      <w:r>
+        <w:rPr>
+          <w:rFonts w:ascii="Verdana" w:hAnsi="Verdana"/>
+          <w:sz w:val="32"/>
+          <w:szCs w:val="32"/>
+        </w:rPr>
+        <w:t>game loops affecting fps.</w:t>
+      </w:r>
+    </w:p>
+    <w:p>
+      <w:pPr>
+        <w:pStyle w:val="NoSpacing"/>
+        <w:rPr>
+          <w:rFonts w:ascii="Verdana" w:hAnsi="Verdana"/>
+          <w:sz w:val="32"/>
+          <w:szCs w:val="32"/>
+        </w:rPr>
+      </w:pPr>
+    </w:p>
+    <w:p>
+      <w:pPr>
+        <w:pStyle w:val="NoSpacing"/>
+        <w:rPr>
+          <w:rFonts w:ascii="Verdana" w:hAnsi="Verdana"/>
+          <w:b/>
+          <w:color w:val="FF0000"/>
+          <w:sz w:val="48"/>
+        </w:rPr>
+      </w:pPr>
+      <w:r>
+        <w:rPr>
+          <w:rFonts w:ascii="Verdana" w:hAnsi="Verdana"/>
+          <w:b/>
+          <w:color w:val="FF0000"/>
+          <w:sz w:val="48"/>
+        </w:rPr>
+        <w:t>FIXES:</w:t>
+      </w:r>
     </w:p>
     <w:p>
       <w:pPr>
@@ -1038,89 +678,277 @@
           <w:ilvl w:val="0"/>
           <w:numId w:val="22"/>
         </w:numPr>
-        <w:rPr>
-          <w:rFonts w:ascii="Verdana" w:hAnsi="Verdana"/>
-          <w:sz w:val="32"/>
-          <w:szCs w:val="32"/>
-        </w:rPr>
-      </w:pPr>
-      <w:r>
-        <w:rPr>
-          <w:rFonts w:ascii="Verdana" w:hAnsi="Verdana"/>
-          <w:sz w:val="32"/>
-          <w:szCs w:val="32"/>
-        </w:rPr>
-        <w:t xml:space="preserve">Entering single player will cancel editor mode and prevent modifying the level unless player choose to go into editor and load level again. </w:t>
-      </w:r>
-      <w:r>
-        <w:rPr>
-          <w:rFonts w:ascii="Verdana" w:hAnsi="Verdana"/>
-          <w:sz w:val="32"/>
-          <w:szCs w:val="32"/>
-        </w:rPr>
-        <w:t>Player</w:t>
-      </w:r>
-      <w:r>
-        <w:rPr>
-          <w:rFonts w:ascii="Verdana" w:hAnsi="Verdana"/>
-          <w:sz w:val="32"/>
-          <w:szCs w:val="32"/>
-        </w:rPr>
-        <w:t xml:space="preserve"> will be prompted “</w:t>
-      </w:r>
-      <w:r>
-        <w:rPr>
-          <w:rFonts w:ascii="Verdana" w:hAnsi="Verdana"/>
-          <w:sz w:val="32"/>
-          <w:szCs w:val="32"/>
-        </w:rPr>
-        <w:t>Start New G</w:t>
-      </w:r>
-      <w:r>
-        <w:rPr>
-          <w:rFonts w:ascii="Verdana" w:hAnsi="Verdana"/>
-          <w:sz w:val="32"/>
-          <w:szCs w:val="32"/>
-        </w:rPr>
-        <w:t>ame?”</w:t>
-      </w:r>
-      <w:r>
-        <w:rPr>
-          <w:rFonts w:ascii="Verdana" w:hAnsi="Verdana"/>
-          <w:sz w:val="32"/>
-          <w:szCs w:val="32"/>
-        </w:rPr>
-        <w:t xml:space="preserve"> and if answer is yes or y game will switch to Single Player mode.</w:t>
-      </w:r>
-    </w:p>
-    <w:p>
-      <w:pPr>
-        <w:pStyle w:val="NoSpacing"/>
-        <w:rPr>
-          <w:rFonts w:ascii="Verdana" w:hAnsi="Verdana"/>
-          <w:sz w:val="32"/>
-          <w:szCs w:val="32"/>
-        </w:rPr>
-      </w:pPr>
-    </w:p>
-    <w:p>
-      <w:pPr>
-        <w:pStyle w:val="NoSpacing"/>
-        <w:rPr>
-          <w:rFonts w:ascii="Verdana" w:hAnsi="Verdana"/>
-          <w:b/>
-          <w:color w:val="FFC000"/>
-          <w:sz w:val="48"/>
-        </w:rPr>
-      </w:pPr>
-      <w:r>
-        <w:rPr>
-          <w:rFonts w:ascii="Verdana" w:hAnsi="Verdana"/>
-          <w:b/>
-          <w:color w:val="FFC000"/>
-          <w:sz w:val="48"/>
-        </w:rPr>
-        <w:t>CHANGES:</w:t>
+      </w:pPr>
+      <w:r>
+        <w:rPr>
+          <w:rFonts w:ascii="Verdana" w:hAnsi="Verdana"/>
+          <w:sz w:val="32"/>
+          <w:szCs w:val="32"/>
+        </w:rPr>
+        <w:t>Update per second is displayed correctly.</w:t>
+      </w:r>
+    </w:p>
+    <w:p>
+      <w:pPr>
+        <w:pStyle w:val="NoSpacing"/>
+      </w:pPr>
+    </w:p>
+    <w:p>
+      <w:pPr>
+        <w:pStyle w:val="NoSpacing"/>
+        <w:jc w:val="center"/>
+      </w:pPr>
+    </w:p>
+    <w:p>
+      <w:pPr>
+        <w:pStyle w:val="NoSpacing"/>
+        <w:jc w:val="center"/>
+      </w:pPr>
+    </w:p>
+    <w:p>
+      <w:pPr>
+        <w:pStyle w:val="NoSpacing"/>
+        <w:jc w:val="center"/>
+      </w:pPr>
+    </w:p>
+    <w:p>
+      <w:pPr>
+        <w:pStyle w:val="NoSpacing"/>
+        <w:jc w:val="center"/>
+      </w:pPr>
+    </w:p>
+    <w:p>
+      <w:pPr>
+        <w:pStyle w:val="NoSpacing"/>
+        <w:jc w:val="center"/>
+      </w:pPr>
+    </w:p>
+    <w:p>
+      <w:pPr>
+        <w:pStyle w:val="NoSpacing"/>
+        <w:jc w:val="center"/>
+      </w:pPr>
+    </w:p>
+    <w:p>
+      <w:pPr>
+        <w:pStyle w:val="NoSpacing"/>
+        <w:jc w:val="center"/>
+      </w:pPr>
+    </w:p>
+    <w:p>
+      <w:pPr>
+        <w:pStyle w:val="NoSpacing"/>
+        <w:jc w:val="center"/>
+      </w:pPr>
+    </w:p>
+    <w:p>
+      <w:pPr>
+        <w:pStyle w:val="NoSpacing"/>
+        <w:jc w:val="center"/>
+      </w:pPr>
+    </w:p>
+    <w:p>
+      <w:pPr>
+        <w:pStyle w:val="NoSpacing"/>
+        <w:jc w:val="center"/>
+      </w:pPr>
+    </w:p>
+    <w:p>
+      <w:pPr>
+        <w:pStyle w:val="NoSpacing"/>
+        <w:jc w:val="center"/>
+      </w:pPr>
+    </w:p>
+    <w:p>
+      <w:pPr>
+        <w:pStyle w:val="NoSpacing"/>
+        <w:jc w:val="center"/>
+      </w:pPr>
+    </w:p>
+    <w:p>
+      <w:pPr>
+        <w:pStyle w:val="NoSpacing"/>
+        <w:jc w:val="center"/>
+      </w:pPr>
+    </w:p>
+    <w:p>
+      <w:pPr>
+        <w:pStyle w:val="NoSpacing"/>
+        <w:jc w:val="center"/>
+      </w:pPr>
+    </w:p>
+    <w:p>
+      <w:pPr>
+        <w:pStyle w:val="NoSpacing"/>
+        <w:jc w:val="center"/>
+      </w:pPr>
+    </w:p>
+    <w:p>
+      <w:pPr>
+        <w:pStyle w:val="NoSpacing"/>
+        <w:jc w:val="center"/>
+      </w:pPr>
+    </w:p>
+    <w:p>
+      <w:pPr>
+        <w:pStyle w:val="NoSpacing"/>
+        <w:jc w:val="center"/>
+      </w:pPr>
+    </w:p>
+    <w:p>
+      <w:pPr>
+        <w:pStyle w:val="NoSpacing"/>
+        <w:jc w:val="center"/>
+      </w:pPr>
+    </w:p>
+    <w:p>
+      <w:pPr>
+        <w:pStyle w:val="NoSpacing"/>
+        <w:jc w:val="center"/>
+      </w:pPr>
+    </w:p>
+    <w:p>
+      <w:pPr>
+        <w:pStyle w:val="NoSpacing"/>
+        <w:jc w:val="center"/>
+      </w:pPr>
+    </w:p>
+    <w:p>
+      <w:pPr>
+        <w:pStyle w:val="NoSpacing"/>
+        <w:jc w:val="center"/>
+      </w:pPr>
+    </w:p>
+    <w:p>
+      <w:pPr>
+        <w:pStyle w:val="NoSpacing"/>
+        <w:jc w:val="center"/>
+      </w:pPr>
+    </w:p>
+    <w:p>
+      <w:pPr>
+        <w:pStyle w:val="NoSpacing"/>
+        <w:jc w:val="center"/>
+      </w:pPr>
+    </w:p>
+    <w:p>
+      <w:pPr>
+        <w:pStyle w:val="NoSpacing"/>
+        <w:jc w:val="center"/>
+      </w:pPr>
+    </w:p>
+    <w:p>
+      <w:pPr>
+        <w:pStyle w:val="NoSpacing"/>
+        <w:jc w:val="center"/>
+      </w:pPr>
+    </w:p>
+    <w:p>
+      <w:pPr>
+        <w:pStyle w:val="NoSpacing"/>
+        <w:jc w:val="center"/>
+      </w:pPr>
+    </w:p>
+    <w:p>
+      <w:pPr>
+        <w:pStyle w:val="NoSpacing"/>
+        <w:jc w:val="center"/>
+      </w:pPr>
+    </w:p>
+    <w:p>
+      <w:pPr>
+        <w:pStyle w:val="NoSpacing"/>
+        <w:jc w:val="center"/>
+      </w:pPr>
+    </w:p>
+    <w:p>
+      <w:pPr>
+        <w:pStyle w:val="NoSpacing"/>
+        <w:jc w:val="center"/>
+      </w:pPr>
+    </w:p>
+    <w:p>
+      <w:pPr>
+        <w:pStyle w:val="NoSpacing"/>
+        <w:jc w:val="center"/>
+      </w:pPr>
+    </w:p>
+    <w:p>
+      <w:pPr>
+        <w:pStyle w:val="NoSpacing"/>
+        <w:jc w:val="center"/>
+      </w:pPr>
+    </w:p>
+    <w:p>
+      <w:pPr>
+        <w:pStyle w:val="NoSpacing"/>
+        <w:jc w:val="center"/>
+      </w:pPr>
+    </w:p>
+    <w:p>
+      <w:pPr>
+        <w:pStyle w:val="NoSpacing"/>
+        <w:jc w:val="center"/>
+      </w:pPr>
+    </w:p>
+    <w:p>
+      <w:pPr>
+        <w:pStyle w:val="NoSpacing"/>
+        <w:jc w:val="center"/>
+        <w:rPr>
+          <w:rFonts w:ascii="Verdana" w:hAnsi="Verdana"/>
+          <w:b/>
+          <w:sz w:val="48"/>
+        </w:rPr>
+      </w:pPr>
+      <w:r>
+        <w:rPr>
+          <w:rFonts w:ascii="Verdana" w:hAnsi="Verdana"/>
+          <w:b/>
+          <w:sz w:val="48"/>
+        </w:rPr>
+        <w:t>[</w:t>
+      </w:r>
+      <w:r>
+        <w:rPr>
+          <w:rFonts w:ascii="Verdana" w:hAnsi="Verdana"/>
+          <w:b/>
+          <w:sz w:val="48"/>
+        </w:rPr>
+        <w:t>PHOSPHORUS</w:t>
+      </w:r>
+      <w:r>
+        <w:rPr>
+          <w:rFonts w:ascii="Verdana" w:hAnsi="Verdana"/>
+          <w:b/>
+          <w:sz w:val="48"/>
+        </w:rPr>
+        <w:t>]</w:t>
+      </w:r>
+    </w:p>
+    <w:p>
+      <w:pPr>
+        <w:pStyle w:val="NoSpacing"/>
+      </w:pPr>
+    </w:p>
+    <w:p>
+      <w:pPr>
+        <w:pStyle w:val="NoSpacing"/>
+        <w:rPr>
+          <w:rFonts w:ascii="Verdana" w:hAnsi="Verdana"/>
+          <w:b/>
+          <w:color w:val="00B050"/>
+          <w:sz w:val="48"/>
+        </w:rPr>
+      </w:pPr>
+      <w:r>
+        <w:rPr>
+          <w:rFonts w:ascii="Verdana" w:hAnsi="Verdana"/>
+          <w:b/>
+          <w:color w:val="00B050"/>
+          <w:sz w:val="48"/>
+        </w:rPr>
+        <w:t>FEATURES:</w:t>
       </w:r>
     </w:p>
     <w:p>
@@ -1130,6 +958,536 @@
           <w:ilvl w:val="0"/>
           <w:numId w:val="22"/>
         </w:numPr>
+      </w:pPr>
+      <w:r>
+        <w:rPr>
+          <w:rFonts w:ascii="Verdana" w:hAnsi="Verdana"/>
+          <w:sz w:val="32"/>
+          <w:szCs w:val="32"/>
+        </w:rPr>
+        <w:t>Menu interaction using mouse besides keyboard. Cursor implemented.</w:t>
+      </w:r>
+    </w:p>
+    <w:p>
+      <w:pPr>
+        <w:pStyle w:val="NoSpacing"/>
+        <w:jc w:val="center"/>
+      </w:pPr>
+    </w:p>
+    <w:p>
+      <w:pPr>
+        <w:pStyle w:val="NoSpacing"/>
+        <w:rPr>
+          <w:rFonts w:ascii="Verdana" w:hAnsi="Verdana"/>
+          <w:b/>
+          <w:color w:val="FFC000"/>
+          <w:sz w:val="48"/>
+        </w:rPr>
+      </w:pPr>
+      <w:r>
+        <w:rPr>
+          <w:rFonts w:ascii="Verdana" w:hAnsi="Verdana"/>
+          <w:b/>
+          <w:color w:val="FFC000"/>
+          <w:sz w:val="48"/>
+        </w:rPr>
+        <w:t>CHANGES:</w:t>
+      </w:r>
+    </w:p>
+    <w:p>
+      <w:pPr>
+        <w:pStyle w:val="NoSpacing"/>
+        <w:numPr>
+          <w:ilvl w:val="0"/>
+          <w:numId w:val="22"/>
+        </w:numPr>
+        <w:rPr>
+          <w:rFonts w:ascii="Verdana" w:hAnsi="Verdana"/>
+          <w:sz w:val="32"/>
+          <w:szCs w:val="32"/>
+        </w:rPr>
+      </w:pPr>
+      <w:r>
+        <w:rPr>
+          <w:rFonts w:ascii="Verdana" w:hAnsi="Verdana"/>
+          <w:sz w:val="32"/>
+          <w:szCs w:val="32"/>
+        </w:rPr>
+        <w:t>Changes in block add/</w:t>
+      </w:r>
+      <w:proofErr w:type="gramStart"/>
+      <w:r>
+        <w:rPr>
+          <w:rFonts w:ascii="Verdana" w:hAnsi="Verdana"/>
+          <w:sz w:val="32"/>
+          <w:szCs w:val="32"/>
+        </w:rPr>
+        <w:t>removal resulting in faster block</w:t>
+      </w:r>
+      <w:proofErr w:type="gramEnd"/>
+      <w:r>
+        <w:rPr>
+          <w:rFonts w:ascii="Verdana" w:hAnsi="Verdana"/>
+          <w:sz w:val="32"/>
+          <w:szCs w:val="32"/>
+        </w:rPr>
+        <w:t xml:space="preserve"> operations, faster level generation, level saving and loading.</w:t>
+      </w:r>
+    </w:p>
+    <w:p>
+      <w:pPr>
+        <w:pStyle w:val="NoSpacing"/>
+        <w:jc w:val="center"/>
+      </w:pPr>
+    </w:p>
+    <w:p>
+      <w:pPr>
+        <w:pStyle w:val="NoSpacing"/>
+        <w:jc w:val="center"/>
+      </w:pPr>
+    </w:p>
+    <w:p>
+      <w:pPr>
+        <w:pStyle w:val="NoSpacing"/>
+        <w:jc w:val="center"/>
+      </w:pPr>
+    </w:p>
+    <w:p>
+      <w:pPr>
+        <w:pStyle w:val="NoSpacing"/>
+        <w:jc w:val="center"/>
+      </w:pPr>
+    </w:p>
+    <w:p>
+      <w:pPr>
+        <w:pStyle w:val="NoSpacing"/>
+        <w:jc w:val="center"/>
+      </w:pPr>
+    </w:p>
+    <w:p>
+      <w:pPr>
+        <w:pStyle w:val="NoSpacing"/>
+        <w:jc w:val="center"/>
+      </w:pPr>
+    </w:p>
+    <w:p>
+      <w:pPr>
+        <w:pStyle w:val="NoSpacing"/>
+        <w:jc w:val="center"/>
+      </w:pPr>
+    </w:p>
+    <w:p>
+      <w:pPr>
+        <w:pStyle w:val="NoSpacing"/>
+        <w:jc w:val="center"/>
+      </w:pPr>
+    </w:p>
+    <w:p>
+      <w:pPr>
+        <w:pStyle w:val="NoSpacing"/>
+        <w:jc w:val="center"/>
+      </w:pPr>
+    </w:p>
+    <w:p>
+      <w:pPr>
+        <w:pStyle w:val="NoSpacing"/>
+        <w:jc w:val="center"/>
+      </w:pPr>
+    </w:p>
+    <w:p>
+      <w:pPr>
+        <w:pStyle w:val="NoSpacing"/>
+        <w:jc w:val="center"/>
+      </w:pPr>
+    </w:p>
+    <w:p>
+      <w:pPr>
+        <w:pStyle w:val="NoSpacing"/>
+        <w:jc w:val="center"/>
+      </w:pPr>
+    </w:p>
+    <w:p>
+      <w:pPr>
+        <w:pStyle w:val="NoSpacing"/>
+        <w:jc w:val="center"/>
+      </w:pPr>
+    </w:p>
+    <w:p>
+      <w:pPr>
+        <w:pStyle w:val="NoSpacing"/>
+        <w:jc w:val="center"/>
+      </w:pPr>
+    </w:p>
+    <w:p>
+      <w:pPr>
+        <w:pStyle w:val="NoSpacing"/>
+        <w:jc w:val="center"/>
+      </w:pPr>
+    </w:p>
+    <w:p>
+      <w:pPr>
+        <w:pStyle w:val="NoSpacing"/>
+        <w:jc w:val="center"/>
+      </w:pPr>
+    </w:p>
+    <w:p>
+      <w:pPr>
+        <w:pStyle w:val="NoSpacing"/>
+        <w:jc w:val="center"/>
+      </w:pPr>
+    </w:p>
+    <w:p>
+      <w:pPr>
+        <w:pStyle w:val="NoSpacing"/>
+        <w:jc w:val="center"/>
+      </w:pPr>
+    </w:p>
+    <w:p>
+      <w:pPr>
+        <w:pStyle w:val="NoSpacing"/>
+        <w:jc w:val="center"/>
+      </w:pPr>
+    </w:p>
+    <w:p>
+      <w:pPr>
+        <w:pStyle w:val="NoSpacing"/>
+        <w:jc w:val="center"/>
+      </w:pPr>
+    </w:p>
+    <w:p>
+      <w:pPr>
+        <w:pStyle w:val="NoSpacing"/>
+        <w:jc w:val="center"/>
+      </w:pPr>
+    </w:p>
+    <w:p>
+      <w:pPr>
+        <w:pStyle w:val="NoSpacing"/>
+        <w:jc w:val="center"/>
+      </w:pPr>
+    </w:p>
+    <w:p>
+      <w:pPr>
+        <w:pStyle w:val="NoSpacing"/>
+        <w:jc w:val="center"/>
+      </w:pPr>
+    </w:p>
+    <w:p>
+      <w:pPr>
+        <w:pStyle w:val="NoSpacing"/>
+        <w:jc w:val="center"/>
+      </w:pPr>
+    </w:p>
+    <w:p>
+      <w:pPr>
+        <w:pStyle w:val="NoSpacing"/>
+        <w:jc w:val="center"/>
+      </w:pPr>
+    </w:p>
+    <w:p>
+      <w:pPr>
+        <w:pStyle w:val="NoSpacing"/>
+        <w:jc w:val="center"/>
+      </w:pPr>
+    </w:p>
+    <w:p>
+      <w:pPr>
+        <w:pStyle w:val="NoSpacing"/>
+        <w:jc w:val="center"/>
+      </w:pPr>
+    </w:p>
+    <w:p>
+      <w:pPr>
+        <w:pStyle w:val="NoSpacing"/>
+        <w:jc w:val="center"/>
+      </w:pPr>
+    </w:p>
+    <w:p>
+      <w:pPr>
+        <w:pStyle w:val="NoSpacing"/>
+        <w:jc w:val="center"/>
+      </w:pPr>
+    </w:p>
+    <w:p>
+      <w:pPr>
+        <w:pStyle w:val="NoSpacing"/>
+        <w:jc w:val="center"/>
+      </w:pPr>
+    </w:p>
+    <w:p>
+      <w:pPr>
+        <w:pStyle w:val="NoSpacing"/>
+        <w:jc w:val="center"/>
+      </w:pPr>
+    </w:p>
+    <w:p>
+      <w:pPr>
+        <w:pStyle w:val="NoSpacing"/>
+        <w:jc w:val="center"/>
+      </w:pPr>
+    </w:p>
+    <w:p>
+      <w:pPr>
+        <w:pStyle w:val="NoSpacing"/>
+        <w:jc w:val="center"/>
+      </w:pPr>
+    </w:p>
+    <w:p>
+      <w:pPr>
+        <w:pStyle w:val="NoSpacing"/>
+        <w:jc w:val="center"/>
+      </w:pPr>
+    </w:p>
+    <w:p>
+      <w:pPr>
+        <w:pStyle w:val="NoSpacing"/>
+        <w:jc w:val="center"/>
+      </w:pPr>
+    </w:p>
+    <w:p>
+      <w:pPr>
+        <w:pStyle w:val="NoSpacing"/>
+        <w:jc w:val="center"/>
+      </w:pPr>
+    </w:p>
+    <w:p>
+      <w:pPr>
+        <w:pStyle w:val="NoSpacing"/>
+        <w:jc w:val="center"/>
+        <w:rPr>
+          <w:rFonts w:ascii="Verdana" w:hAnsi="Verdana"/>
+          <w:b/>
+          <w:sz w:val="48"/>
+        </w:rPr>
+      </w:pPr>
+      <w:r>
+        <w:rPr>
+          <w:rFonts w:ascii="Verdana" w:hAnsi="Verdana"/>
+          <w:b/>
+          <w:sz w:val="48"/>
+        </w:rPr>
+        <w:t>[</w:t>
+      </w:r>
+      <w:r>
+        <w:rPr>
+          <w:rFonts w:ascii="Verdana" w:hAnsi="Verdana"/>
+          <w:b/>
+          <w:sz w:val="48"/>
+        </w:rPr>
+        <w:t>OXYGEN</w:t>
+      </w:r>
+      <w:r>
+        <w:rPr>
+          <w:rFonts w:ascii="Verdana" w:hAnsi="Verdana"/>
+          <w:b/>
+          <w:sz w:val="48"/>
+        </w:rPr>
+        <w:t>]</w:t>
+      </w:r>
+    </w:p>
+    <w:p>
+      <w:pPr>
+        <w:pStyle w:val="NoSpacing"/>
+        <w:jc w:val="center"/>
+        <w:rPr>
+          <w:rFonts w:ascii="Verdana" w:hAnsi="Verdana"/>
+          <w:b/>
+          <w:sz w:val="48"/>
+        </w:rPr>
+      </w:pPr>
+    </w:p>
+    <w:p>
+      <w:pPr>
+        <w:pStyle w:val="NoSpacing"/>
+        <w:rPr>
+          <w:rFonts w:ascii="Verdana" w:hAnsi="Verdana"/>
+          <w:b/>
+          <w:color w:val="00B050"/>
+          <w:sz w:val="48"/>
+        </w:rPr>
+      </w:pPr>
+      <w:r>
+        <w:rPr>
+          <w:rFonts w:ascii="Verdana" w:hAnsi="Verdana"/>
+          <w:b/>
+          <w:color w:val="00B050"/>
+          <w:sz w:val="48"/>
+        </w:rPr>
+        <w:t>FEATURES:</w:t>
+      </w:r>
+    </w:p>
+    <w:p>
+      <w:pPr>
+        <w:pStyle w:val="NoSpacing"/>
+        <w:numPr>
+          <w:ilvl w:val="0"/>
+          <w:numId w:val="22"/>
+        </w:numPr>
+        <w:rPr>
+          <w:rFonts w:ascii="Verdana" w:hAnsi="Verdana"/>
+          <w:sz w:val="32"/>
+          <w:szCs w:val="32"/>
+        </w:rPr>
+      </w:pPr>
+      <w:r>
+        <w:rPr>
+          <w:rFonts w:ascii="Verdana" w:hAnsi="Verdana"/>
+          <w:sz w:val="32"/>
+          <w:szCs w:val="32"/>
+        </w:rPr>
+        <w:t xml:space="preserve">Single player has been unlocked. Player is able to wield one of the six guns (Beretta pistol, </w:t>
+      </w:r>
+      <w:r>
+        <w:rPr>
+          <w:rFonts w:ascii="Verdana" w:hAnsi="Verdana"/>
+          <w:sz w:val="32"/>
+          <w:szCs w:val="32"/>
+        </w:rPr>
+        <w:t>SMG P90</w:t>
+      </w:r>
+      <w:r>
+        <w:rPr>
+          <w:rFonts w:ascii="Verdana" w:hAnsi="Verdana"/>
+          <w:sz w:val="32"/>
+          <w:szCs w:val="32"/>
+        </w:rPr>
+        <w:t xml:space="preserve">, Shotgun, </w:t>
+      </w:r>
+      <w:r>
+        <w:rPr>
+          <w:rFonts w:ascii="Verdana" w:hAnsi="Verdana"/>
+          <w:sz w:val="32"/>
+          <w:szCs w:val="32"/>
+        </w:rPr>
+        <w:t>Assault rifle AK-47</w:t>
+      </w:r>
+      <w:r>
+        <w:rPr>
+          <w:rFonts w:ascii="Verdana" w:hAnsi="Verdana"/>
+          <w:sz w:val="32"/>
+          <w:szCs w:val="32"/>
+        </w:rPr>
+        <w:t>, M60, Sniper Rifle). However there’re no animations for these guns.</w:t>
+      </w:r>
+      <w:r>
+        <w:rPr>
+          <w:rFonts w:ascii="Verdana" w:hAnsi="Verdana"/>
+          <w:sz w:val="32"/>
+          <w:szCs w:val="32"/>
+        </w:rPr>
+        <w:t xml:space="preserve"> Neither fire or alt-fire have been implemented yet.</w:t>
+      </w:r>
+    </w:p>
+    <w:p>
+      <w:pPr>
+        <w:pStyle w:val="NoSpacing"/>
+        <w:ind w:left="360"/>
+        <w:rPr>
+          <w:rFonts w:ascii="Verdana" w:hAnsi="Verdana"/>
+          <w:sz w:val="32"/>
+          <w:szCs w:val="32"/>
+        </w:rPr>
+      </w:pPr>
+    </w:p>
+    <w:p>
+      <w:pPr>
+        <w:pStyle w:val="NoSpacing"/>
+        <w:numPr>
+          <w:ilvl w:val="0"/>
+          <w:numId w:val="22"/>
+        </w:numPr>
+        <w:rPr>
+          <w:rFonts w:ascii="Verdana" w:hAnsi="Verdana"/>
+          <w:sz w:val="32"/>
+          <w:szCs w:val="32"/>
+        </w:rPr>
+      </w:pPr>
+      <w:r>
+        <w:rPr>
+          <w:rFonts w:ascii="Verdana" w:hAnsi="Verdana"/>
+          <w:sz w:val="32"/>
+          <w:szCs w:val="32"/>
+        </w:rPr>
+        <w:t xml:space="preserve">Entering single player will cancel editor mode and prevent modifying the level unless player choose to go into editor and load level again. </w:t>
+      </w:r>
+      <w:r>
+        <w:rPr>
+          <w:rFonts w:ascii="Verdana" w:hAnsi="Verdana"/>
+          <w:sz w:val="32"/>
+          <w:szCs w:val="32"/>
+        </w:rPr>
+        <w:t>Player</w:t>
+      </w:r>
+      <w:r>
+        <w:rPr>
+          <w:rFonts w:ascii="Verdana" w:hAnsi="Verdana"/>
+          <w:sz w:val="32"/>
+          <w:szCs w:val="32"/>
+        </w:rPr>
+        <w:t xml:space="preserve"> will be prompted “</w:t>
+      </w:r>
+      <w:r>
+        <w:rPr>
+          <w:rFonts w:ascii="Verdana" w:hAnsi="Verdana"/>
+          <w:sz w:val="32"/>
+          <w:szCs w:val="32"/>
+        </w:rPr>
+        <w:t>Start New G</w:t>
+      </w:r>
+      <w:r>
+        <w:rPr>
+          <w:rFonts w:ascii="Verdana" w:hAnsi="Verdana"/>
+          <w:sz w:val="32"/>
+          <w:szCs w:val="32"/>
+        </w:rPr>
+        <w:t>ame?”</w:t>
+      </w:r>
+      <w:r>
+        <w:rPr>
+          <w:rFonts w:ascii="Verdana" w:hAnsi="Verdana"/>
+          <w:sz w:val="32"/>
+          <w:szCs w:val="32"/>
+        </w:rPr>
+        <w:t xml:space="preserve"> and if answer is yes or y game will switch to Single Player mode.</w:t>
+      </w:r>
+    </w:p>
+    <w:p>
+      <w:pPr>
+        <w:pStyle w:val="NoSpacing"/>
+        <w:rPr>
+          <w:rFonts w:ascii="Verdana" w:hAnsi="Verdana"/>
+          <w:sz w:val="32"/>
+          <w:szCs w:val="32"/>
+        </w:rPr>
+      </w:pPr>
+    </w:p>
+    <w:p>
+      <w:pPr>
+        <w:pStyle w:val="NoSpacing"/>
+        <w:rPr>
+          <w:rFonts w:ascii="Verdana" w:hAnsi="Verdana"/>
+          <w:b/>
+          <w:color w:val="FFC000"/>
+          <w:sz w:val="48"/>
+        </w:rPr>
+      </w:pPr>
+      <w:r>
+        <w:rPr>
+          <w:rFonts w:ascii="Verdana" w:hAnsi="Verdana"/>
+          <w:b/>
+          <w:color w:val="FFC000"/>
+          <w:sz w:val="48"/>
+        </w:rPr>
+        <w:t>CHANGES:</w:t>
+      </w:r>
+    </w:p>
+    <w:p>
+      <w:pPr>
+        <w:pStyle w:val="NoSpacing"/>
+        <w:numPr>
+          <w:ilvl w:val="0"/>
+          <w:numId w:val="22"/>
+        </w:numPr>
         <w:rPr>
           <w:rFonts w:ascii="Verdana" w:hAnsi="Verdana"/>
           <w:sz w:val="32"/>
@@ -1327,7 +1685,6 @@
           <w:b/>
           <w:sz w:val="48"/>
         </w:rPr>
-        <w:lastRenderedPageBreak/>
         <w:t>[</w:t>
       </w:r>
       <w:r>
@@ -1856,7 +2213,6 @@
           <w:b/>
           <w:sz w:val="48"/>
         </w:rPr>
-        <w:lastRenderedPageBreak/>
         <w:t>[LATVIA]</w:t>
       </w:r>
     </w:p>
@@ -2265,7 +2621,6 @@
           <w:b/>
           <w:sz w:val="48"/>
         </w:rPr>
-        <w:lastRenderedPageBreak/>
         <w:t>[</w:t>
       </w:r>
       <w:r>
@@ -2735,7 +3090,6 @@
           <w:b/>
           <w:sz w:val="48"/>
         </w:rPr>
-        <w:lastRenderedPageBreak/>
         <w:t>[</w:t>
       </w:r>
       <w:r>
@@ -3273,7 +3627,7 @@
                                       <w:sz w:val="32"/>
                                       <w:szCs w:val="32"/>
                                     </w:rPr>
-                                    <w:t>1</w:t>
+                                    <w:t>2</w:t>
                                   </w:r>
                                   <w:r>
                                     <w:rPr>
@@ -3339,7 +3693,7 @@
                                 <w:sz w:val="32"/>
                                 <w:szCs w:val="32"/>
                               </w:rPr>
-                              <w:t>1</w:t>
+                              <w:t>2</w:t>
                             </w:r>
                             <w:r>
                               <w:rPr>
@@ -6831,7 +7185,7 @@
     <w:charset w:val="00"/>
     <w:family w:val="modern"/>
     <w:pitch w:val="fixed"/>
-    <w:sig w:usb0="20002A87" w:usb1="00000000" w:usb2="00000000" w:usb3="00000000" w:csb0="000001FF" w:csb1="00000000"/>
+    <w:sig w:usb0="E0002EFF" w:usb1="C0007843" w:usb2="00000009" w:usb3="00000000" w:csb0="000001FF" w:csb1="00000000"/>
   </w:font>
   <w:font w:name="Wingdings">
     <w:panose1 w:val="05000000000000000000"/>
@@ -6851,8 +7205,9 @@
     <w:panose1 w:val="020B0604030504040204"/>
     <w:charset w:val="00"/>
     <w:family w:val="swiss"/>
+    <w:notTrueType/>
     <w:pitch w:val="variable"/>
-    <w:sig w:usb0="E1002EFF" w:usb1="C000605B" w:usb2="00000029" w:usb3="00000000" w:csb0="000101FF" w:csb1="00000000"/>
+    <w:sig w:usb0="00000003" w:usb1="00000000" w:usb2="00000000" w:usb3="00000000" w:csb0="00000001" w:csb1="00000000"/>
   </w:font>
   <w:font w:name="Verdana">
     <w:panose1 w:val="020B0604030504040204"/>
@@ -6885,6 +7240,7 @@
   </w:compat>
   <w:rsids>
     <w:rsidRoot w:val="00F072F0"/>
+    <w:rsid w:val="00627604"/>
     <w:rsid w:val="00746BEB"/>
     <w:rsid w:val="00AF7112"/>
     <w:rsid w:val="00F072F0"/>
@@ -7595,7 +7951,7 @@
 </file>
 
 <file path=customXml/itemProps1.xml><?xml version="1.0" encoding="utf-8"?>
-<ds:datastoreItem xmlns:ds="http://schemas.openxmlformats.org/officeDocument/2006/customXml" ds:itemID="{44442B56-1E12-4A54-9F1A-E0CE7757EE8F}">
+<ds:datastoreItem xmlns:ds="http://schemas.openxmlformats.org/officeDocument/2006/customXml" ds:itemID="{A0927766-4A42-4FD8-A773-46BF60EDC1C6}">
   <ds:schemaRefs>
     <ds:schemaRef ds:uri="http://schemas.openxmlformats.org/officeDocument/2006/bibliography"/>
   </ds:schemaRefs>

</xml_diff>

<commit_message>
Fixing errors for console! For V18 STONEWALL U04!
</commit_message>
<xml_diff>
--- a/changelog.docx
+++ b/changelog.docx
@@ -265,23 +265,21 @@
           <w:sz w:val="32"/>
           <w:szCs w:val="32"/>
         </w:rPr>
-        <w:t>Gravity is implemented</w:t>
-      </w:r>
-      <w:r>
-        <w:rPr>
-          <w:rFonts w:ascii="Verdana" w:hAnsi="Verdana"/>
-          <w:sz w:val="32"/>
-          <w:szCs w:val="32"/>
-        </w:rPr>
-        <w:t>.</w:t>
-      </w:r>
-      <w:r>
-        <w:rPr>
-          <w:rFonts w:ascii="Verdana" w:hAnsi="Verdana"/>
-          <w:sz w:val="32"/>
-          <w:szCs w:val="32"/>
-        </w:rPr>
-        <w:t xml:space="preserve"> Affects player and all the objects.</w:t>
+        <w:t>Safety from unresponsive or failed application is implemented.</w:t>
+      </w:r>
+    </w:p>
+    <w:p>
+      <w:pPr>
+        <w:pStyle w:val="NoSpacing"/>
+        <w:ind w:left="360"/>
+      </w:pPr>
+      <w:r>
+        <w:rPr>
+          <w:rFonts w:ascii="Verdana" w:hAnsi="Verdana"/>
+          <w:sz w:val="32"/>
+          <w:szCs w:val="32"/>
+        </w:rPr>
+        <w:t>If either updates per second or framerate is equal to zero over five seconds application is terminated.</w:t>
       </w:r>
     </w:p>
     <w:p>
@@ -395,124 +393,92 @@
       <w:pPr>
         <w:pStyle w:val="NoSpacing"/>
       </w:pPr>
+    </w:p>
+    <w:p>
+      <w:pPr>
+        <w:pStyle w:val="NoSpacing"/>
+        <w:jc w:val="center"/>
+        <w:rPr>
+          <w:rFonts w:ascii="Verdana" w:hAnsi="Verdana"/>
+          <w:b/>
+          <w:sz w:val="48"/>
+        </w:rPr>
+      </w:pPr>
+    </w:p>
+    <w:p>
+      <w:pPr>
+        <w:pStyle w:val="NoSpacing"/>
+        <w:jc w:val="center"/>
+        <w:rPr>
+          <w:rFonts w:ascii="Verdana" w:hAnsi="Verdana"/>
+          <w:b/>
+          <w:sz w:val="48"/>
+        </w:rPr>
+      </w:pPr>
+    </w:p>
+    <w:p>
+      <w:pPr>
+        <w:pStyle w:val="NoSpacing"/>
+        <w:jc w:val="center"/>
+        <w:rPr>
+          <w:rFonts w:ascii="Verdana" w:hAnsi="Verdana"/>
+          <w:b/>
+          <w:sz w:val="48"/>
+        </w:rPr>
+      </w:pPr>
+    </w:p>
+    <w:p>
+      <w:pPr>
+        <w:pStyle w:val="NoSpacing"/>
+        <w:jc w:val="center"/>
+        <w:rPr>
+          <w:rFonts w:ascii="Verdana" w:hAnsi="Verdana"/>
+          <w:b/>
+          <w:sz w:val="48"/>
+        </w:rPr>
+      </w:pPr>
+    </w:p>
+    <w:p>
+      <w:pPr>
+        <w:pStyle w:val="NoSpacing"/>
+        <w:jc w:val="center"/>
+        <w:rPr>
+          <w:rFonts w:ascii="Verdana" w:hAnsi="Verdana"/>
+          <w:b/>
+          <w:sz w:val="48"/>
+        </w:rPr>
+      </w:pPr>
+    </w:p>
+    <w:p>
+      <w:pPr>
+        <w:pStyle w:val="NoSpacing"/>
+        <w:jc w:val="center"/>
+        <w:rPr>
+          <w:rFonts w:ascii="Verdana" w:hAnsi="Verdana"/>
+          <w:b/>
+          <w:sz w:val="48"/>
+        </w:rPr>
+      </w:pPr>
+    </w:p>
+    <w:p>
+      <w:pPr>
+        <w:pStyle w:val="NoSpacing"/>
+        <w:jc w:val="center"/>
+        <w:rPr>
+          <w:rFonts w:ascii="Verdana" w:hAnsi="Verdana"/>
+          <w:b/>
+          <w:sz w:val="48"/>
+        </w:rPr>
+      </w:pPr>
       <w:bookmarkStart w:id="0" w:name="_GoBack"/>
       <w:bookmarkEnd w:id="0"/>
-    </w:p>
-    <w:p>
-      <w:pPr>
-        <w:pStyle w:val="NoSpacing"/>
-        <w:jc w:val="center"/>
-        <w:rPr>
-          <w:rFonts w:ascii="Verdana" w:hAnsi="Verdana"/>
-          <w:b/>
-          <w:sz w:val="48"/>
-        </w:rPr>
-      </w:pPr>
-    </w:p>
-    <w:p>
-      <w:pPr>
-        <w:pStyle w:val="NoSpacing"/>
-        <w:jc w:val="center"/>
-        <w:rPr>
-          <w:rFonts w:ascii="Verdana" w:hAnsi="Verdana"/>
-          <w:b/>
-          <w:sz w:val="48"/>
-        </w:rPr>
-      </w:pPr>
-    </w:p>
-    <w:p>
-      <w:pPr>
-        <w:pStyle w:val="NoSpacing"/>
-        <w:jc w:val="center"/>
-        <w:rPr>
-          <w:rFonts w:ascii="Verdana" w:hAnsi="Verdana"/>
-          <w:b/>
-          <w:sz w:val="48"/>
-        </w:rPr>
-      </w:pPr>
-    </w:p>
-    <w:p>
-      <w:pPr>
-        <w:pStyle w:val="NoSpacing"/>
-        <w:jc w:val="center"/>
-        <w:rPr>
-          <w:rFonts w:ascii="Verdana" w:hAnsi="Verdana"/>
-          <w:b/>
-          <w:sz w:val="48"/>
-        </w:rPr>
-      </w:pPr>
-    </w:p>
-    <w:p>
-      <w:pPr>
-        <w:pStyle w:val="NoSpacing"/>
-        <w:jc w:val="center"/>
-        <w:rPr>
-          <w:rFonts w:ascii="Verdana" w:hAnsi="Verdana"/>
-          <w:b/>
-          <w:sz w:val="48"/>
-        </w:rPr>
-      </w:pPr>
-    </w:p>
-    <w:p>
-      <w:pPr>
-        <w:pStyle w:val="NoSpacing"/>
-        <w:jc w:val="center"/>
-        <w:rPr>
-          <w:rFonts w:ascii="Verdana" w:hAnsi="Verdana"/>
-          <w:b/>
-          <w:sz w:val="48"/>
-        </w:rPr>
-      </w:pPr>
-    </w:p>
-    <w:p>
-      <w:pPr>
-        <w:pStyle w:val="NoSpacing"/>
-        <w:jc w:val="center"/>
-        <w:rPr>
-          <w:rFonts w:ascii="Verdana" w:hAnsi="Verdana"/>
-          <w:b/>
-          <w:sz w:val="48"/>
-        </w:rPr>
-      </w:pPr>
-    </w:p>
-    <w:p>
-      <w:pPr>
-        <w:pStyle w:val="NoSpacing"/>
-        <w:jc w:val="center"/>
-        <w:rPr>
-          <w:rFonts w:ascii="Verdana" w:hAnsi="Verdana"/>
-          <w:b/>
-          <w:sz w:val="48"/>
-        </w:rPr>
-      </w:pPr>
-    </w:p>
-    <w:p>
-      <w:pPr>
-        <w:pStyle w:val="NoSpacing"/>
-        <w:jc w:val="center"/>
-        <w:rPr>
-          <w:rFonts w:ascii="Verdana" w:hAnsi="Verdana"/>
-          <w:b/>
-          <w:sz w:val="48"/>
-        </w:rPr>
-      </w:pPr>
-    </w:p>
-    <w:p>
-      <w:pPr>
-        <w:pStyle w:val="NoSpacing"/>
-        <w:jc w:val="center"/>
-        <w:rPr>
-          <w:rFonts w:ascii="Verdana" w:hAnsi="Verdana"/>
-          <w:b/>
-          <w:sz w:val="48"/>
-        </w:rPr>
-      </w:pPr>
-      <w:r>
-        <w:rPr>
-          <w:rFonts w:ascii="Verdana" w:hAnsi="Verdana"/>
-          <w:b/>
-          <w:sz w:val="48"/>
-        </w:rPr>
+      <w:r>
+        <w:rPr>
+          <w:rFonts w:ascii="Verdana" w:hAnsi="Verdana"/>
+          <w:b/>
+          <w:sz w:val="48"/>
+        </w:rPr>
+        <w:lastRenderedPageBreak/>
         <w:t>[</w:t>
       </w:r>
       <w:r>
@@ -907,6 +873,7 @@
           <w:b/>
           <w:sz w:val="48"/>
         </w:rPr>
+        <w:lastRenderedPageBreak/>
         <w:t>[</w:t>
       </w:r>
       <w:r>
@@ -1266,6 +1233,7 @@
           <w:b/>
           <w:sz w:val="48"/>
         </w:rPr>
+        <w:lastRenderedPageBreak/>
         <w:t>[</w:t>
       </w:r>
       <w:r>
@@ -1685,6 +1653,7 @@
           <w:b/>
           <w:sz w:val="48"/>
         </w:rPr>
+        <w:lastRenderedPageBreak/>
         <w:t>[</w:t>
       </w:r>
       <w:r>
@@ -2213,6 +2182,7 @@
           <w:b/>
           <w:sz w:val="48"/>
         </w:rPr>
+        <w:lastRenderedPageBreak/>
         <w:t>[LATVIA]</w:t>
       </w:r>
     </w:p>
@@ -2621,6 +2591,7 @@
           <w:b/>
           <w:sz w:val="48"/>
         </w:rPr>
+        <w:lastRenderedPageBreak/>
         <w:t>[</w:t>
       </w:r>
       <w:r>
@@ -3090,6 +3061,7 @@
           <w:b/>
           <w:sz w:val="48"/>
         </w:rPr>
+        <w:lastRenderedPageBreak/>
         <w:t>[</w:t>
       </w:r>
       <w:r>
@@ -3627,7 +3599,7 @@
                                       <w:sz w:val="32"/>
                                       <w:szCs w:val="32"/>
                                     </w:rPr>
-                                    <w:t>2</w:t>
+                                    <w:t>3</w:t>
                                   </w:r>
                                   <w:r>
                                     <w:rPr>
@@ -3693,7 +3665,7 @@
                                 <w:sz w:val="32"/>
                                 <w:szCs w:val="32"/>
                               </w:rPr>
-                              <w:t>2</w:t>
+                              <w:t>3</w:t>
                             </w:r>
                             <w:r>
                               <w:rPr>
@@ -7240,6 +7212,7 @@
   </w:compat>
   <w:rsids>
     <w:rsidRoot w:val="00F072F0"/>
+    <w:rsid w:val="00625DB6"/>
     <w:rsid w:val="00627604"/>
     <w:rsid w:val="00746BEB"/>
     <w:rsid w:val="00AF7112"/>
@@ -7951,7 +7924,7 @@
 </file>
 
 <file path=customXml/itemProps1.xml><?xml version="1.0" encoding="utf-8"?>
-<ds:datastoreItem xmlns:ds="http://schemas.openxmlformats.org/officeDocument/2006/customXml" ds:itemID="{A0927766-4A42-4FD8-A773-46BF60EDC1C6}">
+<ds:datastoreItem xmlns:ds="http://schemas.openxmlformats.org/officeDocument/2006/customXml" ds:itemID="{A85C7EB0-3183-472B-9824-324B66E5E831}">
   <ds:schemaRefs>
     <ds:schemaRef ds:uri="http://schemas.openxmlformats.org/officeDocument/2006/bibliography"/>
   </ds:schemaRefs>

</xml_diff>

<commit_message>
Updating Level Container and Model! For V18 STONEWALL U05!
</commit_message>
<xml_diff>
--- a/changelog.docx
+++ b/changelog.docx
@@ -298,6 +298,32 @@
         </w:rPr>
         <w:t>Console is implemented. Contains history of input commands.</w:t>
       </w:r>
+      <w:r>
+        <w:rPr>
+          <w:rFonts w:ascii="Verdana" w:hAnsi="Verdana"/>
+          <w:sz w:val="32"/>
+          <w:szCs w:val="32"/>
+        </w:rPr>
+        <w:t xml:space="preserve"> [</w:t>
+      </w:r>
+      <w:proofErr w:type="spellStart"/>
+      <w:r>
+        <w:rPr>
+          <w:rFonts w:ascii="Verdana" w:hAnsi="Verdana"/>
+          <w:sz w:val="32"/>
+          <w:szCs w:val="32"/>
+        </w:rPr>
+        <w:t>JSomnia</w:t>
+      </w:r>
+      <w:proofErr w:type="spellEnd"/>
+      <w:r>
+        <w:rPr>
+          <w:rFonts w:ascii="Verdana" w:hAnsi="Verdana"/>
+          <w:sz w:val="32"/>
+          <w:szCs w:val="32"/>
+        </w:rPr>
+        <w:t>]</w:t>
+      </w:r>
     </w:p>
     <w:p>
       <w:pPr>
@@ -374,104 +400,93 @@
         <w:pStyle w:val="NoSpacing"/>
         <w:rPr>
           <w:rFonts w:ascii="Verdana" w:hAnsi="Verdana"/>
-          <w:b/>
-          <w:color w:val="FF0000"/>
-          <w:sz w:val="48"/>
-        </w:rPr>
-      </w:pPr>
-      <w:r>
-        <w:rPr>
-          <w:rFonts w:ascii="Verdana" w:hAnsi="Verdana"/>
-          <w:b/>
-          <w:color w:val="FF0000"/>
-          <w:sz w:val="48"/>
-        </w:rPr>
-        <w:t>FIXES:</w:t>
-      </w:r>
-    </w:p>
-    <w:p>
-      <w:pPr>
-        <w:pStyle w:val="NoSpacing"/>
-      </w:pPr>
-    </w:p>
-    <w:p>
-      <w:pPr>
-        <w:pStyle w:val="NoSpacing"/>
-        <w:jc w:val="center"/>
-        <w:rPr>
-          <w:rFonts w:ascii="Verdana" w:hAnsi="Verdana"/>
-          <w:b/>
-          <w:sz w:val="48"/>
-        </w:rPr>
-      </w:pPr>
-    </w:p>
-    <w:p>
-      <w:pPr>
-        <w:pStyle w:val="NoSpacing"/>
-        <w:jc w:val="center"/>
-        <w:rPr>
-          <w:rFonts w:ascii="Verdana" w:hAnsi="Verdana"/>
-          <w:b/>
-          <w:sz w:val="48"/>
-        </w:rPr>
-      </w:pPr>
-    </w:p>
-    <w:p>
-      <w:pPr>
-        <w:pStyle w:val="NoSpacing"/>
-        <w:jc w:val="center"/>
-        <w:rPr>
-          <w:rFonts w:ascii="Verdana" w:hAnsi="Verdana"/>
-          <w:b/>
-          <w:sz w:val="48"/>
-        </w:rPr>
-      </w:pPr>
-    </w:p>
-    <w:p>
-      <w:pPr>
-        <w:pStyle w:val="NoSpacing"/>
-        <w:jc w:val="center"/>
-        <w:rPr>
-          <w:rFonts w:ascii="Verdana" w:hAnsi="Verdana"/>
-          <w:b/>
-          <w:sz w:val="48"/>
-        </w:rPr>
-      </w:pPr>
-    </w:p>
-    <w:p>
-      <w:pPr>
-        <w:pStyle w:val="NoSpacing"/>
-        <w:jc w:val="center"/>
-        <w:rPr>
-          <w:rFonts w:ascii="Verdana" w:hAnsi="Verdana"/>
-          <w:b/>
-          <w:sz w:val="48"/>
-        </w:rPr>
-      </w:pPr>
-    </w:p>
-    <w:p>
-      <w:pPr>
-        <w:pStyle w:val="NoSpacing"/>
-        <w:jc w:val="center"/>
-        <w:rPr>
-          <w:rFonts w:ascii="Verdana" w:hAnsi="Verdana"/>
-          <w:b/>
-          <w:sz w:val="48"/>
-        </w:rPr>
-      </w:pPr>
-    </w:p>
-    <w:p>
-      <w:pPr>
-        <w:pStyle w:val="NoSpacing"/>
-        <w:jc w:val="center"/>
-        <w:rPr>
-          <w:rFonts w:ascii="Verdana" w:hAnsi="Verdana"/>
-          <w:b/>
-          <w:sz w:val="48"/>
-        </w:rPr>
+          <w:sz w:val="32"/>
+          <w:szCs w:val="32"/>
+        </w:rPr>
+      </w:pPr>
+    </w:p>
+    <w:p>
+      <w:pPr>
+        <w:pStyle w:val="NoSpacing"/>
+        <w:rPr>
+          <w:rFonts w:ascii="Verdana" w:hAnsi="Verdana"/>
+          <w:sz w:val="32"/>
+          <w:szCs w:val="32"/>
+        </w:rPr>
+      </w:pPr>
+    </w:p>
+    <w:p>
+      <w:pPr>
+        <w:pStyle w:val="NoSpacing"/>
       </w:pPr>
       <w:bookmarkStart w:id="0" w:name="_GoBack"/>
       <w:bookmarkEnd w:id="0"/>
+    </w:p>
+    <w:p>
+      <w:pPr>
+        <w:pStyle w:val="NoSpacing"/>
+        <w:jc w:val="center"/>
+        <w:rPr>
+          <w:rFonts w:ascii="Verdana" w:hAnsi="Verdana"/>
+          <w:b/>
+          <w:sz w:val="48"/>
+        </w:rPr>
+      </w:pPr>
+    </w:p>
+    <w:p>
+      <w:pPr>
+        <w:pStyle w:val="NoSpacing"/>
+        <w:jc w:val="center"/>
+        <w:rPr>
+          <w:rFonts w:ascii="Verdana" w:hAnsi="Verdana"/>
+          <w:b/>
+          <w:sz w:val="48"/>
+        </w:rPr>
+      </w:pPr>
+    </w:p>
+    <w:p>
+      <w:pPr>
+        <w:pStyle w:val="NoSpacing"/>
+        <w:jc w:val="center"/>
+        <w:rPr>
+          <w:rFonts w:ascii="Verdana" w:hAnsi="Verdana"/>
+          <w:b/>
+          <w:sz w:val="48"/>
+        </w:rPr>
+      </w:pPr>
+    </w:p>
+    <w:p>
+      <w:pPr>
+        <w:pStyle w:val="NoSpacing"/>
+        <w:jc w:val="center"/>
+        <w:rPr>
+          <w:rFonts w:ascii="Verdana" w:hAnsi="Verdana"/>
+          <w:b/>
+          <w:sz w:val="48"/>
+        </w:rPr>
+      </w:pPr>
+    </w:p>
+    <w:p>
+      <w:pPr>
+        <w:pStyle w:val="NoSpacing"/>
+        <w:jc w:val="center"/>
+        <w:rPr>
+          <w:rFonts w:ascii="Verdana" w:hAnsi="Verdana"/>
+          <w:b/>
+          <w:sz w:val="48"/>
+        </w:rPr>
+      </w:pPr>
+    </w:p>
+    <w:p>
+      <w:pPr>
+        <w:pStyle w:val="NoSpacing"/>
+        <w:jc w:val="center"/>
+        <w:rPr>
+          <w:rFonts w:ascii="Verdana" w:hAnsi="Verdana"/>
+          <w:b/>
+          <w:sz w:val="48"/>
+        </w:rPr>
+      </w:pPr>
       <w:r>
         <w:rPr>
           <w:rFonts w:ascii="Verdana" w:hAnsi="Verdana"/>
@@ -3599,7 +3614,7 @@
                                       <w:sz w:val="32"/>
                                       <w:szCs w:val="32"/>
                                     </w:rPr>
-                                    <w:t>3</w:t>
+                                    <w:t>2</w:t>
                                   </w:r>
                                   <w:r>
                                     <w:rPr>
@@ -3665,7 +3680,7 @@
                                 <w:sz w:val="32"/>
                                 <w:szCs w:val="32"/>
                               </w:rPr>
-                              <w:t>3</w:t>
+                              <w:t>2</w:t>
                             </w:r>
                             <w:r>
                               <w:rPr>
@@ -7216,6 +7231,7 @@
     <w:rsid w:val="00627604"/>
     <w:rsid w:val="00746BEB"/>
     <w:rsid w:val="00AF7112"/>
+    <w:rsid w:val="00C9469B"/>
     <w:rsid w:val="00F072F0"/>
     <w:rsid w:val="00FD26D1"/>
   </w:rsids>
@@ -7924,7 +7940,7 @@
 </file>
 
 <file path=customXml/itemProps1.xml><?xml version="1.0" encoding="utf-8"?>
-<ds:datastoreItem xmlns:ds="http://schemas.openxmlformats.org/officeDocument/2006/customXml" ds:itemID="{A85C7EB0-3183-472B-9824-324B66E5E831}">
+<ds:datastoreItem xmlns:ds="http://schemas.openxmlformats.org/officeDocument/2006/customXml" ds:itemID="{5E7A5D89-3989-4655-9DA6-C5F645E95B00}">
   <ds:schemaRefs>
     <ds:schemaRef ds:uri="http://schemas.openxmlformats.org/officeDocument/2006/bibliography"/>
   </ds:schemaRefs>

</xml_diff>

<commit_message>
Sooner to release! For V18 STONEWALL U35!
</commit_message>
<xml_diff>
--- a/changelog.docx
+++ b/changelog.docx
@@ -388,93 +388,181 @@
     <w:p>
       <w:pPr>
         <w:pStyle w:val="NoSpacing"/>
-        <w:rPr>
-          <w:rFonts w:ascii="Verdana" w:hAnsi="Verdana"/>
-          <w:sz w:val="32"/>
-          <w:szCs w:val="32"/>
-        </w:rPr>
-      </w:pPr>
-    </w:p>
-    <w:p>
-      <w:pPr>
-        <w:pStyle w:val="NoSpacing"/>
-        <w:rPr>
-          <w:rFonts w:ascii="Verdana" w:hAnsi="Verdana"/>
-          <w:sz w:val="32"/>
-          <w:szCs w:val="32"/>
-        </w:rPr>
-      </w:pPr>
-    </w:p>
-    <w:p>
-      <w:pPr>
-        <w:pStyle w:val="NoSpacing"/>
-        <w:rPr>
-          <w:rFonts w:ascii="Verdana" w:hAnsi="Verdana"/>
-          <w:sz w:val="32"/>
-          <w:szCs w:val="32"/>
-        </w:rPr>
-      </w:pPr>
-    </w:p>
-    <w:p>
-      <w:pPr>
-        <w:pStyle w:val="NoSpacing"/>
-      </w:pPr>
+        <w:numPr>
+          <w:ilvl w:val="0"/>
+          <w:numId w:val="22"/>
+        </w:numPr>
+      </w:pPr>
+      <w:r>
+        <w:rPr>
+          <w:rFonts w:ascii="Verdana" w:hAnsi="Verdana"/>
+          <w:sz w:val="32"/>
+          <w:szCs w:val="32"/>
+        </w:rPr>
+        <w:t>Water R</w:t>
+      </w:r>
+      <w:r>
+        <w:rPr>
+          <w:rFonts w:ascii="Verdana" w:hAnsi="Verdana"/>
+          <w:sz w:val="32"/>
+          <w:szCs w:val="32"/>
+        </w:rPr>
+        <w:t xml:space="preserve">enderer </w:t>
+      </w:r>
       <w:bookmarkStart w:id="0" w:name="_GoBack"/>
       <w:bookmarkEnd w:id="0"/>
-    </w:p>
-    <w:p>
-      <w:pPr>
-        <w:pStyle w:val="NoSpacing"/>
-        <w:jc w:val="center"/>
-        <w:rPr>
-          <w:rFonts w:ascii="Verdana" w:hAnsi="Verdana"/>
-          <w:b/>
-          <w:sz w:val="48"/>
-        </w:rPr>
-      </w:pPr>
-    </w:p>
-    <w:p>
-      <w:pPr>
-        <w:pStyle w:val="NoSpacing"/>
-        <w:jc w:val="center"/>
-        <w:rPr>
-          <w:rFonts w:ascii="Verdana" w:hAnsi="Verdana"/>
-          <w:b/>
-          <w:sz w:val="48"/>
-        </w:rPr>
-      </w:pPr>
-    </w:p>
-    <w:p>
-      <w:pPr>
-        <w:pStyle w:val="NoSpacing"/>
-        <w:jc w:val="center"/>
-        <w:rPr>
-          <w:rFonts w:ascii="Verdana" w:hAnsi="Verdana"/>
-          <w:b/>
-          <w:sz w:val="48"/>
-        </w:rPr>
-      </w:pPr>
-    </w:p>
-    <w:p>
-      <w:pPr>
-        <w:pStyle w:val="NoSpacing"/>
-        <w:jc w:val="center"/>
-        <w:rPr>
-          <w:rFonts w:ascii="Verdana" w:hAnsi="Verdana"/>
-          <w:b/>
-          <w:sz w:val="48"/>
-        </w:rPr>
-      </w:pPr>
-    </w:p>
-    <w:p>
-      <w:pPr>
-        <w:pStyle w:val="NoSpacing"/>
-        <w:jc w:val="center"/>
-        <w:rPr>
-          <w:rFonts w:ascii="Verdana" w:hAnsi="Verdana"/>
-          <w:b/>
-          <w:sz w:val="48"/>
-        </w:rPr>
+      <w:r>
+        <w:rPr>
+          <w:rFonts w:ascii="Verdana" w:hAnsi="Verdana"/>
+          <w:sz w:val="32"/>
+          <w:szCs w:val="32"/>
+        </w:rPr>
+        <w:t>lags less</w:t>
+      </w:r>
+      <w:r>
+        <w:rPr>
+          <w:rFonts w:ascii="Verdana" w:hAnsi="Verdana"/>
+          <w:sz w:val="32"/>
+          <w:szCs w:val="32"/>
+        </w:rPr>
+        <w:t>.</w:t>
+      </w:r>
+    </w:p>
+    <w:p>
+      <w:pPr>
+        <w:pStyle w:val="NoSpacing"/>
+        <w:numPr>
+          <w:ilvl w:val="0"/>
+          <w:numId w:val="22"/>
+        </w:numPr>
+      </w:pPr>
+      <w:r>
+        <w:rPr>
+          <w:rFonts w:ascii="Verdana" w:hAnsi="Verdana"/>
+          <w:sz w:val="32"/>
+          <w:szCs w:val="32"/>
+        </w:rPr>
+        <w:t xml:space="preserve">All textures size (except the font sheet) </w:t>
+      </w:r>
+      <w:proofErr w:type="gramStart"/>
+      <w:r>
+        <w:rPr>
+          <w:rFonts w:ascii="Verdana" w:hAnsi="Verdana"/>
+          <w:sz w:val="32"/>
+          <w:szCs w:val="32"/>
+        </w:rPr>
+        <w:t>are</w:t>
+      </w:r>
+      <w:proofErr w:type="gramEnd"/>
+      <w:r>
+        <w:rPr>
+          <w:rFonts w:ascii="Verdana" w:hAnsi="Verdana"/>
+          <w:sz w:val="32"/>
+          <w:szCs w:val="32"/>
+        </w:rPr>
+        <w:t xml:space="preserve"> changed from 512x512 to 256x256.</w:t>
+      </w:r>
+    </w:p>
+    <w:p>
+      <w:pPr>
+        <w:pStyle w:val="NoSpacing"/>
+        <w:numPr>
+          <w:ilvl w:val="0"/>
+          <w:numId w:val="22"/>
+        </w:numPr>
+      </w:pPr>
+      <w:r>
+        <w:rPr>
+          <w:rFonts w:ascii="Verdana" w:hAnsi="Verdana"/>
+          <w:sz w:val="32"/>
+          <w:szCs w:val="32"/>
+        </w:rPr>
+        <w:t>Blocks consume less memory</w:t>
+      </w:r>
+      <w:r>
+        <w:rPr>
+          <w:rFonts w:ascii="Verdana" w:hAnsi="Verdana"/>
+          <w:sz w:val="32"/>
+          <w:szCs w:val="32"/>
+        </w:rPr>
+        <w:t xml:space="preserve"> and faster to create</w:t>
+      </w:r>
+      <w:r>
+        <w:rPr>
+          <w:rFonts w:ascii="Verdana" w:hAnsi="Verdana"/>
+          <w:sz w:val="32"/>
+          <w:szCs w:val="32"/>
+        </w:rPr>
+        <w:t>.</w:t>
+      </w:r>
+    </w:p>
+    <w:p>
+      <w:pPr>
+        <w:pStyle w:val="NoSpacing"/>
+        <w:numPr>
+          <w:ilvl w:val="0"/>
+          <w:numId w:val="22"/>
+        </w:numPr>
+      </w:pPr>
+      <w:r>
+        <w:rPr>
+          <w:rFonts w:ascii="Verdana" w:hAnsi="Verdana"/>
+          <w:sz w:val="32"/>
+          <w:szCs w:val="32"/>
+        </w:rPr>
+        <w:t>Level loading and Random Level generations is much faster now.</w:t>
+      </w:r>
+    </w:p>
+    <w:p>
+      <w:pPr>
+        <w:pStyle w:val="NoSpacing"/>
+        <w:numPr>
+          <w:ilvl w:val="0"/>
+          <w:numId w:val="22"/>
+        </w:numPr>
+      </w:pPr>
+      <w:r>
+        <w:rPr>
+          <w:rFonts w:ascii="Verdana" w:hAnsi="Verdana"/>
+          <w:sz w:val="32"/>
+          <w:szCs w:val="32"/>
+        </w:rPr>
+        <w:t>(Debug) Using F4 will print all the chunk data.</w:t>
+      </w:r>
+    </w:p>
+    <w:p>
+      <w:pPr>
+        <w:pStyle w:val="NoSpacing"/>
+        <w:rPr>
+          <w:rFonts w:ascii="Verdana" w:hAnsi="Verdana"/>
+          <w:sz w:val="32"/>
+          <w:szCs w:val="32"/>
+        </w:rPr>
+      </w:pPr>
+    </w:p>
+    <w:p>
+      <w:pPr>
+        <w:pStyle w:val="NoSpacing"/>
+        <w:rPr>
+          <w:rFonts w:ascii="Verdana" w:hAnsi="Verdana"/>
+          <w:sz w:val="32"/>
+          <w:szCs w:val="32"/>
+        </w:rPr>
+      </w:pPr>
+    </w:p>
+    <w:p>
+      <w:pPr>
+        <w:pStyle w:val="NoSpacing"/>
+        <w:rPr>
+          <w:rFonts w:ascii="Verdana" w:hAnsi="Verdana"/>
+          <w:sz w:val="32"/>
+          <w:szCs w:val="32"/>
+        </w:rPr>
+      </w:pPr>
+    </w:p>
+    <w:p>
+      <w:pPr>
+        <w:pStyle w:val="NoSpacing"/>
       </w:pPr>
     </w:p>
     <w:p>
@@ -3614,7 +3702,7 @@
                                       <w:sz w:val="32"/>
                                       <w:szCs w:val="32"/>
                                     </w:rPr>
-                                    <w:t>2</w:t>
+                                    <w:t>1</w:t>
                                   </w:r>
                                   <w:r>
                                     <w:rPr>
@@ -3680,7 +3768,7 @@
                                 <w:sz w:val="32"/>
                                 <w:szCs w:val="32"/>
                               </w:rPr>
-                              <w:t>2</w:t>
+                              <w:t>1</w:t>
                             </w:r>
                             <w:r>
                               <w:rPr>
@@ -7227,6 +7315,7 @@
   </w:compat>
   <w:rsids>
     <w:rsidRoot w:val="00F072F0"/>
+    <w:rsid w:val="002F7BEE"/>
     <w:rsid w:val="00625DB6"/>
     <w:rsid w:val="00627604"/>
     <w:rsid w:val="00746BEB"/>
@@ -7940,7 +8029,7 @@
 </file>
 
 <file path=customXml/itemProps1.xml><?xml version="1.0" encoding="utf-8"?>
-<ds:datastoreItem xmlns:ds="http://schemas.openxmlformats.org/officeDocument/2006/customXml" ds:itemID="{5E7A5D89-3989-4655-9DA6-C5F645E95B00}">
+<ds:datastoreItem xmlns:ds="http://schemas.openxmlformats.org/officeDocument/2006/customXml" ds:itemID="{6C10EEC4-C155-4A71-9AC3-EC513011F4BB}">
   <ds:schemaRefs>
     <ds:schemaRef ds:uri="http://schemas.openxmlformats.org/officeDocument/2006/bibliography"/>
   </ds:schemaRefs>

</xml_diff>

<commit_message>
Player is back! For V18 STONEWALL U36!
</commit_message>
<xml_diff>
--- a/changelog.docx
+++ b/changelog.docx
@@ -409,8 +409,6 @@
         </w:rPr>
         <w:t xml:space="preserve">enderer </w:t>
       </w:r>
-      <w:bookmarkStart w:id="0" w:name="_GoBack"/>
-      <w:bookmarkEnd w:id="0"/>
       <w:r>
         <w:rPr>
           <w:rFonts w:ascii="Verdana" w:hAnsi="Verdana"/>
@@ -442,25 +440,23 @@
           <w:sz w:val="32"/>
           <w:szCs w:val="32"/>
         </w:rPr>
-        <w:t xml:space="preserve">All textures size (except the font sheet) </w:t>
-      </w:r>
-      <w:proofErr w:type="gramStart"/>
-      <w:r>
-        <w:rPr>
-          <w:rFonts w:ascii="Verdana" w:hAnsi="Verdana"/>
-          <w:sz w:val="32"/>
-          <w:szCs w:val="32"/>
-        </w:rPr>
-        <w:t>are</w:t>
-      </w:r>
-      <w:proofErr w:type="gramEnd"/>
-      <w:r>
-        <w:rPr>
-          <w:rFonts w:ascii="Verdana" w:hAnsi="Verdana"/>
-          <w:sz w:val="32"/>
-          <w:szCs w:val="32"/>
-        </w:rPr>
-        <w:t xml:space="preserve"> changed from 512x512 to 256x256.</w:t>
+        <w:t>Blocks consume less memory</w:t>
+      </w:r>
+      <w:r>
+        <w:rPr>
+          <w:rFonts w:ascii="Verdana" w:hAnsi="Verdana"/>
+          <w:sz w:val="32"/>
+          <w:szCs w:val="32"/>
+        </w:rPr>
+        <w:t xml:space="preserve"> and faster to create</w:t>
+      </w:r>
+      <w:r>
+        <w:rPr>
+          <w:rFonts w:ascii="Verdana" w:hAnsi="Verdana"/>
+          <w:sz w:val="32"/>
+          <w:szCs w:val="32"/>
+        </w:rPr>
+        <w:t>.</w:t>
       </w:r>
     </w:p>
     <w:p>
@@ -477,23 +473,7 @@
           <w:sz w:val="32"/>
           <w:szCs w:val="32"/>
         </w:rPr>
-        <w:t>Blocks consume less memory</w:t>
-      </w:r>
-      <w:r>
-        <w:rPr>
-          <w:rFonts w:ascii="Verdana" w:hAnsi="Verdana"/>
-          <w:sz w:val="32"/>
-          <w:szCs w:val="32"/>
-        </w:rPr>
-        <w:t xml:space="preserve"> and faster to create</w:t>
-      </w:r>
-      <w:r>
-        <w:rPr>
-          <w:rFonts w:ascii="Verdana" w:hAnsi="Verdana"/>
-          <w:sz w:val="32"/>
-          <w:szCs w:val="32"/>
-        </w:rPr>
-        <w:t>.</w:t>
+        <w:t>Level loading and Random Level generations is much faster now.</w:t>
       </w:r>
     </w:p>
     <w:p>
@@ -510,23 +490,6 @@
           <w:sz w:val="32"/>
           <w:szCs w:val="32"/>
         </w:rPr>
-        <w:t>Level loading and Random Level generations is much faster now.</w:t>
-      </w:r>
-    </w:p>
-    <w:p>
-      <w:pPr>
-        <w:pStyle w:val="NoSpacing"/>
-        <w:numPr>
-          <w:ilvl w:val="0"/>
-          <w:numId w:val="22"/>
-        </w:numPr>
-      </w:pPr>
-      <w:r>
-        <w:rPr>
-          <w:rFonts w:ascii="Verdana" w:hAnsi="Verdana"/>
-          <w:sz w:val="32"/>
-          <w:szCs w:val="32"/>
-        </w:rPr>
         <w:t>(Debug) Using F4 will print all the chunk data.</w:t>
       </w:r>
     </w:p>
@@ -549,6 +512,28 @@
           <w:szCs w:val="32"/>
         </w:rPr>
       </w:pPr>
+    </w:p>
+    <w:p>
+      <w:pPr>
+        <w:pStyle w:val="NoSpacing"/>
+        <w:rPr>
+          <w:rFonts w:ascii="Verdana" w:hAnsi="Verdana"/>
+          <w:sz w:val="32"/>
+          <w:szCs w:val="32"/>
+        </w:rPr>
+      </w:pPr>
+    </w:p>
+    <w:p>
+      <w:pPr>
+        <w:pStyle w:val="NoSpacing"/>
+        <w:rPr>
+          <w:rFonts w:ascii="Verdana" w:hAnsi="Verdana"/>
+          <w:sz w:val="32"/>
+          <w:szCs w:val="32"/>
+        </w:rPr>
+      </w:pPr>
+      <w:bookmarkStart w:id="0" w:name="_GoBack"/>
+      <w:bookmarkEnd w:id="0"/>
     </w:p>
     <w:p>
       <w:pPr>
@@ -3702,7 +3687,7 @@
                                       <w:sz w:val="32"/>
                                       <w:szCs w:val="32"/>
                                     </w:rPr>
-                                    <w:t>1</w:t>
+                                    <w:t>2</w:t>
                                   </w:r>
                                   <w:r>
                                     <w:rPr>
@@ -3768,7 +3753,7 @@
                                 <w:sz w:val="32"/>
                                 <w:szCs w:val="32"/>
                               </w:rPr>
-                              <w:t>1</w:t>
+                              <w:t>2</w:t>
                             </w:r>
                             <w:r>
                               <w:rPr>
@@ -7321,6 +7306,7 @@
     <w:rsid w:val="00746BEB"/>
     <w:rsid w:val="00AF7112"/>
     <w:rsid w:val="00C9469B"/>
+    <w:rsid w:val="00CF0582"/>
     <w:rsid w:val="00F072F0"/>
     <w:rsid w:val="00FD26D1"/>
   </w:rsids>
@@ -8029,7 +8015,7 @@
 </file>
 
 <file path=customXml/itemProps1.xml><?xml version="1.0" encoding="utf-8"?>
-<ds:datastoreItem xmlns:ds="http://schemas.openxmlformats.org/officeDocument/2006/customXml" ds:itemID="{6C10EEC4-C155-4A71-9AC3-EC513011F4BB}">
+<ds:datastoreItem xmlns:ds="http://schemas.openxmlformats.org/officeDocument/2006/customXml" ds:itemID="{59C88FA6-8CD2-414E-ABB9-84E739B02928}">
   <ds:schemaRefs>
     <ds:schemaRef ds:uri="http://schemas.openxmlformats.org/officeDocument/2006/bibliography"/>
   </ds:schemaRefs>

</xml_diff>

<commit_message>
Decal removed! Everything set up! For V18 STONEWALL U40!
</commit_message>
<xml_diff>
--- a/changelog.docx
+++ b/changelog.docx
@@ -496,70 +496,94 @@
     <w:p>
       <w:pPr>
         <w:pStyle w:val="NoSpacing"/>
-        <w:rPr>
-          <w:rFonts w:ascii="Verdana" w:hAnsi="Verdana"/>
-          <w:sz w:val="32"/>
-          <w:szCs w:val="32"/>
-        </w:rPr>
-      </w:pPr>
-    </w:p>
-    <w:p>
-      <w:pPr>
-        <w:pStyle w:val="NoSpacing"/>
-        <w:rPr>
-          <w:rFonts w:ascii="Verdana" w:hAnsi="Verdana"/>
-          <w:sz w:val="32"/>
-          <w:szCs w:val="32"/>
-        </w:rPr>
-      </w:pPr>
-    </w:p>
-    <w:p>
-      <w:pPr>
-        <w:pStyle w:val="NoSpacing"/>
-        <w:rPr>
-          <w:rFonts w:ascii="Verdana" w:hAnsi="Verdana"/>
-          <w:sz w:val="32"/>
-          <w:szCs w:val="32"/>
-        </w:rPr>
-      </w:pPr>
-    </w:p>
-    <w:p>
-      <w:pPr>
-        <w:pStyle w:val="NoSpacing"/>
-        <w:rPr>
-          <w:rFonts w:ascii="Verdana" w:hAnsi="Verdana"/>
-          <w:sz w:val="32"/>
-          <w:szCs w:val="32"/>
+        <w:numPr>
+          <w:ilvl w:val="0"/>
+          <w:numId w:val="22"/>
+        </w:numPr>
+      </w:pPr>
+      <w:r>
+        <w:rPr>
+          <w:rFonts w:ascii="Verdana" w:hAnsi="Verdana"/>
+          <w:sz w:val="32"/>
+          <w:szCs w:val="32"/>
+        </w:rPr>
+        <w:t xml:space="preserve">(Editor) </w:t>
+      </w:r>
+      <w:proofErr w:type="spellStart"/>
+      <w:r>
+        <w:rPr>
+          <w:rFonts w:ascii="Verdana" w:hAnsi="Verdana"/>
+          <w:sz w:val="32"/>
+          <w:szCs w:val="32"/>
+        </w:rPr>
+        <w:t>Minigun</w:t>
+      </w:r>
+      <w:proofErr w:type="spellEnd"/>
+      <w:r>
+        <w:rPr>
+          <w:rFonts w:ascii="Verdana" w:hAnsi="Verdana"/>
+          <w:sz w:val="32"/>
+          <w:szCs w:val="32"/>
+        </w:rPr>
+        <w:t xml:space="preserve"> is no more decal yet a separate entity. Lags less.</w:t>
+      </w:r>
+    </w:p>
+    <w:p>
+      <w:pPr>
+        <w:pStyle w:val="NoSpacing"/>
+        <w:numPr>
+          <w:ilvl w:val="0"/>
+          <w:numId w:val="22"/>
+        </w:numPr>
+      </w:pPr>
+      <w:r>
+        <w:rPr>
+          <w:rFonts w:ascii="Verdana" w:hAnsi="Verdana"/>
+          <w:sz w:val="32"/>
+          <w:szCs w:val="32"/>
+        </w:rPr>
+        <w:t xml:space="preserve">Game gains even more fps with the recent changes to the threads. </w:t>
+      </w:r>
+    </w:p>
+    <w:p>
+      <w:pPr>
+        <w:pStyle w:val="NoSpacing"/>
+        <w:numPr>
+          <w:ilvl w:val="0"/>
+          <w:numId w:val="22"/>
+        </w:numPr>
+      </w:pPr>
+      <w:r>
+        <w:rPr>
+          <w:rFonts w:ascii="Verdana" w:hAnsi="Verdana"/>
+          <w:sz w:val="32"/>
+          <w:szCs w:val="32"/>
+        </w:rPr>
+        <w:t>Game is organized as main &lt;- Game Object -&gt; Renderer, where Game object is shared Object between two vital threads.</w:t>
+      </w:r>
+    </w:p>
+    <w:p>
+      <w:pPr>
+        <w:pStyle w:val="NoSpacing"/>
+        <w:rPr>
+          <w:rFonts w:ascii="Verdana" w:hAnsi="Verdana"/>
+          <w:sz w:val="32"/>
+          <w:szCs w:val="32"/>
+        </w:rPr>
+      </w:pPr>
+    </w:p>
+    <w:p>
+      <w:pPr>
+        <w:pStyle w:val="NoSpacing"/>
+        <w:jc w:val="center"/>
+        <w:rPr>
+          <w:rFonts w:ascii="Verdana" w:hAnsi="Verdana"/>
+          <w:b/>
+          <w:sz w:val="48"/>
         </w:rPr>
       </w:pPr>
       <w:bookmarkStart w:id="0" w:name="_GoBack"/>
       <w:bookmarkEnd w:id="0"/>
-    </w:p>
-    <w:p>
-      <w:pPr>
-        <w:pStyle w:val="NoSpacing"/>
-        <w:rPr>
-          <w:rFonts w:ascii="Verdana" w:hAnsi="Verdana"/>
-          <w:sz w:val="32"/>
-          <w:szCs w:val="32"/>
-        </w:rPr>
-      </w:pPr>
-    </w:p>
-    <w:p>
-      <w:pPr>
-        <w:pStyle w:val="NoSpacing"/>
-      </w:pPr>
-    </w:p>
-    <w:p>
-      <w:pPr>
-        <w:pStyle w:val="NoSpacing"/>
-        <w:jc w:val="center"/>
-        <w:rPr>
-          <w:rFonts w:ascii="Verdana" w:hAnsi="Verdana"/>
-          <w:b/>
-          <w:sz w:val="48"/>
-        </w:rPr>
-      </w:pPr>
       <w:r>
         <w:rPr>
           <w:rFonts w:ascii="Verdana" w:hAnsi="Verdana"/>
@@ -7245,7 +7269,7 @@
     <w:charset w:val="00"/>
     <w:family w:val="modern"/>
     <w:pitch w:val="fixed"/>
-    <w:sig w:usb0="E0002EFF" w:usb1="C0007843" w:usb2="00000009" w:usb3="00000000" w:csb0="000001FF" w:csb1="00000000"/>
+    <w:sig w:usb0="20002A87" w:usb1="00000000" w:usb2="00000000" w:usb3="00000000" w:csb0="000001FF" w:csb1="00000000"/>
   </w:font>
   <w:font w:name="Wingdings">
     <w:panose1 w:val="05000000000000000000"/>
@@ -7265,9 +7289,8 @@
     <w:panose1 w:val="020B0604030504040204"/>
     <w:charset w:val="00"/>
     <w:family w:val="swiss"/>
-    <w:notTrueType/>
     <w:pitch w:val="variable"/>
-    <w:sig w:usb0="00000003" w:usb1="00000000" w:usb2="00000000" w:usb3="00000000" w:csb0="00000001" w:csb1="00000000"/>
+    <w:sig w:usb0="E1002EFF" w:usb1="C000605B" w:usb2="00000029" w:usb3="00000000" w:csb0="000101FF" w:csb1="00000000"/>
   </w:font>
   <w:font w:name="Verdana">
     <w:panose1 w:val="020B0604030504040204"/>
@@ -7304,6 +7327,7 @@
     <w:rsid w:val="00625DB6"/>
     <w:rsid w:val="00627604"/>
     <w:rsid w:val="00746BEB"/>
+    <w:rsid w:val="00A823C9"/>
     <w:rsid w:val="00AF7112"/>
     <w:rsid w:val="00C9469B"/>
     <w:rsid w:val="00CF0582"/>
@@ -8015,7 +8039,7 @@
 </file>
 
 <file path=customXml/itemProps1.xml><?xml version="1.0" encoding="utf-8"?>
-<ds:datastoreItem xmlns:ds="http://schemas.openxmlformats.org/officeDocument/2006/customXml" ds:itemID="{59C88FA6-8CD2-414E-ABB9-84E739B02928}">
+<ds:datastoreItem xmlns:ds="http://schemas.openxmlformats.org/officeDocument/2006/customXml" ds:itemID="{889C256A-ACB7-45B0-AED3-5A9EFBF93404}">
   <ds:schemaRefs>
     <ds:schemaRef ds:uri="http://schemas.openxmlformats.org/officeDocument/2006/bibliography"/>
   </ds:schemaRefs>

</xml_diff>

<commit_message>
Better thread sync on Game Object! For V19 TITANIUM U06!
</commit_message>
<xml_diff>
--- a/changelog.docx
+++ b/changelog.docx
@@ -44,7 +44,7 @@
           <w:b/>
           <w:sz w:val="48"/>
         </w:rPr>
-        <w:t>8</w:t>
+        <w:t>9</w:t>
       </w:r>
       <w:r>
         <w:rPr>
@@ -60,7 +60,7 @@
           <w:b/>
           <w:sz w:val="48"/>
         </w:rPr>
-        <w:t>STONEWALL</w:t>
+        <w:t>TITANIUM</w:t>
       </w:r>
       <w:r>
         <w:rPr>
@@ -215,7 +215,7 @@
           <w:b/>
           <w:sz w:val="48"/>
         </w:rPr>
-        <w:t>STONEWALL</w:t>
+        <w:t>TITANIUM</w:t>
       </w:r>
       <w:r>
         <w:rPr>
@@ -225,11 +225,6 @@
         </w:rPr>
         <w:t>]</w:t>
       </w:r>
-    </w:p>
-    <w:p>
-      <w:pPr>
-        <w:pStyle w:val="NoSpacing"/>
-      </w:pPr>
     </w:p>
     <w:p>
       <w:pPr>
@@ -265,21 +260,33 @@
           <w:sz w:val="32"/>
           <w:szCs w:val="32"/>
         </w:rPr>
-        <w:t>Safety from unresponsive or failed application is implemented.</w:t>
-      </w:r>
-    </w:p>
-    <w:p>
-      <w:pPr>
-        <w:pStyle w:val="NoSpacing"/>
-        <w:ind w:left="360"/>
-      </w:pPr>
-      <w:r>
-        <w:rPr>
-          <w:rFonts w:ascii="Verdana" w:hAnsi="Verdana"/>
-          <w:sz w:val="32"/>
-          <w:szCs w:val="32"/>
-        </w:rPr>
-        <w:t>If either updates per second or framerate is equal to zero over five seconds application is terminated.</w:t>
+        <w:t>Console commands now have post execution status (red if command fails or green if it’s success). If command is not recognized it will have white light bulb.</w:t>
+      </w:r>
+    </w:p>
+    <w:p>
+      <w:pPr>
+        <w:pStyle w:val="NoSpacing"/>
+        <w:jc w:val="center"/>
+      </w:pPr>
+    </w:p>
+    <w:p>
+      <w:pPr>
+        <w:pStyle w:val="NoSpacing"/>
+        <w:rPr>
+          <w:rFonts w:ascii="Verdana" w:hAnsi="Verdana"/>
+          <w:b/>
+          <w:color w:val="FFC000"/>
+          <w:sz w:val="48"/>
+        </w:rPr>
+      </w:pPr>
+      <w:r>
+        <w:rPr>
+          <w:rFonts w:ascii="Verdana" w:hAnsi="Verdana"/>
+          <w:b/>
+          <w:color w:val="FFC000"/>
+          <w:sz w:val="48"/>
+        </w:rPr>
+        <w:t>CHANGES:</w:t>
       </w:r>
     </w:p>
     <w:p>
@@ -296,22 +303,54 @@
           <w:sz w:val="32"/>
           <w:szCs w:val="32"/>
         </w:rPr>
-        <w:t>Console is implemented. Contains history of input commands.</w:t>
-      </w:r>
-      <w:r>
-        <w:rPr>
-          <w:rFonts w:ascii="Verdana" w:hAnsi="Verdana"/>
-          <w:sz w:val="32"/>
-          <w:szCs w:val="32"/>
-        </w:rPr>
-        <w:t xml:space="preserve"> [</w:t>
+        <w:t>Chunk function is improved</w:t>
+      </w:r>
+      <w:r>
+        <w:rPr>
+          <w:rFonts w:ascii="Verdana" w:hAnsi="Verdana"/>
+          <w:sz w:val="32"/>
+          <w:szCs w:val="32"/>
+        </w:rPr>
+        <w:t>.</w:t>
+      </w:r>
+      <w:r>
+        <w:rPr>
+          <w:rFonts w:ascii="Verdana" w:hAnsi="Verdana"/>
+          <w:sz w:val="32"/>
+          <w:szCs w:val="32"/>
+        </w:rPr>
+        <w:t xml:space="preserve"> </w:t>
+      </w:r>
+      <w:proofErr w:type="gramStart"/>
+      <w:r>
+        <w:rPr>
+          <w:rFonts w:ascii="Verdana" w:hAnsi="Verdana"/>
+          <w:sz w:val="32"/>
+          <w:szCs w:val="32"/>
+        </w:rPr>
+        <w:t>Blocks doesn’t</w:t>
+      </w:r>
+      <w:proofErr w:type="gramEnd"/>
+      <w:r>
+        <w:rPr>
+          <w:rFonts w:ascii="Verdana" w:hAnsi="Verdana"/>
+          <w:sz w:val="32"/>
+          <w:szCs w:val="32"/>
+        </w:rPr>
+        <w:t xml:space="preserve"> appear unexpectedly. </w:t>
+      </w:r>
+      <w:r>
+        <w:rPr>
+          <w:rFonts w:ascii="Verdana" w:hAnsi="Verdana"/>
+          <w:sz w:val="32"/>
+        </w:rPr>
+        <w:t>[</w:t>
       </w:r>
       <w:proofErr w:type="spellStart"/>
       <w:r>
         <w:rPr>
           <w:rFonts w:ascii="Verdana" w:hAnsi="Verdana"/>
           <w:sz w:val="32"/>
-          <w:szCs w:val="32"/>
         </w:rPr>
         <w:t>JSomnia</w:t>
       </w:r>
@@ -320,35 +359,8 @@
         <w:rPr>
           <w:rFonts w:ascii="Verdana" w:hAnsi="Verdana"/>
           <w:sz w:val="32"/>
-          <w:szCs w:val="32"/>
         </w:rPr>
         <w:t>]</w:t>
-      </w:r>
-    </w:p>
-    <w:p>
-      <w:pPr>
-        <w:pStyle w:val="NoSpacing"/>
-        <w:jc w:val="center"/>
-      </w:pPr>
-    </w:p>
-    <w:p>
-      <w:pPr>
-        <w:pStyle w:val="NoSpacing"/>
-        <w:rPr>
-          <w:rFonts w:ascii="Verdana" w:hAnsi="Verdana"/>
-          <w:b/>
-          <w:color w:val="FFC000"/>
-          <w:sz w:val="48"/>
-        </w:rPr>
-      </w:pPr>
-      <w:r>
-        <w:rPr>
-          <w:rFonts w:ascii="Verdana" w:hAnsi="Verdana"/>
-          <w:b/>
-          <w:color w:val="FFC000"/>
-          <w:sz w:val="48"/>
-        </w:rPr>
-        <w:t>CHANGES:</w:t>
       </w:r>
     </w:p>
     <w:p>
@@ -363,9 +375,38 @@
         <w:rPr>
           <w:rFonts w:ascii="Verdana" w:hAnsi="Verdana"/>
           <w:sz w:val="32"/>
-          <w:szCs w:val="32"/>
-        </w:rPr>
-        <w:t>Shift key is used when fluids block are being selected or placed adjacently to selected fluid block.</w:t>
+        </w:rPr>
+        <w:t>Default settings are changed. Mouse sen</w:t>
+      </w:r>
+      <w:r>
+        <w:rPr>
+          <w:rFonts w:ascii="Verdana" w:hAnsi="Verdana"/>
+          <w:sz w:val="32"/>
+        </w:rPr>
+        <w:t>si</w:t>
+      </w:r>
+      <w:r>
+        <w:rPr>
+          <w:rFonts w:ascii="Verdana" w:hAnsi="Verdana"/>
+          <w:sz w:val="32"/>
+        </w:rPr>
+        <w:t>tivity set from 3.0 to 1.5 and Music and Sound volumes are set from 1.0 to 0.5 [</w:t>
+      </w:r>
+      <w:proofErr w:type="spellStart"/>
+      <w:r>
+        <w:rPr>
+          <w:rFonts w:ascii="Verdana" w:hAnsi="Verdana"/>
+          <w:sz w:val="32"/>
+        </w:rPr>
+        <w:t>JSomnia</w:t>
+      </w:r>
+      <w:proofErr w:type="spellEnd"/>
+      <w:r>
+        <w:rPr>
+          <w:rFonts w:ascii="Verdana" w:hAnsi="Verdana"/>
+          <w:sz w:val="32"/>
+        </w:rPr>
+        <w:t>]</w:t>
       </w:r>
     </w:p>
     <w:p>
@@ -380,9 +421,8 @@
         <w:rPr>
           <w:rFonts w:ascii="Verdana" w:hAnsi="Verdana"/>
           <w:sz w:val="32"/>
-          <w:szCs w:val="32"/>
-        </w:rPr>
-        <w:t>Selected fluid block has enabled all faces on selection.</w:t>
+        </w:rPr>
+        <w:t>Program consumes less memory in general.</w:t>
       </w:r>
     </w:p>
     <w:p>
@@ -397,33 +437,38 @@
         <w:rPr>
           <w:rFonts w:ascii="Verdana" w:hAnsi="Verdana"/>
           <w:sz w:val="32"/>
-          <w:szCs w:val="32"/>
-        </w:rPr>
-        <w:t>Water R</w:t>
-      </w:r>
-      <w:r>
-        <w:rPr>
-          <w:rFonts w:ascii="Verdana" w:hAnsi="Verdana"/>
-          <w:sz w:val="32"/>
-          <w:szCs w:val="32"/>
-        </w:rPr>
-        <w:t xml:space="preserve">enderer </w:t>
-      </w:r>
-      <w:r>
-        <w:rPr>
-          <w:rFonts w:ascii="Verdana" w:hAnsi="Verdana"/>
-          <w:sz w:val="32"/>
-          <w:szCs w:val="32"/>
-        </w:rPr>
-        <w:t>lags less</w:t>
-      </w:r>
-      <w:r>
-        <w:rPr>
-          <w:rFonts w:ascii="Verdana" w:hAnsi="Verdana"/>
-          <w:sz w:val="32"/>
-          <w:szCs w:val="32"/>
-        </w:rPr>
-        <w:t>.</w:t>
+        </w:rPr>
+        <w:t>Game is more responsive when loading/saving chunks in general.</w:t>
+      </w:r>
+    </w:p>
+    <w:p>
+      <w:pPr>
+        <w:pStyle w:val="NoSpacing"/>
+        <w:rPr>
+          <w:rFonts w:ascii="Verdana" w:hAnsi="Verdana"/>
+          <w:sz w:val="32"/>
+          <w:szCs w:val="32"/>
+        </w:rPr>
+      </w:pPr>
+    </w:p>
+    <w:p>
+      <w:pPr>
+        <w:pStyle w:val="NoSpacing"/>
+        <w:rPr>
+          <w:rFonts w:ascii="Verdana" w:hAnsi="Verdana"/>
+          <w:b/>
+          <w:color w:val="FF0000"/>
+          <w:sz w:val="48"/>
+        </w:rPr>
+      </w:pPr>
+      <w:r>
+        <w:rPr>
+          <w:rFonts w:ascii="Verdana" w:hAnsi="Verdana"/>
+          <w:b/>
+          <w:color w:val="FF0000"/>
+          <w:sz w:val="48"/>
+        </w:rPr>
+        <w:t>FIXES:</w:t>
       </w:r>
     </w:p>
     <w:p>
@@ -440,15 +485,15 @@
           <w:sz w:val="32"/>
           <w:szCs w:val="32"/>
         </w:rPr>
-        <w:t>Blocks consume less memory</w:t>
-      </w:r>
-      <w:r>
-        <w:rPr>
-          <w:rFonts w:ascii="Verdana" w:hAnsi="Verdana"/>
-          <w:sz w:val="32"/>
-          <w:szCs w:val="32"/>
-        </w:rPr>
-        <w:t xml:space="preserve"> and faster to create</w:t>
+        <w:t>[Options Menu] One changed setting doesn’t change all settings</w:t>
+      </w:r>
+      <w:r>
+        <w:rPr>
+          <w:rFonts w:ascii="Verdana" w:hAnsi="Verdana"/>
+          <w:sz w:val="32"/>
+          <w:szCs w:val="32"/>
+        </w:rPr>
+        <w:t xml:space="preserve"> unexpectedly</w:t>
       </w:r>
       <w:r>
         <w:rPr>
@@ -457,6 +502,102 @@
           <w:szCs w:val="32"/>
         </w:rPr>
         <w:t>.</w:t>
+      </w:r>
+    </w:p>
+    <w:p>
+      <w:pPr>
+        <w:pStyle w:val="NoSpacing"/>
+        <w:jc w:val="center"/>
+        <w:rPr>
+          <w:rFonts w:ascii="Verdana" w:hAnsi="Verdana"/>
+          <w:b/>
+          <w:sz w:val="48"/>
+        </w:rPr>
+      </w:pPr>
+    </w:p>
+    <w:p>
+      <w:pPr>
+        <w:pStyle w:val="NoSpacing"/>
+        <w:jc w:val="center"/>
+        <w:rPr>
+          <w:rFonts w:ascii="Verdana" w:hAnsi="Verdana"/>
+          <w:b/>
+          <w:sz w:val="48"/>
+        </w:rPr>
+      </w:pPr>
+    </w:p>
+    <w:p>
+      <w:pPr>
+        <w:pStyle w:val="NoSpacing"/>
+        <w:jc w:val="center"/>
+        <w:rPr>
+          <w:rFonts w:ascii="Verdana" w:hAnsi="Verdana"/>
+          <w:b/>
+          <w:sz w:val="48"/>
+        </w:rPr>
+      </w:pPr>
+    </w:p>
+    <w:p>
+      <w:pPr>
+        <w:pStyle w:val="NoSpacing"/>
+        <w:jc w:val="center"/>
+        <w:rPr>
+          <w:rFonts w:ascii="Verdana" w:hAnsi="Verdana"/>
+          <w:b/>
+          <w:sz w:val="48"/>
+        </w:rPr>
+      </w:pPr>
+      <w:bookmarkStart w:id="0" w:name="_GoBack"/>
+      <w:bookmarkEnd w:id="0"/>
+      <w:r>
+        <w:rPr>
+          <w:rFonts w:ascii="Verdana" w:hAnsi="Verdana"/>
+          <w:b/>
+          <w:sz w:val="48"/>
+        </w:rPr>
+        <w:lastRenderedPageBreak/>
+        <w:t>[</w:t>
+      </w:r>
+      <w:r>
+        <w:rPr>
+          <w:rFonts w:ascii="Verdana" w:hAnsi="Verdana"/>
+          <w:b/>
+          <w:sz w:val="48"/>
+        </w:rPr>
+        <w:t>STONEWALL</w:t>
+      </w:r>
+      <w:r>
+        <w:rPr>
+          <w:rFonts w:ascii="Verdana" w:hAnsi="Verdana"/>
+          <w:b/>
+          <w:sz w:val="48"/>
+        </w:rPr>
+        <w:t>]</w:t>
+      </w:r>
+    </w:p>
+    <w:p>
+      <w:pPr>
+        <w:pStyle w:val="NoSpacing"/>
+      </w:pPr>
+    </w:p>
+    <w:p>
+      <w:pPr>
+        <w:pStyle w:val="NoSpacing"/>
+        <w:rPr>
+          <w:rFonts w:ascii="Verdana" w:hAnsi="Verdana"/>
+          <w:b/>
+          <w:color w:val="00B050"/>
+          <w:sz w:val="48"/>
+        </w:rPr>
+      </w:pPr>
+      <w:r>
+        <w:rPr>
+          <w:rFonts w:ascii="Verdana" w:hAnsi="Verdana"/>
+          <w:b/>
+          <w:color w:val="00B050"/>
+          <w:sz w:val="48"/>
+        </w:rPr>
+        <w:t>FEATURES:</w:t>
       </w:r>
     </w:p>
     <w:p>
@@ -473,7 +614,21 @@
           <w:sz w:val="32"/>
           <w:szCs w:val="32"/>
         </w:rPr>
-        <w:t>Level loading and Random Level generations is much faster now.</w:t>
+        <w:t>Safety from unresponsive or failed application is implemented.</w:t>
+      </w:r>
+    </w:p>
+    <w:p>
+      <w:pPr>
+        <w:pStyle w:val="NoSpacing"/>
+        <w:ind w:left="360"/>
+      </w:pPr>
+      <w:r>
+        <w:rPr>
+          <w:rFonts w:ascii="Verdana" w:hAnsi="Verdana"/>
+          <w:sz w:val="32"/>
+          <w:szCs w:val="32"/>
+        </w:rPr>
+        <w:t>If either updates per second or framerate is equal to zero over five seconds application is terminated.</w:t>
       </w:r>
     </w:p>
     <w:p>
@@ -490,7 +645,59 @@
           <w:sz w:val="32"/>
           <w:szCs w:val="32"/>
         </w:rPr>
-        <w:t>(Debug) Using F4 will print all the chunk data.</w:t>
+        <w:t>Console is implemented. Contains history of input commands.</w:t>
+      </w:r>
+      <w:r>
+        <w:rPr>
+          <w:rFonts w:ascii="Verdana" w:hAnsi="Verdana"/>
+          <w:sz w:val="32"/>
+          <w:szCs w:val="32"/>
+        </w:rPr>
+        <w:t xml:space="preserve"> [</w:t>
+      </w:r>
+      <w:proofErr w:type="spellStart"/>
+      <w:r>
+        <w:rPr>
+          <w:rFonts w:ascii="Verdana" w:hAnsi="Verdana"/>
+          <w:sz w:val="32"/>
+          <w:szCs w:val="32"/>
+        </w:rPr>
+        <w:t>JSomnia</w:t>
+      </w:r>
+      <w:proofErr w:type="spellEnd"/>
+      <w:r>
+        <w:rPr>
+          <w:rFonts w:ascii="Verdana" w:hAnsi="Verdana"/>
+          <w:sz w:val="32"/>
+          <w:szCs w:val="32"/>
+        </w:rPr>
+        <w:t>]</w:t>
+      </w:r>
+    </w:p>
+    <w:p>
+      <w:pPr>
+        <w:pStyle w:val="NoSpacing"/>
+        <w:jc w:val="center"/>
+      </w:pPr>
+    </w:p>
+    <w:p>
+      <w:pPr>
+        <w:pStyle w:val="NoSpacing"/>
+        <w:rPr>
+          <w:rFonts w:ascii="Verdana" w:hAnsi="Verdana"/>
+          <w:b/>
+          <w:color w:val="FFC000"/>
+          <w:sz w:val="48"/>
+        </w:rPr>
+      </w:pPr>
+      <w:r>
+        <w:rPr>
+          <w:rFonts w:ascii="Verdana" w:hAnsi="Verdana"/>
+          <w:b/>
+          <w:color w:val="FFC000"/>
+          <w:sz w:val="48"/>
+        </w:rPr>
+        <w:t>CHANGES:</w:t>
       </w:r>
     </w:p>
     <w:p>
@@ -507,25 +714,7 @@
           <w:sz w:val="32"/>
           <w:szCs w:val="32"/>
         </w:rPr>
-        <w:t xml:space="preserve">(Editor) </w:t>
-      </w:r>
-      <w:proofErr w:type="spellStart"/>
-      <w:r>
-        <w:rPr>
-          <w:rFonts w:ascii="Verdana" w:hAnsi="Verdana"/>
-          <w:sz w:val="32"/>
-          <w:szCs w:val="32"/>
-        </w:rPr>
-        <w:t>Minigun</w:t>
-      </w:r>
-      <w:proofErr w:type="spellEnd"/>
-      <w:r>
-        <w:rPr>
-          <w:rFonts w:ascii="Verdana" w:hAnsi="Verdana"/>
-          <w:sz w:val="32"/>
-          <w:szCs w:val="32"/>
-        </w:rPr>
-        <w:t xml:space="preserve"> is no more decal yet a separate entity. Lags less.</w:t>
+        <w:t>Shift key is used when fluids block are being selected or placed adjacently to selected fluid block.</w:t>
       </w:r>
     </w:p>
     <w:p>
@@ -542,7 +731,7 @@
           <w:sz w:val="32"/>
           <w:szCs w:val="32"/>
         </w:rPr>
-        <w:t xml:space="preserve">Game gains even more fps with the recent changes to the threads. </w:t>
+        <w:t>Selected fluid block has enabled all faces on selection.</w:t>
       </w:r>
     </w:p>
     <w:p>
@@ -559,6 +748,166 @@
           <w:sz w:val="32"/>
           <w:szCs w:val="32"/>
         </w:rPr>
+        <w:t>Water R</w:t>
+      </w:r>
+      <w:r>
+        <w:rPr>
+          <w:rFonts w:ascii="Verdana" w:hAnsi="Verdana"/>
+          <w:sz w:val="32"/>
+          <w:szCs w:val="32"/>
+        </w:rPr>
+        <w:t xml:space="preserve">enderer </w:t>
+      </w:r>
+      <w:r>
+        <w:rPr>
+          <w:rFonts w:ascii="Verdana" w:hAnsi="Verdana"/>
+          <w:sz w:val="32"/>
+          <w:szCs w:val="32"/>
+        </w:rPr>
+        <w:t>lags less</w:t>
+      </w:r>
+      <w:r>
+        <w:rPr>
+          <w:rFonts w:ascii="Verdana" w:hAnsi="Verdana"/>
+          <w:sz w:val="32"/>
+          <w:szCs w:val="32"/>
+        </w:rPr>
+        <w:t>.</w:t>
+      </w:r>
+    </w:p>
+    <w:p>
+      <w:pPr>
+        <w:pStyle w:val="NoSpacing"/>
+        <w:numPr>
+          <w:ilvl w:val="0"/>
+          <w:numId w:val="22"/>
+        </w:numPr>
+      </w:pPr>
+      <w:r>
+        <w:rPr>
+          <w:rFonts w:ascii="Verdana" w:hAnsi="Verdana"/>
+          <w:sz w:val="32"/>
+          <w:szCs w:val="32"/>
+        </w:rPr>
+        <w:t>Blocks consume less memory</w:t>
+      </w:r>
+      <w:r>
+        <w:rPr>
+          <w:rFonts w:ascii="Verdana" w:hAnsi="Verdana"/>
+          <w:sz w:val="32"/>
+          <w:szCs w:val="32"/>
+        </w:rPr>
+        <w:t xml:space="preserve"> and faster to create</w:t>
+      </w:r>
+      <w:r>
+        <w:rPr>
+          <w:rFonts w:ascii="Verdana" w:hAnsi="Verdana"/>
+          <w:sz w:val="32"/>
+          <w:szCs w:val="32"/>
+        </w:rPr>
+        <w:t>.</w:t>
+      </w:r>
+    </w:p>
+    <w:p>
+      <w:pPr>
+        <w:pStyle w:val="NoSpacing"/>
+        <w:numPr>
+          <w:ilvl w:val="0"/>
+          <w:numId w:val="22"/>
+        </w:numPr>
+      </w:pPr>
+      <w:r>
+        <w:rPr>
+          <w:rFonts w:ascii="Verdana" w:hAnsi="Verdana"/>
+          <w:sz w:val="32"/>
+          <w:szCs w:val="32"/>
+        </w:rPr>
+        <w:t>Level loading and Random Level generations is much faster now.</w:t>
+      </w:r>
+    </w:p>
+    <w:p>
+      <w:pPr>
+        <w:pStyle w:val="NoSpacing"/>
+        <w:numPr>
+          <w:ilvl w:val="0"/>
+          <w:numId w:val="22"/>
+        </w:numPr>
+      </w:pPr>
+      <w:r>
+        <w:rPr>
+          <w:rFonts w:ascii="Verdana" w:hAnsi="Verdana"/>
+          <w:sz w:val="32"/>
+          <w:szCs w:val="32"/>
+        </w:rPr>
+        <w:t>(Debug) Using F4 will print all the chunk data.</w:t>
+      </w:r>
+    </w:p>
+    <w:p>
+      <w:pPr>
+        <w:pStyle w:val="NoSpacing"/>
+        <w:numPr>
+          <w:ilvl w:val="0"/>
+          <w:numId w:val="22"/>
+        </w:numPr>
+      </w:pPr>
+      <w:r>
+        <w:rPr>
+          <w:rFonts w:ascii="Verdana" w:hAnsi="Verdana"/>
+          <w:sz w:val="32"/>
+          <w:szCs w:val="32"/>
+        </w:rPr>
+        <w:t xml:space="preserve">(Editor) </w:t>
+      </w:r>
+      <w:proofErr w:type="spellStart"/>
+      <w:r>
+        <w:rPr>
+          <w:rFonts w:ascii="Verdana" w:hAnsi="Verdana"/>
+          <w:sz w:val="32"/>
+          <w:szCs w:val="32"/>
+        </w:rPr>
+        <w:t>Minigun</w:t>
+      </w:r>
+      <w:proofErr w:type="spellEnd"/>
+      <w:r>
+        <w:rPr>
+          <w:rFonts w:ascii="Verdana" w:hAnsi="Verdana"/>
+          <w:sz w:val="32"/>
+          <w:szCs w:val="32"/>
+        </w:rPr>
+        <w:t xml:space="preserve"> is no more decal yet a separate entity. Lags less.</w:t>
+      </w:r>
+    </w:p>
+    <w:p>
+      <w:pPr>
+        <w:pStyle w:val="NoSpacing"/>
+        <w:numPr>
+          <w:ilvl w:val="0"/>
+          <w:numId w:val="22"/>
+        </w:numPr>
+      </w:pPr>
+      <w:r>
+        <w:rPr>
+          <w:rFonts w:ascii="Verdana" w:hAnsi="Verdana"/>
+          <w:sz w:val="32"/>
+          <w:szCs w:val="32"/>
+        </w:rPr>
+        <w:t xml:space="preserve">Game gains even more fps with the recent changes to the threads. </w:t>
+      </w:r>
+    </w:p>
+    <w:p>
+      <w:pPr>
+        <w:pStyle w:val="NoSpacing"/>
+        <w:numPr>
+          <w:ilvl w:val="0"/>
+          <w:numId w:val="22"/>
+        </w:numPr>
+      </w:pPr>
+      <w:r>
+        <w:rPr>
+          <w:rFonts w:ascii="Verdana" w:hAnsi="Verdana"/>
+          <w:sz w:val="32"/>
+          <w:szCs w:val="32"/>
+        </w:rPr>
         <w:t>Game is organized as main &lt;- Game Object -&gt; Renderer, where Game object is shared Object between two vital threads.</w:t>
       </w:r>
     </w:p>
@@ -582,8 +931,72 @@
           <w:sz w:val="48"/>
         </w:rPr>
       </w:pPr>
-      <w:bookmarkStart w:id="0" w:name="_GoBack"/>
-      <w:bookmarkEnd w:id="0"/>
+    </w:p>
+    <w:p>
+      <w:pPr>
+        <w:pStyle w:val="NoSpacing"/>
+        <w:jc w:val="center"/>
+        <w:rPr>
+          <w:rFonts w:ascii="Verdana" w:hAnsi="Verdana"/>
+          <w:b/>
+          <w:sz w:val="48"/>
+        </w:rPr>
+      </w:pPr>
+    </w:p>
+    <w:p>
+      <w:pPr>
+        <w:pStyle w:val="NoSpacing"/>
+        <w:jc w:val="center"/>
+        <w:rPr>
+          <w:rFonts w:ascii="Verdana" w:hAnsi="Verdana"/>
+          <w:b/>
+          <w:sz w:val="48"/>
+        </w:rPr>
+      </w:pPr>
+    </w:p>
+    <w:p>
+      <w:pPr>
+        <w:pStyle w:val="NoSpacing"/>
+        <w:jc w:val="center"/>
+        <w:rPr>
+          <w:rFonts w:ascii="Verdana" w:hAnsi="Verdana"/>
+          <w:b/>
+          <w:sz w:val="48"/>
+        </w:rPr>
+      </w:pPr>
+    </w:p>
+    <w:p>
+      <w:pPr>
+        <w:pStyle w:val="NoSpacing"/>
+        <w:jc w:val="center"/>
+        <w:rPr>
+          <w:rFonts w:ascii="Verdana" w:hAnsi="Verdana"/>
+          <w:b/>
+          <w:sz w:val="48"/>
+        </w:rPr>
+      </w:pPr>
+    </w:p>
+    <w:p>
+      <w:pPr>
+        <w:pStyle w:val="NoSpacing"/>
+        <w:jc w:val="center"/>
+        <w:rPr>
+          <w:rFonts w:ascii="Verdana" w:hAnsi="Verdana"/>
+          <w:b/>
+          <w:sz w:val="48"/>
+        </w:rPr>
+      </w:pPr>
+    </w:p>
+    <w:p>
+      <w:pPr>
+        <w:pStyle w:val="NoSpacing"/>
+        <w:jc w:val="center"/>
+        <w:rPr>
+          <w:rFonts w:ascii="Verdana" w:hAnsi="Verdana"/>
+          <w:b/>
+          <w:sz w:val="48"/>
+        </w:rPr>
+      </w:pPr>
       <w:r>
         <w:rPr>
           <w:rFonts w:ascii="Verdana" w:hAnsi="Verdana"/>
@@ -7327,6 +7740,7 @@
     <w:rsid w:val="00625DB6"/>
     <w:rsid w:val="00627604"/>
     <w:rsid w:val="00746BEB"/>
+    <w:rsid w:val="009A2582"/>
     <w:rsid w:val="00A823C9"/>
     <w:rsid w:val="00AF7112"/>
     <w:rsid w:val="00C9469B"/>
@@ -8039,7 +8453,7 @@
 </file>
 
 <file path=customXml/itemProps1.xml><?xml version="1.0" encoding="utf-8"?>
-<ds:datastoreItem xmlns:ds="http://schemas.openxmlformats.org/officeDocument/2006/customXml" ds:itemID="{889C256A-ACB7-45B0-AED3-5A9EFBF93404}">
+<ds:datastoreItem xmlns:ds="http://schemas.openxmlformats.org/officeDocument/2006/customXml" ds:itemID="{00A75031-C348-439E-8FE0-FA317C0C5ABC}">
   <ds:schemaRefs>
     <ds:schemaRef ds:uri="http://schemas.openxmlformats.org/officeDocument/2006/bibliography"/>
   </ds:schemaRefs>

</xml_diff>

<commit_message>
Updated changelog.docx and support.docx! FOR V20 URANIUM U27!
</commit_message>
<xml_diff>
--- a/changelog.docx
+++ b/changelog.docx
@@ -19,6 +19,522 @@
           <w:b/>
           <w:sz w:val="48"/>
         </w:rPr>
+        <w:t>Ermac</w:t>
+      </w:r>
+      <w:proofErr w:type="spellEnd"/>
+      <w:r>
+        <w:rPr>
+          <w:rFonts w:ascii="Verdana" w:hAnsi="Verdana"/>
+          <w:b/>
+          <w:sz w:val="48"/>
+        </w:rPr>
+        <w:t xml:space="preserve"> Voxel Game v </w:t>
+      </w:r>
+      <w:r>
+        <w:rPr>
+          <w:rFonts w:ascii="Verdana" w:hAnsi="Verdana"/>
+          <w:b/>
+          <w:sz w:val="48"/>
+        </w:rPr>
+        <w:t>20</w:t>
+      </w:r>
+      <w:r>
+        <w:rPr>
+          <w:rFonts w:ascii="Verdana" w:hAnsi="Verdana"/>
+          <w:b/>
+          <w:sz w:val="48"/>
+        </w:rPr>
+        <w:t xml:space="preserve"> (</w:t>
+      </w:r>
+      <w:r>
+        <w:rPr>
+          <w:rFonts w:ascii="Verdana" w:hAnsi="Verdana"/>
+          <w:b/>
+          <w:sz w:val="48"/>
+        </w:rPr>
+        <w:t>URANIUM</w:t>
+      </w:r>
+      <w:r>
+        <w:rPr>
+          <w:rFonts w:ascii="Verdana" w:hAnsi="Verdana"/>
+          <w:b/>
+          <w:sz w:val="48"/>
+        </w:rPr>
+        <w:t>)</w:t>
+      </w:r>
+    </w:p>
+    <w:p>
+      <w:pPr>
+        <w:pStyle w:val="NoSpacing"/>
+        <w:jc w:val="center"/>
+        <w:rPr>
+          <w:rFonts w:ascii="Verdana" w:hAnsi="Verdana"/>
+          <w:b/>
+          <w:sz w:val="48"/>
+        </w:rPr>
+      </w:pPr>
+      <w:r>
+        <w:rPr>
+          <w:rFonts w:ascii="Verdana" w:hAnsi="Verdana"/>
+          <w:b/>
+          <w:sz w:val="48"/>
+        </w:rPr>
+        <w:t>“NEWGEN”</w:t>
+      </w:r>
+    </w:p>
+    <w:p>
+      <w:pPr>
+        <w:pStyle w:val="NoSpacing"/>
+        <w:jc w:val="center"/>
+        <w:rPr>
+          <w:rFonts w:ascii="Verdana" w:hAnsi="Verdana"/>
+          <w:b/>
+          <w:sz w:val="48"/>
+        </w:rPr>
+      </w:pPr>
+      <w:r>
+        <w:rPr>
+          <w:rFonts w:ascii="Verdana" w:hAnsi="Verdana"/>
+          <w:b/>
+          <w:sz w:val="48"/>
+        </w:rPr>
+        <w:t>Game name: “Demolition Synergy”</w:t>
+      </w:r>
+    </w:p>
+    <w:p>
+      <w:pPr>
+        <w:pStyle w:val="NoSpacing"/>
+        <w:jc w:val="center"/>
+      </w:pPr>
+      <w:r>
+        <w:rPr>
+          <w:noProof/>
+        </w:rPr>
+        <w:drawing>
+          <wp:inline distT="0" distB="0" distL="0" distR="0" wp14:anchorId="51F4129E" wp14:editId="1B7B264B">
+            <wp:extent cx="2295144" cy="1197864"/>
+            <wp:effectExtent l="0" t="0" r="0" b="2540"/>
+            <wp:docPr id="2" name="Picture 2"/>
+            <wp:cNvGraphicFramePr>
+              <a:graphicFrameLocks xmlns:a="http://schemas.openxmlformats.org/drawingml/2006/main" noChangeAspect="1"/>
+            </wp:cNvGraphicFramePr>
+            <a:graphic xmlns:a="http://schemas.openxmlformats.org/drawingml/2006/main">
+              <a:graphicData uri="http://schemas.openxmlformats.org/drawingml/2006/picture">
+                <pic:pic xmlns:pic="http://schemas.openxmlformats.org/drawingml/2006/picture">
+                  <pic:nvPicPr>
+                    <pic:cNvPr id="0" name="ds_acro.png"/>
+                    <pic:cNvPicPr/>
+                  </pic:nvPicPr>
+                  <pic:blipFill>
+                    <a:blip r:embed="rId9" cstate="print">
+                      <a:extLst>
+                        <a:ext uri="{28A0092B-C50C-407E-A947-70E740481C1C}">
+                          <a14:useLocalDpi xmlns:a14="http://schemas.microsoft.com/office/drawing/2010/main" val="0"/>
+                        </a:ext>
+                      </a:extLst>
+                    </a:blip>
+                    <a:stretch>
+                      <a:fillRect/>
+                    </a:stretch>
+                  </pic:blipFill>
+                  <pic:spPr>
+                    <a:xfrm>
+                      <a:off x="0" y="0"/>
+                      <a:ext cx="2295144" cy="1197864"/>
+                    </a:xfrm>
+                    <a:prstGeom prst="rect">
+                      <a:avLst/>
+                    </a:prstGeom>
+                  </pic:spPr>
+                </pic:pic>
+              </a:graphicData>
+            </a:graphic>
+          </wp:inline>
+        </w:drawing>
+      </w:r>
+    </w:p>
+    <w:p>
+      <w:pPr>
+        <w:pStyle w:val="NoSpacing"/>
+        <w:jc w:val="center"/>
+      </w:pPr>
+    </w:p>
+    <w:p>
+      <w:pPr>
+        <w:pStyle w:val="NoSpacing"/>
+        <w:jc w:val="center"/>
+        <w:rPr>
+          <w:rFonts w:ascii="Verdana" w:hAnsi="Verdana"/>
+          <w:b/>
+          <w:sz w:val="48"/>
+        </w:rPr>
+      </w:pPr>
+      <w:r>
+        <w:rPr>
+          <w:rFonts w:ascii="Verdana" w:hAnsi="Verdana"/>
+          <w:b/>
+          <w:sz w:val="48"/>
+        </w:rPr>
+        <w:t>[</w:t>
+      </w:r>
+      <w:r>
+        <w:rPr>
+          <w:rFonts w:ascii="Verdana" w:hAnsi="Verdana"/>
+          <w:b/>
+          <w:sz w:val="48"/>
+        </w:rPr>
+        <w:t>URANINIUM</w:t>
+      </w:r>
+      <w:r>
+        <w:rPr>
+          <w:rFonts w:ascii="Verdana" w:hAnsi="Verdana"/>
+          <w:b/>
+          <w:sz w:val="48"/>
+        </w:rPr>
+        <w:t>]</w:t>
+      </w:r>
+    </w:p>
+    <w:p>
+      <w:pPr>
+        <w:pStyle w:val="NoSpacing"/>
+        <w:rPr>
+          <w:rFonts w:ascii="Verdana" w:hAnsi="Verdana"/>
+          <w:b/>
+          <w:color w:val="00B050"/>
+          <w:sz w:val="48"/>
+        </w:rPr>
+      </w:pPr>
+      <w:r>
+        <w:rPr>
+          <w:rFonts w:ascii="Verdana" w:hAnsi="Verdana"/>
+          <w:b/>
+          <w:color w:val="00B050"/>
+          <w:sz w:val="48"/>
+        </w:rPr>
+        <w:t>FEATURES:</w:t>
+      </w:r>
+    </w:p>
+    <w:p>
+      <w:pPr>
+        <w:pStyle w:val="NoSpacing"/>
+        <w:numPr>
+          <w:ilvl w:val="0"/>
+          <w:numId w:val="22"/>
+        </w:numPr>
+      </w:pPr>
+      <w:r>
+        <w:rPr>
+          <w:rFonts w:ascii="Verdana" w:hAnsi="Verdana"/>
+          <w:sz w:val="32"/>
+          <w:szCs w:val="32"/>
+        </w:rPr>
+        <w:t>Linear interpolation of framerate (framerate is more stable)</w:t>
+      </w:r>
+      <w:r>
+        <w:rPr>
+          <w:rFonts w:ascii="Verdana" w:hAnsi="Verdana"/>
+          <w:sz w:val="32"/>
+          <w:szCs w:val="32"/>
+        </w:rPr>
+        <w:t>.</w:t>
+      </w:r>
+    </w:p>
+    <w:p>
+      <w:pPr>
+        <w:pStyle w:val="NoSpacing"/>
+      </w:pPr>
+      <w:r>
+        <w:tab/>
+      </w:r>
+    </w:p>
+    <w:p>
+      <w:pPr>
+        <w:pStyle w:val="NoSpacing"/>
+        <w:rPr>
+          <w:rFonts w:ascii="Verdana" w:hAnsi="Verdana"/>
+          <w:b/>
+          <w:color w:val="FFC000"/>
+          <w:sz w:val="48"/>
+        </w:rPr>
+      </w:pPr>
+      <w:r>
+        <w:rPr>
+          <w:rFonts w:ascii="Verdana" w:hAnsi="Verdana"/>
+          <w:b/>
+          <w:color w:val="FFC000"/>
+          <w:sz w:val="48"/>
+        </w:rPr>
+        <w:t>CHANGES:</w:t>
+      </w:r>
+    </w:p>
+    <w:p>
+      <w:pPr>
+        <w:pStyle w:val="NoSpacing"/>
+        <w:numPr>
+          <w:ilvl w:val="0"/>
+          <w:numId w:val="22"/>
+        </w:numPr>
+        <w:rPr>
+          <w:rFonts w:ascii="Verdana" w:hAnsi="Verdana"/>
+          <w:sz w:val="32"/>
+          <w:szCs w:val="32"/>
+        </w:rPr>
+      </w:pPr>
+      <w:r>
+        <w:rPr>
+          <w:rFonts w:ascii="Verdana" w:hAnsi="Verdana"/>
+          <w:sz w:val="32"/>
+          <w:szCs w:val="32"/>
+        </w:rPr>
+        <w:t>Chunk operations are done in separate thread. Lesser impact on update per second and faster. [</w:t>
+      </w:r>
+      <w:proofErr w:type="spellStart"/>
+      <w:r>
+        <w:rPr>
+          <w:rFonts w:ascii="Verdana" w:hAnsi="Verdana"/>
+          <w:sz w:val="32"/>
+          <w:szCs w:val="32"/>
+        </w:rPr>
+        <w:t>JSomnia</w:t>
+      </w:r>
+      <w:proofErr w:type="spellEnd"/>
+      <w:r>
+        <w:rPr>
+          <w:rFonts w:ascii="Verdana" w:hAnsi="Verdana"/>
+          <w:sz w:val="32"/>
+          <w:szCs w:val="32"/>
+        </w:rPr>
+        <w:t>]</w:t>
+      </w:r>
+    </w:p>
+    <w:p>
+      <w:pPr>
+        <w:pStyle w:val="NoSpacing"/>
+        <w:ind w:left="360"/>
+        <w:rPr>
+          <w:rFonts w:ascii="Verdana" w:hAnsi="Verdana"/>
+          <w:sz w:val="32"/>
+          <w:szCs w:val="32"/>
+        </w:rPr>
+      </w:pPr>
+    </w:p>
+    <w:p>
+      <w:pPr>
+        <w:pStyle w:val="NoSpacing"/>
+        <w:rPr>
+          <w:rFonts w:ascii="Verdana" w:hAnsi="Verdana"/>
+          <w:b/>
+          <w:color w:val="FF0000"/>
+          <w:sz w:val="48"/>
+        </w:rPr>
+      </w:pPr>
+      <w:r>
+        <w:rPr>
+          <w:rFonts w:ascii="Verdana" w:hAnsi="Verdana"/>
+          <w:b/>
+          <w:color w:val="FF0000"/>
+          <w:sz w:val="48"/>
+        </w:rPr>
+        <w:t>FIXES:</w:t>
+      </w:r>
+    </w:p>
+    <w:p>
+      <w:pPr>
+        <w:pStyle w:val="NoSpacing"/>
+        <w:numPr>
+          <w:ilvl w:val="0"/>
+          <w:numId w:val="22"/>
+        </w:numPr>
+      </w:pPr>
+      <w:r>
+        <w:rPr>
+          <w:rFonts w:ascii="Verdana" w:hAnsi="Verdana"/>
+          <w:sz w:val="32"/>
+          <w:szCs w:val="32"/>
+        </w:rPr>
+        <w:t>Water Renderer is not broken anymore. [</w:t>
+      </w:r>
+      <w:proofErr w:type="spellStart"/>
+      <w:r>
+        <w:rPr>
+          <w:rFonts w:ascii="Verdana" w:hAnsi="Verdana"/>
+          <w:sz w:val="32"/>
+          <w:szCs w:val="32"/>
+        </w:rPr>
+        <w:t>JSomnia</w:t>
+      </w:r>
+      <w:proofErr w:type="spellEnd"/>
+      <w:r>
+        <w:rPr>
+          <w:rFonts w:ascii="Verdana" w:hAnsi="Verdana"/>
+          <w:sz w:val="32"/>
+          <w:szCs w:val="32"/>
+        </w:rPr>
+        <w:t>]</w:t>
+      </w:r>
+    </w:p>
+    <w:p>
+      <w:pPr>
+        <w:pStyle w:val="NoSpacing"/>
+        <w:numPr>
+          <w:ilvl w:val="0"/>
+          <w:numId w:val="22"/>
+        </w:numPr>
+      </w:pPr>
+      <w:r>
+        <w:rPr>
+          <w:rFonts w:ascii="Verdana" w:hAnsi="Verdana"/>
+          <w:sz w:val="32"/>
+          <w:szCs w:val="32"/>
+        </w:rPr>
+        <w:t xml:space="preserve">Game consumes lesser memory (still needs 1.5 GB of RAM for </w:t>
+      </w:r>
+      <w:proofErr w:type="spellStart"/>
+      <w:r>
+        <w:rPr>
+          <w:rFonts w:ascii="Verdana" w:hAnsi="Verdana"/>
+          <w:sz w:val="32"/>
+          <w:szCs w:val="32"/>
+        </w:rPr>
+        <w:t>randmax</w:t>
+      </w:r>
+      <w:proofErr w:type="spellEnd"/>
+      <w:r>
+        <w:rPr>
+          <w:rFonts w:ascii="Verdana" w:hAnsi="Verdana"/>
+          <w:sz w:val="32"/>
+          <w:szCs w:val="32"/>
+        </w:rPr>
+        <w:t xml:space="preserve"> level). [</w:t>
+      </w:r>
+      <w:proofErr w:type="spellStart"/>
+      <w:r>
+        <w:rPr>
+          <w:rFonts w:ascii="Verdana" w:hAnsi="Verdana"/>
+          <w:sz w:val="32"/>
+          <w:szCs w:val="32"/>
+        </w:rPr>
+        <w:t>JSomnia</w:t>
+      </w:r>
+      <w:proofErr w:type="spellEnd"/>
+      <w:r>
+        <w:rPr>
+          <w:rFonts w:ascii="Verdana" w:hAnsi="Verdana"/>
+          <w:sz w:val="32"/>
+          <w:szCs w:val="32"/>
+        </w:rPr>
+        <w:t>]</w:t>
+      </w:r>
+    </w:p>
+    <w:p>
+      <w:pPr>
+        <w:pStyle w:val="NoSpacing"/>
+        <w:ind w:left="360"/>
+      </w:pPr>
+    </w:p>
+    <w:p>
+      <w:pPr>
+        <w:pStyle w:val="NoSpacing"/>
+        <w:rPr>
+          <w:rFonts w:ascii="Verdana" w:hAnsi="Verdana"/>
+          <w:b/>
+          <w:sz w:val="48"/>
+        </w:rPr>
+      </w:pPr>
+      <w:r>
+        <w:rPr>
+          <w:rFonts w:ascii="Verdana" w:hAnsi="Verdana"/>
+          <w:b/>
+          <w:sz w:val="48"/>
+        </w:rPr>
+        <w:t>*Notice this is bug/issue fix release.</w:t>
+      </w:r>
+    </w:p>
+    <w:p>
+      <w:pPr>
+        <w:pStyle w:val="NoSpacing"/>
+        <w:ind w:left="360"/>
+        <w:rPr>
+          <w:rFonts w:ascii="Verdana" w:hAnsi="Verdana"/>
+          <w:b/>
+          <w:sz w:val="48"/>
+        </w:rPr>
+      </w:pPr>
+    </w:p>
+    <w:p>
+      <w:pPr>
+        <w:pStyle w:val="NoSpacing"/>
+        <w:ind w:left="360"/>
+        <w:rPr>
+          <w:rFonts w:ascii="Verdana" w:hAnsi="Verdana"/>
+          <w:b/>
+          <w:sz w:val="48"/>
+        </w:rPr>
+      </w:pPr>
+    </w:p>
+    <w:p>
+      <w:pPr>
+        <w:pStyle w:val="NoSpacing"/>
+        <w:ind w:left="360"/>
+        <w:rPr>
+          <w:rFonts w:ascii="Verdana" w:hAnsi="Verdana"/>
+          <w:b/>
+          <w:sz w:val="48"/>
+        </w:rPr>
+      </w:pPr>
+    </w:p>
+    <w:p>
+      <w:pPr>
+        <w:pStyle w:val="NoSpacing"/>
+        <w:ind w:left="360"/>
+        <w:rPr>
+          <w:rFonts w:ascii="Verdana" w:hAnsi="Verdana"/>
+          <w:b/>
+          <w:sz w:val="48"/>
+        </w:rPr>
+      </w:pPr>
+      <w:bookmarkStart w:id="0" w:name="_GoBack"/>
+      <w:bookmarkEnd w:id="0"/>
+    </w:p>
+    <w:p>
+      <w:pPr>
+        <w:pStyle w:val="NoSpacing"/>
+        <w:ind w:left="360"/>
+        <w:rPr>
+          <w:rFonts w:ascii="Verdana" w:hAnsi="Verdana"/>
+          <w:b/>
+          <w:sz w:val="48"/>
+        </w:rPr>
+      </w:pPr>
+    </w:p>
+    <w:p>
+      <w:pPr>
+        <w:pStyle w:val="NoSpacing"/>
+        <w:rPr>
+          <w:rFonts w:ascii="Verdana" w:hAnsi="Verdana"/>
+          <w:b/>
+          <w:sz w:val="48"/>
+        </w:rPr>
+      </w:pPr>
+    </w:p>
+    <w:p>
+      <w:pPr>
+        <w:pStyle w:val="NoSpacing"/>
+        <w:jc w:val="center"/>
+        <w:rPr>
+          <w:rFonts w:ascii="Verdana" w:hAnsi="Verdana"/>
+          <w:b/>
+          <w:sz w:val="48"/>
+        </w:rPr>
+      </w:pPr>
+      <w:proofErr w:type="spellStart"/>
+      <w:r>
+        <w:rPr>
+          <w:rFonts w:ascii="Verdana" w:hAnsi="Verdana"/>
+          <w:b/>
+          <w:sz w:val="48"/>
+        </w:rPr>
+        <w:lastRenderedPageBreak/>
         <w:t>Ermac</w:t>
       </w:r>
       <w:proofErr w:type="spellEnd"/>
@@ -547,8 +1063,6 @@
           <w:sz w:val="48"/>
         </w:rPr>
       </w:pPr>
-      <w:bookmarkStart w:id="0" w:name="_GoBack"/>
-      <w:bookmarkEnd w:id="0"/>
       <w:r>
         <w:rPr>
           <w:rFonts w:ascii="Verdana" w:hAnsi="Verdana"/>
@@ -7682,7 +8196,7 @@
     <w:charset w:val="00"/>
     <w:family w:val="modern"/>
     <w:pitch w:val="fixed"/>
-    <w:sig w:usb0="20002A87" w:usb1="00000000" w:usb2="00000000" w:usb3="00000000" w:csb0="000001FF" w:csb1="00000000"/>
+    <w:sig w:usb0="E0002EFF" w:usb1="C0007843" w:usb2="00000009" w:usb3="00000000" w:csb0="000001FF" w:csb1="00000000"/>
   </w:font>
   <w:font w:name="Wingdings">
     <w:panose1 w:val="05000000000000000000"/>
@@ -7702,8 +8216,9 @@
     <w:panose1 w:val="020B0604030504040204"/>
     <w:charset w:val="00"/>
     <w:family w:val="swiss"/>
+    <w:notTrueType/>
     <w:pitch w:val="variable"/>
-    <w:sig w:usb0="E1002EFF" w:usb1="C000605B" w:usb2="00000029" w:usb3="00000000" w:csb0="000101FF" w:csb1="00000000"/>
+    <w:sig w:usb0="00000003" w:usb1="00000000" w:usb2="00000000" w:usb3="00000000" w:csb0="00000001" w:csb1="00000000"/>
   </w:font>
   <w:font w:name="Verdana">
     <w:panose1 w:val="020B0604030504040204"/>
@@ -7740,11 +8255,13 @@
     <w:rsid w:val="00625DB6"/>
     <w:rsid w:val="00627604"/>
     <w:rsid w:val="00746BEB"/>
+    <w:rsid w:val="00926A90"/>
     <w:rsid w:val="009A2582"/>
     <w:rsid w:val="00A823C9"/>
     <w:rsid w:val="00AF7112"/>
     <w:rsid w:val="00C9469B"/>
     <w:rsid w:val="00CF0582"/>
+    <w:rsid w:val="00DC2C91"/>
     <w:rsid w:val="00F072F0"/>
     <w:rsid w:val="00FD26D1"/>
   </w:rsids>
@@ -8453,7 +8970,7 @@
 </file>
 
 <file path=customXml/itemProps1.xml><?xml version="1.0" encoding="utf-8"?>
-<ds:datastoreItem xmlns:ds="http://schemas.openxmlformats.org/officeDocument/2006/customXml" ds:itemID="{00A75031-C348-439E-8FE0-FA317C0C5ABC}">
+<ds:datastoreItem xmlns:ds="http://schemas.openxmlformats.org/officeDocument/2006/customXml" ds:itemID="{D96932E7-9FE8-4741-AFC8-5B857835506B}">
   <ds:schemaRefs>
     <ds:schemaRef ds:uri="http://schemas.openxmlformats.org/officeDocument/2006/bibliography"/>
   </ds:schemaRefs>

</xml_diff>

<commit_message>
FOR V21 VIVID LIGHT U05! Updated changelog!
</commit_message>
<xml_diff>
--- a/changelog.docx
+++ b/changelog.docx
@@ -36,7 +36,7 @@
           <w:b/>
           <w:sz w:val="48"/>
         </w:rPr>
-        <w:t>20</w:t>
+        <w:t>21</w:t>
       </w:r>
       <w:r>
         <w:rPr>
@@ -52,7 +52,7 @@
           <w:b/>
           <w:sz w:val="48"/>
         </w:rPr>
-        <w:t>URANIUM</w:t>
+        <w:t>VIVID</w:t>
       </w:r>
       <w:r>
         <w:rPr>
@@ -111,10 +111,10 @@
           <w:noProof/>
         </w:rPr>
         <w:drawing>
-          <wp:inline distT="0" distB="0" distL="0" distR="0" wp14:anchorId="51F4129E" wp14:editId="1B7B264B">
+          <wp:inline distT="0" distB="0" distL="0" distR="0" wp14:anchorId="130D2EFF" wp14:editId="7BD0B2B1">
             <wp:extent cx="2295144" cy="1197864"/>
             <wp:effectExtent l="0" t="0" r="0" b="2540"/>
-            <wp:docPr id="2" name="Picture 2"/>
+            <wp:docPr id="3" name="Picture 3"/>
             <wp:cNvGraphicFramePr>
               <a:graphicFrameLocks xmlns:a="http://schemas.openxmlformats.org/drawingml/2006/main" noChangeAspect="1"/>
             </wp:cNvGraphicFramePr>
@@ -183,7 +183,7 @@
           <w:b/>
           <w:sz w:val="48"/>
         </w:rPr>
-        <w:t>URANINIUM</w:t>
+        <w:t>VIVID</w:t>
       </w:r>
       <w:r>
         <w:rPr>
@@ -197,21 +197,29 @@
     <w:p>
       <w:pPr>
         <w:pStyle w:val="NoSpacing"/>
-        <w:rPr>
-          <w:rFonts w:ascii="Verdana" w:hAnsi="Verdana"/>
-          <w:b/>
-          <w:color w:val="00B050"/>
-          <w:sz w:val="48"/>
-        </w:rPr>
-      </w:pPr>
-      <w:r>
-        <w:rPr>
-          <w:rFonts w:ascii="Verdana" w:hAnsi="Verdana"/>
-          <w:b/>
-          <w:color w:val="00B050"/>
-          <w:sz w:val="48"/>
-        </w:rPr>
-        <w:t>FEATURES:</w:t>
+      </w:pPr>
+      <w:r>
+        <w:tab/>
+      </w:r>
+    </w:p>
+    <w:p>
+      <w:pPr>
+        <w:pStyle w:val="NoSpacing"/>
+        <w:rPr>
+          <w:rFonts w:ascii="Verdana" w:hAnsi="Verdana"/>
+          <w:b/>
+          <w:color w:val="FFC000"/>
+          <w:sz w:val="48"/>
+        </w:rPr>
+      </w:pPr>
+      <w:r>
+        <w:rPr>
+          <w:rFonts w:ascii="Verdana" w:hAnsi="Verdana"/>
+          <w:b/>
+          <w:color w:val="FFC000"/>
+          <w:sz w:val="48"/>
+        </w:rPr>
+        <w:t>CHANGES:</w:t>
       </w:r>
     </w:p>
     <w:p>
@@ -221,50 +229,51 @@
           <w:ilvl w:val="0"/>
           <w:numId w:val="22"/>
         </w:numPr>
-      </w:pPr>
-      <w:r>
-        <w:rPr>
-          <w:rFonts w:ascii="Verdana" w:hAnsi="Verdana"/>
-          <w:sz w:val="32"/>
-          <w:szCs w:val="32"/>
-        </w:rPr>
-        <w:t>Linear interpolation of framerate (framerate is more stable)</w:t>
-      </w:r>
-      <w:r>
-        <w:rPr>
-          <w:rFonts w:ascii="Verdana" w:hAnsi="Verdana"/>
-          <w:sz w:val="32"/>
-          <w:szCs w:val="32"/>
-        </w:rPr>
-        <w:t>.</w:t>
-      </w:r>
-    </w:p>
-    <w:p>
-      <w:pPr>
-        <w:pStyle w:val="NoSpacing"/>
-      </w:pPr>
-      <w:r>
-        <w:tab/>
-      </w:r>
-    </w:p>
-    <w:p>
-      <w:pPr>
-        <w:pStyle w:val="NoSpacing"/>
-        <w:rPr>
-          <w:rFonts w:ascii="Verdana" w:hAnsi="Verdana"/>
-          <w:b/>
-          <w:color w:val="FFC000"/>
-          <w:sz w:val="48"/>
-        </w:rPr>
-      </w:pPr>
-      <w:r>
-        <w:rPr>
-          <w:rFonts w:ascii="Verdana" w:hAnsi="Verdana"/>
-          <w:b/>
-          <w:color w:val="FFC000"/>
-          <w:sz w:val="48"/>
-        </w:rPr>
-        <w:t>CHANGES:</w:t>
+        <w:rPr>
+          <w:rFonts w:ascii="Verdana" w:hAnsi="Verdana"/>
+          <w:sz w:val="32"/>
+          <w:szCs w:val="32"/>
+        </w:rPr>
+      </w:pPr>
+      <w:r>
+        <w:rPr>
+          <w:rFonts w:ascii="Verdana" w:hAnsi="Verdana"/>
+          <w:sz w:val="32"/>
+          <w:szCs w:val="32"/>
+        </w:rPr>
+        <w:t xml:space="preserve">Chunk operations are done in </w:t>
+      </w:r>
+      <w:r>
+        <w:rPr>
+          <w:rFonts w:ascii="Verdana" w:hAnsi="Verdana"/>
+          <w:sz w:val="32"/>
+          <w:szCs w:val="32"/>
+        </w:rPr>
+        <w:t xml:space="preserve">timer thread </w:t>
+      </w:r>
+      <w:r>
+        <w:rPr>
+          <w:rFonts w:ascii="Verdana" w:hAnsi="Verdana"/>
+          <w:sz w:val="32"/>
+          <w:szCs w:val="32"/>
+        </w:rPr>
+        <w:t>at</w:t>
+      </w:r>
+      <w:r>
+        <w:rPr>
+          <w:rFonts w:ascii="Verdana" w:hAnsi="Verdana"/>
+          <w:sz w:val="32"/>
+          <w:szCs w:val="32"/>
+        </w:rPr>
+        <w:t xml:space="preserve"> fixed rate</w:t>
+      </w:r>
+      <w:r>
+        <w:rPr>
+          <w:rFonts w:ascii="Verdana" w:hAnsi="Verdana"/>
+          <w:sz w:val="32"/>
+          <w:szCs w:val="32"/>
+        </w:rPr>
+        <w:t xml:space="preserve">. </w:t>
       </w:r>
     </w:p>
     <w:p>
@@ -286,56 +295,39 @@
           <w:sz w:val="32"/>
           <w:szCs w:val="32"/>
         </w:rPr>
-        <w:t>Chunk operations are done in separate thread. Lesser impact on update per second and faster. [</w:t>
-      </w:r>
-      <w:proofErr w:type="spellStart"/>
-      <w:r>
-        <w:rPr>
-          <w:rFonts w:ascii="Verdana" w:hAnsi="Verdana"/>
-          <w:sz w:val="32"/>
-          <w:szCs w:val="32"/>
-        </w:rPr>
-        <w:t>JSomnia</w:t>
-      </w:r>
-      <w:proofErr w:type="spellEnd"/>
-      <w:r>
-        <w:rPr>
-          <w:rFonts w:ascii="Verdana" w:hAnsi="Verdana"/>
-          <w:sz w:val="32"/>
-          <w:szCs w:val="32"/>
-        </w:rPr>
-        <w:t>]</w:t>
-      </w:r>
-    </w:p>
-    <w:p>
-      <w:pPr>
-        <w:pStyle w:val="NoSpacing"/>
-        <w:ind w:left="360"/>
-        <w:rPr>
-          <w:rFonts w:ascii="Verdana" w:hAnsi="Verdana"/>
-          <w:sz w:val="32"/>
-          <w:szCs w:val="32"/>
-        </w:rPr>
-      </w:pPr>
-    </w:p>
-    <w:p>
-      <w:pPr>
-        <w:pStyle w:val="NoSpacing"/>
-        <w:rPr>
-          <w:rFonts w:ascii="Verdana" w:hAnsi="Verdana"/>
-          <w:b/>
-          <w:color w:val="FF0000"/>
-          <w:sz w:val="48"/>
-        </w:rPr>
-      </w:pPr>
-      <w:r>
-        <w:rPr>
-          <w:rFonts w:ascii="Verdana" w:hAnsi="Verdana"/>
-          <w:b/>
-          <w:color w:val="FF0000"/>
-          <w:sz w:val="48"/>
-        </w:rPr>
-        <w:t>FIXES:</w:t>
+        <w:t xml:space="preserve">Random level generator uses Noise &amp; Random together </w:t>
+      </w:r>
+      <w:r>
+        <w:rPr>
+          <w:rFonts w:ascii="Verdana" w:hAnsi="Verdana"/>
+          <w:sz w:val="32"/>
+          <w:szCs w:val="32"/>
+        </w:rPr>
+        <w:t>t</w:t>
+      </w:r>
+      <w:r>
+        <w:rPr>
+          <w:rFonts w:ascii="Verdana" w:hAnsi="Verdana"/>
+          <w:sz w:val="32"/>
+          <w:szCs w:val="32"/>
+        </w:rPr>
+        <w:t>o generate random level. First Noise is applied</w:t>
+      </w:r>
+      <w:r>
+        <w:rPr>
+          <w:rFonts w:ascii="Verdana" w:hAnsi="Verdana"/>
+          <w:sz w:val="32"/>
+          <w:szCs w:val="32"/>
+        </w:rPr>
+        <w:t>,</w:t>
+      </w:r>
+      <w:r>
+        <w:rPr>
+          <w:rFonts w:ascii="Verdana" w:hAnsi="Verdana"/>
+          <w:sz w:val="32"/>
+          <w:szCs w:val="32"/>
+        </w:rPr>
+        <w:t xml:space="preserve"> then random after former is done.</w:t>
       </w:r>
     </w:p>
     <w:p>
@@ -345,32 +337,57 @@
           <w:ilvl w:val="0"/>
           <w:numId w:val="22"/>
         </w:numPr>
-      </w:pPr>
-      <w:r>
-        <w:rPr>
-          <w:rFonts w:ascii="Verdana" w:hAnsi="Verdana"/>
-          <w:sz w:val="32"/>
-          <w:szCs w:val="32"/>
-        </w:rPr>
-        <w:t>Water Renderer is not broken anymore. [</w:t>
-      </w:r>
-      <w:proofErr w:type="spellStart"/>
-      <w:r>
-        <w:rPr>
-          <w:rFonts w:ascii="Verdana" w:hAnsi="Verdana"/>
-          <w:sz w:val="32"/>
-          <w:szCs w:val="32"/>
-        </w:rPr>
-        <w:t>JSomnia</w:t>
-      </w:r>
-      <w:proofErr w:type="spellEnd"/>
-      <w:r>
-        <w:rPr>
-          <w:rFonts w:ascii="Verdana" w:hAnsi="Verdana"/>
-          <w:sz w:val="32"/>
-          <w:szCs w:val="32"/>
-        </w:rPr>
-        <w:t>]</w:t>
+        <w:rPr>
+          <w:rFonts w:ascii="Verdana" w:hAnsi="Verdana"/>
+          <w:sz w:val="32"/>
+          <w:szCs w:val="32"/>
+        </w:rPr>
+      </w:pPr>
+      <w:r>
+        <w:rPr>
+          <w:rFonts w:ascii="Verdana" w:hAnsi="Verdana"/>
+          <w:sz w:val="32"/>
+          <w:szCs w:val="32"/>
+        </w:rPr>
+        <w:t>Block positions are aligned to the even number</w:t>
+      </w:r>
+      <w:r>
+        <w:rPr>
+          <w:rFonts w:ascii="Verdana" w:hAnsi="Verdana"/>
+          <w:sz w:val="32"/>
+          <w:szCs w:val="32"/>
+        </w:rPr>
+        <w:t>.</w:t>
+      </w:r>
+    </w:p>
+    <w:p>
+      <w:pPr>
+        <w:pStyle w:val="NoSpacing"/>
+        <w:rPr>
+          <w:rFonts w:ascii="Verdana" w:hAnsi="Verdana"/>
+          <w:sz w:val="32"/>
+          <w:szCs w:val="32"/>
+        </w:rPr>
+      </w:pPr>
+    </w:p>
+    <w:p>
+      <w:pPr>
+        <w:pStyle w:val="NoSpacing"/>
+        <w:rPr>
+          <w:rFonts w:ascii="Verdana" w:hAnsi="Verdana"/>
+          <w:b/>
+          <w:color w:val="FF0000"/>
+          <w:sz w:val="48"/>
+        </w:rPr>
+      </w:pPr>
+      <w:r>
+        <w:rPr>
+          <w:rFonts w:ascii="Verdana" w:hAnsi="Verdana"/>
+          <w:b/>
+          <w:color w:val="FF0000"/>
+          <w:sz w:val="48"/>
+        </w:rPr>
+        <w:t>FIXES:</w:t>
       </w:r>
     </w:p>
     <w:p>
@@ -380,386 +397,43 @@
           <w:ilvl w:val="0"/>
           <w:numId w:val="22"/>
         </w:numPr>
-      </w:pPr>
-      <w:r>
-        <w:rPr>
-          <w:rFonts w:ascii="Verdana" w:hAnsi="Verdana"/>
-          <w:sz w:val="32"/>
-          <w:szCs w:val="32"/>
-        </w:rPr>
-        <w:t xml:space="preserve">Game consumes lesser memory (still needs 1.5 GB of RAM for </w:t>
-      </w:r>
-      <w:proofErr w:type="spellStart"/>
-      <w:r>
-        <w:rPr>
-          <w:rFonts w:ascii="Verdana" w:hAnsi="Verdana"/>
-          <w:sz w:val="32"/>
-          <w:szCs w:val="32"/>
-        </w:rPr>
-        <w:t>randmax</w:t>
-      </w:r>
-      <w:proofErr w:type="spellEnd"/>
-      <w:r>
-        <w:rPr>
-          <w:rFonts w:ascii="Verdana" w:hAnsi="Verdana"/>
-          <w:sz w:val="32"/>
-          <w:szCs w:val="32"/>
-        </w:rPr>
-        <w:t xml:space="preserve"> level). [</w:t>
-      </w:r>
-      <w:proofErr w:type="spellStart"/>
-      <w:r>
-        <w:rPr>
-          <w:rFonts w:ascii="Verdana" w:hAnsi="Verdana"/>
-          <w:sz w:val="32"/>
-          <w:szCs w:val="32"/>
-        </w:rPr>
-        <w:t>JSomnia</w:t>
-      </w:r>
-      <w:proofErr w:type="spellEnd"/>
-      <w:r>
-        <w:rPr>
-          <w:rFonts w:ascii="Verdana" w:hAnsi="Verdana"/>
-          <w:sz w:val="32"/>
-          <w:szCs w:val="32"/>
-        </w:rPr>
-        <w:t>]</w:t>
-      </w:r>
-    </w:p>
-    <w:p>
-      <w:pPr>
-        <w:pStyle w:val="NoSpacing"/>
-        <w:ind w:left="360"/>
-      </w:pPr>
-    </w:p>
-    <w:p>
-      <w:pPr>
-        <w:pStyle w:val="NoSpacing"/>
-        <w:rPr>
-          <w:rFonts w:ascii="Verdana" w:hAnsi="Verdana"/>
-          <w:b/>
-          <w:sz w:val="48"/>
-        </w:rPr>
-      </w:pPr>
-      <w:r>
-        <w:rPr>
-          <w:rFonts w:ascii="Verdana" w:hAnsi="Verdana"/>
-          <w:b/>
-          <w:sz w:val="48"/>
-        </w:rPr>
-        <w:t>*Notice this is bug/issue fix release.</w:t>
-      </w:r>
-    </w:p>
-    <w:p>
-      <w:pPr>
-        <w:pStyle w:val="NoSpacing"/>
-        <w:ind w:left="360"/>
-        <w:rPr>
-          <w:rFonts w:ascii="Verdana" w:hAnsi="Verdana"/>
-          <w:b/>
-          <w:sz w:val="48"/>
-        </w:rPr>
-      </w:pPr>
-    </w:p>
-    <w:p>
-      <w:pPr>
-        <w:pStyle w:val="NoSpacing"/>
-        <w:ind w:left="360"/>
-        <w:rPr>
-          <w:rFonts w:ascii="Verdana" w:hAnsi="Verdana"/>
-          <w:b/>
-          <w:sz w:val="48"/>
-        </w:rPr>
-      </w:pPr>
-    </w:p>
-    <w:p>
-      <w:pPr>
-        <w:pStyle w:val="NoSpacing"/>
-        <w:ind w:left="360"/>
-        <w:rPr>
-          <w:rFonts w:ascii="Verdana" w:hAnsi="Verdana"/>
-          <w:b/>
-          <w:sz w:val="48"/>
-        </w:rPr>
-      </w:pPr>
-    </w:p>
-    <w:p>
-      <w:pPr>
-        <w:pStyle w:val="NoSpacing"/>
-        <w:ind w:left="360"/>
-        <w:rPr>
-          <w:rFonts w:ascii="Verdana" w:hAnsi="Verdana"/>
-          <w:b/>
-          <w:sz w:val="48"/>
-        </w:rPr>
-      </w:pPr>
-      <w:bookmarkStart w:id="0" w:name="_GoBack"/>
-      <w:bookmarkEnd w:id="0"/>
-    </w:p>
-    <w:p>
-      <w:pPr>
-        <w:pStyle w:val="NoSpacing"/>
-        <w:ind w:left="360"/>
-        <w:rPr>
-          <w:rFonts w:ascii="Verdana" w:hAnsi="Verdana"/>
-          <w:b/>
-          <w:sz w:val="48"/>
-        </w:rPr>
-      </w:pPr>
-    </w:p>
-    <w:p>
-      <w:pPr>
-        <w:pStyle w:val="NoSpacing"/>
-        <w:rPr>
-          <w:rFonts w:ascii="Verdana" w:hAnsi="Verdana"/>
-          <w:b/>
-          <w:sz w:val="48"/>
-        </w:rPr>
-      </w:pPr>
-    </w:p>
-    <w:p>
-      <w:pPr>
-        <w:pStyle w:val="NoSpacing"/>
-        <w:jc w:val="center"/>
-        <w:rPr>
-          <w:rFonts w:ascii="Verdana" w:hAnsi="Verdana"/>
-          <w:b/>
-          <w:sz w:val="48"/>
-        </w:rPr>
-      </w:pPr>
-      <w:proofErr w:type="spellStart"/>
-      <w:r>
-        <w:rPr>
-          <w:rFonts w:ascii="Verdana" w:hAnsi="Verdana"/>
-          <w:b/>
-          <w:sz w:val="48"/>
-        </w:rPr>
-        <w:lastRenderedPageBreak/>
-        <w:t>Ermac</w:t>
-      </w:r>
-      <w:proofErr w:type="spellEnd"/>
-      <w:r>
-        <w:rPr>
-          <w:rFonts w:ascii="Verdana" w:hAnsi="Verdana"/>
-          <w:b/>
-          <w:sz w:val="48"/>
-        </w:rPr>
-        <w:t xml:space="preserve"> Voxel Game v </w:t>
-      </w:r>
-      <w:r>
-        <w:rPr>
-          <w:rFonts w:ascii="Verdana" w:hAnsi="Verdana"/>
-          <w:b/>
-          <w:sz w:val="48"/>
-        </w:rPr>
-        <w:t>1</w:t>
-      </w:r>
-      <w:r>
-        <w:rPr>
-          <w:rFonts w:ascii="Verdana" w:hAnsi="Verdana"/>
-          <w:b/>
-          <w:sz w:val="48"/>
-        </w:rPr>
-        <w:t>9</w:t>
-      </w:r>
-      <w:r>
-        <w:rPr>
-          <w:rFonts w:ascii="Verdana" w:hAnsi="Verdana"/>
-          <w:b/>
-          <w:sz w:val="48"/>
-        </w:rPr>
-        <w:t xml:space="preserve"> (</w:t>
-      </w:r>
-      <w:r>
-        <w:rPr>
-          <w:rFonts w:ascii="Verdana" w:hAnsi="Verdana"/>
-          <w:b/>
-          <w:sz w:val="48"/>
-        </w:rPr>
-        <w:t>TITANIUM</w:t>
-      </w:r>
-      <w:r>
-        <w:rPr>
-          <w:rFonts w:ascii="Verdana" w:hAnsi="Verdana"/>
-          <w:b/>
-          <w:sz w:val="48"/>
-        </w:rPr>
-        <w:t>)</w:t>
-      </w:r>
-    </w:p>
-    <w:p>
-      <w:pPr>
-        <w:pStyle w:val="NoSpacing"/>
-        <w:jc w:val="center"/>
-        <w:rPr>
-          <w:rFonts w:ascii="Verdana" w:hAnsi="Verdana"/>
-          <w:b/>
-          <w:sz w:val="48"/>
-        </w:rPr>
-      </w:pPr>
-      <w:r>
-        <w:rPr>
-          <w:rFonts w:ascii="Verdana" w:hAnsi="Verdana"/>
-          <w:b/>
-          <w:sz w:val="48"/>
-        </w:rPr>
-        <w:t>“</w:t>
-      </w:r>
-      <w:r>
-        <w:rPr>
-          <w:rFonts w:ascii="Verdana" w:hAnsi="Verdana"/>
-          <w:b/>
-          <w:sz w:val="48"/>
-        </w:rPr>
-        <w:t>NEWGEN</w:t>
-      </w:r>
-      <w:r>
-        <w:rPr>
-          <w:rFonts w:ascii="Verdana" w:hAnsi="Verdana"/>
-          <w:b/>
-          <w:sz w:val="48"/>
-        </w:rPr>
-        <w:t>”</w:t>
-      </w:r>
-    </w:p>
-    <w:p>
-      <w:pPr>
-        <w:pStyle w:val="NoSpacing"/>
-        <w:jc w:val="center"/>
-        <w:rPr>
-          <w:rFonts w:ascii="Verdana" w:hAnsi="Verdana"/>
-          <w:b/>
-          <w:sz w:val="48"/>
-        </w:rPr>
-      </w:pPr>
-      <w:r>
-        <w:rPr>
-          <w:rFonts w:ascii="Verdana" w:hAnsi="Verdana"/>
-          <w:b/>
-          <w:sz w:val="48"/>
-        </w:rPr>
-        <w:t>Game name</w:t>
-      </w:r>
-      <w:r>
-        <w:rPr>
-          <w:rFonts w:ascii="Verdana" w:hAnsi="Verdana"/>
-          <w:b/>
-          <w:sz w:val="48"/>
-        </w:rPr>
-        <w:t>: “Demolition Synergy”</w:t>
-      </w:r>
-    </w:p>
-    <w:p>
-      <w:pPr>
-        <w:pStyle w:val="NoSpacing"/>
-        <w:jc w:val="center"/>
-      </w:pPr>
-      <w:r>
-        <w:rPr>
-          <w:noProof/>
-        </w:rPr>
-        <w:drawing>
-          <wp:inline distT="0" distB="0" distL="0" distR="0" wp14:anchorId="75B431CE" wp14:editId="1CE7B089">
-            <wp:extent cx="2295144" cy="1197864"/>
-            <wp:effectExtent l="0" t="0" r="0" b="2540"/>
-            <wp:docPr id="1" name="Picture 1"/>
-            <wp:cNvGraphicFramePr>
-              <a:graphicFrameLocks xmlns:a="http://schemas.openxmlformats.org/drawingml/2006/main" noChangeAspect="1"/>
-            </wp:cNvGraphicFramePr>
-            <a:graphic xmlns:a="http://schemas.openxmlformats.org/drawingml/2006/main">
-              <a:graphicData uri="http://schemas.openxmlformats.org/drawingml/2006/picture">
-                <pic:pic xmlns:pic="http://schemas.openxmlformats.org/drawingml/2006/picture">
-                  <pic:nvPicPr>
-                    <pic:cNvPr id="0" name="ds_acro.png"/>
-                    <pic:cNvPicPr/>
-                  </pic:nvPicPr>
-                  <pic:blipFill>
-                    <a:blip r:embed="rId9" cstate="print">
-                      <a:extLst>
-                        <a:ext uri="{28A0092B-C50C-407E-A947-70E740481C1C}">
-                          <a14:useLocalDpi xmlns:a14="http://schemas.microsoft.com/office/drawing/2010/main" val="0"/>
-                        </a:ext>
-                      </a:extLst>
-                    </a:blip>
-                    <a:stretch>
-                      <a:fillRect/>
-                    </a:stretch>
-                  </pic:blipFill>
-                  <pic:spPr>
-                    <a:xfrm>
-                      <a:off x="0" y="0"/>
-                      <a:ext cx="2295144" cy="1197864"/>
-                    </a:xfrm>
-                    <a:prstGeom prst="rect">
-                      <a:avLst/>
-                    </a:prstGeom>
-                  </pic:spPr>
-                </pic:pic>
-              </a:graphicData>
-            </a:graphic>
-          </wp:inline>
-        </w:drawing>
-      </w:r>
-    </w:p>
-    <w:p>
-      <w:pPr>
-        <w:pStyle w:val="NoSpacing"/>
-        <w:jc w:val="center"/>
-      </w:pPr>
-    </w:p>
-    <w:p>
-      <w:pPr>
-        <w:pStyle w:val="NoSpacing"/>
-        <w:jc w:val="center"/>
-        <w:rPr>
-          <w:rFonts w:ascii="Verdana" w:hAnsi="Verdana"/>
-          <w:b/>
-          <w:sz w:val="48"/>
-        </w:rPr>
-      </w:pPr>
-      <w:r>
-        <w:rPr>
-          <w:rFonts w:ascii="Verdana" w:hAnsi="Verdana"/>
-          <w:b/>
-          <w:sz w:val="48"/>
-        </w:rPr>
-        <w:t>[</w:t>
-      </w:r>
-      <w:r>
-        <w:rPr>
-          <w:rFonts w:ascii="Verdana" w:hAnsi="Verdana"/>
-          <w:b/>
-          <w:sz w:val="48"/>
-        </w:rPr>
-        <w:t>TITANIUM</w:t>
-      </w:r>
-      <w:r>
-        <w:rPr>
-          <w:rFonts w:ascii="Verdana" w:hAnsi="Verdana"/>
-          <w:b/>
-          <w:sz w:val="48"/>
-        </w:rPr>
-        <w:t>]</w:t>
-      </w:r>
-    </w:p>
-    <w:p>
-      <w:pPr>
-        <w:pStyle w:val="NoSpacing"/>
-        <w:rPr>
-          <w:rFonts w:ascii="Verdana" w:hAnsi="Verdana"/>
-          <w:b/>
-          <w:color w:val="00B050"/>
-          <w:sz w:val="48"/>
-        </w:rPr>
-      </w:pPr>
-      <w:r>
-        <w:rPr>
-          <w:rFonts w:ascii="Verdana" w:hAnsi="Verdana"/>
-          <w:b/>
-          <w:color w:val="00B050"/>
-          <w:sz w:val="48"/>
-        </w:rPr>
-        <w:t>FEATURES:</w:t>
+        <w:rPr>
+          <w:rFonts w:ascii="Verdana" w:hAnsi="Verdana"/>
+          <w:sz w:val="32"/>
+          <w:szCs w:val="32"/>
+        </w:rPr>
+      </w:pPr>
+      <w:r>
+        <w:rPr>
+          <w:rFonts w:ascii="Verdana" w:hAnsi="Verdana"/>
+          <w:sz w:val="32"/>
+          <w:szCs w:val="32"/>
+        </w:rPr>
+        <w:t xml:space="preserve">Fixed </w:t>
+      </w:r>
+      <w:r>
+        <w:rPr>
+          <w:rFonts w:ascii="Verdana" w:hAnsi="Verdana"/>
+          <w:sz w:val="32"/>
+          <w:szCs w:val="32"/>
+        </w:rPr>
+        <w:t>exceptions when typing in the text</w:t>
+      </w:r>
+      <w:r>
+        <w:rPr>
+          <w:rFonts w:ascii="Verdana" w:hAnsi="Verdana"/>
+          <w:sz w:val="32"/>
+          <w:szCs w:val="32"/>
+        </w:rPr>
+        <w:t xml:space="preserve"> causing app to stop</w:t>
+      </w:r>
+      <w:r>
+        <w:rPr>
+          <w:rFonts w:ascii="Verdana" w:hAnsi="Verdana"/>
+          <w:sz w:val="32"/>
+          <w:szCs w:val="32"/>
+        </w:rPr>
+        <w:t>.</w:t>
       </w:r>
     </w:p>
     <w:p>
@@ -769,40 +443,181 @@
           <w:ilvl w:val="0"/>
           <w:numId w:val="22"/>
         </w:numPr>
-      </w:pPr>
-      <w:r>
-        <w:rPr>
-          <w:rFonts w:ascii="Verdana" w:hAnsi="Verdana"/>
-          <w:sz w:val="32"/>
-          <w:szCs w:val="32"/>
-        </w:rPr>
-        <w:t>Console commands now have post execution status (red if command fails or green if it’s success). If command is not recognized it will have white light bulb.</w:t>
-      </w:r>
-    </w:p>
-    <w:p>
-      <w:pPr>
-        <w:pStyle w:val="NoSpacing"/>
-        <w:jc w:val="center"/>
-      </w:pPr>
-    </w:p>
-    <w:p>
-      <w:pPr>
-        <w:pStyle w:val="NoSpacing"/>
-        <w:rPr>
-          <w:rFonts w:ascii="Verdana" w:hAnsi="Verdana"/>
-          <w:b/>
-          <w:color w:val="FFC000"/>
-          <w:sz w:val="48"/>
-        </w:rPr>
-      </w:pPr>
-      <w:r>
-        <w:rPr>
-          <w:rFonts w:ascii="Verdana" w:hAnsi="Verdana"/>
-          <w:b/>
-          <w:color w:val="FFC000"/>
-          <w:sz w:val="48"/>
-        </w:rPr>
-        <w:t>CHANGES:</w:t>
+        <w:rPr>
+          <w:rFonts w:ascii="Verdana" w:hAnsi="Verdana"/>
+          <w:sz w:val="32"/>
+          <w:szCs w:val="32"/>
+        </w:rPr>
+      </w:pPr>
+      <w:r>
+        <w:rPr>
+          <w:rFonts w:ascii="Verdana" w:hAnsi="Verdana"/>
+          <w:sz w:val="32"/>
+          <w:szCs w:val="32"/>
+        </w:rPr>
+        <w:t>Small performance gain.</w:t>
+      </w:r>
+    </w:p>
+    <w:p>
+      <w:pPr>
+        <w:pStyle w:val="NoSpacing"/>
+        <w:ind w:left="360"/>
+      </w:pPr>
+    </w:p>
+    <w:p>
+      <w:pPr>
+        <w:pStyle w:val="NoSpacing"/>
+        <w:ind w:left="360"/>
+      </w:pPr>
+    </w:p>
+    <w:p>
+      <w:pPr>
+        <w:pStyle w:val="NoSpacing"/>
+        <w:ind w:left="360"/>
+      </w:pPr>
+    </w:p>
+    <w:p>
+      <w:pPr>
+        <w:pStyle w:val="NoSpacing"/>
+        <w:ind w:left="360"/>
+      </w:pPr>
+    </w:p>
+    <w:p>
+      <w:pPr>
+        <w:pStyle w:val="NoSpacing"/>
+        <w:ind w:left="360"/>
+      </w:pPr>
+    </w:p>
+    <w:p>
+      <w:pPr>
+        <w:pStyle w:val="NoSpacing"/>
+        <w:ind w:left="360"/>
+      </w:pPr>
+    </w:p>
+    <w:p>
+      <w:pPr>
+        <w:pStyle w:val="NoSpacing"/>
+        <w:ind w:left="360"/>
+      </w:pPr>
+    </w:p>
+    <w:p>
+      <w:pPr>
+        <w:pStyle w:val="NoSpacing"/>
+        <w:ind w:left="360"/>
+      </w:pPr>
+    </w:p>
+    <w:p>
+      <w:pPr>
+        <w:pStyle w:val="NoSpacing"/>
+        <w:ind w:left="360"/>
+      </w:pPr>
+    </w:p>
+    <w:p>
+      <w:pPr>
+        <w:pStyle w:val="NoSpacing"/>
+        <w:ind w:left="360"/>
+      </w:pPr>
+    </w:p>
+    <w:p>
+      <w:pPr>
+        <w:pStyle w:val="NoSpacing"/>
+        <w:ind w:left="360"/>
+      </w:pPr>
+    </w:p>
+    <w:p>
+      <w:pPr>
+        <w:pStyle w:val="NoSpacing"/>
+        <w:ind w:left="360"/>
+      </w:pPr>
+    </w:p>
+    <w:p>
+      <w:pPr>
+        <w:pStyle w:val="NoSpacing"/>
+        <w:ind w:left="360"/>
+      </w:pPr>
+    </w:p>
+    <w:p>
+      <w:pPr>
+        <w:pStyle w:val="NoSpacing"/>
+        <w:ind w:left="360"/>
+      </w:pPr>
+    </w:p>
+    <w:p>
+      <w:pPr>
+        <w:pStyle w:val="NoSpacing"/>
+        <w:ind w:left="360"/>
+      </w:pPr>
+    </w:p>
+    <w:p>
+      <w:pPr>
+        <w:pStyle w:val="NoSpacing"/>
+        <w:rPr>
+          <w:rFonts w:ascii="Verdana" w:hAnsi="Verdana"/>
+          <w:b/>
+          <w:sz w:val="48"/>
+        </w:rPr>
+      </w:pPr>
+    </w:p>
+    <w:p>
+      <w:pPr>
+        <w:pStyle w:val="NoSpacing"/>
+        <w:jc w:val="center"/>
+      </w:pPr>
+    </w:p>
+    <w:p>
+      <w:pPr>
+        <w:pStyle w:val="NoSpacing"/>
+        <w:jc w:val="center"/>
+        <w:rPr>
+          <w:rFonts w:ascii="Verdana" w:hAnsi="Verdana"/>
+          <w:b/>
+          <w:sz w:val="48"/>
+        </w:rPr>
+      </w:pPr>
+      <w:r>
+        <w:rPr>
+          <w:rFonts w:ascii="Verdana" w:hAnsi="Verdana"/>
+          <w:b/>
+          <w:sz w:val="48"/>
+        </w:rPr>
+        <w:lastRenderedPageBreak/>
+        <w:t>[</w:t>
+      </w:r>
+      <w:r>
+        <w:rPr>
+          <w:rFonts w:ascii="Verdana" w:hAnsi="Verdana"/>
+          <w:b/>
+          <w:sz w:val="48"/>
+        </w:rPr>
+        <w:t>URANINIUM</w:t>
+      </w:r>
+      <w:r>
+        <w:rPr>
+          <w:rFonts w:ascii="Verdana" w:hAnsi="Verdana"/>
+          <w:b/>
+          <w:sz w:val="48"/>
+        </w:rPr>
+        <w:t>]</w:t>
+      </w:r>
+    </w:p>
+    <w:p>
+      <w:pPr>
+        <w:pStyle w:val="NoSpacing"/>
+        <w:rPr>
+          <w:rFonts w:ascii="Verdana" w:hAnsi="Verdana"/>
+          <w:b/>
+          <w:color w:val="00B050"/>
+          <w:sz w:val="48"/>
+        </w:rPr>
+      </w:pPr>
+      <w:r>
+        <w:rPr>
+          <w:rFonts w:ascii="Verdana" w:hAnsi="Verdana"/>
+          <w:b/>
+          <w:color w:val="00B050"/>
+          <w:sz w:val="48"/>
+        </w:rPr>
+        <w:t>FEATURES:</w:t>
       </w:r>
     </w:p>
     <w:p>
@@ -819,64 +634,35 @@
           <w:sz w:val="32"/>
           <w:szCs w:val="32"/>
         </w:rPr>
-        <w:t>Chunk function is improved</w:t>
-      </w:r>
-      <w:r>
-        <w:rPr>
-          <w:rFonts w:ascii="Verdana" w:hAnsi="Verdana"/>
-          <w:sz w:val="32"/>
-          <w:szCs w:val="32"/>
-        </w:rPr>
-        <w:t>.</w:t>
-      </w:r>
-      <w:r>
-        <w:rPr>
-          <w:rFonts w:ascii="Verdana" w:hAnsi="Verdana"/>
-          <w:sz w:val="32"/>
-          <w:szCs w:val="32"/>
-        </w:rPr>
-        <w:t xml:space="preserve"> </w:t>
-      </w:r>
-      <w:proofErr w:type="gramStart"/>
-      <w:r>
-        <w:rPr>
-          <w:rFonts w:ascii="Verdana" w:hAnsi="Verdana"/>
-          <w:sz w:val="32"/>
-          <w:szCs w:val="32"/>
-        </w:rPr>
-        <w:t>Blocks doesn’t</w:t>
-      </w:r>
-      <w:proofErr w:type="gramEnd"/>
-      <w:r>
-        <w:rPr>
-          <w:rFonts w:ascii="Verdana" w:hAnsi="Verdana"/>
-          <w:sz w:val="32"/>
-          <w:szCs w:val="32"/>
-        </w:rPr>
-        <w:t xml:space="preserve"> appear unexpectedly. </w:t>
-      </w:r>
-      <w:r>
-        <w:rPr>
-          <w:rFonts w:ascii="Verdana" w:hAnsi="Verdana"/>
-          <w:sz w:val="32"/>
-        </w:rPr>
-        <w:t>[</w:t>
-      </w:r>
-      <w:proofErr w:type="spellStart"/>
-      <w:r>
-        <w:rPr>
-          <w:rFonts w:ascii="Verdana" w:hAnsi="Verdana"/>
-          <w:sz w:val="32"/>
-        </w:rPr>
-        <w:t>JSomnia</w:t>
-      </w:r>
-      <w:proofErr w:type="spellEnd"/>
-      <w:r>
-        <w:rPr>
-          <w:rFonts w:ascii="Verdana" w:hAnsi="Verdana"/>
-          <w:sz w:val="32"/>
-        </w:rPr>
-        <w:t>]</w:t>
+        <w:t>Linear interpolation of framerate (framerate is more stable).</w:t>
+      </w:r>
+    </w:p>
+    <w:p>
+      <w:pPr>
+        <w:pStyle w:val="NoSpacing"/>
+      </w:pPr>
+      <w:r>
+        <w:tab/>
+      </w:r>
+    </w:p>
+    <w:p>
+      <w:pPr>
+        <w:pStyle w:val="NoSpacing"/>
+        <w:rPr>
+          <w:rFonts w:ascii="Verdana" w:hAnsi="Verdana"/>
+          <w:b/>
+          <w:color w:val="FFC000"/>
+          <w:sz w:val="48"/>
+        </w:rPr>
+      </w:pPr>
+      <w:r>
+        <w:rPr>
+          <w:rFonts w:ascii="Verdana" w:hAnsi="Verdana"/>
+          <w:b/>
+          <w:color w:val="FFC000"/>
+          <w:sz w:val="48"/>
+        </w:rPr>
+        <w:t>CHANGES:</w:t>
       </w:r>
     </w:p>
     <w:p>
@@ -886,33 +672,26 @@
           <w:ilvl w:val="0"/>
           <w:numId w:val="22"/>
         </w:numPr>
-      </w:pPr>
-      <w:r>
-        <w:rPr>
-          <w:rFonts w:ascii="Verdana" w:hAnsi="Verdana"/>
-          <w:sz w:val="32"/>
-        </w:rPr>
-        <w:t>Default settings are changed. Mouse sen</w:t>
-      </w:r>
-      <w:r>
-        <w:rPr>
-          <w:rFonts w:ascii="Verdana" w:hAnsi="Verdana"/>
-          <w:sz w:val="32"/>
-        </w:rPr>
-        <w:t>si</w:t>
-      </w:r>
-      <w:r>
-        <w:rPr>
-          <w:rFonts w:ascii="Verdana" w:hAnsi="Verdana"/>
-          <w:sz w:val="32"/>
-        </w:rPr>
-        <w:t>tivity set from 3.0 to 1.5 and Music and Sound volumes are set from 1.0 to 0.5 [</w:t>
+        <w:rPr>
+          <w:rFonts w:ascii="Verdana" w:hAnsi="Verdana"/>
+          <w:sz w:val="32"/>
+          <w:szCs w:val="32"/>
+        </w:rPr>
+      </w:pPr>
+      <w:r>
+        <w:rPr>
+          <w:rFonts w:ascii="Verdana" w:hAnsi="Verdana"/>
+          <w:sz w:val="32"/>
+          <w:szCs w:val="32"/>
+        </w:rPr>
+        <w:t>Chunk operations are done in separate thread. Lesser impact on update per second and faster. [</w:t>
       </w:r>
       <w:proofErr w:type="spellStart"/>
       <w:r>
         <w:rPr>
           <w:rFonts w:ascii="Verdana" w:hAnsi="Verdana"/>
           <w:sz w:val="32"/>
+          <w:szCs w:val="32"/>
         </w:rPr>
         <w:t>JSomnia</w:t>
       </w:r>
@@ -921,8 +700,40 @@
         <w:rPr>
           <w:rFonts w:ascii="Verdana" w:hAnsi="Verdana"/>
           <w:sz w:val="32"/>
+          <w:szCs w:val="32"/>
         </w:rPr>
         <w:t>]</w:t>
+      </w:r>
+    </w:p>
+    <w:p>
+      <w:pPr>
+        <w:pStyle w:val="NoSpacing"/>
+        <w:ind w:left="360"/>
+        <w:rPr>
+          <w:rFonts w:ascii="Verdana" w:hAnsi="Verdana"/>
+          <w:sz w:val="32"/>
+          <w:szCs w:val="32"/>
+        </w:rPr>
+      </w:pPr>
+    </w:p>
+    <w:p>
+      <w:pPr>
+        <w:pStyle w:val="NoSpacing"/>
+        <w:rPr>
+          <w:rFonts w:ascii="Verdana" w:hAnsi="Verdana"/>
+          <w:b/>
+          <w:color w:val="FF0000"/>
+          <w:sz w:val="48"/>
+        </w:rPr>
+      </w:pPr>
+      <w:r>
+        <w:rPr>
+          <w:rFonts w:ascii="Verdana" w:hAnsi="Verdana"/>
+          <w:b/>
+          <w:color w:val="FF0000"/>
+          <w:sz w:val="48"/>
+        </w:rPr>
+        <w:t>FIXES:</w:t>
       </w:r>
     </w:p>
     <w:p>
@@ -937,8 +748,27 @@
         <w:rPr>
           <w:rFonts w:ascii="Verdana" w:hAnsi="Verdana"/>
           <w:sz w:val="32"/>
-        </w:rPr>
-        <w:t>Program consumes less memory in general.</w:t>
+          <w:szCs w:val="32"/>
+        </w:rPr>
+        <w:t>Water Renderer is not broken anymore. [</w:t>
+      </w:r>
+      <w:proofErr w:type="spellStart"/>
+      <w:r>
+        <w:rPr>
+          <w:rFonts w:ascii="Verdana" w:hAnsi="Verdana"/>
+          <w:sz w:val="32"/>
+          <w:szCs w:val="32"/>
+        </w:rPr>
+        <w:t>JSomnia</w:t>
+      </w:r>
+      <w:proofErr w:type="spellEnd"/>
+      <w:r>
+        <w:rPr>
+          <w:rFonts w:ascii="Verdana" w:hAnsi="Verdana"/>
+          <w:sz w:val="32"/>
+          <w:szCs w:val="32"/>
+        </w:rPr>
+        <w:t>]</w:t>
       </w:r>
     </w:p>
     <w:p>
@@ -953,38 +783,274 @@
         <w:rPr>
           <w:rFonts w:ascii="Verdana" w:hAnsi="Verdana"/>
           <w:sz w:val="32"/>
-        </w:rPr>
-        <w:t>Game is more responsive when loading/saving chunks in general.</w:t>
-      </w:r>
-    </w:p>
-    <w:p>
-      <w:pPr>
-        <w:pStyle w:val="NoSpacing"/>
-        <w:rPr>
-          <w:rFonts w:ascii="Verdana" w:hAnsi="Verdana"/>
-          <w:sz w:val="32"/>
-          <w:szCs w:val="32"/>
-        </w:rPr>
-      </w:pPr>
-    </w:p>
-    <w:p>
-      <w:pPr>
-        <w:pStyle w:val="NoSpacing"/>
-        <w:rPr>
-          <w:rFonts w:ascii="Verdana" w:hAnsi="Verdana"/>
-          <w:b/>
-          <w:color w:val="FF0000"/>
-          <w:sz w:val="48"/>
-        </w:rPr>
-      </w:pPr>
-      <w:r>
-        <w:rPr>
-          <w:rFonts w:ascii="Verdana" w:hAnsi="Verdana"/>
-          <w:b/>
-          <w:color w:val="FF0000"/>
-          <w:sz w:val="48"/>
-        </w:rPr>
-        <w:t>FIXES:</w:t>
+          <w:szCs w:val="32"/>
+        </w:rPr>
+        <w:t xml:space="preserve">Game consumes lesser memory (still needs 1.5 GB of RAM for </w:t>
+      </w:r>
+      <w:proofErr w:type="spellStart"/>
+      <w:r>
+        <w:rPr>
+          <w:rFonts w:ascii="Verdana" w:hAnsi="Verdana"/>
+          <w:sz w:val="32"/>
+          <w:szCs w:val="32"/>
+        </w:rPr>
+        <w:t>randmax</w:t>
+      </w:r>
+      <w:proofErr w:type="spellEnd"/>
+      <w:r>
+        <w:rPr>
+          <w:rFonts w:ascii="Verdana" w:hAnsi="Verdana"/>
+          <w:sz w:val="32"/>
+          <w:szCs w:val="32"/>
+        </w:rPr>
+        <w:t xml:space="preserve"> level). [</w:t>
+      </w:r>
+      <w:proofErr w:type="spellStart"/>
+      <w:r>
+        <w:rPr>
+          <w:rFonts w:ascii="Verdana" w:hAnsi="Verdana"/>
+          <w:sz w:val="32"/>
+          <w:szCs w:val="32"/>
+        </w:rPr>
+        <w:t>JSomnia</w:t>
+      </w:r>
+      <w:proofErr w:type="spellEnd"/>
+      <w:r>
+        <w:rPr>
+          <w:rFonts w:ascii="Verdana" w:hAnsi="Verdana"/>
+          <w:sz w:val="32"/>
+          <w:szCs w:val="32"/>
+        </w:rPr>
+        <w:t>]</w:t>
+      </w:r>
+    </w:p>
+    <w:p>
+      <w:pPr>
+        <w:pStyle w:val="NoSpacing"/>
+        <w:ind w:left="360"/>
+      </w:pPr>
+    </w:p>
+    <w:p>
+      <w:pPr>
+        <w:pStyle w:val="NoSpacing"/>
+        <w:rPr>
+          <w:rFonts w:ascii="Verdana" w:hAnsi="Verdana"/>
+          <w:b/>
+          <w:sz w:val="48"/>
+        </w:rPr>
+      </w:pPr>
+      <w:r>
+        <w:rPr>
+          <w:rFonts w:ascii="Verdana" w:hAnsi="Verdana"/>
+          <w:b/>
+          <w:sz w:val="48"/>
+        </w:rPr>
+        <w:t>*Notice this is bug/issue fix release.</w:t>
+      </w:r>
+    </w:p>
+    <w:p>
+      <w:pPr>
+        <w:pStyle w:val="NoSpacing"/>
+        <w:ind w:left="360"/>
+        <w:rPr>
+          <w:rFonts w:ascii="Verdana" w:hAnsi="Verdana"/>
+          <w:b/>
+          <w:sz w:val="48"/>
+        </w:rPr>
+      </w:pPr>
+    </w:p>
+    <w:p>
+      <w:pPr>
+        <w:pStyle w:val="NoSpacing"/>
+        <w:ind w:left="360"/>
+        <w:rPr>
+          <w:rFonts w:ascii="Verdana" w:hAnsi="Verdana"/>
+          <w:b/>
+          <w:sz w:val="48"/>
+        </w:rPr>
+      </w:pPr>
+    </w:p>
+    <w:p>
+      <w:pPr>
+        <w:pStyle w:val="NoSpacing"/>
+        <w:ind w:left="360"/>
+        <w:rPr>
+          <w:rFonts w:ascii="Verdana" w:hAnsi="Verdana"/>
+          <w:b/>
+          <w:sz w:val="48"/>
+        </w:rPr>
+      </w:pPr>
+    </w:p>
+    <w:p>
+      <w:pPr>
+        <w:pStyle w:val="NoSpacing"/>
+        <w:ind w:left="360"/>
+        <w:rPr>
+          <w:rFonts w:ascii="Verdana" w:hAnsi="Verdana"/>
+          <w:b/>
+          <w:sz w:val="48"/>
+        </w:rPr>
+      </w:pPr>
+    </w:p>
+    <w:p>
+      <w:pPr>
+        <w:pStyle w:val="NoSpacing"/>
+        <w:ind w:left="360"/>
+        <w:rPr>
+          <w:rFonts w:ascii="Verdana" w:hAnsi="Verdana"/>
+          <w:b/>
+          <w:sz w:val="48"/>
+        </w:rPr>
+      </w:pPr>
+    </w:p>
+    <w:p>
+      <w:pPr>
+        <w:pStyle w:val="NoSpacing"/>
+        <w:rPr>
+          <w:rFonts w:ascii="Verdana" w:hAnsi="Verdana"/>
+          <w:b/>
+          <w:sz w:val="48"/>
+        </w:rPr>
+      </w:pPr>
+    </w:p>
+    <w:p>
+      <w:pPr>
+        <w:pStyle w:val="NoSpacing"/>
+        <w:jc w:val="center"/>
+      </w:pPr>
+    </w:p>
+    <w:p>
+      <w:pPr>
+        <w:pStyle w:val="NoSpacing"/>
+        <w:jc w:val="center"/>
+      </w:pPr>
+    </w:p>
+    <w:p>
+      <w:pPr>
+        <w:pStyle w:val="NoSpacing"/>
+        <w:jc w:val="center"/>
+      </w:pPr>
+    </w:p>
+    <w:p>
+      <w:pPr>
+        <w:pStyle w:val="NoSpacing"/>
+        <w:jc w:val="center"/>
+      </w:pPr>
+    </w:p>
+    <w:p>
+      <w:pPr>
+        <w:pStyle w:val="NoSpacing"/>
+        <w:jc w:val="center"/>
+      </w:pPr>
+    </w:p>
+    <w:p>
+      <w:pPr>
+        <w:pStyle w:val="NoSpacing"/>
+        <w:jc w:val="center"/>
+      </w:pPr>
+    </w:p>
+    <w:p>
+      <w:pPr>
+        <w:pStyle w:val="NoSpacing"/>
+        <w:jc w:val="center"/>
+      </w:pPr>
+    </w:p>
+    <w:p>
+      <w:pPr>
+        <w:pStyle w:val="NoSpacing"/>
+        <w:jc w:val="center"/>
+      </w:pPr>
+    </w:p>
+    <w:p>
+      <w:pPr>
+        <w:pStyle w:val="NoSpacing"/>
+        <w:jc w:val="center"/>
+      </w:pPr>
+    </w:p>
+    <w:p>
+      <w:pPr>
+        <w:pStyle w:val="NoSpacing"/>
+        <w:jc w:val="center"/>
+      </w:pPr>
+    </w:p>
+    <w:p>
+      <w:pPr>
+        <w:pStyle w:val="NoSpacing"/>
+        <w:jc w:val="center"/>
+      </w:pPr>
+    </w:p>
+    <w:p>
+      <w:pPr>
+        <w:pStyle w:val="NoSpacing"/>
+        <w:jc w:val="center"/>
+      </w:pPr>
+    </w:p>
+    <w:p>
+      <w:pPr>
+        <w:pStyle w:val="NoSpacing"/>
+        <w:jc w:val="center"/>
+      </w:pPr>
+    </w:p>
+    <w:p>
+      <w:pPr>
+        <w:pStyle w:val="NoSpacing"/>
+        <w:jc w:val="center"/>
+      </w:pPr>
+    </w:p>
+    <w:p>
+      <w:pPr>
+        <w:pStyle w:val="NoSpacing"/>
+        <w:jc w:val="center"/>
+        <w:rPr>
+          <w:rFonts w:ascii="Verdana" w:hAnsi="Verdana"/>
+          <w:b/>
+          <w:sz w:val="48"/>
+        </w:rPr>
+      </w:pPr>
+      <w:r>
+        <w:rPr>
+          <w:rFonts w:ascii="Verdana" w:hAnsi="Verdana"/>
+          <w:b/>
+          <w:sz w:val="48"/>
+        </w:rPr>
+        <w:lastRenderedPageBreak/>
+        <w:t>[</w:t>
+      </w:r>
+      <w:r>
+        <w:rPr>
+          <w:rFonts w:ascii="Verdana" w:hAnsi="Verdana"/>
+          <w:b/>
+          <w:sz w:val="48"/>
+        </w:rPr>
+        <w:t>TITANIUM</w:t>
+      </w:r>
+      <w:r>
+        <w:rPr>
+          <w:rFonts w:ascii="Verdana" w:hAnsi="Verdana"/>
+          <w:b/>
+          <w:sz w:val="48"/>
+        </w:rPr>
+        <w:t>]</w:t>
+      </w:r>
+    </w:p>
+    <w:p>
+      <w:pPr>
+        <w:pStyle w:val="NoSpacing"/>
+        <w:rPr>
+          <w:rFonts w:ascii="Verdana" w:hAnsi="Verdana"/>
+          <w:b/>
+          <w:color w:val="00B050"/>
+          <w:sz w:val="48"/>
+        </w:rPr>
+      </w:pPr>
+      <w:r>
+        <w:rPr>
+          <w:rFonts w:ascii="Verdana" w:hAnsi="Verdana"/>
+          <w:b/>
+          <w:color w:val="00B050"/>
+          <w:sz w:val="48"/>
+        </w:rPr>
+        <w:t>FEATURES:</w:t>
       </w:r>
     </w:p>
     <w:p>
@@ -1001,6 +1067,231 @@
           <w:sz w:val="32"/>
           <w:szCs w:val="32"/>
         </w:rPr>
+        <w:t>Console commands now have post execution status (red if command fails or green if it’s success). If command is not recognized it will have white light bulb.</w:t>
+      </w:r>
+    </w:p>
+    <w:p>
+      <w:pPr>
+        <w:pStyle w:val="NoSpacing"/>
+        <w:jc w:val="center"/>
+      </w:pPr>
+    </w:p>
+    <w:p>
+      <w:pPr>
+        <w:pStyle w:val="NoSpacing"/>
+        <w:rPr>
+          <w:rFonts w:ascii="Verdana" w:hAnsi="Verdana"/>
+          <w:b/>
+          <w:color w:val="FFC000"/>
+          <w:sz w:val="48"/>
+        </w:rPr>
+      </w:pPr>
+      <w:r>
+        <w:rPr>
+          <w:rFonts w:ascii="Verdana" w:hAnsi="Verdana"/>
+          <w:b/>
+          <w:color w:val="FFC000"/>
+          <w:sz w:val="48"/>
+        </w:rPr>
+        <w:t>CHANGES:</w:t>
+      </w:r>
+    </w:p>
+    <w:p>
+      <w:pPr>
+        <w:pStyle w:val="NoSpacing"/>
+        <w:numPr>
+          <w:ilvl w:val="0"/>
+          <w:numId w:val="22"/>
+        </w:numPr>
+      </w:pPr>
+      <w:r>
+        <w:rPr>
+          <w:rFonts w:ascii="Verdana" w:hAnsi="Verdana"/>
+          <w:sz w:val="32"/>
+          <w:szCs w:val="32"/>
+        </w:rPr>
+        <w:t>Chunk function is improved</w:t>
+      </w:r>
+      <w:r>
+        <w:rPr>
+          <w:rFonts w:ascii="Verdana" w:hAnsi="Verdana"/>
+          <w:sz w:val="32"/>
+          <w:szCs w:val="32"/>
+        </w:rPr>
+        <w:t>.</w:t>
+      </w:r>
+      <w:r>
+        <w:rPr>
+          <w:rFonts w:ascii="Verdana" w:hAnsi="Verdana"/>
+          <w:sz w:val="32"/>
+          <w:szCs w:val="32"/>
+        </w:rPr>
+        <w:t xml:space="preserve"> </w:t>
+      </w:r>
+      <w:proofErr w:type="gramStart"/>
+      <w:r>
+        <w:rPr>
+          <w:rFonts w:ascii="Verdana" w:hAnsi="Verdana"/>
+          <w:sz w:val="32"/>
+          <w:szCs w:val="32"/>
+        </w:rPr>
+        <w:t>Blocks doesn’t</w:t>
+      </w:r>
+      <w:proofErr w:type="gramEnd"/>
+      <w:r>
+        <w:rPr>
+          <w:rFonts w:ascii="Verdana" w:hAnsi="Verdana"/>
+          <w:sz w:val="32"/>
+          <w:szCs w:val="32"/>
+        </w:rPr>
+        <w:t xml:space="preserve"> appear unexpectedly. </w:t>
+      </w:r>
+      <w:r>
+        <w:rPr>
+          <w:rFonts w:ascii="Verdana" w:hAnsi="Verdana"/>
+          <w:sz w:val="32"/>
+        </w:rPr>
+        <w:t>[</w:t>
+      </w:r>
+      <w:proofErr w:type="spellStart"/>
+      <w:r>
+        <w:rPr>
+          <w:rFonts w:ascii="Verdana" w:hAnsi="Verdana"/>
+          <w:sz w:val="32"/>
+        </w:rPr>
+        <w:t>JSomnia</w:t>
+      </w:r>
+      <w:proofErr w:type="spellEnd"/>
+      <w:r>
+        <w:rPr>
+          <w:rFonts w:ascii="Verdana" w:hAnsi="Verdana"/>
+          <w:sz w:val="32"/>
+        </w:rPr>
+        <w:t>]</w:t>
+      </w:r>
+    </w:p>
+    <w:p>
+      <w:pPr>
+        <w:pStyle w:val="NoSpacing"/>
+        <w:numPr>
+          <w:ilvl w:val="0"/>
+          <w:numId w:val="22"/>
+        </w:numPr>
+      </w:pPr>
+      <w:r>
+        <w:rPr>
+          <w:rFonts w:ascii="Verdana" w:hAnsi="Verdana"/>
+          <w:sz w:val="32"/>
+        </w:rPr>
+        <w:t>Default settings are changed. Mouse sen</w:t>
+      </w:r>
+      <w:r>
+        <w:rPr>
+          <w:rFonts w:ascii="Verdana" w:hAnsi="Verdana"/>
+          <w:sz w:val="32"/>
+        </w:rPr>
+        <w:t>si</w:t>
+      </w:r>
+      <w:r>
+        <w:rPr>
+          <w:rFonts w:ascii="Verdana" w:hAnsi="Verdana"/>
+          <w:sz w:val="32"/>
+        </w:rPr>
+        <w:t>tivity set from 3.0 to 1.5 and Music and Sound volumes are set from 1.0 to 0.5 [</w:t>
+      </w:r>
+      <w:proofErr w:type="spellStart"/>
+      <w:r>
+        <w:rPr>
+          <w:rFonts w:ascii="Verdana" w:hAnsi="Verdana"/>
+          <w:sz w:val="32"/>
+        </w:rPr>
+        <w:t>JSomnia</w:t>
+      </w:r>
+      <w:proofErr w:type="spellEnd"/>
+      <w:r>
+        <w:rPr>
+          <w:rFonts w:ascii="Verdana" w:hAnsi="Verdana"/>
+          <w:sz w:val="32"/>
+        </w:rPr>
+        <w:t>]</w:t>
+      </w:r>
+    </w:p>
+    <w:p>
+      <w:pPr>
+        <w:pStyle w:val="NoSpacing"/>
+        <w:numPr>
+          <w:ilvl w:val="0"/>
+          <w:numId w:val="22"/>
+        </w:numPr>
+      </w:pPr>
+      <w:r>
+        <w:rPr>
+          <w:rFonts w:ascii="Verdana" w:hAnsi="Verdana"/>
+          <w:sz w:val="32"/>
+        </w:rPr>
+        <w:t>Program consumes less memory in general.</w:t>
+      </w:r>
+    </w:p>
+    <w:p>
+      <w:pPr>
+        <w:pStyle w:val="NoSpacing"/>
+        <w:numPr>
+          <w:ilvl w:val="0"/>
+          <w:numId w:val="22"/>
+        </w:numPr>
+      </w:pPr>
+      <w:r>
+        <w:rPr>
+          <w:rFonts w:ascii="Verdana" w:hAnsi="Verdana"/>
+          <w:sz w:val="32"/>
+        </w:rPr>
+        <w:t>Game is more responsive when loading/saving chunks in general.</w:t>
+      </w:r>
+    </w:p>
+    <w:p>
+      <w:pPr>
+        <w:pStyle w:val="NoSpacing"/>
+        <w:rPr>
+          <w:rFonts w:ascii="Verdana" w:hAnsi="Verdana"/>
+          <w:sz w:val="32"/>
+          <w:szCs w:val="32"/>
+        </w:rPr>
+      </w:pPr>
+    </w:p>
+    <w:p>
+      <w:pPr>
+        <w:pStyle w:val="NoSpacing"/>
+        <w:rPr>
+          <w:rFonts w:ascii="Verdana" w:hAnsi="Verdana"/>
+          <w:b/>
+          <w:color w:val="FF0000"/>
+          <w:sz w:val="48"/>
+        </w:rPr>
+      </w:pPr>
+      <w:r>
+        <w:rPr>
+          <w:rFonts w:ascii="Verdana" w:hAnsi="Verdana"/>
+          <w:b/>
+          <w:color w:val="FF0000"/>
+          <w:sz w:val="48"/>
+        </w:rPr>
+        <w:t>FIXES:</w:t>
+      </w:r>
+    </w:p>
+    <w:p>
+      <w:pPr>
+        <w:pStyle w:val="NoSpacing"/>
+        <w:numPr>
+          <w:ilvl w:val="0"/>
+          <w:numId w:val="22"/>
+        </w:numPr>
+      </w:pPr>
+      <w:r>
+        <w:rPr>
+          <w:rFonts w:ascii="Verdana" w:hAnsi="Verdana"/>
+          <w:sz w:val="32"/>
+          <w:szCs w:val="32"/>
+        </w:rPr>
         <w:t>[Options Menu] One changed setting doesn’t change all settings</w:t>
       </w:r>
       <w:r>
@@ -1052,6 +1343,85 @@
           <w:sz w:val="48"/>
         </w:rPr>
       </w:pPr>
+    </w:p>
+    <w:p>
+      <w:pPr>
+        <w:pStyle w:val="NoSpacing"/>
+        <w:jc w:val="center"/>
+        <w:rPr>
+          <w:rFonts w:ascii="Verdana" w:hAnsi="Verdana"/>
+          <w:b/>
+          <w:sz w:val="48"/>
+        </w:rPr>
+      </w:pPr>
+    </w:p>
+    <w:p>
+      <w:pPr>
+        <w:pStyle w:val="NoSpacing"/>
+        <w:jc w:val="center"/>
+        <w:rPr>
+          <w:rFonts w:ascii="Verdana" w:hAnsi="Verdana"/>
+          <w:b/>
+          <w:sz w:val="48"/>
+        </w:rPr>
+      </w:pPr>
+    </w:p>
+    <w:p>
+      <w:pPr>
+        <w:pStyle w:val="NoSpacing"/>
+        <w:jc w:val="center"/>
+        <w:rPr>
+          <w:rFonts w:ascii="Verdana" w:hAnsi="Verdana"/>
+          <w:b/>
+          <w:sz w:val="48"/>
+        </w:rPr>
+      </w:pPr>
+    </w:p>
+    <w:p>
+      <w:pPr>
+        <w:pStyle w:val="NoSpacing"/>
+        <w:jc w:val="center"/>
+        <w:rPr>
+          <w:rFonts w:ascii="Verdana" w:hAnsi="Verdana"/>
+          <w:b/>
+          <w:sz w:val="48"/>
+        </w:rPr>
+      </w:pPr>
+    </w:p>
+    <w:p>
+      <w:pPr>
+        <w:pStyle w:val="NoSpacing"/>
+        <w:jc w:val="center"/>
+        <w:rPr>
+          <w:rFonts w:ascii="Verdana" w:hAnsi="Verdana"/>
+          <w:b/>
+          <w:sz w:val="48"/>
+        </w:rPr>
+      </w:pPr>
+    </w:p>
+    <w:p>
+      <w:pPr>
+        <w:pStyle w:val="NoSpacing"/>
+        <w:jc w:val="center"/>
+        <w:rPr>
+          <w:rFonts w:ascii="Verdana" w:hAnsi="Verdana"/>
+          <w:b/>
+          <w:sz w:val="48"/>
+        </w:rPr>
+      </w:pPr>
+    </w:p>
+    <w:p>
+      <w:pPr>
+        <w:pStyle w:val="NoSpacing"/>
+        <w:jc w:val="center"/>
+        <w:rPr>
+          <w:rFonts w:ascii="Verdana" w:hAnsi="Verdana"/>
+          <w:b/>
+          <w:sz w:val="48"/>
+        </w:rPr>
+      </w:pPr>
+      <w:bookmarkStart w:id="0" w:name="_GoBack"/>
+      <w:bookmarkEnd w:id="0"/>
     </w:p>
     <w:p>
       <w:pPr>
@@ -8216,9 +8586,8 @@
     <w:panose1 w:val="020B0604030504040204"/>
     <w:charset w:val="00"/>
     <w:family w:val="swiss"/>
-    <w:notTrueType/>
     <w:pitch w:val="variable"/>
-    <w:sig w:usb0="00000003" w:usb1="00000000" w:usb2="00000000" w:usb3="00000000" w:csb0="00000001" w:csb1="00000000"/>
+    <w:sig w:usb0="E1002EFF" w:usb1="C000605B" w:usb2="00000029" w:usb3="00000000" w:csb0="000101FF" w:csb1="00000000"/>
   </w:font>
   <w:font w:name="Verdana">
     <w:panose1 w:val="020B0604030504040204"/>
@@ -8263,7 +8632,9 @@
     <w:rsid w:val="00CF0582"/>
     <w:rsid w:val="00DC2C91"/>
     <w:rsid w:val="00F072F0"/>
+    <w:rsid w:val="00F82198"/>
     <w:rsid w:val="00FD26D1"/>
+    <w:rsid w:val="00FD666A"/>
   </w:rsids>
   <m:mathPr>
     <m:mathFont m:val="Cambria Math"/>
@@ -8970,7 +9341,7 @@
 </file>
 
 <file path=customXml/itemProps1.xml><?xml version="1.0" encoding="utf-8"?>
-<ds:datastoreItem xmlns:ds="http://schemas.openxmlformats.org/officeDocument/2006/customXml" ds:itemID="{D96932E7-9FE8-4741-AFC8-5B857835506B}">
+<ds:datastoreItem xmlns:ds="http://schemas.openxmlformats.org/officeDocument/2006/customXml" ds:itemID="{4E45004B-4A03-42BC-8B77-60A7AEC5F2F9}">
   <ds:schemaRefs>
     <ds:schemaRef ds:uri="http://schemas.openxmlformats.org/officeDocument/2006/bibliography"/>
   </ds:schemaRefs>

</xml_diff>

<commit_message>
FOR V22 WARDEN LIGHT U10! Credits Menu, Changelog & Support!
</commit_message>
<xml_diff>
--- a/changelog.docx
+++ b/changelog.docx
@@ -36,7 +36,15 @@
           <w:b/>
           <w:sz w:val="48"/>
         </w:rPr>
-        <w:t>21</w:t>
+        <w:t>2</w:t>
+      </w:r>
+      <w:r>
+        <w:rPr>
+          <w:rFonts w:ascii="Verdana" w:hAnsi="Verdana"/>
+          <w:b/>
+          <w:sz w:val="48"/>
+        </w:rPr>
+        <w:t>2</w:t>
       </w:r>
       <w:r>
         <w:rPr>
@@ -52,7 +60,7 @@
           <w:b/>
           <w:sz w:val="48"/>
         </w:rPr>
-        <w:t>VIVID</w:t>
+        <w:t>WARDEN</w:t>
       </w:r>
       <w:r>
         <w:rPr>
@@ -100,6 +108,12 @@
         </w:rPr>
         <w:t>Game name: “Demolition Synergy”</w:t>
       </w:r>
+    </w:p>
+    <w:p>
+      <w:pPr>
+        <w:pStyle w:val="NoSpacing"/>
+        <w:jc w:val="center"/>
+      </w:pPr>
     </w:p>
     <w:p>
       <w:pPr>
@@ -157,6 +171,11 @@
       <w:pPr>
         <w:pStyle w:val="NoSpacing"/>
         <w:jc w:val="center"/>
+        <w:rPr>
+          <w:rFonts w:ascii="Verdana" w:hAnsi="Verdana"/>
+          <w:b/>
+          <w:sz w:val="48"/>
+        </w:rPr>
       </w:pPr>
     </w:p>
     <w:p>
@@ -183,7 +202,7 @@
           <w:b/>
           <w:sz w:val="48"/>
         </w:rPr>
-        <w:t>VIVID</w:t>
+        <w:t>WARDEN</w:t>
       </w:r>
       <w:r>
         <w:rPr>
@@ -197,29 +216,30 @@
     <w:p>
       <w:pPr>
         <w:pStyle w:val="NoSpacing"/>
-      </w:pPr>
-      <w:r>
-        <w:tab/>
-      </w:r>
-    </w:p>
-    <w:p>
-      <w:pPr>
-        <w:pStyle w:val="NoSpacing"/>
-        <w:rPr>
-          <w:rFonts w:ascii="Verdana" w:hAnsi="Verdana"/>
-          <w:b/>
-          <w:color w:val="FFC000"/>
-          <w:sz w:val="48"/>
-        </w:rPr>
-      </w:pPr>
-      <w:r>
-        <w:rPr>
-          <w:rFonts w:ascii="Verdana" w:hAnsi="Verdana"/>
-          <w:b/>
-          <w:color w:val="FFC000"/>
-          <w:sz w:val="48"/>
-        </w:rPr>
-        <w:t>CHANGES:</w:t>
+        <w:rPr>
+          <w:rFonts w:ascii="Verdana" w:hAnsi="Verdana"/>
+          <w:b/>
+          <w:color w:val="00B050"/>
+          <w:sz w:val="48"/>
+        </w:rPr>
+      </w:pPr>
+      <w:r>
+        <w:rPr>
+          <w:rFonts w:ascii="Verdana" w:hAnsi="Verdana"/>
+          <w:b/>
+          <w:color w:val="00B050"/>
+          <w:sz w:val="48"/>
+        </w:rPr>
+        <w:t>FEATURES</w:t>
+      </w:r>
+      <w:r>
+        <w:rPr>
+          <w:rFonts w:ascii="Verdana" w:hAnsi="Verdana"/>
+          <w:b/>
+          <w:color w:val="00B050"/>
+          <w:sz w:val="48"/>
+        </w:rPr>
+        <w:t>:</w:t>
       </w:r>
     </w:p>
     <w:p>
@@ -241,39 +261,7 @@
           <w:sz w:val="32"/>
           <w:szCs w:val="32"/>
         </w:rPr>
-        <w:t xml:space="preserve">Chunk operations are done in </w:t>
-      </w:r>
-      <w:r>
-        <w:rPr>
-          <w:rFonts w:ascii="Verdana" w:hAnsi="Verdana"/>
-          <w:sz w:val="32"/>
-          <w:szCs w:val="32"/>
-        </w:rPr>
-        <w:t xml:space="preserve">timer thread </w:t>
-      </w:r>
-      <w:r>
-        <w:rPr>
-          <w:rFonts w:ascii="Verdana" w:hAnsi="Verdana"/>
-          <w:sz w:val="32"/>
-          <w:szCs w:val="32"/>
-        </w:rPr>
-        <w:t>at</w:t>
-      </w:r>
-      <w:r>
-        <w:rPr>
-          <w:rFonts w:ascii="Verdana" w:hAnsi="Verdana"/>
-          <w:sz w:val="32"/>
-          <w:szCs w:val="32"/>
-        </w:rPr>
-        <w:t xml:space="preserve"> fixed rate</w:t>
-      </w:r>
-      <w:r>
-        <w:rPr>
-          <w:rFonts w:ascii="Verdana" w:hAnsi="Verdana"/>
-          <w:sz w:val="32"/>
-          <w:szCs w:val="32"/>
-        </w:rPr>
-        <w:t xml:space="preserve">. </w:t>
+        <w:t>More ambient tracks &amp; new track when level is randomly generated.</w:t>
       </w:r>
     </w:p>
     <w:p>
@@ -295,39 +283,7 @@
           <w:sz w:val="32"/>
           <w:szCs w:val="32"/>
         </w:rPr>
-        <w:t xml:space="preserve">Random level generator uses Noise &amp; Random together </w:t>
-      </w:r>
-      <w:r>
-        <w:rPr>
-          <w:rFonts w:ascii="Verdana" w:hAnsi="Verdana"/>
-          <w:sz w:val="32"/>
-          <w:szCs w:val="32"/>
-        </w:rPr>
-        <w:t>t</w:t>
-      </w:r>
-      <w:r>
-        <w:rPr>
-          <w:rFonts w:ascii="Verdana" w:hAnsi="Verdana"/>
-          <w:sz w:val="32"/>
-          <w:szCs w:val="32"/>
-        </w:rPr>
-        <w:t>o generate random level. First Noise is applied</w:t>
-      </w:r>
-      <w:r>
-        <w:rPr>
-          <w:rFonts w:ascii="Verdana" w:hAnsi="Verdana"/>
-          <w:sz w:val="32"/>
-          <w:szCs w:val="32"/>
-        </w:rPr>
-        <w:t>,</w:t>
-      </w:r>
-      <w:r>
-        <w:rPr>
-          <w:rFonts w:ascii="Verdana" w:hAnsi="Verdana"/>
-          <w:sz w:val="32"/>
-          <w:szCs w:val="32"/>
-        </w:rPr>
-        <w:t xml:space="preserve"> then random after former is done.</w:t>
+        <w:t>Credits added to the menu.</w:t>
       </w:r>
     </w:p>
     <w:p>
@@ -349,45 +305,38 @@
           <w:sz w:val="32"/>
           <w:szCs w:val="32"/>
         </w:rPr>
-        <w:t>Block positions are aligned to the even number</w:t>
-      </w:r>
-      <w:r>
-        <w:rPr>
-          <w:rFonts w:ascii="Verdana" w:hAnsi="Verdana"/>
-          <w:sz w:val="32"/>
-          <w:szCs w:val="32"/>
-        </w:rPr>
-        <w:t>.</w:t>
-      </w:r>
-    </w:p>
-    <w:p>
-      <w:pPr>
-        <w:pStyle w:val="NoSpacing"/>
-        <w:rPr>
-          <w:rFonts w:ascii="Verdana" w:hAnsi="Verdana"/>
-          <w:sz w:val="32"/>
-          <w:szCs w:val="32"/>
-        </w:rPr>
-      </w:pPr>
-    </w:p>
-    <w:p>
-      <w:pPr>
-        <w:pStyle w:val="NoSpacing"/>
-        <w:rPr>
-          <w:rFonts w:ascii="Verdana" w:hAnsi="Verdana"/>
-          <w:b/>
-          <w:color w:val="FF0000"/>
-          <w:sz w:val="48"/>
-        </w:rPr>
-      </w:pPr>
-      <w:r>
-        <w:rPr>
-          <w:rFonts w:ascii="Verdana" w:hAnsi="Verdana"/>
-          <w:b/>
-          <w:color w:val="FF0000"/>
-          <w:sz w:val="48"/>
-        </w:rPr>
-        <w:t>FIXES:</w:t>
+        <w:t>Auto-complete for commands.</w:t>
+      </w:r>
+    </w:p>
+    <w:p>
+      <w:pPr>
+        <w:pStyle w:val="NoSpacing"/>
+        <w:rPr>
+          <w:rFonts w:ascii="Verdana" w:hAnsi="Verdana"/>
+          <w:b/>
+          <w:color w:val="FFC000"/>
+          <w:sz w:val="48"/>
+        </w:rPr>
+      </w:pPr>
+    </w:p>
+    <w:p>
+      <w:pPr>
+        <w:pStyle w:val="NoSpacing"/>
+        <w:rPr>
+          <w:rFonts w:ascii="Verdana" w:hAnsi="Verdana"/>
+          <w:b/>
+          <w:color w:val="FFC000"/>
+          <w:sz w:val="48"/>
+        </w:rPr>
+      </w:pPr>
+      <w:r>
+        <w:rPr>
+          <w:rFonts w:ascii="Verdana" w:hAnsi="Verdana"/>
+          <w:b/>
+          <w:color w:val="FFC000"/>
+          <w:sz w:val="48"/>
+        </w:rPr>
+        <w:t>CHANGES:</w:t>
       </w:r>
     </w:p>
     <w:p>
@@ -409,23 +358,15 @@
           <w:sz w:val="32"/>
           <w:szCs w:val="32"/>
         </w:rPr>
-        <w:t xml:space="preserve">Fixed </w:t>
-      </w:r>
-      <w:r>
-        <w:rPr>
-          <w:rFonts w:ascii="Verdana" w:hAnsi="Verdana"/>
-          <w:sz w:val="32"/>
-          <w:szCs w:val="32"/>
-        </w:rPr>
-        <w:t>exceptions when typing in the text</w:t>
-      </w:r>
-      <w:r>
-        <w:rPr>
-          <w:rFonts w:ascii="Verdana" w:hAnsi="Verdana"/>
-          <w:sz w:val="32"/>
-          <w:szCs w:val="32"/>
-        </w:rPr>
-        <w:t xml:space="preserve"> causing app to stop</w:t>
+        <w:t>Chunks are deter</w:t>
+      </w:r>
+      <w:r>
+        <w:rPr>
+          <w:rFonts w:ascii="Verdana" w:hAnsi="Verdana"/>
+          <w:sz w:val="32"/>
+          <w:szCs w:val="32"/>
+        </w:rPr>
+        <w:t>mined by using another function</w:t>
       </w:r>
       <w:r>
         <w:rPr>
@@ -434,6 +375,196 @@
           <w:szCs w:val="32"/>
         </w:rPr>
         <w:t>.</w:t>
+      </w:r>
+    </w:p>
+    <w:p>
+      <w:pPr>
+        <w:pStyle w:val="NoSpacing"/>
+        <w:ind w:left="360"/>
+        <w:rPr>
+          <w:rFonts w:ascii="Verdana" w:hAnsi="Verdana"/>
+          <w:sz w:val="32"/>
+          <w:szCs w:val="32"/>
+        </w:rPr>
+      </w:pPr>
+    </w:p>
+    <w:p>
+      <w:pPr>
+        <w:pStyle w:val="NoSpacing"/>
+        <w:jc w:val="center"/>
+      </w:pPr>
+    </w:p>
+    <w:p>
+      <w:pPr>
+        <w:pStyle w:val="NoSpacing"/>
+        <w:jc w:val="center"/>
+      </w:pPr>
+    </w:p>
+    <w:p>
+      <w:pPr>
+        <w:pStyle w:val="NoSpacing"/>
+        <w:jc w:val="center"/>
+      </w:pPr>
+    </w:p>
+    <w:p>
+      <w:pPr>
+        <w:pStyle w:val="NoSpacing"/>
+        <w:jc w:val="center"/>
+      </w:pPr>
+    </w:p>
+    <w:p>
+      <w:pPr>
+        <w:pStyle w:val="NoSpacing"/>
+        <w:jc w:val="center"/>
+      </w:pPr>
+    </w:p>
+    <w:p>
+      <w:pPr>
+        <w:pStyle w:val="NoSpacing"/>
+        <w:jc w:val="center"/>
+      </w:pPr>
+    </w:p>
+    <w:p>
+      <w:pPr>
+        <w:pStyle w:val="NoSpacing"/>
+        <w:jc w:val="center"/>
+      </w:pPr>
+    </w:p>
+    <w:p>
+      <w:pPr>
+        <w:pStyle w:val="NoSpacing"/>
+        <w:jc w:val="center"/>
+      </w:pPr>
+    </w:p>
+    <w:p>
+      <w:pPr>
+        <w:pStyle w:val="NoSpacing"/>
+        <w:jc w:val="center"/>
+      </w:pPr>
+    </w:p>
+    <w:p>
+      <w:pPr>
+        <w:pStyle w:val="NoSpacing"/>
+        <w:jc w:val="center"/>
+      </w:pPr>
+    </w:p>
+    <w:p>
+      <w:pPr>
+        <w:pStyle w:val="NoSpacing"/>
+        <w:jc w:val="center"/>
+      </w:pPr>
+    </w:p>
+    <w:p>
+      <w:pPr>
+        <w:pStyle w:val="NoSpacing"/>
+        <w:jc w:val="center"/>
+      </w:pPr>
+    </w:p>
+    <w:p>
+      <w:pPr>
+        <w:pStyle w:val="NoSpacing"/>
+        <w:jc w:val="center"/>
+      </w:pPr>
+    </w:p>
+    <w:p>
+      <w:pPr>
+        <w:pStyle w:val="NoSpacing"/>
+        <w:jc w:val="center"/>
+      </w:pPr>
+    </w:p>
+    <w:p>
+      <w:pPr>
+        <w:pStyle w:val="NoSpacing"/>
+        <w:jc w:val="center"/>
+      </w:pPr>
+    </w:p>
+    <w:p>
+      <w:pPr>
+        <w:pStyle w:val="NoSpacing"/>
+        <w:jc w:val="center"/>
+      </w:pPr>
+    </w:p>
+    <w:p>
+      <w:pPr>
+        <w:pStyle w:val="NoSpacing"/>
+        <w:jc w:val="center"/>
+      </w:pPr>
+    </w:p>
+    <w:p>
+      <w:pPr>
+        <w:pStyle w:val="NoSpacing"/>
+        <w:jc w:val="center"/>
+      </w:pPr>
+    </w:p>
+    <w:p>
+      <w:pPr>
+        <w:pStyle w:val="NoSpacing"/>
+        <w:jc w:val="center"/>
+      </w:pPr>
+    </w:p>
+    <w:p>
+      <w:pPr>
+        <w:pStyle w:val="NoSpacing"/>
+        <w:jc w:val="center"/>
+        <w:rPr>
+          <w:rFonts w:ascii="Verdana" w:hAnsi="Verdana"/>
+          <w:b/>
+          <w:sz w:val="48"/>
+        </w:rPr>
+      </w:pPr>
+      <w:bookmarkStart w:id="0" w:name="_GoBack"/>
+      <w:bookmarkEnd w:id="0"/>
+      <w:r>
+        <w:rPr>
+          <w:rFonts w:ascii="Verdana" w:hAnsi="Verdana"/>
+          <w:b/>
+          <w:sz w:val="48"/>
+        </w:rPr>
+        <w:t>[</w:t>
+      </w:r>
+      <w:r>
+        <w:rPr>
+          <w:rFonts w:ascii="Verdana" w:hAnsi="Verdana"/>
+          <w:b/>
+          <w:sz w:val="48"/>
+        </w:rPr>
+        <w:t>VIVID</w:t>
+      </w:r>
+      <w:r>
+        <w:rPr>
+          <w:rFonts w:ascii="Verdana" w:hAnsi="Verdana"/>
+          <w:b/>
+          <w:sz w:val="48"/>
+        </w:rPr>
+        <w:t>]</w:t>
+      </w:r>
+    </w:p>
+    <w:p>
+      <w:pPr>
+        <w:pStyle w:val="NoSpacing"/>
+      </w:pPr>
+      <w:r>
+        <w:tab/>
+      </w:r>
+    </w:p>
+    <w:p>
+      <w:pPr>
+        <w:pStyle w:val="NoSpacing"/>
+        <w:rPr>
+          <w:rFonts w:ascii="Verdana" w:hAnsi="Verdana"/>
+          <w:b/>
+          <w:color w:val="FFC000"/>
+          <w:sz w:val="48"/>
+        </w:rPr>
+      </w:pPr>
+      <w:r>
+        <w:rPr>
+          <w:rFonts w:ascii="Verdana" w:hAnsi="Verdana"/>
+          <w:b/>
+          <w:color w:val="FFC000"/>
+          <w:sz w:val="48"/>
+        </w:rPr>
+        <w:t>CHANGES:</w:t>
       </w:r>
     </w:p>
     <w:p>
@@ -455,169 +586,39 @@
           <w:sz w:val="32"/>
           <w:szCs w:val="32"/>
         </w:rPr>
-        <w:t>Small performance gain.</w:t>
-      </w:r>
-    </w:p>
-    <w:p>
-      <w:pPr>
-        <w:pStyle w:val="NoSpacing"/>
-        <w:ind w:left="360"/>
-      </w:pPr>
-    </w:p>
-    <w:p>
-      <w:pPr>
-        <w:pStyle w:val="NoSpacing"/>
-        <w:ind w:left="360"/>
-      </w:pPr>
-    </w:p>
-    <w:p>
-      <w:pPr>
-        <w:pStyle w:val="NoSpacing"/>
-        <w:ind w:left="360"/>
-      </w:pPr>
-    </w:p>
-    <w:p>
-      <w:pPr>
-        <w:pStyle w:val="NoSpacing"/>
-        <w:ind w:left="360"/>
-      </w:pPr>
-    </w:p>
-    <w:p>
-      <w:pPr>
-        <w:pStyle w:val="NoSpacing"/>
-        <w:ind w:left="360"/>
-      </w:pPr>
-    </w:p>
-    <w:p>
-      <w:pPr>
-        <w:pStyle w:val="NoSpacing"/>
-        <w:ind w:left="360"/>
-      </w:pPr>
-    </w:p>
-    <w:p>
-      <w:pPr>
-        <w:pStyle w:val="NoSpacing"/>
-        <w:ind w:left="360"/>
-      </w:pPr>
-    </w:p>
-    <w:p>
-      <w:pPr>
-        <w:pStyle w:val="NoSpacing"/>
-        <w:ind w:left="360"/>
-      </w:pPr>
-    </w:p>
-    <w:p>
-      <w:pPr>
-        <w:pStyle w:val="NoSpacing"/>
-        <w:ind w:left="360"/>
-      </w:pPr>
-    </w:p>
-    <w:p>
-      <w:pPr>
-        <w:pStyle w:val="NoSpacing"/>
-        <w:ind w:left="360"/>
-      </w:pPr>
-    </w:p>
-    <w:p>
-      <w:pPr>
-        <w:pStyle w:val="NoSpacing"/>
-        <w:ind w:left="360"/>
-      </w:pPr>
-    </w:p>
-    <w:p>
-      <w:pPr>
-        <w:pStyle w:val="NoSpacing"/>
-        <w:ind w:left="360"/>
-      </w:pPr>
-    </w:p>
-    <w:p>
-      <w:pPr>
-        <w:pStyle w:val="NoSpacing"/>
-        <w:ind w:left="360"/>
-      </w:pPr>
-    </w:p>
-    <w:p>
-      <w:pPr>
-        <w:pStyle w:val="NoSpacing"/>
-        <w:ind w:left="360"/>
-      </w:pPr>
-    </w:p>
-    <w:p>
-      <w:pPr>
-        <w:pStyle w:val="NoSpacing"/>
-        <w:ind w:left="360"/>
-      </w:pPr>
-    </w:p>
-    <w:p>
-      <w:pPr>
-        <w:pStyle w:val="NoSpacing"/>
-        <w:rPr>
-          <w:rFonts w:ascii="Verdana" w:hAnsi="Verdana"/>
-          <w:b/>
-          <w:sz w:val="48"/>
-        </w:rPr>
-      </w:pPr>
-    </w:p>
-    <w:p>
-      <w:pPr>
-        <w:pStyle w:val="NoSpacing"/>
-        <w:jc w:val="center"/>
-      </w:pPr>
-    </w:p>
-    <w:p>
-      <w:pPr>
-        <w:pStyle w:val="NoSpacing"/>
-        <w:jc w:val="center"/>
-        <w:rPr>
-          <w:rFonts w:ascii="Verdana" w:hAnsi="Verdana"/>
-          <w:b/>
-          <w:sz w:val="48"/>
-        </w:rPr>
-      </w:pPr>
-      <w:r>
-        <w:rPr>
-          <w:rFonts w:ascii="Verdana" w:hAnsi="Verdana"/>
-          <w:b/>
-          <w:sz w:val="48"/>
-        </w:rPr>
-        <w:lastRenderedPageBreak/>
-        <w:t>[</w:t>
-      </w:r>
-      <w:r>
-        <w:rPr>
-          <w:rFonts w:ascii="Verdana" w:hAnsi="Verdana"/>
-          <w:b/>
-          <w:sz w:val="48"/>
-        </w:rPr>
-        <w:t>URANINIUM</w:t>
-      </w:r>
-      <w:r>
-        <w:rPr>
-          <w:rFonts w:ascii="Verdana" w:hAnsi="Verdana"/>
-          <w:b/>
-          <w:sz w:val="48"/>
-        </w:rPr>
-        <w:t>]</w:t>
-      </w:r>
-    </w:p>
-    <w:p>
-      <w:pPr>
-        <w:pStyle w:val="NoSpacing"/>
-        <w:rPr>
-          <w:rFonts w:ascii="Verdana" w:hAnsi="Verdana"/>
-          <w:b/>
-          <w:color w:val="00B050"/>
-          <w:sz w:val="48"/>
-        </w:rPr>
-      </w:pPr>
-      <w:r>
-        <w:rPr>
-          <w:rFonts w:ascii="Verdana" w:hAnsi="Verdana"/>
-          <w:b/>
-          <w:color w:val="00B050"/>
-          <w:sz w:val="48"/>
-        </w:rPr>
-        <w:t>FEATURES:</w:t>
+        <w:t xml:space="preserve">Chunk operations are done in </w:t>
+      </w:r>
+      <w:r>
+        <w:rPr>
+          <w:rFonts w:ascii="Verdana" w:hAnsi="Verdana"/>
+          <w:sz w:val="32"/>
+          <w:szCs w:val="32"/>
+        </w:rPr>
+        <w:t xml:space="preserve">timer thread </w:t>
+      </w:r>
+      <w:r>
+        <w:rPr>
+          <w:rFonts w:ascii="Verdana" w:hAnsi="Verdana"/>
+          <w:sz w:val="32"/>
+          <w:szCs w:val="32"/>
+        </w:rPr>
+        <w:t>at</w:t>
+      </w:r>
+      <w:r>
+        <w:rPr>
+          <w:rFonts w:ascii="Verdana" w:hAnsi="Verdana"/>
+          <w:sz w:val="32"/>
+          <w:szCs w:val="32"/>
+        </w:rPr>
+        <w:t xml:space="preserve"> fixed rate</w:t>
+      </w:r>
+      <w:r>
+        <w:rPr>
+          <w:rFonts w:ascii="Verdana" w:hAnsi="Verdana"/>
+          <w:sz w:val="32"/>
+          <w:szCs w:val="32"/>
+        </w:rPr>
+        <w:t xml:space="preserve">. </w:t>
       </w:r>
     </w:p>
     <w:p>
@@ -627,42 +628,51 @@
           <w:ilvl w:val="0"/>
           <w:numId w:val="22"/>
         </w:numPr>
-      </w:pPr>
-      <w:r>
-        <w:rPr>
-          <w:rFonts w:ascii="Verdana" w:hAnsi="Verdana"/>
-          <w:sz w:val="32"/>
-          <w:szCs w:val="32"/>
-        </w:rPr>
-        <w:t>Linear interpolation of framerate (framerate is more stable).</w:t>
-      </w:r>
-    </w:p>
-    <w:p>
-      <w:pPr>
-        <w:pStyle w:val="NoSpacing"/>
-      </w:pPr>
-      <w:r>
-        <w:tab/>
-      </w:r>
-    </w:p>
-    <w:p>
-      <w:pPr>
-        <w:pStyle w:val="NoSpacing"/>
-        <w:rPr>
-          <w:rFonts w:ascii="Verdana" w:hAnsi="Verdana"/>
-          <w:b/>
-          <w:color w:val="FFC000"/>
-          <w:sz w:val="48"/>
-        </w:rPr>
-      </w:pPr>
-      <w:r>
-        <w:rPr>
-          <w:rFonts w:ascii="Verdana" w:hAnsi="Verdana"/>
-          <w:b/>
-          <w:color w:val="FFC000"/>
-          <w:sz w:val="48"/>
-        </w:rPr>
-        <w:t>CHANGES:</w:t>
+        <w:rPr>
+          <w:rFonts w:ascii="Verdana" w:hAnsi="Verdana"/>
+          <w:sz w:val="32"/>
+          <w:szCs w:val="32"/>
+        </w:rPr>
+      </w:pPr>
+      <w:r>
+        <w:rPr>
+          <w:rFonts w:ascii="Verdana" w:hAnsi="Verdana"/>
+          <w:sz w:val="32"/>
+          <w:szCs w:val="32"/>
+        </w:rPr>
+        <w:t xml:space="preserve">Random level generator uses Noise &amp; Random together </w:t>
+      </w:r>
+      <w:r>
+        <w:rPr>
+          <w:rFonts w:ascii="Verdana" w:hAnsi="Verdana"/>
+          <w:sz w:val="32"/>
+          <w:szCs w:val="32"/>
+        </w:rPr>
+        <w:t>t</w:t>
+      </w:r>
+      <w:r>
+        <w:rPr>
+          <w:rFonts w:ascii="Verdana" w:hAnsi="Verdana"/>
+          <w:sz w:val="32"/>
+          <w:szCs w:val="32"/>
+        </w:rPr>
+        <w:t>o generate random level. First Noise is applied</w:t>
+      </w:r>
+      <w:r>
+        <w:rPr>
+          <w:rFonts w:ascii="Verdana" w:hAnsi="Verdana"/>
+          <w:sz w:val="32"/>
+          <w:szCs w:val="32"/>
+        </w:rPr>
+        <w:t>,</w:t>
+      </w:r>
+      <w:r>
+        <w:rPr>
+          <w:rFonts w:ascii="Verdana" w:hAnsi="Verdana"/>
+          <w:sz w:val="32"/>
+          <w:szCs w:val="32"/>
+        </w:rPr>
+        <w:t xml:space="preserve"> then random after former is done.</w:t>
       </w:r>
     </w:p>
     <w:p>
@@ -684,31 +694,20 @@
           <w:sz w:val="32"/>
           <w:szCs w:val="32"/>
         </w:rPr>
-        <w:t>Chunk operations are done in separate thread. Lesser impact on update per second and faster. [</w:t>
-      </w:r>
-      <w:proofErr w:type="spellStart"/>
-      <w:r>
-        <w:rPr>
-          <w:rFonts w:ascii="Verdana" w:hAnsi="Verdana"/>
-          <w:sz w:val="32"/>
-          <w:szCs w:val="32"/>
-        </w:rPr>
-        <w:t>JSomnia</w:t>
-      </w:r>
-      <w:proofErr w:type="spellEnd"/>
-      <w:r>
-        <w:rPr>
-          <w:rFonts w:ascii="Verdana" w:hAnsi="Verdana"/>
-          <w:sz w:val="32"/>
-          <w:szCs w:val="32"/>
-        </w:rPr>
-        <w:t>]</w:t>
-      </w:r>
-    </w:p>
-    <w:p>
-      <w:pPr>
-        <w:pStyle w:val="NoSpacing"/>
-        <w:ind w:left="360"/>
+        <w:t>Block positions are aligned to the even number</w:t>
+      </w:r>
+      <w:r>
+        <w:rPr>
+          <w:rFonts w:ascii="Verdana" w:hAnsi="Verdana"/>
+          <w:sz w:val="32"/>
+          <w:szCs w:val="32"/>
+        </w:rPr>
+        <w:t>.</w:t>
+      </w:r>
+    </w:p>
+    <w:p>
+      <w:pPr>
+        <w:pStyle w:val="NoSpacing"/>
         <w:rPr>
           <w:rFonts w:ascii="Verdana" w:hAnsi="Verdana"/>
           <w:sz w:val="32"/>
@@ -743,32 +742,43 @@
           <w:ilvl w:val="0"/>
           <w:numId w:val="22"/>
         </w:numPr>
-      </w:pPr>
-      <w:r>
-        <w:rPr>
-          <w:rFonts w:ascii="Verdana" w:hAnsi="Verdana"/>
-          <w:sz w:val="32"/>
-          <w:szCs w:val="32"/>
-        </w:rPr>
-        <w:t>Water Renderer is not broken anymore. [</w:t>
-      </w:r>
-      <w:proofErr w:type="spellStart"/>
-      <w:r>
-        <w:rPr>
-          <w:rFonts w:ascii="Verdana" w:hAnsi="Verdana"/>
-          <w:sz w:val="32"/>
-          <w:szCs w:val="32"/>
-        </w:rPr>
-        <w:t>JSomnia</w:t>
-      </w:r>
-      <w:proofErr w:type="spellEnd"/>
-      <w:r>
-        <w:rPr>
-          <w:rFonts w:ascii="Verdana" w:hAnsi="Verdana"/>
-          <w:sz w:val="32"/>
-          <w:szCs w:val="32"/>
-        </w:rPr>
-        <w:t>]</w:t>
+        <w:rPr>
+          <w:rFonts w:ascii="Verdana" w:hAnsi="Verdana"/>
+          <w:sz w:val="32"/>
+          <w:szCs w:val="32"/>
+        </w:rPr>
+      </w:pPr>
+      <w:r>
+        <w:rPr>
+          <w:rFonts w:ascii="Verdana" w:hAnsi="Verdana"/>
+          <w:sz w:val="32"/>
+          <w:szCs w:val="32"/>
+        </w:rPr>
+        <w:t xml:space="preserve">Fixed </w:t>
+      </w:r>
+      <w:r>
+        <w:rPr>
+          <w:rFonts w:ascii="Verdana" w:hAnsi="Verdana"/>
+          <w:sz w:val="32"/>
+          <w:szCs w:val="32"/>
+        </w:rPr>
+        <w:t>exceptions when typing in the text</w:t>
+      </w:r>
+      <w:r>
+        <w:rPr>
+          <w:rFonts w:ascii="Verdana" w:hAnsi="Verdana"/>
+          <w:sz w:val="32"/>
+          <w:szCs w:val="32"/>
+        </w:rPr>
+        <w:t xml:space="preserve"> causing app to stop</w:t>
+      </w:r>
+      <w:r>
+        <w:rPr>
+          <w:rFonts w:ascii="Verdana" w:hAnsi="Verdana"/>
+          <w:sz w:val="32"/>
+          <w:szCs w:val="32"/>
+        </w:rPr>
+        <w:t>.</w:t>
       </w:r>
     </w:p>
     <w:p>
@@ -778,50 +788,19 @@
           <w:ilvl w:val="0"/>
           <w:numId w:val="22"/>
         </w:numPr>
-      </w:pPr>
-      <w:r>
-        <w:rPr>
-          <w:rFonts w:ascii="Verdana" w:hAnsi="Verdana"/>
-          <w:sz w:val="32"/>
-          <w:szCs w:val="32"/>
-        </w:rPr>
-        <w:t xml:space="preserve">Game consumes lesser memory (still needs 1.5 GB of RAM for </w:t>
-      </w:r>
-      <w:proofErr w:type="spellStart"/>
-      <w:r>
-        <w:rPr>
-          <w:rFonts w:ascii="Verdana" w:hAnsi="Verdana"/>
-          <w:sz w:val="32"/>
-          <w:szCs w:val="32"/>
-        </w:rPr>
-        <w:t>randmax</w:t>
-      </w:r>
-      <w:proofErr w:type="spellEnd"/>
-      <w:r>
-        <w:rPr>
-          <w:rFonts w:ascii="Verdana" w:hAnsi="Verdana"/>
-          <w:sz w:val="32"/>
-          <w:szCs w:val="32"/>
-        </w:rPr>
-        <w:t xml:space="preserve"> level). [</w:t>
-      </w:r>
-      <w:proofErr w:type="spellStart"/>
-      <w:r>
-        <w:rPr>
-          <w:rFonts w:ascii="Verdana" w:hAnsi="Verdana"/>
-          <w:sz w:val="32"/>
-          <w:szCs w:val="32"/>
-        </w:rPr>
-        <w:t>JSomnia</w:t>
-      </w:r>
-      <w:proofErr w:type="spellEnd"/>
-      <w:r>
-        <w:rPr>
-          <w:rFonts w:ascii="Verdana" w:hAnsi="Verdana"/>
-          <w:sz w:val="32"/>
-          <w:szCs w:val="32"/>
-        </w:rPr>
-        <w:t>]</w:t>
+        <w:rPr>
+          <w:rFonts w:ascii="Verdana" w:hAnsi="Verdana"/>
+          <w:sz w:val="32"/>
+          <w:szCs w:val="32"/>
+        </w:rPr>
+      </w:pPr>
+      <w:r>
+        <w:rPr>
+          <w:rFonts w:ascii="Verdana" w:hAnsi="Verdana"/>
+          <w:sz w:val="32"/>
+          <w:szCs w:val="32"/>
+        </w:rPr>
+        <w:t>Small performance gain.</w:t>
       </w:r>
     </w:p>
     <w:p>
@@ -833,162 +812,155 @@
     <w:p>
       <w:pPr>
         <w:pStyle w:val="NoSpacing"/>
-        <w:rPr>
-          <w:rFonts w:ascii="Verdana" w:hAnsi="Verdana"/>
-          <w:b/>
-          <w:sz w:val="48"/>
-        </w:rPr>
-      </w:pPr>
-      <w:r>
-        <w:rPr>
-          <w:rFonts w:ascii="Verdana" w:hAnsi="Verdana"/>
-          <w:b/>
-          <w:sz w:val="48"/>
-        </w:rPr>
-        <w:t>*Notice this is bug/issue fix release.</w:t>
-      </w:r>
-    </w:p>
-    <w:p>
-      <w:pPr>
-        <w:pStyle w:val="NoSpacing"/>
         <w:ind w:left="360"/>
-        <w:rPr>
-          <w:rFonts w:ascii="Verdana" w:hAnsi="Verdana"/>
-          <w:b/>
-          <w:sz w:val="48"/>
-        </w:rPr>
       </w:pPr>
     </w:p>
     <w:p>
       <w:pPr>
         <w:pStyle w:val="NoSpacing"/>
         <w:ind w:left="360"/>
-        <w:rPr>
-          <w:rFonts w:ascii="Verdana" w:hAnsi="Verdana"/>
-          <w:b/>
-          <w:sz w:val="48"/>
-        </w:rPr>
       </w:pPr>
     </w:p>
     <w:p>
       <w:pPr>
         <w:pStyle w:val="NoSpacing"/>
         <w:ind w:left="360"/>
-        <w:rPr>
-          <w:rFonts w:ascii="Verdana" w:hAnsi="Verdana"/>
-          <w:b/>
-          <w:sz w:val="48"/>
-        </w:rPr>
       </w:pPr>
     </w:p>
     <w:p>
       <w:pPr>
         <w:pStyle w:val="NoSpacing"/>
         <w:ind w:left="360"/>
-        <w:rPr>
-          <w:rFonts w:ascii="Verdana" w:hAnsi="Verdana"/>
-          <w:b/>
-          <w:sz w:val="48"/>
-        </w:rPr>
       </w:pPr>
     </w:p>
     <w:p>
       <w:pPr>
         <w:pStyle w:val="NoSpacing"/>
         <w:ind w:left="360"/>
-        <w:rPr>
-          <w:rFonts w:ascii="Verdana" w:hAnsi="Verdana"/>
-          <w:b/>
-          <w:sz w:val="48"/>
-        </w:rPr>
-      </w:pPr>
-    </w:p>
-    <w:p>
-      <w:pPr>
-        <w:pStyle w:val="NoSpacing"/>
-        <w:rPr>
-          <w:rFonts w:ascii="Verdana" w:hAnsi="Verdana"/>
-          <w:b/>
-          <w:sz w:val="48"/>
-        </w:rPr>
-      </w:pPr>
-    </w:p>
-    <w:p>
-      <w:pPr>
-        <w:pStyle w:val="NoSpacing"/>
-        <w:jc w:val="center"/>
-      </w:pPr>
-    </w:p>
-    <w:p>
-      <w:pPr>
-        <w:pStyle w:val="NoSpacing"/>
-        <w:jc w:val="center"/>
-      </w:pPr>
-    </w:p>
-    <w:p>
-      <w:pPr>
-        <w:pStyle w:val="NoSpacing"/>
-        <w:jc w:val="center"/>
-      </w:pPr>
-    </w:p>
-    <w:p>
-      <w:pPr>
-        <w:pStyle w:val="NoSpacing"/>
-        <w:jc w:val="center"/>
-      </w:pPr>
-    </w:p>
-    <w:p>
-      <w:pPr>
-        <w:pStyle w:val="NoSpacing"/>
-        <w:jc w:val="center"/>
-      </w:pPr>
-    </w:p>
-    <w:p>
-      <w:pPr>
-        <w:pStyle w:val="NoSpacing"/>
-        <w:jc w:val="center"/>
-      </w:pPr>
-    </w:p>
-    <w:p>
-      <w:pPr>
-        <w:pStyle w:val="NoSpacing"/>
-        <w:jc w:val="center"/>
-      </w:pPr>
-    </w:p>
-    <w:p>
-      <w:pPr>
-        <w:pStyle w:val="NoSpacing"/>
-        <w:jc w:val="center"/>
-      </w:pPr>
-    </w:p>
-    <w:p>
-      <w:pPr>
-        <w:pStyle w:val="NoSpacing"/>
-        <w:jc w:val="center"/>
-      </w:pPr>
-    </w:p>
-    <w:p>
-      <w:pPr>
-        <w:pStyle w:val="NoSpacing"/>
-        <w:jc w:val="center"/>
-      </w:pPr>
-    </w:p>
-    <w:p>
-      <w:pPr>
-        <w:pStyle w:val="NoSpacing"/>
-        <w:jc w:val="center"/>
-      </w:pPr>
-    </w:p>
-    <w:p>
-      <w:pPr>
-        <w:pStyle w:val="NoSpacing"/>
-        <w:jc w:val="center"/>
-      </w:pPr>
-    </w:p>
-    <w:p>
-      <w:pPr>
-        <w:pStyle w:val="NoSpacing"/>
-        <w:jc w:val="center"/>
+      </w:pPr>
+    </w:p>
+    <w:p>
+      <w:pPr>
+        <w:pStyle w:val="NoSpacing"/>
+        <w:ind w:left="360"/>
+      </w:pPr>
+    </w:p>
+    <w:p>
+      <w:pPr>
+        <w:pStyle w:val="NoSpacing"/>
+        <w:ind w:left="360"/>
+      </w:pPr>
+    </w:p>
+    <w:p>
+      <w:pPr>
+        <w:pStyle w:val="NoSpacing"/>
+        <w:ind w:left="360"/>
+      </w:pPr>
+    </w:p>
+    <w:p>
+      <w:pPr>
+        <w:pStyle w:val="NoSpacing"/>
+        <w:ind w:left="360"/>
+      </w:pPr>
+    </w:p>
+    <w:p>
+      <w:pPr>
+        <w:pStyle w:val="NoSpacing"/>
+        <w:ind w:left="360"/>
+      </w:pPr>
+    </w:p>
+    <w:p>
+      <w:pPr>
+        <w:pStyle w:val="NoSpacing"/>
+        <w:ind w:left="360"/>
+      </w:pPr>
+    </w:p>
+    <w:p>
+      <w:pPr>
+        <w:pStyle w:val="NoSpacing"/>
+        <w:ind w:left="360"/>
+      </w:pPr>
+    </w:p>
+    <w:p>
+      <w:pPr>
+        <w:pStyle w:val="NoSpacing"/>
+        <w:ind w:left="360"/>
+      </w:pPr>
+    </w:p>
+    <w:p>
+      <w:pPr>
+        <w:pStyle w:val="NoSpacing"/>
+        <w:ind w:left="360"/>
+      </w:pPr>
+    </w:p>
+    <w:p>
+      <w:pPr>
+        <w:pStyle w:val="NoSpacing"/>
+        <w:rPr>
+          <w:rFonts w:ascii="Verdana" w:hAnsi="Verdana"/>
+          <w:b/>
+          <w:sz w:val="48"/>
+        </w:rPr>
+      </w:pPr>
+    </w:p>
+    <w:p>
+      <w:pPr>
+        <w:pStyle w:val="NoSpacing"/>
+        <w:rPr>
+          <w:rFonts w:ascii="Verdana" w:hAnsi="Verdana"/>
+          <w:b/>
+          <w:sz w:val="48"/>
+        </w:rPr>
+      </w:pPr>
+    </w:p>
+    <w:p>
+      <w:pPr>
+        <w:pStyle w:val="NoSpacing"/>
+        <w:rPr>
+          <w:rFonts w:ascii="Verdana" w:hAnsi="Verdana"/>
+          <w:b/>
+          <w:sz w:val="48"/>
+        </w:rPr>
+      </w:pPr>
+    </w:p>
+    <w:p>
+      <w:pPr>
+        <w:pStyle w:val="NoSpacing"/>
+        <w:rPr>
+          <w:rFonts w:ascii="Verdana" w:hAnsi="Verdana"/>
+          <w:b/>
+          <w:sz w:val="48"/>
+        </w:rPr>
+      </w:pPr>
+    </w:p>
+    <w:p>
+      <w:pPr>
+        <w:pStyle w:val="NoSpacing"/>
+        <w:rPr>
+          <w:rFonts w:ascii="Verdana" w:hAnsi="Verdana"/>
+          <w:b/>
+          <w:sz w:val="48"/>
+        </w:rPr>
+      </w:pPr>
+    </w:p>
+    <w:p>
+      <w:pPr>
+        <w:pStyle w:val="NoSpacing"/>
+        <w:rPr>
+          <w:rFonts w:ascii="Verdana" w:hAnsi="Verdana"/>
+          <w:b/>
+          <w:sz w:val="48"/>
+        </w:rPr>
+      </w:pPr>
+    </w:p>
+    <w:p>
+      <w:pPr>
+        <w:pStyle w:val="NoSpacing"/>
+        <w:rPr>
+          <w:rFonts w:ascii="Verdana" w:hAnsi="Verdana"/>
+          <w:b/>
+          <w:sz w:val="48"/>
+        </w:rPr>
       </w:pPr>
     </w:p>
     <w:p>
@@ -1022,7 +994,7 @@
           <w:b/>
           <w:sz w:val="48"/>
         </w:rPr>
-        <w:t>TITANIUM</w:t>
+        <w:t>URANINIUM</w:t>
       </w:r>
       <w:r>
         <w:rPr>
@@ -1067,14 +1039,16 @@
           <w:sz w:val="32"/>
           <w:szCs w:val="32"/>
         </w:rPr>
-        <w:t>Console commands now have post execution status (red if command fails or green if it’s success). If command is not recognized it will have white light bulb.</w:t>
-      </w:r>
-    </w:p>
-    <w:p>
-      <w:pPr>
-        <w:pStyle w:val="NoSpacing"/>
-        <w:jc w:val="center"/>
-      </w:pPr>
+        <w:t>Linear interpolation of framerate (framerate is more stable).</w:t>
+      </w:r>
+    </w:p>
+    <w:p>
+      <w:pPr>
+        <w:pStyle w:val="NoSpacing"/>
+      </w:pPr>
+      <w:r>
+        <w:tab/>
+      </w:r>
     </w:p>
     <w:p>
       <w:pPr>
@@ -1103,61 +1077,26 @@
           <w:ilvl w:val="0"/>
           <w:numId w:val="22"/>
         </w:numPr>
-      </w:pPr>
-      <w:r>
-        <w:rPr>
-          <w:rFonts w:ascii="Verdana" w:hAnsi="Verdana"/>
-          <w:sz w:val="32"/>
-          <w:szCs w:val="32"/>
-        </w:rPr>
-        <w:t>Chunk function is improved</w:t>
-      </w:r>
-      <w:r>
-        <w:rPr>
-          <w:rFonts w:ascii="Verdana" w:hAnsi="Verdana"/>
-          <w:sz w:val="32"/>
-          <w:szCs w:val="32"/>
-        </w:rPr>
-        <w:t>.</w:t>
-      </w:r>
-      <w:r>
-        <w:rPr>
-          <w:rFonts w:ascii="Verdana" w:hAnsi="Verdana"/>
-          <w:sz w:val="32"/>
-          <w:szCs w:val="32"/>
-        </w:rPr>
-        <w:t xml:space="preserve"> </w:t>
-      </w:r>
-      <w:proofErr w:type="gramStart"/>
-      <w:r>
-        <w:rPr>
-          <w:rFonts w:ascii="Verdana" w:hAnsi="Verdana"/>
-          <w:sz w:val="32"/>
-          <w:szCs w:val="32"/>
-        </w:rPr>
-        <w:t>Blocks doesn’t</w:t>
-      </w:r>
-      <w:proofErr w:type="gramEnd"/>
-      <w:r>
-        <w:rPr>
-          <w:rFonts w:ascii="Verdana" w:hAnsi="Verdana"/>
-          <w:sz w:val="32"/>
-          <w:szCs w:val="32"/>
-        </w:rPr>
-        <w:t xml:space="preserve"> appear unexpectedly. </w:t>
-      </w:r>
-      <w:r>
-        <w:rPr>
-          <w:rFonts w:ascii="Verdana" w:hAnsi="Verdana"/>
-          <w:sz w:val="32"/>
-        </w:rPr>
-        <w:t>[</w:t>
+        <w:rPr>
+          <w:rFonts w:ascii="Verdana" w:hAnsi="Verdana"/>
+          <w:sz w:val="32"/>
+          <w:szCs w:val="32"/>
+        </w:rPr>
+      </w:pPr>
+      <w:r>
+        <w:rPr>
+          <w:rFonts w:ascii="Verdana" w:hAnsi="Verdana"/>
+          <w:sz w:val="32"/>
+          <w:szCs w:val="32"/>
+        </w:rPr>
+        <w:t>Chunk operations are done in separate thread. Lesser impact on update per second and faster. [</w:t>
       </w:r>
       <w:proofErr w:type="spellStart"/>
       <w:r>
         <w:rPr>
           <w:rFonts w:ascii="Verdana" w:hAnsi="Verdana"/>
           <w:sz w:val="32"/>
+          <w:szCs w:val="32"/>
         </w:rPr>
         <w:t>JSomnia</w:t>
       </w:r>
@@ -1166,8 +1105,40 @@
         <w:rPr>
           <w:rFonts w:ascii="Verdana" w:hAnsi="Verdana"/>
           <w:sz w:val="32"/>
+          <w:szCs w:val="32"/>
         </w:rPr>
         <w:t>]</w:t>
+      </w:r>
+    </w:p>
+    <w:p>
+      <w:pPr>
+        <w:pStyle w:val="NoSpacing"/>
+        <w:ind w:left="360"/>
+        <w:rPr>
+          <w:rFonts w:ascii="Verdana" w:hAnsi="Verdana"/>
+          <w:sz w:val="32"/>
+          <w:szCs w:val="32"/>
+        </w:rPr>
+      </w:pPr>
+    </w:p>
+    <w:p>
+      <w:pPr>
+        <w:pStyle w:val="NoSpacing"/>
+        <w:rPr>
+          <w:rFonts w:ascii="Verdana" w:hAnsi="Verdana"/>
+          <w:b/>
+          <w:color w:val="FF0000"/>
+          <w:sz w:val="48"/>
+        </w:rPr>
+      </w:pPr>
+      <w:r>
+        <w:rPr>
+          <w:rFonts w:ascii="Verdana" w:hAnsi="Verdana"/>
+          <w:b/>
+          <w:color w:val="FF0000"/>
+          <w:sz w:val="48"/>
+        </w:rPr>
+        <w:t>FIXES:</w:t>
       </w:r>
     </w:p>
     <w:p>
@@ -1182,28 +1153,16 @@
         <w:rPr>
           <w:rFonts w:ascii="Verdana" w:hAnsi="Verdana"/>
           <w:sz w:val="32"/>
-        </w:rPr>
-        <w:t>Default settings are changed. Mouse sen</w:t>
-      </w:r>
-      <w:r>
-        <w:rPr>
-          <w:rFonts w:ascii="Verdana" w:hAnsi="Verdana"/>
-          <w:sz w:val="32"/>
-        </w:rPr>
-        <w:t>si</w:t>
-      </w:r>
-      <w:r>
-        <w:rPr>
-          <w:rFonts w:ascii="Verdana" w:hAnsi="Verdana"/>
-          <w:sz w:val="32"/>
-        </w:rPr>
-        <w:t>tivity set from 3.0 to 1.5 and Music and Sound volumes are set from 1.0 to 0.5 [</w:t>
+          <w:szCs w:val="32"/>
+        </w:rPr>
+        <w:t>Water Renderer is not broken anymore. [</w:t>
       </w:r>
       <w:proofErr w:type="spellStart"/>
       <w:r>
         <w:rPr>
           <w:rFonts w:ascii="Verdana" w:hAnsi="Verdana"/>
           <w:sz w:val="32"/>
+          <w:szCs w:val="32"/>
         </w:rPr>
         <w:t>JSomnia</w:t>
       </w:r>
@@ -1212,6 +1171,7 @@
         <w:rPr>
           <w:rFonts w:ascii="Verdana" w:hAnsi="Verdana"/>
           <w:sz w:val="32"/>
+          <w:szCs w:val="32"/>
         </w:rPr>
         <w:t>]</w:t>
       </w:r>
@@ -1228,8 +1188,274 @@
         <w:rPr>
           <w:rFonts w:ascii="Verdana" w:hAnsi="Verdana"/>
           <w:sz w:val="32"/>
-        </w:rPr>
-        <w:t>Program consumes less memory in general.</w:t>
+          <w:szCs w:val="32"/>
+        </w:rPr>
+        <w:t xml:space="preserve">Game consumes lesser memory (still needs 1.5 GB of RAM for </w:t>
+      </w:r>
+      <w:proofErr w:type="spellStart"/>
+      <w:r>
+        <w:rPr>
+          <w:rFonts w:ascii="Verdana" w:hAnsi="Verdana"/>
+          <w:sz w:val="32"/>
+          <w:szCs w:val="32"/>
+        </w:rPr>
+        <w:t>randmax</w:t>
+      </w:r>
+      <w:proofErr w:type="spellEnd"/>
+      <w:r>
+        <w:rPr>
+          <w:rFonts w:ascii="Verdana" w:hAnsi="Verdana"/>
+          <w:sz w:val="32"/>
+          <w:szCs w:val="32"/>
+        </w:rPr>
+        <w:t xml:space="preserve"> level). [</w:t>
+      </w:r>
+      <w:proofErr w:type="spellStart"/>
+      <w:r>
+        <w:rPr>
+          <w:rFonts w:ascii="Verdana" w:hAnsi="Verdana"/>
+          <w:sz w:val="32"/>
+          <w:szCs w:val="32"/>
+        </w:rPr>
+        <w:t>JSomnia</w:t>
+      </w:r>
+      <w:proofErr w:type="spellEnd"/>
+      <w:r>
+        <w:rPr>
+          <w:rFonts w:ascii="Verdana" w:hAnsi="Verdana"/>
+          <w:sz w:val="32"/>
+          <w:szCs w:val="32"/>
+        </w:rPr>
+        <w:t>]</w:t>
+      </w:r>
+    </w:p>
+    <w:p>
+      <w:pPr>
+        <w:pStyle w:val="NoSpacing"/>
+        <w:ind w:left="360"/>
+      </w:pPr>
+    </w:p>
+    <w:p>
+      <w:pPr>
+        <w:pStyle w:val="NoSpacing"/>
+        <w:rPr>
+          <w:rFonts w:ascii="Verdana" w:hAnsi="Verdana"/>
+          <w:b/>
+          <w:sz w:val="48"/>
+        </w:rPr>
+      </w:pPr>
+      <w:r>
+        <w:rPr>
+          <w:rFonts w:ascii="Verdana" w:hAnsi="Verdana"/>
+          <w:b/>
+          <w:sz w:val="48"/>
+        </w:rPr>
+        <w:t>*Notice this is bug/issue fix release.</w:t>
+      </w:r>
+    </w:p>
+    <w:p>
+      <w:pPr>
+        <w:pStyle w:val="NoSpacing"/>
+        <w:ind w:left="360"/>
+        <w:rPr>
+          <w:rFonts w:ascii="Verdana" w:hAnsi="Verdana"/>
+          <w:b/>
+          <w:sz w:val="48"/>
+        </w:rPr>
+      </w:pPr>
+    </w:p>
+    <w:p>
+      <w:pPr>
+        <w:pStyle w:val="NoSpacing"/>
+        <w:ind w:left="360"/>
+        <w:rPr>
+          <w:rFonts w:ascii="Verdana" w:hAnsi="Verdana"/>
+          <w:b/>
+          <w:sz w:val="48"/>
+        </w:rPr>
+      </w:pPr>
+    </w:p>
+    <w:p>
+      <w:pPr>
+        <w:pStyle w:val="NoSpacing"/>
+        <w:ind w:left="360"/>
+        <w:rPr>
+          <w:rFonts w:ascii="Verdana" w:hAnsi="Verdana"/>
+          <w:b/>
+          <w:sz w:val="48"/>
+        </w:rPr>
+      </w:pPr>
+    </w:p>
+    <w:p>
+      <w:pPr>
+        <w:pStyle w:val="NoSpacing"/>
+        <w:ind w:left="360"/>
+        <w:rPr>
+          <w:rFonts w:ascii="Verdana" w:hAnsi="Verdana"/>
+          <w:b/>
+          <w:sz w:val="48"/>
+        </w:rPr>
+      </w:pPr>
+    </w:p>
+    <w:p>
+      <w:pPr>
+        <w:pStyle w:val="NoSpacing"/>
+        <w:ind w:left="360"/>
+        <w:rPr>
+          <w:rFonts w:ascii="Verdana" w:hAnsi="Verdana"/>
+          <w:b/>
+          <w:sz w:val="48"/>
+        </w:rPr>
+      </w:pPr>
+    </w:p>
+    <w:p>
+      <w:pPr>
+        <w:pStyle w:val="NoSpacing"/>
+        <w:rPr>
+          <w:rFonts w:ascii="Verdana" w:hAnsi="Verdana"/>
+          <w:b/>
+          <w:sz w:val="48"/>
+        </w:rPr>
+      </w:pPr>
+    </w:p>
+    <w:p>
+      <w:pPr>
+        <w:pStyle w:val="NoSpacing"/>
+        <w:jc w:val="center"/>
+      </w:pPr>
+    </w:p>
+    <w:p>
+      <w:pPr>
+        <w:pStyle w:val="NoSpacing"/>
+        <w:jc w:val="center"/>
+      </w:pPr>
+    </w:p>
+    <w:p>
+      <w:pPr>
+        <w:pStyle w:val="NoSpacing"/>
+        <w:jc w:val="center"/>
+      </w:pPr>
+    </w:p>
+    <w:p>
+      <w:pPr>
+        <w:pStyle w:val="NoSpacing"/>
+        <w:jc w:val="center"/>
+      </w:pPr>
+    </w:p>
+    <w:p>
+      <w:pPr>
+        <w:pStyle w:val="NoSpacing"/>
+        <w:jc w:val="center"/>
+      </w:pPr>
+    </w:p>
+    <w:p>
+      <w:pPr>
+        <w:pStyle w:val="NoSpacing"/>
+        <w:jc w:val="center"/>
+      </w:pPr>
+    </w:p>
+    <w:p>
+      <w:pPr>
+        <w:pStyle w:val="NoSpacing"/>
+        <w:jc w:val="center"/>
+      </w:pPr>
+    </w:p>
+    <w:p>
+      <w:pPr>
+        <w:pStyle w:val="NoSpacing"/>
+        <w:jc w:val="center"/>
+      </w:pPr>
+    </w:p>
+    <w:p>
+      <w:pPr>
+        <w:pStyle w:val="NoSpacing"/>
+        <w:jc w:val="center"/>
+      </w:pPr>
+    </w:p>
+    <w:p>
+      <w:pPr>
+        <w:pStyle w:val="NoSpacing"/>
+        <w:jc w:val="center"/>
+      </w:pPr>
+    </w:p>
+    <w:p>
+      <w:pPr>
+        <w:pStyle w:val="NoSpacing"/>
+        <w:jc w:val="center"/>
+      </w:pPr>
+    </w:p>
+    <w:p>
+      <w:pPr>
+        <w:pStyle w:val="NoSpacing"/>
+        <w:jc w:val="center"/>
+      </w:pPr>
+    </w:p>
+    <w:p>
+      <w:pPr>
+        <w:pStyle w:val="NoSpacing"/>
+        <w:jc w:val="center"/>
+      </w:pPr>
+    </w:p>
+    <w:p>
+      <w:pPr>
+        <w:pStyle w:val="NoSpacing"/>
+        <w:jc w:val="center"/>
+      </w:pPr>
+    </w:p>
+    <w:p>
+      <w:pPr>
+        <w:pStyle w:val="NoSpacing"/>
+        <w:jc w:val="center"/>
+        <w:rPr>
+          <w:rFonts w:ascii="Verdana" w:hAnsi="Verdana"/>
+          <w:b/>
+          <w:sz w:val="48"/>
+        </w:rPr>
+      </w:pPr>
+      <w:r>
+        <w:rPr>
+          <w:rFonts w:ascii="Verdana" w:hAnsi="Verdana"/>
+          <w:b/>
+          <w:sz w:val="48"/>
+        </w:rPr>
+        <w:lastRenderedPageBreak/>
+        <w:t>[</w:t>
+      </w:r>
+      <w:r>
+        <w:rPr>
+          <w:rFonts w:ascii="Verdana" w:hAnsi="Verdana"/>
+          <w:b/>
+          <w:sz w:val="48"/>
+        </w:rPr>
+        <w:t>TITANIUM</w:t>
+      </w:r>
+      <w:r>
+        <w:rPr>
+          <w:rFonts w:ascii="Verdana" w:hAnsi="Verdana"/>
+          <w:b/>
+          <w:sz w:val="48"/>
+        </w:rPr>
+        <w:t>]</w:t>
+      </w:r>
+    </w:p>
+    <w:p>
+      <w:pPr>
+        <w:pStyle w:val="NoSpacing"/>
+        <w:rPr>
+          <w:rFonts w:ascii="Verdana" w:hAnsi="Verdana"/>
+          <w:b/>
+          <w:color w:val="00B050"/>
+          <w:sz w:val="48"/>
+        </w:rPr>
+      </w:pPr>
+      <w:r>
+        <w:rPr>
+          <w:rFonts w:ascii="Verdana" w:hAnsi="Verdana"/>
+          <w:b/>
+          <w:color w:val="00B050"/>
+          <w:sz w:val="48"/>
+        </w:rPr>
+        <w:t>FEATURES:</w:t>
       </w:r>
     </w:p>
     <w:p>
@@ -1244,38 +1470,35 @@
         <w:rPr>
           <w:rFonts w:ascii="Verdana" w:hAnsi="Verdana"/>
           <w:sz w:val="32"/>
-        </w:rPr>
-        <w:t>Game is more responsive when loading/saving chunks in general.</w:t>
-      </w:r>
-    </w:p>
-    <w:p>
-      <w:pPr>
-        <w:pStyle w:val="NoSpacing"/>
-        <w:rPr>
-          <w:rFonts w:ascii="Verdana" w:hAnsi="Verdana"/>
-          <w:sz w:val="32"/>
-          <w:szCs w:val="32"/>
-        </w:rPr>
-      </w:pPr>
-    </w:p>
-    <w:p>
-      <w:pPr>
-        <w:pStyle w:val="NoSpacing"/>
-        <w:rPr>
-          <w:rFonts w:ascii="Verdana" w:hAnsi="Verdana"/>
-          <w:b/>
-          <w:color w:val="FF0000"/>
-          <w:sz w:val="48"/>
-        </w:rPr>
-      </w:pPr>
-      <w:r>
-        <w:rPr>
-          <w:rFonts w:ascii="Verdana" w:hAnsi="Verdana"/>
-          <w:b/>
-          <w:color w:val="FF0000"/>
-          <w:sz w:val="48"/>
-        </w:rPr>
-        <w:t>FIXES:</w:t>
+          <w:szCs w:val="32"/>
+        </w:rPr>
+        <w:t>Console commands now have post execution status (red if command fails or green if it’s success). If command is not recognized it will have white light bulb.</w:t>
+      </w:r>
+    </w:p>
+    <w:p>
+      <w:pPr>
+        <w:pStyle w:val="NoSpacing"/>
+        <w:jc w:val="center"/>
+      </w:pPr>
+    </w:p>
+    <w:p>
+      <w:pPr>
+        <w:pStyle w:val="NoSpacing"/>
+        <w:rPr>
+          <w:rFonts w:ascii="Verdana" w:hAnsi="Verdana"/>
+          <w:b/>
+          <w:color w:val="FFC000"/>
+          <w:sz w:val="48"/>
+        </w:rPr>
+      </w:pPr>
+      <w:r>
+        <w:rPr>
+          <w:rFonts w:ascii="Verdana" w:hAnsi="Verdana"/>
+          <w:b/>
+          <w:color w:val="FFC000"/>
+          <w:sz w:val="48"/>
+        </w:rPr>
+        <w:t>CHANGES:</w:t>
       </w:r>
     </w:p>
     <w:p>
@@ -1292,6 +1515,188 @@
           <w:sz w:val="32"/>
           <w:szCs w:val="32"/>
         </w:rPr>
+        <w:t>Chunk function is improved</w:t>
+      </w:r>
+      <w:r>
+        <w:rPr>
+          <w:rFonts w:ascii="Verdana" w:hAnsi="Verdana"/>
+          <w:sz w:val="32"/>
+          <w:szCs w:val="32"/>
+        </w:rPr>
+        <w:t>.</w:t>
+      </w:r>
+      <w:r>
+        <w:rPr>
+          <w:rFonts w:ascii="Verdana" w:hAnsi="Verdana"/>
+          <w:sz w:val="32"/>
+          <w:szCs w:val="32"/>
+        </w:rPr>
+        <w:t xml:space="preserve"> </w:t>
+      </w:r>
+      <w:proofErr w:type="gramStart"/>
+      <w:r>
+        <w:rPr>
+          <w:rFonts w:ascii="Verdana" w:hAnsi="Verdana"/>
+          <w:sz w:val="32"/>
+          <w:szCs w:val="32"/>
+        </w:rPr>
+        <w:t>Blocks doesn’t</w:t>
+      </w:r>
+      <w:proofErr w:type="gramEnd"/>
+      <w:r>
+        <w:rPr>
+          <w:rFonts w:ascii="Verdana" w:hAnsi="Verdana"/>
+          <w:sz w:val="32"/>
+          <w:szCs w:val="32"/>
+        </w:rPr>
+        <w:t xml:space="preserve"> appear unexpectedly. </w:t>
+      </w:r>
+      <w:r>
+        <w:rPr>
+          <w:rFonts w:ascii="Verdana" w:hAnsi="Verdana"/>
+          <w:sz w:val="32"/>
+        </w:rPr>
+        <w:t>[</w:t>
+      </w:r>
+      <w:proofErr w:type="spellStart"/>
+      <w:r>
+        <w:rPr>
+          <w:rFonts w:ascii="Verdana" w:hAnsi="Verdana"/>
+          <w:sz w:val="32"/>
+        </w:rPr>
+        <w:t>JSomnia</w:t>
+      </w:r>
+      <w:proofErr w:type="spellEnd"/>
+      <w:r>
+        <w:rPr>
+          <w:rFonts w:ascii="Verdana" w:hAnsi="Verdana"/>
+          <w:sz w:val="32"/>
+        </w:rPr>
+        <w:t>]</w:t>
+      </w:r>
+    </w:p>
+    <w:p>
+      <w:pPr>
+        <w:pStyle w:val="NoSpacing"/>
+        <w:numPr>
+          <w:ilvl w:val="0"/>
+          <w:numId w:val="22"/>
+        </w:numPr>
+      </w:pPr>
+      <w:r>
+        <w:rPr>
+          <w:rFonts w:ascii="Verdana" w:hAnsi="Verdana"/>
+          <w:sz w:val="32"/>
+        </w:rPr>
+        <w:t>Default settings are changed. Mouse sen</w:t>
+      </w:r>
+      <w:r>
+        <w:rPr>
+          <w:rFonts w:ascii="Verdana" w:hAnsi="Verdana"/>
+          <w:sz w:val="32"/>
+        </w:rPr>
+        <w:t>si</w:t>
+      </w:r>
+      <w:r>
+        <w:rPr>
+          <w:rFonts w:ascii="Verdana" w:hAnsi="Verdana"/>
+          <w:sz w:val="32"/>
+        </w:rPr>
+        <w:t>tivity set from 3.0 to 1.5 and Music and Sound volumes are set from 1.0 to 0.5 [</w:t>
+      </w:r>
+      <w:proofErr w:type="spellStart"/>
+      <w:r>
+        <w:rPr>
+          <w:rFonts w:ascii="Verdana" w:hAnsi="Verdana"/>
+          <w:sz w:val="32"/>
+        </w:rPr>
+        <w:t>JSomnia</w:t>
+      </w:r>
+      <w:proofErr w:type="spellEnd"/>
+      <w:r>
+        <w:rPr>
+          <w:rFonts w:ascii="Verdana" w:hAnsi="Verdana"/>
+          <w:sz w:val="32"/>
+        </w:rPr>
+        <w:t>]</w:t>
+      </w:r>
+    </w:p>
+    <w:p>
+      <w:pPr>
+        <w:pStyle w:val="NoSpacing"/>
+        <w:numPr>
+          <w:ilvl w:val="0"/>
+          <w:numId w:val="22"/>
+        </w:numPr>
+      </w:pPr>
+      <w:r>
+        <w:rPr>
+          <w:rFonts w:ascii="Verdana" w:hAnsi="Verdana"/>
+          <w:sz w:val="32"/>
+        </w:rPr>
+        <w:t>Program consumes less memory in general.</w:t>
+      </w:r>
+    </w:p>
+    <w:p>
+      <w:pPr>
+        <w:pStyle w:val="NoSpacing"/>
+        <w:numPr>
+          <w:ilvl w:val="0"/>
+          <w:numId w:val="22"/>
+        </w:numPr>
+      </w:pPr>
+      <w:r>
+        <w:rPr>
+          <w:rFonts w:ascii="Verdana" w:hAnsi="Verdana"/>
+          <w:sz w:val="32"/>
+        </w:rPr>
+        <w:t>Game is more responsive when loading/saving chunks in general.</w:t>
+      </w:r>
+    </w:p>
+    <w:p>
+      <w:pPr>
+        <w:pStyle w:val="NoSpacing"/>
+        <w:rPr>
+          <w:rFonts w:ascii="Verdana" w:hAnsi="Verdana"/>
+          <w:sz w:val="32"/>
+          <w:szCs w:val="32"/>
+        </w:rPr>
+      </w:pPr>
+    </w:p>
+    <w:p>
+      <w:pPr>
+        <w:pStyle w:val="NoSpacing"/>
+        <w:rPr>
+          <w:rFonts w:ascii="Verdana" w:hAnsi="Verdana"/>
+          <w:b/>
+          <w:color w:val="FF0000"/>
+          <w:sz w:val="48"/>
+        </w:rPr>
+      </w:pPr>
+      <w:r>
+        <w:rPr>
+          <w:rFonts w:ascii="Verdana" w:hAnsi="Verdana"/>
+          <w:b/>
+          <w:color w:val="FF0000"/>
+          <w:sz w:val="48"/>
+        </w:rPr>
+        <w:t>FIXES:</w:t>
+      </w:r>
+    </w:p>
+    <w:p>
+      <w:pPr>
+        <w:pStyle w:val="NoSpacing"/>
+        <w:numPr>
+          <w:ilvl w:val="0"/>
+          <w:numId w:val="22"/>
+        </w:numPr>
+      </w:pPr>
+      <w:r>
+        <w:rPr>
+          <w:rFonts w:ascii="Verdana" w:hAnsi="Verdana"/>
+          <w:sz w:val="32"/>
+          <w:szCs w:val="32"/>
+        </w:rPr>
         <w:t>[Options Menu] One changed setting doesn’t change all settings</w:t>
       </w:r>
       <w:r>
@@ -1420,8 +1825,6 @@
           <w:sz w:val="48"/>
         </w:rPr>
       </w:pPr>
-      <w:bookmarkStart w:id="0" w:name="_GoBack"/>
-      <w:bookmarkEnd w:id="0"/>
     </w:p>
     <w:p>
       <w:pPr>
@@ -5008,7 +5411,7 @@
                                       <w:sz w:val="32"/>
                                       <w:szCs w:val="32"/>
                                     </w:rPr>
-                                    <w:t>2</w:t>
+                                    <w:t>1</w:t>
                                   </w:r>
                                   <w:r>
                                     <w:rPr>
@@ -5074,7 +5477,7 @@
                                 <w:sz w:val="32"/>
                                 <w:szCs w:val="32"/>
                               </w:rPr>
-                              <w:t>2</w:t>
+                              <w:t>1</w:t>
                             </w:r>
                             <w:r>
                               <w:rPr>
@@ -6279,6 +6682,119 @@
     </w:lvl>
   </w:abstractNum>
   <w:abstractNum w:abstractNumId="9">
+    <w:nsid w:val="2FA0400E"/>
+    <w:multiLevelType w:val="hybridMultilevel"/>
+    <w:tmpl w:val="166A2ED0"/>
+    <w:lvl w:ilvl="0" w:tplc="04090001">
+      <w:start w:val="1"/>
+      <w:numFmt w:val="bullet"/>
+      <w:lvlText w:val=""/>
+      <w:lvlJc w:val="left"/>
+      <w:pPr>
+        <w:ind w:left="1440" w:hanging="360"/>
+      </w:pPr>
+      <w:rPr>
+        <w:rFonts w:ascii="Symbol" w:hAnsi="Symbol" w:hint="default"/>
+      </w:rPr>
+    </w:lvl>
+    <w:lvl w:ilvl="1" w:tplc="04090003" w:tentative="1">
+      <w:start w:val="1"/>
+      <w:numFmt w:val="bullet"/>
+      <w:lvlText w:val="o"/>
+      <w:lvlJc w:val="left"/>
+      <w:pPr>
+        <w:ind w:left="2160" w:hanging="360"/>
+      </w:pPr>
+      <w:rPr>
+        <w:rFonts w:ascii="Courier New" w:hAnsi="Courier New" w:cs="Courier New" w:hint="default"/>
+      </w:rPr>
+    </w:lvl>
+    <w:lvl w:ilvl="2" w:tplc="04090005" w:tentative="1">
+      <w:start w:val="1"/>
+      <w:numFmt w:val="bullet"/>
+      <w:lvlText w:val=""/>
+      <w:lvlJc w:val="left"/>
+      <w:pPr>
+        <w:ind w:left="2880" w:hanging="360"/>
+      </w:pPr>
+      <w:rPr>
+        <w:rFonts w:ascii="Wingdings" w:hAnsi="Wingdings" w:hint="default"/>
+      </w:rPr>
+    </w:lvl>
+    <w:lvl w:ilvl="3" w:tplc="04090001" w:tentative="1">
+      <w:start w:val="1"/>
+      <w:numFmt w:val="bullet"/>
+      <w:lvlText w:val=""/>
+      <w:lvlJc w:val="left"/>
+      <w:pPr>
+        <w:ind w:left="3600" w:hanging="360"/>
+      </w:pPr>
+      <w:rPr>
+        <w:rFonts w:ascii="Symbol" w:hAnsi="Symbol" w:hint="default"/>
+      </w:rPr>
+    </w:lvl>
+    <w:lvl w:ilvl="4" w:tplc="04090003" w:tentative="1">
+      <w:start w:val="1"/>
+      <w:numFmt w:val="bullet"/>
+      <w:lvlText w:val="o"/>
+      <w:lvlJc w:val="left"/>
+      <w:pPr>
+        <w:ind w:left="4320" w:hanging="360"/>
+      </w:pPr>
+      <w:rPr>
+        <w:rFonts w:ascii="Courier New" w:hAnsi="Courier New" w:cs="Courier New" w:hint="default"/>
+      </w:rPr>
+    </w:lvl>
+    <w:lvl w:ilvl="5" w:tplc="04090005" w:tentative="1">
+      <w:start w:val="1"/>
+      <w:numFmt w:val="bullet"/>
+      <w:lvlText w:val=""/>
+      <w:lvlJc w:val="left"/>
+      <w:pPr>
+        <w:ind w:left="5040" w:hanging="360"/>
+      </w:pPr>
+      <w:rPr>
+        <w:rFonts w:ascii="Wingdings" w:hAnsi="Wingdings" w:hint="default"/>
+      </w:rPr>
+    </w:lvl>
+    <w:lvl w:ilvl="6" w:tplc="04090001" w:tentative="1">
+      <w:start w:val="1"/>
+      <w:numFmt w:val="bullet"/>
+      <w:lvlText w:val=""/>
+      <w:lvlJc w:val="left"/>
+      <w:pPr>
+        <w:ind w:left="5760" w:hanging="360"/>
+      </w:pPr>
+      <w:rPr>
+        <w:rFonts w:ascii="Symbol" w:hAnsi="Symbol" w:hint="default"/>
+      </w:rPr>
+    </w:lvl>
+    <w:lvl w:ilvl="7" w:tplc="04090003" w:tentative="1">
+      <w:start w:val="1"/>
+      <w:numFmt w:val="bullet"/>
+      <w:lvlText w:val="o"/>
+      <w:lvlJc w:val="left"/>
+      <w:pPr>
+        <w:ind w:left="6480" w:hanging="360"/>
+      </w:pPr>
+      <w:rPr>
+        <w:rFonts w:ascii="Courier New" w:hAnsi="Courier New" w:cs="Courier New" w:hint="default"/>
+      </w:rPr>
+    </w:lvl>
+    <w:lvl w:ilvl="8" w:tplc="04090005" w:tentative="1">
+      <w:start w:val="1"/>
+      <w:numFmt w:val="bullet"/>
+      <w:lvlText w:val=""/>
+      <w:lvlJc w:val="left"/>
+      <w:pPr>
+        <w:ind w:left="7200" w:hanging="360"/>
+      </w:pPr>
+      <w:rPr>
+        <w:rFonts w:ascii="Wingdings" w:hAnsi="Wingdings" w:hint="default"/>
+      </w:rPr>
+    </w:lvl>
+  </w:abstractNum>
+  <w:abstractNum w:abstractNumId="10">
     <w:nsid w:val="31C4647D"/>
     <w:multiLevelType w:val="hybridMultilevel"/>
     <w:tmpl w:val="C250244E"/>
@@ -6391,7 +6907,7 @@
       </w:rPr>
     </w:lvl>
   </w:abstractNum>
-  <w:abstractNum w:abstractNumId="10">
+  <w:abstractNum w:abstractNumId="11">
     <w:nsid w:val="3A8E1F14"/>
     <w:multiLevelType w:val="hybridMultilevel"/>
     <w:tmpl w:val="DF8A4E4C"/>
@@ -6504,7 +7020,7 @@
       </w:rPr>
     </w:lvl>
   </w:abstractNum>
-  <w:abstractNum w:abstractNumId="11">
+  <w:abstractNum w:abstractNumId="12">
     <w:nsid w:val="47BB246C"/>
     <w:multiLevelType w:val="hybridMultilevel"/>
     <w:tmpl w:val="46048FB8"/>
@@ -6618,7 +7134,7 @@
       </w:rPr>
     </w:lvl>
   </w:abstractNum>
-  <w:abstractNum w:abstractNumId="12">
+  <w:abstractNum w:abstractNumId="13">
     <w:nsid w:val="49BD1D98"/>
     <w:multiLevelType w:val="hybridMultilevel"/>
     <w:tmpl w:val="3332526C"/>
@@ -6731,7 +7247,7 @@
       </w:rPr>
     </w:lvl>
   </w:abstractNum>
-  <w:abstractNum w:abstractNumId="13">
+  <w:abstractNum w:abstractNumId="14">
     <w:nsid w:val="4CBE58AB"/>
     <w:multiLevelType w:val="hybridMultilevel"/>
     <w:tmpl w:val="F7484EBC"/>
@@ -6845,7 +7361,7 @@
       </w:rPr>
     </w:lvl>
   </w:abstractNum>
-  <w:abstractNum w:abstractNumId="14">
+  <w:abstractNum w:abstractNumId="15">
     <w:nsid w:val="4DFC1534"/>
     <w:multiLevelType w:val="hybridMultilevel"/>
     <w:tmpl w:val="2EF85536"/>
@@ -6958,7 +7474,7 @@
       </w:rPr>
     </w:lvl>
   </w:abstractNum>
-  <w:abstractNum w:abstractNumId="15">
+  <w:abstractNum w:abstractNumId="16">
     <w:nsid w:val="511F51B9"/>
     <w:multiLevelType w:val="hybridMultilevel"/>
     <w:tmpl w:val="F650FDA2"/>
@@ -7071,7 +7587,7 @@
       </w:rPr>
     </w:lvl>
   </w:abstractNum>
-  <w:abstractNum w:abstractNumId="16">
+  <w:abstractNum w:abstractNumId="17">
     <w:nsid w:val="567B01C4"/>
     <w:multiLevelType w:val="hybridMultilevel"/>
     <w:tmpl w:val="01E64DBC"/>
@@ -7185,7 +7701,7 @@
       </w:rPr>
     </w:lvl>
   </w:abstractNum>
-  <w:abstractNum w:abstractNumId="17">
+  <w:abstractNum w:abstractNumId="18">
     <w:nsid w:val="57FA5BDC"/>
     <w:multiLevelType w:val="hybridMultilevel"/>
     <w:tmpl w:val="C1069388"/>
@@ -7298,7 +7814,7 @@
       </w:rPr>
     </w:lvl>
   </w:abstractNum>
-  <w:abstractNum w:abstractNumId="18">
+  <w:abstractNum w:abstractNumId="19">
     <w:nsid w:val="6A465EA9"/>
     <w:multiLevelType w:val="hybridMultilevel"/>
     <w:tmpl w:val="83527182"/>
@@ -7411,7 +7927,7 @@
       </w:rPr>
     </w:lvl>
   </w:abstractNum>
-  <w:abstractNum w:abstractNumId="19">
+  <w:abstractNum w:abstractNumId="20">
     <w:nsid w:val="6E0F0971"/>
     <w:multiLevelType w:val="hybridMultilevel"/>
     <w:tmpl w:val="EF481D2C"/>
@@ -7525,7 +8041,7 @@
       </w:rPr>
     </w:lvl>
   </w:abstractNum>
-  <w:abstractNum w:abstractNumId="20">
+  <w:abstractNum w:abstractNumId="21">
     <w:nsid w:val="74E724D3"/>
     <w:multiLevelType w:val="hybridMultilevel"/>
     <w:tmpl w:val="EDCC46EC"/>
@@ -7638,7 +8154,7 @@
       </w:rPr>
     </w:lvl>
   </w:abstractNum>
-  <w:abstractNum w:abstractNumId="21">
+  <w:abstractNum w:abstractNumId="22">
     <w:nsid w:val="774E37A9"/>
     <w:multiLevelType w:val="hybridMultilevel"/>
     <w:tmpl w:val="1E341DC4"/>
@@ -7751,7 +8267,7 @@
       </w:rPr>
     </w:lvl>
   </w:abstractNum>
-  <w:abstractNum w:abstractNumId="22">
+  <w:abstractNum w:abstractNumId="23">
     <w:nsid w:val="7C7B411A"/>
     <w:multiLevelType w:val="hybridMultilevel"/>
     <w:tmpl w:val="DD327E98"/>
@@ -7865,13 +8381,13 @@
     </w:lvl>
   </w:abstractNum>
   <w:num w:numId="1">
-    <w:abstractNumId w:val="20"/>
+    <w:abstractNumId w:val="21"/>
   </w:num>
   <w:num w:numId="2">
-    <w:abstractNumId w:val="17"/>
+    <w:abstractNumId w:val="18"/>
   </w:num>
   <w:num w:numId="3">
-    <w:abstractNumId w:val="14"/>
+    <w:abstractNumId w:val="15"/>
   </w:num>
   <w:num w:numId="4">
     <w:abstractNumId w:val="8"/>
@@ -7883,28 +8399,28 @@
     <w:abstractNumId w:val="2"/>
   </w:num>
   <w:num w:numId="7">
-    <w:abstractNumId w:val="18"/>
+    <w:abstractNumId w:val="19"/>
   </w:num>
   <w:num w:numId="8">
-    <w:abstractNumId w:val="9"/>
+    <w:abstractNumId w:val="10"/>
   </w:num>
   <w:num w:numId="9">
-    <w:abstractNumId w:val="15"/>
+    <w:abstractNumId w:val="16"/>
   </w:num>
   <w:num w:numId="10">
-    <w:abstractNumId w:val="12"/>
+    <w:abstractNumId w:val="13"/>
   </w:num>
   <w:num w:numId="11">
     <w:abstractNumId w:val="0"/>
   </w:num>
   <w:num w:numId="12">
-    <w:abstractNumId w:val="22"/>
+    <w:abstractNumId w:val="23"/>
   </w:num>
   <w:num w:numId="13">
-    <w:abstractNumId w:val="9"/>
+    <w:abstractNumId w:val="10"/>
   </w:num>
   <w:num w:numId="14">
-    <w:abstractNumId w:val="19"/>
+    <w:abstractNumId w:val="20"/>
   </w:num>
   <w:num w:numId="15">
     <w:abstractNumId w:val="7"/>
@@ -7913,16 +8429,16 @@
     <w:abstractNumId w:val="4"/>
   </w:num>
   <w:num w:numId="17">
-    <w:abstractNumId w:val="13"/>
+    <w:abstractNumId w:val="14"/>
   </w:num>
   <w:num w:numId="18">
     <w:abstractNumId w:val="3"/>
   </w:num>
   <w:num w:numId="19">
-    <w:abstractNumId w:val="11"/>
+    <w:abstractNumId w:val="12"/>
   </w:num>
   <w:num w:numId="20">
-    <w:abstractNumId w:val="21"/>
+    <w:abstractNumId w:val="22"/>
   </w:num>
   <w:num w:numId="21">
     <w:abstractNumId w:val="1"/>
@@ -7931,10 +8447,13 @@
     <w:abstractNumId w:val="5"/>
   </w:num>
   <w:num w:numId="23">
-    <w:abstractNumId w:val="16"/>
+    <w:abstractNumId w:val="17"/>
   </w:num>
   <w:num w:numId="24">
-    <w:abstractNumId w:val="10"/>
+    <w:abstractNumId w:val="11"/>
+  </w:num>
+  <w:num w:numId="25">
+    <w:abstractNumId w:val="9"/>
   </w:num>
 </w:numbering>
 </file>
@@ -8621,6 +9140,7 @@
   <w:rsids>
     <w:rsidRoot w:val="00F072F0"/>
     <w:rsid w:val="002F7BEE"/>
+    <w:rsid w:val="005F69F2"/>
     <w:rsid w:val="00625DB6"/>
     <w:rsid w:val="00627604"/>
     <w:rsid w:val="00746BEB"/>
@@ -9341,7 +9861,7 @@
 </file>
 
 <file path=customXml/itemProps1.xml><?xml version="1.0" encoding="utf-8"?>
-<ds:datastoreItem xmlns:ds="http://schemas.openxmlformats.org/officeDocument/2006/customXml" ds:itemID="{4E45004B-4A03-42BC-8B77-60A7AEC5F2F9}">
+<ds:datastoreItem xmlns:ds="http://schemas.openxmlformats.org/officeDocument/2006/customXml" ds:itemID="{84AD8009-497F-4D6C-8F21-08B4D2AB87F5}">
   <ds:schemaRefs>
     <ds:schemaRef ds:uri="http://schemas.openxmlformats.org/officeDocument/2006/bibliography"/>
   </ds:schemaRefs>

</xml_diff>

<commit_message>
FOR V23 XENON LIGHT U14! Updated changelog!
</commit_message>
<xml_diff>
--- a/changelog.docx
+++ b/changelog.docx
@@ -44,7 +44,7 @@
           <w:b/>
           <w:sz w:val="48"/>
         </w:rPr>
-        <w:t>2</w:t>
+        <w:t>3</w:t>
       </w:r>
       <w:r>
         <w:rPr>
@@ -60,8 +60,10 @@
           <w:b/>
           <w:sz w:val="48"/>
         </w:rPr>
-        <w:t>WARDEN</w:t>
-      </w:r>
+        <w:t>XENON</w:t>
+      </w:r>
+      <w:bookmarkStart w:id="0" w:name="_GoBack"/>
+      <w:bookmarkEnd w:id="0"/>
       <w:r>
         <w:rPr>
           <w:rFonts w:ascii="Verdana" w:hAnsi="Verdana"/>
@@ -177,17 +179,6 @@
           <w:sz w:val="48"/>
         </w:rPr>
       </w:pPr>
-    </w:p>
-    <w:p>
-      <w:pPr>
-        <w:pStyle w:val="NoSpacing"/>
-        <w:jc w:val="center"/>
-        <w:rPr>
-          <w:rFonts w:ascii="Verdana" w:hAnsi="Verdana"/>
-          <w:b/>
-          <w:sz w:val="48"/>
-        </w:rPr>
-      </w:pPr>
       <w:r>
         <w:rPr>
           <w:rFonts w:ascii="Verdana" w:hAnsi="Verdana"/>
@@ -202,7 +193,7 @@
           <w:b/>
           <w:sz w:val="48"/>
         </w:rPr>
-        <w:t>WARDEN</w:t>
+        <w:t>XENON</w:t>
       </w:r>
       <w:r>
         <w:rPr>
@@ -219,27 +210,18 @@
         <w:rPr>
           <w:rFonts w:ascii="Verdana" w:hAnsi="Verdana"/>
           <w:b/>
-          <w:color w:val="00B050"/>
-          <w:sz w:val="48"/>
-        </w:rPr>
-      </w:pPr>
-      <w:r>
-        <w:rPr>
-          <w:rFonts w:ascii="Verdana" w:hAnsi="Verdana"/>
-          <w:b/>
-          <w:color w:val="00B050"/>
-          <w:sz w:val="48"/>
-        </w:rPr>
-        <w:t>FEATURES</w:t>
-      </w:r>
-      <w:r>
-        <w:rPr>
-          <w:rFonts w:ascii="Verdana" w:hAnsi="Verdana"/>
-          <w:b/>
-          <w:color w:val="00B050"/>
-          <w:sz w:val="48"/>
-        </w:rPr>
-        <w:t>:</w:t>
+          <w:color w:val="FFC000"/>
+          <w:sz w:val="48"/>
+        </w:rPr>
+      </w:pPr>
+      <w:r>
+        <w:rPr>
+          <w:rFonts w:ascii="Verdana" w:hAnsi="Verdana"/>
+          <w:b/>
+          <w:color w:val="FFC000"/>
+          <w:sz w:val="48"/>
+        </w:rPr>
+        <w:t>CHANGES:</w:t>
       </w:r>
     </w:p>
     <w:p>
@@ -261,7 +243,25 @@
           <w:sz w:val="32"/>
           <w:szCs w:val="32"/>
         </w:rPr>
-        <w:t>More ambient tracks &amp; new track when level is randomly generated.</w:t>
+        <w:t xml:space="preserve">Solid object collision and in the fluid water effect are improved – use approximation of surroundings around the player rather than looping through the many solid objects. Less fps </w:t>
+      </w:r>
+      <w:proofErr w:type="gramStart"/>
+      <w:r>
+        <w:rPr>
+          <w:rFonts w:ascii="Verdana" w:hAnsi="Verdana"/>
+          <w:sz w:val="32"/>
+          <w:szCs w:val="32"/>
+        </w:rPr>
+        <w:t>drop</w:t>
+      </w:r>
+      <w:proofErr w:type="gramEnd"/>
+      <w:r>
+        <w:rPr>
+          <w:rFonts w:ascii="Verdana" w:hAnsi="Verdana"/>
+          <w:sz w:val="32"/>
+          <w:szCs w:val="32"/>
+        </w:rPr>
+        <w:t xml:space="preserve"> when in motion.</w:t>
       </w:r>
     </w:p>
     <w:p>
@@ -283,7 +283,7 @@
           <w:sz w:val="32"/>
           <w:szCs w:val="32"/>
         </w:rPr>
-        <w:t>Credits added to the menu.</w:t>
+        <w:t>Rework on the fog – fog is everywhere existent and all the objects blend in.</w:t>
       </w:r>
     </w:p>
     <w:p>
@@ -305,38 +305,15 @@
           <w:sz w:val="32"/>
           <w:szCs w:val="32"/>
         </w:rPr>
-        <w:t>Auto-complete for commands.</w:t>
-      </w:r>
-    </w:p>
-    <w:p>
-      <w:pPr>
-        <w:pStyle w:val="NoSpacing"/>
-        <w:rPr>
-          <w:rFonts w:ascii="Verdana" w:hAnsi="Verdana"/>
-          <w:b/>
-          <w:color w:val="FFC000"/>
-          <w:sz w:val="48"/>
-        </w:rPr>
-      </w:pPr>
-    </w:p>
-    <w:p>
-      <w:pPr>
-        <w:pStyle w:val="NoSpacing"/>
-        <w:rPr>
-          <w:rFonts w:ascii="Verdana" w:hAnsi="Verdana"/>
-          <w:b/>
-          <w:color w:val="FFC000"/>
-          <w:sz w:val="48"/>
-        </w:rPr>
-      </w:pPr>
-      <w:r>
-        <w:rPr>
-          <w:rFonts w:ascii="Verdana" w:hAnsi="Verdana"/>
-          <w:b/>
-          <w:color w:val="FFC000"/>
-          <w:sz w:val="48"/>
-        </w:rPr>
-        <w:t>CHANGES:</w:t>
+        <w:t>Random level generator rework – there is 4 type of preexisting levels for the same hardcoded seed.</w:t>
+      </w:r>
+      <w:r>
+        <w:rPr>
+          <w:rFonts w:ascii="Verdana" w:hAnsi="Verdana"/>
+          <w:sz w:val="32"/>
+          <w:szCs w:val="32"/>
+        </w:rPr>
+        <w:t xml:space="preserve"> Simplex noise is being used.</w:t>
       </w:r>
     </w:p>
     <w:p>
@@ -358,6 +335,284 @@
           <w:sz w:val="32"/>
           <w:szCs w:val="32"/>
         </w:rPr>
+        <w:t xml:space="preserve">General improvement in multiple </w:t>
+      </w:r>
+      <w:proofErr w:type="gramStart"/>
+      <w:r>
+        <w:rPr>
+          <w:rFonts w:ascii="Verdana" w:hAnsi="Verdana"/>
+          <w:sz w:val="32"/>
+          <w:szCs w:val="32"/>
+        </w:rPr>
+        <w:t>object</w:t>
+      </w:r>
+      <w:proofErr w:type="gramEnd"/>
+      <w:r>
+        <w:rPr>
+          <w:rFonts w:ascii="Verdana" w:hAnsi="Verdana"/>
+          <w:sz w:val="32"/>
+          <w:szCs w:val="32"/>
+        </w:rPr>
+        <w:t xml:space="preserve"> rendering without instancing (for the text rendering and for the old way of block rendering).</w:t>
+      </w:r>
+    </w:p>
+    <w:p>
+      <w:pPr>
+        <w:pStyle w:val="NoSpacing"/>
+        <w:numPr>
+          <w:ilvl w:val="0"/>
+          <w:numId w:val="22"/>
+        </w:numPr>
+        <w:rPr>
+          <w:rFonts w:ascii="Verdana" w:hAnsi="Verdana"/>
+          <w:sz w:val="32"/>
+          <w:szCs w:val="32"/>
+        </w:rPr>
+      </w:pPr>
+      <w:r>
+        <w:rPr>
+          <w:rFonts w:ascii="Verdana" w:hAnsi="Verdana"/>
+          <w:sz w:val="32"/>
+          <w:szCs w:val="32"/>
+        </w:rPr>
+        <w:t>Water effects (non-light, regular version only) are more realistic at low cost to performance (framerate).</w:t>
+      </w:r>
+    </w:p>
+    <w:p>
+      <w:pPr>
+        <w:pStyle w:val="NoSpacing"/>
+        <w:jc w:val="center"/>
+        <w:rPr>
+          <w:rFonts w:ascii="Verdana" w:hAnsi="Verdana"/>
+          <w:b/>
+          <w:sz w:val="48"/>
+        </w:rPr>
+      </w:pPr>
+    </w:p>
+    <w:p>
+      <w:pPr>
+        <w:pStyle w:val="NoSpacing"/>
+        <w:jc w:val="center"/>
+        <w:rPr>
+          <w:rFonts w:ascii="Verdana" w:hAnsi="Verdana"/>
+          <w:b/>
+          <w:sz w:val="48"/>
+        </w:rPr>
+      </w:pPr>
+    </w:p>
+    <w:p>
+      <w:pPr>
+        <w:pStyle w:val="NoSpacing"/>
+        <w:jc w:val="center"/>
+        <w:rPr>
+          <w:rFonts w:ascii="Verdana" w:hAnsi="Verdana"/>
+          <w:b/>
+          <w:sz w:val="48"/>
+        </w:rPr>
+      </w:pPr>
+    </w:p>
+    <w:p>
+      <w:pPr>
+        <w:pStyle w:val="NoSpacing"/>
+        <w:jc w:val="center"/>
+        <w:rPr>
+          <w:rFonts w:ascii="Verdana" w:hAnsi="Verdana"/>
+          <w:b/>
+          <w:sz w:val="48"/>
+        </w:rPr>
+      </w:pPr>
+    </w:p>
+    <w:p>
+      <w:pPr>
+        <w:pStyle w:val="NoSpacing"/>
+        <w:jc w:val="center"/>
+        <w:rPr>
+          <w:rFonts w:ascii="Verdana" w:hAnsi="Verdana"/>
+          <w:b/>
+          <w:sz w:val="48"/>
+        </w:rPr>
+      </w:pPr>
+    </w:p>
+    <w:p>
+      <w:pPr>
+        <w:pStyle w:val="NoSpacing"/>
+        <w:jc w:val="center"/>
+        <w:rPr>
+          <w:rFonts w:ascii="Verdana" w:hAnsi="Verdana"/>
+          <w:b/>
+          <w:sz w:val="48"/>
+        </w:rPr>
+      </w:pPr>
+      <w:r>
+        <w:rPr>
+          <w:rFonts w:ascii="Verdana" w:hAnsi="Verdana"/>
+          <w:b/>
+          <w:sz w:val="48"/>
+        </w:rPr>
+        <w:lastRenderedPageBreak/>
+        <w:t xml:space="preserve"> </w:t>
+      </w:r>
+      <w:r>
+        <w:rPr>
+          <w:rFonts w:ascii="Verdana" w:hAnsi="Verdana"/>
+          <w:b/>
+          <w:sz w:val="48"/>
+        </w:rPr>
+        <w:t>[</w:t>
+      </w:r>
+      <w:r>
+        <w:rPr>
+          <w:rFonts w:ascii="Verdana" w:hAnsi="Verdana"/>
+          <w:b/>
+          <w:sz w:val="48"/>
+        </w:rPr>
+        <w:t>WARDEN</w:t>
+      </w:r>
+      <w:r>
+        <w:rPr>
+          <w:rFonts w:ascii="Verdana" w:hAnsi="Verdana"/>
+          <w:b/>
+          <w:sz w:val="48"/>
+        </w:rPr>
+        <w:t>]</w:t>
+      </w:r>
+    </w:p>
+    <w:p>
+      <w:pPr>
+        <w:pStyle w:val="NoSpacing"/>
+        <w:rPr>
+          <w:rFonts w:ascii="Verdana" w:hAnsi="Verdana"/>
+          <w:b/>
+          <w:color w:val="00B050"/>
+          <w:sz w:val="48"/>
+        </w:rPr>
+      </w:pPr>
+      <w:r>
+        <w:rPr>
+          <w:rFonts w:ascii="Verdana" w:hAnsi="Verdana"/>
+          <w:b/>
+          <w:color w:val="00B050"/>
+          <w:sz w:val="48"/>
+        </w:rPr>
+        <w:t>FEATURES:</w:t>
+      </w:r>
+    </w:p>
+    <w:p>
+      <w:pPr>
+        <w:pStyle w:val="NoSpacing"/>
+        <w:numPr>
+          <w:ilvl w:val="0"/>
+          <w:numId w:val="22"/>
+        </w:numPr>
+        <w:rPr>
+          <w:rFonts w:ascii="Verdana" w:hAnsi="Verdana"/>
+          <w:sz w:val="32"/>
+          <w:szCs w:val="32"/>
+        </w:rPr>
+      </w:pPr>
+      <w:r>
+        <w:rPr>
+          <w:rFonts w:ascii="Verdana" w:hAnsi="Verdana"/>
+          <w:sz w:val="32"/>
+          <w:szCs w:val="32"/>
+        </w:rPr>
+        <w:t>More ambient tracks &amp; new track when level is randomly generated.</w:t>
+      </w:r>
+    </w:p>
+    <w:p>
+      <w:pPr>
+        <w:pStyle w:val="NoSpacing"/>
+        <w:numPr>
+          <w:ilvl w:val="0"/>
+          <w:numId w:val="22"/>
+        </w:numPr>
+        <w:rPr>
+          <w:rFonts w:ascii="Verdana" w:hAnsi="Verdana"/>
+          <w:sz w:val="32"/>
+          <w:szCs w:val="32"/>
+        </w:rPr>
+      </w:pPr>
+      <w:r>
+        <w:rPr>
+          <w:rFonts w:ascii="Verdana" w:hAnsi="Verdana"/>
+          <w:sz w:val="32"/>
+          <w:szCs w:val="32"/>
+        </w:rPr>
+        <w:t>Credits added to the menu.</w:t>
+      </w:r>
+    </w:p>
+    <w:p>
+      <w:pPr>
+        <w:pStyle w:val="NoSpacing"/>
+        <w:numPr>
+          <w:ilvl w:val="0"/>
+          <w:numId w:val="22"/>
+        </w:numPr>
+        <w:rPr>
+          <w:rFonts w:ascii="Verdana" w:hAnsi="Verdana"/>
+          <w:sz w:val="32"/>
+          <w:szCs w:val="32"/>
+        </w:rPr>
+      </w:pPr>
+      <w:r>
+        <w:rPr>
+          <w:rFonts w:ascii="Verdana" w:hAnsi="Verdana"/>
+          <w:sz w:val="32"/>
+          <w:szCs w:val="32"/>
+        </w:rPr>
+        <w:t>Auto-complete for commands.</w:t>
+      </w:r>
+    </w:p>
+    <w:p>
+      <w:pPr>
+        <w:pStyle w:val="NoSpacing"/>
+        <w:rPr>
+          <w:rFonts w:ascii="Verdana" w:hAnsi="Verdana"/>
+          <w:b/>
+          <w:color w:val="FFC000"/>
+          <w:sz w:val="48"/>
+        </w:rPr>
+      </w:pPr>
+    </w:p>
+    <w:p>
+      <w:pPr>
+        <w:pStyle w:val="NoSpacing"/>
+        <w:rPr>
+          <w:rFonts w:ascii="Verdana" w:hAnsi="Verdana"/>
+          <w:b/>
+          <w:color w:val="FFC000"/>
+          <w:sz w:val="48"/>
+        </w:rPr>
+      </w:pPr>
+      <w:r>
+        <w:rPr>
+          <w:rFonts w:ascii="Verdana" w:hAnsi="Verdana"/>
+          <w:b/>
+          <w:color w:val="FFC000"/>
+          <w:sz w:val="48"/>
+        </w:rPr>
+        <w:t>CHANGES:</w:t>
+      </w:r>
+    </w:p>
+    <w:p>
+      <w:pPr>
+        <w:pStyle w:val="NoSpacing"/>
+        <w:numPr>
+          <w:ilvl w:val="0"/>
+          <w:numId w:val="22"/>
+        </w:numPr>
+        <w:rPr>
+          <w:rFonts w:ascii="Verdana" w:hAnsi="Verdana"/>
+          <w:sz w:val="32"/>
+          <w:szCs w:val="32"/>
+        </w:rPr>
+      </w:pPr>
+      <w:r>
+        <w:rPr>
+          <w:rFonts w:ascii="Verdana" w:hAnsi="Verdana"/>
+          <w:sz w:val="32"/>
+          <w:szCs w:val="32"/>
+        </w:rPr>
         <w:t>Chunks are deter</w:t>
       </w:r>
       <w:r>
@@ -512,14 +767,90 @@
           <w:sz w:val="48"/>
         </w:rPr>
       </w:pPr>
-      <w:bookmarkStart w:id="0" w:name="_GoBack"/>
-      <w:bookmarkEnd w:id="0"/>
-      <w:r>
-        <w:rPr>
-          <w:rFonts w:ascii="Verdana" w:hAnsi="Verdana"/>
-          <w:b/>
-          <w:sz w:val="48"/>
-        </w:rPr>
+    </w:p>
+    <w:p>
+      <w:pPr>
+        <w:pStyle w:val="NoSpacing"/>
+        <w:jc w:val="center"/>
+        <w:rPr>
+          <w:rFonts w:ascii="Verdana" w:hAnsi="Verdana"/>
+          <w:b/>
+          <w:sz w:val="48"/>
+        </w:rPr>
+      </w:pPr>
+    </w:p>
+    <w:p>
+      <w:pPr>
+        <w:pStyle w:val="NoSpacing"/>
+        <w:jc w:val="center"/>
+        <w:rPr>
+          <w:rFonts w:ascii="Verdana" w:hAnsi="Verdana"/>
+          <w:b/>
+          <w:sz w:val="48"/>
+        </w:rPr>
+      </w:pPr>
+    </w:p>
+    <w:p>
+      <w:pPr>
+        <w:pStyle w:val="NoSpacing"/>
+        <w:jc w:val="center"/>
+        <w:rPr>
+          <w:rFonts w:ascii="Verdana" w:hAnsi="Verdana"/>
+          <w:b/>
+          <w:sz w:val="48"/>
+        </w:rPr>
+      </w:pPr>
+    </w:p>
+    <w:p>
+      <w:pPr>
+        <w:pStyle w:val="NoSpacing"/>
+        <w:jc w:val="center"/>
+        <w:rPr>
+          <w:rFonts w:ascii="Verdana" w:hAnsi="Verdana"/>
+          <w:b/>
+          <w:sz w:val="48"/>
+        </w:rPr>
+      </w:pPr>
+    </w:p>
+    <w:p>
+      <w:pPr>
+        <w:pStyle w:val="NoSpacing"/>
+        <w:jc w:val="center"/>
+        <w:rPr>
+          <w:rFonts w:ascii="Verdana" w:hAnsi="Verdana"/>
+          <w:b/>
+          <w:sz w:val="48"/>
+        </w:rPr>
+      </w:pPr>
+    </w:p>
+    <w:p>
+      <w:pPr>
+        <w:pStyle w:val="NoSpacing"/>
+        <w:jc w:val="center"/>
+        <w:rPr>
+          <w:rFonts w:ascii="Verdana" w:hAnsi="Verdana"/>
+          <w:b/>
+          <w:sz w:val="48"/>
+        </w:rPr>
+      </w:pPr>
+    </w:p>
+    <w:p>
+      <w:pPr>
+        <w:pStyle w:val="NoSpacing"/>
+        <w:jc w:val="center"/>
+        <w:rPr>
+          <w:rFonts w:ascii="Verdana" w:hAnsi="Verdana"/>
+          <w:b/>
+          <w:sz w:val="48"/>
+        </w:rPr>
+      </w:pPr>
+      <w:r>
+        <w:rPr>
+          <w:rFonts w:ascii="Verdana" w:hAnsi="Verdana"/>
+          <w:b/>
+          <w:sz w:val="48"/>
+        </w:rPr>
+        <w:lastRenderedPageBreak/>
         <w:t>[</w:t>
       </w:r>
       <w:r>
@@ -9105,8 +9436,9 @@
     <w:panose1 w:val="020B0604030504040204"/>
     <w:charset w:val="00"/>
     <w:family w:val="swiss"/>
+    <w:notTrueType/>
     <w:pitch w:val="variable"/>
-    <w:sig w:usb0="E1002EFF" w:usb1="C000605B" w:usb2="00000029" w:usb3="00000000" w:csb0="000101FF" w:csb1="00000000"/>
+    <w:sig w:usb0="00000003" w:usb1="00000000" w:usb2="00000000" w:usb3="00000000" w:csb0="00000001" w:csb1="00000000"/>
   </w:font>
   <w:font w:name="Verdana">
     <w:panose1 w:val="020B0604030504040204"/>
@@ -9144,6 +9476,7 @@
     <w:rsid w:val="00625DB6"/>
     <w:rsid w:val="00627604"/>
     <w:rsid w:val="00746BEB"/>
+    <w:rsid w:val="00767599"/>
     <w:rsid w:val="00926A90"/>
     <w:rsid w:val="009A2582"/>
     <w:rsid w:val="00A823C9"/>
@@ -9151,6 +9484,7 @@
     <w:rsid w:val="00C9469B"/>
     <w:rsid w:val="00CF0582"/>
     <w:rsid w:val="00DC2C91"/>
+    <w:rsid w:val="00E3698B"/>
     <w:rsid w:val="00F072F0"/>
     <w:rsid w:val="00F82198"/>
     <w:rsid w:val="00FD26D1"/>
@@ -9861,7 +10195,7 @@
 </file>
 
 <file path=customXml/itemProps1.xml><?xml version="1.0" encoding="utf-8"?>
-<ds:datastoreItem xmlns:ds="http://schemas.openxmlformats.org/officeDocument/2006/customXml" ds:itemID="{84AD8009-497F-4D6C-8F21-08B4D2AB87F5}">
+<ds:datastoreItem xmlns:ds="http://schemas.openxmlformats.org/officeDocument/2006/customXml" ds:itemID="{7B3D44FD-E489-40E0-B7BE-B46CB235217E}">
   <ds:schemaRefs>
     <ds:schemaRef ds:uri="http://schemas.openxmlformats.org/officeDocument/2006/bibliography"/>
   </ds:schemaRefs>

</xml_diff>

<commit_message>
FOR V24 YEOMEN U07! Put RW Locks in GameObj. Updated changelog!
</commit_message>
<xml_diff>
--- a/changelog.docx
+++ b/changelog.docx
@@ -44,7 +44,7 @@
           <w:b/>
           <w:sz w:val="48"/>
         </w:rPr>
-        <w:t>3</w:t>
+        <w:t>4</w:t>
       </w:r>
       <w:r>
         <w:rPr>
@@ -60,10 +60,8 @@
           <w:b/>
           <w:sz w:val="48"/>
         </w:rPr>
-        <w:t>XENON</w:t>
-      </w:r>
-      <w:bookmarkStart w:id="0" w:name="_GoBack"/>
-      <w:bookmarkEnd w:id="0"/>
+        <w:t>YEOMEN</w:t>
+      </w:r>
       <w:r>
         <w:rPr>
           <w:rFonts w:ascii="Verdana" w:hAnsi="Verdana"/>
@@ -179,6 +177,17 @@
           <w:sz w:val="48"/>
         </w:rPr>
       </w:pPr>
+    </w:p>
+    <w:p>
+      <w:pPr>
+        <w:pStyle w:val="NoSpacing"/>
+        <w:jc w:val="center"/>
+        <w:rPr>
+          <w:rFonts w:ascii="Verdana" w:hAnsi="Verdana"/>
+          <w:b/>
+          <w:sz w:val="48"/>
+        </w:rPr>
+      </w:pPr>
       <w:r>
         <w:rPr>
           <w:rFonts w:ascii="Verdana" w:hAnsi="Verdana"/>
@@ -193,7 +202,7 @@
           <w:b/>
           <w:sz w:val="48"/>
         </w:rPr>
-        <w:t>XENON</w:t>
+        <w:t>YEOMEN</w:t>
       </w:r>
       <w:r>
         <w:rPr>
@@ -210,18 +219,18 @@
         <w:rPr>
           <w:rFonts w:ascii="Verdana" w:hAnsi="Verdana"/>
           <w:b/>
-          <w:color w:val="FFC000"/>
-          <w:sz w:val="48"/>
-        </w:rPr>
-      </w:pPr>
-      <w:r>
-        <w:rPr>
-          <w:rFonts w:ascii="Verdana" w:hAnsi="Verdana"/>
-          <w:b/>
-          <w:color w:val="FFC000"/>
-          <w:sz w:val="48"/>
-        </w:rPr>
-        <w:t>CHANGES:</w:t>
+          <w:color w:val="00B050"/>
+          <w:sz w:val="48"/>
+        </w:rPr>
+      </w:pPr>
+      <w:r>
+        <w:rPr>
+          <w:rFonts w:ascii="Verdana" w:hAnsi="Verdana"/>
+          <w:b/>
+          <w:color w:val="00B050"/>
+          <w:sz w:val="48"/>
+        </w:rPr>
+        <w:t>FEATURES:</w:t>
       </w:r>
     </w:p>
     <w:p>
@@ -243,25 +252,15 @@
           <w:sz w:val="32"/>
           <w:szCs w:val="32"/>
         </w:rPr>
-        <w:t xml:space="preserve">Solid object collision and in the fluid water effect are improved – use approximation of surroundings around the player rather than looping through the many solid objects. Less fps </w:t>
-      </w:r>
-      <w:proofErr w:type="gramStart"/>
-      <w:r>
-        <w:rPr>
-          <w:rFonts w:ascii="Verdana" w:hAnsi="Verdana"/>
-          <w:sz w:val="32"/>
-          <w:szCs w:val="32"/>
-        </w:rPr>
-        <w:t>drop</w:t>
-      </w:r>
-      <w:proofErr w:type="gramEnd"/>
-      <w:r>
-        <w:rPr>
-          <w:rFonts w:ascii="Verdana" w:hAnsi="Verdana"/>
-          <w:sz w:val="32"/>
-          <w:szCs w:val="32"/>
-        </w:rPr>
-        <w:t xml:space="preserve"> when in motion.</w:t>
+        <w:t>Texture atlases implemented with aim to consume less video card memory and improve performance</w:t>
+      </w:r>
+      <w:r>
+        <w:rPr>
+          <w:rFonts w:ascii="Verdana" w:hAnsi="Verdana"/>
+          <w:sz w:val="32"/>
+          <w:szCs w:val="32"/>
+        </w:rPr>
+        <w:t>.</w:t>
       </w:r>
     </w:p>
     <w:p>
@@ -283,7 +282,7 @@
           <w:sz w:val="32"/>
           <w:szCs w:val="32"/>
         </w:rPr>
-        <w:t>Rework on the fog – fog is everywhere existent and all the objects blend in.</w:t>
+        <w:t>Get feature for console commands. Writing command without arguments gets its value.</w:t>
       </w:r>
     </w:p>
     <w:p>
@@ -305,15 +304,25 @@
           <w:sz w:val="32"/>
           <w:szCs w:val="32"/>
         </w:rPr>
-        <w:t>Random level generator rework – there is 4 type of preexisting levels for the same hardcoded seed.</w:t>
-      </w:r>
-      <w:r>
-        <w:rPr>
-          <w:rFonts w:ascii="Verdana" w:hAnsi="Verdana"/>
-          <w:sz w:val="32"/>
-          <w:szCs w:val="32"/>
-        </w:rPr>
-        <w:t xml:space="preserve"> Simplex noise is being used.</w:t>
+        <w:t>Texture size can be changed from the .</w:t>
+      </w:r>
+      <w:proofErr w:type="spellStart"/>
+      <w:r>
+        <w:rPr>
+          <w:rFonts w:ascii="Verdana" w:hAnsi="Verdana"/>
+          <w:sz w:val="32"/>
+          <w:szCs w:val="32"/>
+        </w:rPr>
+        <w:t>ini</w:t>
+      </w:r>
+      <w:proofErr w:type="spellEnd"/>
+      <w:r>
+        <w:rPr>
+          <w:rFonts w:ascii="Verdana" w:hAnsi="Verdana"/>
+          <w:sz w:val="32"/>
+          <w:szCs w:val="32"/>
+        </w:rPr>
+        <w:t>. (Default 512, max is 4096).</w:t>
       </w:r>
     </w:p>
     <w:p>
@@ -335,25 +344,64 @@
           <w:sz w:val="32"/>
           <w:szCs w:val="32"/>
         </w:rPr>
-        <w:t xml:space="preserve">General improvement in multiple </w:t>
-      </w:r>
-      <w:proofErr w:type="gramStart"/>
-      <w:r>
-        <w:rPr>
-          <w:rFonts w:ascii="Verdana" w:hAnsi="Verdana"/>
-          <w:sz w:val="32"/>
-          <w:szCs w:val="32"/>
-        </w:rPr>
-        <w:t>object</w:t>
-      </w:r>
-      <w:proofErr w:type="gramEnd"/>
-      <w:r>
-        <w:rPr>
-          <w:rFonts w:ascii="Verdana" w:hAnsi="Verdana"/>
-          <w:sz w:val="32"/>
-          <w:szCs w:val="32"/>
-        </w:rPr>
-        <w:t xml:space="preserve"> rendering without instancing (for the text rendering and for the old way of block rendering).</w:t>
+        <w:t>Dynamic size can be changed from the .</w:t>
+      </w:r>
+      <w:proofErr w:type="spellStart"/>
+      <w:r>
+        <w:rPr>
+          <w:rFonts w:ascii="Verdana" w:hAnsi="Verdana"/>
+          <w:sz w:val="32"/>
+          <w:szCs w:val="32"/>
+        </w:rPr>
+        <w:t>ini</w:t>
+      </w:r>
+      <w:proofErr w:type="spellEnd"/>
+      <w:r>
+        <w:rPr>
+          <w:rFonts w:ascii="Verdana" w:hAnsi="Verdana"/>
+          <w:sz w:val="32"/>
+          <w:szCs w:val="32"/>
+        </w:rPr>
+        <w:t xml:space="preserve"> (Default for blocks 250, for text 25, available only in regular version).</w:t>
+      </w:r>
+      <w:r>
+        <w:rPr>
+          <w:rFonts w:ascii="Verdana" w:hAnsi="Verdana"/>
+          <w:sz w:val="32"/>
+          <w:szCs w:val="32"/>
+        </w:rPr>
+        <w:t xml:space="preserve"> [HellBlade64]</w:t>
+      </w:r>
+    </w:p>
+    <w:p>
+      <w:pPr>
+        <w:pStyle w:val="NoSpacing"/>
+        <w:rPr>
+          <w:rFonts w:ascii="Verdana" w:hAnsi="Verdana"/>
+          <w:b/>
+          <w:color w:val="FFC000"/>
+          <w:sz w:val="48"/>
+        </w:rPr>
+      </w:pPr>
+    </w:p>
+    <w:p>
+      <w:pPr>
+        <w:pStyle w:val="NoSpacing"/>
+        <w:rPr>
+          <w:rFonts w:ascii="Verdana" w:hAnsi="Verdana"/>
+          <w:b/>
+          <w:color w:val="FFC000"/>
+          <w:sz w:val="48"/>
+        </w:rPr>
+      </w:pPr>
+      <w:r>
+        <w:rPr>
+          <w:rFonts w:ascii="Verdana" w:hAnsi="Verdana"/>
+          <w:b/>
+          <w:color w:val="FFC000"/>
+          <w:sz w:val="48"/>
+        </w:rPr>
+        <w:t>CHANGES:</w:t>
       </w:r>
     </w:p>
     <w:p>
@@ -375,126 +423,15 @@
           <w:sz w:val="32"/>
           <w:szCs w:val="32"/>
         </w:rPr>
-        <w:t>Water effects (non-light, regular version only) are more realistic at low cost to performance (framerate).</w:t>
-      </w:r>
-    </w:p>
-    <w:p>
-      <w:pPr>
-        <w:pStyle w:val="NoSpacing"/>
-        <w:jc w:val="center"/>
-        <w:rPr>
-          <w:rFonts w:ascii="Verdana" w:hAnsi="Verdana"/>
-          <w:b/>
-          <w:sz w:val="48"/>
-        </w:rPr>
-      </w:pPr>
-    </w:p>
-    <w:p>
-      <w:pPr>
-        <w:pStyle w:val="NoSpacing"/>
-        <w:jc w:val="center"/>
-        <w:rPr>
-          <w:rFonts w:ascii="Verdana" w:hAnsi="Verdana"/>
-          <w:b/>
-          <w:sz w:val="48"/>
-        </w:rPr>
-      </w:pPr>
-    </w:p>
-    <w:p>
-      <w:pPr>
-        <w:pStyle w:val="NoSpacing"/>
-        <w:jc w:val="center"/>
-        <w:rPr>
-          <w:rFonts w:ascii="Verdana" w:hAnsi="Verdana"/>
-          <w:b/>
-          <w:sz w:val="48"/>
-        </w:rPr>
-      </w:pPr>
-    </w:p>
-    <w:p>
-      <w:pPr>
-        <w:pStyle w:val="NoSpacing"/>
-        <w:jc w:val="center"/>
-        <w:rPr>
-          <w:rFonts w:ascii="Verdana" w:hAnsi="Verdana"/>
-          <w:b/>
-          <w:sz w:val="48"/>
-        </w:rPr>
-      </w:pPr>
-    </w:p>
-    <w:p>
-      <w:pPr>
-        <w:pStyle w:val="NoSpacing"/>
-        <w:jc w:val="center"/>
-        <w:rPr>
-          <w:rFonts w:ascii="Verdana" w:hAnsi="Verdana"/>
-          <w:b/>
-          <w:sz w:val="48"/>
-        </w:rPr>
-      </w:pPr>
-    </w:p>
-    <w:p>
-      <w:pPr>
-        <w:pStyle w:val="NoSpacing"/>
-        <w:jc w:val="center"/>
-        <w:rPr>
-          <w:rFonts w:ascii="Verdana" w:hAnsi="Verdana"/>
-          <w:b/>
-          <w:sz w:val="48"/>
-        </w:rPr>
-      </w:pPr>
-      <w:r>
-        <w:rPr>
-          <w:rFonts w:ascii="Verdana" w:hAnsi="Verdana"/>
-          <w:b/>
-          <w:sz w:val="48"/>
-        </w:rPr>
-        <w:lastRenderedPageBreak/>
-        <w:t xml:space="preserve"> </w:t>
-      </w:r>
-      <w:r>
-        <w:rPr>
-          <w:rFonts w:ascii="Verdana" w:hAnsi="Verdana"/>
-          <w:b/>
-          <w:sz w:val="48"/>
-        </w:rPr>
-        <w:t>[</w:t>
-      </w:r>
-      <w:r>
-        <w:rPr>
-          <w:rFonts w:ascii="Verdana" w:hAnsi="Verdana"/>
-          <w:b/>
-          <w:sz w:val="48"/>
-        </w:rPr>
-        <w:t>WARDEN</w:t>
-      </w:r>
-      <w:r>
-        <w:rPr>
-          <w:rFonts w:ascii="Verdana" w:hAnsi="Verdana"/>
-          <w:b/>
-          <w:sz w:val="48"/>
-        </w:rPr>
-        <w:t>]</w:t>
-      </w:r>
-    </w:p>
-    <w:p>
-      <w:pPr>
-        <w:pStyle w:val="NoSpacing"/>
-        <w:rPr>
-          <w:rFonts w:ascii="Verdana" w:hAnsi="Verdana"/>
-          <w:b/>
-          <w:color w:val="00B050"/>
-          <w:sz w:val="48"/>
-        </w:rPr>
-      </w:pPr>
-      <w:r>
-        <w:rPr>
-          <w:rFonts w:ascii="Verdana" w:hAnsi="Verdana"/>
-          <w:b/>
-          <w:color w:val="00B050"/>
-          <w:sz w:val="48"/>
-        </w:rPr>
-        <w:t>FEATURES:</w:t>
+        <w:t>Font reworked and changed</w:t>
+      </w:r>
+      <w:r>
+        <w:rPr>
+          <w:rFonts w:ascii="Verdana" w:hAnsi="Verdana"/>
+          <w:sz w:val="32"/>
+          <w:szCs w:val="32"/>
+        </w:rPr>
+        <w:t>.</w:t>
       </w:r>
     </w:p>
     <w:p>
@@ -510,13 +447,159 @@
           <w:szCs w:val="32"/>
         </w:rPr>
       </w:pPr>
-      <w:r>
-        <w:rPr>
-          <w:rFonts w:ascii="Verdana" w:hAnsi="Verdana"/>
-          <w:sz w:val="32"/>
-          <w:szCs w:val="32"/>
-        </w:rPr>
-        <w:t>More ambient tracks &amp; new track when level is randomly generated.</w:t>
+      <w:proofErr w:type="spellStart"/>
+      <w:r>
+        <w:rPr>
+          <w:rFonts w:ascii="Verdana" w:hAnsi="Verdana"/>
+          <w:sz w:val="32"/>
+          <w:szCs w:val="32"/>
+        </w:rPr>
+        <w:t>Hashcode</w:t>
+      </w:r>
+      <w:proofErr w:type="spellEnd"/>
+      <w:r>
+        <w:rPr>
+          <w:rFonts w:ascii="Verdana" w:hAnsi="Verdana"/>
+          <w:sz w:val="32"/>
+          <w:szCs w:val="32"/>
+        </w:rPr>
+        <w:t xml:space="preserve"> reworked so lesser invisible blocks </w:t>
+      </w:r>
+      <w:r>
+        <w:rPr>
+          <w:rFonts w:ascii="Verdana" w:hAnsi="Verdana"/>
+          <w:sz w:val="32"/>
+          <w:szCs w:val="32"/>
+        </w:rPr>
+        <w:t xml:space="preserve">colliding </w:t>
+      </w:r>
+      <w:bookmarkStart w:id="0" w:name="_GoBack"/>
+      <w:bookmarkEnd w:id="0"/>
+      <w:r>
+        <w:rPr>
+          <w:rFonts w:ascii="Verdana" w:hAnsi="Verdana"/>
+          <w:sz w:val="32"/>
+          <w:szCs w:val="32"/>
+        </w:rPr>
+        <w:t>bug [</w:t>
+      </w:r>
+      <w:proofErr w:type="spellStart"/>
+      <w:r>
+        <w:rPr>
+          <w:rFonts w:ascii="Verdana" w:hAnsi="Verdana"/>
+          <w:sz w:val="32"/>
+          <w:szCs w:val="32"/>
+        </w:rPr>
+        <w:t>JSomnia</w:t>
+      </w:r>
+      <w:proofErr w:type="spellEnd"/>
+      <w:r>
+        <w:rPr>
+          <w:rFonts w:ascii="Verdana" w:hAnsi="Verdana"/>
+          <w:sz w:val="32"/>
+          <w:szCs w:val="32"/>
+        </w:rPr>
+        <w:t>]</w:t>
+      </w:r>
+    </w:p>
+    <w:p>
+      <w:pPr>
+        <w:pStyle w:val="NoSpacing"/>
+        <w:jc w:val="center"/>
+        <w:rPr>
+          <w:rFonts w:ascii="Verdana" w:hAnsi="Verdana"/>
+          <w:b/>
+          <w:sz w:val="48"/>
+        </w:rPr>
+      </w:pPr>
+    </w:p>
+    <w:p>
+      <w:pPr>
+        <w:pStyle w:val="NoSpacing"/>
+        <w:jc w:val="center"/>
+        <w:rPr>
+          <w:rFonts w:ascii="Verdana" w:hAnsi="Verdana"/>
+          <w:b/>
+          <w:sz w:val="48"/>
+        </w:rPr>
+      </w:pPr>
+    </w:p>
+    <w:p>
+      <w:pPr>
+        <w:pStyle w:val="NoSpacing"/>
+        <w:jc w:val="center"/>
+        <w:rPr>
+          <w:rFonts w:ascii="Verdana" w:hAnsi="Verdana"/>
+          <w:b/>
+          <w:sz w:val="48"/>
+        </w:rPr>
+      </w:pPr>
+    </w:p>
+    <w:p>
+      <w:pPr>
+        <w:pStyle w:val="NoSpacing"/>
+        <w:jc w:val="center"/>
+        <w:rPr>
+          <w:rFonts w:ascii="Verdana" w:hAnsi="Verdana"/>
+          <w:b/>
+          <w:sz w:val="48"/>
+        </w:rPr>
+      </w:pPr>
+    </w:p>
+    <w:p>
+      <w:pPr>
+        <w:pStyle w:val="NoSpacing"/>
+        <w:jc w:val="center"/>
+        <w:rPr>
+          <w:rFonts w:ascii="Verdana" w:hAnsi="Verdana"/>
+          <w:b/>
+          <w:sz w:val="48"/>
+        </w:rPr>
+      </w:pPr>
+      <w:r>
+        <w:rPr>
+          <w:rFonts w:ascii="Verdana" w:hAnsi="Verdana"/>
+          <w:b/>
+          <w:sz w:val="48"/>
+        </w:rPr>
+        <w:lastRenderedPageBreak/>
+        <w:t>[</w:t>
+      </w:r>
+      <w:r>
+        <w:rPr>
+          <w:rFonts w:ascii="Verdana" w:hAnsi="Verdana"/>
+          <w:b/>
+          <w:sz w:val="48"/>
+        </w:rPr>
+        <w:t>XENON</w:t>
+      </w:r>
+      <w:r>
+        <w:rPr>
+          <w:rFonts w:ascii="Verdana" w:hAnsi="Verdana"/>
+          <w:b/>
+          <w:sz w:val="48"/>
+        </w:rPr>
+        <w:t>]</w:t>
+      </w:r>
+    </w:p>
+    <w:p>
+      <w:pPr>
+        <w:pStyle w:val="NoSpacing"/>
+        <w:rPr>
+          <w:rFonts w:ascii="Verdana" w:hAnsi="Verdana"/>
+          <w:b/>
+          <w:color w:val="FFC000"/>
+          <w:sz w:val="48"/>
+        </w:rPr>
+      </w:pPr>
+      <w:r>
+        <w:rPr>
+          <w:rFonts w:ascii="Verdana" w:hAnsi="Verdana"/>
+          <w:b/>
+          <w:color w:val="FFC000"/>
+          <w:sz w:val="48"/>
+        </w:rPr>
+        <w:t>CHANGES:</w:t>
       </w:r>
     </w:p>
     <w:p>
@@ -538,7 +621,25 @@
           <w:sz w:val="32"/>
           <w:szCs w:val="32"/>
         </w:rPr>
-        <w:t>Credits added to the menu.</w:t>
+        <w:t xml:space="preserve">Solid object collision and in the fluid water effect are improved – use approximation of surroundings around the player rather than looping through the many solid objects. Less fps </w:t>
+      </w:r>
+      <w:proofErr w:type="gramStart"/>
+      <w:r>
+        <w:rPr>
+          <w:rFonts w:ascii="Verdana" w:hAnsi="Verdana"/>
+          <w:sz w:val="32"/>
+          <w:szCs w:val="32"/>
+        </w:rPr>
+        <w:t>drop</w:t>
+      </w:r>
+      <w:proofErr w:type="gramEnd"/>
+      <w:r>
+        <w:rPr>
+          <w:rFonts w:ascii="Verdana" w:hAnsi="Verdana"/>
+          <w:sz w:val="32"/>
+          <w:szCs w:val="32"/>
+        </w:rPr>
+        <w:t xml:space="preserve"> when in motion.</w:t>
       </w:r>
     </w:p>
     <w:p>
@@ -560,7 +661,369 @@
           <w:sz w:val="32"/>
           <w:szCs w:val="32"/>
         </w:rPr>
+        <w:t>Rework on the fog – fog is everywhere existent and all the objects blend in.</w:t>
+      </w:r>
+    </w:p>
+    <w:p>
+      <w:pPr>
+        <w:pStyle w:val="NoSpacing"/>
+        <w:numPr>
+          <w:ilvl w:val="0"/>
+          <w:numId w:val="22"/>
+        </w:numPr>
+        <w:rPr>
+          <w:rFonts w:ascii="Verdana" w:hAnsi="Verdana"/>
+          <w:sz w:val="32"/>
+          <w:szCs w:val="32"/>
+        </w:rPr>
+      </w:pPr>
+      <w:r>
+        <w:rPr>
+          <w:rFonts w:ascii="Verdana" w:hAnsi="Verdana"/>
+          <w:sz w:val="32"/>
+          <w:szCs w:val="32"/>
+        </w:rPr>
+        <w:t>Random level generator rework – there is 4 type of preexisting levels for the same hardcoded seed.</w:t>
+      </w:r>
+      <w:r>
+        <w:rPr>
+          <w:rFonts w:ascii="Verdana" w:hAnsi="Verdana"/>
+          <w:sz w:val="32"/>
+          <w:szCs w:val="32"/>
+        </w:rPr>
+        <w:t xml:space="preserve"> Simplex noise is being used.</w:t>
+      </w:r>
+    </w:p>
+    <w:p>
+      <w:pPr>
+        <w:pStyle w:val="NoSpacing"/>
+        <w:numPr>
+          <w:ilvl w:val="0"/>
+          <w:numId w:val="22"/>
+        </w:numPr>
+        <w:rPr>
+          <w:rFonts w:ascii="Verdana" w:hAnsi="Verdana"/>
+          <w:sz w:val="32"/>
+          <w:szCs w:val="32"/>
+        </w:rPr>
+      </w:pPr>
+      <w:r>
+        <w:rPr>
+          <w:rFonts w:ascii="Verdana" w:hAnsi="Verdana"/>
+          <w:sz w:val="32"/>
+          <w:szCs w:val="32"/>
+        </w:rPr>
+        <w:t xml:space="preserve">General improvement in multiple </w:t>
+      </w:r>
+      <w:proofErr w:type="gramStart"/>
+      <w:r>
+        <w:rPr>
+          <w:rFonts w:ascii="Verdana" w:hAnsi="Verdana"/>
+          <w:sz w:val="32"/>
+          <w:szCs w:val="32"/>
+        </w:rPr>
+        <w:t>object</w:t>
+      </w:r>
+      <w:proofErr w:type="gramEnd"/>
+      <w:r>
+        <w:rPr>
+          <w:rFonts w:ascii="Verdana" w:hAnsi="Verdana"/>
+          <w:sz w:val="32"/>
+          <w:szCs w:val="32"/>
+        </w:rPr>
+        <w:t xml:space="preserve"> rendering without instancing (for the text rendering and for the old way of block rendering).</w:t>
+      </w:r>
+    </w:p>
+    <w:p>
+      <w:pPr>
+        <w:pStyle w:val="NoSpacing"/>
+        <w:numPr>
+          <w:ilvl w:val="0"/>
+          <w:numId w:val="22"/>
+        </w:numPr>
+        <w:rPr>
+          <w:rFonts w:ascii="Verdana" w:hAnsi="Verdana"/>
+          <w:sz w:val="32"/>
+          <w:szCs w:val="32"/>
+        </w:rPr>
+      </w:pPr>
+      <w:r>
+        <w:rPr>
+          <w:rFonts w:ascii="Verdana" w:hAnsi="Verdana"/>
+          <w:sz w:val="32"/>
+          <w:szCs w:val="32"/>
+        </w:rPr>
+        <w:t>Water effects (non-light, regular version only) are more realistic at low cost to performance (framerate).</w:t>
+      </w:r>
+    </w:p>
+    <w:p>
+      <w:pPr>
+        <w:pStyle w:val="NoSpacing"/>
+        <w:jc w:val="center"/>
+        <w:rPr>
+          <w:rFonts w:ascii="Verdana" w:hAnsi="Verdana"/>
+          <w:b/>
+          <w:sz w:val="48"/>
+        </w:rPr>
+      </w:pPr>
+    </w:p>
+    <w:p>
+      <w:pPr>
+        <w:pStyle w:val="NoSpacing"/>
+        <w:jc w:val="center"/>
+        <w:rPr>
+          <w:rFonts w:ascii="Verdana" w:hAnsi="Verdana"/>
+          <w:b/>
+          <w:sz w:val="48"/>
+        </w:rPr>
+      </w:pPr>
+    </w:p>
+    <w:p>
+      <w:pPr>
+        <w:pStyle w:val="NoSpacing"/>
+        <w:jc w:val="center"/>
+        <w:rPr>
+          <w:rFonts w:ascii="Verdana" w:hAnsi="Verdana"/>
+          <w:b/>
+          <w:sz w:val="48"/>
+        </w:rPr>
+      </w:pPr>
+    </w:p>
+    <w:p>
+      <w:pPr>
+        <w:pStyle w:val="NoSpacing"/>
+        <w:jc w:val="center"/>
+        <w:rPr>
+          <w:rFonts w:ascii="Verdana" w:hAnsi="Verdana"/>
+          <w:b/>
+          <w:sz w:val="48"/>
+        </w:rPr>
+      </w:pPr>
+    </w:p>
+    <w:p>
+      <w:pPr>
+        <w:pStyle w:val="NoSpacing"/>
+        <w:jc w:val="center"/>
+        <w:rPr>
+          <w:rFonts w:ascii="Verdana" w:hAnsi="Verdana"/>
+          <w:b/>
+          <w:sz w:val="48"/>
+        </w:rPr>
+      </w:pPr>
+    </w:p>
+    <w:p>
+      <w:pPr>
+        <w:pStyle w:val="NoSpacing"/>
+        <w:jc w:val="center"/>
+        <w:rPr>
+          <w:rFonts w:ascii="Verdana" w:hAnsi="Verdana"/>
+          <w:b/>
+          <w:sz w:val="48"/>
+        </w:rPr>
+      </w:pPr>
+    </w:p>
+    <w:p>
+      <w:pPr>
+        <w:pStyle w:val="NoSpacing"/>
+        <w:jc w:val="center"/>
+        <w:rPr>
+          <w:rFonts w:ascii="Verdana" w:hAnsi="Verdana"/>
+          <w:b/>
+          <w:sz w:val="48"/>
+        </w:rPr>
+      </w:pPr>
+    </w:p>
+    <w:p>
+      <w:pPr>
+        <w:pStyle w:val="NoSpacing"/>
+        <w:jc w:val="center"/>
+        <w:rPr>
+          <w:rFonts w:ascii="Verdana" w:hAnsi="Verdana"/>
+          <w:b/>
+          <w:sz w:val="48"/>
+        </w:rPr>
+      </w:pPr>
+    </w:p>
+    <w:p>
+      <w:pPr>
+        <w:pStyle w:val="NoSpacing"/>
+        <w:jc w:val="center"/>
+        <w:rPr>
+          <w:rFonts w:ascii="Verdana" w:hAnsi="Verdana"/>
+          <w:b/>
+          <w:sz w:val="48"/>
+        </w:rPr>
+      </w:pPr>
+    </w:p>
+    <w:p>
+      <w:pPr>
+        <w:pStyle w:val="NoSpacing"/>
+        <w:jc w:val="center"/>
+        <w:rPr>
+          <w:rFonts w:ascii="Verdana" w:hAnsi="Verdana"/>
+          <w:b/>
+          <w:sz w:val="48"/>
+        </w:rPr>
+      </w:pPr>
+    </w:p>
+    <w:p>
+      <w:pPr>
+        <w:pStyle w:val="NoSpacing"/>
+        <w:jc w:val="center"/>
+        <w:rPr>
+          <w:rFonts w:ascii="Verdana" w:hAnsi="Verdana"/>
+          <w:b/>
+          <w:sz w:val="48"/>
+        </w:rPr>
+      </w:pPr>
+    </w:p>
+    <w:p>
+      <w:pPr>
+        <w:pStyle w:val="NoSpacing"/>
+        <w:jc w:val="center"/>
+        <w:rPr>
+          <w:rFonts w:ascii="Verdana" w:hAnsi="Verdana"/>
+          <w:b/>
+          <w:sz w:val="48"/>
+        </w:rPr>
+      </w:pPr>
+    </w:p>
+    <w:p>
+      <w:pPr>
+        <w:pStyle w:val="NoSpacing"/>
+        <w:jc w:val="center"/>
+        <w:rPr>
+          <w:rFonts w:ascii="Verdana" w:hAnsi="Verdana"/>
+          <w:b/>
+          <w:sz w:val="48"/>
+        </w:rPr>
+      </w:pPr>
+      <w:r>
+        <w:rPr>
+          <w:rFonts w:ascii="Verdana" w:hAnsi="Verdana"/>
+          <w:b/>
+          <w:sz w:val="48"/>
+        </w:rPr>
+        <w:lastRenderedPageBreak/>
+        <w:t xml:space="preserve"> </w:t>
+      </w:r>
+      <w:r>
+        <w:rPr>
+          <w:rFonts w:ascii="Verdana" w:hAnsi="Verdana"/>
+          <w:b/>
+          <w:sz w:val="48"/>
+        </w:rPr>
+        <w:t>[</w:t>
+      </w:r>
+      <w:r>
+        <w:rPr>
+          <w:rFonts w:ascii="Verdana" w:hAnsi="Verdana"/>
+          <w:b/>
+          <w:sz w:val="48"/>
+        </w:rPr>
+        <w:t>WARDEN</w:t>
+      </w:r>
+      <w:r>
+        <w:rPr>
+          <w:rFonts w:ascii="Verdana" w:hAnsi="Verdana"/>
+          <w:b/>
+          <w:sz w:val="48"/>
+        </w:rPr>
+        <w:t>]</w:t>
+      </w:r>
+    </w:p>
+    <w:p>
+      <w:pPr>
+        <w:pStyle w:val="NoSpacing"/>
+        <w:rPr>
+          <w:rFonts w:ascii="Verdana" w:hAnsi="Verdana"/>
+          <w:b/>
+          <w:color w:val="00B050"/>
+          <w:sz w:val="48"/>
+        </w:rPr>
+      </w:pPr>
+      <w:r>
+        <w:rPr>
+          <w:rFonts w:ascii="Verdana" w:hAnsi="Verdana"/>
+          <w:b/>
+          <w:color w:val="00B050"/>
+          <w:sz w:val="48"/>
+        </w:rPr>
+        <w:t>FEATURES:</w:t>
+      </w:r>
+    </w:p>
+    <w:p>
+      <w:pPr>
+        <w:pStyle w:val="NoSpacing"/>
+        <w:numPr>
+          <w:ilvl w:val="0"/>
+          <w:numId w:val="22"/>
+        </w:numPr>
+        <w:rPr>
+          <w:rFonts w:ascii="Verdana" w:hAnsi="Verdana"/>
+          <w:sz w:val="32"/>
+          <w:szCs w:val="32"/>
+        </w:rPr>
+      </w:pPr>
+      <w:r>
+        <w:rPr>
+          <w:rFonts w:ascii="Verdana" w:hAnsi="Verdana"/>
+          <w:sz w:val="32"/>
+          <w:szCs w:val="32"/>
+        </w:rPr>
+        <w:t>More ambient tracks &amp; new track when level is randomly generated.</w:t>
+      </w:r>
+    </w:p>
+    <w:p>
+      <w:pPr>
+        <w:pStyle w:val="NoSpacing"/>
+        <w:numPr>
+          <w:ilvl w:val="0"/>
+          <w:numId w:val="22"/>
+        </w:numPr>
+        <w:rPr>
+          <w:rFonts w:ascii="Verdana" w:hAnsi="Verdana"/>
+          <w:sz w:val="32"/>
+          <w:szCs w:val="32"/>
+        </w:rPr>
+      </w:pPr>
+      <w:r>
+        <w:rPr>
+          <w:rFonts w:ascii="Verdana" w:hAnsi="Verdana"/>
+          <w:sz w:val="32"/>
+          <w:szCs w:val="32"/>
+        </w:rPr>
+        <w:t>Credits added to the menu.</w:t>
+      </w:r>
+    </w:p>
+    <w:p>
+      <w:pPr>
+        <w:pStyle w:val="NoSpacing"/>
+        <w:numPr>
+          <w:ilvl w:val="0"/>
+          <w:numId w:val="22"/>
+        </w:numPr>
+        <w:rPr>
+          <w:rFonts w:ascii="Verdana" w:hAnsi="Verdana"/>
+          <w:sz w:val="32"/>
+          <w:szCs w:val="32"/>
+        </w:rPr>
+      </w:pPr>
+      <w:r>
+        <w:rPr>
+          <w:rFonts w:ascii="Verdana" w:hAnsi="Verdana"/>
+          <w:sz w:val="32"/>
+          <w:szCs w:val="32"/>
+        </w:rPr>
         <w:t>Auto-complete for commands.</w:t>
+      </w:r>
+      <w:r>
+        <w:rPr>
+          <w:rFonts w:ascii="Verdana" w:hAnsi="Verdana"/>
+          <w:sz w:val="32"/>
+          <w:szCs w:val="32"/>
+        </w:rPr>
+        <w:t xml:space="preserve"> [HellBlade64]</w:t>
       </w:r>
     </w:p>
     <w:p>
@@ -9482,6 +9945,7 @@
     <w:rsid w:val="00A823C9"/>
     <w:rsid w:val="00AF7112"/>
     <w:rsid w:val="00C9469B"/>
+    <w:rsid w:val="00CB1CDF"/>
     <w:rsid w:val="00CF0582"/>
     <w:rsid w:val="00DC2C91"/>
     <w:rsid w:val="00E3698B"/>
@@ -10195,7 +10659,7 @@
 </file>
 
 <file path=customXml/itemProps1.xml><?xml version="1.0" encoding="utf-8"?>
-<ds:datastoreItem xmlns:ds="http://schemas.openxmlformats.org/officeDocument/2006/customXml" ds:itemID="{7B3D44FD-E489-40E0-B7BE-B46CB235217E}">
+<ds:datastoreItem xmlns:ds="http://schemas.openxmlformats.org/officeDocument/2006/customXml" ds:itemID="{ED042A52-A84C-4917-9272-CEA89D851CE1}">
   <ds:schemaRefs>
     <ds:schemaRef ds:uri="http://schemas.openxmlformats.org/officeDocument/2006/bibliography"/>
   </ds:schemaRefs>

</xml_diff>

<commit_message>
Chunk func & org fix. Random Level Generator fix. For V25 ZEN!
</commit_message>
<xml_diff>
--- a/changelog.docx
+++ b/changelog.docx
@@ -295,37 +295,6 @@
     <w:p>
       <w:pPr>
         <w:pStyle w:val="NoSpacing"/>
-        <w:ind w:left="360"/>
-        <w:rPr>
-          <w:rFonts w:ascii="Verdana" w:hAnsi="Verdana"/>
-          <w:b/>
-          <w:sz w:val="48"/>
-        </w:rPr>
-      </w:pPr>
-    </w:p>
-    <w:p>
-      <w:pPr>
-        <w:pStyle w:val="NoSpacing"/>
-        <w:rPr>
-          <w:rFonts w:ascii="Verdana" w:hAnsi="Verdana"/>
-          <w:b/>
-          <w:color w:val="FF0000"/>
-          <w:sz w:val="48"/>
-        </w:rPr>
-      </w:pPr>
-      <w:r>
-        <w:rPr>
-          <w:rFonts w:ascii="Verdana" w:hAnsi="Verdana"/>
-          <w:b/>
-          <w:color w:val="FF0000"/>
-          <w:sz w:val="48"/>
-        </w:rPr>
-        <w:t>FIXES:</w:t>
-      </w:r>
-    </w:p>
-    <w:p>
-      <w:pPr>
-        <w:pStyle w:val="NoSpacing"/>
         <w:numPr>
           <w:ilvl w:val="0"/>
           <w:numId w:val="22"/>
@@ -336,13 +305,14 @@
           <w:sz w:val="48"/>
         </w:rPr>
       </w:pPr>
-      <w:r>
-        <w:rPr>
-          <w:rFonts w:ascii="Verdana" w:hAnsi="Verdana"/>
-          <w:sz w:val="32"/>
-          <w:szCs w:val="32"/>
-        </w:rPr>
-        <w:t>Block operations (level loading, random level generating…) are faster.</w:t>
+      <w:bookmarkStart w:id="0" w:name="_Hlk97949595"/>
+      <w:r>
+        <w:rPr>
+          <w:rFonts w:ascii="Verdana" w:hAnsi="Verdana"/>
+          <w:sz w:val="32"/>
+          <w:szCs w:val="32"/>
+        </w:rPr>
+        <w:t>Reworked chunk function and chunk organization.</w:t>
       </w:r>
     </w:p>
     <w:p>
@@ -364,7 +334,39 @@
           <w:sz w:val="32"/>
           <w:szCs w:val="32"/>
         </w:rPr>
-        <w:t>Fixed block bleeding (water bleeding through the solid blocks).</w:t>
+        <w:t>Reworked Random Level Generator.</w:t>
+      </w:r>
+    </w:p>
+    <w:bookmarkEnd w:id="0"/>
+    <w:p>
+      <w:pPr>
+        <w:pStyle w:val="NoSpacing"/>
+        <w:ind w:left="360"/>
+        <w:rPr>
+          <w:rFonts w:ascii="Verdana" w:hAnsi="Verdana"/>
+          <w:b/>
+          <w:sz w:val="48"/>
+        </w:rPr>
+      </w:pPr>
+    </w:p>
+    <w:p>
+      <w:pPr>
+        <w:pStyle w:val="NoSpacing"/>
+        <w:rPr>
+          <w:rFonts w:ascii="Verdana" w:hAnsi="Verdana"/>
+          <w:b/>
+          <w:color w:val="FF0000"/>
+          <w:sz w:val="48"/>
+        </w:rPr>
+      </w:pPr>
+      <w:r>
+        <w:rPr>
+          <w:rFonts w:ascii="Verdana" w:hAnsi="Verdana"/>
+          <w:b/>
+          <w:color w:val="FF0000"/>
+          <w:sz w:val="48"/>
+        </w:rPr>
+        <w:t>FIXES:</w:t>
       </w:r>
     </w:p>
     <w:p>
@@ -386,145 +388,7 @@
           <w:sz w:val="32"/>
           <w:szCs w:val="32"/>
         </w:rPr>
-        <w:t>Block removal updates adjacent blocks faces correctly</w:t>
-      </w:r>
-      <w:r>
-        <w:rPr>
-          <w:rFonts w:ascii="Verdana" w:hAnsi="Verdana"/>
-          <w:sz w:val="32"/>
-          <w:szCs w:val="32"/>
-        </w:rPr>
-        <w:t xml:space="preserve"> (Editor)</w:t>
-      </w:r>
-      <w:r>
-        <w:rPr>
-          <w:rFonts w:ascii="Verdana" w:hAnsi="Verdana"/>
-          <w:sz w:val="32"/>
-          <w:szCs w:val="32"/>
-        </w:rPr>
-        <w:t>.</w:t>
-      </w:r>
-    </w:p>
-    <w:p>
-      <w:pPr>
-        <w:pStyle w:val="NoSpacing"/>
-        <w:rPr>
-          <w:rFonts w:ascii="Verdana" w:hAnsi="Verdana"/>
-          <w:b/>
-          <w:color w:val="FF0000"/>
-          <w:sz w:val="48"/>
-        </w:rPr>
-      </w:pPr>
-    </w:p>
-    <w:p>
-      <w:pPr>
-        <w:pStyle w:val="NoSpacing"/>
-        <w:jc w:val="center"/>
-        <w:rPr>
-          <w:rFonts w:ascii="Verdana" w:hAnsi="Verdana"/>
-          <w:b/>
-          <w:sz w:val="48"/>
-        </w:rPr>
-      </w:pPr>
-    </w:p>
-    <w:p>
-      <w:pPr>
-        <w:pStyle w:val="NoSpacing"/>
-        <w:jc w:val="center"/>
-        <w:rPr>
-          <w:rFonts w:ascii="Verdana" w:hAnsi="Verdana"/>
-          <w:b/>
-          <w:sz w:val="48"/>
-        </w:rPr>
-      </w:pPr>
-    </w:p>
-    <w:p>
-      <w:pPr>
-        <w:pStyle w:val="NoSpacing"/>
-        <w:jc w:val="center"/>
-        <w:rPr>
-          <w:rFonts w:ascii="Verdana" w:hAnsi="Verdana"/>
-          <w:b/>
-          <w:sz w:val="48"/>
-        </w:rPr>
-      </w:pPr>
-    </w:p>
-    <w:p>
-      <w:pPr>
-        <w:pStyle w:val="NoSpacing"/>
-        <w:jc w:val="center"/>
-        <w:rPr>
-          <w:rFonts w:ascii="Verdana" w:hAnsi="Verdana"/>
-          <w:b/>
-          <w:sz w:val="48"/>
-        </w:rPr>
-      </w:pPr>
-    </w:p>
-    <w:p>
-      <w:pPr>
-        <w:pStyle w:val="NoSpacing"/>
-        <w:jc w:val="center"/>
-        <w:rPr>
-          <w:rFonts w:ascii="Verdana" w:hAnsi="Verdana"/>
-          <w:b/>
-          <w:sz w:val="48"/>
-        </w:rPr>
-      </w:pPr>
-    </w:p>
-    <w:p>
-      <w:pPr>
-        <w:pStyle w:val="NoSpacing"/>
-        <w:jc w:val="center"/>
-        <w:rPr>
-          <w:rFonts w:ascii="Verdana" w:hAnsi="Verdana"/>
-          <w:b/>
-          <w:sz w:val="48"/>
-        </w:rPr>
-      </w:pPr>
-      <w:r>
-        <w:rPr>
-          <w:rFonts w:ascii="Verdana" w:hAnsi="Verdana"/>
-          <w:b/>
-          <w:sz w:val="48"/>
-        </w:rPr>
-        <w:lastRenderedPageBreak/>
-        <w:t>[</w:t>
-      </w:r>
-      <w:r>
-        <w:rPr>
-          <w:rFonts w:ascii="Verdana" w:hAnsi="Verdana"/>
-          <w:b/>
-          <w:sz w:val="48"/>
-        </w:rPr>
-        <w:t>YEOMEN</w:t>
-      </w:r>
-      <w:r>
-        <w:rPr>
-          <w:rFonts w:ascii="Verdana" w:hAnsi="Verdana"/>
-          <w:b/>
-          <w:sz w:val="48"/>
-        </w:rPr>
-        <w:t>]</w:t>
-      </w:r>
-    </w:p>
-    <w:p>
-      <w:pPr>
-        <w:pStyle w:val="NoSpacing"/>
-        <w:rPr>
-          <w:rFonts w:ascii="Verdana" w:hAnsi="Verdana"/>
-          <w:b/>
-          <w:color w:val="00B050"/>
-          <w:sz w:val="48"/>
-        </w:rPr>
-      </w:pPr>
-      <w:r>
-        <w:rPr>
-          <w:rFonts w:ascii="Verdana" w:hAnsi="Verdana"/>
-          <w:b/>
-          <w:color w:val="00B050"/>
-          <w:sz w:val="48"/>
-        </w:rPr>
-        <w:t>FEATURES:</w:t>
+        <w:t>Block operations (level loading, random level generating…) are faster.</w:t>
       </w:r>
     </w:p>
     <w:p>
@@ -536,17 +400,17 @@
         </w:numPr>
         <w:rPr>
           <w:rFonts w:ascii="Verdana" w:hAnsi="Verdana"/>
-          <w:sz w:val="32"/>
-          <w:szCs w:val="32"/>
-        </w:rPr>
-      </w:pPr>
-      <w:r>
-        <w:rPr>
-          <w:rFonts w:ascii="Verdana" w:hAnsi="Verdana"/>
-          <w:sz w:val="32"/>
-          <w:szCs w:val="32"/>
-        </w:rPr>
-        <w:t>Texture atlases implemented with aim to consume less video card memory and improve performance.</w:t>
+          <w:b/>
+          <w:sz w:val="48"/>
+        </w:rPr>
+      </w:pPr>
+      <w:r>
+        <w:rPr>
+          <w:rFonts w:ascii="Verdana" w:hAnsi="Verdana"/>
+          <w:sz w:val="32"/>
+          <w:szCs w:val="32"/>
+        </w:rPr>
+        <w:t>Fixed block bleeding (water bleeding through the solid blocks).</w:t>
       </w:r>
     </w:p>
     <w:p>
@@ -558,17 +422,33 @@
         </w:numPr>
         <w:rPr>
           <w:rFonts w:ascii="Verdana" w:hAnsi="Verdana"/>
-          <w:sz w:val="32"/>
-          <w:szCs w:val="32"/>
-        </w:rPr>
-      </w:pPr>
-      <w:r>
-        <w:rPr>
-          <w:rFonts w:ascii="Verdana" w:hAnsi="Verdana"/>
-          <w:sz w:val="32"/>
-          <w:szCs w:val="32"/>
-        </w:rPr>
-        <w:t>Get feature for console commands. Writing command without arguments gets its value.</w:t>
+          <w:b/>
+          <w:sz w:val="48"/>
+        </w:rPr>
+      </w:pPr>
+      <w:r>
+        <w:rPr>
+          <w:rFonts w:ascii="Verdana" w:hAnsi="Verdana"/>
+          <w:sz w:val="32"/>
+          <w:szCs w:val="32"/>
+        </w:rPr>
+        <w:t>Block removal updates adjacent blocks faces correctly</w:t>
+      </w:r>
+      <w:r>
+        <w:rPr>
+          <w:rFonts w:ascii="Verdana" w:hAnsi="Verdana"/>
+          <w:sz w:val="32"/>
+          <w:szCs w:val="32"/>
+        </w:rPr>
+        <w:t xml:space="preserve"> (Editor)</w:t>
+      </w:r>
+      <w:r>
+        <w:rPr>
+          <w:rFonts w:ascii="Verdana" w:hAnsi="Verdana"/>
+          <w:sz w:val="32"/>
+          <w:szCs w:val="32"/>
+        </w:rPr>
+        <w:t>.</w:t>
       </w:r>
     </w:p>
     <w:p>
@@ -580,25 +460,138 @@
         </w:numPr>
         <w:rPr>
           <w:rFonts w:ascii="Verdana" w:hAnsi="Verdana"/>
-          <w:sz w:val="32"/>
-          <w:szCs w:val="32"/>
-        </w:rPr>
-      </w:pPr>
-      <w:r>
-        <w:rPr>
-          <w:rFonts w:ascii="Verdana" w:hAnsi="Verdana"/>
-          <w:sz w:val="32"/>
-          <w:szCs w:val="32"/>
-        </w:rPr>
-        <w:t>Texture size can be changed from the .ini. (Default 512, max is 4096).</w:t>
-      </w:r>
-      <w:r>
-        <w:rPr>
-          <w:rFonts w:ascii="Verdana" w:hAnsi="Verdana"/>
-          <w:sz w:val="32"/>
-          <w:szCs w:val="32"/>
-        </w:rPr>
-        <w:t xml:space="preserve"> </w:t>
+          <w:b/>
+          <w:sz w:val="48"/>
+        </w:rPr>
+      </w:pPr>
+      <w:r>
+        <w:rPr>
+          <w:rFonts w:ascii="Verdana" w:hAnsi="Verdana"/>
+          <w:sz w:val="32"/>
+          <w:szCs w:val="32"/>
+        </w:rPr>
+        <w:t>Fixed crashes when light block being added (original only).</w:t>
+      </w:r>
+    </w:p>
+    <w:p>
+      <w:pPr>
+        <w:pStyle w:val="NoSpacing"/>
+        <w:rPr>
+          <w:rFonts w:ascii="Verdana" w:hAnsi="Verdana"/>
+          <w:b/>
+          <w:color w:val="FF0000"/>
+          <w:sz w:val="48"/>
+        </w:rPr>
+      </w:pPr>
+    </w:p>
+    <w:p>
+      <w:pPr>
+        <w:pStyle w:val="NoSpacing"/>
+        <w:jc w:val="center"/>
+        <w:rPr>
+          <w:rFonts w:ascii="Verdana" w:hAnsi="Verdana"/>
+          <w:b/>
+          <w:sz w:val="48"/>
+        </w:rPr>
+      </w:pPr>
+    </w:p>
+    <w:p>
+      <w:pPr>
+        <w:pStyle w:val="NoSpacing"/>
+        <w:jc w:val="center"/>
+        <w:rPr>
+          <w:rFonts w:ascii="Verdana" w:hAnsi="Verdana"/>
+          <w:b/>
+          <w:sz w:val="48"/>
+        </w:rPr>
+      </w:pPr>
+    </w:p>
+    <w:p>
+      <w:pPr>
+        <w:pStyle w:val="NoSpacing"/>
+        <w:jc w:val="center"/>
+        <w:rPr>
+          <w:rFonts w:ascii="Verdana" w:hAnsi="Verdana"/>
+          <w:b/>
+          <w:sz w:val="48"/>
+        </w:rPr>
+      </w:pPr>
+    </w:p>
+    <w:p>
+      <w:pPr>
+        <w:pStyle w:val="NoSpacing"/>
+        <w:jc w:val="center"/>
+        <w:rPr>
+          <w:rFonts w:ascii="Verdana" w:hAnsi="Verdana"/>
+          <w:b/>
+          <w:sz w:val="48"/>
+        </w:rPr>
+      </w:pPr>
+    </w:p>
+    <w:p>
+      <w:pPr>
+        <w:pStyle w:val="NoSpacing"/>
+        <w:jc w:val="center"/>
+        <w:rPr>
+          <w:rFonts w:ascii="Verdana" w:hAnsi="Verdana"/>
+          <w:b/>
+          <w:sz w:val="48"/>
+        </w:rPr>
+      </w:pPr>
+    </w:p>
+    <w:p>
+      <w:pPr>
+        <w:pStyle w:val="NoSpacing"/>
+        <w:jc w:val="center"/>
+        <w:rPr>
+          <w:rFonts w:ascii="Verdana" w:hAnsi="Verdana"/>
+          <w:b/>
+          <w:sz w:val="48"/>
+        </w:rPr>
+      </w:pPr>
+      <w:r>
+        <w:rPr>
+          <w:rFonts w:ascii="Verdana" w:hAnsi="Verdana"/>
+          <w:b/>
+          <w:sz w:val="48"/>
+        </w:rPr>
+        <w:t>[</w:t>
+      </w:r>
+      <w:r>
+        <w:rPr>
+          <w:rFonts w:ascii="Verdana" w:hAnsi="Verdana"/>
+          <w:b/>
+          <w:sz w:val="48"/>
+        </w:rPr>
+        <w:t>YEOMEN</w:t>
+      </w:r>
+      <w:r>
+        <w:rPr>
+          <w:rFonts w:ascii="Verdana" w:hAnsi="Verdana"/>
+          <w:b/>
+          <w:sz w:val="48"/>
+        </w:rPr>
+        <w:t>]</w:t>
+      </w:r>
+    </w:p>
+    <w:p>
+      <w:pPr>
+        <w:pStyle w:val="NoSpacing"/>
+        <w:rPr>
+          <w:rFonts w:ascii="Verdana" w:hAnsi="Verdana"/>
+          <w:b/>
+          <w:color w:val="00B050"/>
+          <w:sz w:val="48"/>
+        </w:rPr>
+      </w:pPr>
+      <w:r>
+        <w:rPr>
+          <w:rFonts w:ascii="Verdana" w:hAnsi="Verdana"/>
+          <w:b/>
+          <w:color w:val="00B050"/>
+          <w:sz w:val="48"/>
+        </w:rPr>
+        <w:t>FEATURES:</w:t>
       </w:r>
     </w:p>
     <w:p>
@@ -620,7 +613,7 @@
           <w:sz w:val="32"/>
           <w:szCs w:val="32"/>
         </w:rPr>
-        <w:t>Implemented to work with more light sources.</w:t>
+        <w:t>Texture atlases implemented with aim to consume less video card memory and improve performance.</w:t>
       </w:r>
     </w:p>
     <w:p>
@@ -642,46 +635,7 @@
           <w:sz w:val="32"/>
           <w:szCs w:val="32"/>
         </w:rPr>
-        <w:t>Dynamic size can be changed from the .ini (Default for blocks 250, for text 25, available only in regular version).</w:t>
-      </w:r>
-      <w:r>
-        <w:rPr>
-          <w:rFonts w:ascii="Verdana" w:hAnsi="Verdana"/>
-          <w:sz w:val="32"/>
-          <w:szCs w:val="32"/>
-        </w:rPr>
-        <w:t xml:space="preserve"> [HellBlade64]</w:t>
-      </w:r>
-    </w:p>
-    <w:p>
-      <w:pPr>
-        <w:pStyle w:val="NoSpacing"/>
-        <w:rPr>
-          <w:rFonts w:ascii="Verdana" w:hAnsi="Verdana"/>
-          <w:b/>
-          <w:color w:val="FFC000"/>
-          <w:sz w:val="48"/>
-        </w:rPr>
-      </w:pPr>
-    </w:p>
-    <w:p>
-      <w:pPr>
-        <w:pStyle w:val="NoSpacing"/>
-        <w:rPr>
-          <w:rFonts w:ascii="Verdana" w:hAnsi="Verdana"/>
-          <w:b/>
-          <w:color w:val="FFC000"/>
-          <w:sz w:val="48"/>
-        </w:rPr>
-      </w:pPr>
-      <w:r>
-        <w:rPr>
-          <w:rFonts w:ascii="Verdana" w:hAnsi="Verdana"/>
-          <w:b/>
-          <w:color w:val="FFC000"/>
-          <w:sz w:val="48"/>
-        </w:rPr>
-        <w:t>CHANGES:</w:t>
+        <w:t>Get feature for console commands. Writing command without arguments gets its value.</w:t>
       </w:r>
     </w:p>
     <w:p>
@@ -703,15 +657,15 @@
           <w:sz w:val="32"/>
           <w:szCs w:val="32"/>
         </w:rPr>
-        <w:t>Font reworked and changed</w:t>
-      </w:r>
-      <w:r>
-        <w:rPr>
-          <w:rFonts w:ascii="Verdana" w:hAnsi="Verdana"/>
-          <w:sz w:val="32"/>
-          <w:szCs w:val="32"/>
-        </w:rPr>
-        <w:t>.</w:t>
+        <w:t>Texture size can be changed from the .ini. (Default 512, max is 4096).</w:t>
+      </w:r>
+      <w:r>
+        <w:rPr>
+          <w:rFonts w:ascii="Verdana" w:hAnsi="Verdana"/>
+          <w:sz w:val="32"/>
+          <w:szCs w:val="32"/>
+        </w:rPr>
+        <w:t xml:space="preserve"> </w:t>
       </w:r>
     </w:p>
     <w:p>
@@ -733,200 +687,7 @@
           <w:sz w:val="32"/>
           <w:szCs w:val="32"/>
         </w:rPr>
-        <w:t xml:space="preserve">Hashcode reworked so lesser invisible blocks </w:t>
-      </w:r>
-      <w:r>
-        <w:rPr>
-          <w:rFonts w:ascii="Verdana" w:hAnsi="Verdana"/>
-          <w:sz w:val="32"/>
-          <w:szCs w:val="32"/>
-        </w:rPr>
-        <w:t xml:space="preserve">colliding </w:t>
-      </w:r>
-      <w:r>
-        <w:rPr>
-          <w:rFonts w:ascii="Verdana" w:hAnsi="Verdana"/>
-          <w:sz w:val="32"/>
-          <w:szCs w:val="32"/>
-        </w:rPr>
-        <w:t>bug [JSomnia]</w:t>
-      </w:r>
-    </w:p>
-    <w:p>
-      <w:pPr>
-        <w:pStyle w:val="NoSpacing"/>
-        <w:jc w:val="center"/>
-        <w:rPr>
-          <w:rFonts w:ascii="Verdana" w:hAnsi="Verdana"/>
-          <w:b/>
-          <w:sz w:val="48"/>
-        </w:rPr>
-      </w:pPr>
-    </w:p>
-    <w:p>
-      <w:pPr>
-        <w:pStyle w:val="NoSpacing"/>
-        <w:jc w:val="center"/>
-        <w:rPr>
-          <w:rFonts w:ascii="Verdana" w:hAnsi="Verdana"/>
-          <w:b/>
-          <w:sz w:val="48"/>
-        </w:rPr>
-      </w:pPr>
-    </w:p>
-    <w:p>
-      <w:pPr>
-        <w:pStyle w:val="NoSpacing"/>
-        <w:jc w:val="center"/>
-        <w:rPr>
-          <w:rFonts w:ascii="Verdana" w:hAnsi="Verdana"/>
-          <w:b/>
-          <w:sz w:val="48"/>
-        </w:rPr>
-      </w:pPr>
-    </w:p>
-    <w:p>
-      <w:pPr>
-        <w:pStyle w:val="NoSpacing"/>
-        <w:jc w:val="center"/>
-        <w:rPr>
-          <w:rFonts w:ascii="Verdana" w:hAnsi="Verdana"/>
-          <w:b/>
-          <w:sz w:val="48"/>
-        </w:rPr>
-      </w:pPr>
-    </w:p>
-    <w:p>
-      <w:pPr>
-        <w:pStyle w:val="NoSpacing"/>
-        <w:jc w:val="center"/>
-        <w:rPr>
-          <w:rFonts w:ascii="Verdana" w:hAnsi="Verdana"/>
-          <w:b/>
-          <w:sz w:val="48"/>
-        </w:rPr>
-      </w:pPr>
-    </w:p>
-    <w:p>
-      <w:pPr>
-        <w:pStyle w:val="NoSpacing"/>
-        <w:jc w:val="center"/>
-        <w:rPr>
-          <w:rFonts w:ascii="Verdana" w:hAnsi="Verdana"/>
-          <w:b/>
-          <w:sz w:val="48"/>
-        </w:rPr>
-      </w:pPr>
-    </w:p>
-    <w:p>
-      <w:pPr>
-        <w:pStyle w:val="NoSpacing"/>
-        <w:jc w:val="center"/>
-        <w:rPr>
-          <w:rFonts w:ascii="Verdana" w:hAnsi="Verdana"/>
-          <w:b/>
-          <w:sz w:val="48"/>
-        </w:rPr>
-      </w:pPr>
-    </w:p>
-    <w:p>
-      <w:pPr>
-        <w:pStyle w:val="NoSpacing"/>
-        <w:jc w:val="center"/>
-        <w:rPr>
-          <w:rFonts w:ascii="Verdana" w:hAnsi="Verdana"/>
-          <w:b/>
-          <w:sz w:val="48"/>
-        </w:rPr>
-      </w:pPr>
-    </w:p>
-    <w:p>
-      <w:pPr>
-        <w:pStyle w:val="NoSpacing"/>
-        <w:jc w:val="center"/>
-        <w:rPr>
-          <w:rFonts w:ascii="Verdana" w:hAnsi="Verdana"/>
-          <w:b/>
-          <w:sz w:val="48"/>
-        </w:rPr>
-      </w:pPr>
-    </w:p>
-    <w:p>
-      <w:pPr>
-        <w:pStyle w:val="NoSpacing"/>
-        <w:jc w:val="center"/>
-        <w:rPr>
-          <w:rFonts w:ascii="Verdana" w:hAnsi="Verdana"/>
-          <w:b/>
-          <w:sz w:val="48"/>
-        </w:rPr>
-      </w:pPr>
-    </w:p>
-    <w:p>
-      <w:pPr>
-        <w:pStyle w:val="NoSpacing"/>
-        <w:jc w:val="center"/>
-        <w:rPr>
-          <w:rFonts w:ascii="Verdana" w:hAnsi="Verdana"/>
-          <w:b/>
-          <w:sz w:val="48"/>
-        </w:rPr>
-      </w:pPr>
-    </w:p>
-    <w:p>
-      <w:pPr>
-        <w:pStyle w:val="NoSpacing"/>
-        <w:jc w:val="center"/>
-        <w:rPr>
-          <w:rFonts w:ascii="Verdana" w:hAnsi="Verdana"/>
-          <w:b/>
-          <w:sz w:val="48"/>
-        </w:rPr>
-      </w:pPr>
-      <w:r>
-        <w:rPr>
-          <w:rFonts w:ascii="Verdana" w:hAnsi="Verdana"/>
-          <w:b/>
-          <w:sz w:val="48"/>
-        </w:rPr>
-        <w:lastRenderedPageBreak/>
-        <w:t>[</w:t>
-      </w:r>
-      <w:r>
-        <w:rPr>
-          <w:rFonts w:ascii="Verdana" w:hAnsi="Verdana"/>
-          <w:b/>
-          <w:sz w:val="48"/>
-        </w:rPr>
-        <w:t>XENON</w:t>
-      </w:r>
-      <w:r>
-        <w:rPr>
-          <w:rFonts w:ascii="Verdana" w:hAnsi="Verdana"/>
-          <w:b/>
-          <w:sz w:val="48"/>
-        </w:rPr>
-        <w:t>]</w:t>
-      </w:r>
-    </w:p>
-    <w:p>
-      <w:pPr>
-        <w:pStyle w:val="NoSpacing"/>
-        <w:rPr>
-          <w:rFonts w:ascii="Verdana" w:hAnsi="Verdana"/>
-          <w:b/>
-          <w:color w:val="FFC000"/>
-          <w:sz w:val="48"/>
-        </w:rPr>
-      </w:pPr>
-      <w:r>
-        <w:rPr>
-          <w:rFonts w:ascii="Verdana" w:hAnsi="Verdana"/>
-          <w:b/>
-          <w:color w:val="FFC000"/>
-          <w:sz w:val="48"/>
-        </w:rPr>
-        <w:t>CHANGES:</w:t>
+        <w:t>Implemented to work with more light sources.</w:t>
       </w:r>
     </w:p>
     <w:p>
@@ -948,7 +709,46 @@
           <w:sz w:val="32"/>
           <w:szCs w:val="32"/>
         </w:rPr>
-        <w:t>Solid object collision and in the fluid water effect are improved – use approximation of surroundings around the player rather than looping through the many solid objects. Less fps drop when in motion.</w:t>
+        <w:t>Dynamic size can be changed from the .ini (Default for blocks 250, for text 25, available only in regular version).</w:t>
+      </w:r>
+      <w:r>
+        <w:rPr>
+          <w:rFonts w:ascii="Verdana" w:hAnsi="Verdana"/>
+          <w:sz w:val="32"/>
+          <w:szCs w:val="32"/>
+        </w:rPr>
+        <w:t xml:space="preserve"> [HellBlade64]</w:t>
+      </w:r>
+    </w:p>
+    <w:p>
+      <w:pPr>
+        <w:pStyle w:val="NoSpacing"/>
+        <w:rPr>
+          <w:rFonts w:ascii="Verdana" w:hAnsi="Verdana"/>
+          <w:b/>
+          <w:color w:val="FFC000"/>
+          <w:sz w:val="48"/>
+        </w:rPr>
+      </w:pPr>
+    </w:p>
+    <w:p>
+      <w:pPr>
+        <w:pStyle w:val="NoSpacing"/>
+        <w:rPr>
+          <w:rFonts w:ascii="Verdana" w:hAnsi="Verdana"/>
+          <w:b/>
+          <w:color w:val="FFC000"/>
+          <w:sz w:val="48"/>
+        </w:rPr>
+      </w:pPr>
+      <w:r>
+        <w:rPr>
+          <w:rFonts w:ascii="Verdana" w:hAnsi="Verdana"/>
+          <w:b/>
+          <w:color w:val="FFC000"/>
+          <w:sz w:val="48"/>
+        </w:rPr>
+        <w:t>CHANGES:</w:t>
       </w:r>
     </w:p>
     <w:p>
@@ -970,7 +770,15 @@
           <w:sz w:val="32"/>
           <w:szCs w:val="32"/>
         </w:rPr>
-        <w:t>Rework on the fog – fog is everywhere existent and all the objects blend in.</w:t>
+        <w:t>Font reworked and changed</w:t>
+      </w:r>
+      <w:r>
+        <w:rPr>
+          <w:rFonts w:ascii="Verdana" w:hAnsi="Verdana"/>
+          <w:sz w:val="32"/>
+          <w:szCs w:val="32"/>
+        </w:rPr>
+        <w:t>.</w:t>
       </w:r>
     </w:p>
     <w:p>
@@ -992,15 +800,199 @@
           <w:sz w:val="32"/>
           <w:szCs w:val="32"/>
         </w:rPr>
-        <w:t>Random level generator rework – there is 4 type of preexisting levels for the same hardcoded seed.</w:t>
-      </w:r>
-      <w:r>
-        <w:rPr>
-          <w:rFonts w:ascii="Verdana" w:hAnsi="Verdana"/>
-          <w:sz w:val="32"/>
-          <w:szCs w:val="32"/>
-        </w:rPr>
-        <w:t xml:space="preserve"> Simplex noise is being used.</w:t>
+        <w:t xml:space="preserve">Hashcode reworked so lesser invisible blocks </w:t>
+      </w:r>
+      <w:r>
+        <w:rPr>
+          <w:rFonts w:ascii="Verdana" w:hAnsi="Verdana"/>
+          <w:sz w:val="32"/>
+          <w:szCs w:val="32"/>
+        </w:rPr>
+        <w:t xml:space="preserve">colliding </w:t>
+      </w:r>
+      <w:r>
+        <w:rPr>
+          <w:rFonts w:ascii="Verdana" w:hAnsi="Verdana"/>
+          <w:sz w:val="32"/>
+          <w:szCs w:val="32"/>
+        </w:rPr>
+        <w:t>bug [JSomnia]</w:t>
+      </w:r>
+    </w:p>
+    <w:p>
+      <w:pPr>
+        <w:pStyle w:val="NoSpacing"/>
+        <w:jc w:val="center"/>
+        <w:rPr>
+          <w:rFonts w:ascii="Verdana" w:hAnsi="Verdana"/>
+          <w:b/>
+          <w:sz w:val="48"/>
+        </w:rPr>
+      </w:pPr>
+    </w:p>
+    <w:p>
+      <w:pPr>
+        <w:pStyle w:val="NoSpacing"/>
+        <w:jc w:val="center"/>
+        <w:rPr>
+          <w:rFonts w:ascii="Verdana" w:hAnsi="Verdana"/>
+          <w:b/>
+          <w:sz w:val="48"/>
+        </w:rPr>
+      </w:pPr>
+    </w:p>
+    <w:p>
+      <w:pPr>
+        <w:pStyle w:val="NoSpacing"/>
+        <w:jc w:val="center"/>
+        <w:rPr>
+          <w:rFonts w:ascii="Verdana" w:hAnsi="Verdana"/>
+          <w:b/>
+          <w:sz w:val="48"/>
+        </w:rPr>
+      </w:pPr>
+    </w:p>
+    <w:p>
+      <w:pPr>
+        <w:pStyle w:val="NoSpacing"/>
+        <w:jc w:val="center"/>
+        <w:rPr>
+          <w:rFonts w:ascii="Verdana" w:hAnsi="Verdana"/>
+          <w:b/>
+          <w:sz w:val="48"/>
+        </w:rPr>
+      </w:pPr>
+    </w:p>
+    <w:p>
+      <w:pPr>
+        <w:pStyle w:val="NoSpacing"/>
+        <w:jc w:val="center"/>
+        <w:rPr>
+          <w:rFonts w:ascii="Verdana" w:hAnsi="Verdana"/>
+          <w:b/>
+          <w:sz w:val="48"/>
+        </w:rPr>
+      </w:pPr>
+    </w:p>
+    <w:p>
+      <w:pPr>
+        <w:pStyle w:val="NoSpacing"/>
+        <w:jc w:val="center"/>
+        <w:rPr>
+          <w:rFonts w:ascii="Verdana" w:hAnsi="Verdana"/>
+          <w:b/>
+          <w:sz w:val="48"/>
+        </w:rPr>
+      </w:pPr>
+    </w:p>
+    <w:p>
+      <w:pPr>
+        <w:pStyle w:val="NoSpacing"/>
+        <w:jc w:val="center"/>
+        <w:rPr>
+          <w:rFonts w:ascii="Verdana" w:hAnsi="Verdana"/>
+          <w:b/>
+          <w:sz w:val="48"/>
+        </w:rPr>
+      </w:pPr>
+    </w:p>
+    <w:p>
+      <w:pPr>
+        <w:pStyle w:val="NoSpacing"/>
+        <w:jc w:val="center"/>
+        <w:rPr>
+          <w:rFonts w:ascii="Verdana" w:hAnsi="Verdana"/>
+          <w:b/>
+          <w:sz w:val="48"/>
+        </w:rPr>
+      </w:pPr>
+    </w:p>
+    <w:p>
+      <w:pPr>
+        <w:pStyle w:val="NoSpacing"/>
+        <w:jc w:val="center"/>
+        <w:rPr>
+          <w:rFonts w:ascii="Verdana" w:hAnsi="Verdana"/>
+          <w:b/>
+          <w:sz w:val="48"/>
+        </w:rPr>
+      </w:pPr>
+    </w:p>
+    <w:p>
+      <w:pPr>
+        <w:pStyle w:val="NoSpacing"/>
+        <w:jc w:val="center"/>
+        <w:rPr>
+          <w:rFonts w:ascii="Verdana" w:hAnsi="Verdana"/>
+          <w:b/>
+          <w:sz w:val="48"/>
+        </w:rPr>
+      </w:pPr>
+    </w:p>
+    <w:p>
+      <w:pPr>
+        <w:pStyle w:val="NoSpacing"/>
+        <w:jc w:val="center"/>
+        <w:rPr>
+          <w:rFonts w:ascii="Verdana" w:hAnsi="Verdana"/>
+          <w:b/>
+          <w:sz w:val="48"/>
+        </w:rPr>
+      </w:pPr>
+    </w:p>
+    <w:p>
+      <w:pPr>
+        <w:pStyle w:val="NoSpacing"/>
+        <w:jc w:val="center"/>
+        <w:rPr>
+          <w:rFonts w:ascii="Verdana" w:hAnsi="Verdana"/>
+          <w:b/>
+          <w:sz w:val="48"/>
+        </w:rPr>
+      </w:pPr>
+      <w:r>
+        <w:rPr>
+          <w:rFonts w:ascii="Verdana" w:hAnsi="Verdana"/>
+          <w:b/>
+          <w:sz w:val="48"/>
+        </w:rPr>
+        <w:t>[</w:t>
+      </w:r>
+      <w:r>
+        <w:rPr>
+          <w:rFonts w:ascii="Verdana" w:hAnsi="Verdana"/>
+          <w:b/>
+          <w:sz w:val="48"/>
+        </w:rPr>
+        <w:t>XENON</w:t>
+      </w:r>
+      <w:r>
+        <w:rPr>
+          <w:rFonts w:ascii="Verdana" w:hAnsi="Verdana"/>
+          <w:b/>
+          <w:sz w:val="48"/>
+        </w:rPr>
+        <w:t>]</w:t>
+      </w:r>
+    </w:p>
+    <w:p>
+      <w:pPr>
+        <w:pStyle w:val="NoSpacing"/>
+        <w:rPr>
+          <w:rFonts w:ascii="Verdana" w:hAnsi="Verdana"/>
+          <w:b/>
+          <w:color w:val="FFC000"/>
+          <w:sz w:val="48"/>
+        </w:rPr>
+      </w:pPr>
+      <w:r>
+        <w:rPr>
+          <w:rFonts w:ascii="Verdana" w:hAnsi="Verdana"/>
+          <w:b/>
+          <w:color w:val="FFC000"/>
+          <w:sz w:val="48"/>
+        </w:rPr>
+        <w:t>CHANGES:</w:t>
       </w:r>
     </w:p>
     <w:p>
@@ -1022,7 +1014,7 @@
           <w:sz w:val="32"/>
           <w:szCs w:val="32"/>
         </w:rPr>
-        <w:t>General improvement in multiple object rendering without instancing (for the text rendering and for the old way of block rendering).</w:t>
+        <w:t>Solid object collision and in the fluid water effect are improved – use approximation of surroundings around the player rather than looping through the many solid objects. Less fps drop when in motion.</w:t>
       </w:r>
     </w:p>
     <w:p>
@@ -1044,203 +1036,7 @@
           <w:sz w:val="32"/>
           <w:szCs w:val="32"/>
         </w:rPr>
-        <w:t>Water effects (non-light, regular version only) are more realistic at low cost to performance (framerate).</w:t>
-      </w:r>
-    </w:p>
-    <w:p>
-      <w:pPr>
-        <w:pStyle w:val="NoSpacing"/>
-        <w:jc w:val="center"/>
-        <w:rPr>
-          <w:rFonts w:ascii="Verdana" w:hAnsi="Verdana"/>
-          <w:b/>
-          <w:sz w:val="48"/>
-        </w:rPr>
-      </w:pPr>
-    </w:p>
-    <w:p>
-      <w:pPr>
-        <w:pStyle w:val="NoSpacing"/>
-        <w:jc w:val="center"/>
-        <w:rPr>
-          <w:rFonts w:ascii="Verdana" w:hAnsi="Verdana"/>
-          <w:b/>
-          <w:sz w:val="48"/>
-        </w:rPr>
-      </w:pPr>
-    </w:p>
-    <w:p>
-      <w:pPr>
-        <w:pStyle w:val="NoSpacing"/>
-        <w:jc w:val="center"/>
-        <w:rPr>
-          <w:rFonts w:ascii="Verdana" w:hAnsi="Verdana"/>
-          <w:b/>
-          <w:sz w:val="48"/>
-        </w:rPr>
-      </w:pPr>
-    </w:p>
-    <w:p>
-      <w:pPr>
-        <w:pStyle w:val="NoSpacing"/>
-        <w:jc w:val="center"/>
-        <w:rPr>
-          <w:rFonts w:ascii="Verdana" w:hAnsi="Verdana"/>
-          <w:b/>
-          <w:sz w:val="48"/>
-        </w:rPr>
-      </w:pPr>
-    </w:p>
-    <w:p>
-      <w:pPr>
-        <w:pStyle w:val="NoSpacing"/>
-        <w:jc w:val="center"/>
-        <w:rPr>
-          <w:rFonts w:ascii="Verdana" w:hAnsi="Verdana"/>
-          <w:b/>
-          <w:sz w:val="48"/>
-        </w:rPr>
-      </w:pPr>
-    </w:p>
-    <w:p>
-      <w:pPr>
-        <w:pStyle w:val="NoSpacing"/>
-        <w:jc w:val="center"/>
-        <w:rPr>
-          <w:rFonts w:ascii="Verdana" w:hAnsi="Verdana"/>
-          <w:b/>
-          <w:sz w:val="48"/>
-        </w:rPr>
-      </w:pPr>
-    </w:p>
-    <w:p>
-      <w:pPr>
-        <w:pStyle w:val="NoSpacing"/>
-        <w:jc w:val="center"/>
-        <w:rPr>
-          <w:rFonts w:ascii="Verdana" w:hAnsi="Verdana"/>
-          <w:b/>
-          <w:sz w:val="48"/>
-        </w:rPr>
-      </w:pPr>
-    </w:p>
-    <w:p>
-      <w:pPr>
-        <w:pStyle w:val="NoSpacing"/>
-        <w:jc w:val="center"/>
-        <w:rPr>
-          <w:rFonts w:ascii="Verdana" w:hAnsi="Verdana"/>
-          <w:b/>
-          <w:sz w:val="48"/>
-        </w:rPr>
-      </w:pPr>
-    </w:p>
-    <w:p>
-      <w:pPr>
-        <w:pStyle w:val="NoSpacing"/>
-        <w:jc w:val="center"/>
-        <w:rPr>
-          <w:rFonts w:ascii="Verdana" w:hAnsi="Verdana"/>
-          <w:b/>
-          <w:sz w:val="48"/>
-        </w:rPr>
-      </w:pPr>
-    </w:p>
-    <w:p>
-      <w:pPr>
-        <w:pStyle w:val="NoSpacing"/>
-        <w:jc w:val="center"/>
-        <w:rPr>
-          <w:rFonts w:ascii="Verdana" w:hAnsi="Verdana"/>
-          <w:b/>
-          <w:sz w:val="48"/>
-        </w:rPr>
-      </w:pPr>
-    </w:p>
-    <w:p>
-      <w:pPr>
-        <w:pStyle w:val="NoSpacing"/>
-        <w:jc w:val="center"/>
-        <w:rPr>
-          <w:rFonts w:ascii="Verdana" w:hAnsi="Verdana"/>
-          <w:b/>
-          <w:sz w:val="48"/>
-        </w:rPr>
-      </w:pPr>
-    </w:p>
-    <w:p>
-      <w:pPr>
-        <w:pStyle w:val="NoSpacing"/>
-        <w:jc w:val="center"/>
-        <w:rPr>
-          <w:rFonts w:ascii="Verdana" w:hAnsi="Verdana"/>
-          <w:b/>
-          <w:sz w:val="48"/>
-        </w:rPr>
-      </w:pPr>
-    </w:p>
-    <w:p>
-      <w:pPr>
-        <w:pStyle w:val="NoSpacing"/>
-        <w:jc w:val="center"/>
-        <w:rPr>
-          <w:rFonts w:ascii="Verdana" w:hAnsi="Verdana"/>
-          <w:b/>
-          <w:sz w:val="48"/>
-        </w:rPr>
-      </w:pPr>
-      <w:r>
-        <w:rPr>
-          <w:rFonts w:ascii="Verdana" w:hAnsi="Verdana"/>
-          <w:b/>
-          <w:sz w:val="48"/>
-        </w:rPr>
-        <w:lastRenderedPageBreak/>
-        <w:t xml:space="preserve"> </w:t>
-      </w:r>
-      <w:r>
-        <w:rPr>
-          <w:rFonts w:ascii="Verdana" w:hAnsi="Verdana"/>
-          <w:b/>
-          <w:sz w:val="48"/>
-        </w:rPr>
-        <w:t>[</w:t>
-      </w:r>
-      <w:r>
-        <w:rPr>
-          <w:rFonts w:ascii="Verdana" w:hAnsi="Verdana"/>
-          <w:b/>
-          <w:sz w:val="48"/>
-        </w:rPr>
-        <w:t>WARDEN</w:t>
-      </w:r>
-      <w:r>
-        <w:rPr>
-          <w:rFonts w:ascii="Verdana" w:hAnsi="Verdana"/>
-          <w:b/>
-          <w:sz w:val="48"/>
-        </w:rPr>
-        <w:t>]</w:t>
-      </w:r>
-    </w:p>
-    <w:p>
-      <w:pPr>
-        <w:pStyle w:val="NoSpacing"/>
-        <w:rPr>
-          <w:rFonts w:ascii="Verdana" w:hAnsi="Verdana"/>
-          <w:b/>
-          <w:color w:val="00B050"/>
-          <w:sz w:val="48"/>
-        </w:rPr>
-      </w:pPr>
-      <w:r>
-        <w:rPr>
-          <w:rFonts w:ascii="Verdana" w:hAnsi="Verdana"/>
-          <w:b/>
-          <w:color w:val="00B050"/>
-          <w:sz w:val="48"/>
-        </w:rPr>
-        <w:t>FEATURES:</w:t>
+        <w:t>Rework on the fog – fog is everywhere existent and all the objects blend in.</w:t>
       </w:r>
     </w:p>
     <w:p>
@@ -1262,7 +1058,15 @@
           <w:sz w:val="32"/>
           <w:szCs w:val="32"/>
         </w:rPr>
-        <w:t>More ambient tracks &amp; new track when level is randomly generated.</w:t>
+        <w:t>Random level generator rework – there is 4 type of preexisting levels for the same hardcoded seed.</w:t>
+      </w:r>
+      <w:r>
+        <w:rPr>
+          <w:rFonts w:ascii="Verdana" w:hAnsi="Verdana"/>
+          <w:sz w:val="32"/>
+          <w:szCs w:val="32"/>
+        </w:rPr>
+        <w:t xml:space="preserve"> Simplex noise is being used.</w:t>
       </w:r>
     </w:p>
     <w:p>
@@ -1284,7 +1088,7 @@
           <w:sz w:val="32"/>
           <w:szCs w:val="32"/>
         </w:rPr>
-        <w:t>Credits added to the menu.</w:t>
+        <w:t>General improvement in multiple object rendering without instancing (for the text rendering and for the old way of block rendering).</w:t>
       </w:r>
     </w:p>
     <w:p>
@@ -1306,46 +1110,202 @@
           <w:sz w:val="32"/>
           <w:szCs w:val="32"/>
         </w:rPr>
-        <w:t>Auto-complete for commands.</w:t>
-      </w:r>
-      <w:r>
-        <w:rPr>
-          <w:rFonts w:ascii="Verdana" w:hAnsi="Verdana"/>
-          <w:sz w:val="32"/>
-          <w:szCs w:val="32"/>
-        </w:rPr>
-        <w:t xml:space="preserve"> [HellBlade64]</w:t>
-      </w:r>
-    </w:p>
-    <w:p>
-      <w:pPr>
-        <w:pStyle w:val="NoSpacing"/>
-        <w:rPr>
-          <w:rFonts w:ascii="Verdana" w:hAnsi="Verdana"/>
-          <w:b/>
-          <w:color w:val="FFC000"/>
-          <w:sz w:val="48"/>
-        </w:rPr>
-      </w:pPr>
-    </w:p>
-    <w:p>
-      <w:pPr>
-        <w:pStyle w:val="NoSpacing"/>
-        <w:rPr>
-          <w:rFonts w:ascii="Verdana" w:hAnsi="Verdana"/>
-          <w:b/>
-          <w:color w:val="FFC000"/>
-          <w:sz w:val="48"/>
-        </w:rPr>
-      </w:pPr>
-      <w:r>
-        <w:rPr>
-          <w:rFonts w:ascii="Verdana" w:hAnsi="Verdana"/>
-          <w:b/>
-          <w:color w:val="FFC000"/>
-          <w:sz w:val="48"/>
-        </w:rPr>
-        <w:t>CHANGES:</w:t>
+        <w:t>Water effects (non-light, regular version only) are more realistic at low cost to performance (framerate).</w:t>
+      </w:r>
+    </w:p>
+    <w:p>
+      <w:pPr>
+        <w:pStyle w:val="NoSpacing"/>
+        <w:jc w:val="center"/>
+        <w:rPr>
+          <w:rFonts w:ascii="Verdana" w:hAnsi="Verdana"/>
+          <w:b/>
+          <w:sz w:val="48"/>
+        </w:rPr>
+      </w:pPr>
+    </w:p>
+    <w:p>
+      <w:pPr>
+        <w:pStyle w:val="NoSpacing"/>
+        <w:jc w:val="center"/>
+        <w:rPr>
+          <w:rFonts w:ascii="Verdana" w:hAnsi="Verdana"/>
+          <w:b/>
+          <w:sz w:val="48"/>
+        </w:rPr>
+      </w:pPr>
+    </w:p>
+    <w:p>
+      <w:pPr>
+        <w:pStyle w:val="NoSpacing"/>
+        <w:jc w:val="center"/>
+        <w:rPr>
+          <w:rFonts w:ascii="Verdana" w:hAnsi="Verdana"/>
+          <w:b/>
+          <w:sz w:val="48"/>
+        </w:rPr>
+      </w:pPr>
+    </w:p>
+    <w:p>
+      <w:pPr>
+        <w:pStyle w:val="NoSpacing"/>
+        <w:jc w:val="center"/>
+        <w:rPr>
+          <w:rFonts w:ascii="Verdana" w:hAnsi="Verdana"/>
+          <w:b/>
+          <w:sz w:val="48"/>
+        </w:rPr>
+      </w:pPr>
+    </w:p>
+    <w:p>
+      <w:pPr>
+        <w:pStyle w:val="NoSpacing"/>
+        <w:jc w:val="center"/>
+        <w:rPr>
+          <w:rFonts w:ascii="Verdana" w:hAnsi="Verdana"/>
+          <w:b/>
+          <w:sz w:val="48"/>
+        </w:rPr>
+      </w:pPr>
+    </w:p>
+    <w:p>
+      <w:pPr>
+        <w:pStyle w:val="NoSpacing"/>
+        <w:jc w:val="center"/>
+        <w:rPr>
+          <w:rFonts w:ascii="Verdana" w:hAnsi="Verdana"/>
+          <w:b/>
+          <w:sz w:val="48"/>
+        </w:rPr>
+      </w:pPr>
+    </w:p>
+    <w:p>
+      <w:pPr>
+        <w:pStyle w:val="NoSpacing"/>
+        <w:jc w:val="center"/>
+        <w:rPr>
+          <w:rFonts w:ascii="Verdana" w:hAnsi="Verdana"/>
+          <w:b/>
+          <w:sz w:val="48"/>
+        </w:rPr>
+      </w:pPr>
+    </w:p>
+    <w:p>
+      <w:pPr>
+        <w:pStyle w:val="NoSpacing"/>
+        <w:jc w:val="center"/>
+        <w:rPr>
+          <w:rFonts w:ascii="Verdana" w:hAnsi="Verdana"/>
+          <w:b/>
+          <w:sz w:val="48"/>
+        </w:rPr>
+      </w:pPr>
+    </w:p>
+    <w:p>
+      <w:pPr>
+        <w:pStyle w:val="NoSpacing"/>
+        <w:jc w:val="center"/>
+        <w:rPr>
+          <w:rFonts w:ascii="Verdana" w:hAnsi="Verdana"/>
+          <w:b/>
+          <w:sz w:val="48"/>
+        </w:rPr>
+      </w:pPr>
+    </w:p>
+    <w:p>
+      <w:pPr>
+        <w:pStyle w:val="NoSpacing"/>
+        <w:jc w:val="center"/>
+        <w:rPr>
+          <w:rFonts w:ascii="Verdana" w:hAnsi="Verdana"/>
+          <w:b/>
+          <w:sz w:val="48"/>
+        </w:rPr>
+      </w:pPr>
+    </w:p>
+    <w:p>
+      <w:pPr>
+        <w:pStyle w:val="NoSpacing"/>
+        <w:jc w:val="center"/>
+        <w:rPr>
+          <w:rFonts w:ascii="Verdana" w:hAnsi="Verdana"/>
+          <w:b/>
+          <w:sz w:val="48"/>
+        </w:rPr>
+      </w:pPr>
+    </w:p>
+    <w:p>
+      <w:pPr>
+        <w:pStyle w:val="NoSpacing"/>
+        <w:jc w:val="center"/>
+        <w:rPr>
+          <w:rFonts w:ascii="Verdana" w:hAnsi="Verdana"/>
+          <w:b/>
+          <w:sz w:val="48"/>
+        </w:rPr>
+      </w:pPr>
+    </w:p>
+    <w:p>
+      <w:pPr>
+        <w:pStyle w:val="NoSpacing"/>
+        <w:jc w:val="center"/>
+        <w:rPr>
+          <w:rFonts w:ascii="Verdana" w:hAnsi="Verdana"/>
+          <w:b/>
+          <w:sz w:val="48"/>
+        </w:rPr>
+      </w:pPr>
+      <w:r>
+        <w:rPr>
+          <w:rFonts w:ascii="Verdana" w:hAnsi="Verdana"/>
+          <w:b/>
+          <w:sz w:val="48"/>
+        </w:rPr>
+        <w:t xml:space="preserve"> </w:t>
+      </w:r>
+      <w:r>
+        <w:rPr>
+          <w:rFonts w:ascii="Verdana" w:hAnsi="Verdana"/>
+          <w:b/>
+          <w:sz w:val="48"/>
+        </w:rPr>
+        <w:t>[</w:t>
+      </w:r>
+      <w:r>
+        <w:rPr>
+          <w:rFonts w:ascii="Verdana" w:hAnsi="Verdana"/>
+          <w:b/>
+          <w:sz w:val="48"/>
+        </w:rPr>
+        <w:t>WARDEN</w:t>
+      </w:r>
+      <w:r>
+        <w:rPr>
+          <w:rFonts w:ascii="Verdana" w:hAnsi="Verdana"/>
+          <w:b/>
+          <w:sz w:val="48"/>
+        </w:rPr>
+        <w:t>]</w:t>
+      </w:r>
+    </w:p>
+    <w:p>
+      <w:pPr>
+        <w:pStyle w:val="NoSpacing"/>
+        <w:rPr>
+          <w:rFonts w:ascii="Verdana" w:hAnsi="Verdana"/>
+          <w:b/>
+          <w:color w:val="00B050"/>
+          <w:sz w:val="48"/>
+        </w:rPr>
+      </w:pPr>
+      <w:r>
+        <w:rPr>
+          <w:rFonts w:ascii="Verdana" w:hAnsi="Verdana"/>
+          <w:b/>
+          <w:color w:val="00B050"/>
+          <w:sz w:val="48"/>
+        </w:rPr>
+        <w:t>FEATURES:</w:t>
       </w:r>
     </w:p>
     <w:p>
@@ -1367,289 +1327,7 @@
           <w:sz w:val="32"/>
           <w:szCs w:val="32"/>
         </w:rPr>
-        <w:t>Chunks are deter</w:t>
-      </w:r>
-      <w:r>
-        <w:rPr>
-          <w:rFonts w:ascii="Verdana" w:hAnsi="Verdana"/>
-          <w:sz w:val="32"/>
-          <w:szCs w:val="32"/>
-        </w:rPr>
-        <w:t>mined by using another function</w:t>
-      </w:r>
-      <w:r>
-        <w:rPr>
-          <w:rFonts w:ascii="Verdana" w:hAnsi="Verdana"/>
-          <w:sz w:val="32"/>
-          <w:szCs w:val="32"/>
-        </w:rPr>
-        <w:t>.</w:t>
-      </w:r>
-    </w:p>
-    <w:p>
-      <w:pPr>
-        <w:pStyle w:val="NoSpacing"/>
-        <w:ind w:left="360"/>
-        <w:rPr>
-          <w:rFonts w:ascii="Verdana" w:hAnsi="Verdana"/>
-          <w:sz w:val="32"/>
-          <w:szCs w:val="32"/>
-        </w:rPr>
-      </w:pPr>
-    </w:p>
-    <w:p>
-      <w:pPr>
-        <w:pStyle w:val="NoSpacing"/>
-        <w:jc w:val="center"/>
-      </w:pPr>
-    </w:p>
-    <w:p>
-      <w:pPr>
-        <w:pStyle w:val="NoSpacing"/>
-        <w:jc w:val="center"/>
-      </w:pPr>
-    </w:p>
-    <w:p>
-      <w:pPr>
-        <w:pStyle w:val="NoSpacing"/>
-        <w:jc w:val="center"/>
-      </w:pPr>
-    </w:p>
-    <w:p>
-      <w:pPr>
-        <w:pStyle w:val="NoSpacing"/>
-        <w:jc w:val="center"/>
-      </w:pPr>
-    </w:p>
-    <w:p>
-      <w:pPr>
-        <w:pStyle w:val="NoSpacing"/>
-        <w:jc w:val="center"/>
-      </w:pPr>
-    </w:p>
-    <w:p>
-      <w:pPr>
-        <w:pStyle w:val="NoSpacing"/>
-        <w:jc w:val="center"/>
-      </w:pPr>
-    </w:p>
-    <w:p>
-      <w:pPr>
-        <w:pStyle w:val="NoSpacing"/>
-        <w:jc w:val="center"/>
-      </w:pPr>
-    </w:p>
-    <w:p>
-      <w:pPr>
-        <w:pStyle w:val="NoSpacing"/>
-        <w:jc w:val="center"/>
-      </w:pPr>
-    </w:p>
-    <w:p>
-      <w:pPr>
-        <w:pStyle w:val="NoSpacing"/>
-        <w:jc w:val="center"/>
-      </w:pPr>
-    </w:p>
-    <w:p>
-      <w:pPr>
-        <w:pStyle w:val="NoSpacing"/>
-        <w:jc w:val="center"/>
-      </w:pPr>
-    </w:p>
-    <w:p>
-      <w:pPr>
-        <w:pStyle w:val="NoSpacing"/>
-        <w:jc w:val="center"/>
-      </w:pPr>
-    </w:p>
-    <w:p>
-      <w:pPr>
-        <w:pStyle w:val="NoSpacing"/>
-        <w:jc w:val="center"/>
-      </w:pPr>
-    </w:p>
-    <w:p>
-      <w:pPr>
-        <w:pStyle w:val="NoSpacing"/>
-        <w:jc w:val="center"/>
-      </w:pPr>
-    </w:p>
-    <w:p>
-      <w:pPr>
-        <w:pStyle w:val="NoSpacing"/>
-        <w:jc w:val="center"/>
-      </w:pPr>
-    </w:p>
-    <w:p>
-      <w:pPr>
-        <w:pStyle w:val="NoSpacing"/>
-        <w:jc w:val="center"/>
-      </w:pPr>
-    </w:p>
-    <w:p>
-      <w:pPr>
-        <w:pStyle w:val="NoSpacing"/>
-        <w:jc w:val="center"/>
-      </w:pPr>
-    </w:p>
-    <w:p>
-      <w:pPr>
-        <w:pStyle w:val="NoSpacing"/>
-        <w:jc w:val="center"/>
-      </w:pPr>
-    </w:p>
-    <w:p>
-      <w:pPr>
-        <w:pStyle w:val="NoSpacing"/>
-        <w:jc w:val="center"/>
-      </w:pPr>
-    </w:p>
-    <w:p>
-      <w:pPr>
-        <w:pStyle w:val="NoSpacing"/>
-        <w:jc w:val="center"/>
-      </w:pPr>
-    </w:p>
-    <w:p>
-      <w:pPr>
-        <w:pStyle w:val="NoSpacing"/>
-        <w:jc w:val="center"/>
-        <w:rPr>
-          <w:rFonts w:ascii="Verdana" w:hAnsi="Verdana"/>
-          <w:b/>
-          <w:sz w:val="48"/>
-        </w:rPr>
-      </w:pPr>
-    </w:p>
-    <w:p>
-      <w:pPr>
-        <w:pStyle w:val="NoSpacing"/>
-        <w:jc w:val="center"/>
-        <w:rPr>
-          <w:rFonts w:ascii="Verdana" w:hAnsi="Verdana"/>
-          <w:b/>
-          <w:sz w:val="48"/>
-        </w:rPr>
-      </w:pPr>
-    </w:p>
-    <w:p>
-      <w:pPr>
-        <w:pStyle w:val="NoSpacing"/>
-        <w:jc w:val="center"/>
-        <w:rPr>
-          <w:rFonts w:ascii="Verdana" w:hAnsi="Verdana"/>
-          <w:b/>
-          <w:sz w:val="48"/>
-        </w:rPr>
-      </w:pPr>
-    </w:p>
-    <w:p>
-      <w:pPr>
-        <w:pStyle w:val="NoSpacing"/>
-        <w:jc w:val="center"/>
-        <w:rPr>
-          <w:rFonts w:ascii="Verdana" w:hAnsi="Verdana"/>
-          <w:b/>
-          <w:sz w:val="48"/>
-        </w:rPr>
-      </w:pPr>
-    </w:p>
-    <w:p>
-      <w:pPr>
-        <w:pStyle w:val="NoSpacing"/>
-        <w:jc w:val="center"/>
-        <w:rPr>
-          <w:rFonts w:ascii="Verdana" w:hAnsi="Verdana"/>
-          <w:b/>
-          <w:sz w:val="48"/>
-        </w:rPr>
-      </w:pPr>
-    </w:p>
-    <w:p>
-      <w:pPr>
-        <w:pStyle w:val="NoSpacing"/>
-        <w:jc w:val="center"/>
-        <w:rPr>
-          <w:rFonts w:ascii="Verdana" w:hAnsi="Verdana"/>
-          <w:b/>
-          <w:sz w:val="48"/>
-        </w:rPr>
-      </w:pPr>
-    </w:p>
-    <w:p>
-      <w:pPr>
-        <w:pStyle w:val="NoSpacing"/>
-        <w:jc w:val="center"/>
-        <w:rPr>
-          <w:rFonts w:ascii="Verdana" w:hAnsi="Verdana"/>
-          <w:b/>
-          <w:sz w:val="48"/>
-        </w:rPr>
-      </w:pPr>
-    </w:p>
-    <w:p>
-      <w:pPr>
-        <w:pStyle w:val="NoSpacing"/>
-        <w:jc w:val="center"/>
-        <w:rPr>
-          <w:rFonts w:ascii="Verdana" w:hAnsi="Verdana"/>
-          <w:b/>
-          <w:sz w:val="48"/>
-        </w:rPr>
-      </w:pPr>
-      <w:r>
-        <w:rPr>
-          <w:rFonts w:ascii="Verdana" w:hAnsi="Verdana"/>
-          <w:b/>
-          <w:sz w:val="48"/>
-        </w:rPr>
-        <w:lastRenderedPageBreak/>
-        <w:t>[</w:t>
-      </w:r>
-      <w:r>
-        <w:rPr>
-          <w:rFonts w:ascii="Verdana" w:hAnsi="Verdana"/>
-          <w:b/>
-          <w:sz w:val="48"/>
-        </w:rPr>
-        <w:t>VIVID</w:t>
-      </w:r>
-      <w:r>
-        <w:rPr>
-          <w:rFonts w:ascii="Verdana" w:hAnsi="Verdana"/>
-          <w:b/>
-          <w:sz w:val="48"/>
-        </w:rPr>
-        <w:t>]</w:t>
-      </w:r>
-    </w:p>
-    <w:p>
-      <w:pPr>
-        <w:pStyle w:val="NoSpacing"/>
-      </w:pPr>
-      <w:r>
-        <w:tab/>
-      </w:r>
-    </w:p>
-    <w:p>
-      <w:pPr>
-        <w:pStyle w:val="NoSpacing"/>
-        <w:rPr>
-          <w:rFonts w:ascii="Verdana" w:hAnsi="Verdana"/>
-          <w:b/>
-          <w:color w:val="FFC000"/>
-          <w:sz w:val="48"/>
-        </w:rPr>
-      </w:pPr>
-      <w:r>
-        <w:rPr>
-          <w:rFonts w:ascii="Verdana" w:hAnsi="Verdana"/>
-          <w:b/>
-          <w:color w:val="FFC000"/>
-          <w:sz w:val="48"/>
-        </w:rPr>
-        <w:t>CHANGES:</w:t>
+        <w:t>More ambient tracks &amp; new track when level is randomly generated.</w:t>
       </w:r>
     </w:p>
     <w:p>
@@ -1671,39 +1349,7 @@
           <w:sz w:val="32"/>
           <w:szCs w:val="32"/>
         </w:rPr>
-        <w:t xml:space="preserve">Chunk operations are done in </w:t>
-      </w:r>
-      <w:r>
-        <w:rPr>
-          <w:rFonts w:ascii="Verdana" w:hAnsi="Verdana"/>
-          <w:sz w:val="32"/>
-          <w:szCs w:val="32"/>
-        </w:rPr>
-        <w:t xml:space="preserve">timer thread </w:t>
-      </w:r>
-      <w:r>
-        <w:rPr>
-          <w:rFonts w:ascii="Verdana" w:hAnsi="Verdana"/>
-          <w:sz w:val="32"/>
-          <w:szCs w:val="32"/>
-        </w:rPr>
-        <w:t>at</w:t>
-      </w:r>
-      <w:r>
-        <w:rPr>
-          <w:rFonts w:ascii="Verdana" w:hAnsi="Verdana"/>
-          <w:sz w:val="32"/>
-          <w:szCs w:val="32"/>
-        </w:rPr>
-        <w:t xml:space="preserve"> fixed rate</w:t>
-      </w:r>
-      <w:r>
-        <w:rPr>
-          <w:rFonts w:ascii="Verdana" w:hAnsi="Verdana"/>
-          <w:sz w:val="32"/>
-          <w:szCs w:val="32"/>
-        </w:rPr>
-        <w:t xml:space="preserve">. </w:t>
+        <w:t>Credits added to the menu.</w:t>
       </w:r>
     </w:p>
     <w:p>
@@ -1725,39 +1371,46 @@
           <w:sz w:val="32"/>
           <w:szCs w:val="32"/>
         </w:rPr>
-        <w:t xml:space="preserve">Random level generator uses Noise &amp; Random together </w:t>
-      </w:r>
-      <w:r>
-        <w:rPr>
-          <w:rFonts w:ascii="Verdana" w:hAnsi="Verdana"/>
-          <w:sz w:val="32"/>
-          <w:szCs w:val="32"/>
-        </w:rPr>
-        <w:t>t</w:t>
-      </w:r>
-      <w:r>
-        <w:rPr>
-          <w:rFonts w:ascii="Verdana" w:hAnsi="Verdana"/>
-          <w:sz w:val="32"/>
-          <w:szCs w:val="32"/>
-        </w:rPr>
-        <w:t>o generate random level. First Noise is applied</w:t>
-      </w:r>
-      <w:r>
-        <w:rPr>
-          <w:rFonts w:ascii="Verdana" w:hAnsi="Verdana"/>
-          <w:sz w:val="32"/>
-          <w:szCs w:val="32"/>
-        </w:rPr>
-        <w:t>,</w:t>
-      </w:r>
-      <w:r>
-        <w:rPr>
-          <w:rFonts w:ascii="Verdana" w:hAnsi="Verdana"/>
-          <w:sz w:val="32"/>
-          <w:szCs w:val="32"/>
-        </w:rPr>
-        <w:t xml:space="preserve"> then random after former is done.</w:t>
+        <w:t>Auto-complete for commands.</w:t>
+      </w:r>
+      <w:r>
+        <w:rPr>
+          <w:rFonts w:ascii="Verdana" w:hAnsi="Verdana"/>
+          <w:sz w:val="32"/>
+          <w:szCs w:val="32"/>
+        </w:rPr>
+        <w:t xml:space="preserve"> [HellBlade64]</w:t>
+      </w:r>
+    </w:p>
+    <w:p>
+      <w:pPr>
+        <w:pStyle w:val="NoSpacing"/>
+        <w:rPr>
+          <w:rFonts w:ascii="Verdana" w:hAnsi="Verdana"/>
+          <w:b/>
+          <w:color w:val="FFC000"/>
+          <w:sz w:val="48"/>
+        </w:rPr>
+      </w:pPr>
+    </w:p>
+    <w:p>
+      <w:pPr>
+        <w:pStyle w:val="NoSpacing"/>
+        <w:rPr>
+          <w:rFonts w:ascii="Verdana" w:hAnsi="Verdana"/>
+          <w:b/>
+          <w:color w:val="FFC000"/>
+          <w:sz w:val="48"/>
+        </w:rPr>
+      </w:pPr>
+      <w:r>
+        <w:rPr>
+          <w:rFonts w:ascii="Verdana" w:hAnsi="Verdana"/>
+          <w:b/>
+          <w:color w:val="FFC000"/>
+          <w:sz w:val="48"/>
+        </w:rPr>
+        <w:t>CHANGES:</w:t>
       </w:r>
     </w:p>
     <w:p>
@@ -1779,7 +1432,15 @@
           <w:sz w:val="32"/>
           <w:szCs w:val="32"/>
         </w:rPr>
-        <w:t>Block positions are aligned to the even number</w:t>
+        <w:t>Chunks are deter</w:t>
+      </w:r>
+      <w:r>
+        <w:rPr>
+          <w:rFonts w:ascii="Verdana" w:hAnsi="Verdana"/>
+          <w:sz w:val="32"/>
+          <w:szCs w:val="32"/>
+        </w:rPr>
+        <w:t>mined by using another function</w:t>
       </w:r>
       <w:r>
         <w:rPr>
@@ -1793,31 +1454,266 @@
     <w:p>
       <w:pPr>
         <w:pStyle w:val="NoSpacing"/>
-        <w:rPr>
-          <w:rFonts w:ascii="Verdana" w:hAnsi="Verdana"/>
-          <w:sz w:val="32"/>
-          <w:szCs w:val="32"/>
-        </w:rPr>
-      </w:pPr>
-    </w:p>
-    <w:p>
-      <w:pPr>
-        <w:pStyle w:val="NoSpacing"/>
-        <w:rPr>
-          <w:rFonts w:ascii="Verdana" w:hAnsi="Verdana"/>
-          <w:b/>
-          <w:color w:val="FF0000"/>
-          <w:sz w:val="48"/>
-        </w:rPr>
-      </w:pPr>
-      <w:r>
-        <w:rPr>
-          <w:rFonts w:ascii="Verdana" w:hAnsi="Verdana"/>
-          <w:b/>
-          <w:color w:val="FF0000"/>
-          <w:sz w:val="48"/>
-        </w:rPr>
-        <w:t>FIXES:</w:t>
+        <w:ind w:left="360"/>
+        <w:rPr>
+          <w:rFonts w:ascii="Verdana" w:hAnsi="Verdana"/>
+          <w:sz w:val="32"/>
+          <w:szCs w:val="32"/>
+        </w:rPr>
+      </w:pPr>
+    </w:p>
+    <w:p>
+      <w:pPr>
+        <w:pStyle w:val="NoSpacing"/>
+        <w:jc w:val="center"/>
+      </w:pPr>
+    </w:p>
+    <w:p>
+      <w:pPr>
+        <w:pStyle w:val="NoSpacing"/>
+        <w:jc w:val="center"/>
+      </w:pPr>
+    </w:p>
+    <w:p>
+      <w:pPr>
+        <w:pStyle w:val="NoSpacing"/>
+        <w:jc w:val="center"/>
+      </w:pPr>
+    </w:p>
+    <w:p>
+      <w:pPr>
+        <w:pStyle w:val="NoSpacing"/>
+        <w:jc w:val="center"/>
+      </w:pPr>
+    </w:p>
+    <w:p>
+      <w:pPr>
+        <w:pStyle w:val="NoSpacing"/>
+        <w:jc w:val="center"/>
+      </w:pPr>
+    </w:p>
+    <w:p>
+      <w:pPr>
+        <w:pStyle w:val="NoSpacing"/>
+        <w:jc w:val="center"/>
+      </w:pPr>
+    </w:p>
+    <w:p>
+      <w:pPr>
+        <w:pStyle w:val="NoSpacing"/>
+        <w:jc w:val="center"/>
+      </w:pPr>
+    </w:p>
+    <w:p>
+      <w:pPr>
+        <w:pStyle w:val="NoSpacing"/>
+        <w:jc w:val="center"/>
+      </w:pPr>
+    </w:p>
+    <w:p>
+      <w:pPr>
+        <w:pStyle w:val="NoSpacing"/>
+        <w:jc w:val="center"/>
+      </w:pPr>
+    </w:p>
+    <w:p>
+      <w:pPr>
+        <w:pStyle w:val="NoSpacing"/>
+        <w:jc w:val="center"/>
+      </w:pPr>
+    </w:p>
+    <w:p>
+      <w:pPr>
+        <w:pStyle w:val="NoSpacing"/>
+        <w:jc w:val="center"/>
+      </w:pPr>
+    </w:p>
+    <w:p>
+      <w:pPr>
+        <w:pStyle w:val="NoSpacing"/>
+        <w:jc w:val="center"/>
+      </w:pPr>
+    </w:p>
+    <w:p>
+      <w:pPr>
+        <w:pStyle w:val="NoSpacing"/>
+        <w:jc w:val="center"/>
+      </w:pPr>
+    </w:p>
+    <w:p>
+      <w:pPr>
+        <w:pStyle w:val="NoSpacing"/>
+        <w:jc w:val="center"/>
+      </w:pPr>
+    </w:p>
+    <w:p>
+      <w:pPr>
+        <w:pStyle w:val="NoSpacing"/>
+        <w:jc w:val="center"/>
+      </w:pPr>
+    </w:p>
+    <w:p>
+      <w:pPr>
+        <w:pStyle w:val="NoSpacing"/>
+        <w:jc w:val="center"/>
+      </w:pPr>
+    </w:p>
+    <w:p>
+      <w:pPr>
+        <w:pStyle w:val="NoSpacing"/>
+        <w:jc w:val="center"/>
+      </w:pPr>
+    </w:p>
+    <w:p>
+      <w:pPr>
+        <w:pStyle w:val="NoSpacing"/>
+        <w:jc w:val="center"/>
+      </w:pPr>
+    </w:p>
+    <w:p>
+      <w:pPr>
+        <w:pStyle w:val="NoSpacing"/>
+        <w:jc w:val="center"/>
+      </w:pPr>
+    </w:p>
+    <w:p>
+      <w:pPr>
+        <w:pStyle w:val="NoSpacing"/>
+        <w:jc w:val="center"/>
+        <w:rPr>
+          <w:rFonts w:ascii="Verdana" w:hAnsi="Verdana"/>
+          <w:b/>
+          <w:sz w:val="48"/>
+        </w:rPr>
+      </w:pPr>
+    </w:p>
+    <w:p>
+      <w:pPr>
+        <w:pStyle w:val="NoSpacing"/>
+        <w:jc w:val="center"/>
+        <w:rPr>
+          <w:rFonts w:ascii="Verdana" w:hAnsi="Verdana"/>
+          <w:b/>
+          <w:sz w:val="48"/>
+        </w:rPr>
+      </w:pPr>
+    </w:p>
+    <w:p>
+      <w:pPr>
+        <w:pStyle w:val="NoSpacing"/>
+        <w:jc w:val="center"/>
+        <w:rPr>
+          <w:rFonts w:ascii="Verdana" w:hAnsi="Verdana"/>
+          <w:b/>
+          <w:sz w:val="48"/>
+        </w:rPr>
+      </w:pPr>
+    </w:p>
+    <w:p>
+      <w:pPr>
+        <w:pStyle w:val="NoSpacing"/>
+        <w:jc w:val="center"/>
+        <w:rPr>
+          <w:rFonts w:ascii="Verdana" w:hAnsi="Verdana"/>
+          <w:b/>
+          <w:sz w:val="48"/>
+        </w:rPr>
+      </w:pPr>
+    </w:p>
+    <w:p>
+      <w:pPr>
+        <w:pStyle w:val="NoSpacing"/>
+        <w:jc w:val="center"/>
+        <w:rPr>
+          <w:rFonts w:ascii="Verdana" w:hAnsi="Verdana"/>
+          <w:b/>
+          <w:sz w:val="48"/>
+        </w:rPr>
+      </w:pPr>
+    </w:p>
+    <w:p>
+      <w:pPr>
+        <w:pStyle w:val="NoSpacing"/>
+        <w:jc w:val="center"/>
+        <w:rPr>
+          <w:rFonts w:ascii="Verdana" w:hAnsi="Verdana"/>
+          <w:b/>
+          <w:sz w:val="48"/>
+        </w:rPr>
+      </w:pPr>
+    </w:p>
+    <w:p>
+      <w:pPr>
+        <w:pStyle w:val="NoSpacing"/>
+        <w:jc w:val="center"/>
+        <w:rPr>
+          <w:rFonts w:ascii="Verdana" w:hAnsi="Verdana"/>
+          <w:b/>
+          <w:sz w:val="48"/>
+        </w:rPr>
+      </w:pPr>
+    </w:p>
+    <w:p>
+      <w:pPr>
+        <w:pStyle w:val="NoSpacing"/>
+        <w:jc w:val="center"/>
+        <w:rPr>
+          <w:rFonts w:ascii="Verdana" w:hAnsi="Verdana"/>
+          <w:b/>
+          <w:sz w:val="48"/>
+        </w:rPr>
+      </w:pPr>
+      <w:r>
+        <w:rPr>
+          <w:rFonts w:ascii="Verdana" w:hAnsi="Verdana"/>
+          <w:b/>
+          <w:sz w:val="48"/>
+        </w:rPr>
+        <w:t>[</w:t>
+      </w:r>
+      <w:r>
+        <w:rPr>
+          <w:rFonts w:ascii="Verdana" w:hAnsi="Verdana"/>
+          <w:b/>
+          <w:sz w:val="48"/>
+        </w:rPr>
+        <w:t>VIVID</w:t>
+      </w:r>
+      <w:r>
+        <w:rPr>
+          <w:rFonts w:ascii="Verdana" w:hAnsi="Verdana"/>
+          <w:b/>
+          <w:sz w:val="48"/>
+        </w:rPr>
+        <w:t>]</w:t>
+      </w:r>
+    </w:p>
+    <w:p>
+      <w:pPr>
+        <w:pStyle w:val="NoSpacing"/>
+      </w:pPr>
+      <w:r>
+        <w:tab/>
+      </w:r>
+    </w:p>
+    <w:p>
+      <w:pPr>
+        <w:pStyle w:val="NoSpacing"/>
+        <w:rPr>
+          <w:rFonts w:ascii="Verdana" w:hAnsi="Verdana"/>
+          <w:b/>
+          <w:color w:val="FFC000"/>
+          <w:sz w:val="48"/>
+        </w:rPr>
+      </w:pPr>
+      <w:r>
+        <w:rPr>
+          <w:rFonts w:ascii="Verdana" w:hAnsi="Verdana"/>
+          <w:b/>
+          <w:color w:val="FFC000"/>
+          <w:sz w:val="48"/>
+        </w:rPr>
+        <w:t>CHANGES:</w:t>
       </w:r>
     </w:p>
     <w:p>
@@ -1839,31 +1735,39 @@
           <w:sz w:val="32"/>
           <w:szCs w:val="32"/>
         </w:rPr>
-        <w:t xml:space="preserve">Fixed </w:t>
-      </w:r>
-      <w:r>
-        <w:rPr>
-          <w:rFonts w:ascii="Verdana" w:hAnsi="Verdana"/>
-          <w:sz w:val="32"/>
-          <w:szCs w:val="32"/>
-        </w:rPr>
-        <w:t>exceptions when typing in the text</w:t>
-      </w:r>
-      <w:r>
-        <w:rPr>
-          <w:rFonts w:ascii="Verdana" w:hAnsi="Verdana"/>
-          <w:sz w:val="32"/>
-          <w:szCs w:val="32"/>
-        </w:rPr>
-        <w:t xml:space="preserve"> causing app to stop</w:t>
-      </w:r>
-      <w:r>
-        <w:rPr>
-          <w:rFonts w:ascii="Verdana" w:hAnsi="Verdana"/>
-          <w:sz w:val="32"/>
-          <w:szCs w:val="32"/>
-        </w:rPr>
-        <w:t>.</w:t>
+        <w:t xml:space="preserve">Chunk operations are done in </w:t>
+      </w:r>
+      <w:r>
+        <w:rPr>
+          <w:rFonts w:ascii="Verdana" w:hAnsi="Verdana"/>
+          <w:sz w:val="32"/>
+          <w:szCs w:val="32"/>
+        </w:rPr>
+        <w:t xml:space="preserve">timer thread </w:t>
+      </w:r>
+      <w:r>
+        <w:rPr>
+          <w:rFonts w:ascii="Verdana" w:hAnsi="Verdana"/>
+          <w:sz w:val="32"/>
+          <w:szCs w:val="32"/>
+        </w:rPr>
+        <w:t>at</w:t>
+      </w:r>
+      <w:r>
+        <w:rPr>
+          <w:rFonts w:ascii="Verdana" w:hAnsi="Verdana"/>
+          <w:sz w:val="32"/>
+          <w:szCs w:val="32"/>
+        </w:rPr>
+        <w:t xml:space="preserve"> fixed rate</w:t>
+      </w:r>
+      <w:r>
+        <w:rPr>
+          <w:rFonts w:ascii="Verdana" w:hAnsi="Verdana"/>
+          <w:sz w:val="32"/>
+          <w:szCs w:val="32"/>
+        </w:rPr>
+        <w:t xml:space="preserve">. </w:t>
       </w:r>
     </w:p>
     <w:p>
@@ -1885,229 +1789,39 @@
           <w:sz w:val="32"/>
           <w:szCs w:val="32"/>
         </w:rPr>
-        <w:t>Small performance gain.</w:t>
-      </w:r>
-    </w:p>
-    <w:p>
-      <w:pPr>
-        <w:pStyle w:val="NoSpacing"/>
-        <w:ind w:left="360"/>
-      </w:pPr>
-    </w:p>
-    <w:p>
-      <w:pPr>
-        <w:pStyle w:val="NoSpacing"/>
-        <w:ind w:left="360"/>
-      </w:pPr>
-    </w:p>
-    <w:p>
-      <w:pPr>
-        <w:pStyle w:val="NoSpacing"/>
-        <w:ind w:left="360"/>
-      </w:pPr>
-    </w:p>
-    <w:p>
-      <w:pPr>
-        <w:pStyle w:val="NoSpacing"/>
-        <w:ind w:left="360"/>
-      </w:pPr>
-    </w:p>
-    <w:p>
-      <w:pPr>
-        <w:pStyle w:val="NoSpacing"/>
-        <w:ind w:left="360"/>
-      </w:pPr>
-    </w:p>
-    <w:p>
-      <w:pPr>
-        <w:pStyle w:val="NoSpacing"/>
-        <w:ind w:left="360"/>
-      </w:pPr>
-    </w:p>
-    <w:p>
-      <w:pPr>
-        <w:pStyle w:val="NoSpacing"/>
-        <w:ind w:left="360"/>
-      </w:pPr>
-    </w:p>
-    <w:p>
-      <w:pPr>
-        <w:pStyle w:val="NoSpacing"/>
-        <w:ind w:left="360"/>
-      </w:pPr>
-    </w:p>
-    <w:p>
-      <w:pPr>
-        <w:pStyle w:val="NoSpacing"/>
-        <w:ind w:left="360"/>
-      </w:pPr>
-    </w:p>
-    <w:p>
-      <w:pPr>
-        <w:pStyle w:val="NoSpacing"/>
-        <w:ind w:left="360"/>
-      </w:pPr>
-    </w:p>
-    <w:p>
-      <w:pPr>
-        <w:pStyle w:val="NoSpacing"/>
-        <w:ind w:left="360"/>
-      </w:pPr>
-    </w:p>
-    <w:p>
-      <w:pPr>
-        <w:pStyle w:val="NoSpacing"/>
-        <w:ind w:left="360"/>
-      </w:pPr>
-    </w:p>
-    <w:p>
-      <w:pPr>
-        <w:pStyle w:val="NoSpacing"/>
-        <w:ind w:left="360"/>
-      </w:pPr>
-    </w:p>
-    <w:p>
-      <w:pPr>
-        <w:pStyle w:val="NoSpacing"/>
-        <w:ind w:left="360"/>
-      </w:pPr>
-    </w:p>
-    <w:p>
-      <w:pPr>
-        <w:pStyle w:val="NoSpacing"/>
-        <w:ind w:left="360"/>
-      </w:pPr>
-    </w:p>
-    <w:p>
-      <w:pPr>
-        <w:pStyle w:val="NoSpacing"/>
-        <w:rPr>
-          <w:rFonts w:ascii="Verdana" w:hAnsi="Verdana"/>
-          <w:b/>
-          <w:sz w:val="48"/>
-        </w:rPr>
-      </w:pPr>
-    </w:p>
-    <w:p>
-      <w:pPr>
-        <w:pStyle w:val="NoSpacing"/>
-        <w:rPr>
-          <w:rFonts w:ascii="Verdana" w:hAnsi="Verdana"/>
-          <w:b/>
-          <w:sz w:val="48"/>
-        </w:rPr>
-      </w:pPr>
-    </w:p>
-    <w:p>
-      <w:pPr>
-        <w:pStyle w:val="NoSpacing"/>
-        <w:rPr>
-          <w:rFonts w:ascii="Verdana" w:hAnsi="Verdana"/>
-          <w:b/>
-          <w:sz w:val="48"/>
-        </w:rPr>
-      </w:pPr>
-    </w:p>
-    <w:p>
-      <w:pPr>
-        <w:pStyle w:val="NoSpacing"/>
-        <w:rPr>
-          <w:rFonts w:ascii="Verdana" w:hAnsi="Verdana"/>
-          <w:b/>
-          <w:sz w:val="48"/>
-        </w:rPr>
-      </w:pPr>
-    </w:p>
-    <w:p>
-      <w:pPr>
-        <w:pStyle w:val="NoSpacing"/>
-        <w:rPr>
-          <w:rFonts w:ascii="Verdana" w:hAnsi="Verdana"/>
-          <w:b/>
-          <w:sz w:val="48"/>
-        </w:rPr>
-      </w:pPr>
-    </w:p>
-    <w:p>
-      <w:pPr>
-        <w:pStyle w:val="NoSpacing"/>
-        <w:rPr>
-          <w:rFonts w:ascii="Verdana" w:hAnsi="Verdana"/>
-          <w:b/>
-          <w:sz w:val="48"/>
-        </w:rPr>
-      </w:pPr>
-    </w:p>
-    <w:p>
-      <w:pPr>
-        <w:pStyle w:val="NoSpacing"/>
-        <w:rPr>
-          <w:rFonts w:ascii="Verdana" w:hAnsi="Verdana"/>
-          <w:b/>
-          <w:sz w:val="48"/>
-        </w:rPr>
-      </w:pPr>
-    </w:p>
-    <w:p>
-      <w:pPr>
-        <w:pStyle w:val="NoSpacing"/>
-        <w:jc w:val="center"/>
-      </w:pPr>
-    </w:p>
-    <w:p>
-      <w:pPr>
-        <w:pStyle w:val="NoSpacing"/>
-        <w:jc w:val="center"/>
-        <w:rPr>
-          <w:rFonts w:ascii="Verdana" w:hAnsi="Verdana"/>
-          <w:b/>
-          <w:sz w:val="48"/>
-        </w:rPr>
-      </w:pPr>
-      <w:r>
-        <w:rPr>
-          <w:rFonts w:ascii="Verdana" w:hAnsi="Verdana"/>
-          <w:b/>
-          <w:sz w:val="48"/>
-        </w:rPr>
-        <w:lastRenderedPageBreak/>
-        <w:t>[</w:t>
-      </w:r>
-      <w:r>
-        <w:rPr>
-          <w:rFonts w:ascii="Verdana" w:hAnsi="Verdana"/>
-          <w:b/>
-          <w:sz w:val="48"/>
-        </w:rPr>
-        <w:t>URANINIUM</w:t>
-      </w:r>
-      <w:r>
-        <w:rPr>
-          <w:rFonts w:ascii="Verdana" w:hAnsi="Verdana"/>
-          <w:b/>
-          <w:sz w:val="48"/>
-        </w:rPr>
-        <w:t>]</w:t>
-      </w:r>
-    </w:p>
-    <w:p>
-      <w:pPr>
-        <w:pStyle w:val="NoSpacing"/>
-        <w:rPr>
-          <w:rFonts w:ascii="Verdana" w:hAnsi="Verdana"/>
-          <w:b/>
-          <w:color w:val="00B050"/>
-          <w:sz w:val="48"/>
-        </w:rPr>
-      </w:pPr>
-      <w:r>
-        <w:rPr>
-          <w:rFonts w:ascii="Verdana" w:hAnsi="Verdana"/>
-          <w:b/>
-          <w:color w:val="00B050"/>
-          <w:sz w:val="48"/>
-        </w:rPr>
-        <w:t>FEATURES:</w:t>
+        <w:t xml:space="preserve">Random level generator uses Noise &amp; Random together </w:t>
+      </w:r>
+      <w:r>
+        <w:rPr>
+          <w:rFonts w:ascii="Verdana" w:hAnsi="Verdana"/>
+          <w:sz w:val="32"/>
+          <w:szCs w:val="32"/>
+        </w:rPr>
+        <w:t>t</w:t>
+      </w:r>
+      <w:r>
+        <w:rPr>
+          <w:rFonts w:ascii="Verdana" w:hAnsi="Verdana"/>
+          <w:sz w:val="32"/>
+          <w:szCs w:val="32"/>
+        </w:rPr>
+        <w:t>o generate random level. First Noise is applied</w:t>
+      </w:r>
+      <w:r>
+        <w:rPr>
+          <w:rFonts w:ascii="Verdana" w:hAnsi="Verdana"/>
+          <w:sz w:val="32"/>
+          <w:szCs w:val="32"/>
+        </w:rPr>
+        <w:t>,</w:t>
+      </w:r>
+      <w:r>
+        <w:rPr>
+          <w:rFonts w:ascii="Verdana" w:hAnsi="Verdana"/>
+          <w:sz w:val="32"/>
+          <w:szCs w:val="32"/>
+        </w:rPr>
+        <w:t xml:space="preserve"> then random after former is done.</w:t>
       </w:r>
     </w:p>
     <w:p>
@@ -2117,42 +1831,57 @@
           <w:ilvl w:val="0"/>
           <w:numId w:val="22"/>
         </w:numPr>
-      </w:pPr>
-      <w:r>
-        <w:rPr>
-          <w:rFonts w:ascii="Verdana" w:hAnsi="Verdana"/>
-          <w:sz w:val="32"/>
-          <w:szCs w:val="32"/>
-        </w:rPr>
-        <w:t>Linear interpolation of framerate (framerate is more stable).</w:t>
-      </w:r>
-    </w:p>
-    <w:p>
-      <w:pPr>
-        <w:pStyle w:val="NoSpacing"/>
-      </w:pPr>
-      <w:r>
-        <w:tab/>
-      </w:r>
-    </w:p>
-    <w:p>
-      <w:pPr>
-        <w:pStyle w:val="NoSpacing"/>
-        <w:rPr>
-          <w:rFonts w:ascii="Verdana" w:hAnsi="Verdana"/>
-          <w:b/>
-          <w:color w:val="FFC000"/>
-          <w:sz w:val="48"/>
-        </w:rPr>
-      </w:pPr>
-      <w:r>
-        <w:rPr>
-          <w:rFonts w:ascii="Verdana" w:hAnsi="Verdana"/>
-          <w:b/>
-          <w:color w:val="FFC000"/>
-          <w:sz w:val="48"/>
-        </w:rPr>
-        <w:t>CHANGES:</w:t>
+        <w:rPr>
+          <w:rFonts w:ascii="Verdana" w:hAnsi="Verdana"/>
+          <w:sz w:val="32"/>
+          <w:szCs w:val="32"/>
+        </w:rPr>
+      </w:pPr>
+      <w:r>
+        <w:rPr>
+          <w:rFonts w:ascii="Verdana" w:hAnsi="Verdana"/>
+          <w:sz w:val="32"/>
+          <w:szCs w:val="32"/>
+        </w:rPr>
+        <w:t>Block positions are aligned to the even number</w:t>
+      </w:r>
+      <w:r>
+        <w:rPr>
+          <w:rFonts w:ascii="Verdana" w:hAnsi="Verdana"/>
+          <w:sz w:val="32"/>
+          <w:szCs w:val="32"/>
+        </w:rPr>
+        <w:t>.</w:t>
+      </w:r>
+    </w:p>
+    <w:p>
+      <w:pPr>
+        <w:pStyle w:val="NoSpacing"/>
+        <w:rPr>
+          <w:rFonts w:ascii="Verdana" w:hAnsi="Verdana"/>
+          <w:sz w:val="32"/>
+          <w:szCs w:val="32"/>
+        </w:rPr>
+      </w:pPr>
+    </w:p>
+    <w:p>
+      <w:pPr>
+        <w:pStyle w:val="NoSpacing"/>
+        <w:rPr>
+          <w:rFonts w:ascii="Verdana" w:hAnsi="Verdana"/>
+          <w:b/>
+          <w:color w:val="FF0000"/>
+          <w:sz w:val="48"/>
+        </w:rPr>
+      </w:pPr>
+      <w:r>
+        <w:rPr>
+          <w:rFonts w:ascii="Verdana" w:hAnsi="Verdana"/>
+          <w:b/>
+          <w:color w:val="FF0000"/>
+          <w:sz w:val="48"/>
+        </w:rPr>
+        <w:t>FIXES:</w:t>
       </w:r>
     </w:p>
     <w:p>
@@ -2174,38 +1903,31 @@
           <w:sz w:val="32"/>
           <w:szCs w:val="32"/>
         </w:rPr>
-        <w:t>Chunk operations are done in separate thread. Lesser impact on update per second and faster. [JSomnia]</w:t>
-      </w:r>
-    </w:p>
-    <w:p>
-      <w:pPr>
-        <w:pStyle w:val="NoSpacing"/>
-        <w:ind w:left="360"/>
-        <w:rPr>
-          <w:rFonts w:ascii="Verdana" w:hAnsi="Verdana"/>
-          <w:sz w:val="32"/>
-          <w:szCs w:val="32"/>
-        </w:rPr>
-      </w:pPr>
-    </w:p>
-    <w:p>
-      <w:pPr>
-        <w:pStyle w:val="NoSpacing"/>
-        <w:rPr>
-          <w:rFonts w:ascii="Verdana" w:hAnsi="Verdana"/>
-          <w:b/>
-          <w:color w:val="FF0000"/>
-          <w:sz w:val="48"/>
-        </w:rPr>
-      </w:pPr>
-      <w:r>
-        <w:rPr>
-          <w:rFonts w:ascii="Verdana" w:hAnsi="Verdana"/>
-          <w:b/>
-          <w:color w:val="FF0000"/>
-          <w:sz w:val="48"/>
-        </w:rPr>
-        <w:t>FIXES:</w:t>
+        <w:t xml:space="preserve">Fixed </w:t>
+      </w:r>
+      <w:r>
+        <w:rPr>
+          <w:rFonts w:ascii="Verdana" w:hAnsi="Verdana"/>
+          <w:sz w:val="32"/>
+          <w:szCs w:val="32"/>
+        </w:rPr>
+        <w:t>exceptions when typing in the text</w:t>
+      </w:r>
+      <w:r>
+        <w:rPr>
+          <w:rFonts w:ascii="Verdana" w:hAnsi="Verdana"/>
+          <w:sz w:val="32"/>
+          <w:szCs w:val="32"/>
+        </w:rPr>
+        <w:t xml:space="preserve"> causing app to stop</w:t>
+      </w:r>
+      <w:r>
+        <w:rPr>
+          <w:rFonts w:ascii="Verdana" w:hAnsi="Verdana"/>
+          <w:sz w:val="32"/>
+          <w:szCs w:val="32"/>
+        </w:rPr>
+        <w:t>.</w:t>
       </w:r>
     </w:p>
     <w:p>
@@ -2215,14 +1937,240 @@
           <w:ilvl w:val="0"/>
           <w:numId w:val="22"/>
         </w:numPr>
-      </w:pPr>
-      <w:r>
-        <w:rPr>
-          <w:rFonts w:ascii="Verdana" w:hAnsi="Verdana"/>
-          <w:sz w:val="32"/>
-          <w:szCs w:val="32"/>
-        </w:rPr>
-        <w:t>Water Renderer is not broken anymore. [JSomnia]</w:t>
+        <w:rPr>
+          <w:rFonts w:ascii="Verdana" w:hAnsi="Verdana"/>
+          <w:sz w:val="32"/>
+          <w:szCs w:val="32"/>
+        </w:rPr>
+      </w:pPr>
+      <w:r>
+        <w:rPr>
+          <w:rFonts w:ascii="Verdana" w:hAnsi="Verdana"/>
+          <w:sz w:val="32"/>
+          <w:szCs w:val="32"/>
+        </w:rPr>
+        <w:t>Small performance gain.</w:t>
+      </w:r>
+    </w:p>
+    <w:p>
+      <w:pPr>
+        <w:pStyle w:val="NoSpacing"/>
+        <w:ind w:left="360"/>
+      </w:pPr>
+    </w:p>
+    <w:p>
+      <w:pPr>
+        <w:pStyle w:val="NoSpacing"/>
+        <w:ind w:left="360"/>
+      </w:pPr>
+    </w:p>
+    <w:p>
+      <w:pPr>
+        <w:pStyle w:val="NoSpacing"/>
+        <w:ind w:left="360"/>
+      </w:pPr>
+    </w:p>
+    <w:p>
+      <w:pPr>
+        <w:pStyle w:val="NoSpacing"/>
+        <w:ind w:left="360"/>
+      </w:pPr>
+    </w:p>
+    <w:p>
+      <w:pPr>
+        <w:pStyle w:val="NoSpacing"/>
+        <w:ind w:left="360"/>
+      </w:pPr>
+    </w:p>
+    <w:p>
+      <w:pPr>
+        <w:pStyle w:val="NoSpacing"/>
+        <w:ind w:left="360"/>
+      </w:pPr>
+    </w:p>
+    <w:p>
+      <w:pPr>
+        <w:pStyle w:val="NoSpacing"/>
+        <w:ind w:left="360"/>
+      </w:pPr>
+    </w:p>
+    <w:p>
+      <w:pPr>
+        <w:pStyle w:val="NoSpacing"/>
+        <w:ind w:left="360"/>
+      </w:pPr>
+    </w:p>
+    <w:p>
+      <w:pPr>
+        <w:pStyle w:val="NoSpacing"/>
+        <w:ind w:left="360"/>
+      </w:pPr>
+    </w:p>
+    <w:p>
+      <w:pPr>
+        <w:pStyle w:val="NoSpacing"/>
+        <w:ind w:left="360"/>
+      </w:pPr>
+    </w:p>
+    <w:p>
+      <w:pPr>
+        <w:pStyle w:val="NoSpacing"/>
+        <w:ind w:left="360"/>
+      </w:pPr>
+    </w:p>
+    <w:p>
+      <w:pPr>
+        <w:pStyle w:val="NoSpacing"/>
+        <w:ind w:left="360"/>
+      </w:pPr>
+    </w:p>
+    <w:p>
+      <w:pPr>
+        <w:pStyle w:val="NoSpacing"/>
+        <w:ind w:left="360"/>
+      </w:pPr>
+    </w:p>
+    <w:p>
+      <w:pPr>
+        <w:pStyle w:val="NoSpacing"/>
+        <w:ind w:left="360"/>
+      </w:pPr>
+    </w:p>
+    <w:p>
+      <w:pPr>
+        <w:pStyle w:val="NoSpacing"/>
+        <w:ind w:left="360"/>
+      </w:pPr>
+    </w:p>
+    <w:p>
+      <w:pPr>
+        <w:pStyle w:val="NoSpacing"/>
+        <w:rPr>
+          <w:rFonts w:ascii="Verdana" w:hAnsi="Verdana"/>
+          <w:b/>
+          <w:sz w:val="48"/>
+        </w:rPr>
+      </w:pPr>
+    </w:p>
+    <w:p>
+      <w:pPr>
+        <w:pStyle w:val="NoSpacing"/>
+        <w:rPr>
+          <w:rFonts w:ascii="Verdana" w:hAnsi="Verdana"/>
+          <w:b/>
+          <w:sz w:val="48"/>
+        </w:rPr>
+      </w:pPr>
+    </w:p>
+    <w:p>
+      <w:pPr>
+        <w:pStyle w:val="NoSpacing"/>
+        <w:rPr>
+          <w:rFonts w:ascii="Verdana" w:hAnsi="Verdana"/>
+          <w:b/>
+          <w:sz w:val="48"/>
+        </w:rPr>
+      </w:pPr>
+    </w:p>
+    <w:p>
+      <w:pPr>
+        <w:pStyle w:val="NoSpacing"/>
+        <w:rPr>
+          <w:rFonts w:ascii="Verdana" w:hAnsi="Verdana"/>
+          <w:b/>
+          <w:sz w:val="48"/>
+        </w:rPr>
+      </w:pPr>
+    </w:p>
+    <w:p>
+      <w:pPr>
+        <w:pStyle w:val="NoSpacing"/>
+        <w:rPr>
+          <w:rFonts w:ascii="Verdana" w:hAnsi="Verdana"/>
+          <w:b/>
+          <w:sz w:val="48"/>
+        </w:rPr>
+      </w:pPr>
+    </w:p>
+    <w:p>
+      <w:pPr>
+        <w:pStyle w:val="NoSpacing"/>
+        <w:rPr>
+          <w:rFonts w:ascii="Verdana" w:hAnsi="Verdana"/>
+          <w:b/>
+          <w:sz w:val="48"/>
+        </w:rPr>
+      </w:pPr>
+    </w:p>
+    <w:p>
+      <w:pPr>
+        <w:pStyle w:val="NoSpacing"/>
+        <w:rPr>
+          <w:rFonts w:ascii="Verdana" w:hAnsi="Verdana"/>
+          <w:b/>
+          <w:sz w:val="48"/>
+        </w:rPr>
+      </w:pPr>
+    </w:p>
+    <w:p>
+      <w:pPr>
+        <w:pStyle w:val="NoSpacing"/>
+        <w:jc w:val="center"/>
+      </w:pPr>
+    </w:p>
+    <w:p>
+      <w:pPr>
+        <w:pStyle w:val="NoSpacing"/>
+        <w:jc w:val="center"/>
+        <w:rPr>
+          <w:rFonts w:ascii="Verdana" w:hAnsi="Verdana"/>
+          <w:b/>
+          <w:sz w:val="48"/>
+        </w:rPr>
+      </w:pPr>
+      <w:r>
+        <w:rPr>
+          <w:rFonts w:ascii="Verdana" w:hAnsi="Verdana"/>
+          <w:b/>
+          <w:sz w:val="48"/>
+        </w:rPr>
+        <w:t>[</w:t>
+      </w:r>
+      <w:r>
+        <w:rPr>
+          <w:rFonts w:ascii="Verdana" w:hAnsi="Verdana"/>
+          <w:b/>
+          <w:sz w:val="48"/>
+        </w:rPr>
+        <w:t>URANINIUM</w:t>
+      </w:r>
+      <w:r>
+        <w:rPr>
+          <w:rFonts w:ascii="Verdana" w:hAnsi="Verdana"/>
+          <w:b/>
+          <w:sz w:val="48"/>
+        </w:rPr>
+        <w:t>]</w:t>
+      </w:r>
+    </w:p>
+    <w:p>
+      <w:pPr>
+        <w:pStyle w:val="NoSpacing"/>
+        <w:rPr>
+          <w:rFonts w:ascii="Verdana" w:hAnsi="Verdana"/>
+          <w:b/>
+          <w:color w:val="00B050"/>
+          <w:sz w:val="48"/>
+        </w:rPr>
+      </w:pPr>
+      <w:r>
+        <w:rPr>
+          <w:rFonts w:ascii="Verdana" w:hAnsi="Verdana"/>
+          <w:b/>
+          <w:color w:val="00B050"/>
+          <w:sz w:val="48"/>
+        </w:rPr>
+        <w:t>FEATURES:</w:t>
       </w:r>
     </w:p>
     <w:p>
@@ -2239,236 +2187,35 @@
           <w:sz w:val="32"/>
           <w:szCs w:val="32"/>
         </w:rPr>
-        <w:t>Game consumes lesser memory (still needs 1.5 GB of RAM for randmax level). [JSomnia]</w:t>
-      </w:r>
-    </w:p>
-    <w:p>
-      <w:pPr>
-        <w:pStyle w:val="NoSpacing"/>
-        <w:ind w:left="360"/>
-      </w:pPr>
-    </w:p>
-    <w:p>
-      <w:pPr>
-        <w:pStyle w:val="NoSpacing"/>
-        <w:rPr>
-          <w:rFonts w:ascii="Verdana" w:hAnsi="Verdana"/>
-          <w:b/>
-          <w:sz w:val="48"/>
-        </w:rPr>
-      </w:pPr>
-      <w:r>
-        <w:rPr>
-          <w:rFonts w:ascii="Verdana" w:hAnsi="Verdana"/>
-          <w:b/>
-          <w:sz w:val="48"/>
-        </w:rPr>
-        <w:t>*Notice this is bug/issue fix release.</w:t>
-      </w:r>
-    </w:p>
-    <w:p>
-      <w:pPr>
-        <w:pStyle w:val="NoSpacing"/>
-        <w:ind w:left="360"/>
-        <w:rPr>
-          <w:rFonts w:ascii="Verdana" w:hAnsi="Verdana"/>
-          <w:b/>
-          <w:sz w:val="48"/>
-        </w:rPr>
-      </w:pPr>
-    </w:p>
-    <w:p>
-      <w:pPr>
-        <w:pStyle w:val="NoSpacing"/>
-        <w:ind w:left="360"/>
-        <w:rPr>
-          <w:rFonts w:ascii="Verdana" w:hAnsi="Verdana"/>
-          <w:b/>
-          <w:sz w:val="48"/>
-        </w:rPr>
-      </w:pPr>
-    </w:p>
-    <w:p>
-      <w:pPr>
-        <w:pStyle w:val="NoSpacing"/>
-        <w:ind w:left="360"/>
-        <w:rPr>
-          <w:rFonts w:ascii="Verdana" w:hAnsi="Verdana"/>
-          <w:b/>
-          <w:sz w:val="48"/>
-        </w:rPr>
-      </w:pPr>
-    </w:p>
-    <w:p>
-      <w:pPr>
-        <w:pStyle w:val="NoSpacing"/>
-        <w:ind w:left="360"/>
-        <w:rPr>
-          <w:rFonts w:ascii="Verdana" w:hAnsi="Verdana"/>
-          <w:b/>
-          <w:sz w:val="48"/>
-        </w:rPr>
-      </w:pPr>
-    </w:p>
-    <w:p>
-      <w:pPr>
-        <w:pStyle w:val="NoSpacing"/>
-        <w:ind w:left="360"/>
-        <w:rPr>
-          <w:rFonts w:ascii="Verdana" w:hAnsi="Verdana"/>
-          <w:b/>
-          <w:sz w:val="48"/>
-        </w:rPr>
-      </w:pPr>
-    </w:p>
-    <w:p>
-      <w:pPr>
-        <w:pStyle w:val="NoSpacing"/>
-        <w:rPr>
-          <w:rFonts w:ascii="Verdana" w:hAnsi="Verdana"/>
-          <w:b/>
-          <w:sz w:val="48"/>
-        </w:rPr>
-      </w:pPr>
-    </w:p>
-    <w:p>
-      <w:pPr>
-        <w:pStyle w:val="NoSpacing"/>
-        <w:jc w:val="center"/>
-      </w:pPr>
-    </w:p>
-    <w:p>
-      <w:pPr>
-        <w:pStyle w:val="NoSpacing"/>
-        <w:jc w:val="center"/>
-      </w:pPr>
-    </w:p>
-    <w:p>
-      <w:pPr>
-        <w:pStyle w:val="NoSpacing"/>
-        <w:jc w:val="center"/>
-      </w:pPr>
-    </w:p>
-    <w:p>
-      <w:pPr>
-        <w:pStyle w:val="NoSpacing"/>
-        <w:jc w:val="center"/>
-      </w:pPr>
-    </w:p>
-    <w:p>
-      <w:pPr>
-        <w:pStyle w:val="NoSpacing"/>
-        <w:jc w:val="center"/>
-      </w:pPr>
-    </w:p>
-    <w:p>
-      <w:pPr>
-        <w:pStyle w:val="NoSpacing"/>
-        <w:jc w:val="center"/>
-      </w:pPr>
-    </w:p>
-    <w:p>
-      <w:pPr>
-        <w:pStyle w:val="NoSpacing"/>
-        <w:jc w:val="center"/>
-      </w:pPr>
-    </w:p>
-    <w:p>
-      <w:pPr>
-        <w:pStyle w:val="NoSpacing"/>
-        <w:jc w:val="center"/>
-      </w:pPr>
-    </w:p>
-    <w:p>
-      <w:pPr>
-        <w:pStyle w:val="NoSpacing"/>
-        <w:jc w:val="center"/>
-      </w:pPr>
-    </w:p>
-    <w:p>
-      <w:pPr>
-        <w:pStyle w:val="NoSpacing"/>
-        <w:jc w:val="center"/>
-      </w:pPr>
-    </w:p>
-    <w:p>
-      <w:pPr>
-        <w:pStyle w:val="NoSpacing"/>
-        <w:jc w:val="center"/>
-      </w:pPr>
-    </w:p>
-    <w:p>
-      <w:pPr>
-        <w:pStyle w:val="NoSpacing"/>
-        <w:jc w:val="center"/>
-      </w:pPr>
-    </w:p>
-    <w:p>
-      <w:pPr>
-        <w:pStyle w:val="NoSpacing"/>
-        <w:jc w:val="center"/>
-      </w:pPr>
-    </w:p>
-    <w:p>
-      <w:pPr>
-        <w:pStyle w:val="NoSpacing"/>
-        <w:jc w:val="center"/>
-      </w:pPr>
-    </w:p>
-    <w:p>
-      <w:pPr>
-        <w:pStyle w:val="NoSpacing"/>
-        <w:jc w:val="center"/>
-        <w:rPr>
-          <w:rFonts w:ascii="Verdana" w:hAnsi="Verdana"/>
-          <w:b/>
-          <w:sz w:val="48"/>
-        </w:rPr>
-      </w:pPr>
-      <w:r>
-        <w:rPr>
-          <w:rFonts w:ascii="Verdana" w:hAnsi="Verdana"/>
-          <w:b/>
-          <w:sz w:val="48"/>
-        </w:rPr>
-        <w:lastRenderedPageBreak/>
-        <w:t>[</w:t>
-      </w:r>
-      <w:r>
-        <w:rPr>
-          <w:rFonts w:ascii="Verdana" w:hAnsi="Verdana"/>
-          <w:b/>
-          <w:sz w:val="48"/>
-        </w:rPr>
-        <w:t>TITANIUM</w:t>
-      </w:r>
-      <w:r>
-        <w:rPr>
-          <w:rFonts w:ascii="Verdana" w:hAnsi="Verdana"/>
-          <w:b/>
-          <w:sz w:val="48"/>
-        </w:rPr>
-        <w:t>]</w:t>
-      </w:r>
-    </w:p>
-    <w:p>
-      <w:pPr>
-        <w:pStyle w:val="NoSpacing"/>
-        <w:rPr>
-          <w:rFonts w:ascii="Verdana" w:hAnsi="Verdana"/>
-          <w:b/>
-          <w:color w:val="00B050"/>
-          <w:sz w:val="48"/>
-        </w:rPr>
-      </w:pPr>
-      <w:r>
-        <w:rPr>
-          <w:rFonts w:ascii="Verdana" w:hAnsi="Verdana"/>
-          <w:b/>
-          <w:color w:val="00B050"/>
-          <w:sz w:val="48"/>
-        </w:rPr>
-        <w:t>FEATURES:</w:t>
+        <w:t>Linear interpolation of framerate (framerate is more stable).</w:t>
+      </w:r>
+    </w:p>
+    <w:p>
+      <w:pPr>
+        <w:pStyle w:val="NoSpacing"/>
+      </w:pPr>
+      <w:r>
+        <w:tab/>
+      </w:r>
+    </w:p>
+    <w:p>
+      <w:pPr>
+        <w:pStyle w:val="NoSpacing"/>
+        <w:rPr>
+          <w:rFonts w:ascii="Verdana" w:hAnsi="Verdana"/>
+          <w:b/>
+          <w:color w:val="FFC000"/>
+          <w:sz w:val="48"/>
+        </w:rPr>
+      </w:pPr>
+      <w:r>
+        <w:rPr>
+          <w:rFonts w:ascii="Verdana" w:hAnsi="Verdana"/>
+          <w:b/>
+          <w:color w:val="FFC000"/>
+          <w:sz w:val="48"/>
+        </w:rPr>
+        <w:t>CHANGES:</w:t>
       </w:r>
     </w:p>
     <w:p>
@@ -2478,40 +2225,50 @@
           <w:ilvl w:val="0"/>
           <w:numId w:val="22"/>
         </w:numPr>
-      </w:pPr>
-      <w:r>
-        <w:rPr>
-          <w:rFonts w:ascii="Verdana" w:hAnsi="Verdana"/>
-          <w:sz w:val="32"/>
-          <w:szCs w:val="32"/>
-        </w:rPr>
-        <w:t>Console commands now have post execution status (red if command fails or green if it’s success). If command is not recognized it will have white light bulb.</w:t>
-      </w:r>
-    </w:p>
-    <w:p>
-      <w:pPr>
-        <w:pStyle w:val="NoSpacing"/>
-        <w:jc w:val="center"/>
-      </w:pPr>
-    </w:p>
-    <w:p>
-      <w:pPr>
-        <w:pStyle w:val="NoSpacing"/>
-        <w:rPr>
-          <w:rFonts w:ascii="Verdana" w:hAnsi="Verdana"/>
-          <w:b/>
-          <w:color w:val="FFC000"/>
-          <w:sz w:val="48"/>
-        </w:rPr>
-      </w:pPr>
-      <w:r>
-        <w:rPr>
-          <w:rFonts w:ascii="Verdana" w:hAnsi="Verdana"/>
-          <w:b/>
-          <w:color w:val="FFC000"/>
-          <w:sz w:val="48"/>
-        </w:rPr>
-        <w:t>CHANGES:</w:t>
+        <w:rPr>
+          <w:rFonts w:ascii="Verdana" w:hAnsi="Verdana"/>
+          <w:sz w:val="32"/>
+          <w:szCs w:val="32"/>
+        </w:rPr>
+      </w:pPr>
+      <w:r>
+        <w:rPr>
+          <w:rFonts w:ascii="Verdana" w:hAnsi="Verdana"/>
+          <w:sz w:val="32"/>
+          <w:szCs w:val="32"/>
+        </w:rPr>
+        <w:t>Chunk operations are done in separate thread. Lesser impact on update per second and faster. [JSomnia]</w:t>
+      </w:r>
+    </w:p>
+    <w:p>
+      <w:pPr>
+        <w:pStyle w:val="NoSpacing"/>
+        <w:ind w:left="360"/>
+        <w:rPr>
+          <w:rFonts w:ascii="Verdana" w:hAnsi="Verdana"/>
+          <w:sz w:val="32"/>
+          <w:szCs w:val="32"/>
+        </w:rPr>
+      </w:pPr>
+    </w:p>
+    <w:p>
+      <w:pPr>
+        <w:pStyle w:val="NoSpacing"/>
+        <w:rPr>
+          <w:rFonts w:ascii="Verdana" w:hAnsi="Verdana"/>
+          <w:b/>
+          <w:color w:val="FF0000"/>
+          <w:sz w:val="48"/>
+        </w:rPr>
+      </w:pPr>
+      <w:r>
+        <w:rPr>
+          <w:rFonts w:ascii="Verdana" w:hAnsi="Verdana"/>
+          <w:b/>
+          <w:color w:val="FF0000"/>
+          <w:sz w:val="48"/>
+        </w:rPr>
+        <w:t>FIXES:</w:t>
       </w:r>
     </w:p>
     <w:p>
@@ -2528,30 +2285,7 @@
           <w:sz w:val="32"/>
           <w:szCs w:val="32"/>
         </w:rPr>
-        <w:t>Chunk function is improved</w:t>
-      </w:r>
-      <w:r>
-        <w:rPr>
-          <w:rFonts w:ascii="Verdana" w:hAnsi="Verdana"/>
-          <w:sz w:val="32"/>
-          <w:szCs w:val="32"/>
-        </w:rPr>
-        <w:t>.</w:t>
-      </w:r>
-      <w:r>
-        <w:rPr>
-          <w:rFonts w:ascii="Verdana" w:hAnsi="Verdana"/>
-          <w:sz w:val="32"/>
-          <w:szCs w:val="32"/>
-        </w:rPr>
-        <w:t xml:space="preserve"> Blocks doesn’t appear unexpectedly. </w:t>
-      </w:r>
-      <w:r>
-        <w:rPr>
-          <w:rFonts w:ascii="Verdana" w:hAnsi="Verdana"/>
-          <w:sz w:val="32"/>
-        </w:rPr>
-        <w:t>[JSomnia]</w:t>
+        <w:t>Water Renderer is not broken anymore. [JSomnia]</w:t>
       </w:r>
     </w:p>
     <w:p>
@@ -2566,22 +2300,237 @@
         <w:rPr>
           <w:rFonts w:ascii="Verdana" w:hAnsi="Verdana"/>
           <w:sz w:val="32"/>
-        </w:rPr>
-        <w:t>Default settings are changed. Mouse sen</w:t>
-      </w:r>
-      <w:r>
-        <w:rPr>
-          <w:rFonts w:ascii="Verdana" w:hAnsi="Verdana"/>
-          <w:sz w:val="32"/>
-        </w:rPr>
-        <w:t>si</w:t>
-      </w:r>
-      <w:r>
-        <w:rPr>
-          <w:rFonts w:ascii="Verdana" w:hAnsi="Verdana"/>
-          <w:sz w:val="32"/>
-        </w:rPr>
-        <w:t>tivity set from 3.0 to 1.5 and Music and Sound volumes are set from 1.0 to 0.5 [JSomnia]</w:t>
+          <w:szCs w:val="32"/>
+        </w:rPr>
+        <w:t>Game consumes lesser memory (still needs 1.5 GB of RAM for randmax level). [JSomnia]</w:t>
+      </w:r>
+    </w:p>
+    <w:p>
+      <w:pPr>
+        <w:pStyle w:val="NoSpacing"/>
+        <w:ind w:left="360"/>
+      </w:pPr>
+    </w:p>
+    <w:p>
+      <w:pPr>
+        <w:pStyle w:val="NoSpacing"/>
+        <w:rPr>
+          <w:rFonts w:ascii="Verdana" w:hAnsi="Verdana"/>
+          <w:b/>
+          <w:sz w:val="48"/>
+        </w:rPr>
+      </w:pPr>
+      <w:r>
+        <w:rPr>
+          <w:rFonts w:ascii="Verdana" w:hAnsi="Verdana"/>
+          <w:b/>
+          <w:sz w:val="48"/>
+        </w:rPr>
+        <w:t>*Notice this is bug/issue fix release.</w:t>
+      </w:r>
+    </w:p>
+    <w:p>
+      <w:pPr>
+        <w:pStyle w:val="NoSpacing"/>
+        <w:ind w:left="360"/>
+        <w:rPr>
+          <w:rFonts w:ascii="Verdana" w:hAnsi="Verdana"/>
+          <w:b/>
+          <w:sz w:val="48"/>
+        </w:rPr>
+      </w:pPr>
+    </w:p>
+    <w:p>
+      <w:pPr>
+        <w:pStyle w:val="NoSpacing"/>
+        <w:ind w:left="360"/>
+        <w:rPr>
+          <w:rFonts w:ascii="Verdana" w:hAnsi="Verdana"/>
+          <w:b/>
+          <w:sz w:val="48"/>
+        </w:rPr>
+      </w:pPr>
+    </w:p>
+    <w:p>
+      <w:pPr>
+        <w:pStyle w:val="NoSpacing"/>
+        <w:ind w:left="360"/>
+        <w:rPr>
+          <w:rFonts w:ascii="Verdana" w:hAnsi="Verdana"/>
+          <w:b/>
+          <w:sz w:val="48"/>
+        </w:rPr>
+      </w:pPr>
+    </w:p>
+    <w:p>
+      <w:pPr>
+        <w:pStyle w:val="NoSpacing"/>
+        <w:ind w:left="360"/>
+        <w:rPr>
+          <w:rFonts w:ascii="Verdana" w:hAnsi="Verdana"/>
+          <w:b/>
+          <w:sz w:val="48"/>
+        </w:rPr>
+      </w:pPr>
+    </w:p>
+    <w:p>
+      <w:pPr>
+        <w:pStyle w:val="NoSpacing"/>
+        <w:ind w:left="360"/>
+        <w:rPr>
+          <w:rFonts w:ascii="Verdana" w:hAnsi="Verdana"/>
+          <w:b/>
+          <w:sz w:val="48"/>
+        </w:rPr>
+      </w:pPr>
+    </w:p>
+    <w:p>
+      <w:pPr>
+        <w:pStyle w:val="NoSpacing"/>
+        <w:rPr>
+          <w:rFonts w:ascii="Verdana" w:hAnsi="Verdana"/>
+          <w:b/>
+          <w:sz w:val="48"/>
+        </w:rPr>
+      </w:pPr>
+    </w:p>
+    <w:p>
+      <w:pPr>
+        <w:pStyle w:val="NoSpacing"/>
+        <w:jc w:val="center"/>
+      </w:pPr>
+    </w:p>
+    <w:p>
+      <w:pPr>
+        <w:pStyle w:val="NoSpacing"/>
+        <w:jc w:val="center"/>
+      </w:pPr>
+    </w:p>
+    <w:p>
+      <w:pPr>
+        <w:pStyle w:val="NoSpacing"/>
+        <w:jc w:val="center"/>
+      </w:pPr>
+    </w:p>
+    <w:p>
+      <w:pPr>
+        <w:pStyle w:val="NoSpacing"/>
+        <w:jc w:val="center"/>
+      </w:pPr>
+    </w:p>
+    <w:p>
+      <w:pPr>
+        <w:pStyle w:val="NoSpacing"/>
+        <w:jc w:val="center"/>
+      </w:pPr>
+    </w:p>
+    <w:p>
+      <w:pPr>
+        <w:pStyle w:val="NoSpacing"/>
+        <w:jc w:val="center"/>
+      </w:pPr>
+    </w:p>
+    <w:p>
+      <w:pPr>
+        <w:pStyle w:val="NoSpacing"/>
+        <w:jc w:val="center"/>
+      </w:pPr>
+    </w:p>
+    <w:p>
+      <w:pPr>
+        <w:pStyle w:val="NoSpacing"/>
+        <w:jc w:val="center"/>
+      </w:pPr>
+    </w:p>
+    <w:p>
+      <w:pPr>
+        <w:pStyle w:val="NoSpacing"/>
+        <w:jc w:val="center"/>
+      </w:pPr>
+    </w:p>
+    <w:p>
+      <w:pPr>
+        <w:pStyle w:val="NoSpacing"/>
+        <w:jc w:val="center"/>
+      </w:pPr>
+    </w:p>
+    <w:p>
+      <w:pPr>
+        <w:pStyle w:val="NoSpacing"/>
+        <w:jc w:val="center"/>
+      </w:pPr>
+    </w:p>
+    <w:p>
+      <w:pPr>
+        <w:pStyle w:val="NoSpacing"/>
+        <w:jc w:val="center"/>
+      </w:pPr>
+    </w:p>
+    <w:p>
+      <w:pPr>
+        <w:pStyle w:val="NoSpacing"/>
+        <w:jc w:val="center"/>
+      </w:pPr>
+    </w:p>
+    <w:p>
+      <w:pPr>
+        <w:pStyle w:val="NoSpacing"/>
+        <w:jc w:val="center"/>
+      </w:pPr>
+    </w:p>
+    <w:p>
+      <w:pPr>
+        <w:pStyle w:val="NoSpacing"/>
+        <w:jc w:val="center"/>
+        <w:rPr>
+          <w:rFonts w:ascii="Verdana" w:hAnsi="Verdana"/>
+          <w:b/>
+          <w:sz w:val="48"/>
+        </w:rPr>
+      </w:pPr>
+      <w:r>
+        <w:rPr>
+          <w:rFonts w:ascii="Verdana" w:hAnsi="Verdana"/>
+          <w:b/>
+          <w:sz w:val="48"/>
+        </w:rPr>
+        <w:t>[</w:t>
+      </w:r>
+      <w:r>
+        <w:rPr>
+          <w:rFonts w:ascii="Verdana" w:hAnsi="Verdana"/>
+          <w:b/>
+          <w:sz w:val="48"/>
+        </w:rPr>
+        <w:t>TITANIUM</w:t>
+      </w:r>
+      <w:r>
+        <w:rPr>
+          <w:rFonts w:ascii="Verdana" w:hAnsi="Verdana"/>
+          <w:b/>
+          <w:sz w:val="48"/>
+        </w:rPr>
+        <w:t>]</w:t>
+      </w:r>
+    </w:p>
+    <w:p>
+      <w:pPr>
+        <w:pStyle w:val="NoSpacing"/>
+        <w:rPr>
+          <w:rFonts w:ascii="Verdana" w:hAnsi="Verdana"/>
+          <w:b/>
+          <w:color w:val="00B050"/>
+          <w:sz w:val="48"/>
+        </w:rPr>
+      </w:pPr>
+      <w:r>
+        <w:rPr>
+          <w:rFonts w:ascii="Verdana" w:hAnsi="Verdana"/>
+          <w:b/>
+          <w:color w:val="00B050"/>
+          <w:sz w:val="48"/>
+        </w:rPr>
+        <w:t>FEATURES:</w:t>
       </w:r>
     </w:p>
     <w:p>
@@ -2596,8 +2545,35 @@
         <w:rPr>
           <w:rFonts w:ascii="Verdana" w:hAnsi="Verdana"/>
           <w:sz w:val="32"/>
-        </w:rPr>
-        <w:t>Program consumes less memory in general.</w:t>
+          <w:szCs w:val="32"/>
+        </w:rPr>
+        <w:t>Console commands now have post execution status (red if command fails or green if it’s success). If command is not recognized it will have white light bulb.</w:t>
+      </w:r>
+    </w:p>
+    <w:p>
+      <w:pPr>
+        <w:pStyle w:val="NoSpacing"/>
+        <w:jc w:val="center"/>
+      </w:pPr>
+    </w:p>
+    <w:p>
+      <w:pPr>
+        <w:pStyle w:val="NoSpacing"/>
+        <w:rPr>
+          <w:rFonts w:ascii="Verdana" w:hAnsi="Verdana"/>
+          <w:b/>
+          <w:color w:val="FFC000"/>
+          <w:sz w:val="48"/>
+        </w:rPr>
+      </w:pPr>
+      <w:r>
+        <w:rPr>
+          <w:rFonts w:ascii="Verdana" w:hAnsi="Verdana"/>
+          <w:b/>
+          <w:color w:val="FFC000"/>
+          <w:sz w:val="48"/>
+        </w:rPr>
+        <w:t>CHANGES:</w:t>
       </w:r>
     </w:p>
     <w:p>
@@ -2612,38 +2588,32 @@
         <w:rPr>
           <w:rFonts w:ascii="Verdana" w:hAnsi="Verdana"/>
           <w:sz w:val="32"/>
-        </w:rPr>
-        <w:t>Game is more responsive when loading/saving chunks in general.</w:t>
-      </w:r>
-    </w:p>
-    <w:p>
-      <w:pPr>
-        <w:pStyle w:val="NoSpacing"/>
-        <w:rPr>
-          <w:rFonts w:ascii="Verdana" w:hAnsi="Verdana"/>
-          <w:sz w:val="32"/>
-          <w:szCs w:val="32"/>
-        </w:rPr>
-      </w:pPr>
-    </w:p>
-    <w:p>
-      <w:pPr>
-        <w:pStyle w:val="NoSpacing"/>
-        <w:rPr>
-          <w:rFonts w:ascii="Verdana" w:hAnsi="Verdana"/>
-          <w:b/>
-          <w:color w:val="FF0000"/>
-          <w:sz w:val="48"/>
-        </w:rPr>
-      </w:pPr>
-      <w:r>
-        <w:rPr>
-          <w:rFonts w:ascii="Verdana" w:hAnsi="Verdana"/>
-          <w:b/>
-          <w:color w:val="FF0000"/>
-          <w:sz w:val="48"/>
-        </w:rPr>
-        <w:t>FIXES:</w:t>
+          <w:szCs w:val="32"/>
+        </w:rPr>
+        <w:t>Chunk function is improved</w:t>
+      </w:r>
+      <w:r>
+        <w:rPr>
+          <w:rFonts w:ascii="Verdana" w:hAnsi="Verdana"/>
+          <w:sz w:val="32"/>
+          <w:szCs w:val="32"/>
+        </w:rPr>
+        <w:t>.</w:t>
+      </w:r>
+      <w:r>
+        <w:rPr>
+          <w:rFonts w:ascii="Verdana" w:hAnsi="Verdana"/>
+          <w:sz w:val="32"/>
+          <w:szCs w:val="32"/>
+        </w:rPr>
+        <w:t xml:space="preserve"> Blocks doesn’t appear unexpectedly. </w:t>
+      </w:r>
+      <w:r>
+        <w:rPr>
+          <w:rFonts w:ascii="Verdana" w:hAnsi="Verdana"/>
+          <w:sz w:val="32"/>
+        </w:rPr>
+        <w:t>[JSomnia]</w:t>
       </w:r>
     </w:p>
     <w:p>
@@ -2658,196 +2628,22 @@
         <w:rPr>
           <w:rFonts w:ascii="Verdana" w:hAnsi="Verdana"/>
           <w:sz w:val="32"/>
-          <w:szCs w:val="32"/>
-        </w:rPr>
-        <w:t>[Options Menu] One changed setting doesn’t change all settings</w:t>
-      </w:r>
-      <w:r>
-        <w:rPr>
-          <w:rFonts w:ascii="Verdana" w:hAnsi="Verdana"/>
-          <w:sz w:val="32"/>
-          <w:szCs w:val="32"/>
-        </w:rPr>
-        <w:t xml:space="preserve"> unexpectedly</w:t>
-      </w:r>
-      <w:r>
-        <w:rPr>
-          <w:rFonts w:ascii="Verdana" w:hAnsi="Verdana"/>
-          <w:sz w:val="32"/>
-          <w:szCs w:val="32"/>
-        </w:rPr>
-        <w:t>.</w:t>
-      </w:r>
-    </w:p>
-    <w:p>
-      <w:pPr>
-        <w:pStyle w:val="NoSpacing"/>
-        <w:jc w:val="center"/>
-        <w:rPr>
-          <w:rFonts w:ascii="Verdana" w:hAnsi="Verdana"/>
-          <w:b/>
-          <w:sz w:val="48"/>
-        </w:rPr>
-      </w:pPr>
-    </w:p>
-    <w:p>
-      <w:pPr>
-        <w:pStyle w:val="NoSpacing"/>
-        <w:jc w:val="center"/>
-        <w:rPr>
-          <w:rFonts w:ascii="Verdana" w:hAnsi="Verdana"/>
-          <w:b/>
-          <w:sz w:val="48"/>
-        </w:rPr>
-      </w:pPr>
-    </w:p>
-    <w:p>
-      <w:pPr>
-        <w:pStyle w:val="NoSpacing"/>
-        <w:jc w:val="center"/>
-        <w:rPr>
-          <w:rFonts w:ascii="Verdana" w:hAnsi="Verdana"/>
-          <w:b/>
-          <w:sz w:val="48"/>
-        </w:rPr>
-      </w:pPr>
-    </w:p>
-    <w:p>
-      <w:pPr>
-        <w:pStyle w:val="NoSpacing"/>
-        <w:jc w:val="center"/>
-        <w:rPr>
-          <w:rFonts w:ascii="Verdana" w:hAnsi="Verdana"/>
-          <w:b/>
-          <w:sz w:val="48"/>
-        </w:rPr>
-      </w:pPr>
-    </w:p>
-    <w:p>
-      <w:pPr>
-        <w:pStyle w:val="NoSpacing"/>
-        <w:jc w:val="center"/>
-        <w:rPr>
-          <w:rFonts w:ascii="Verdana" w:hAnsi="Verdana"/>
-          <w:b/>
-          <w:sz w:val="48"/>
-        </w:rPr>
-      </w:pPr>
-    </w:p>
-    <w:p>
-      <w:pPr>
-        <w:pStyle w:val="NoSpacing"/>
-        <w:jc w:val="center"/>
-        <w:rPr>
-          <w:rFonts w:ascii="Verdana" w:hAnsi="Verdana"/>
-          <w:b/>
-          <w:sz w:val="48"/>
-        </w:rPr>
-      </w:pPr>
-    </w:p>
-    <w:p>
-      <w:pPr>
-        <w:pStyle w:val="NoSpacing"/>
-        <w:jc w:val="center"/>
-        <w:rPr>
-          <w:rFonts w:ascii="Verdana" w:hAnsi="Verdana"/>
-          <w:b/>
-          <w:sz w:val="48"/>
-        </w:rPr>
-      </w:pPr>
-    </w:p>
-    <w:p>
-      <w:pPr>
-        <w:pStyle w:val="NoSpacing"/>
-        <w:jc w:val="center"/>
-        <w:rPr>
-          <w:rFonts w:ascii="Verdana" w:hAnsi="Verdana"/>
-          <w:b/>
-          <w:sz w:val="48"/>
-        </w:rPr>
-      </w:pPr>
-    </w:p>
-    <w:p>
-      <w:pPr>
-        <w:pStyle w:val="NoSpacing"/>
-        <w:jc w:val="center"/>
-        <w:rPr>
-          <w:rFonts w:ascii="Verdana" w:hAnsi="Verdana"/>
-          <w:b/>
-          <w:sz w:val="48"/>
-        </w:rPr>
-      </w:pPr>
-    </w:p>
-    <w:p>
-      <w:pPr>
-        <w:pStyle w:val="NoSpacing"/>
-        <w:jc w:val="center"/>
-        <w:rPr>
-          <w:rFonts w:ascii="Verdana" w:hAnsi="Verdana"/>
-          <w:b/>
-          <w:sz w:val="48"/>
-        </w:rPr>
-      </w:pPr>
-    </w:p>
-    <w:p>
-      <w:pPr>
-        <w:pStyle w:val="NoSpacing"/>
-        <w:jc w:val="center"/>
-        <w:rPr>
-          <w:rFonts w:ascii="Verdana" w:hAnsi="Verdana"/>
-          <w:b/>
-          <w:sz w:val="48"/>
-        </w:rPr>
-      </w:pPr>
-      <w:r>
-        <w:rPr>
-          <w:rFonts w:ascii="Verdana" w:hAnsi="Verdana"/>
-          <w:b/>
-          <w:sz w:val="48"/>
-        </w:rPr>
-        <w:lastRenderedPageBreak/>
-        <w:t>[</w:t>
-      </w:r>
-      <w:r>
-        <w:rPr>
-          <w:rFonts w:ascii="Verdana" w:hAnsi="Verdana"/>
-          <w:b/>
-          <w:sz w:val="48"/>
-        </w:rPr>
-        <w:t>STONEWALL</w:t>
-      </w:r>
-      <w:r>
-        <w:rPr>
-          <w:rFonts w:ascii="Verdana" w:hAnsi="Verdana"/>
-          <w:b/>
-          <w:sz w:val="48"/>
-        </w:rPr>
-        <w:t>]</w:t>
-      </w:r>
-    </w:p>
-    <w:p>
-      <w:pPr>
-        <w:pStyle w:val="NoSpacing"/>
-      </w:pPr>
-    </w:p>
-    <w:p>
-      <w:pPr>
-        <w:pStyle w:val="NoSpacing"/>
-        <w:rPr>
-          <w:rFonts w:ascii="Verdana" w:hAnsi="Verdana"/>
-          <w:b/>
-          <w:color w:val="00B050"/>
-          <w:sz w:val="48"/>
-        </w:rPr>
-      </w:pPr>
-      <w:r>
-        <w:rPr>
-          <w:rFonts w:ascii="Verdana" w:hAnsi="Verdana"/>
-          <w:b/>
-          <w:color w:val="00B050"/>
-          <w:sz w:val="48"/>
-        </w:rPr>
-        <w:t>FEATURES:</w:t>
+        </w:rPr>
+        <w:t>Default settings are changed. Mouse sen</w:t>
+      </w:r>
+      <w:r>
+        <w:rPr>
+          <w:rFonts w:ascii="Verdana" w:hAnsi="Verdana"/>
+          <w:sz w:val="32"/>
+        </w:rPr>
+        <w:t>si</w:t>
+      </w:r>
+      <w:r>
+        <w:rPr>
+          <w:rFonts w:ascii="Verdana" w:hAnsi="Verdana"/>
+          <w:sz w:val="32"/>
+        </w:rPr>
+        <w:t>tivity set from 3.0 to 1.5 and Music and Sound volumes are set from 1.0 to 0.5 [JSomnia]</w:t>
       </w:r>
     </w:p>
     <w:p>
@@ -2862,23 +2658,8 @@
         <w:rPr>
           <w:rFonts w:ascii="Verdana" w:hAnsi="Verdana"/>
           <w:sz w:val="32"/>
-          <w:szCs w:val="32"/>
-        </w:rPr>
-        <w:t>Safety from unresponsive or failed application is implemented.</w:t>
-      </w:r>
-    </w:p>
-    <w:p>
-      <w:pPr>
-        <w:pStyle w:val="NoSpacing"/>
-        <w:ind w:left="360"/>
-      </w:pPr>
-      <w:r>
-        <w:rPr>
-          <w:rFonts w:ascii="Verdana" w:hAnsi="Verdana"/>
-          <w:sz w:val="32"/>
-          <w:szCs w:val="32"/>
-        </w:rPr>
-        <w:t>If either updates per second or framerate is equal to zero over five seconds application is terminated.</w:t>
+        </w:rPr>
+        <w:t>Program consumes less memory in general.</w:t>
       </w:r>
     </w:p>
     <w:p>
@@ -2893,43 +2674,38 @@
         <w:rPr>
           <w:rFonts w:ascii="Verdana" w:hAnsi="Verdana"/>
           <w:sz w:val="32"/>
-          <w:szCs w:val="32"/>
-        </w:rPr>
-        <w:t>Console is implemented. Contains history of input commands.</w:t>
-      </w:r>
-      <w:r>
-        <w:rPr>
-          <w:rFonts w:ascii="Verdana" w:hAnsi="Verdana"/>
-          <w:sz w:val="32"/>
-          <w:szCs w:val="32"/>
-        </w:rPr>
-        <w:t xml:space="preserve"> [JSomnia]</w:t>
-      </w:r>
-    </w:p>
-    <w:p>
-      <w:pPr>
-        <w:pStyle w:val="NoSpacing"/>
-        <w:jc w:val="center"/>
-      </w:pPr>
-    </w:p>
-    <w:p>
-      <w:pPr>
-        <w:pStyle w:val="NoSpacing"/>
-        <w:rPr>
-          <w:rFonts w:ascii="Verdana" w:hAnsi="Verdana"/>
-          <w:b/>
-          <w:color w:val="FFC000"/>
-          <w:sz w:val="48"/>
-        </w:rPr>
-      </w:pPr>
-      <w:r>
-        <w:rPr>
-          <w:rFonts w:ascii="Verdana" w:hAnsi="Verdana"/>
-          <w:b/>
-          <w:color w:val="FFC000"/>
-          <w:sz w:val="48"/>
-        </w:rPr>
-        <w:t>CHANGES:</w:t>
+        </w:rPr>
+        <w:t>Game is more responsive when loading/saving chunks in general.</w:t>
+      </w:r>
+    </w:p>
+    <w:p>
+      <w:pPr>
+        <w:pStyle w:val="NoSpacing"/>
+        <w:rPr>
+          <w:rFonts w:ascii="Verdana" w:hAnsi="Verdana"/>
+          <w:sz w:val="32"/>
+          <w:szCs w:val="32"/>
+        </w:rPr>
+      </w:pPr>
+    </w:p>
+    <w:p>
+      <w:pPr>
+        <w:pStyle w:val="NoSpacing"/>
+        <w:rPr>
+          <w:rFonts w:ascii="Verdana" w:hAnsi="Verdana"/>
+          <w:b/>
+          <w:color w:val="FF0000"/>
+          <w:sz w:val="48"/>
+        </w:rPr>
+      </w:pPr>
+      <w:r>
+        <w:rPr>
+          <w:rFonts w:ascii="Verdana" w:hAnsi="Verdana"/>
+          <w:b/>
+          <w:color w:val="FF0000"/>
+          <w:sz w:val="48"/>
+        </w:rPr>
+        <w:t>FIXES:</w:t>
       </w:r>
     </w:p>
     <w:p>
@@ -2946,7 +2722,193 @@
           <w:sz w:val="32"/>
           <w:szCs w:val="32"/>
         </w:rPr>
-        <w:t>Shift key is used when fluids block are being selected or placed adjacently to selected fluid block.</w:t>
+        <w:t>[Options Menu] One changed setting doesn’t change all settings</w:t>
+      </w:r>
+      <w:r>
+        <w:rPr>
+          <w:rFonts w:ascii="Verdana" w:hAnsi="Verdana"/>
+          <w:sz w:val="32"/>
+          <w:szCs w:val="32"/>
+        </w:rPr>
+        <w:t xml:space="preserve"> unexpectedly</w:t>
+      </w:r>
+      <w:r>
+        <w:rPr>
+          <w:rFonts w:ascii="Verdana" w:hAnsi="Verdana"/>
+          <w:sz w:val="32"/>
+          <w:szCs w:val="32"/>
+        </w:rPr>
+        <w:t>.</w:t>
+      </w:r>
+    </w:p>
+    <w:p>
+      <w:pPr>
+        <w:pStyle w:val="NoSpacing"/>
+        <w:jc w:val="center"/>
+        <w:rPr>
+          <w:rFonts w:ascii="Verdana" w:hAnsi="Verdana"/>
+          <w:b/>
+          <w:sz w:val="48"/>
+        </w:rPr>
+      </w:pPr>
+    </w:p>
+    <w:p>
+      <w:pPr>
+        <w:pStyle w:val="NoSpacing"/>
+        <w:jc w:val="center"/>
+        <w:rPr>
+          <w:rFonts w:ascii="Verdana" w:hAnsi="Verdana"/>
+          <w:b/>
+          <w:sz w:val="48"/>
+        </w:rPr>
+      </w:pPr>
+    </w:p>
+    <w:p>
+      <w:pPr>
+        <w:pStyle w:val="NoSpacing"/>
+        <w:jc w:val="center"/>
+        <w:rPr>
+          <w:rFonts w:ascii="Verdana" w:hAnsi="Verdana"/>
+          <w:b/>
+          <w:sz w:val="48"/>
+        </w:rPr>
+      </w:pPr>
+    </w:p>
+    <w:p>
+      <w:pPr>
+        <w:pStyle w:val="NoSpacing"/>
+        <w:jc w:val="center"/>
+        <w:rPr>
+          <w:rFonts w:ascii="Verdana" w:hAnsi="Verdana"/>
+          <w:b/>
+          <w:sz w:val="48"/>
+        </w:rPr>
+      </w:pPr>
+    </w:p>
+    <w:p>
+      <w:pPr>
+        <w:pStyle w:val="NoSpacing"/>
+        <w:jc w:val="center"/>
+        <w:rPr>
+          <w:rFonts w:ascii="Verdana" w:hAnsi="Verdana"/>
+          <w:b/>
+          <w:sz w:val="48"/>
+        </w:rPr>
+      </w:pPr>
+    </w:p>
+    <w:p>
+      <w:pPr>
+        <w:pStyle w:val="NoSpacing"/>
+        <w:jc w:val="center"/>
+        <w:rPr>
+          <w:rFonts w:ascii="Verdana" w:hAnsi="Verdana"/>
+          <w:b/>
+          <w:sz w:val="48"/>
+        </w:rPr>
+      </w:pPr>
+    </w:p>
+    <w:p>
+      <w:pPr>
+        <w:pStyle w:val="NoSpacing"/>
+        <w:jc w:val="center"/>
+        <w:rPr>
+          <w:rFonts w:ascii="Verdana" w:hAnsi="Verdana"/>
+          <w:b/>
+          <w:sz w:val="48"/>
+        </w:rPr>
+      </w:pPr>
+    </w:p>
+    <w:p>
+      <w:pPr>
+        <w:pStyle w:val="NoSpacing"/>
+        <w:jc w:val="center"/>
+        <w:rPr>
+          <w:rFonts w:ascii="Verdana" w:hAnsi="Verdana"/>
+          <w:b/>
+          <w:sz w:val="48"/>
+        </w:rPr>
+      </w:pPr>
+    </w:p>
+    <w:p>
+      <w:pPr>
+        <w:pStyle w:val="NoSpacing"/>
+        <w:jc w:val="center"/>
+        <w:rPr>
+          <w:rFonts w:ascii="Verdana" w:hAnsi="Verdana"/>
+          <w:b/>
+          <w:sz w:val="48"/>
+        </w:rPr>
+      </w:pPr>
+    </w:p>
+    <w:p>
+      <w:pPr>
+        <w:pStyle w:val="NoSpacing"/>
+        <w:jc w:val="center"/>
+        <w:rPr>
+          <w:rFonts w:ascii="Verdana" w:hAnsi="Verdana"/>
+          <w:b/>
+          <w:sz w:val="48"/>
+        </w:rPr>
+      </w:pPr>
+    </w:p>
+    <w:p>
+      <w:pPr>
+        <w:pStyle w:val="NoSpacing"/>
+        <w:jc w:val="center"/>
+        <w:rPr>
+          <w:rFonts w:ascii="Verdana" w:hAnsi="Verdana"/>
+          <w:b/>
+          <w:sz w:val="48"/>
+        </w:rPr>
+      </w:pPr>
+      <w:r>
+        <w:rPr>
+          <w:rFonts w:ascii="Verdana" w:hAnsi="Verdana"/>
+          <w:b/>
+          <w:sz w:val="48"/>
+        </w:rPr>
+        <w:t>[</w:t>
+      </w:r>
+      <w:r>
+        <w:rPr>
+          <w:rFonts w:ascii="Verdana" w:hAnsi="Verdana"/>
+          <w:b/>
+          <w:sz w:val="48"/>
+        </w:rPr>
+        <w:t>STONEWALL</w:t>
+      </w:r>
+      <w:r>
+        <w:rPr>
+          <w:rFonts w:ascii="Verdana" w:hAnsi="Verdana"/>
+          <w:b/>
+          <w:sz w:val="48"/>
+        </w:rPr>
+        <w:t>]</w:t>
+      </w:r>
+    </w:p>
+    <w:p>
+      <w:pPr>
+        <w:pStyle w:val="NoSpacing"/>
+      </w:pPr>
+    </w:p>
+    <w:p>
+      <w:pPr>
+        <w:pStyle w:val="NoSpacing"/>
+        <w:rPr>
+          <w:rFonts w:ascii="Verdana" w:hAnsi="Verdana"/>
+          <w:b/>
+          <w:color w:val="00B050"/>
+          <w:sz w:val="48"/>
+        </w:rPr>
+      </w:pPr>
+      <w:r>
+        <w:rPr>
+          <w:rFonts w:ascii="Verdana" w:hAnsi="Verdana"/>
+          <w:b/>
+          <w:color w:val="00B050"/>
+          <w:sz w:val="48"/>
+        </w:rPr>
+        <w:t>FEATURES:</w:t>
       </w:r>
     </w:p>
     <w:p>
@@ -2963,7 +2925,21 @@
           <w:sz w:val="32"/>
           <w:szCs w:val="32"/>
         </w:rPr>
-        <w:t>Selected fluid block has enabled all faces on selection.</w:t>
+        <w:t>Safety from unresponsive or failed application is implemented.</w:t>
+      </w:r>
+    </w:p>
+    <w:p>
+      <w:pPr>
+        <w:pStyle w:val="NoSpacing"/>
+        <w:ind w:left="360"/>
+      </w:pPr>
+      <w:r>
+        <w:rPr>
+          <w:rFonts w:ascii="Verdana" w:hAnsi="Verdana"/>
+          <w:sz w:val="32"/>
+          <w:szCs w:val="32"/>
+        </w:rPr>
+        <w:t>If either updates per second or framerate is equal to zero over five seconds application is terminated.</w:t>
       </w:r>
     </w:p>
     <w:p>
@@ -2980,31 +2956,41 @@
           <w:sz w:val="32"/>
           <w:szCs w:val="32"/>
         </w:rPr>
-        <w:t>Water R</w:t>
-      </w:r>
-      <w:r>
-        <w:rPr>
-          <w:rFonts w:ascii="Verdana" w:hAnsi="Verdana"/>
-          <w:sz w:val="32"/>
-          <w:szCs w:val="32"/>
-        </w:rPr>
-        <w:t xml:space="preserve">enderer </w:t>
-      </w:r>
-      <w:r>
-        <w:rPr>
-          <w:rFonts w:ascii="Verdana" w:hAnsi="Verdana"/>
-          <w:sz w:val="32"/>
-          <w:szCs w:val="32"/>
-        </w:rPr>
-        <w:t>lags less</w:t>
-      </w:r>
-      <w:r>
-        <w:rPr>
-          <w:rFonts w:ascii="Verdana" w:hAnsi="Verdana"/>
-          <w:sz w:val="32"/>
-          <w:szCs w:val="32"/>
-        </w:rPr>
-        <w:t>.</w:t>
+        <w:t>Console is implemented. Contains history of input commands.</w:t>
+      </w:r>
+      <w:r>
+        <w:rPr>
+          <w:rFonts w:ascii="Verdana" w:hAnsi="Verdana"/>
+          <w:sz w:val="32"/>
+          <w:szCs w:val="32"/>
+        </w:rPr>
+        <w:t xml:space="preserve"> [JSomnia]</w:t>
+      </w:r>
+    </w:p>
+    <w:p>
+      <w:pPr>
+        <w:pStyle w:val="NoSpacing"/>
+        <w:jc w:val="center"/>
+      </w:pPr>
+    </w:p>
+    <w:p>
+      <w:pPr>
+        <w:pStyle w:val="NoSpacing"/>
+        <w:rPr>
+          <w:rFonts w:ascii="Verdana" w:hAnsi="Verdana"/>
+          <w:b/>
+          <w:color w:val="FFC000"/>
+          <w:sz w:val="48"/>
+        </w:rPr>
+      </w:pPr>
+      <w:r>
+        <w:rPr>
+          <w:rFonts w:ascii="Verdana" w:hAnsi="Verdana"/>
+          <w:b/>
+          <w:color w:val="FFC000"/>
+          <w:sz w:val="48"/>
+        </w:rPr>
+        <w:t>CHANGES:</w:t>
       </w:r>
     </w:p>
     <w:p>
@@ -3021,23 +3007,7 @@
           <w:sz w:val="32"/>
           <w:szCs w:val="32"/>
         </w:rPr>
-        <w:t>Blocks consume less memory</w:t>
-      </w:r>
-      <w:r>
-        <w:rPr>
-          <w:rFonts w:ascii="Verdana" w:hAnsi="Verdana"/>
-          <w:sz w:val="32"/>
-          <w:szCs w:val="32"/>
-        </w:rPr>
-        <w:t xml:space="preserve"> and faster to create</w:t>
-      </w:r>
-      <w:r>
-        <w:rPr>
-          <w:rFonts w:ascii="Verdana" w:hAnsi="Verdana"/>
-          <w:sz w:val="32"/>
-          <w:szCs w:val="32"/>
-        </w:rPr>
-        <w:t>.</w:t>
+        <w:t>Shift key is used when fluids block are being selected or placed adjacently to selected fluid block.</w:t>
       </w:r>
     </w:p>
     <w:p>
@@ -3054,7 +3024,7 @@
           <w:sz w:val="32"/>
           <w:szCs w:val="32"/>
         </w:rPr>
-        <w:t>Level loading and Random Level generations is much faster now.</w:t>
+        <w:t>Selected fluid block has enabled all faces on selection.</w:t>
       </w:r>
     </w:p>
     <w:p>
@@ -3071,7 +3041,31 @@
           <w:sz w:val="32"/>
           <w:szCs w:val="32"/>
         </w:rPr>
-        <w:t>(Debug) Using F4 will print all the chunk data.</w:t>
+        <w:t>Water R</w:t>
+      </w:r>
+      <w:r>
+        <w:rPr>
+          <w:rFonts w:ascii="Verdana" w:hAnsi="Verdana"/>
+          <w:sz w:val="32"/>
+          <w:szCs w:val="32"/>
+        </w:rPr>
+        <w:t xml:space="preserve">enderer </w:t>
+      </w:r>
+      <w:r>
+        <w:rPr>
+          <w:rFonts w:ascii="Verdana" w:hAnsi="Verdana"/>
+          <w:sz w:val="32"/>
+          <w:szCs w:val="32"/>
+        </w:rPr>
+        <w:t>lags less</w:t>
+      </w:r>
+      <w:r>
+        <w:rPr>
+          <w:rFonts w:ascii="Verdana" w:hAnsi="Verdana"/>
+          <w:sz w:val="32"/>
+          <w:szCs w:val="32"/>
+        </w:rPr>
+        <w:t>.</w:t>
       </w:r>
     </w:p>
     <w:p>
@@ -3088,7 +3082,23 @@
           <w:sz w:val="32"/>
           <w:szCs w:val="32"/>
         </w:rPr>
-        <w:t>(Editor) Minigun is no more decal yet a separate entity. Lags less.</w:t>
+        <w:t>Blocks consume less memory</w:t>
+      </w:r>
+      <w:r>
+        <w:rPr>
+          <w:rFonts w:ascii="Verdana" w:hAnsi="Verdana"/>
+          <w:sz w:val="32"/>
+          <w:szCs w:val="32"/>
+        </w:rPr>
+        <w:t xml:space="preserve"> and faster to create</w:t>
+      </w:r>
+      <w:r>
+        <w:rPr>
+          <w:rFonts w:ascii="Verdana" w:hAnsi="Verdana"/>
+          <w:sz w:val="32"/>
+          <w:szCs w:val="32"/>
+        </w:rPr>
+        <w:t>.</w:t>
       </w:r>
     </w:p>
     <w:p>
@@ -3105,7 +3115,7 @@
           <w:sz w:val="32"/>
           <w:szCs w:val="32"/>
         </w:rPr>
-        <w:t xml:space="preserve">Game gains even more fps with the recent changes to the threads. </w:t>
+        <w:t>Level loading and Random Level generations is much faster now.</w:t>
       </w:r>
     </w:p>
     <w:p>
@@ -3122,144 +3132,7 @@
           <w:sz w:val="32"/>
           <w:szCs w:val="32"/>
         </w:rPr>
-        <w:t>Game is organized as main &lt;- Game Object -&gt; Renderer, where Game object is shared Object between two vital threads.</w:t>
-      </w:r>
-    </w:p>
-    <w:p>
-      <w:pPr>
-        <w:pStyle w:val="NoSpacing"/>
-        <w:rPr>
-          <w:rFonts w:ascii="Verdana" w:hAnsi="Verdana"/>
-          <w:sz w:val="32"/>
-          <w:szCs w:val="32"/>
-        </w:rPr>
-      </w:pPr>
-    </w:p>
-    <w:p>
-      <w:pPr>
-        <w:pStyle w:val="NoSpacing"/>
-        <w:jc w:val="center"/>
-        <w:rPr>
-          <w:rFonts w:ascii="Verdana" w:hAnsi="Verdana"/>
-          <w:b/>
-          <w:sz w:val="48"/>
-        </w:rPr>
-      </w:pPr>
-    </w:p>
-    <w:p>
-      <w:pPr>
-        <w:pStyle w:val="NoSpacing"/>
-        <w:jc w:val="center"/>
-        <w:rPr>
-          <w:rFonts w:ascii="Verdana" w:hAnsi="Verdana"/>
-          <w:b/>
-          <w:sz w:val="48"/>
-        </w:rPr>
-      </w:pPr>
-    </w:p>
-    <w:p>
-      <w:pPr>
-        <w:pStyle w:val="NoSpacing"/>
-        <w:jc w:val="center"/>
-        <w:rPr>
-          <w:rFonts w:ascii="Verdana" w:hAnsi="Verdana"/>
-          <w:b/>
-          <w:sz w:val="48"/>
-        </w:rPr>
-      </w:pPr>
-    </w:p>
-    <w:p>
-      <w:pPr>
-        <w:pStyle w:val="NoSpacing"/>
-        <w:jc w:val="center"/>
-        <w:rPr>
-          <w:rFonts w:ascii="Verdana" w:hAnsi="Verdana"/>
-          <w:b/>
-          <w:sz w:val="48"/>
-        </w:rPr>
-      </w:pPr>
-    </w:p>
-    <w:p>
-      <w:pPr>
-        <w:pStyle w:val="NoSpacing"/>
-        <w:jc w:val="center"/>
-        <w:rPr>
-          <w:rFonts w:ascii="Verdana" w:hAnsi="Verdana"/>
-          <w:b/>
-          <w:sz w:val="48"/>
-        </w:rPr>
-      </w:pPr>
-    </w:p>
-    <w:p>
-      <w:pPr>
-        <w:pStyle w:val="NoSpacing"/>
-        <w:jc w:val="center"/>
-        <w:rPr>
-          <w:rFonts w:ascii="Verdana" w:hAnsi="Verdana"/>
-          <w:b/>
-          <w:sz w:val="48"/>
-        </w:rPr>
-      </w:pPr>
-    </w:p>
-    <w:p>
-      <w:pPr>
-        <w:pStyle w:val="NoSpacing"/>
-        <w:jc w:val="center"/>
-        <w:rPr>
-          <w:rFonts w:ascii="Verdana" w:hAnsi="Verdana"/>
-          <w:b/>
-          <w:sz w:val="48"/>
-        </w:rPr>
-      </w:pPr>
-      <w:r>
-        <w:rPr>
-          <w:rFonts w:ascii="Verdana" w:hAnsi="Verdana"/>
-          <w:b/>
-          <w:sz w:val="48"/>
-        </w:rPr>
-        <w:lastRenderedPageBreak/>
-        <w:t>[</w:t>
-      </w:r>
-      <w:r>
-        <w:rPr>
-          <w:rFonts w:ascii="Verdana" w:hAnsi="Verdana"/>
-          <w:b/>
-          <w:sz w:val="48"/>
-        </w:rPr>
-        <w:t>RELIC</w:t>
-      </w:r>
-      <w:r>
-        <w:rPr>
-          <w:rFonts w:ascii="Verdana" w:hAnsi="Verdana"/>
-          <w:b/>
-          <w:sz w:val="48"/>
-        </w:rPr>
-        <w:t>]</w:t>
-      </w:r>
-    </w:p>
-    <w:p>
-      <w:pPr>
-        <w:pStyle w:val="NoSpacing"/>
-      </w:pPr>
-    </w:p>
-    <w:p>
-      <w:pPr>
-        <w:pStyle w:val="NoSpacing"/>
-        <w:rPr>
-          <w:rFonts w:ascii="Verdana" w:hAnsi="Verdana"/>
-          <w:b/>
-          <w:color w:val="00B050"/>
-          <w:sz w:val="48"/>
-        </w:rPr>
-      </w:pPr>
-      <w:r>
-        <w:rPr>
-          <w:rFonts w:ascii="Verdana" w:hAnsi="Verdana"/>
-          <w:b/>
-          <w:color w:val="00B050"/>
-          <w:sz w:val="48"/>
-        </w:rPr>
-        <w:t>FEATURES:</w:t>
+        <w:t>(Debug) Using F4 will print all the chunk data.</w:t>
       </w:r>
     </w:p>
     <w:p>
@@ -3276,33 +3149,7 @@
           <w:sz w:val="32"/>
           <w:szCs w:val="32"/>
         </w:rPr>
-        <w:t>Use F12 to save screenshots.</w:t>
-      </w:r>
-    </w:p>
-    <w:p>
-      <w:pPr>
-        <w:pStyle w:val="NoSpacing"/>
-        <w:jc w:val="center"/>
-      </w:pPr>
-    </w:p>
-    <w:p>
-      <w:pPr>
-        <w:pStyle w:val="NoSpacing"/>
-        <w:rPr>
-          <w:rFonts w:ascii="Verdana" w:hAnsi="Verdana"/>
-          <w:b/>
-          <w:color w:val="FFC000"/>
-          <w:sz w:val="48"/>
-        </w:rPr>
-      </w:pPr>
-      <w:r>
-        <w:rPr>
-          <w:rFonts w:ascii="Verdana" w:hAnsi="Verdana"/>
-          <w:b/>
-          <w:color w:val="FFC000"/>
-          <w:sz w:val="48"/>
-        </w:rPr>
-        <w:t>CHANGES:</w:t>
+        <w:t>(Editor) Minigun is no more decal yet a separate entity. Lags less.</w:t>
       </w:r>
     </w:p>
     <w:p>
@@ -3319,61 +3166,7 @@
           <w:sz w:val="32"/>
           <w:szCs w:val="32"/>
         </w:rPr>
-        <w:t>Changes</w:t>
-      </w:r>
-      <w:r>
-        <w:rPr>
-          <w:rFonts w:ascii="Verdana" w:hAnsi="Verdana"/>
-          <w:sz w:val="32"/>
-          <w:szCs w:val="32"/>
-        </w:rPr>
-        <w:t xml:space="preserve"> to</w:t>
-      </w:r>
-      <w:r>
-        <w:rPr>
-          <w:rFonts w:ascii="Verdana" w:hAnsi="Verdana"/>
-          <w:sz w:val="32"/>
-          <w:szCs w:val="32"/>
-        </w:rPr>
-        <w:t xml:space="preserve"> </w:t>
-      </w:r>
-      <w:r>
-        <w:rPr>
-          <w:rFonts w:ascii="Verdana" w:hAnsi="Verdana"/>
-          <w:sz w:val="32"/>
-          <w:szCs w:val="32"/>
-        </w:rPr>
-        <w:t>game loops affecting fps.</w:t>
-      </w:r>
-    </w:p>
-    <w:p>
-      <w:pPr>
-        <w:pStyle w:val="NoSpacing"/>
-        <w:rPr>
-          <w:rFonts w:ascii="Verdana" w:hAnsi="Verdana"/>
-          <w:sz w:val="32"/>
-          <w:szCs w:val="32"/>
-        </w:rPr>
-      </w:pPr>
-    </w:p>
-    <w:p>
-      <w:pPr>
-        <w:pStyle w:val="NoSpacing"/>
-        <w:rPr>
-          <w:rFonts w:ascii="Verdana" w:hAnsi="Verdana"/>
-          <w:b/>
-          <w:color w:val="FF0000"/>
-          <w:sz w:val="48"/>
-        </w:rPr>
-      </w:pPr>
-      <w:r>
-        <w:rPr>
-          <w:rFonts w:ascii="Verdana" w:hAnsi="Verdana"/>
-          <w:b/>
-          <w:color w:val="FF0000"/>
-          <w:sz w:val="48"/>
-        </w:rPr>
-        <w:t>FIXES:</w:t>
+        <w:t xml:space="preserve">Game gains even more fps with the recent changes to the threads. </w:t>
       </w:r>
     </w:p>
     <w:p>
@@ -3390,6 +3183,273 @@
           <w:sz w:val="32"/>
           <w:szCs w:val="32"/>
         </w:rPr>
+        <w:t>Game is organized as main &lt;- Game Object -&gt; Renderer, where Game object is shared Object between two vital threads.</w:t>
+      </w:r>
+    </w:p>
+    <w:p>
+      <w:pPr>
+        <w:pStyle w:val="NoSpacing"/>
+        <w:rPr>
+          <w:rFonts w:ascii="Verdana" w:hAnsi="Verdana"/>
+          <w:sz w:val="32"/>
+          <w:szCs w:val="32"/>
+        </w:rPr>
+      </w:pPr>
+    </w:p>
+    <w:p>
+      <w:pPr>
+        <w:pStyle w:val="NoSpacing"/>
+        <w:jc w:val="center"/>
+        <w:rPr>
+          <w:rFonts w:ascii="Verdana" w:hAnsi="Verdana"/>
+          <w:b/>
+          <w:sz w:val="48"/>
+        </w:rPr>
+      </w:pPr>
+    </w:p>
+    <w:p>
+      <w:pPr>
+        <w:pStyle w:val="NoSpacing"/>
+        <w:jc w:val="center"/>
+        <w:rPr>
+          <w:rFonts w:ascii="Verdana" w:hAnsi="Verdana"/>
+          <w:b/>
+          <w:sz w:val="48"/>
+        </w:rPr>
+      </w:pPr>
+    </w:p>
+    <w:p>
+      <w:pPr>
+        <w:pStyle w:val="NoSpacing"/>
+        <w:jc w:val="center"/>
+        <w:rPr>
+          <w:rFonts w:ascii="Verdana" w:hAnsi="Verdana"/>
+          <w:b/>
+          <w:sz w:val="48"/>
+        </w:rPr>
+      </w:pPr>
+    </w:p>
+    <w:p>
+      <w:pPr>
+        <w:pStyle w:val="NoSpacing"/>
+        <w:jc w:val="center"/>
+        <w:rPr>
+          <w:rFonts w:ascii="Verdana" w:hAnsi="Verdana"/>
+          <w:b/>
+          <w:sz w:val="48"/>
+        </w:rPr>
+      </w:pPr>
+    </w:p>
+    <w:p>
+      <w:pPr>
+        <w:pStyle w:val="NoSpacing"/>
+        <w:jc w:val="center"/>
+        <w:rPr>
+          <w:rFonts w:ascii="Verdana" w:hAnsi="Verdana"/>
+          <w:b/>
+          <w:sz w:val="48"/>
+        </w:rPr>
+      </w:pPr>
+    </w:p>
+    <w:p>
+      <w:pPr>
+        <w:pStyle w:val="NoSpacing"/>
+        <w:jc w:val="center"/>
+        <w:rPr>
+          <w:rFonts w:ascii="Verdana" w:hAnsi="Verdana"/>
+          <w:b/>
+          <w:sz w:val="48"/>
+        </w:rPr>
+      </w:pPr>
+    </w:p>
+    <w:p>
+      <w:pPr>
+        <w:pStyle w:val="NoSpacing"/>
+        <w:jc w:val="center"/>
+        <w:rPr>
+          <w:rFonts w:ascii="Verdana" w:hAnsi="Verdana"/>
+          <w:b/>
+          <w:sz w:val="48"/>
+        </w:rPr>
+      </w:pPr>
+      <w:r>
+        <w:rPr>
+          <w:rFonts w:ascii="Verdana" w:hAnsi="Verdana"/>
+          <w:b/>
+          <w:sz w:val="48"/>
+        </w:rPr>
+        <w:t>[</w:t>
+      </w:r>
+      <w:r>
+        <w:rPr>
+          <w:rFonts w:ascii="Verdana" w:hAnsi="Verdana"/>
+          <w:b/>
+          <w:sz w:val="48"/>
+        </w:rPr>
+        <w:t>RELIC</w:t>
+      </w:r>
+      <w:r>
+        <w:rPr>
+          <w:rFonts w:ascii="Verdana" w:hAnsi="Verdana"/>
+          <w:b/>
+          <w:sz w:val="48"/>
+        </w:rPr>
+        <w:t>]</w:t>
+      </w:r>
+    </w:p>
+    <w:p>
+      <w:pPr>
+        <w:pStyle w:val="NoSpacing"/>
+      </w:pPr>
+    </w:p>
+    <w:p>
+      <w:pPr>
+        <w:pStyle w:val="NoSpacing"/>
+        <w:rPr>
+          <w:rFonts w:ascii="Verdana" w:hAnsi="Verdana"/>
+          <w:b/>
+          <w:color w:val="00B050"/>
+          <w:sz w:val="48"/>
+        </w:rPr>
+      </w:pPr>
+      <w:r>
+        <w:rPr>
+          <w:rFonts w:ascii="Verdana" w:hAnsi="Verdana"/>
+          <w:b/>
+          <w:color w:val="00B050"/>
+          <w:sz w:val="48"/>
+        </w:rPr>
+        <w:t>FEATURES:</w:t>
+      </w:r>
+    </w:p>
+    <w:p>
+      <w:pPr>
+        <w:pStyle w:val="NoSpacing"/>
+        <w:numPr>
+          <w:ilvl w:val="0"/>
+          <w:numId w:val="22"/>
+        </w:numPr>
+      </w:pPr>
+      <w:r>
+        <w:rPr>
+          <w:rFonts w:ascii="Verdana" w:hAnsi="Verdana"/>
+          <w:sz w:val="32"/>
+          <w:szCs w:val="32"/>
+        </w:rPr>
+        <w:t>Use F12 to save screenshots.</w:t>
+      </w:r>
+    </w:p>
+    <w:p>
+      <w:pPr>
+        <w:pStyle w:val="NoSpacing"/>
+        <w:jc w:val="center"/>
+      </w:pPr>
+    </w:p>
+    <w:p>
+      <w:pPr>
+        <w:pStyle w:val="NoSpacing"/>
+        <w:rPr>
+          <w:rFonts w:ascii="Verdana" w:hAnsi="Verdana"/>
+          <w:b/>
+          <w:color w:val="FFC000"/>
+          <w:sz w:val="48"/>
+        </w:rPr>
+      </w:pPr>
+      <w:r>
+        <w:rPr>
+          <w:rFonts w:ascii="Verdana" w:hAnsi="Verdana"/>
+          <w:b/>
+          <w:color w:val="FFC000"/>
+          <w:sz w:val="48"/>
+        </w:rPr>
+        <w:t>CHANGES:</w:t>
+      </w:r>
+    </w:p>
+    <w:p>
+      <w:pPr>
+        <w:pStyle w:val="NoSpacing"/>
+        <w:numPr>
+          <w:ilvl w:val="0"/>
+          <w:numId w:val="22"/>
+        </w:numPr>
+      </w:pPr>
+      <w:r>
+        <w:rPr>
+          <w:rFonts w:ascii="Verdana" w:hAnsi="Verdana"/>
+          <w:sz w:val="32"/>
+          <w:szCs w:val="32"/>
+        </w:rPr>
+        <w:t>Changes</w:t>
+      </w:r>
+      <w:r>
+        <w:rPr>
+          <w:rFonts w:ascii="Verdana" w:hAnsi="Verdana"/>
+          <w:sz w:val="32"/>
+          <w:szCs w:val="32"/>
+        </w:rPr>
+        <w:t xml:space="preserve"> to</w:t>
+      </w:r>
+      <w:r>
+        <w:rPr>
+          <w:rFonts w:ascii="Verdana" w:hAnsi="Verdana"/>
+          <w:sz w:val="32"/>
+          <w:szCs w:val="32"/>
+        </w:rPr>
+        <w:t xml:space="preserve"> </w:t>
+      </w:r>
+      <w:r>
+        <w:rPr>
+          <w:rFonts w:ascii="Verdana" w:hAnsi="Verdana"/>
+          <w:sz w:val="32"/>
+          <w:szCs w:val="32"/>
+        </w:rPr>
+        <w:t>game loops affecting fps.</w:t>
+      </w:r>
+    </w:p>
+    <w:p>
+      <w:pPr>
+        <w:pStyle w:val="NoSpacing"/>
+        <w:rPr>
+          <w:rFonts w:ascii="Verdana" w:hAnsi="Verdana"/>
+          <w:sz w:val="32"/>
+          <w:szCs w:val="32"/>
+        </w:rPr>
+      </w:pPr>
+    </w:p>
+    <w:p>
+      <w:pPr>
+        <w:pStyle w:val="NoSpacing"/>
+        <w:rPr>
+          <w:rFonts w:ascii="Verdana" w:hAnsi="Verdana"/>
+          <w:b/>
+          <w:color w:val="FF0000"/>
+          <w:sz w:val="48"/>
+        </w:rPr>
+      </w:pPr>
+      <w:r>
+        <w:rPr>
+          <w:rFonts w:ascii="Verdana" w:hAnsi="Verdana"/>
+          <w:b/>
+          <w:color w:val="FF0000"/>
+          <w:sz w:val="48"/>
+        </w:rPr>
+        <w:t>FIXES:</w:t>
+      </w:r>
+    </w:p>
+    <w:p>
+      <w:pPr>
+        <w:pStyle w:val="NoSpacing"/>
+        <w:numPr>
+          <w:ilvl w:val="0"/>
+          <w:numId w:val="22"/>
+        </w:numPr>
+      </w:pPr>
+      <w:r>
+        <w:rPr>
+          <w:rFonts w:ascii="Verdana" w:hAnsi="Verdana"/>
+          <w:sz w:val="32"/>
+          <w:szCs w:val="32"/>
+        </w:rPr>
         <w:t>Update per second is displayed correctly.</w:t>
       </w:r>
     </w:p>
@@ -3612,7 +3672,6 @@
           <w:b/>
           <w:sz w:val="48"/>
         </w:rPr>
-        <w:lastRenderedPageBreak/>
         <w:t>[</w:t>
       </w:r>
       <w:r>
@@ -9780,9 +9839,8 @@
     <w:panose1 w:val="020B0604030504040204"/>
     <w:charset w:val="00"/>
     <w:family w:val="swiss"/>
-    <w:notTrueType/>
     <w:pitch w:val="variable"/>
-    <w:sig w:usb0="00000003" w:usb1="00000000" w:usb2="00000000" w:usb3="00000000" w:csb0="00000001" w:csb1="00000000"/>
+    <w:sig w:usb0="E1002EFF" w:usb1="C000605B" w:usb2="00000029" w:usb3="00000000" w:csb0="000101FF" w:csb1="00000000"/>
   </w:font>
   <w:font w:name="Verdana">
     <w:panose1 w:val="020B0604030504040204"/>
@@ -9830,6 +9888,7 @@
     <w:rsid w:val="00627604"/>
     <w:rsid w:val="00746BEB"/>
     <w:rsid w:val="00767599"/>
+    <w:rsid w:val="007F6848"/>
     <w:rsid w:val="00926A90"/>
     <w:rsid w:val="009A2582"/>
     <w:rsid w:val="009B3973"/>

</xml_diff>

<commit_message>
Fog Rework. Determine visible chunks. Water Renderer Rework.
</commit_message>
<xml_diff>
--- a/changelog.docx
+++ b/changelog.docx
@@ -1,6 +1,6 @@
 
 <file path=word/document.xml><?xml version="1.0" encoding="utf-8"?>
-<w:document xmlns:wpc="http://schemas.microsoft.com/office/word/2010/wordprocessingCanvas" xmlns:cx="http://schemas.microsoft.com/office/drawing/2014/chartex" xmlns:cx1="http://schemas.microsoft.com/office/drawing/2015/9/8/chartex" xmlns:cx2="http://schemas.microsoft.com/office/drawing/2015/10/21/chartex" xmlns:cx3="http://schemas.microsoft.com/office/drawing/2016/5/9/chartex" xmlns:cx4="http://schemas.microsoft.com/office/drawing/2016/5/10/chartex" xmlns:cx5="http://schemas.microsoft.com/office/drawing/2016/5/11/chartex" xmlns:cx6="http://schemas.microsoft.com/office/drawing/2016/5/12/chartex" xmlns:cx7="http://schemas.microsoft.com/office/drawing/2016/5/13/chartex" xmlns:cx8="http://schemas.microsoft.com/office/drawing/2016/5/14/chartex" xmlns:mc="http://schemas.openxmlformats.org/markup-compatibility/2006" xmlns:aink="http://schemas.microsoft.com/office/drawing/2016/ink" xmlns:am3d="http://schemas.microsoft.com/office/drawing/2017/model3d" xmlns:o="urn:schemas-microsoft-com:office:office" xmlns:r="http://schemas.openxmlformats.org/officeDocument/2006/relationships" xmlns:m="http://schemas.openxmlformats.org/officeDocument/2006/math" xmlns:v="urn:schemas-microsoft-com:vml" xmlns:wp14="http://schemas.microsoft.com/office/word/2010/wordprocessingDrawing" xmlns:wp="http://schemas.openxmlformats.org/drawingml/2006/wordprocessingDrawing" xmlns:w10="urn:schemas-microsoft-com:office:word" xmlns:w="http://schemas.openxmlformats.org/wordprocessingml/2006/main" xmlns:w14="http://schemas.microsoft.com/office/word/2010/wordml" xmlns:w15="http://schemas.microsoft.com/office/word/2012/wordml" xmlns:w16cex="http://schemas.microsoft.com/office/word/2018/wordml/cex" xmlns:w16cid="http://schemas.microsoft.com/office/word/2016/wordml/cid" xmlns:w16="http://schemas.microsoft.com/office/word/2018/wordml" xmlns:w16sdtdh="http://schemas.microsoft.com/office/word/2020/wordml/sdtdatahash" xmlns:w16se="http://schemas.microsoft.com/office/word/2015/wordml/symex" xmlns:wpg="http://schemas.microsoft.com/office/word/2010/wordprocessingGroup" xmlns:wpi="http://schemas.microsoft.com/office/word/2010/wordprocessingInk" xmlns:wne="http://schemas.microsoft.com/office/word/2006/wordml" xmlns:wps="http://schemas.microsoft.com/office/word/2010/wordprocessingShape" mc:Ignorable="w14 w15 w16se w16cid w16 w16cex w16sdtdh wp14">
+<w:document xmlns:wpc="http://schemas.microsoft.com/office/word/2010/wordprocessingCanvas" xmlns:cx="http://schemas.microsoft.com/office/drawing/2014/chartex" xmlns:cx1="http://schemas.microsoft.com/office/drawing/2015/9/8/chartex" xmlns:cx2="http://schemas.microsoft.com/office/drawing/2015/10/21/chartex" xmlns:cx3="http://schemas.microsoft.com/office/drawing/2016/5/9/chartex" xmlns:cx4="http://schemas.microsoft.com/office/drawing/2016/5/10/chartex" xmlns:cx5="http://schemas.microsoft.com/office/drawing/2016/5/11/chartex" xmlns:cx6="http://schemas.microsoft.com/office/drawing/2016/5/12/chartex" xmlns:cx7="http://schemas.microsoft.com/office/drawing/2016/5/13/chartex" xmlns:cx8="http://schemas.microsoft.com/office/drawing/2016/5/14/chartex" xmlns:mc="http://schemas.openxmlformats.org/markup-compatibility/2006" xmlns:aink="http://schemas.microsoft.com/office/drawing/2016/ink" xmlns:am3d="http://schemas.microsoft.com/office/drawing/2017/model3d" xmlns:o="urn:schemas-microsoft-com:office:office" xmlns:oel="http://schemas.microsoft.com/office/2019/extlst" xmlns:r="http://schemas.openxmlformats.org/officeDocument/2006/relationships" xmlns:m="http://schemas.openxmlformats.org/officeDocument/2006/math" xmlns:v="urn:schemas-microsoft-com:vml" xmlns:wp14="http://schemas.microsoft.com/office/word/2010/wordprocessingDrawing" xmlns:wp="http://schemas.openxmlformats.org/drawingml/2006/wordprocessingDrawing" xmlns:w10="urn:schemas-microsoft-com:office:word" xmlns:w="http://schemas.openxmlformats.org/wordprocessingml/2006/main" xmlns:w14="http://schemas.microsoft.com/office/word/2010/wordml" xmlns:w15="http://schemas.microsoft.com/office/word/2012/wordml" xmlns:w16cex="http://schemas.microsoft.com/office/word/2018/wordml/cex" xmlns:w16cid="http://schemas.microsoft.com/office/word/2016/wordml/cid" xmlns:w16="http://schemas.microsoft.com/office/word/2018/wordml" xmlns:w16sdtdh="http://schemas.microsoft.com/office/word/2020/wordml/sdtdatahash" xmlns:w16se="http://schemas.microsoft.com/office/word/2015/wordml/symex" xmlns:wpg="http://schemas.microsoft.com/office/word/2010/wordprocessingGroup" xmlns:wpi="http://schemas.microsoft.com/office/word/2010/wordprocessingInk" xmlns:wne="http://schemas.microsoft.com/office/word/2006/wordml" xmlns:wps="http://schemas.microsoft.com/office/word/2010/wordprocessingShape" mc:Ignorable="w14 w15 w16se w16cid w16 w16cex w16sdtdh wp14">
   <w:body>
     <w:p>
       <w:pPr>
@@ -334,6 +334,28 @@
           <w:sz w:val="32"/>
           <w:szCs w:val="32"/>
         </w:rPr>
+        <w:t>Reworked fog.</w:t>
+      </w:r>
+    </w:p>
+    <w:p>
+      <w:pPr>
+        <w:pStyle w:val="NoSpacing"/>
+        <w:numPr>
+          <w:ilvl w:val="0"/>
+          <w:numId w:val="22"/>
+        </w:numPr>
+        <w:rPr>
+          <w:rFonts w:ascii="Verdana" w:hAnsi="Verdana"/>
+          <w:b/>
+          <w:sz w:val="48"/>
+        </w:rPr>
+      </w:pPr>
+      <w:r>
+        <w:rPr>
+          <w:rFonts w:ascii="Verdana" w:hAnsi="Verdana"/>
+          <w:sz w:val="32"/>
+          <w:szCs w:val="32"/>
+        </w:rPr>
         <w:t>Reworked Random Level Generator.</w:t>
       </w:r>
     </w:p>
@@ -6108,7 +6130,7 @@
 </file>
 
 <file path=word/endnotes.xml><?xml version="1.0" encoding="utf-8"?>
-<w:endnotes xmlns:wpc="http://schemas.microsoft.com/office/word/2010/wordprocessingCanvas" xmlns:cx="http://schemas.microsoft.com/office/drawing/2014/chartex" xmlns:cx1="http://schemas.microsoft.com/office/drawing/2015/9/8/chartex" xmlns:cx2="http://schemas.microsoft.com/office/drawing/2015/10/21/chartex" xmlns:cx3="http://schemas.microsoft.com/office/drawing/2016/5/9/chartex" xmlns:cx4="http://schemas.microsoft.com/office/drawing/2016/5/10/chartex" xmlns:cx5="http://schemas.microsoft.com/office/drawing/2016/5/11/chartex" xmlns:cx6="http://schemas.microsoft.com/office/drawing/2016/5/12/chartex" xmlns:cx7="http://schemas.microsoft.com/office/drawing/2016/5/13/chartex" xmlns:cx8="http://schemas.microsoft.com/office/drawing/2016/5/14/chartex" xmlns:mc="http://schemas.openxmlformats.org/markup-compatibility/2006" xmlns:aink="http://schemas.microsoft.com/office/drawing/2016/ink" xmlns:am3d="http://schemas.microsoft.com/office/drawing/2017/model3d" xmlns:o="urn:schemas-microsoft-com:office:office" xmlns:r="http://schemas.openxmlformats.org/officeDocument/2006/relationships" xmlns:m="http://schemas.openxmlformats.org/officeDocument/2006/math" xmlns:v="urn:schemas-microsoft-com:vml" xmlns:wp14="http://schemas.microsoft.com/office/word/2010/wordprocessingDrawing" xmlns:wp="http://schemas.openxmlformats.org/drawingml/2006/wordprocessingDrawing" xmlns:w10="urn:schemas-microsoft-com:office:word" xmlns:w="http://schemas.openxmlformats.org/wordprocessingml/2006/main" xmlns:w14="http://schemas.microsoft.com/office/word/2010/wordml" xmlns:w15="http://schemas.microsoft.com/office/word/2012/wordml" xmlns:w16cex="http://schemas.microsoft.com/office/word/2018/wordml/cex" xmlns:w16cid="http://schemas.microsoft.com/office/word/2016/wordml/cid" xmlns:w16="http://schemas.microsoft.com/office/word/2018/wordml" xmlns:w16sdtdh="http://schemas.microsoft.com/office/word/2020/wordml/sdtdatahash" xmlns:w16se="http://schemas.microsoft.com/office/word/2015/wordml/symex" xmlns:wpg="http://schemas.microsoft.com/office/word/2010/wordprocessingGroup" xmlns:wpi="http://schemas.microsoft.com/office/word/2010/wordprocessingInk" xmlns:wne="http://schemas.microsoft.com/office/word/2006/wordml" xmlns:wps="http://schemas.microsoft.com/office/word/2010/wordprocessingShape" mc:Ignorable="w14 w15 w16se w16cid w16 w16cex w16sdtdh wp14">
+<w:endnotes xmlns:wpc="http://schemas.microsoft.com/office/word/2010/wordprocessingCanvas" xmlns:cx="http://schemas.microsoft.com/office/drawing/2014/chartex" xmlns:cx1="http://schemas.microsoft.com/office/drawing/2015/9/8/chartex" xmlns:cx2="http://schemas.microsoft.com/office/drawing/2015/10/21/chartex" xmlns:cx3="http://schemas.microsoft.com/office/drawing/2016/5/9/chartex" xmlns:cx4="http://schemas.microsoft.com/office/drawing/2016/5/10/chartex" xmlns:cx5="http://schemas.microsoft.com/office/drawing/2016/5/11/chartex" xmlns:cx6="http://schemas.microsoft.com/office/drawing/2016/5/12/chartex" xmlns:cx7="http://schemas.microsoft.com/office/drawing/2016/5/13/chartex" xmlns:cx8="http://schemas.microsoft.com/office/drawing/2016/5/14/chartex" xmlns:mc="http://schemas.openxmlformats.org/markup-compatibility/2006" xmlns:aink="http://schemas.microsoft.com/office/drawing/2016/ink" xmlns:am3d="http://schemas.microsoft.com/office/drawing/2017/model3d" xmlns:o="urn:schemas-microsoft-com:office:office" xmlns:oel="http://schemas.microsoft.com/office/2019/extlst" xmlns:r="http://schemas.openxmlformats.org/officeDocument/2006/relationships" xmlns:m="http://schemas.openxmlformats.org/officeDocument/2006/math" xmlns:v="urn:schemas-microsoft-com:vml" xmlns:wp14="http://schemas.microsoft.com/office/word/2010/wordprocessingDrawing" xmlns:wp="http://schemas.openxmlformats.org/drawingml/2006/wordprocessingDrawing" xmlns:w10="urn:schemas-microsoft-com:office:word" xmlns:w="http://schemas.openxmlformats.org/wordprocessingml/2006/main" xmlns:w14="http://schemas.microsoft.com/office/word/2010/wordml" xmlns:w15="http://schemas.microsoft.com/office/word/2012/wordml" xmlns:w16cex="http://schemas.microsoft.com/office/word/2018/wordml/cex" xmlns:w16cid="http://schemas.microsoft.com/office/word/2016/wordml/cid" xmlns:w16="http://schemas.microsoft.com/office/word/2018/wordml" xmlns:w16sdtdh="http://schemas.microsoft.com/office/word/2020/wordml/sdtdatahash" xmlns:w16se="http://schemas.microsoft.com/office/word/2015/wordml/symex" xmlns:wpg="http://schemas.microsoft.com/office/word/2010/wordprocessingGroup" xmlns:wpi="http://schemas.microsoft.com/office/word/2010/wordprocessingInk" xmlns:wne="http://schemas.microsoft.com/office/word/2006/wordml" xmlns:wps="http://schemas.microsoft.com/office/word/2010/wordprocessingShape" mc:Ignorable="w14 w15 w16se w16cid w16 w16cex w16sdtdh wp14">
   <w:endnote w:type="separator" w:id="-1">
     <w:p>
       <w:pPr>
@@ -6133,7 +6155,7 @@
 </file>
 
 <file path=word/footer1.xml><?xml version="1.0" encoding="utf-8"?>
-<w:ftr xmlns:wpc="http://schemas.microsoft.com/office/word/2010/wordprocessingCanvas" xmlns:cx="http://schemas.microsoft.com/office/drawing/2014/chartex" xmlns:cx1="http://schemas.microsoft.com/office/drawing/2015/9/8/chartex" xmlns:cx2="http://schemas.microsoft.com/office/drawing/2015/10/21/chartex" xmlns:cx3="http://schemas.microsoft.com/office/drawing/2016/5/9/chartex" xmlns:cx4="http://schemas.microsoft.com/office/drawing/2016/5/10/chartex" xmlns:cx5="http://schemas.microsoft.com/office/drawing/2016/5/11/chartex" xmlns:cx6="http://schemas.microsoft.com/office/drawing/2016/5/12/chartex" xmlns:cx7="http://schemas.microsoft.com/office/drawing/2016/5/13/chartex" xmlns:cx8="http://schemas.microsoft.com/office/drawing/2016/5/14/chartex" xmlns:mc="http://schemas.openxmlformats.org/markup-compatibility/2006" xmlns:aink="http://schemas.microsoft.com/office/drawing/2016/ink" xmlns:am3d="http://schemas.microsoft.com/office/drawing/2017/model3d" xmlns:o="urn:schemas-microsoft-com:office:office" xmlns:r="http://schemas.openxmlformats.org/officeDocument/2006/relationships" xmlns:m="http://schemas.openxmlformats.org/officeDocument/2006/math" xmlns:v="urn:schemas-microsoft-com:vml" xmlns:wp14="http://schemas.microsoft.com/office/word/2010/wordprocessingDrawing" xmlns:wp="http://schemas.openxmlformats.org/drawingml/2006/wordprocessingDrawing" xmlns:w10="urn:schemas-microsoft-com:office:word" xmlns:w="http://schemas.openxmlformats.org/wordprocessingml/2006/main" xmlns:w14="http://schemas.microsoft.com/office/word/2010/wordml" xmlns:w15="http://schemas.microsoft.com/office/word/2012/wordml" xmlns:w16cex="http://schemas.microsoft.com/office/word/2018/wordml/cex" xmlns:w16cid="http://schemas.microsoft.com/office/word/2016/wordml/cid" xmlns:w16="http://schemas.microsoft.com/office/word/2018/wordml" xmlns:w16sdtdh="http://schemas.microsoft.com/office/word/2020/wordml/sdtdatahash" xmlns:w16se="http://schemas.microsoft.com/office/word/2015/wordml/symex" xmlns:wpg="http://schemas.microsoft.com/office/word/2010/wordprocessingGroup" xmlns:wpi="http://schemas.microsoft.com/office/word/2010/wordprocessingInk" xmlns:wne="http://schemas.microsoft.com/office/word/2006/wordml" xmlns:wps="http://schemas.microsoft.com/office/word/2010/wordprocessingShape" mc:Ignorable="w14 w15 w16se w16cid w16 w16cex w16sdtdh wp14">
+<w:ftr xmlns:wpc="http://schemas.microsoft.com/office/word/2010/wordprocessingCanvas" xmlns:cx="http://schemas.microsoft.com/office/drawing/2014/chartex" xmlns:cx1="http://schemas.microsoft.com/office/drawing/2015/9/8/chartex" xmlns:cx2="http://schemas.microsoft.com/office/drawing/2015/10/21/chartex" xmlns:cx3="http://schemas.microsoft.com/office/drawing/2016/5/9/chartex" xmlns:cx4="http://schemas.microsoft.com/office/drawing/2016/5/10/chartex" xmlns:cx5="http://schemas.microsoft.com/office/drawing/2016/5/11/chartex" xmlns:cx6="http://schemas.microsoft.com/office/drawing/2016/5/12/chartex" xmlns:cx7="http://schemas.microsoft.com/office/drawing/2016/5/13/chartex" xmlns:cx8="http://schemas.microsoft.com/office/drawing/2016/5/14/chartex" xmlns:mc="http://schemas.openxmlformats.org/markup-compatibility/2006" xmlns:aink="http://schemas.microsoft.com/office/drawing/2016/ink" xmlns:am3d="http://schemas.microsoft.com/office/drawing/2017/model3d" xmlns:o="urn:schemas-microsoft-com:office:office" xmlns:oel="http://schemas.microsoft.com/office/2019/extlst" xmlns:r="http://schemas.openxmlformats.org/officeDocument/2006/relationships" xmlns:m="http://schemas.openxmlformats.org/officeDocument/2006/math" xmlns:v="urn:schemas-microsoft-com:vml" xmlns:wp14="http://schemas.microsoft.com/office/word/2010/wordprocessingDrawing" xmlns:wp="http://schemas.openxmlformats.org/drawingml/2006/wordprocessingDrawing" xmlns:w10="urn:schemas-microsoft-com:office:word" xmlns:w="http://schemas.openxmlformats.org/wordprocessingml/2006/main" xmlns:w14="http://schemas.microsoft.com/office/word/2010/wordml" xmlns:w15="http://schemas.microsoft.com/office/word/2012/wordml" xmlns:w16cex="http://schemas.microsoft.com/office/word/2018/wordml/cex" xmlns:w16cid="http://schemas.microsoft.com/office/word/2016/wordml/cid" xmlns:w16="http://schemas.microsoft.com/office/word/2018/wordml" xmlns:w16sdtdh="http://schemas.microsoft.com/office/word/2020/wordml/sdtdatahash" xmlns:w16se="http://schemas.microsoft.com/office/word/2015/wordml/symex" xmlns:wpg="http://schemas.microsoft.com/office/word/2010/wordprocessingGroup" xmlns:wpi="http://schemas.microsoft.com/office/word/2010/wordprocessingInk" xmlns:wne="http://schemas.microsoft.com/office/word/2006/wordml" xmlns:wps="http://schemas.microsoft.com/office/word/2010/wordprocessingShape" mc:Ignorable="w14 w15 w16se w16cid w16 w16cex w16sdtdh wp14">
   <w:sdt>
     <w:sdtPr>
       <w:rPr>
@@ -6145,7 +6167,6 @@
         <w:docPartUnique/>
       </w:docPartObj>
     </w:sdtPr>
-    <w:sdtEndPr/>
     <w:sdtContent>
       <w:sdt>
         <w:sdtPr>
@@ -6158,7 +6179,6 @@
             <w:docPartUnique/>
           </w:docPartObj>
         </w:sdtPr>
-        <w:sdtEndPr/>
         <w:sdtContent>
           <w:p>
             <w:pPr>
@@ -6353,7 +6373,7 @@
 </file>
 
 <file path=word/footnotes.xml><?xml version="1.0" encoding="utf-8"?>
-<w:footnotes xmlns:wpc="http://schemas.microsoft.com/office/word/2010/wordprocessingCanvas" xmlns:cx="http://schemas.microsoft.com/office/drawing/2014/chartex" xmlns:cx1="http://schemas.microsoft.com/office/drawing/2015/9/8/chartex" xmlns:cx2="http://schemas.microsoft.com/office/drawing/2015/10/21/chartex" xmlns:cx3="http://schemas.microsoft.com/office/drawing/2016/5/9/chartex" xmlns:cx4="http://schemas.microsoft.com/office/drawing/2016/5/10/chartex" xmlns:cx5="http://schemas.microsoft.com/office/drawing/2016/5/11/chartex" xmlns:cx6="http://schemas.microsoft.com/office/drawing/2016/5/12/chartex" xmlns:cx7="http://schemas.microsoft.com/office/drawing/2016/5/13/chartex" xmlns:cx8="http://schemas.microsoft.com/office/drawing/2016/5/14/chartex" xmlns:mc="http://schemas.openxmlformats.org/markup-compatibility/2006" xmlns:aink="http://schemas.microsoft.com/office/drawing/2016/ink" xmlns:am3d="http://schemas.microsoft.com/office/drawing/2017/model3d" xmlns:o="urn:schemas-microsoft-com:office:office" xmlns:r="http://schemas.openxmlformats.org/officeDocument/2006/relationships" xmlns:m="http://schemas.openxmlformats.org/officeDocument/2006/math" xmlns:v="urn:schemas-microsoft-com:vml" xmlns:wp14="http://schemas.microsoft.com/office/word/2010/wordprocessingDrawing" xmlns:wp="http://schemas.openxmlformats.org/drawingml/2006/wordprocessingDrawing" xmlns:w10="urn:schemas-microsoft-com:office:word" xmlns:w="http://schemas.openxmlformats.org/wordprocessingml/2006/main" xmlns:w14="http://schemas.microsoft.com/office/word/2010/wordml" xmlns:w15="http://schemas.microsoft.com/office/word/2012/wordml" xmlns:w16cex="http://schemas.microsoft.com/office/word/2018/wordml/cex" xmlns:w16cid="http://schemas.microsoft.com/office/word/2016/wordml/cid" xmlns:w16="http://schemas.microsoft.com/office/word/2018/wordml" xmlns:w16sdtdh="http://schemas.microsoft.com/office/word/2020/wordml/sdtdatahash" xmlns:w16se="http://schemas.microsoft.com/office/word/2015/wordml/symex" xmlns:wpg="http://schemas.microsoft.com/office/word/2010/wordprocessingGroup" xmlns:wpi="http://schemas.microsoft.com/office/word/2010/wordprocessingInk" xmlns:wne="http://schemas.microsoft.com/office/word/2006/wordml" xmlns:wps="http://schemas.microsoft.com/office/word/2010/wordprocessingShape" mc:Ignorable="w14 w15 w16se w16cid w16 w16cex w16sdtdh wp14">
+<w:footnotes xmlns:wpc="http://schemas.microsoft.com/office/word/2010/wordprocessingCanvas" xmlns:cx="http://schemas.microsoft.com/office/drawing/2014/chartex" xmlns:cx1="http://schemas.microsoft.com/office/drawing/2015/9/8/chartex" xmlns:cx2="http://schemas.microsoft.com/office/drawing/2015/10/21/chartex" xmlns:cx3="http://schemas.microsoft.com/office/drawing/2016/5/9/chartex" xmlns:cx4="http://schemas.microsoft.com/office/drawing/2016/5/10/chartex" xmlns:cx5="http://schemas.microsoft.com/office/drawing/2016/5/11/chartex" xmlns:cx6="http://schemas.microsoft.com/office/drawing/2016/5/12/chartex" xmlns:cx7="http://schemas.microsoft.com/office/drawing/2016/5/13/chartex" xmlns:cx8="http://schemas.microsoft.com/office/drawing/2016/5/14/chartex" xmlns:mc="http://schemas.openxmlformats.org/markup-compatibility/2006" xmlns:aink="http://schemas.microsoft.com/office/drawing/2016/ink" xmlns:am3d="http://schemas.microsoft.com/office/drawing/2017/model3d" xmlns:o="urn:schemas-microsoft-com:office:office" xmlns:oel="http://schemas.microsoft.com/office/2019/extlst" xmlns:r="http://schemas.openxmlformats.org/officeDocument/2006/relationships" xmlns:m="http://schemas.openxmlformats.org/officeDocument/2006/math" xmlns:v="urn:schemas-microsoft-com:vml" xmlns:wp14="http://schemas.microsoft.com/office/word/2010/wordprocessingDrawing" xmlns:wp="http://schemas.openxmlformats.org/drawingml/2006/wordprocessingDrawing" xmlns:w10="urn:schemas-microsoft-com:office:word" xmlns:w="http://schemas.openxmlformats.org/wordprocessingml/2006/main" xmlns:w14="http://schemas.microsoft.com/office/word/2010/wordml" xmlns:w15="http://schemas.microsoft.com/office/word/2012/wordml" xmlns:w16cex="http://schemas.microsoft.com/office/word/2018/wordml/cex" xmlns:w16cid="http://schemas.microsoft.com/office/word/2016/wordml/cid" xmlns:w16="http://schemas.microsoft.com/office/word/2018/wordml" xmlns:w16sdtdh="http://schemas.microsoft.com/office/word/2020/wordml/sdtdatahash" xmlns:w16se="http://schemas.microsoft.com/office/word/2015/wordml/symex" xmlns:wpg="http://schemas.microsoft.com/office/word/2010/wordprocessingGroup" xmlns:wpi="http://schemas.microsoft.com/office/word/2010/wordprocessingInk" xmlns:wne="http://schemas.microsoft.com/office/word/2006/wordml" xmlns:wps="http://schemas.microsoft.com/office/word/2010/wordprocessingShape" mc:Ignorable="w14 w15 w16se w16cid w16 w16cex w16sdtdh wp14">
   <w:footnote w:type="separator" w:id="-1">
     <w:p>
       <w:pPr>
@@ -6378,7 +6398,7 @@
 </file>
 
 <file path=word/header1.xml><?xml version="1.0" encoding="utf-8"?>
-<w:hdr xmlns:wpc="http://schemas.microsoft.com/office/word/2010/wordprocessingCanvas" xmlns:cx="http://schemas.microsoft.com/office/drawing/2014/chartex" xmlns:cx1="http://schemas.microsoft.com/office/drawing/2015/9/8/chartex" xmlns:cx2="http://schemas.microsoft.com/office/drawing/2015/10/21/chartex" xmlns:cx3="http://schemas.microsoft.com/office/drawing/2016/5/9/chartex" xmlns:cx4="http://schemas.microsoft.com/office/drawing/2016/5/10/chartex" xmlns:cx5="http://schemas.microsoft.com/office/drawing/2016/5/11/chartex" xmlns:cx6="http://schemas.microsoft.com/office/drawing/2016/5/12/chartex" xmlns:cx7="http://schemas.microsoft.com/office/drawing/2016/5/13/chartex" xmlns:cx8="http://schemas.microsoft.com/office/drawing/2016/5/14/chartex" xmlns:mc="http://schemas.openxmlformats.org/markup-compatibility/2006" xmlns:aink="http://schemas.microsoft.com/office/drawing/2016/ink" xmlns:am3d="http://schemas.microsoft.com/office/drawing/2017/model3d" xmlns:o="urn:schemas-microsoft-com:office:office" xmlns:r="http://schemas.openxmlformats.org/officeDocument/2006/relationships" xmlns:m="http://schemas.openxmlformats.org/officeDocument/2006/math" xmlns:v="urn:schemas-microsoft-com:vml" xmlns:wp14="http://schemas.microsoft.com/office/word/2010/wordprocessingDrawing" xmlns:wp="http://schemas.openxmlformats.org/drawingml/2006/wordprocessingDrawing" xmlns:w10="urn:schemas-microsoft-com:office:word" xmlns:w="http://schemas.openxmlformats.org/wordprocessingml/2006/main" xmlns:w14="http://schemas.microsoft.com/office/word/2010/wordml" xmlns:w15="http://schemas.microsoft.com/office/word/2012/wordml" xmlns:w16cex="http://schemas.microsoft.com/office/word/2018/wordml/cex" xmlns:w16cid="http://schemas.microsoft.com/office/word/2016/wordml/cid" xmlns:w16="http://schemas.microsoft.com/office/word/2018/wordml" xmlns:w16sdtdh="http://schemas.microsoft.com/office/word/2020/wordml/sdtdatahash" xmlns:w16se="http://schemas.microsoft.com/office/word/2015/wordml/symex" xmlns:wpg="http://schemas.microsoft.com/office/word/2010/wordprocessingGroup" xmlns:wpi="http://schemas.microsoft.com/office/word/2010/wordprocessingInk" xmlns:wne="http://schemas.microsoft.com/office/word/2006/wordml" xmlns:wps="http://schemas.microsoft.com/office/word/2010/wordprocessingShape" mc:Ignorable="w14 w15 w16se w16cid w16 w16cex w16sdtdh wp14">
+<w:hdr xmlns:wpc="http://schemas.microsoft.com/office/word/2010/wordprocessingCanvas" xmlns:cx="http://schemas.microsoft.com/office/drawing/2014/chartex" xmlns:cx1="http://schemas.microsoft.com/office/drawing/2015/9/8/chartex" xmlns:cx2="http://schemas.microsoft.com/office/drawing/2015/10/21/chartex" xmlns:cx3="http://schemas.microsoft.com/office/drawing/2016/5/9/chartex" xmlns:cx4="http://schemas.microsoft.com/office/drawing/2016/5/10/chartex" xmlns:cx5="http://schemas.microsoft.com/office/drawing/2016/5/11/chartex" xmlns:cx6="http://schemas.microsoft.com/office/drawing/2016/5/12/chartex" xmlns:cx7="http://schemas.microsoft.com/office/drawing/2016/5/13/chartex" xmlns:cx8="http://schemas.microsoft.com/office/drawing/2016/5/14/chartex" xmlns:mc="http://schemas.openxmlformats.org/markup-compatibility/2006" xmlns:aink="http://schemas.microsoft.com/office/drawing/2016/ink" xmlns:am3d="http://schemas.microsoft.com/office/drawing/2017/model3d" xmlns:o="urn:schemas-microsoft-com:office:office" xmlns:oel="http://schemas.microsoft.com/office/2019/extlst" xmlns:r="http://schemas.openxmlformats.org/officeDocument/2006/relationships" xmlns:m="http://schemas.openxmlformats.org/officeDocument/2006/math" xmlns:v="urn:schemas-microsoft-com:vml" xmlns:wp14="http://schemas.microsoft.com/office/word/2010/wordprocessingDrawing" xmlns:wp="http://schemas.openxmlformats.org/drawingml/2006/wordprocessingDrawing" xmlns:w10="urn:schemas-microsoft-com:office:word" xmlns:w="http://schemas.openxmlformats.org/wordprocessingml/2006/main" xmlns:w14="http://schemas.microsoft.com/office/word/2010/wordml" xmlns:w15="http://schemas.microsoft.com/office/word/2012/wordml" xmlns:w16cex="http://schemas.microsoft.com/office/word/2018/wordml/cex" xmlns:w16cid="http://schemas.microsoft.com/office/word/2016/wordml/cid" xmlns:w16="http://schemas.microsoft.com/office/word/2018/wordml" xmlns:w16sdtdh="http://schemas.microsoft.com/office/word/2020/wordml/sdtdatahash" xmlns:w16se="http://schemas.microsoft.com/office/word/2015/wordml/symex" xmlns:wpg="http://schemas.microsoft.com/office/word/2010/wordprocessingGroup" xmlns:wpi="http://schemas.microsoft.com/office/word/2010/wordprocessingInk" xmlns:wne="http://schemas.microsoft.com/office/word/2006/wordml" xmlns:wps="http://schemas.microsoft.com/office/word/2010/wordprocessingShape" mc:Ignorable="w14 w15 w16se w16cid w16 w16cex w16sdtdh wp14">
   <w:sdt>
     <w:sdtPr>
       <w:rPr>
@@ -6394,7 +6414,6 @@
       <w:dataBinding w:prefixMappings="xmlns:ns0='http://schemas.openxmlformats.org/package/2006/metadata/core-properties' xmlns:ns1='http://purl.org/dc/elements/1.1/'" w:xpath="/ns0:coreProperties[1]/ns1:title[1]" w:storeItemID="{6C3C8BC8-F283-45AE-878A-BAB7291924A1}"/>
       <w:text/>
     </w:sdtPr>
-    <w:sdtEndPr/>
     <w:sdtContent>
       <w:p>
         <w:pPr>
@@ -6435,7 +6454,7 @@
 </file>
 
 <file path=word/numbering.xml><?xml version="1.0" encoding="utf-8"?>
-<w:numbering xmlns:wpc="http://schemas.microsoft.com/office/word/2010/wordprocessingCanvas" xmlns:cx="http://schemas.microsoft.com/office/drawing/2014/chartex" xmlns:cx1="http://schemas.microsoft.com/office/drawing/2015/9/8/chartex" xmlns:cx2="http://schemas.microsoft.com/office/drawing/2015/10/21/chartex" xmlns:cx3="http://schemas.microsoft.com/office/drawing/2016/5/9/chartex" xmlns:cx4="http://schemas.microsoft.com/office/drawing/2016/5/10/chartex" xmlns:cx5="http://schemas.microsoft.com/office/drawing/2016/5/11/chartex" xmlns:cx6="http://schemas.microsoft.com/office/drawing/2016/5/12/chartex" xmlns:cx7="http://schemas.microsoft.com/office/drawing/2016/5/13/chartex" xmlns:cx8="http://schemas.microsoft.com/office/drawing/2016/5/14/chartex" xmlns:mc="http://schemas.openxmlformats.org/markup-compatibility/2006" xmlns:aink="http://schemas.microsoft.com/office/drawing/2016/ink" xmlns:am3d="http://schemas.microsoft.com/office/drawing/2017/model3d" xmlns:o="urn:schemas-microsoft-com:office:office" xmlns:r="http://schemas.openxmlformats.org/officeDocument/2006/relationships" xmlns:m="http://schemas.openxmlformats.org/officeDocument/2006/math" xmlns:v="urn:schemas-microsoft-com:vml" xmlns:wp14="http://schemas.microsoft.com/office/word/2010/wordprocessingDrawing" xmlns:wp="http://schemas.openxmlformats.org/drawingml/2006/wordprocessingDrawing" xmlns:w10="urn:schemas-microsoft-com:office:word" xmlns:w="http://schemas.openxmlformats.org/wordprocessingml/2006/main" xmlns:w14="http://schemas.microsoft.com/office/word/2010/wordml" xmlns:w15="http://schemas.microsoft.com/office/word/2012/wordml" xmlns:w16cex="http://schemas.microsoft.com/office/word/2018/wordml/cex" xmlns:w16cid="http://schemas.microsoft.com/office/word/2016/wordml/cid" xmlns:w16="http://schemas.microsoft.com/office/word/2018/wordml" xmlns:w16sdtdh="http://schemas.microsoft.com/office/word/2020/wordml/sdtdatahash" xmlns:w16se="http://schemas.microsoft.com/office/word/2015/wordml/symex" xmlns:wpg="http://schemas.microsoft.com/office/word/2010/wordprocessingGroup" xmlns:wpi="http://schemas.microsoft.com/office/word/2010/wordprocessingInk" xmlns:wne="http://schemas.microsoft.com/office/word/2006/wordml" xmlns:wps="http://schemas.microsoft.com/office/word/2010/wordprocessingShape" mc:Ignorable="w14 w15 w16se w16cid w16 w16cex w16sdtdh wp14">
+<w:numbering xmlns:wpc="http://schemas.microsoft.com/office/word/2010/wordprocessingCanvas" xmlns:cx="http://schemas.microsoft.com/office/drawing/2014/chartex" xmlns:cx1="http://schemas.microsoft.com/office/drawing/2015/9/8/chartex" xmlns:cx2="http://schemas.microsoft.com/office/drawing/2015/10/21/chartex" xmlns:cx3="http://schemas.microsoft.com/office/drawing/2016/5/9/chartex" xmlns:cx4="http://schemas.microsoft.com/office/drawing/2016/5/10/chartex" xmlns:cx5="http://schemas.microsoft.com/office/drawing/2016/5/11/chartex" xmlns:cx6="http://schemas.microsoft.com/office/drawing/2016/5/12/chartex" xmlns:cx7="http://schemas.microsoft.com/office/drawing/2016/5/13/chartex" xmlns:cx8="http://schemas.microsoft.com/office/drawing/2016/5/14/chartex" xmlns:mc="http://schemas.openxmlformats.org/markup-compatibility/2006" xmlns:aink="http://schemas.microsoft.com/office/drawing/2016/ink" xmlns:am3d="http://schemas.microsoft.com/office/drawing/2017/model3d" xmlns:o="urn:schemas-microsoft-com:office:office" xmlns:oel="http://schemas.microsoft.com/office/2019/extlst" xmlns:r="http://schemas.openxmlformats.org/officeDocument/2006/relationships" xmlns:m="http://schemas.openxmlformats.org/officeDocument/2006/math" xmlns:v="urn:schemas-microsoft-com:vml" xmlns:wp14="http://schemas.microsoft.com/office/word/2010/wordprocessingDrawing" xmlns:wp="http://schemas.openxmlformats.org/drawingml/2006/wordprocessingDrawing" xmlns:w10="urn:schemas-microsoft-com:office:word" xmlns:w="http://schemas.openxmlformats.org/wordprocessingml/2006/main" xmlns:w14="http://schemas.microsoft.com/office/word/2010/wordml" xmlns:w15="http://schemas.microsoft.com/office/word/2012/wordml" xmlns:w16cex="http://schemas.microsoft.com/office/word/2018/wordml/cex" xmlns:w16cid="http://schemas.microsoft.com/office/word/2016/wordml/cid" xmlns:w16="http://schemas.microsoft.com/office/word/2018/wordml" xmlns:w16sdtdh="http://schemas.microsoft.com/office/word/2020/wordml/sdtdatahash" xmlns:w16se="http://schemas.microsoft.com/office/word/2015/wordml/symex" xmlns:wpg="http://schemas.microsoft.com/office/word/2010/wordprocessingGroup" xmlns:wpi="http://schemas.microsoft.com/office/word/2010/wordprocessingInk" xmlns:wne="http://schemas.microsoft.com/office/word/2006/wordml" xmlns:wps="http://schemas.microsoft.com/office/word/2010/wordprocessingShape" mc:Ignorable="w14 w15 w16se w16cid w16 w16cex w16sdtdh wp14">
   <w:abstractNum w:abstractNumId="0" w15:restartNumberingAfterBreak="0">
     <w:nsid w:val="01E9652D"/>
     <w:multiLevelType w:val="hybridMultilevel"/>
@@ -9156,82 +9175,82 @@
       </w:rPr>
     </w:lvl>
   </w:abstractNum>
-  <w:num w:numId="1">
+  <w:num w:numId="1" w16cid:durableId="1126509980">
     <w:abstractNumId w:val="21"/>
   </w:num>
-  <w:num w:numId="2">
+  <w:num w:numId="2" w16cid:durableId="1990354778">
     <w:abstractNumId w:val="18"/>
   </w:num>
-  <w:num w:numId="3">
+  <w:num w:numId="3" w16cid:durableId="1972325749">
     <w:abstractNumId w:val="15"/>
   </w:num>
-  <w:num w:numId="4">
+  <w:num w:numId="4" w16cid:durableId="1152988680">
     <w:abstractNumId w:val="8"/>
   </w:num>
-  <w:num w:numId="5">
+  <w:num w:numId="5" w16cid:durableId="1810783538">
     <w:abstractNumId w:val="6"/>
   </w:num>
-  <w:num w:numId="6">
+  <w:num w:numId="6" w16cid:durableId="168909634">
     <w:abstractNumId w:val="2"/>
   </w:num>
-  <w:num w:numId="7">
+  <w:num w:numId="7" w16cid:durableId="1714576872">
     <w:abstractNumId w:val="19"/>
   </w:num>
-  <w:num w:numId="8">
+  <w:num w:numId="8" w16cid:durableId="244849444">
     <w:abstractNumId w:val="10"/>
   </w:num>
-  <w:num w:numId="9">
+  <w:num w:numId="9" w16cid:durableId="332075654">
     <w:abstractNumId w:val="16"/>
   </w:num>
-  <w:num w:numId="10">
+  <w:num w:numId="10" w16cid:durableId="1889145747">
     <w:abstractNumId w:val="13"/>
   </w:num>
-  <w:num w:numId="11">
+  <w:num w:numId="11" w16cid:durableId="8064644">
     <w:abstractNumId w:val="0"/>
   </w:num>
-  <w:num w:numId="12">
+  <w:num w:numId="12" w16cid:durableId="815342743">
     <w:abstractNumId w:val="23"/>
   </w:num>
-  <w:num w:numId="13">
+  <w:num w:numId="13" w16cid:durableId="1213036091">
     <w:abstractNumId w:val="10"/>
   </w:num>
-  <w:num w:numId="14">
+  <w:num w:numId="14" w16cid:durableId="552814049">
     <w:abstractNumId w:val="20"/>
   </w:num>
-  <w:num w:numId="15">
+  <w:num w:numId="15" w16cid:durableId="2144494586">
     <w:abstractNumId w:val="7"/>
   </w:num>
-  <w:num w:numId="16">
+  <w:num w:numId="16" w16cid:durableId="97526593">
     <w:abstractNumId w:val="4"/>
   </w:num>
-  <w:num w:numId="17">
+  <w:num w:numId="17" w16cid:durableId="1106270254">
     <w:abstractNumId w:val="14"/>
   </w:num>
-  <w:num w:numId="18">
+  <w:num w:numId="18" w16cid:durableId="1476874671">
     <w:abstractNumId w:val="3"/>
   </w:num>
-  <w:num w:numId="19">
+  <w:num w:numId="19" w16cid:durableId="62457766">
     <w:abstractNumId w:val="12"/>
   </w:num>
-  <w:num w:numId="20">
+  <w:num w:numId="20" w16cid:durableId="1531649055">
     <w:abstractNumId w:val="22"/>
   </w:num>
-  <w:num w:numId="21">
+  <w:num w:numId="21" w16cid:durableId="1773430195">
     <w:abstractNumId w:val="1"/>
   </w:num>
-  <w:num w:numId="22">
+  <w:num w:numId="22" w16cid:durableId="1392188456">
     <w:abstractNumId w:val="5"/>
   </w:num>
-  <w:num w:numId="23">
+  <w:num w:numId="23" w16cid:durableId="680205055">
     <w:abstractNumId w:val="17"/>
   </w:num>
-  <w:num w:numId="24">
+  <w:num w:numId="24" w16cid:durableId="681585630">
     <w:abstractNumId w:val="11"/>
   </w:num>
-  <w:num w:numId="25">
+  <w:num w:numId="25" w16cid:durableId="702360907">
     <w:abstractNumId w:val="9"/>
   </w:num>
-  <w:num w:numId="26">
+  <w:num w:numId="26" w16cid:durableId="2019230346">
     <w:abstractNumId w:val="5"/>
   </w:num>
 </w:numbering>
@@ -9761,7 +9780,7 @@
 </file>
 
 <file path=word/glossary/document.xml><?xml version="1.0" encoding="utf-8"?>
-<w:glossaryDocument xmlns:wpc="http://schemas.microsoft.com/office/word/2010/wordprocessingCanvas" xmlns:cx="http://schemas.microsoft.com/office/drawing/2014/chartex" xmlns:cx1="http://schemas.microsoft.com/office/drawing/2015/9/8/chartex" xmlns:cx2="http://schemas.microsoft.com/office/drawing/2015/10/21/chartex" xmlns:cx3="http://schemas.microsoft.com/office/drawing/2016/5/9/chartex" xmlns:cx4="http://schemas.microsoft.com/office/drawing/2016/5/10/chartex" xmlns:cx5="http://schemas.microsoft.com/office/drawing/2016/5/11/chartex" xmlns:cx6="http://schemas.microsoft.com/office/drawing/2016/5/12/chartex" xmlns:cx7="http://schemas.microsoft.com/office/drawing/2016/5/13/chartex" xmlns:cx8="http://schemas.microsoft.com/office/drawing/2016/5/14/chartex" xmlns:mc="http://schemas.openxmlformats.org/markup-compatibility/2006" xmlns:aink="http://schemas.microsoft.com/office/drawing/2016/ink" xmlns:am3d="http://schemas.microsoft.com/office/drawing/2017/model3d" xmlns:o="urn:schemas-microsoft-com:office:office" xmlns:r="http://schemas.openxmlformats.org/officeDocument/2006/relationships" xmlns:m="http://schemas.openxmlformats.org/officeDocument/2006/math" xmlns:v="urn:schemas-microsoft-com:vml" xmlns:wp14="http://schemas.microsoft.com/office/word/2010/wordprocessingDrawing" xmlns:wp="http://schemas.openxmlformats.org/drawingml/2006/wordprocessingDrawing" xmlns:w10="urn:schemas-microsoft-com:office:word" xmlns:w="http://schemas.openxmlformats.org/wordprocessingml/2006/main" xmlns:w14="http://schemas.microsoft.com/office/word/2010/wordml" xmlns:w15="http://schemas.microsoft.com/office/word/2012/wordml" xmlns:w16cex="http://schemas.microsoft.com/office/word/2018/wordml/cex" xmlns:w16cid="http://schemas.microsoft.com/office/word/2016/wordml/cid" xmlns:w16="http://schemas.microsoft.com/office/word/2018/wordml" xmlns:w16sdtdh="http://schemas.microsoft.com/office/word/2020/wordml/sdtdatahash" xmlns:w16se="http://schemas.microsoft.com/office/word/2015/wordml/symex" xmlns:wpg="http://schemas.microsoft.com/office/word/2010/wordprocessingGroup" xmlns:wpi="http://schemas.microsoft.com/office/word/2010/wordprocessingInk" xmlns:wne="http://schemas.microsoft.com/office/word/2006/wordml" xmlns:wps="http://schemas.microsoft.com/office/word/2010/wordprocessingShape" mc:Ignorable="w14 w15 w16se w16cid w16 w16cex w16sdtdh wp14">
+<w:glossaryDocument xmlns:wpc="http://schemas.microsoft.com/office/word/2010/wordprocessingCanvas" xmlns:cx="http://schemas.microsoft.com/office/drawing/2014/chartex" xmlns:cx1="http://schemas.microsoft.com/office/drawing/2015/9/8/chartex" xmlns:cx2="http://schemas.microsoft.com/office/drawing/2015/10/21/chartex" xmlns:cx3="http://schemas.microsoft.com/office/drawing/2016/5/9/chartex" xmlns:cx4="http://schemas.microsoft.com/office/drawing/2016/5/10/chartex" xmlns:cx5="http://schemas.microsoft.com/office/drawing/2016/5/11/chartex" xmlns:cx6="http://schemas.microsoft.com/office/drawing/2016/5/12/chartex" xmlns:cx7="http://schemas.microsoft.com/office/drawing/2016/5/13/chartex" xmlns:cx8="http://schemas.microsoft.com/office/drawing/2016/5/14/chartex" xmlns:mc="http://schemas.openxmlformats.org/markup-compatibility/2006" xmlns:aink="http://schemas.microsoft.com/office/drawing/2016/ink" xmlns:am3d="http://schemas.microsoft.com/office/drawing/2017/model3d" xmlns:o="urn:schemas-microsoft-com:office:office" xmlns:oel="http://schemas.microsoft.com/office/2019/extlst" xmlns:r="http://schemas.openxmlformats.org/officeDocument/2006/relationships" xmlns:m="http://schemas.openxmlformats.org/officeDocument/2006/math" xmlns:v="urn:schemas-microsoft-com:vml" xmlns:wp14="http://schemas.microsoft.com/office/word/2010/wordprocessingDrawing" xmlns:wp="http://schemas.openxmlformats.org/drawingml/2006/wordprocessingDrawing" xmlns:w10="urn:schemas-microsoft-com:office:word" xmlns:w="http://schemas.openxmlformats.org/wordprocessingml/2006/main" xmlns:w14="http://schemas.microsoft.com/office/word/2010/wordml" xmlns:w15="http://schemas.microsoft.com/office/word/2012/wordml" xmlns:w16cex="http://schemas.microsoft.com/office/word/2018/wordml/cex" xmlns:w16cid="http://schemas.microsoft.com/office/word/2016/wordml/cid" xmlns:w16="http://schemas.microsoft.com/office/word/2018/wordml" xmlns:w16sdtdh="http://schemas.microsoft.com/office/word/2020/wordml/sdtdatahash" xmlns:w16se="http://schemas.microsoft.com/office/word/2015/wordml/symex" xmlns:wpg="http://schemas.microsoft.com/office/word/2010/wordprocessingGroup" xmlns:wpi="http://schemas.microsoft.com/office/word/2010/wordprocessingInk" xmlns:wne="http://schemas.microsoft.com/office/word/2006/wordml" xmlns:wps="http://schemas.microsoft.com/office/word/2010/wordprocessingShape" mc:Ignorable="w14 w15 w16se w16cid w16 w16cex w16sdtdh wp14">
   <w:docParts>
     <w:docPart>
       <w:docPartPr>
@@ -9886,6 +9905,7 @@
     <w:rsid w:val="005F69F2"/>
     <w:rsid w:val="00625DB6"/>
     <w:rsid w:val="00627604"/>
+    <w:rsid w:val="00670258"/>
     <w:rsid w:val="00746BEB"/>
     <w:rsid w:val="00767599"/>
     <w:rsid w:val="007F6848"/>

</xml_diff>